<commit_message>
Vehicle Search & Selection Activity Diagram (#259)
</commit_message>
<xml_diff>
--- a/Activity Specification Document.docx
+++ b/Activity Specification Document.docx
@@ -591,6 +591,649 @@
         <w:br w:type="page"/>
       </w:r>
     </w:p>
+    <w:p>
+      <w:pPr>
+        <w:pStyle w:val="Heading3"/>
+      </w:pPr>
+      <w:r>
+        <w:lastRenderedPageBreak/>
+        <w:t xml:space="preserve">2- </w:t>
+      </w:r>
+      <w:r>
+        <w:t>Vehicle Search &amp; Selection Activity</w:t>
+      </w:r>
+    </w:p>
+    <w:p>
+      <w:pPr>
+        <w:rPr>
+          <w:b/>
+          <w:bCs/>
+        </w:rPr>
+      </w:pPr>
+      <w:r>
+        <w:rPr>
+          <w:b/>
+          <w:bCs/>
+        </w:rPr>
+        <w:t>Purpose</w:t>
+      </w:r>
+    </w:p>
+    <w:p>
+      <w:r>
+        <w:t>The Vehicle Search &amp; Selection Activity Diagram represents the process by which clients search for available vehicles and choose a fitting vehicle to make a reservation in the KriGo system. The diagram presents the activities, decisions, and alternatives related to finding vehicles that meet client requirements.</w:t>
+      </w:r>
+    </w:p>
+    <w:p>
+      <w:pPr>
+        <w:rPr>
+          <w:b/>
+          <w:bCs/>
+        </w:rPr>
+      </w:pPr>
+      <w:r>
+        <w:rPr>
+          <w:b/>
+          <w:bCs/>
+        </w:rPr>
+        <w:t>Workflow Description</w:t>
+      </w:r>
+    </w:p>
+    <w:p>
+      <w:r>
+        <w:t>The process starts with the client accessing the vehicle search screen. The client sets the search criteria, such as pick-up point, rental period, car type, price range, and other filters. Then, all vehicles that fit the set criteria and are available for the required period of time will be retrieved.</w:t>
+      </w:r>
+    </w:p>
+    <w:p>
+      <w:r>
+        <w:t>In case there are no vehicles that meet the set criteria, the customer will be notified about the result and allowed to change the criteria and perform the search again.</w:t>
+      </w:r>
+    </w:p>
+    <w:p>
+      <w:r>
+        <w:t>If there are some vehicles that meet the set criteria, the client examines the list of search results and chooses a particular vehicle that he/she wants to examine further and see all the details about the chosen one.</w:t>
+      </w:r>
+    </w:p>
+    <w:p>
+      <w:r>
+        <w:t>Then, the client makes the decision regarding the suitability of the chosen vehicle for renting and proceeds either to making the reservation or continues to search for other fitting vehicles.</w:t>
+      </w:r>
+    </w:p>
+    <w:p>
+      <w:pPr>
+        <w:rPr>
+          <w:b/>
+          <w:bCs/>
+        </w:rPr>
+      </w:pPr>
+      <w:r>
+        <w:rPr>
+          <w:b/>
+          <w:bCs/>
+        </w:rPr>
+        <w:t>Main Activities</w:t>
+      </w:r>
+    </w:p>
+    <w:p>
+      <w:r>
+        <w:t>The Vehicle Search &amp; Selection Activity Diagram includes the following primary activities:</w:t>
+      </w:r>
+    </w:p>
+    <w:p>
+      <w:pPr>
+        <w:pStyle w:val="ListParagraph"/>
+        <w:numPr>
+          <w:ilvl w:val="0"/>
+          <w:numId w:val="127"/>
+        </w:numPr>
+      </w:pPr>
+      <w:r>
+        <w:t>Open the vehicle search interface.</w:t>
+      </w:r>
+    </w:p>
+    <w:p>
+      <w:pPr>
+        <w:pStyle w:val="ListParagraph"/>
+        <w:numPr>
+          <w:ilvl w:val="0"/>
+          <w:numId w:val="127"/>
+        </w:numPr>
+      </w:pPr>
+      <w:r>
+        <w:t>Enter search criteria.</w:t>
+      </w:r>
+    </w:p>
+    <w:p>
+      <w:pPr>
+        <w:pStyle w:val="ListParagraph"/>
+        <w:numPr>
+          <w:ilvl w:val="0"/>
+          <w:numId w:val="127"/>
+        </w:numPr>
+      </w:pPr>
+      <w:r>
+        <w:t>Submit the search request.</w:t>
+      </w:r>
+    </w:p>
+    <w:p>
+      <w:pPr>
+        <w:pStyle w:val="ListParagraph"/>
+        <w:numPr>
+          <w:ilvl w:val="0"/>
+          <w:numId w:val="127"/>
+        </w:numPr>
+      </w:pPr>
+      <w:r>
+        <w:t>Retrieve matching available vehicles.</w:t>
+      </w:r>
+    </w:p>
+    <w:p>
+      <w:pPr>
+        <w:pStyle w:val="ListParagraph"/>
+        <w:numPr>
+          <w:ilvl w:val="0"/>
+          <w:numId w:val="127"/>
+        </w:numPr>
+      </w:pPr>
+      <w:r>
+        <w:t>Display search results.</w:t>
+      </w:r>
+    </w:p>
+    <w:p>
+      <w:pPr>
+        <w:pStyle w:val="ListParagraph"/>
+        <w:numPr>
+          <w:ilvl w:val="0"/>
+          <w:numId w:val="127"/>
+        </w:numPr>
+      </w:pPr>
+      <w:r>
+        <w:t>Browse available vehicles.</w:t>
+      </w:r>
+    </w:p>
+    <w:p>
+      <w:pPr>
+        <w:pStyle w:val="ListParagraph"/>
+        <w:numPr>
+          <w:ilvl w:val="0"/>
+          <w:numId w:val="127"/>
+        </w:numPr>
+      </w:pPr>
+      <w:r>
+        <w:t>Select a vehicle.</w:t>
+      </w:r>
+    </w:p>
+    <w:p>
+      <w:pPr>
+        <w:pStyle w:val="ListParagraph"/>
+        <w:numPr>
+          <w:ilvl w:val="0"/>
+          <w:numId w:val="127"/>
+        </w:numPr>
+      </w:pPr>
+      <w:r>
+        <w:t>View vehicle details.</w:t>
+      </w:r>
+    </w:p>
+    <w:p>
+      <w:pPr>
+        <w:pStyle w:val="ListParagraph"/>
+        <w:numPr>
+          <w:ilvl w:val="0"/>
+          <w:numId w:val="127"/>
+        </w:numPr>
+      </w:pPr>
+      <w:r>
+        <w:t>Proceed to the reservation process.</w:t>
+      </w:r>
+    </w:p>
+    <w:p>
+      <w:pPr>
+        <w:rPr>
+          <w:b/>
+          <w:bCs/>
+        </w:rPr>
+      </w:pPr>
+      <w:r>
+        <w:rPr>
+          <w:b/>
+          <w:bCs/>
+        </w:rPr>
+        <w:t>Decision Points</w:t>
+      </w:r>
+    </w:p>
+    <w:p>
+      <w:r>
+        <w:t>The activity diagram contains two primary decision nodes:</w:t>
+      </w:r>
+    </w:p>
+    <w:p>
+      <w:pPr>
+        <w:numPr>
+          <w:ilvl w:val="0"/>
+          <w:numId w:val="125"/>
+        </w:numPr>
+      </w:pPr>
+      <w:r>
+        <w:rPr>
+          <w:b/>
+          <w:bCs/>
+        </w:rPr>
+        <w:t>Vehicles Found?</w:t>
+      </w:r>
+    </w:p>
+    <w:p>
+      <w:pPr>
+        <w:numPr>
+          <w:ilvl w:val="1"/>
+          <w:numId w:val="125"/>
+        </w:numPr>
+        <w:spacing w:after="0" w:line="276" w:lineRule="auto"/>
+      </w:pPr>
+      <w:r>
+        <w:t xml:space="preserve">If </w:t>
+      </w:r>
+      <w:r>
+        <w:rPr>
+          <w:b/>
+          <w:bCs/>
+        </w:rPr>
+        <w:t>yes</w:t>
+      </w:r>
+      <w:r>
+        <w:t>, the customer browses the available vehicles.</w:t>
+      </w:r>
+    </w:p>
+    <w:p>
+      <w:pPr>
+        <w:numPr>
+          <w:ilvl w:val="1"/>
+          <w:numId w:val="125"/>
+        </w:numPr>
+        <w:spacing w:after="0" w:line="276" w:lineRule="auto"/>
+      </w:pPr>
+      <w:r>
+        <w:t xml:space="preserve">If </w:t>
+      </w:r>
+      <w:r>
+        <w:rPr>
+          <w:b/>
+          <w:bCs/>
+        </w:rPr>
+        <w:t>no</w:t>
+      </w:r>
+      <w:r>
+        <w:t>, the system displays a message indicating that no vehicles match the search criteria, allowing the customer to modify the search.</w:t>
+      </w:r>
+    </w:p>
+    <w:p>
+      <w:pPr>
+        <w:numPr>
+          <w:ilvl w:val="0"/>
+          <w:numId w:val="125"/>
+        </w:numPr>
+      </w:pPr>
+      <w:r>
+        <w:rPr>
+          <w:b/>
+          <w:bCs/>
+        </w:rPr>
+        <w:t>Vehicle Meets Requirements?</w:t>
+      </w:r>
+    </w:p>
+    <w:p>
+      <w:pPr>
+        <w:numPr>
+          <w:ilvl w:val="1"/>
+          <w:numId w:val="125"/>
+        </w:numPr>
+        <w:spacing w:after="0" w:line="276" w:lineRule="auto"/>
+      </w:pPr>
+      <w:r>
+        <w:t xml:space="preserve">If </w:t>
+      </w:r>
+      <w:r>
+        <w:rPr>
+          <w:b/>
+          <w:bCs/>
+        </w:rPr>
+        <w:t>yes</w:t>
+      </w:r>
+      <w:r>
+        <w:t>, the customer proceeds with the reservation process.</w:t>
+      </w:r>
+    </w:p>
+    <w:p>
+      <w:pPr>
+        <w:numPr>
+          <w:ilvl w:val="1"/>
+          <w:numId w:val="125"/>
+        </w:numPr>
+        <w:spacing w:line="276" w:lineRule="auto"/>
+      </w:pPr>
+      <w:r>
+        <w:t xml:space="preserve">If </w:t>
+      </w:r>
+      <w:r>
+        <w:rPr>
+          <w:b/>
+          <w:bCs/>
+        </w:rPr>
+        <w:t>no</w:t>
+      </w:r>
+      <w:r>
+        <w:t>, the customer returns to the search results to evaluate other vehicles.</w:t>
+      </w:r>
+    </w:p>
+    <w:p>
+      <w:r>
+        <w:t>These decision points ensure that customers can efficiently identify vehicles that best satisfy their rental preferences while handling situations where no suitable vehicles are immediately available.</w:t>
+      </w:r>
+    </w:p>
+    <w:p>
+      <w:pPr>
+        <w:rPr>
+          <w:b/>
+          <w:bCs/>
+        </w:rPr>
+      </w:pPr>
+      <w:r>
+        <w:rPr>
+          <w:b/>
+          <w:bCs/>
+        </w:rPr>
+        <w:lastRenderedPageBreak/>
+        <w:t>Alternative Flows</w:t>
+      </w:r>
+    </w:p>
+    <w:p>
+      <w:r>
+        <w:t>The Vehicle Search &amp; Selection Activity Diagram incorporates several alternative scenarios:</w:t>
+      </w:r>
+    </w:p>
+    <w:p>
+      <w:pPr>
+        <w:pStyle w:val="ListParagraph"/>
+        <w:numPr>
+          <w:ilvl w:val="0"/>
+          <w:numId w:val="128"/>
+        </w:numPr>
+      </w:pPr>
+      <w:r>
+        <w:t>No vehicles match the specified search criteria.</w:t>
+      </w:r>
+    </w:p>
+    <w:p>
+      <w:pPr>
+        <w:pStyle w:val="ListParagraph"/>
+        <w:numPr>
+          <w:ilvl w:val="0"/>
+          <w:numId w:val="128"/>
+        </w:numPr>
+      </w:pPr>
+      <w:r>
+        <w:t>The selected vehicle does not satisfy the customer's preferences.</w:t>
+      </w:r>
+    </w:p>
+    <w:p>
+      <w:pPr>
+        <w:pStyle w:val="ListParagraph"/>
+        <w:numPr>
+          <w:ilvl w:val="0"/>
+          <w:numId w:val="128"/>
+        </w:numPr>
+      </w:pPr>
+      <w:r>
+        <w:t>Successful vehicle selection leading to the reservation process.</w:t>
+      </w:r>
+    </w:p>
+    <w:p>
+      <w:r>
+        <w:t>These alternative paths provide flexibility during the vehicle selection and enhance overall</w:t>
+      </w:r>
+      <w:r>
+        <w:t xml:space="preserve"> UX</w:t>
+      </w:r>
+      <w:r>
+        <w:t>.</w:t>
+      </w:r>
+    </w:p>
+    <w:p>
+      <w:pPr>
+        <w:rPr>
+          <w:b/>
+          <w:bCs/>
+        </w:rPr>
+      </w:pPr>
+      <w:r>
+        <w:rPr>
+          <w:b/>
+          <w:bCs/>
+        </w:rPr>
+        <w:t>Conclusion</w:t>
+      </w:r>
+    </w:p>
+    <w:p>
+      <w:r>
+        <w:rPr>
+          <w:noProof/>
+        </w:rPr>
+        <w:drawing>
+          <wp:anchor distT="0" distB="0" distL="114300" distR="114300" simplePos="0" relativeHeight="251658240" behindDoc="0" locked="0" layoutInCell="1" allowOverlap="1" wp14:anchorId="25665111" wp14:editId="485BD763">
+            <wp:simplePos x="0" y="0"/>
+            <wp:positionH relativeFrom="column">
+              <wp:posOffset>54610</wp:posOffset>
+            </wp:positionH>
+            <wp:positionV relativeFrom="paragraph">
+              <wp:posOffset>772795</wp:posOffset>
+            </wp:positionV>
+            <wp:extent cx="5941695" cy="5911850"/>
+            <wp:effectExtent l="0" t="0" r="1905" b="0"/>
+            <wp:wrapSquare wrapText="bothSides"/>
+            <wp:docPr id="1540429073" name="Picture 9"/>
+            <wp:cNvGraphicFramePr>
+              <a:graphicFrameLocks xmlns:a="http://schemas.openxmlformats.org/drawingml/2006/main" noChangeAspect="1"/>
+            </wp:cNvGraphicFramePr>
+            <a:graphic xmlns:a="http://schemas.openxmlformats.org/drawingml/2006/main">
+              <a:graphicData uri="http://schemas.openxmlformats.org/drawingml/2006/picture">
+                <pic:pic xmlns:pic="http://schemas.openxmlformats.org/drawingml/2006/picture">
+                  <pic:nvPicPr>
+                    <pic:cNvPr id="0" name="Picture 3"/>
+                    <pic:cNvPicPr>
+                      <a:picLocks noChangeAspect="1" noChangeArrowheads="1"/>
+                    </pic:cNvPicPr>
+                  </pic:nvPicPr>
+                  <pic:blipFill>
+                    <a:blip r:embed="rId9">
+                      <a:extLst>
+                        <a:ext uri="{28A0092B-C50C-407E-A947-70E740481C1C}">
+                          <a14:useLocalDpi xmlns:a14="http://schemas.microsoft.com/office/drawing/2010/main" val="0"/>
+                        </a:ext>
+                      </a:extLst>
+                    </a:blip>
+                    <a:srcRect/>
+                    <a:stretch>
+                      <a:fillRect/>
+                    </a:stretch>
+                  </pic:blipFill>
+                  <pic:spPr bwMode="auto">
+                    <a:xfrm>
+                      <a:off x="0" y="0"/>
+                      <a:ext cx="5941695" cy="5911850"/>
+                    </a:xfrm>
+                    <a:prstGeom prst="rect">
+                      <a:avLst/>
+                    </a:prstGeom>
+                    <a:noFill/>
+                    <a:ln>
+                      <a:noFill/>
+                    </a:ln>
+                  </pic:spPr>
+                </pic:pic>
+              </a:graphicData>
+            </a:graphic>
+          </wp:anchor>
+        </w:drawing>
+      </w:r>
+      <w:r>
+        <w:t xml:space="preserve">The Vehicle Search and Selection Activity Diagram </w:t>
+      </w:r>
+      <w:r>
+        <w:t>give</w:t>
+      </w:r>
+      <w:r>
+        <w:t xml:space="preserve"> a detailed view of all the processes included in the process of finding and selecting rental cars within the KriGo application. The diagram shows how these processes are structured logically, starting with the entry of search parameters and ending with the selection of a suitable vehicle.</w:t>
+      </w:r>
+      <w:r>
+        <w:rPr>
+          <w:noProof/>
+        </w:rPr>
+        <mc:AlternateContent>
+          <mc:Choice Requires="wps">
+            <w:drawing>
+              <wp:anchor distT="0" distB="0" distL="114300" distR="114300" simplePos="0" relativeHeight="251660288" behindDoc="0" locked="0" layoutInCell="1" allowOverlap="1" wp14:anchorId="76B9DB1C" wp14:editId="55C61D54">
+                <wp:simplePos x="0" y="0"/>
+                <wp:positionH relativeFrom="column">
+                  <wp:posOffset>-2540</wp:posOffset>
+                </wp:positionH>
+                <wp:positionV relativeFrom="paragraph">
+                  <wp:posOffset>8620125</wp:posOffset>
+                </wp:positionV>
+                <wp:extent cx="5941695" cy="635"/>
+                <wp:effectExtent l="0" t="0" r="0" b="0"/>
+                <wp:wrapSquare wrapText="bothSides"/>
+                <wp:docPr id="1919891769" name="Text Box 1"/>
+                <wp:cNvGraphicFramePr/>
+                <a:graphic xmlns:a="http://schemas.openxmlformats.org/drawingml/2006/main">
+                  <a:graphicData uri="http://schemas.microsoft.com/office/word/2010/wordprocessingShape">
+                    <wps:wsp>
+                      <wps:cNvSpPr txBox="1"/>
+                      <wps:spPr>
+                        <a:xfrm>
+                          <a:off x="0" y="0"/>
+                          <a:ext cx="5941695" cy="635"/>
+                        </a:xfrm>
+                        <a:prstGeom prst="rect">
+                          <a:avLst/>
+                        </a:prstGeom>
+                        <a:solidFill>
+                          <a:prstClr val="white"/>
+                        </a:solidFill>
+                        <a:ln>
+                          <a:noFill/>
+                        </a:ln>
+                      </wps:spPr>
+                      <wps:txbx>
+                        <w:txbxContent>
+                          <w:p>
+                            <w:pPr>
+                              <w:pStyle w:val="Caption"/>
+                              <w:rPr>
+                                <w:noProof/>
+                              </w:rPr>
+                            </w:pPr>
+                            <w:r>
+                              <w:t xml:space="preserve">Figure </w:t>
+                            </w:r>
+                            <w:r>
+                              <w:fldChar w:fldCharType="begin"/>
+                            </w:r>
+                            <w:r>
+                              <w:instrText xml:space="preserve"> SEQ Figure \* ARABIC </w:instrText>
+                            </w:r>
+                            <w:r>
+                              <w:fldChar w:fldCharType="separate"/>
+                            </w:r>
+                            <w:r>
+                              <w:rPr>
+                                <w:noProof/>
+                              </w:rPr>
+                              <w:t>2</w:t>
+                            </w:r>
+                            <w:r>
+                              <w:fldChar w:fldCharType="end"/>
+                            </w:r>
+                            <w:r>
+                              <w:t xml:space="preserve"> - </w:t>
+                            </w:r>
+                            <w:r>
+                              <w:t>Vehicle Search &amp; Selection Activity Diagram</w:t>
+                            </w:r>
+                          </w:p>
+                        </w:txbxContent>
+                      </wps:txbx>
+                      <wps:bodyPr rot="0" spcFirstLastPara="0" vertOverflow="overflow" horzOverflow="overflow" vert="horz" wrap="square" lIns="0" tIns="0" rIns="0" bIns="0" numCol="1" spcCol="0" rtlCol="0" fromWordArt="0" anchor="t" anchorCtr="0" forceAA="0" compatLnSpc="1">
+                        <a:prstTxWarp prst="textNoShape">
+                          <a:avLst/>
+                        </a:prstTxWarp>
+                        <a:spAutoFit/>
+                      </wps:bodyPr>
+                    </wps:wsp>
+                  </a:graphicData>
+                </a:graphic>
+              </wp:anchor>
+            </w:drawing>
+          </mc:Choice>
+          <mc:Fallback>
+            <w:pict>
+              <v:shapetype w14:anchorId="76B9DB1C" id="_x0000_t202" coordsize="21600,21600" o:spt="202" path="m,l,21600r21600,l21600,xe">
+                <v:stroke joinstyle="miter"/>
+                <v:path gradientshapeok="t" o:connecttype="rect"/>
+              </v:shapetype>
+              <v:shape id="Text Box 1" o:spid="_x0000_s1026" type="#_x0000_t202" style="position:absolute;margin-left:-.2pt;margin-top:678.75pt;width:467.85pt;height:.05pt;z-index:251660288;visibility:visible;mso-wrap-style:square;mso-wrap-distance-left:9pt;mso-wrap-distance-top:0;mso-wrap-distance-right:9pt;mso-wrap-distance-bottom:0;mso-position-horizontal:absolute;mso-position-horizontal-relative:text;mso-position-vertical:absolute;mso-position-vertical-relative:text;v-text-anchor:top" o:gfxdata="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" stroked="f">
+                <v:textbox style="mso-fit-shape-to-text:t" inset="0,0,0,0">
+                  <w:txbxContent>
+                    <w:p>
+                      <w:pPr>
+                        <w:pStyle w:val="Caption"/>
+                        <w:rPr>
+                          <w:noProof/>
+                        </w:rPr>
+                      </w:pPr>
+                      <w:r>
+                        <w:t xml:space="preserve">Figure </w:t>
+                      </w:r>
+                      <w:r>
+                        <w:fldChar w:fldCharType="begin"/>
+                      </w:r>
+                      <w:r>
+                        <w:instrText xml:space="preserve"> SEQ Figure \* ARABIC </w:instrText>
+                      </w:r>
+                      <w:r>
+                        <w:fldChar w:fldCharType="separate"/>
+                      </w:r>
+                      <w:r>
+                        <w:rPr>
+                          <w:noProof/>
+                        </w:rPr>
+                        <w:t>2</w:t>
+                      </w:r>
+                      <w:r>
+                        <w:fldChar w:fldCharType="end"/>
+                      </w:r>
+                      <w:r>
+                        <w:t xml:space="preserve"> - </w:t>
+                      </w:r>
+                      <w:r>
+                        <w:t>Vehicle Search &amp; Selection Activity Diagram</w:t>
+                      </w:r>
+                    </w:p>
+                  </w:txbxContent>
+                </v:textbox>
+                <w10:wrap type="square"/>
+              </v:shape>
+            </w:pict>
+          </mc:Fallback>
+        </mc:AlternateContent>
+      </w:r>
+    </w:p>
+    <w:p>
+      <w:pPr>
+        <w:spacing w:line="278" w:lineRule="auto"/>
+      </w:pPr>
+      <w:r>
+        <w:br w:type="page"/>
+      </w:r>
+    </w:p>
     <w:p/>
     <w:sectPr>
       <w:pgSz w:w="11906" w:h="16838" w:code="9"/>
@@ -804,6 +1447,155 @@
     </w:lvl>
   </w:abstractNum>
   <w:abstractNum w:abstractNumId="1" w15:restartNumberingAfterBreak="0">
+    <w:nsid w:val="012931D3"/>
+    <w:multiLevelType w:val="multilevel"/>
+    <w:tmpl w:val="54128F68"/>
+    <w:lvl w:ilvl="0">
+      <w:start w:val="1"/>
+      <w:numFmt w:val="bullet"/>
+      <w:lvlText w:val=""/>
+      <w:lvlJc w:val="left"/>
+      <w:pPr>
+        <w:tabs>
+          <w:tab w:val="num" w:pos="720"/>
+        </w:tabs>
+        <w:ind w:left="720" w:hanging="360"/>
+      </w:pPr>
+      <w:rPr>
+        <w:rFonts w:ascii="Symbol" w:hAnsi="Symbol" w:hint="default"/>
+        <w:sz w:val="20"/>
+      </w:rPr>
+    </w:lvl>
+    <w:lvl w:ilvl="1" w:tentative="1">
+      <w:start w:val="1"/>
+      <w:numFmt w:val="bullet"/>
+      <w:lvlText w:val="o"/>
+      <w:lvlJc w:val="left"/>
+      <w:pPr>
+        <w:tabs>
+          <w:tab w:val="num" w:pos="1440"/>
+        </w:tabs>
+        <w:ind w:left="1440" w:hanging="360"/>
+      </w:pPr>
+      <w:rPr>
+        <w:rFonts w:ascii="Courier New" w:hAnsi="Courier New" w:hint="default"/>
+        <w:sz w:val="20"/>
+      </w:rPr>
+    </w:lvl>
+    <w:lvl w:ilvl="2" w:tentative="1">
+      <w:start w:val="1"/>
+      <w:numFmt w:val="bullet"/>
+      <w:lvlText w:val=""/>
+      <w:lvlJc w:val="left"/>
+      <w:pPr>
+        <w:tabs>
+          <w:tab w:val="num" w:pos="2160"/>
+        </w:tabs>
+        <w:ind w:left="2160" w:hanging="360"/>
+      </w:pPr>
+      <w:rPr>
+        <w:rFonts w:ascii="Wingdings" w:hAnsi="Wingdings" w:hint="default"/>
+        <w:sz w:val="20"/>
+      </w:rPr>
+    </w:lvl>
+    <w:lvl w:ilvl="3" w:tentative="1">
+      <w:start w:val="1"/>
+      <w:numFmt w:val="bullet"/>
+      <w:lvlText w:val=""/>
+      <w:lvlJc w:val="left"/>
+      <w:pPr>
+        <w:tabs>
+          <w:tab w:val="num" w:pos="2880"/>
+        </w:tabs>
+        <w:ind w:left="2880" w:hanging="360"/>
+      </w:pPr>
+      <w:rPr>
+        <w:rFonts w:ascii="Wingdings" w:hAnsi="Wingdings" w:hint="default"/>
+        <w:sz w:val="20"/>
+      </w:rPr>
+    </w:lvl>
+    <w:lvl w:ilvl="4" w:tentative="1">
+      <w:start w:val="1"/>
+      <w:numFmt w:val="bullet"/>
+      <w:lvlText w:val=""/>
+      <w:lvlJc w:val="left"/>
+      <w:pPr>
+        <w:tabs>
+          <w:tab w:val="num" w:pos="3600"/>
+        </w:tabs>
+        <w:ind w:left="3600" w:hanging="360"/>
+      </w:pPr>
+      <w:rPr>
+        <w:rFonts w:ascii="Wingdings" w:hAnsi="Wingdings" w:hint="default"/>
+        <w:sz w:val="20"/>
+      </w:rPr>
+    </w:lvl>
+    <w:lvl w:ilvl="5" w:tentative="1">
+      <w:start w:val="1"/>
+      <w:numFmt w:val="bullet"/>
+      <w:lvlText w:val=""/>
+      <w:lvlJc w:val="left"/>
+      <w:pPr>
+        <w:tabs>
+          <w:tab w:val="num" w:pos="4320"/>
+        </w:tabs>
+        <w:ind w:left="4320" w:hanging="360"/>
+      </w:pPr>
+      <w:rPr>
+        <w:rFonts w:ascii="Wingdings" w:hAnsi="Wingdings" w:hint="default"/>
+        <w:sz w:val="20"/>
+      </w:rPr>
+    </w:lvl>
+    <w:lvl w:ilvl="6" w:tentative="1">
+      <w:start w:val="1"/>
+      <w:numFmt w:val="bullet"/>
+      <w:lvlText w:val=""/>
+      <w:lvlJc w:val="left"/>
+      <w:pPr>
+        <w:tabs>
+          <w:tab w:val="num" w:pos="5040"/>
+        </w:tabs>
+        <w:ind w:left="5040" w:hanging="360"/>
+      </w:pPr>
+      <w:rPr>
+        <w:rFonts w:ascii="Wingdings" w:hAnsi="Wingdings" w:hint="default"/>
+        <w:sz w:val="20"/>
+      </w:rPr>
+    </w:lvl>
+    <w:lvl w:ilvl="7" w:tentative="1">
+      <w:start w:val="1"/>
+      <w:numFmt w:val="bullet"/>
+      <w:lvlText w:val=""/>
+      <w:lvlJc w:val="left"/>
+      <w:pPr>
+        <w:tabs>
+          <w:tab w:val="num" w:pos="5760"/>
+        </w:tabs>
+        <w:ind w:left="5760" w:hanging="360"/>
+      </w:pPr>
+      <w:rPr>
+        <w:rFonts w:ascii="Wingdings" w:hAnsi="Wingdings" w:hint="default"/>
+        <w:sz w:val="20"/>
+      </w:rPr>
+    </w:lvl>
+    <w:lvl w:ilvl="8" w:tentative="1">
+      <w:start w:val="1"/>
+      <w:numFmt w:val="bullet"/>
+      <w:lvlText w:val=""/>
+      <w:lvlJc w:val="left"/>
+      <w:pPr>
+        <w:tabs>
+          <w:tab w:val="num" w:pos="6480"/>
+        </w:tabs>
+        <w:ind w:left="6480" w:hanging="360"/>
+      </w:pPr>
+      <w:rPr>
+        <w:rFonts w:ascii="Wingdings" w:hAnsi="Wingdings" w:hint="default"/>
+        <w:sz w:val="20"/>
+      </w:rPr>
+    </w:lvl>
+  </w:abstractNum>
+  <w:abstractNum w:abstractNumId="2" w15:restartNumberingAfterBreak="0">
     <w:nsid w:val="020222C2"/>
     <w:multiLevelType w:val="hybridMultilevel"/>
     <w:tmpl w:val="26FC1C02"/>
@@ -916,7 +1708,7 @@
       </w:rPr>
     </w:lvl>
   </w:abstractNum>
-  <w:abstractNum w:abstractNumId="2" w15:restartNumberingAfterBreak="0">
+  <w:abstractNum w:abstractNumId="3" w15:restartNumberingAfterBreak="0">
     <w:nsid w:val="027A2D57"/>
     <w:multiLevelType w:val="hybridMultilevel"/>
     <w:tmpl w:val="3148FF7E"/>
@@ -1029,7 +1821,7 @@
       </w:rPr>
     </w:lvl>
   </w:abstractNum>
-  <w:abstractNum w:abstractNumId="3" w15:restartNumberingAfterBreak="0">
+  <w:abstractNum w:abstractNumId="4" w15:restartNumberingAfterBreak="0">
     <w:nsid w:val="038C4B22"/>
     <w:multiLevelType w:val="hybridMultilevel"/>
     <w:tmpl w:val="390E2614"/>
@@ -1142,7 +1934,7 @@
       </w:rPr>
     </w:lvl>
   </w:abstractNum>
-  <w:abstractNum w:abstractNumId="4" w15:restartNumberingAfterBreak="0">
+  <w:abstractNum w:abstractNumId="5" w15:restartNumberingAfterBreak="0">
     <w:nsid w:val="04351CD0"/>
     <w:multiLevelType w:val="hybridMultilevel"/>
     <w:tmpl w:val="4748F3C4"/>
@@ -1255,7 +2047,7 @@
       </w:rPr>
     </w:lvl>
   </w:abstractNum>
-  <w:abstractNum w:abstractNumId="5" w15:restartNumberingAfterBreak="0">
+  <w:abstractNum w:abstractNumId="6" w15:restartNumberingAfterBreak="0">
     <w:nsid w:val="0444578B"/>
     <w:multiLevelType w:val="multilevel"/>
     <w:tmpl w:val="6B840BA4"/>
@@ -1404,7 +2196,7 @@
       </w:rPr>
     </w:lvl>
   </w:abstractNum>
-  <w:abstractNum w:abstractNumId="6" w15:restartNumberingAfterBreak="0">
+  <w:abstractNum w:abstractNumId="7" w15:restartNumberingAfterBreak="0">
     <w:nsid w:val="06FA4547"/>
     <w:multiLevelType w:val="hybridMultilevel"/>
     <w:tmpl w:val="DA825754"/>
@@ -1517,7 +2309,7 @@
       </w:rPr>
     </w:lvl>
   </w:abstractNum>
-  <w:abstractNum w:abstractNumId="7" w15:restartNumberingAfterBreak="0">
+  <w:abstractNum w:abstractNumId="8" w15:restartNumberingAfterBreak="0">
     <w:nsid w:val="08BB19BF"/>
     <w:multiLevelType w:val="multilevel"/>
     <w:tmpl w:val="C5807BB2"/>
@@ -1666,7 +2458,7 @@
       </w:rPr>
     </w:lvl>
   </w:abstractNum>
-  <w:abstractNum w:abstractNumId="8" w15:restartNumberingAfterBreak="0">
+  <w:abstractNum w:abstractNumId="9" w15:restartNumberingAfterBreak="0">
     <w:nsid w:val="08D32D08"/>
     <w:multiLevelType w:val="multilevel"/>
     <w:tmpl w:val="A32449CA"/>
@@ -1815,7 +2607,7 @@
       </w:rPr>
     </w:lvl>
   </w:abstractNum>
-  <w:abstractNum w:abstractNumId="9" w15:restartNumberingAfterBreak="0">
+  <w:abstractNum w:abstractNumId="10" w15:restartNumberingAfterBreak="0">
     <w:nsid w:val="09E84C0F"/>
     <w:multiLevelType w:val="hybridMultilevel"/>
     <w:tmpl w:val="3754EFAC"/>
@@ -1928,7 +2720,7 @@
       </w:rPr>
     </w:lvl>
   </w:abstractNum>
-  <w:abstractNum w:abstractNumId="10" w15:restartNumberingAfterBreak="0">
+  <w:abstractNum w:abstractNumId="11" w15:restartNumberingAfterBreak="0">
     <w:nsid w:val="0AE82489"/>
     <w:multiLevelType w:val="multilevel"/>
     <w:tmpl w:val="B82C10D4"/>
@@ -2077,7 +2869,7 @@
       </w:rPr>
     </w:lvl>
   </w:abstractNum>
-  <w:abstractNum w:abstractNumId="11" w15:restartNumberingAfterBreak="0">
+  <w:abstractNum w:abstractNumId="12" w15:restartNumberingAfterBreak="0">
     <w:nsid w:val="0CC17936"/>
     <w:multiLevelType w:val="multilevel"/>
     <w:tmpl w:val="B5E0C4F8"/>
@@ -2226,7 +3018,7 @@
       </w:rPr>
     </w:lvl>
   </w:abstractNum>
-  <w:abstractNum w:abstractNumId="12" w15:restartNumberingAfterBreak="0">
+  <w:abstractNum w:abstractNumId="13" w15:restartNumberingAfterBreak="0">
     <w:nsid w:val="0E1040E2"/>
     <w:multiLevelType w:val="multilevel"/>
     <w:tmpl w:val="607CCC88"/>
@@ -2375,7 +3167,7 @@
       </w:rPr>
     </w:lvl>
   </w:abstractNum>
-  <w:abstractNum w:abstractNumId="13" w15:restartNumberingAfterBreak="0">
+  <w:abstractNum w:abstractNumId="14" w15:restartNumberingAfterBreak="0">
     <w:nsid w:val="0E2561E7"/>
     <w:multiLevelType w:val="hybridMultilevel"/>
     <w:tmpl w:val="2A6E4870"/>
@@ -2488,7 +3280,7 @@
       </w:rPr>
     </w:lvl>
   </w:abstractNum>
-  <w:abstractNum w:abstractNumId="14" w15:restartNumberingAfterBreak="0">
+  <w:abstractNum w:abstractNumId="15" w15:restartNumberingAfterBreak="0">
     <w:nsid w:val="0E841C27"/>
     <w:multiLevelType w:val="hybridMultilevel"/>
     <w:tmpl w:val="789C7F32"/>
@@ -2601,7 +3393,7 @@
       </w:rPr>
     </w:lvl>
   </w:abstractNum>
-  <w:abstractNum w:abstractNumId="15" w15:restartNumberingAfterBreak="0">
+  <w:abstractNum w:abstractNumId="16" w15:restartNumberingAfterBreak="0">
     <w:nsid w:val="0FAA2602"/>
     <w:multiLevelType w:val="hybridMultilevel"/>
     <w:tmpl w:val="C6C63128"/>
@@ -2714,7 +3506,7 @@
       </w:rPr>
     </w:lvl>
   </w:abstractNum>
-  <w:abstractNum w:abstractNumId="16" w15:restartNumberingAfterBreak="0">
+  <w:abstractNum w:abstractNumId="17" w15:restartNumberingAfterBreak="0">
     <w:nsid w:val="122550ED"/>
     <w:multiLevelType w:val="hybridMultilevel"/>
     <w:tmpl w:val="91ACE480"/>
@@ -2827,7 +3619,7 @@
       </w:rPr>
     </w:lvl>
   </w:abstractNum>
-  <w:abstractNum w:abstractNumId="17" w15:restartNumberingAfterBreak="0">
+  <w:abstractNum w:abstractNumId="18" w15:restartNumberingAfterBreak="0">
     <w:nsid w:val="124C1BAE"/>
     <w:multiLevelType w:val="hybridMultilevel"/>
     <w:tmpl w:val="04988FC0"/>
@@ -2940,7 +3732,7 @@
       </w:rPr>
     </w:lvl>
   </w:abstractNum>
-  <w:abstractNum w:abstractNumId="18" w15:restartNumberingAfterBreak="0">
+  <w:abstractNum w:abstractNumId="19" w15:restartNumberingAfterBreak="0">
     <w:nsid w:val="139F7557"/>
     <w:multiLevelType w:val="multilevel"/>
     <w:tmpl w:val="A984C1D4"/>
@@ -3089,7 +3881,7 @@
       </w:rPr>
     </w:lvl>
   </w:abstractNum>
-  <w:abstractNum w:abstractNumId="19" w15:restartNumberingAfterBreak="0">
+  <w:abstractNum w:abstractNumId="20" w15:restartNumberingAfterBreak="0">
     <w:nsid w:val="13A13D09"/>
     <w:multiLevelType w:val="multilevel"/>
     <w:tmpl w:val="92067DCC"/>
@@ -3238,7 +4030,7 @@
       </w:rPr>
     </w:lvl>
   </w:abstractNum>
-  <w:abstractNum w:abstractNumId="20" w15:restartNumberingAfterBreak="0">
+  <w:abstractNum w:abstractNumId="21" w15:restartNumberingAfterBreak="0">
     <w:nsid w:val="16D400B4"/>
     <w:multiLevelType w:val="hybridMultilevel"/>
     <w:tmpl w:val="58E6DFBE"/>
@@ -3351,7 +4143,7 @@
       </w:rPr>
     </w:lvl>
   </w:abstractNum>
-  <w:abstractNum w:abstractNumId="21" w15:restartNumberingAfterBreak="0">
+  <w:abstractNum w:abstractNumId="22" w15:restartNumberingAfterBreak="0">
     <w:nsid w:val="17236012"/>
     <w:multiLevelType w:val="hybridMultilevel"/>
     <w:tmpl w:val="DAFA46C8"/>
@@ -3464,7 +4256,7 @@
       </w:rPr>
     </w:lvl>
   </w:abstractNum>
-  <w:abstractNum w:abstractNumId="22" w15:restartNumberingAfterBreak="0">
+  <w:abstractNum w:abstractNumId="23" w15:restartNumberingAfterBreak="0">
     <w:nsid w:val="172B04C0"/>
     <w:multiLevelType w:val="hybridMultilevel"/>
     <w:tmpl w:val="B6C41D5E"/>
@@ -3577,7 +4369,7 @@
       </w:rPr>
     </w:lvl>
   </w:abstractNum>
-  <w:abstractNum w:abstractNumId="23" w15:restartNumberingAfterBreak="0">
+  <w:abstractNum w:abstractNumId="24" w15:restartNumberingAfterBreak="0">
     <w:nsid w:val="17485CCB"/>
     <w:multiLevelType w:val="multilevel"/>
     <w:tmpl w:val="397E1AE0"/>
@@ -3726,7 +4518,7 @@
       </w:rPr>
     </w:lvl>
   </w:abstractNum>
-  <w:abstractNum w:abstractNumId="24" w15:restartNumberingAfterBreak="0">
+  <w:abstractNum w:abstractNumId="25" w15:restartNumberingAfterBreak="0">
     <w:nsid w:val="17763D31"/>
     <w:multiLevelType w:val="hybridMultilevel"/>
     <w:tmpl w:val="6CE63304"/>
@@ -3839,7 +4631,7 @@
       </w:rPr>
     </w:lvl>
   </w:abstractNum>
-  <w:abstractNum w:abstractNumId="25" w15:restartNumberingAfterBreak="0">
+  <w:abstractNum w:abstractNumId="26" w15:restartNumberingAfterBreak="0">
     <w:nsid w:val="17B06937"/>
     <w:multiLevelType w:val="hybridMultilevel"/>
     <w:tmpl w:val="71089CF2"/>
@@ -3952,7 +4744,7 @@
       </w:rPr>
     </w:lvl>
   </w:abstractNum>
-  <w:abstractNum w:abstractNumId="26" w15:restartNumberingAfterBreak="0">
+  <w:abstractNum w:abstractNumId="27" w15:restartNumberingAfterBreak="0">
     <w:nsid w:val="190F0390"/>
     <w:multiLevelType w:val="multilevel"/>
     <w:tmpl w:val="CBE4A4A4"/>
@@ -4101,7 +4893,7 @@
       </w:rPr>
     </w:lvl>
   </w:abstractNum>
-  <w:abstractNum w:abstractNumId="27" w15:restartNumberingAfterBreak="0">
+  <w:abstractNum w:abstractNumId="28" w15:restartNumberingAfterBreak="0">
     <w:nsid w:val="195875B0"/>
     <w:multiLevelType w:val="multilevel"/>
     <w:tmpl w:val="615444D4"/>
@@ -4214,7 +5006,7 @@
       </w:pPr>
     </w:lvl>
   </w:abstractNum>
-  <w:abstractNum w:abstractNumId="28" w15:restartNumberingAfterBreak="0">
+  <w:abstractNum w:abstractNumId="29" w15:restartNumberingAfterBreak="0">
     <w:nsid w:val="197C6FD7"/>
     <w:multiLevelType w:val="hybridMultilevel"/>
     <w:tmpl w:val="D97CEAA8"/>
@@ -4327,7 +5119,7 @@
       </w:rPr>
     </w:lvl>
   </w:abstractNum>
-  <w:abstractNum w:abstractNumId="29" w15:restartNumberingAfterBreak="0">
+  <w:abstractNum w:abstractNumId="30" w15:restartNumberingAfterBreak="0">
     <w:nsid w:val="1CC60A94"/>
     <w:multiLevelType w:val="multilevel"/>
     <w:tmpl w:val="EB74741C"/>
@@ -4476,7 +5268,7 @@
       </w:rPr>
     </w:lvl>
   </w:abstractNum>
-  <w:abstractNum w:abstractNumId="30" w15:restartNumberingAfterBreak="0">
+  <w:abstractNum w:abstractNumId="31" w15:restartNumberingAfterBreak="0">
     <w:nsid w:val="1E6658CF"/>
     <w:multiLevelType w:val="multilevel"/>
     <w:tmpl w:val="762ABC5E"/>
@@ -4625,7 +5417,7 @@
       </w:rPr>
     </w:lvl>
   </w:abstractNum>
-  <w:abstractNum w:abstractNumId="31" w15:restartNumberingAfterBreak="0">
+  <w:abstractNum w:abstractNumId="32" w15:restartNumberingAfterBreak="0">
     <w:nsid w:val="1FA532B0"/>
     <w:multiLevelType w:val="multilevel"/>
     <w:tmpl w:val="8718294C"/>
@@ -4774,7 +5566,7 @@
       </w:rPr>
     </w:lvl>
   </w:abstractNum>
-  <w:abstractNum w:abstractNumId="32" w15:restartNumberingAfterBreak="0">
+  <w:abstractNum w:abstractNumId="33" w15:restartNumberingAfterBreak="0">
     <w:nsid w:val="215C77FD"/>
     <w:multiLevelType w:val="hybridMultilevel"/>
     <w:tmpl w:val="58F41D10"/>
@@ -4863,7 +5655,7 @@
       </w:pPr>
     </w:lvl>
   </w:abstractNum>
-  <w:abstractNum w:abstractNumId="33" w15:restartNumberingAfterBreak="0">
+  <w:abstractNum w:abstractNumId="34" w15:restartNumberingAfterBreak="0">
     <w:nsid w:val="218D5909"/>
     <w:multiLevelType w:val="hybridMultilevel"/>
     <w:tmpl w:val="CC989EE4"/>
@@ -4976,7 +5768,7 @@
       </w:rPr>
     </w:lvl>
   </w:abstractNum>
-  <w:abstractNum w:abstractNumId="34" w15:restartNumberingAfterBreak="0">
+  <w:abstractNum w:abstractNumId="35" w15:restartNumberingAfterBreak="0">
     <w:nsid w:val="23E010BA"/>
     <w:multiLevelType w:val="multilevel"/>
     <w:tmpl w:val="4A16907E"/>
@@ -5125,7 +5917,7 @@
       </w:rPr>
     </w:lvl>
   </w:abstractNum>
-  <w:abstractNum w:abstractNumId="35" w15:restartNumberingAfterBreak="0">
+  <w:abstractNum w:abstractNumId="36" w15:restartNumberingAfterBreak="0">
     <w:nsid w:val="2470127A"/>
     <w:multiLevelType w:val="multilevel"/>
     <w:tmpl w:val="309E9618"/>
@@ -5274,7 +6066,7 @@
       </w:rPr>
     </w:lvl>
   </w:abstractNum>
-  <w:abstractNum w:abstractNumId="36" w15:restartNumberingAfterBreak="0">
+  <w:abstractNum w:abstractNumId="37" w15:restartNumberingAfterBreak="0">
     <w:nsid w:val="24796798"/>
     <w:multiLevelType w:val="hybridMultilevel"/>
     <w:tmpl w:val="6622BEDC"/>
@@ -5363,7 +6155,7 @@
       </w:pPr>
     </w:lvl>
   </w:abstractNum>
-  <w:abstractNum w:abstractNumId="37" w15:restartNumberingAfterBreak="0">
+  <w:abstractNum w:abstractNumId="38" w15:restartNumberingAfterBreak="0">
     <w:nsid w:val="253B76EC"/>
     <w:multiLevelType w:val="multilevel"/>
     <w:tmpl w:val="2AA67CDA"/>
@@ -5512,7 +6304,7 @@
       </w:rPr>
     </w:lvl>
   </w:abstractNum>
-  <w:abstractNum w:abstractNumId="38" w15:restartNumberingAfterBreak="0">
+  <w:abstractNum w:abstractNumId="39" w15:restartNumberingAfterBreak="0">
     <w:nsid w:val="2E4D738C"/>
     <w:multiLevelType w:val="multilevel"/>
     <w:tmpl w:val="1540BBA2"/>
@@ -5661,7 +6453,7 @@
       </w:rPr>
     </w:lvl>
   </w:abstractNum>
-  <w:abstractNum w:abstractNumId="39" w15:restartNumberingAfterBreak="0">
+  <w:abstractNum w:abstractNumId="40" w15:restartNumberingAfterBreak="0">
     <w:nsid w:val="2F0041C7"/>
     <w:multiLevelType w:val="multilevel"/>
     <w:tmpl w:val="656414FE"/>
@@ -5810,7 +6602,7 @@
       </w:rPr>
     </w:lvl>
   </w:abstractNum>
-  <w:abstractNum w:abstractNumId="40" w15:restartNumberingAfterBreak="0">
+  <w:abstractNum w:abstractNumId="41" w15:restartNumberingAfterBreak="0">
     <w:nsid w:val="304F01FA"/>
     <w:multiLevelType w:val="multilevel"/>
     <w:tmpl w:val="151C4EC6"/>
@@ -5959,7 +6751,7 @@
       </w:rPr>
     </w:lvl>
   </w:abstractNum>
-  <w:abstractNum w:abstractNumId="41" w15:restartNumberingAfterBreak="0">
+  <w:abstractNum w:abstractNumId="42" w15:restartNumberingAfterBreak="0">
     <w:nsid w:val="30BD025D"/>
     <w:multiLevelType w:val="hybridMultilevel"/>
     <w:tmpl w:val="04381C82"/>
@@ -6048,7 +6840,7 @@
       </w:pPr>
     </w:lvl>
   </w:abstractNum>
-  <w:abstractNum w:abstractNumId="42" w15:restartNumberingAfterBreak="0">
+  <w:abstractNum w:abstractNumId="43" w15:restartNumberingAfterBreak="0">
     <w:nsid w:val="327C0BA6"/>
     <w:multiLevelType w:val="hybridMultilevel"/>
     <w:tmpl w:val="2A9047EE"/>
@@ -6161,7 +6953,7 @@
       </w:rPr>
     </w:lvl>
   </w:abstractNum>
-  <w:abstractNum w:abstractNumId="43" w15:restartNumberingAfterBreak="0">
+  <w:abstractNum w:abstractNumId="44" w15:restartNumberingAfterBreak="0">
     <w:nsid w:val="338D63E8"/>
     <w:multiLevelType w:val="hybridMultilevel"/>
     <w:tmpl w:val="28D0FB50"/>
@@ -6274,7 +7066,7 @@
       </w:rPr>
     </w:lvl>
   </w:abstractNum>
-  <w:abstractNum w:abstractNumId="44" w15:restartNumberingAfterBreak="0">
+  <w:abstractNum w:abstractNumId="45" w15:restartNumberingAfterBreak="0">
     <w:nsid w:val="34182771"/>
     <w:multiLevelType w:val="multilevel"/>
     <w:tmpl w:val="2AA67CDA"/>
@@ -6423,7 +7215,7 @@
       </w:rPr>
     </w:lvl>
   </w:abstractNum>
-  <w:abstractNum w:abstractNumId="45" w15:restartNumberingAfterBreak="0">
+  <w:abstractNum w:abstractNumId="46" w15:restartNumberingAfterBreak="0">
     <w:nsid w:val="35413E58"/>
     <w:multiLevelType w:val="hybridMultilevel"/>
     <w:tmpl w:val="03C64164"/>
@@ -6536,7 +7328,7 @@
       </w:rPr>
     </w:lvl>
   </w:abstractNum>
-  <w:abstractNum w:abstractNumId="46" w15:restartNumberingAfterBreak="0">
+  <w:abstractNum w:abstractNumId="47" w15:restartNumberingAfterBreak="0">
     <w:nsid w:val="35C86AF0"/>
     <w:multiLevelType w:val="multilevel"/>
     <w:tmpl w:val="8202FCD6"/>
@@ -6685,7 +7477,7 @@
       </w:rPr>
     </w:lvl>
   </w:abstractNum>
-  <w:abstractNum w:abstractNumId="47" w15:restartNumberingAfterBreak="0">
+  <w:abstractNum w:abstractNumId="48" w15:restartNumberingAfterBreak="0">
     <w:nsid w:val="3623194A"/>
     <w:multiLevelType w:val="multilevel"/>
     <w:tmpl w:val="63F4E6F0"/>
@@ -6834,7 +7626,7 @@
       </w:rPr>
     </w:lvl>
   </w:abstractNum>
-  <w:abstractNum w:abstractNumId="48" w15:restartNumberingAfterBreak="0">
+  <w:abstractNum w:abstractNumId="49" w15:restartNumberingAfterBreak="0">
     <w:nsid w:val="36E36979"/>
     <w:multiLevelType w:val="multilevel"/>
     <w:tmpl w:val="3D58C93A"/>
@@ -6983,7 +7775,7 @@
       </w:rPr>
     </w:lvl>
   </w:abstractNum>
-  <w:abstractNum w:abstractNumId="49" w15:restartNumberingAfterBreak="0">
+  <w:abstractNum w:abstractNumId="50" w15:restartNumberingAfterBreak="0">
     <w:nsid w:val="37B424C3"/>
     <w:multiLevelType w:val="hybridMultilevel"/>
     <w:tmpl w:val="18F030D4"/>
@@ -7096,7 +7888,7 @@
       </w:rPr>
     </w:lvl>
   </w:abstractNum>
-  <w:abstractNum w:abstractNumId="50" w15:restartNumberingAfterBreak="0">
+  <w:abstractNum w:abstractNumId="51" w15:restartNumberingAfterBreak="0">
     <w:nsid w:val="3BC10D30"/>
     <w:multiLevelType w:val="multilevel"/>
     <w:tmpl w:val="502AD78C"/>
@@ -7245,7 +8037,7 @@
       </w:rPr>
     </w:lvl>
   </w:abstractNum>
-  <w:abstractNum w:abstractNumId="51" w15:restartNumberingAfterBreak="0">
+  <w:abstractNum w:abstractNumId="52" w15:restartNumberingAfterBreak="0">
     <w:nsid w:val="3C276BB8"/>
     <w:multiLevelType w:val="multilevel"/>
     <w:tmpl w:val="2AA67CDA"/>
@@ -7394,7 +8186,7 @@
       </w:rPr>
     </w:lvl>
   </w:abstractNum>
-  <w:abstractNum w:abstractNumId="52" w15:restartNumberingAfterBreak="0">
+  <w:abstractNum w:abstractNumId="53" w15:restartNumberingAfterBreak="0">
     <w:nsid w:val="3C596808"/>
     <w:multiLevelType w:val="multilevel"/>
     <w:tmpl w:val="2AA67CDA"/>
@@ -7543,7 +8335,7 @@
       </w:rPr>
     </w:lvl>
   </w:abstractNum>
-  <w:abstractNum w:abstractNumId="53" w15:restartNumberingAfterBreak="0">
+  <w:abstractNum w:abstractNumId="54" w15:restartNumberingAfterBreak="0">
     <w:nsid w:val="3CBF280A"/>
     <w:multiLevelType w:val="multilevel"/>
     <w:tmpl w:val="A13E4362"/>
@@ -7692,7 +8484,7 @@
       </w:rPr>
     </w:lvl>
   </w:abstractNum>
-  <w:abstractNum w:abstractNumId="54" w15:restartNumberingAfterBreak="0">
+  <w:abstractNum w:abstractNumId="55" w15:restartNumberingAfterBreak="0">
     <w:nsid w:val="3CC7541B"/>
     <w:multiLevelType w:val="multilevel"/>
     <w:tmpl w:val="2AA67CDA"/>
@@ -7841,7 +8633,7 @@
       </w:rPr>
     </w:lvl>
   </w:abstractNum>
-  <w:abstractNum w:abstractNumId="55" w15:restartNumberingAfterBreak="0">
+  <w:abstractNum w:abstractNumId="56" w15:restartNumberingAfterBreak="0">
     <w:nsid w:val="3F5E3BA1"/>
     <w:multiLevelType w:val="multilevel"/>
     <w:tmpl w:val="2AA67CDA"/>
@@ -7990,7 +8782,7 @@
       </w:rPr>
     </w:lvl>
   </w:abstractNum>
-  <w:abstractNum w:abstractNumId="56" w15:restartNumberingAfterBreak="0">
+  <w:abstractNum w:abstractNumId="57" w15:restartNumberingAfterBreak="0">
     <w:nsid w:val="40431B1C"/>
     <w:multiLevelType w:val="multilevel"/>
     <w:tmpl w:val="5D8E77D0"/>
@@ -8139,7 +8931,7 @@
       </w:rPr>
     </w:lvl>
   </w:abstractNum>
-  <w:abstractNum w:abstractNumId="57" w15:restartNumberingAfterBreak="0">
+  <w:abstractNum w:abstractNumId="58" w15:restartNumberingAfterBreak="0">
     <w:nsid w:val="419E0199"/>
     <w:multiLevelType w:val="multilevel"/>
     <w:tmpl w:val="D6CA9606"/>
@@ -8288,7 +9080,7 @@
       </w:rPr>
     </w:lvl>
   </w:abstractNum>
-  <w:abstractNum w:abstractNumId="58" w15:restartNumberingAfterBreak="0">
+  <w:abstractNum w:abstractNumId="59" w15:restartNumberingAfterBreak="0">
     <w:nsid w:val="452F60FB"/>
     <w:multiLevelType w:val="hybridMultilevel"/>
     <w:tmpl w:val="892A990A"/>
@@ -8401,7 +9193,7 @@
       </w:rPr>
     </w:lvl>
   </w:abstractNum>
-  <w:abstractNum w:abstractNumId="59" w15:restartNumberingAfterBreak="0">
+  <w:abstractNum w:abstractNumId="60" w15:restartNumberingAfterBreak="0">
     <w:nsid w:val="47B65409"/>
     <w:multiLevelType w:val="multilevel"/>
     <w:tmpl w:val="2AA67CDA"/>
@@ -8550,7 +9342,7 @@
       </w:rPr>
     </w:lvl>
   </w:abstractNum>
-  <w:abstractNum w:abstractNumId="60" w15:restartNumberingAfterBreak="0">
+  <w:abstractNum w:abstractNumId="61" w15:restartNumberingAfterBreak="0">
     <w:nsid w:val="47BF2170"/>
     <w:multiLevelType w:val="multilevel"/>
     <w:tmpl w:val="D9681266"/>
@@ -8699,7 +9491,7 @@
       </w:rPr>
     </w:lvl>
   </w:abstractNum>
-  <w:abstractNum w:abstractNumId="61" w15:restartNumberingAfterBreak="0">
+  <w:abstractNum w:abstractNumId="62" w15:restartNumberingAfterBreak="0">
     <w:nsid w:val="47E5592F"/>
     <w:multiLevelType w:val="hybridMultilevel"/>
     <w:tmpl w:val="719AB9FA"/>
@@ -8812,7 +9604,7 @@
       </w:rPr>
     </w:lvl>
   </w:abstractNum>
-  <w:abstractNum w:abstractNumId="62" w15:restartNumberingAfterBreak="0">
+  <w:abstractNum w:abstractNumId="63" w15:restartNumberingAfterBreak="0">
     <w:nsid w:val="48C041A9"/>
     <w:multiLevelType w:val="multilevel"/>
     <w:tmpl w:val="59A694BC"/>
@@ -8961,7 +9753,7 @@
       </w:rPr>
     </w:lvl>
   </w:abstractNum>
-  <w:abstractNum w:abstractNumId="63" w15:restartNumberingAfterBreak="0">
+  <w:abstractNum w:abstractNumId="64" w15:restartNumberingAfterBreak="0">
     <w:nsid w:val="49D6568A"/>
     <w:multiLevelType w:val="multilevel"/>
     <w:tmpl w:val="559E29EC"/>
@@ -9110,7 +9902,7 @@
       </w:rPr>
     </w:lvl>
   </w:abstractNum>
-  <w:abstractNum w:abstractNumId="64" w15:restartNumberingAfterBreak="0">
+  <w:abstractNum w:abstractNumId="65" w15:restartNumberingAfterBreak="0">
     <w:nsid w:val="4AF73293"/>
     <w:multiLevelType w:val="hybridMultilevel"/>
     <w:tmpl w:val="F2962738"/>
@@ -9223,7 +10015,7 @@
       </w:rPr>
     </w:lvl>
   </w:abstractNum>
-  <w:abstractNum w:abstractNumId="65" w15:restartNumberingAfterBreak="0">
+  <w:abstractNum w:abstractNumId="66" w15:restartNumberingAfterBreak="0">
     <w:nsid w:val="4B375248"/>
     <w:multiLevelType w:val="multilevel"/>
     <w:tmpl w:val="B574C1C6"/>
@@ -9372,7 +10164,7 @@
       </w:rPr>
     </w:lvl>
   </w:abstractNum>
-  <w:abstractNum w:abstractNumId="66" w15:restartNumberingAfterBreak="0">
+  <w:abstractNum w:abstractNumId="67" w15:restartNumberingAfterBreak="0">
     <w:nsid w:val="4BA13766"/>
     <w:multiLevelType w:val="multilevel"/>
     <w:tmpl w:val="63F4E6F0"/>
@@ -9521,7 +10313,7 @@
       </w:rPr>
     </w:lvl>
   </w:abstractNum>
-  <w:abstractNum w:abstractNumId="67" w15:restartNumberingAfterBreak="0">
+  <w:abstractNum w:abstractNumId="68" w15:restartNumberingAfterBreak="0">
     <w:nsid w:val="4BA25441"/>
     <w:multiLevelType w:val="hybridMultilevel"/>
     <w:tmpl w:val="217E2E96"/>
@@ -9634,7 +10426,7 @@
       </w:rPr>
     </w:lvl>
   </w:abstractNum>
-  <w:abstractNum w:abstractNumId="68" w15:restartNumberingAfterBreak="0">
+  <w:abstractNum w:abstractNumId="69" w15:restartNumberingAfterBreak="0">
     <w:nsid w:val="4E276DCB"/>
     <w:multiLevelType w:val="hybridMultilevel"/>
     <w:tmpl w:val="B7C469B4"/>
@@ -9747,7 +10539,7 @@
       </w:rPr>
     </w:lvl>
   </w:abstractNum>
-  <w:abstractNum w:abstractNumId="69" w15:restartNumberingAfterBreak="0">
+  <w:abstractNum w:abstractNumId="70" w15:restartNumberingAfterBreak="0">
     <w:nsid w:val="4F053929"/>
     <w:multiLevelType w:val="hybridMultilevel"/>
     <w:tmpl w:val="2A78C678"/>
@@ -9860,7 +10652,7 @@
       </w:rPr>
     </w:lvl>
   </w:abstractNum>
-  <w:abstractNum w:abstractNumId="70" w15:restartNumberingAfterBreak="0">
+  <w:abstractNum w:abstractNumId="71" w15:restartNumberingAfterBreak="0">
     <w:nsid w:val="4FFB237E"/>
     <w:multiLevelType w:val="multilevel"/>
     <w:tmpl w:val="2AA67CDA"/>
@@ -10009,7 +10801,7 @@
       </w:rPr>
     </w:lvl>
   </w:abstractNum>
-  <w:abstractNum w:abstractNumId="71" w15:restartNumberingAfterBreak="0">
+  <w:abstractNum w:abstractNumId="72" w15:restartNumberingAfterBreak="0">
     <w:nsid w:val="51737FE0"/>
     <w:multiLevelType w:val="hybridMultilevel"/>
     <w:tmpl w:val="2B0604E6"/>
@@ -10122,7 +10914,7 @@
       </w:rPr>
     </w:lvl>
   </w:abstractNum>
-  <w:abstractNum w:abstractNumId="72" w15:restartNumberingAfterBreak="0">
+  <w:abstractNum w:abstractNumId="73" w15:restartNumberingAfterBreak="0">
     <w:nsid w:val="518B1885"/>
     <w:multiLevelType w:val="multilevel"/>
     <w:tmpl w:val="AE1AAC28"/>
@@ -10271,7 +11063,7 @@
       </w:rPr>
     </w:lvl>
   </w:abstractNum>
-  <w:abstractNum w:abstractNumId="73" w15:restartNumberingAfterBreak="0">
+  <w:abstractNum w:abstractNumId="74" w15:restartNumberingAfterBreak="0">
     <w:nsid w:val="51A86EF8"/>
     <w:multiLevelType w:val="multilevel"/>
     <w:tmpl w:val="FF2841D4"/>
@@ -10420,7 +11212,7 @@
       </w:rPr>
     </w:lvl>
   </w:abstractNum>
-  <w:abstractNum w:abstractNumId="74" w15:restartNumberingAfterBreak="0">
+  <w:abstractNum w:abstractNumId="75" w15:restartNumberingAfterBreak="0">
     <w:nsid w:val="51AB55CC"/>
     <w:multiLevelType w:val="multilevel"/>
     <w:tmpl w:val="5986D838"/>
@@ -10569,7 +11361,7 @@
       </w:rPr>
     </w:lvl>
   </w:abstractNum>
-  <w:abstractNum w:abstractNumId="75" w15:restartNumberingAfterBreak="0">
+  <w:abstractNum w:abstractNumId="76" w15:restartNumberingAfterBreak="0">
     <w:nsid w:val="521378FF"/>
     <w:multiLevelType w:val="multilevel"/>
     <w:tmpl w:val="7B002268"/>
@@ -10718,7 +11510,7 @@
       </w:rPr>
     </w:lvl>
   </w:abstractNum>
-  <w:abstractNum w:abstractNumId="76" w15:restartNumberingAfterBreak="0">
+  <w:abstractNum w:abstractNumId="77" w15:restartNumberingAfterBreak="0">
     <w:nsid w:val="521F2792"/>
     <w:multiLevelType w:val="multilevel"/>
     <w:tmpl w:val="9FB45386"/>
@@ -10867,7 +11659,7 @@
       </w:rPr>
     </w:lvl>
   </w:abstractNum>
-  <w:abstractNum w:abstractNumId="77" w15:restartNumberingAfterBreak="0">
+  <w:abstractNum w:abstractNumId="78" w15:restartNumberingAfterBreak="0">
     <w:nsid w:val="53390911"/>
     <w:multiLevelType w:val="multilevel"/>
     <w:tmpl w:val="1C380F12"/>
@@ -11016,7 +11808,7 @@
       </w:rPr>
     </w:lvl>
   </w:abstractNum>
-  <w:abstractNum w:abstractNumId="78" w15:restartNumberingAfterBreak="0">
+  <w:abstractNum w:abstractNumId="79" w15:restartNumberingAfterBreak="0">
     <w:nsid w:val="53CD23AC"/>
     <w:multiLevelType w:val="multilevel"/>
     <w:tmpl w:val="57BAE8F0"/>
@@ -11165,7 +11957,7 @@
       </w:rPr>
     </w:lvl>
   </w:abstractNum>
-  <w:abstractNum w:abstractNumId="79" w15:restartNumberingAfterBreak="0">
+  <w:abstractNum w:abstractNumId="80" w15:restartNumberingAfterBreak="0">
     <w:nsid w:val="5462791F"/>
     <w:multiLevelType w:val="hybridMultilevel"/>
     <w:tmpl w:val="FDE24C26"/>
@@ -11278,7 +12070,7 @@
       </w:rPr>
     </w:lvl>
   </w:abstractNum>
-  <w:abstractNum w:abstractNumId="80" w15:restartNumberingAfterBreak="0">
+  <w:abstractNum w:abstractNumId="81" w15:restartNumberingAfterBreak="0">
     <w:nsid w:val="547005EB"/>
     <w:multiLevelType w:val="multilevel"/>
     <w:tmpl w:val="F260CC5C"/>
@@ -11427,7 +12219,7 @@
       </w:rPr>
     </w:lvl>
   </w:abstractNum>
-  <w:abstractNum w:abstractNumId="81" w15:restartNumberingAfterBreak="0">
+  <w:abstractNum w:abstractNumId="82" w15:restartNumberingAfterBreak="0">
     <w:nsid w:val="58034221"/>
     <w:multiLevelType w:val="hybridMultilevel"/>
     <w:tmpl w:val="65D0619C"/>
@@ -11540,7 +12332,156 @@
       </w:rPr>
     </w:lvl>
   </w:abstractNum>
-  <w:abstractNum w:abstractNumId="82" w15:restartNumberingAfterBreak="0">
+  <w:abstractNum w:abstractNumId="83" w15:restartNumberingAfterBreak="0">
+    <w:nsid w:val="59515319"/>
+    <w:multiLevelType w:val="multilevel"/>
+    <w:tmpl w:val="5AD8ACF0"/>
+    <w:lvl w:ilvl="0">
+      <w:start w:val="1"/>
+      <w:numFmt w:val="bullet"/>
+      <w:lvlText w:val=""/>
+      <w:lvlJc w:val="left"/>
+      <w:pPr>
+        <w:tabs>
+          <w:tab w:val="num" w:pos="720"/>
+        </w:tabs>
+        <w:ind w:left="720" w:hanging="360"/>
+      </w:pPr>
+      <w:rPr>
+        <w:rFonts w:ascii="Symbol" w:hAnsi="Symbol" w:hint="default"/>
+        <w:sz w:val="20"/>
+      </w:rPr>
+    </w:lvl>
+    <w:lvl w:ilvl="1" w:tentative="1">
+      <w:start w:val="1"/>
+      <w:numFmt w:val="bullet"/>
+      <w:lvlText w:val="o"/>
+      <w:lvlJc w:val="left"/>
+      <w:pPr>
+        <w:tabs>
+          <w:tab w:val="num" w:pos="1440"/>
+        </w:tabs>
+        <w:ind w:left="1440" w:hanging="360"/>
+      </w:pPr>
+      <w:rPr>
+        <w:rFonts w:ascii="Courier New" w:hAnsi="Courier New" w:hint="default"/>
+        <w:sz w:val="20"/>
+      </w:rPr>
+    </w:lvl>
+    <w:lvl w:ilvl="2" w:tentative="1">
+      <w:start w:val="1"/>
+      <w:numFmt w:val="bullet"/>
+      <w:lvlText w:val=""/>
+      <w:lvlJc w:val="left"/>
+      <w:pPr>
+        <w:tabs>
+          <w:tab w:val="num" w:pos="2160"/>
+        </w:tabs>
+        <w:ind w:left="2160" w:hanging="360"/>
+      </w:pPr>
+      <w:rPr>
+        <w:rFonts w:ascii="Wingdings" w:hAnsi="Wingdings" w:hint="default"/>
+        <w:sz w:val="20"/>
+      </w:rPr>
+    </w:lvl>
+    <w:lvl w:ilvl="3" w:tentative="1">
+      <w:start w:val="1"/>
+      <w:numFmt w:val="bullet"/>
+      <w:lvlText w:val=""/>
+      <w:lvlJc w:val="left"/>
+      <w:pPr>
+        <w:tabs>
+          <w:tab w:val="num" w:pos="2880"/>
+        </w:tabs>
+        <w:ind w:left="2880" w:hanging="360"/>
+      </w:pPr>
+      <w:rPr>
+        <w:rFonts w:ascii="Wingdings" w:hAnsi="Wingdings" w:hint="default"/>
+        <w:sz w:val="20"/>
+      </w:rPr>
+    </w:lvl>
+    <w:lvl w:ilvl="4" w:tentative="1">
+      <w:start w:val="1"/>
+      <w:numFmt w:val="bullet"/>
+      <w:lvlText w:val=""/>
+      <w:lvlJc w:val="left"/>
+      <w:pPr>
+        <w:tabs>
+          <w:tab w:val="num" w:pos="3600"/>
+        </w:tabs>
+        <w:ind w:left="3600" w:hanging="360"/>
+      </w:pPr>
+      <w:rPr>
+        <w:rFonts w:ascii="Wingdings" w:hAnsi="Wingdings" w:hint="default"/>
+        <w:sz w:val="20"/>
+      </w:rPr>
+    </w:lvl>
+    <w:lvl w:ilvl="5" w:tentative="1">
+      <w:start w:val="1"/>
+      <w:numFmt w:val="bullet"/>
+      <w:lvlText w:val=""/>
+      <w:lvlJc w:val="left"/>
+      <w:pPr>
+        <w:tabs>
+          <w:tab w:val="num" w:pos="4320"/>
+        </w:tabs>
+        <w:ind w:left="4320" w:hanging="360"/>
+      </w:pPr>
+      <w:rPr>
+        <w:rFonts w:ascii="Wingdings" w:hAnsi="Wingdings" w:hint="default"/>
+        <w:sz w:val="20"/>
+      </w:rPr>
+    </w:lvl>
+    <w:lvl w:ilvl="6" w:tentative="1">
+      <w:start w:val="1"/>
+      <w:numFmt w:val="bullet"/>
+      <w:lvlText w:val=""/>
+      <w:lvlJc w:val="left"/>
+      <w:pPr>
+        <w:tabs>
+          <w:tab w:val="num" w:pos="5040"/>
+        </w:tabs>
+        <w:ind w:left="5040" w:hanging="360"/>
+      </w:pPr>
+      <w:rPr>
+        <w:rFonts w:ascii="Wingdings" w:hAnsi="Wingdings" w:hint="default"/>
+        <w:sz w:val="20"/>
+      </w:rPr>
+    </w:lvl>
+    <w:lvl w:ilvl="7" w:tentative="1">
+      <w:start w:val="1"/>
+      <w:numFmt w:val="bullet"/>
+      <w:lvlText w:val=""/>
+      <w:lvlJc w:val="left"/>
+      <w:pPr>
+        <w:tabs>
+          <w:tab w:val="num" w:pos="5760"/>
+        </w:tabs>
+        <w:ind w:left="5760" w:hanging="360"/>
+      </w:pPr>
+      <w:rPr>
+        <w:rFonts w:ascii="Wingdings" w:hAnsi="Wingdings" w:hint="default"/>
+        <w:sz w:val="20"/>
+      </w:rPr>
+    </w:lvl>
+    <w:lvl w:ilvl="8" w:tentative="1">
+      <w:start w:val="1"/>
+      <w:numFmt w:val="bullet"/>
+      <w:lvlText w:val=""/>
+      <w:lvlJc w:val="left"/>
+      <w:pPr>
+        <w:tabs>
+          <w:tab w:val="num" w:pos="6480"/>
+        </w:tabs>
+        <w:ind w:left="6480" w:hanging="360"/>
+      </w:pPr>
+      <w:rPr>
+        <w:rFonts w:ascii="Wingdings" w:hAnsi="Wingdings" w:hint="default"/>
+        <w:sz w:val="20"/>
+      </w:rPr>
+    </w:lvl>
+  </w:abstractNum>
+  <w:abstractNum w:abstractNumId="84" w15:restartNumberingAfterBreak="0">
     <w:nsid w:val="5A460390"/>
     <w:multiLevelType w:val="hybridMultilevel"/>
     <w:tmpl w:val="BD8E939C"/>
@@ -11653,7 +12594,7 @@
       </w:rPr>
     </w:lvl>
   </w:abstractNum>
-  <w:abstractNum w:abstractNumId="83" w15:restartNumberingAfterBreak="0">
+  <w:abstractNum w:abstractNumId="85" w15:restartNumberingAfterBreak="0">
     <w:nsid w:val="5CEE630B"/>
     <w:multiLevelType w:val="hybridMultilevel"/>
     <w:tmpl w:val="DE8E8DBA"/>
@@ -11766,7 +12707,7 @@
       </w:rPr>
     </w:lvl>
   </w:abstractNum>
-  <w:abstractNum w:abstractNumId="84" w15:restartNumberingAfterBreak="0">
+  <w:abstractNum w:abstractNumId="86" w15:restartNumberingAfterBreak="0">
     <w:nsid w:val="5D5A183C"/>
     <w:multiLevelType w:val="multilevel"/>
     <w:tmpl w:val="C804C34A"/>
@@ -11915,7 +12856,7 @@
       </w:rPr>
     </w:lvl>
   </w:abstractNum>
-  <w:abstractNum w:abstractNumId="85" w15:restartNumberingAfterBreak="0">
+  <w:abstractNum w:abstractNumId="87" w15:restartNumberingAfterBreak="0">
     <w:nsid w:val="5DF95194"/>
     <w:multiLevelType w:val="multilevel"/>
     <w:tmpl w:val="CC127E54"/>
@@ -12064,7 +13005,120 @@
       </w:rPr>
     </w:lvl>
   </w:abstractNum>
-  <w:abstractNum w:abstractNumId="86" w15:restartNumberingAfterBreak="0">
+  <w:abstractNum w:abstractNumId="88" w15:restartNumberingAfterBreak="0">
+    <w:nsid w:val="5E6333E0"/>
+    <w:multiLevelType w:val="hybridMultilevel"/>
+    <w:tmpl w:val="A15497C8"/>
+    <w:lvl w:ilvl="0" w:tplc="04090005">
+      <w:start w:val="1"/>
+      <w:numFmt w:val="bullet"/>
+      <w:lvlText w:val=""/>
+      <w:lvlJc w:val="left"/>
+      <w:pPr>
+        <w:ind w:left="1080" w:hanging="360"/>
+      </w:pPr>
+      <w:rPr>
+        <w:rFonts w:ascii="Wingdings" w:hAnsi="Wingdings" w:hint="default"/>
+      </w:rPr>
+    </w:lvl>
+    <w:lvl w:ilvl="1" w:tplc="04090003" w:tentative="1">
+      <w:start w:val="1"/>
+      <w:numFmt w:val="bullet"/>
+      <w:lvlText w:val="o"/>
+      <w:lvlJc w:val="left"/>
+      <w:pPr>
+        <w:ind w:left="1800" w:hanging="360"/>
+      </w:pPr>
+      <w:rPr>
+        <w:rFonts w:ascii="Courier New" w:hAnsi="Courier New" w:cs="Courier New" w:hint="default"/>
+      </w:rPr>
+    </w:lvl>
+    <w:lvl w:ilvl="2" w:tplc="04090005" w:tentative="1">
+      <w:start w:val="1"/>
+      <w:numFmt w:val="bullet"/>
+      <w:lvlText w:val=""/>
+      <w:lvlJc w:val="left"/>
+      <w:pPr>
+        <w:ind w:left="2520" w:hanging="360"/>
+      </w:pPr>
+      <w:rPr>
+        <w:rFonts w:ascii="Wingdings" w:hAnsi="Wingdings" w:hint="default"/>
+      </w:rPr>
+    </w:lvl>
+    <w:lvl w:ilvl="3" w:tplc="04090001" w:tentative="1">
+      <w:start w:val="1"/>
+      <w:numFmt w:val="bullet"/>
+      <w:lvlText w:val=""/>
+      <w:lvlJc w:val="left"/>
+      <w:pPr>
+        <w:ind w:left="3240" w:hanging="360"/>
+      </w:pPr>
+      <w:rPr>
+        <w:rFonts w:ascii="Symbol" w:hAnsi="Symbol" w:hint="default"/>
+      </w:rPr>
+    </w:lvl>
+    <w:lvl w:ilvl="4" w:tplc="04090003" w:tentative="1">
+      <w:start w:val="1"/>
+      <w:numFmt w:val="bullet"/>
+      <w:lvlText w:val="o"/>
+      <w:lvlJc w:val="left"/>
+      <w:pPr>
+        <w:ind w:left="3960" w:hanging="360"/>
+      </w:pPr>
+      <w:rPr>
+        <w:rFonts w:ascii="Courier New" w:hAnsi="Courier New" w:cs="Courier New" w:hint="default"/>
+      </w:rPr>
+    </w:lvl>
+    <w:lvl w:ilvl="5" w:tplc="04090005" w:tentative="1">
+      <w:start w:val="1"/>
+      <w:numFmt w:val="bullet"/>
+      <w:lvlText w:val=""/>
+      <w:lvlJc w:val="left"/>
+      <w:pPr>
+        <w:ind w:left="4680" w:hanging="360"/>
+      </w:pPr>
+      <w:rPr>
+        <w:rFonts w:ascii="Wingdings" w:hAnsi="Wingdings" w:hint="default"/>
+      </w:rPr>
+    </w:lvl>
+    <w:lvl w:ilvl="6" w:tplc="04090001" w:tentative="1">
+      <w:start w:val="1"/>
+      <w:numFmt w:val="bullet"/>
+      <w:lvlText w:val=""/>
+      <w:lvlJc w:val="left"/>
+      <w:pPr>
+        <w:ind w:left="5400" w:hanging="360"/>
+      </w:pPr>
+      <w:rPr>
+        <w:rFonts w:ascii="Symbol" w:hAnsi="Symbol" w:hint="default"/>
+      </w:rPr>
+    </w:lvl>
+    <w:lvl w:ilvl="7" w:tplc="04090003" w:tentative="1">
+      <w:start w:val="1"/>
+      <w:numFmt w:val="bullet"/>
+      <w:lvlText w:val="o"/>
+      <w:lvlJc w:val="left"/>
+      <w:pPr>
+        <w:ind w:left="6120" w:hanging="360"/>
+      </w:pPr>
+      <w:rPr>
+        <w:rFonts w:ascii="Courier New" w:hAnsi="Courier New" w:cs="Courier New" w:hint="default"/>
+      </w:rPr>
+    </w:lvl>
+    <w:lvl w:ilvl="8" w:tplc="04090005" w:tentative="1">
+      <w:start w:val="1"/>
+      <w:numFmt w:val="bullet"/>
+      <w:lvlText w:val=""/>
+      <w:lvlJc w:val="left"/>
+      <w:pPr>
+        <w:ind w:left="6840" w:hanging="360"/>
+      </w:pPr>
+      <w:rPr>
+        <w:rFonts w:ascii="Wingdings" w:hAnsi="Wingdings" w:hint="default"/>
+      </w:rPr>
+    </w:lvl>
+  </w:abstractNum>
+  <w:abstractNum w:abstractNumId="89" w15:restartNumberingAfterBreak="0">
     <w:nsid w:val="5E9C452C"/>
     <w:multiLevelType w:val="multilevel"/>
     <w:tmpl w:val="B8727936"/>
@@ -12213,7 +13267,7 @@
       </w:rPr>
     </w:lvl>
   </w:abstractNum>
-  <w:abstractNum w:abstractNumId="87" w15:restartNumberingAfterBreak="0">
+  <w:abstractNum w:abstractNumId="90" w15:restartNumberingAfterBreak="0">
     <w:nsid w:val="62385AA6"/>
     <w:multiLevelType w:val="multilevel"/>
     <w:tmpl w:val="B9EAECD4"/>
@@ -12362,7 +13416,7 @@
       </w:rPr>
     </w:lvl>
   </w:abstractNum>
-  <w:abstractNum w:abstractNumId="88" w15:restartNumberingAfterBreak="0">
+  <w:abstractNum w:abstractNumId="91" w15:restartNumberingAfterBreak="0">
     <w:nsid w:val="625D686D"/>
     <w:multiLevelType w:val="multilevel"/>
     <w:tmpl w:val="BC1C2048"/>
@@ -12511,7 +13565,7 @@
       </w:rPr>
     </w:lvl>
   </w:abstractNum>
-  <w:abstractNum w:abstractNumId="89" w15:restartNumberingAfterBreak="0">
+  <w:abstractNum w:abstractNumId="92" w15:restartNumberingAfterBreak="0">
     <w:nsid w:val="62B46951"/>
     <w:multiLevelType w:val="hybridMultilevel"/>
     <w:tmpl w:val="0FEAFEC6"/>
@@ -12624,7 +13678,7 @@
       </w:rPr>
     </w:lvl>
   </w:abstractNum>
-  <w:abstractNum w:abstractNumId="90" w15:restartNumberingAfterBreak="0">
+  <w:abstractNum w:abstractNumId="93" w15:restartNumberingAfterBreak="0">
     <w:nsid w:val="647819E3"/>
     <w:multiLevelType w:val="multilevel"/>
     <w:tmpl w:val="ABB278BC"/>
@@ -12773,7 +13827,7 @@
       </w:rPr>
     </w:lvl>
   </w:abstractNum>
-  <w:abstractNum w:abstractNumId="91" w15:restartNumberingAfterBreak="0">
+  <w:abstractNum w:abstractNumId="94" w15:restartNumberingAfterBreak="0">
     <w:nsid w:val="64F30198"/>
     <w:multiLevelType w:val="multilevel"/>
     <w:tmpl w:val="63F4E6F0"/>
@@ -12922,7 +13976,7 @@
       </w:rPr>
     </w:lvl>
   </w:abstractNum>
-  <w:abstractNum w:abstractNumId="92" w15:restartNumberingAfterBreak="0">
+  <w:abstractNum w:abstractNumId="95" w15:restartNumberingAfterBreak="0">
     <w:nsid w:val="65314293"/>
     <w:multiLevelType w:val="hybridMultilevel"/>
     <w:tmpl w:val="6688DFAC"/>
@@ -13035,7 +14089,7 @@
       </w:rPr>
     </w:lvl>
   </w:abstractNum>
-  <w:abstractNum w:abstractNumId="93" w15:restartNumberingAfterBreak="0">
+  <w:abstractNum w:abstractNumId="96" w15:restartNumberingAfterBreak="0">
     <w:nsid w:val="65CE4D0F"/>
     <w:multiLevelType w:val="hybridMultilevel"/>
     <w:tmpl w:val="DB668538"/>
@@ -13148,7 +14202,7 @@
       </w:rPr>
     </w:lvl>
   </w:abstractNum>
-  <w:abstractNum w:abstractNumId="94" w15:restartNumberingAfterBreak="0">
+  <w:abstractNum w:abstractNumId="97" w15:restartNumberingAfterBreak="0">
     <w:nsid w:val="661C7D73"/>
     <w:multiLevelType w:val="multilevel"/>
     <w:tmpl w:val="D9681266"/>
@@ -13297,7 +14351,156 @@
       </w:rPr>
     </w:lvl>
   </w:abstractNum>
-  <w:abstractNum w:abstractNumId="95" w15:restartNumberingAfterBreak="0">
+  <w:abstractNum w:abstractNumId="98" w15:restartNumberingAfterBreak="0">
+    <w:nsid w:val="661F6F82"/>
+    <w:multiLevelType w:val="multilevel"/>
+    <w:tmpl w:val="53F8A934"/>
+    <w:lvl w:ilvl="0">
+      <w:start w:val="1"/>
+      <w:numFmt w:val="bullet"/>
+      <w:lvlText w:val=""/>
+      <w:lvlJc w:val="left"/>
+      <w:pPr>
+        <w:tabs>
+          <w:tab w:val="num" w:pos="720"/>
+        </w:tabs>
+        <w:ind w:left="720" w:hanging="360"/>
+      </w:pPr>
+      <w:rPr>
+        <w:rFonts w:ascii="Symbol" w:hAnsi="Symbol" w:hint="default"/>
+        <w:sz w:val="20"/>
+      </w:rPr>
+    </w:lvl>
+    <w:lvl w:ilvl="1">
+      <w:start w:val="1"/>
+      <w:numFmt w:val="bullet"/>
+      <w:lvlText w:val="o"/>
+      <w:lvlJc w:val="left"/>
+      <w:pPr>
+        <w:tabs>
+          <w:tab w:val="num" w:pos="1440"/>
+        </w:tabs>
+        <w:ind w:left="1440" w:hanging="360"/>
+      </w:pPr>
+      <w:rPr>
+        <w:rFonts w:ascii="Courier New" w:hAnsi="Courier New" w:hint="default"/>
+        <w:sz w:val="20"/>
+      </w:rPr>
+    </w:lvl>
+    <w:lvl w:ilvl="2" w:tentative="1">
+      <w:start w:val="1"/>
+      <w:numFmt w:val="bullet"/>
+      <w:lvlText w:val=""/>
+      <w:lvlJc w:val="left"/>
+      <w:pPr>
+        <w:tabs>
+          <w:tab w:val="num" w:pos="2160"/>
+        </w:tabs>
+        <w:ind w:left="2160" w:hanging="360"/>
+      </w:pPr>
+      <w:rPr>
+        <w:rFonts w:ascii="Wingdings" w:hAnsi="Wingdings" w:hint="default"/>
+        <w:sz w:val="20"/>
+      </w:rPr>
+    </w:lvl>
+    <w:lvl w:ilvl="3" w:tentative="1">
+      <w:start w:val="1"/>
+      <w:numFmt w:val="bullet"/>
+      <w:lvlText w:val=""/>
+      <w:lvlJc w:val="left"/>
+      <w:pPr>
+        <w:tabs>
+          <w:tab w:val="num" w:pos="2880"/>
+        </w:tabs>
+        <w:ind w:left="2880" w:hanging="360"/>
+      </w:pPr>
+      <w:rPr>
+        <w:rFonts w:ascii="Wingdings" w:hAnsi="Wingdings" w:hint="default"/>
+        <w:sz w:val="20"/>
+      </w:rPr>
+    </w:lvl>
+    <w:lvl w:ilvl="4" w:tentative="1">
+      <w:start w:val="1"/>
+      <w:numFmt w:val="bullet"/>
+      <w:lvlText w:val=""/>
+      <w:lvlJc w:val="left"/>
+      <w:pPr>
+        <w:tabs>
+          <w:tab w:val="num" w:pos="3600"/>
+        </w:tabs>
+        <w:ind w:left="3600" w:hanging="360"/>
+      </w:pPr>
+      <w:rPr>
+        <w:rFonts w:ascii="Wingdings" w:hAnsi="Wingdings" w:hint="default"/>
+        <w:sz w:val="20"/>
+      </w:rPr>
+    </w:lvl>
+    <w:lvl w:ilvl="5" w:tentative="1">
+      <w:start w:val="1"/>
+      <w:numFmt w:val="bullet"/>
+      <w:lvlText w:val=""/>
+      <w:lvlJc w:val="left"/>
+      <w:pPr>
+        <w:tabs>
+          <w:tab w:val="num" w:pos="4320"/>
+        </w:tabs>
+        <w:ind w:left="4320" w:hanging="360"/>
+      </w:pPr>
+      <w:rPr>
+        <w:rFonts w:ascii="Wingdings" w:hAnsi="Wingdings" w:hint="default"/>
+        <w:sz w:val="20"/>
+      </w:rPr>
+    </w:lvl>
+    <w:lvl w:ilvl="6" w:tentative="1">
+      <w:start w:val="1"/>
+      <w:numFmt w:val="bullet"/>
+      <w:lvlText w:val=""/>
+      <w:lvlJc w:val="left"/>
+      <w:pPr>
+        <w:tabs>
+          <w:tab w:val="num" w:pos="5040"/>
+        </w:tabs>
+        <w:ind w:left="5040" w:hanging="360"/>
+      </w:pPr>
+      <w:rPr>
+        <w:rFonts w:ascii="Wingdings" w:hAnsi="Wingdings" w:hint="default"/>
+        <w:sz w:val="20"/>
+      </w:rPr>
+    </w:lvl>
+    <w:lvl w:ilvl="7" w:tentative="1">
+      <w:start w:val="1"/>
+      <w:numFmt w:val="bullet"/>
+      <w:lvlText w:val=""/>
+      <w:lvlJc w:val="left"/>
+      <w:pPr>
+        <w:tabs>
+          <w:tab w:val="num" w:pos="5760"/>
+        </w:tabs>
+        <w:ind w:left="5760" w:hanging="360"/>
+      </w:pPr>
+      <w:rPr>
+        <w:rFonts w:ascii="Wingdings" w:hAnsi="Wingdings" w:hint="default"/>
+        <w:sz w:val="20"/>
+      </w:rPr>
+    </w:lvl>
+    <w:lvl w:ilvl="8" w:tentative="1">
+      <w:start w:val="1"/>
+      <w:numFmt w:val="bullet"/>
+      <w:lvlText w:val=""/>
+      <w:lvlJc w:val="left"/>
+      <w:pPr>
+        <w:tabs>
+          <w:tab w:val="num" w:pos="6480"/>
+        </w:tabs>
+        <w:ind w:left="6480" w:hanging="360"/>
+      </w:pPr>
+      <w:rPr>
+        <w:rFonts w:ascii="Wingdings" w:hAnsi="Wingdings" w:hint="default"/>
+        <w:sz w:val="20"/>
+      </w:rPr>
+    </w:lvl>
+  </w:abstractNum>
+  <w:abstractNum w:abstractNumId="99" w15:restartNumberingAfterBreak="0">
     <w:nsid w:val="66E36FE0"/>
     <w:multiLevelType w:val="multilevel"/>
     <w:tmpl w:val="2AA67CDA"/>
@@ -13446,7 +14649,7 @@
       </w:rPr>
     </w:lvl>
   </w:abstractNum>
-  <w:abstractNum w:abstractNumId="96" w15:restartNumberingAfterBreak="0">
+  <w:abstractNum w:abstractNumId="100" w15:restartNumberingAfterBreak="0">
     <w:nsid w:val="68B94344"/>
     <w:multiLevelType w:val="multilevel"/>
     <w:tmpl w:val="9BA812D8"/>
@@ -13595,7 +14798,7 @@
       </w:rPr>
     </w:lvl>
   </w:abstractNum>
-  <w:abstractNum w:abstractNumId="97" w15:restartNumberingAfterBreak="0">
+  <w:abstractNum w:abstractNumId="101" w15:restartNumberingAfterBreak="0">
     <w:nsid w:val="69DE2C87"/>
     <w:multiLevelType w:val="hybridMultilevel"/>
     <w:tmpl w:val="F530F20A"/>
@@ -13708,7 +14911,7 @@
       </w:rPr>
     </w:lvl>
   </w:abstractNum>
-  <w:abstractNum w:abstractNumId="98" w15:restartNumberingAfterBreak="0">
+  <w:abstractNum w:abstractNumId="102" w15:restartNumberingAfterBreak="0">
     <w:nsid w:val="69ED672D"/>
     <w:multiLevelType w:val="multilevel"/>
     <w:tmpl w:val="CC08E300"/>
@@ -13857,7 +15060,7 @@
       </w:rPr>
     </w:lvl>
   </w:abstractNum>
-  <w:abstractNum w:abstractNumId="99" w15:restartNumberingAfterBreak="0">
+  <w:abstractNum w:abstractNumId="103" w15:restartNumberingAfterBreak="0">
     <w:nsid w:val="6A063EFD"/>
     <w:multiLevelType w:val="hybridMultilevel"/>
     <w:tmpl w:val="48703FBA"/>
@@ -13970,7 +15173,7 @@
       </w:rPr>
     </w:lvl>
   </w:abstractNum>
-  <w:abstractNum w:abstractNumId="100" w15:restartNumberingAfterBreak="0">
+  <w:abstractNum w:abstractNumId="104" w15:restartNumberingAfterBreak="0">
     <w:nsid w:val="6A825ABE"/>
     <w:multiLevelType w:val="multilevel"/>
     <w:tmpl w:val="0CD6F30E"/>
@@ -14119,7 +15322,7 @@
       </w:rPr>
     </w:lvl>
   </w:abstractNum>
-  <w:abstractNum w:abstractNumId="101" w15:restartNumberingAfterBreak="0">
+  <w:abstractNum w:abstractNumId="105" w15:restartNumberingAfterBreak="0">
     <w:nsid w:val="6B1D7832"/>
     <w:multiLevelType w:val="multilevel"/>
     <w:tmpl w:val="DD4646B2"/>
@@ -14268,7 +15471,7 @@
       </w:rPr>
     </w:lvl>
   </w:abstractNum>
-  <w:abstractNum w:abstractNumId="102" w15:restartNumberingAfterBreak="0">
+  <w:abstractNum w:abstractNumId="106" w15:restartNumberingAfterBreak="0">
     <w:nsid w:val="6C6D6667"/>
     <w:multiLevelType w:val="hybridMultilevel"/>
     <w:tmpl w:val="A744709C"/>
@@ -14381,7 +15584,7 @@
       </w:rPr>
     </w:lvl>
   </w:abstractNum>
-  <w:abstractNum w:abstractNumId="103" w15:restartNumberingAfterBreak="0">
+  <w:abstractNum w:abstractNumId="107" w15:restartNumberingAfterBreak="0">
     <w:nsid w:val="6CAD7EA5"/>
     <w:multiLevelType w:val="multilevel"/>
     <w:tmpl w:val="C472C5B0"/>
@@ -14530,7 +15733,7 @@
       </w:rPr>
     </w:lvl>
   </w:abstractNum>
-  <w:abstractNum w:abstractNumId="104" w15:restartNumberingAfterBreak="0">
+  <w:abstractNum w:abstractNumId="108" w15:restartNumberingAfterBreak="0">
     <w:nsid w:val="6E43557B"/>
     <w:multiLevelType w:val="multilevel"/>
     <w:tmpl w:val="323C7112"/>
@@ -14679,7 +15882,7 @@
       </w:rPr>
     </w:lvl>
   </w:abstractNum>
-  <w:abstractNum w:abstractNumId="105" w15:restartNumberingAfterBreak="0">
+  <w:abstractNum w:abstractNumId="109" w15:restartNumberingAfterBreak="0">
     <w:nsid w:val="6EA27D0A"/>
     <w:multiLevelType w:val="multilevel"/>
     <w:tmpl w:val="7BF0256C"/>
@@ -14828,7 +16031,7 @@
       </w:rPr>
     </w:lvl>
   </w:abstractNum>
-  <w:abstractNum w:abstractNumId="106" w15:restartNumberingAfterBreak="0">
+  <w:abstractNum w:abstractNumId="110" w15:restartNumberingAfterBreak="0">
     <w:nsid w:val="6EF86273"/>
     <w:multiLevelType w:val="multilevel"/>
     <w:tmpl w:val="2AA67CDA"/>
@@ -14977,7 +16180,7 @@
       </w:rPr>
     </w:lvl>
   </w:abstractNum>
-  <w:abstractNum w:abstractNumId="107" w15:restartNumberingAfterBreak="0">
+  <w:abstractNum w:abstractNumId="111" w15:restartNumberingAfterBreak="0">
     <w:nsid w:val="70874300"/>
     <w:multiLevelType w:val="hybridMultilevel"/>
     <w:tmpl w:val="1B3A0518"/>
@@ -15090,7 +16293,7 @@
       </w:rPr>
     </w:lvl>
   </w:abstractNum>
-  <w:abstractNum w:abstractNumId="108" w15:restartNumberingAfterBreak="0">
+  <w:abstractNum w:abstractNumId="112" w15:restartNumberingAfterBreak="0">
     <w:nsid w:val="7090251B"/>
     <w:multiLevelType w:val="hybridMultilevel"/>
     <w:tmpl w:val="67687EFE"/>
@@ -15203,7 +16406,7 @@
       </w:rPr>
     </w:lvl>
   </w:abstractNum>
-  <w:abstractNum w:abstractNumId="109" w15:restartNumberingAfterBreak="0">
+  <w:abstractNum w:abstractNumId="113" w15:restartNumberingAfterBreak="0">
     <w:nsid w:val="72031F81"/>
     <w:multiLevelType w:val="multilevel"/>
     <w:tmpl w:val="84400090"/>
@@ -15352,7 +16555,7 @@
       </w:rPr>
     </w:lvl>
   </w:abstractNum>
-  <w:abstractNum w:abstractNumId="110" w15:restartNumberingAfterBreak="0">
+  <w:abstractNum w:abstractNumId="114" w15:restartNumberingAfterBreak="0">
     <w:nsid w:val="722301E0"/>
     <w:multiLevelType w:val="multilevel"/>
     <w:tmpl w:val="1EE82E5A"/>
@@ -15501,7 +16704,7 @@
       </w:rPr>
     </w:lvl>
   </w:abstractNum>
-  <w:abstractNum w:abstractNumId="111" w15:restartNumberingAfterBreak="0">
+  <w:abstractNum w:abstractNumId="115" w15:restartNumberingAfterBreak="0">
     <w:nsid w:val="75144C65"/>
     <w:multiLevelType w:val="hybridMultilevel"/>
     <w:tmpl w:val="12127FAA"/>
@@ -15614,7 +16817,7 @@
       </w:rPr>
     </w:lvl>
   </w:abstractNum>
-  <w:abstractNum w:abstractNumId="112" w15:restartNumberingAfterBreak="0">
+  <w:abstractNum w:abstractNumId="116" w15:restartNumberingAfterBreak="0">
     <w:nsid w:val="75237F84"/>
     <w:multiLevelType w:val="hybridMultilevel"/>
     <w:tmpl w:val="5F0A6EF2"/>
@@ -15727,7 +16930,7 @@
       </w:rPr>
     </w:lvl>
   </w:abstractNum>
-  <w:abstractNum w:abstractNumId="113" w15:restartNumberingAfterBreak="0">
+  <w:abstractNum w:abstractNumId="117" w15:restartNumberingAfterBreak="0">
     <w:nsid w:val="758968F2"/>
     <w:multiLevelType w:val="multilevel"/>
     <w:tmpl w:val="D4241C4A"/>
@@ -15876,7 +17079,7 @@
       </w:rPr>
     </w:lvl>
   </w:abstractNum>
-  <w:abstractNum w:abstractNumId="114" w15:restartNumberingAfterBreak="0">
+  <w:abstractNum w:abstractNumId="118" w15:restartNumberingAfterBreak="0">
     <w:nsid w:val="75FF09B0"/>
     <w:multiLevelType w:val="multilevel"/>
     <w:tmpl w:val="C34A7734"/>
@@ -16025,7 +17228,7 @@
       </w:rPr>
     </w:lvl>
   </w:abstractNum>
-  <w:abstractNum w:abstractNumId="115" w15:restartNumberingAfterBreak="0">
+  <w:abstractNum w:abstractNumId="119" w15:restartNumberingAfterBreak="0">
     <w:nsid w:val="76864E3D"/>
     <w:multiLevelType w:val="hybridMultilevel"/>
     <w:tmpl w:val="9000C896"/>
@@ -16138,7 +17341,7 @@
       </w:rPr>
     </w:lvl>
   </w:abstractNum>
-  <w:abstractNum w:abstractNumId="116" w15:restartNumberingAfterBreak="0">
+  <w:abstractNum w:abstractNumId="120" w15:restartNumberingAfterBreak="0">
     <w:nsid w:val="77960362"/>
     <w:multiLevelType w:val="multilevel"/>
     <w:tmpl w:val="FEA0022E"/>
@@ -16287,7 +17490,7 @@
       </w:rPr>
     </w:lvl>
   </w:abstractNum>
-  <w:abstractNum w:abstractNumId="117" w15:restartNumberingAfterBreak="0">
+  <w:abstractNum w:abstractNumId="121" w15:restartNumberingAfterBreak="0">
     <w:nsid w:val="785A644F"/>
     <w:multiLevelType w:val="multilevel"/>
     <w:tmpl w:val="D1DC60FE"/>
@@ -16436,7 +17639,7 @@
       </w:rPr>
     </w:lvl>
   </w:abstractNum>
-  <w:abstractNum w:abstractNumId="118" w15:restartNumberingAfterBreak="0">
+  <w:abstractNum w:abstractNumId="122" w15:restartNumberingAfterBreak="0">
     <w:nsid w:val="78B62297"/>
     <w:multiLevelType w:val="multilevel"/>
     <w:tmpl w:val="2AA67CDA"/>
@@ -16585,7 +17788,7 @@
       </w:rPr>
     </w:lvl>
   </w:abstractNum>
-  <w:abstractNum w:abstractNumId="119" w15:restartNumberingAfterBreak="0">
+  <w:abstractNum w:abstractNumId="123" w15:restartNumberingAfterBreak="0">
     <w:nsid w:val="7BFA03DF"/>
     <w:multiLevelType w:val="hybridMultilevel"/>
     <w:tmpl w:val="536A979E"/>
@@ -16698,7 +17901,7 @@
       </w:rPr>
     </w:lvl>
   </w:abstractNum>
-  <w:abstractNum w:abstractNumId="120" w15:restartNumberingAfterBreak="0">
+  <w:abstractNum w:abstractNumId="124" w15:restartNumberingAfterBreak="0">
     <w:nsid w:val="7CA524B4"/>
     <w:multiLevelType w:val="hybridMultilevel"/>
     <w:tmpl w:val="957C4F4A"/>
@@ -16811,7 +18014,7 @@
       </w:rPr>
     </w:lvl>
   </w:abstractNum>
-  <w:abstractNum w:abstractNumId="121" w15:restartNumberingAfterBreak="0">
+  <w:abstractNum w:abstractNumId="125" w15:restartNumberingAfterBreak="0">
     <w:nsid w:val="7E1C597E"/>
     <w:multiLevelType w:val="multilevel"/>
     <w:tmpl w:val="2AA67CDA"/>
@@ -16960,7 +18163,7 @@
       </w:rPr>
     </w:lvl>
   </w:abstractNum>
-  <w:abstractNum w:abstractNumId="122" w15:restartNumberingAfterBreak="0">
+  <w:abstractNum w:abstractNumId="126" w15:restartNumberingAfterBreak="0">
     <w:nsid w:val="7EBD7710"/>
     <w:multiLevelType w:val="hybridMultilevel"/>
     <w:tmpl w:val="C8C6F7A0"/>
@@ -17073,374 +18276,502 @@
       </w:rPr>
     </w:lvl>
   </w:abstractNum>
+  <w:abstractNum w:abstractNumId="127" w15:restartNumberingAfterBreak="0">
+    <w:nsid w:val="7F233031"/>
+    <w:multiLevelType w:val="hybridMultilevel"/>
+    <w:tmpl w:val="0D22564E"/>
+    <w:lvl w:ilvl="0" w:tplc="04090005">
+      <w:start w:val="1"/>
+      <w:numFmt w:val="bullet"/>
+      <w:lvlText w:val=""/>
+      <w:lvlJc w:val="left"/>
+      <w:pPr>
+        <w:ind w:left="1080" w:hanging="360"/>
+      </w:pPr>
+      <w:rPr>
+        <w:rFonts w:ascii="Wingdings" w:hAnsi="Wingdings" w:hint="default"/>
+      </w:rPr>
+    </w:lvl>
+    <w:lvl w:ilvl="1" w:tplc="04090003" w:tentative="1">
+      <w:start w:val="1"/>
+      <w:numFmt w:val="bullet"/>
+      <w:lvlText w:val="o"/>
+      <w:lvlJc w:val="left"/>
+      <w:pPr>
+        <w:ind w:left="1800" w:hanging="360"/>
+      </w:pPr>
+      <w:rPr>
+        <w:rFonts w:ascii="Courier New" w:hAnsi="Courier New" w:cs="Courier New" w:hint="default"/>
+      </w:rPr>
+    </w:lvl>
+    <w:lvl w:ilvl="2" w:tplc="04090005" w:tentative="1">
+      <w:start w:val="1"/>
+      <w:numFmt w:val="bullet"/>
+      <w:lvlText w:val=""/>
+      <w:lvlJc w:val="left"/>
+      <w:pPr>
+        <w:ind w:left="2520" w:hanging="360"/>
+      </w:pPr>
+      <w:rPr>
+        <w:rFonts w:ascii="Wingdings" w:hAnsi="Wingdings" w:hint="default"/>
+      </w:rPr>
+    </w:lvl>
+    <w:lvl w:ilvl="3" w:tplc="04090001" w:tentative="1">
+      <w:start w:val="1"/>
+      <w:numFmt w:val="bullet"/>
+      <w:lvlText w:val=""/>
+      <w:lvlJc w:val="left"/>
+      <w:pPr>
+        <w:ind w:left="3240" w:hanging="360"/>
+      </w:pPr>
+      <w:rPr>
+        <w:rFonts w:ascii="Symbol" w:hAnsi="Symbol" w:hint="default"/>
+      </w:rPr>
+    </w:lvl>
+    <w:lvl w:ilvl="4" w:tplc="04090003" w:tentative="1">
+      <w:start w:val="1"/>
+      <w:numFmt w:val="bullet"/>
+      <w:lvlText w:val="o"/>
+      <w:lvlJc w:val="left"/>
+      <w:pPr>
+        <w:ind w:left="3960" w:hanging="360"/>
+      </w:pPr>
+      <w:rPr>
+        <w:rFonts w:ascii="Courier New" w:hAnsi="Courier New" w:cs="Courier New" w:hint="default"/>
+      </w:rPr>
+    </w:lvl>
+    <w:lvl w:ilvl="5" w:tplc="04090005" w:tentative="1">
+      <w:start w:val="1"/>
+      <w:numFmt w:val="bullet"/>
+      <w:lvlText w:val=""/>
+      <w:lvlJc w:val="left"/>
+      <w:pPr>
+        <w:ind w:left="4680" w:hanging="360"/>
+      </w:pPr>
+      <w:rPr>
+        <w:rFonts w:ascii="Wingdings" w:hAnsi="Wingdings" w:hint="default"/>
+      </w:rPr>
+    </w:lvl>
+    <w:lvl w:ilvl="6" w:tplc="04090001" w:tentative="1">
+      <w:start w:val="1"/>
+      <w:numFmt w:val="bullet"/>
+      <w:lvlText w:val=""/>
+      <w:lvlJc w:val="left"/>
+      <w:pPr>
+        <w:ind w:left="5400" w:hanging="360"/>
+      </w:pPr>
+      <w:rPr>
+        <w:rFonts w:ascii="Symbol" w:hAnsi="Symbol" w:hint="default"/>
+      </w:rPr>
+    </w:lvl>
+    <w:lvl w:ilvl="7" w:tplc="04090003" w:tentative="1">
+      <w:start w:val="1"/>
+      <w:numFmt w:val="bullet"/>
+      <w:lvlText w:val="o"/>
+      <w:lvlJc w:val="left"/>
+      <w:pPr>
+        <w:ind w:left="6120" w:hanging="360"/>
+      </w:pPr>
+      <w:rPr>
+        <w:rFonts w:ascii="Courier New" w:hAnsi="Courier New" w:cs="Courier New" w:hint="default"/>
+      </w:rPr>
+    </w:lvl>
+    <w:lvl w:ilvl="8" w:tplc="04090005" w:tentative="1">
+      <w:start w:val="1"/>
+      <w:numFmt w:val="bullet"/>
+      <w:lvlText w:val=""/>
+      <w:lvlJc w:val="left"/>
+      <w:pPr>
+        <w:ind w:left="6840" w:hanging="360"/>
+      </w:pPr>
+      <w:rPr>
+        <w:rFonts w:ascii="Wingdings" w:hAnsi="Wingdings" w:hint="default"/>
+      </w:rPr>
+    </w:lvl>
+  </w:abstractNum>
   <w:num w:numId="1" w16cid:durableId="425157302">
-    <w:abstractNumId w:val="47"/>
+    <w:abstractNumId w:val="48"/>
   </w:num>
   <w:num w:numId="2" w16cid:durableId="967664612">
+    <w:abstractNumId w:val="94"/>
+  </w:num>
+  <w:num w:numId="3" w16cid:durableId="361631616">
+    <w:abstractNumId w:val="67"/>
+  </w:num>
+  <w:num w:numId="4" w16cid:durableId="1409575397">
+    <w:abstractNumId w:val="80"/>
+  </w:num>
+  <w:num w:numId="5" w16cid:durableId="1647204897">
+    <w:abstractNumId w:val="124"/>
+  </w:num>
+  <w:num w:numId="6" w16cid:durableId="682589869">
+    <w:abstractNumId w:val="22"/>
+  </w:num>
+  <w:num w:numId="7" w16cid:durableId="679703478">
+    <w:abstractNumId w:val="101"/>
+  </w:num>
+  <w:num w:numId="8" w16cid:durableId="496455128">
+    <w:abstractNumId w:val="42"/>
+  </w:num>
+  <w:num w:numId="9" w16cid:durableId="1184633094">
+    <w:abstractNumId w:val="59"/>
+  </w:num>
+  <w:num w:numId="10" w16cid:durableId="71507387">
+    <w:abstractNumId w:val="65"/>
+  </w:num>
+  <w:num w:numId="11" w16cid:durableId="1412503779">
+    <w:abstractNumId w:val="103"/>
+  </w:num>
+  <w:num w:numId="12" w16cid:durableId="1107113995">
+    <w:abstractNumId w:val="43"/>
+  </w:num>
+  <w:num w:numId="13" w16cid:durableId="2011055922">
+    <w:abstractNumId w:val="23"/>
+  </w:num>
+  <w:num w:numId="14" w16cid:durableId="1529222885">
+    <w:abstractNumId w:val="123"/>
+  </w:num>
+  <w:num w:numId="15" w16cid:durableId="836580755">
+    <w:abstractNumId w:val="16"/>
+  </w:num>
+  <w:num w:numId="16" w16cid:durableId="1344674502">
+    <w:abstractNumId w:val="84"/>
+  </w:num>
+  <w:num w:numId="17" w16cid:durableId="1320882603">
+    <w:abstractNumId w:val="111"/>
+  </w:num>
+  <w:num w:numId="18" w16cid:durableId="1139028372">
+    <w:abstractNumId w:val="44"/>
+  </w:num>
+  <w:num w:numId="19" w16cid:durableId="1525635473">
+    <w:abstractNumId w:val="92"/>
+  </w:num>
+  <w:num w:numId="20" w16cid:durableId="609623515">
+    <w:abstractNumId w:val="126"/>
+  </w:num>
+  <w:num w:numId="21" w16cid:durableId="165170997">
+    <w:abstractNumId w:val="106"/>
+  </w:num>
+  <w:num w:numId="22" w16cid:durableId="1620525290">
+    <w:abstractNumId w:val="29"/>
+  </w:num>
+  <w:num w:numId="23" w16cid:durableId="400753109">
+    <w:abstractNumId w:val="115"/>
+  </w:num>
+  <w:num w:numId="24" w16cid:durableId="193882219">
+    <w:abstractNumId w:val="5"/>
+  </w:num>
+  <w:num w:numId="25" w16cid:durableId="311981628">
+    <w:abstractNumId w:val="50"/>
+  </w:num>
+  <w:num w:numId="26" w16cid:durableId="2009166045">
+    <w:abstractNumId w:val="15"/>
+  </w:num>
+  <w:num w:numId="27" w16cid:durableId="2135174697">
+    <w:abstractNumId w:val="21"/>
+  </w:num>
+  <w:num w:numId="28" w16cid:durableId="353504740">
+    <w:abstractNumId w:val="17"/>
+  </w:num>
+  <w:num w:numId="29" w16cid:durableId="2124693280">
+    <w:abstractNumId w:val="96"/>
+  </w:num>
+  <w:num w:numId="30" w16cid:durableId="1367099744">
+    <w:abstractNumId w:val="34"/>
+  </w:num>
+  <w:num w:numId="31" w16cid:durableId="2011105642">
+    <w:abstractNumId w:val="85"/>
+  </w:num>
+  <w:num w:numId="32" w16cid:durableId="831995364">
+    <w:abstractNumId w:val="26"/>
+  </w:num>
+  <w:num w:numId="33" w16cid:durableId="851073403">
+    <w:abstractNumId w:val="4"/>
+  </w:num>
+  <w:num w:numId="34" w16cid:durableId="1183666391">
+    <w:abstractNumId w:val="25"/>
+  </w:num>
+  <w:num w:numId="35" w16cid:durableId="697268929">
+    <w:abstractNumId w:val="2"/>
+  </w:num>
+  <w:num w:numId="36" w16cid:durableId="1971284395">
+    <w:abstractNumId w:val="3"/>
+  </w:num>
+  <w:num w:numId="37" w16cid:durableId="1849755457">
+    <w:abstractNumId w:val="116"/>
+  </w:num>
+  <w:num w:numId="38" w16cid:durableId="516505904">
+    <w:abstractNumId w:val="14"/>
+  </w:num>
+  <w:num w:numId="39" w16cid:durableId="906300072">
+    <w:abstractNumId w:val="18"/>
+  </w:num>
+  <w:num w:numId="40" w16cid:durableId="905338697">
+    <w:abstractNumId w:val="69"/>
+  </w:num>
+  <w:num w:numId="41" w16cid:durableId="501896635">
+    <w:abstractNumId w:val="46"/>
+  </w:num>
+  <w:num w:numId="42" w16cid:durableId="1953435156">
+    <w:abstractNumId w:val="70"/>
+  </w:num>
+  <w:num w:numId="43" w16cid:durableId="1060447452">
+    <w:abstractNumId w:val="82"/>
+  </w:num>
+  <w:num w:numId="44" w16cid:durableId="1772503672">
+    <w:abstractNumId w:val="62"/>
+  </w:num>
+  <w:num w:numId="45" w16cid:durableId="1650330222">
+    <w:abstractNumId w:val="68"/>
+  </w:num>
+  <w:num w:numId="46" w16cid:durableId="2102337934">
+    <w:abstractNumId w:val="28"/>
+  </w:num>
+  <w:num w:numId="47" w16cid:durableId="68767822">
+    <w:abstractNumId w:val="104"/>
+  </w:num>
+  <w:num w:numId="48" w16cid:durableId="1992058265">
+    <w:abstractNumId w:val="6"/>
+  </w:num>
+  <w:num w:numId="49" w16cid:durableId="788475134">
+    <w:abstractNumId w:val="121"/>
+  </w:num>
+  <w:num w:numId="50" w16cid:durableId="224419455">
+    <w:abstractNumId w:val="109"/>
+  </w:num>
+  <w:num w:numId="51" w16cid:durableId="1699575947">
     <w:abstractNumId w:val="91"/>
   </w:num>
-  <w:num w:numId="3" w16cid:durableId="361631616">
+  <w:num w:numId="52" w16cid:durableId="1048916239">
+    <w:abstractNumId w:val="54"/>
+  </w:num>
+  <w:num w:numId="53" w16cid:durableId="1188711211">
+    <w:abstractNumId w:val="118"/>
+  </w:num>
+  <w:num w:numId="54" w16cid:durableId="447555614">
+    <w:abstractNumId w:val="93"/>
+  </w:num>
+  <w:num w:numId="55" w16cid:durableId="1679307268">
+    <w:abstractNumId w:val="51"/>
+  </w:num>
+  <w:num w:numId="56" w16cid:durableId="693773591">
+    <w:abstractNumId w:val="108"/>
+  </w:num>
+  <w:num w:numId="57" w16cid:durableId="1110473324">
+    <w:abstractNumId w:val="36"/>
+  </w:num>
+  <w:num w:numId="58" w16cid:durableId="842937968">
     <w:abstractNumId w:val="66"/>
   </w:num>
-  <w:num w:numId="4" w16cid:durableId="1409575397">
+  <w:num w:numId="59" w16cid:durableId="821121315">
+    <w:abstractNumId w:val="41"/>
+  </w:num>
+  <w:num w:numId="60" w16cid:durableId="2095394549">
+    <w:abstractNumId w:val="120"/>
+  </w:num>
+  <w:num w:numId="61" w16cid:durableId="1299921011">
+    <w:abstractNumId w:val="40"/>
+  </w:num>
+  <w:num w:numId="62" w16cid:durableId="1927420240">
+    <w:abstractNumId w:val="74"/>
+  </w:num>
+  <w:num w:numId="63" w16cid:durableId="41290043">
     <w:abstractNumId w:val="79"/>
   </w:num>
-  <w:num w:numId="5" w16cid:durableId="1647204897">
-    <w:abstractNumId w:val="120"/>
+  <w:num w:numId="64" w16cid:durableId="999846909">
+    <w:abstractNumId w:val="63"/>
   </w:num>
-  <w:num w:numId="6" w16cid:durableId="682589869">
-    <w:abstractNumId w:val="21"/>
+  <w:num w:numId="65" w16cid:durableId="1250969563">
+    <w:abstractNumId w:val="72"/>
   </w:num>
-  <w:num w:numId="7" w16cid:durableId="679703478">
-    <w:abstractNumId w:val="97"/>
+  <w:num w:numId="66" w16cid:durableId="484011382">
+    <w:abstractNumId w:val="102"/>
   </w:num>
-  <w:num w:numId="8" w16cid:durableId="496455128">
-    <w:abstractNumId w:val="41"/>
+  <w:num w:numId="67" w16cid:durableId="2008289242">
+    <w:abstractNumId w:val="12"/>
   </w:num>
-  <w:num w:numId="9" w16cid:durableId="1184633094">
-    <w:abstractNumId w:val="58"/>
+  <w:num w:numId="68" w16cid:durableId="1041637222">
+    <w:abstractNumId w:val="19"/>
   </w:num>
-  <w:num w:numId="10" w16cid:durableId="71507387">
-    <w:abstractNumId w:val="64"/>
+  <w:num w:numId="69" w16cid:durableId="1296839887">
+    <w:abstractNumId w:val="78"/>
   </w:num>
-  <w:num w:numId="11" w16cid:durableId="1412503779">
-    <w:abstractNumId w:val="99"/>
+  <w:num w:numId="70" w16cid:durableId="336662050">
+    <w:abstractNumId w:val="90"/>
   </w:num>
-  <w:num w:numId="12" w16cid:durableId="1107113995">
-    <w:abstractNumId w:val="42"/>
-  </w:num>
-  <w:num w:numId="13" w16cid:durableId="2011055922">
-    <w:abstractNumId w:val="22"/>
-  </w:num>
-  <w:num w:numId="14" w16cid:durableId="1529222885">
-    <w:abstractNumId w:val="119"/>
-  </w:num>
-  <w:num w:numId="15" w16cid:durableId="836580755">
-    <w:abstractNumId w:val="15"/>
-  </w:num>
-  <w:num w:numId="16" w16cid:durableId="1344674502">
-    <w:abstractNumId w:val="82"/>
-  </w:num>
-  <w:num w:numId="17" w16cid:durableId="1320882603">
+  <w:num w:numId="71" w16cid:durableId="1460032333">
     <w:abstractNumId w:val="107"/>
   </w:num>
-  <w:num w:numId="18" w16cid:durableId="1139028372">
-    <w:abstractNumId w:val="43"/>
+  <w:num w:numId="72" w16cid:durableId="592400615">
+    <w:abstractNumId w:val="9"/>
   </w:num>
-  <w:num w:numId="19" w16cid:durableId="1525635473">
-    <w:abstractNumId w:val="89"/>
-  </w:num>
-  <w:num w:numId="20" w16cid:durableId="609623515">
-    <w:abstractNumId w:val="122"/>
-  </w:num>
-  <w:num w:numId="21" w16cid:durableId="165170997">
-    <w:abstractNumId w:val="102"/>
-  </w:num>
-  <w:num w:numId="22" w16cid:durableId="1620525290">
-    <w:abstractNumId w:val="28"/>
-  </w:num>
-  <w:num w:numId="23" w16cid:durableId="400753109">
-    <w:abstractNumId w:val="111"/>
-  </w:num>
-  <w:num w:numId="24" w16cid:durableId="193882219">
-    <w:abstractNumId w:val="4"/>
-  </w:num>
-  <w:num w:numId="25" w16cid:durableId="311981628">
-    <w:abstractNumId w:val="49"/>
-  </w:num>
-  <w:num w:numId="26" w16cid:durableId="2009166045">
-    <w:abstractNumId w:val="14"/>
-  </w:num>
-  <w:num w:numId="27" w16cid:durableId="2135174697">
-    <w:abstractNumId w:val="20"/>
-  </w:num>
-  <w:num w:numId="28" w16cid:durableId="353504740">
-    <w:abstractNumId w:val="16"/>
-  </w:num>
-  <w:num w:numId="29" w16cid:durableId="2124693280">
-    <w:abstractNumId w:val="93"/>
-  </w:num>
-  <w:num w:numId="30" w16cid:durableId="1367099744">
+  <w:num w:numId="73" w16cid:durableId="1879049234">
     <w:abstractNumId w:val="33"/>
   </w:num>
-  <w:num w:numId="31" w16cid:durableId="2011105642">
-    <w:abstractNumId w:val="83"/>
+  <w:num w:numId="74" w16cid:durableId="1747679558">
+    <w:abstractNumId w:val="37"/>
   </w:num>
-  <w:num w:numId="32" w16cid:durableId="831995364">
-    <w:abstractNumId w:val="25"/>
+  <w:num w:numId="75" w16cid:durableId="55278029">
+    <w:abstractNumId w:val="30"/>
   </w:num>
-  <w:num w:numId="33" w16cid:durableId="851073403">
-    <w:abstractNumId w:val="3"/>
+  <w:num w:numId="76" w16cid:durableId="1032193382">
+    <w:abstractNumId w:val="31"/>
   </w:num>
-  <w:num w:numId="34" w16cid:durableId="1183666391">
-    <w:abstractNumId w:val="24"/>
+  <w:num w:numId="77" w16cid:durableId="763109604">
+    <w:abstractNumId w:val="81"/>
   </w:num>
-  <w:num w:numId="35" w16cid:durableId="697268929">
-    <w:abstractNumId w:val="1"/>
+  <w:num w:numId="78" w16cid:durableId="2138137265">
+    <w:abstractNumId w:val="95"/>
   </w:num>
-  <w:num w:numId="36" w16cid:durableId="1971284395">
-    <w:abstractNumId w:val="2"/>
-  </w:num>
-  <w:num w:numId="37" w16cid:durableId="1849755457">
+  <w:num w:numId="79" w16cid:durableId="343675924">
     <w:abstractNumId w:val="112"/>
   </w:num>
-  <w:num w:numId="38" w16cid:durableId="516505904">
-    <w:abstractNumId w:val="13"/>
-  </w:num>
-  <w:num w:numId="39" w16cid:durableId="906300072">
-    <w:abstractNumId w:val="17"/>
-  </w:num>
-  <w:num w:numId="40" w16cid:durableId="905338697">
-    <w:abstractNumId w:val="68"/>
-  </w:num>
-  <w:num w:numId="41" w16cid:durableId="501896635">
-    <w:abstractNumId w:val="45"/>
-  </w:num>
-  <w:num w:numId="42" w16cid:durableId="1953435156">
-    <w:abstractNumId w:val="69"/>
-  </w:num>
-  <w:num w:numId="43" w16cid:durableId="1060447452">
-    <w:abstractNumId w:val="81"/>
-  </w:num>
-  <w:num w:numId="44" w16cid:durableId="1772503672">
-    <w:abstractNumId w:val="61"/>
-  </w:num>
-  <w:num w:numId="45" w16cid:durableId="1650330222">
-    <w:abstractNumId w:val="67"/>
-  </w:num>
-  <w:num w:numId="46" w16cid:durableId="2102337934">
-    <w:abstractNumId w:val="27"/>
-  </w:num>
-  <w:num w:numId="47" w16cid:durableId="68767822">
-    <w:abstractNumId w:val="100"/>
-  </w:num>
-  <w:num w:numId="48" w16cid:durableId="1992058265">
-    <w:abstractNumId w:val="5"/>
-  </w:num>
-  <w:num w:numId="49" w16cid:durableId="788475134">
-    <w:abstractNumId w:val="117"/>
-  </w:num>
-  <w:num w:numId="50" w16cid:durableId="224419455">
-    <w:abstractNumId w:val="105"/>
-  </w:num>
-  <w:num w:numId="51" w16cid:durableId="1699575947">
-    <w:abstractNumId w:val="88"/>
-  </w:num>
-  <w:num w:numId="52" w16cid:durableId="1048916239">
-    <w:abstractNumId w:val="53"/>
-  </w:num>
-  <w:num w:numId="53" w16cid:durableId="1188711211">
-    <w:abstractNumId w:val="114"/>
-  </w:num>
-  <w:num w:numId="54" w16cid:durableId="447555614">
-    <w:abstractNumId w:val="90"/>
-  </w:num>
-  <w:num w:numId="55" w16cid:durableId="1679307268">
-    <w:abstractNumId w:val="50"/>
-  </w:num>
-  <w:num w:numId="56" w16cid:durableId="693773591">
-    <w:abstractNumId w:val="104"/>
-  </w:num>
-  <w:num w:numId="57" w16cid:durableId="1110473324">
-    <w:abstractNumId w:val="35"/>
-  </w:num>
-  <w:num w:numId="58" w16cid:durableId="842937968">
-    <w:abstractNumId w:val="65"/>
-  </w:num>
-  <w:num w:numId="59" w16cid:durableId="821121315">
-    <w:abstractNumId w:val="40"/>
-  </w:num>
-  <w:num w:numId="60" w16cid:durableId="2095394549">
-    <w:abstractNumId w:val="116"/>
-  </w:num>
-  <w:num w:numId="61" w16cid:durableId="1299921011">
+  <w:num w:numId="80" w16cid:durableId="1823277442">
     <w:abstractNumId w:val="39"/>
-  </w:num>
-  <w:num w:numId="62" w16cid:durableId="1927420240">
-    <w:abstractNumId w:val="73"/>
-  </w:num>
-  <w:num w:numId="63" w16cid:durableId="41290043">
-    <w:abstractNumId w:val="78"/>
-  </w:num>
-  <w:num w:numId="64" w16cid:durableId="999846909">
-    <w:abstractNumId w:val="62"/>
-  </w:num>
-  <w:num w:numId="65" w16cid:durableId="1250969563">
-    <w:abstractNumId w:val="71"/>
-  </w:num>
-  <w:num w:numId="66" w16cid:durableId="484011382">
-    <w:abstractNumId w:val="98"/>
-  </w:num>
-  <w:num w:numId="67" w16cid:durableId="2008289242">
-    <w:abstractNumId w:val="11"/>
-  </w:num>
-  <w:num w:numId="68" w16cid:durableId="1041637222">
-    <w:abstractNumId w:val="18"/>
-  </w:num>
-  <w:num w:numId="69" w16cid:durableId="1296839887">
-    <w:abstractNumId w:val="77"/>
-  </w:num>
-  <w:num w:numId="70" w16cid:durableId="336662050">
-    <w:abstractNumId w:val="87"/>
-  </w:num>
-  <w:num w:numId="71" w16cid:durableId="1460032333">
-    <w:abstractNumId w:val="103"/>
-  </w:num>
-  <w:num w:numId="72" w16cid:durableId="592400615">
-    <w:abstractNumId w:val="8"/>
-  </w:num>
-  <w:num w:numId="73" w16cid:durableId="1879049234">
-    <w:abstractNumId w:val="32"/>
-  </w:num>
-  <w:num w:numId="74" w16cid:durableId="1747679558">
-    <w:abstractNumId w:val="36"/>
-  </w:num>
-  <w:num w:numId="75" w16cid:durableId="55278029">
-    <w:abstractNumId w:val="29"/>
-  </w:num>
-  <w:num w:numId="76" w16cid:durableId="1032193382">
-    <w:abstractNumId w:val="30"/>
-  </w:num>
-  <w:num w:numId="77" w16cid:durableId="763109604">
-    <w:abstractNumId w:val="80"/>
-  </w:num>
-  <w:num w:numId="78" w16cid:durableId="2138137265">
-    <w:abstractNumId w:val="92"/>
-  </w:num>
-  <w:num w:numId="79" w16cid:durableId="343675924">
-    <w:abstractNumId w:val="108"/>
-  </w:num>
-  <w:num w:numId="80" w16cid:durableId="1823277442">
-    <w:abstractNumId w:val="38"/>
   </w:num>
   <w:num w:numId="81" w16cid:durableId="1686900155">
     <w:abstractNumId w:val="0"/>
   </w:num>
   <w:num w:numId="82" w16cid:durableId="1113326280">
+    <w:abstractNumId w:val="77"/>
+  </w:num>
+  <w:num w:numId="83" w16cid:durableId="1253051103">
+    <w:abstractNumId w:val="105"/>
+  </w:num>
+  <w:num w:numId="84" w16cid:durableId="444888444">
+    <w:abstractNumId w:val="47"/>
+  </w:num>
+  <w:num w:numId="85" w16cid:durableId="64299649">
+    <w:abstractNumId w:val="97"/>
+  </w:num>
+  <w:num w:numId="86" w16cid:durableId="868182992">
+    <w:abstractNumId w:val="61"/>
+  </w:num>
+  <w:num w:numId="87" w16cid:durableId="896863331">
+    <w:abstractNumId w:val="24"/>
+  </w:num>
+  <w:num w:numId="88" w16cid:durableId="505442826">
+    <w:abstractNumId w:val="100"/>
+  </w:num>
+  <w:num w:numId="89" w16cid:durableId="1858763908">
+    <w:abstractNumId w:val="35"/>
+  </w:num>
+  <w:num w:numId="90" w16cid:durableId="1896088176">
+    <w:abstractNumId w:val="13"/>
+  </w:num>
+  <w:num w:numId="91" w16cid:durableId="1284576603">
+    <w:abstractNumId w:val="86"/>
+  </w:num>
+  <w:num w:numId="92" w16cid:durableId="1963075542">
+    <w:abstractNumId w:val="8"/>
+  </w:num>
+  <w:num w:numId="93" w16cid:durableId="787627596">
     <w:abstractNumId w:val="76"/>
   </w:num>
-  <w:num w:numId="83" w16cid:durableId="1253051103">
-    <w:abstractNumId w:val="101"/>
+  <w:num w:numId="94" w16cid:durableId="2003925799">
+    <w:abstractNumId w:val="11"/>
   </w:num>
-  <w:num w:numId="84" w16cid:durableId="444888444">
-    <w:abstractNumId w:val="46"/>
+  <w:num w:numId="95" w16cid:durableId="1169102579">
+    <w:abstractNumId w:val="89"/>
   </w:num>
-  <w:num w:numId="85" w16cid:durableId="64299649">
-    <w:abstractNumId w:val="94"/>
+  <w:num w:numId="96" w16cid:durableId="1216501564">
+    <w:abstractNumId w:val="32"/>
   </w:num>
-  <w:num w:numId="86" w16cid:durableId="868182992">
+  <w:num w:numId="97" w16cid:durableId="261768216">
+    <w:abstractNumId w:val="110"/>
+  </w:num>
+  <w:num w:numId="98" w16cid:durableId="2141918721">
+    <w:abstractNumId w:val="71"/>
+  </w:num>
+  <w:num w:numId="99" w16cid:durableId="905841544">
+    <w:abstractNumId w:val="38"/>
+  </w:num>
+  <w:num w:numId="100" w16cid:durableId="1753887223">
+    <w:abstractNumId w:val="87"/>
+  </w:num>
+  <w:num w:numId="101" w16cid:durableId="1320184766">
+    <w:abstractNumId w:val="27"/>
+  </w:num>
+  <w:num w:numId="102" w16cid:durableId="465127606">
+    <w:abstractNumId w:val="55"/>
+  </w:num>
+  <w:num w:numId="103" w16cid:durableId="1640451435">
+    <w:abstractNumId w:val="53"/>
+  </w:num>
+  <w:num w:numId="104" w16cid:durableId="942029608">
+    <w:abstractNumId w:val="49"/>
+  </w:num>
+  <w:num w:numId="105" w16cid:durableId="70857193">
+    <w:abstractNumId w:val="57"/>
+  </w:num>
+  <w:num w:numId="106" w16cid:durableId="1617908629">
+    <w:abstractNumId w:val="114"/>
+  </w:num>
+  <w:num w:numId="107" w16cid:durableId="970137111">
+    <w:abstractNumId w:val="125"/>
+  </w:num>
+  <w:num w:numId="108" w16cid:durableId="383797013">
+    <w:abstractNumId w:val="45"/>
+  </w:num>
+  <w:num w:numId="109" w16cid:durableId="1459567304">
+    <w:abstractNumId w:val="56"/>
+  </w:num>
+  <w:num w:numId="110" w16cid:durableId="862745862">
+    <w:abstractNumId w:val="20"/>
+  </w:num>
+  <w:num w:numId="111" w16cid:durableId="1859536331">
     <w:abstractNumId w:val="60"/>
   </w:num>
-  <w:num w:numId="87" w16cid:durableId="896863331">
-    <w:abstractNumId w:val="23"/>
+  <w:num w:numId="112" w16cid:durableId="2092697678">
+    <w:abstractNumId w:val="73"/>
   </w:num>
-  <w:num w:numId="88" w16cid:durableId="505442826">
-    <w:abstractNumId w:val="96"/>
+  <w:num w:numId="113" w16cid:durableId="1418403813">
+    <w:abstractNumId w:val="64"/>
   </w:num>
-  <w:num w:numId="89" w16cid:durableId="1858763908">
-    <w:abstractNumId w:val="34"/>
+  <w:num w:numId="114" w16cid:durableId="1965042317">
+    <w:abstractNumId w:val="113"/>
   </w:num>
-  <w:num w:numId="90" w16cid:durableId="1896088176">
-    <w:abstractNumId w:val="12"/>
+  <w:num w:numId="115" w16cid:durableId="670569040">
+    <w:abstractNumId w:val="52"/>
   </w:num>
-  <w:num w:numId="91" w16cid:durableId="1284576603">
-    <w:abstractNumId w:val="84"/>
+  <w:num w:numId="116" w16cid:durableId="413823113">
+    <w:abstractNumId w:val="122"/>
   </w:num>
-  <w:num w:numId="92" w16cid:durableId="1963075542">
+  <w:num w:numId="117" w16cid:durableId="1293747982">
+    <w:abstractNumId w:val="99"/>
+  </w:num>
+  <w:num w:numId="118" w16cid:durableId="2058698591">
+    <w:abstractNumId w:val="58"/>
+  </w:num>
+  <w:num w:numId="119" w16cid:durableId="892157361">
+    <w:abstractNumId w:val="75"/>
+  </w:num>
+  <w:num w:numId="120" w16cid:durableId="1449229938">
+    <w:abstractNumId w:val="117"/>
+  </w:num>
+  <w:num w:numId="121" w16cid:durableId="177283374">
     <w:abstractNumId w:val="7"/>
   </w:num>
-  <w:num w:numId="93" w16cid:durableId="787627596">
-    <w:abstractNumId w:val="75"/>
-  </w:num>
-  <w:num w:numId="94" w16cid:durableId="2003925799">
+  <w:num w:numId="122" w16cid:durableId="576598579">
     <w:abstractNumId w:val="10"/>
   </w:num>
-  <w:num w:numId="95" w16cid:durableId="1169102579">
-    <w:abstractNumId w:val="86"/>
+  <w:num w:numId="123" w16cid:durableId="1495337109">
+    <w:abstractNumId w:val="119"/>
   </w:num>
-  <w:num w:numId="96" w16cid:durableId="1216501564">
-    <w:abstractNumId w:val="31"/>
+  <w:num w:numId="124" w16cid:durableId="302319311">
+    <w:abstractNumId w:val="83"/>
   </w:num>
-  <w:num w:numId="97" w16cid:durableId="261768216">
-    <w:abstractNumId w:val="106"/>
+  <w:num w:numId="125" w16cid:durableId="1891844186">
+    <w:abstractNumId w:val="98"/>
   </w:num>
-  <w:num w:numId="98" w16cid:durableId="2141918721">
-    <w:abstractNumId w:val="70"/>
+  <w:num w:numId="126" w16cid:durableId="256911009">
+    <w:abstractNumId w:val="1"/>
   </w:num>
-  <w:num w:numId="99" w16cid:durableId="905841544">
-    <w:abstractNumId w:val="37"/>
+  <w:num w:numId="127" w16cid:durableId="1001927776">
+    <w:abstractNumId w:val="127"/>
   </w:num>
-  <w:num w:numId="100" w16cid:durableId="1753887223">
-    <w:abstractNumId w:val="85"/>
-  </w:num>
-  <w:num w:numId="101" w16cid:durableId="1320184766">
-    <w:abstractNumId w:val="26"/>
-  </w:num>
-  <w:num w:numId="102" w16cid:durableId="465127606">
-    <w:abstractNumId w:val="54"/>
-  </w:num>
-  <w:num w:numId="103" w16cid:durableId="1640451435">
-    <w:abstractNumId w:val="52"/>
-  </w:num>
-  <w:num w:numId="104" w16cid:durableId="942029608">
-    <w:abstractNumId w:val="48"/>
-  </w:num>
-  <w:num w:numId="105" w16cid:durableId="70857193">
-    <w:abstractNumId w:val="56"/>
-  </w:num>
-  <w:num w:numId="106" w16cid:durableId="1617908629">
-    <w:abstractNumId w:val="110"/>
-  </w:num>
-  <w:num w:numId="107" w16cid:durableId="970137111">
-    <w:abstractNumId w:val="121"/>
-  </w:num>
-  <w:num w:numId="108" w16cid:durableId="383797013">
-    <w:abstractNumId w:val="44"/>
-  </w:num>
-  <w:num w:numId="109" w16cid:durableId="1459567304">
-    <w:abstractNumId w:val="55"/>
-  </w:num>
-  <w:num w:numId="110" w16cid:durableId="862745862">
-    <w:abstractNumId w:val="19"/>
-  </w:num>
-  <w:num w:numId="111" w16cid:durableId="1859536331">
-    <w:abstractNumId w:val="59"/>
-  </w:num>
-  <w:num w:numId="112" w16cid:durableId="2092697678">
-    <w:abstractNumId w:val="72"/>
-  </w:num>
-  <w:num w:numId="113" w16cid:durableId="1418403813">
-    <w:abstractNumId w:val="63"/>
-  </w:num>
-  <w:num w:numId="114" w16cid:durableId="1965042317">
-    <w:abstractNumId w:val="109"/>
-  </w:num>
-  <w:num w:numId="115" w16cid:durableId="670569040">
-    <w:abstractNumId w:val="51"/>
-  </w:num>
-  <w:num w:numId="116" w16cid:durableId="413823113">
-    <w:abstractNumId w:val="118"/>
-  </w:num>
-  <w:num w:numId="117" w16cid:durableId="1293747982">
-    <w:abstractNumId w:val="95"/>
-  </w:num>
-  <w:num w:numId="118" w16cid:durableId="2058698591">
-    <w:abstractNumId w:val="57"/>
-  </w:num>
-  <w:num w:numId="119" w16cid:durableId="892157361">
-    <w:abstractNumId w:val="74"/>
-  </w:num>
-  <w:num w:numId="120" w16cid:durableId="1449229938">
-    <w:abstractNumId w:val="113"/>
-  </w:num>
-  <w:num w:numId="121" w16cid:durableId="177283374">
-    <w:abstractNumId w:val="6"/>
-  </w:num>
-  <w:num w:numId="122" w16cid:durableId="576598579">
-    <w:abstractNumId w:val="9"/>
-  </w:num>
-  <w:num w:numId="123" w16cid:durableId="1495337109">
-    <w:abstractNumId w:val="115"/>
+  <w:num w:numId="128" w16cid:durableId="1365057616">
+    <w:abstractNumId w:val="88"/>
   </w:num>
   <w:numIdMacAtCleanup w:val="45"/>
 </w:numbering>

</xml_diff>

<commit_message>
Reservation Workflow Activity Diagram (#260)
</commit_message>
<xml_diff>
--- a/Activity Specification Document.docx
+++ b/Activity Specification Document.docx
@@ -1234,6 +1234,527 @@
         <w:br w:type="page"/>
       </w:r>
     </w:p>
+    <w:p>
+      <w:pPr>
+        <w:pStyle w:val="Heading3"/>
+      </w:pPr>
+      <w:r>
+        <w:lastRenderedPageBreak/>
+        <w:t xml:space="preserve">3- </w:t>
+      </w:r>
+      <w:r>
+        <w:t xml:space="preserve">Reservation Workflow Activity </w:t>
+      </w:r>
+    </w:p>
+    <w:p>
+      <w:pPr>
+        <w:rPr>
+          <w:b/>
+          <w:bCs/>
+        </w:rPr>
+      </w:pPr>
+      <w:r>
+        <w:rPr>
+          <w:b/>
+          <w:bCs/>
+        </w:rPr>
+        <w:t>Purpose</w:t>
+      </w:r>
+    </w:p>
+    <w:p>
+      <w:r>
+        <w:t>Activity Diagram of Reservation Process Workflow is a diagram that shows all activities performed when making a car reservation in the KriGo system. The activity diagram demonstrates the entire reservation process from choosing a car and inserting reservation details to checking its availability, calculating the price of the car, confirming the reservation and saving the reservation information.</w:t>
+      </w:r>
+    </w:p>
+    <w:p>
+      <w:pPr>
+        <w:rPr>
+          <w:b/>
+          <w:bCs/>
+        </w:rPr>
+      </w:pPr>
+      <w:r>
+        <w:rPr>
+          <w:b/>
+          <w:bCs/>
+        </w:rPr>
+        <w:t>Workflow Description</w:t>
+      </w:r>
+    </w:p>
+    <w:p>
+      <w:r>
+        <w:t>The process of making reservations involves the choice by the customer of a car among the available search results. The next step is providing the required information on the rental: location of picking up, dates of pick up and return, and making a reservation.</w:t>
+      </w:r>
+    </w:p>
+    <w:p>
+      <w:r>
+        <w:t>When the system gets the request, it checks the availability of the chosen car within the requested period of time. If the vehicle is not available, the customer gets informed about this fact and is redirected to the vehicle search page.</w:t>
+      </w:r>
+    </w:p>
+    <w:p>
+      <w:r>
+        <w:t>If the chosen vehicle is available, the system calculates the price of the rental based on the rental period and rules.</w:t>
+      </w:r>
+    </w:p>
+    <w:p>
+      <w:r>
+        <w:t>After reviewing the reservation details, the customer makes a decision on reserving the car. In case of making the reservation, the system saves the reservation information and sends the confirmation message to the customer. If the client does not want to reserve the car anymore, the reservation process is cancelled.</w:t>
+      </w:r>
+    </w:p>
+    <w:p>
+      <w:pPr>
+        <w:rPr>
+          <w:b/>
+          <w:bCs/>
+        </w:rPr>
+      </w:pPr>
+      <w:r>
+        <w:rPr>
+          <w:b/>
+          <w:bCs/>
+        </w:rPr>
+        <w:t>Main Activities</w:t>
+      </w:r>
+    </w:p>
+    <w:p>
+      <w:r>
+        <w:t>The Reservation Workflow Activity Diagram includes the following primary activities:</w:t>
+      </w:r>
+    </w:p>
+    <w:p>
+      <w:pPr>
+        <w:pStyle w:val="ListParagraph"/>
+        <w:numPr>
+          <w:ilvl w:val="0"/>
+          <w:numId w:val="132"/>
+        </w:numPr>
+      </w:pPr>
+      <w:r>
+        <w:t>Select a vehicle.</w:t>
+      </w:r>
+    </w:p>
+    <w:p>
+      <w:pPr>
+        <w:pStyle w:val="ListParagraph"/>
+        <w:numPr>
+          <w:ilvl w:val="0"/>
+          <w:numId w:val="132"/>
+        </w:numPr>
+      </w:pPr>
+      <w:r>
+        <w:t>Enter reservation details.</w:t>
+      </w:r>
+    </w:p>
+    <w:p>
+      <w:pPr>
+        <w:pStyle w:val="ListParagraph"/>
+        <w:numPr>
+          <w:ilvl w:val="0"/>
+          <w:numId w:val="132"/>
+        </w:numPr>
+      </w:pPr>
+      <w:r>
+        <w:t>Submit the reservation request.</w:t>
+      </w:r>
+    </w:p>
+    <w:p>
+      <w:pPr>
+        <w:pStyle w:val="ListParagraph"/>
+        <w:numPr>
+          <w:ilvl w:val="0"/>
+          <w:numId w:val="132"/>
+        </w:numPr>
+      </w:pPr>
+      <w:r>
+        <w:t>Check vehicle availability.</w:t>
+      </w:r>
+    </w:p>
+    <w:p>
+      <w:pPr>
+        <w:pStyle w:val="ListParagraph"/>
+        <w:numPr>
+          <w:ilvl w:val="0"/>
+          <w:numId w:val="132"/>
+        </w:numPr>
+      </w:pPr>
+      <w:r>
+        <w:t>Calculate the rental cost.</w:t>
+      </w:r>
+    </w:p>
+    <w:p>
+      <w:pPr>
+        <w:pStyle w:val="ListParagraph"/>
+        <w:numPr>
+          <w:ilvl w:val="0"/>
+          <w:numId w:val="132"/>
+        </w:numPr>
+      </w:pPr>
+      <w:r>
+        <w:t>Display the reservation summary.</w:t>
+      </w:r>
+    </w:p>
+    <w:p>
+      <w:pPr>
+        <w:pStyle w:val="ListParagraph"/>
+        <w:numPr>
+          <w:ilvl w:val="0"/>
+          <w:numId w:val="132"/>
+        </w:numPr>
+      </w:pPr>
+      <w:r>
+        <w:t>Confirm the reservation.</w:t>
+      </w:r>
+    </w:p>
+    <w:p>
+      <w:pPr>
+        <w:pStyle w:val="ListParagraph"/>
+        <w:numPr>
+          <w:ilvl w:val="0"/>
+          <w:numId w:val="132"/>
+        </w:numPr>
+      </w:pPr>
+      <w:r>
+        <w:t>Create and save the reservation.</w:t>
+      </w:r>
+    </w:p>
+    <w:p>
+      <w:pPr>
+        <w:pStyle w:val="ListParagraph"/>
+        <w:numPr>
+          <w:ilvl w:val="0"/>
+          <w:numId w:val="132"/>
+        </w:numPr>
+      </w:pPr>
+      <w:r>
+        <w:t>Display the reservation confirmation.</w:t>
+      </w:r>
+    </w:p>
+    <w:p>
+      <w:pPr>
+        <w:rPr>
+          <w:b/>
+          <w:bCs/>
+        </w:rPr>
+      </w:pPr>
+      <w:r>
+        <w:rPr>
+          <w:b/>
+          <w:bCs/>
+        </w:rPr>
+        <w:t>Decision Points</w:t>
+      </w:r>
+    </w:p>
+    <w:p>
+      <w:r>
+        <w:t>The activity diagram contains two main decision nodes:</w:t>
+      </w:r>
+    </w:p>
+    <w:p>
+      <w:pPr>
+        <w:numPr>
+          <w:ilvl w:val="0"/>
+          <w:numId w:val="130"/>
+        </w:numPr>
+      </w:pPr>
+      <w:r>
+        <w:rPr>
+          <w:b/>
+          <w:bCs/>
+        </w:rPr>
+        <w:t>Vehicle Available?</w:t>
+      </w:r>
+    </w:p>
+    <w:p>
+      <w:pPr>
+        <w:numPr>
+          <w:ilvl w:val="1"/>
+          <w:numId w:val="130"/>
+        </w:numPr>
+        <w:spacing w:after="0"/>
+      </w:pPr>
+      <w:r>
+        <w:t xml:space="preserve">If </w:t>
+      </w:r>
+      <w:r>
+        <w:rPr>
+          <w:b/>
+          <w:bCs/>
+        </w:rPr>
+        <w:t>Yes</w:t>
+      </w:r>
+      <w:r>
+        <w:t>, the reservation process continues with rental cost calculation and reservation review.</w:t>
+      </w:r>
+    </w:p>
+    <w:p>
+      <w:pPr>
+        <w:numPr>
+          <w:ilvl w:val="1"/>
+          <w:numId w:val="130"/>
+        </w:numPr>
+        <w:spacing w:after="0"/>
+      </w:pPr>
+      <w:r>
+        <w:t xml:space="preserve">If </w:t>
+      </w:r>
+      <w:r>
+        <w:rPr>
+          <w:b/>
+          <w:bCs/>
+        </w:rPr>
+        <w:t>No</w:t>
+      </w:r>
+      <w:r>
+        <w:t>, the customer is informed that the vehicle is unavailable and returns to the vehicle search process.</w:t>
+      </w:r>
+    </w:p>
+    <w:p>
+      <w:pPr>
+        <w:numPr>
+          <w:ilvl w:val="0"/>
+          <w:numId w:val="130"/>
+        </w:numPr>
+      </w:pPr>
+      <w:r>
+        <w:rPr>
+          <w:b/>
+          <w:bCs/>
+        </w:rPr>
+        <w:t>Confirm Reservation?</w:t>
+      </w:r>
+    </w:p>
+    <w:p>
+      <w:pPr>
+        <w:numPr>
+          <w:ilvl w:val="1"/>
+          <w:numId w:val="130"/>
+        </w:numPr>
+        <w:spacing w:after="0"/>
+      </w:pPr>
+      <w:r>
+        <w:t xml:space="preserve">If </w:t>
+      </w:r>
+      <w:r>
+        <w:rPr>
+          <w:b/>
+          <w:bCs/>
+        </w:rPr>
+        <w:t>Yes</w:t>
+      </w:r>
+      <w:r>
+        <w:t>, the reservation is created and stored successfully.</w:t>
+      </w:r>
+    </w:p>
+    <w:p>
+      <w:pPr>
+        <w:numPr>
+          <w:ilvl w:val="1"/>
+          <w:numId w:val="130"/>
+        </w:numPr>
+      </w:pPr>
+      <w:r>
+        <w:t xml:space="preserve">If </w:t>
+      </w:r>
+      <w:r>
+        <w:rPr>
+          <w:b/>
+          <w:bCs/>
+        </w:rPr>
+        <w:t>No</w:t>
+      </w:r>
+      <w:r>
+        <w:t>, the reservation process is canceled without saving any data.</w:t>
+      </w:r>
+    </w:p>
+    <w:p>
+      <w:r>
+        <w:lastRenderedPageBreak/>
+        <w:t>These decision points ensure that reservations are created only for available vehicles and only after explicit customer confirmation.</w:t>
+      </w:r>
+    </w:p>
+    <w:p>
+      <w:pPr>
+        <w:rPr>
+          <w:b/>
+          <w:bCs/>
+        </w:rPr>
+      </w:pPr>
+      <w:r>
+        <w:rPr>
+          <w:b/>
+          <w:bCs/>
+        </w:rPr>
+        <w:t>Alternative Flows</w:t>
+      </w:r>
+    </w:p>
+    <w:p>
+      <w:r>
+        <w:t>The Reservation Workflow Activity Diagram incorporates several alternative scenarios:</w:t>
+      </w:r>
+    </w:p>
+    <w:p>
+      <w:pPr>
+        <w:pStyle w:val="ListParagraph"/>
+        <w:numPr>
+          <w:ilvl w:val="0"/>
+          <w:numId w:val="133"/>
+        </w:numPr>
+      </w:pPr>
+      <w:r>
+        <w:t>The selected vehicle is unavailable for the requested rental period.</w:t>
+      </w:r>
+    </w:p>
+    <w:p>
+      <w:pPr>
+        <w:pStyle w:val="ListParagraph"/>
+        <w:numPr>
+          <w:ilvl w:val="0"/>
+          <w:numId w:val="133"/>
+        </w:numPr>
+      </w:pPr>
+      <w:r>
+        <w:t>The customer cancels the reservation before confirmation.</w:t>
+      </w:r>
+    </w:p>
+    <w:p>
+      <w:pPr>
+        <w:pStyle w:val="ListParagraph"/>
+        <w:numPr>
+          <w:ilvl w:val="0"/>
+          <w:numId w:val="133"/>
+        </w:numPr>
+      </w:pPr>
+      <w:r>
+        <w:t>Successful reservation creation and confirmation.</w:t>
+      </w:r>
+    </w:p>
+    <w:p>
+      <w:r>
+        <w:t>These alternative paths improve system reliability by preventing duplicate bookings and allowing customers to review their reservation details before finalizing the transaction.</w:t>
+      </w:r>
+    </w:p>
+    <w:p>
+      <w:pPr>
+        <w:rPr>
+          <w:b/>
+          <w:bCs/>
+        </w:rPr>
+      </w:pPr>
+      <w:r>
+        <w:rPr>
+          <w:b/>
+          <w:bCs/>
+        </w:rPr>
+        <w:t>Conclusion</w:t>
+      </w:r>
+    </w:p>
+    <w:p>
+      <w:r>
+        <w:t>Reservation Workflow Activity Diagram acts as the most detailed description of the whole process of reserving a car through the KriGo system. It describes the entire logical sequence of actions, validations, and decisions needed to reserve the car. This activity diagram is a vital part of behavioral modeling of the reservation subsystem</w:t>
+      </w:r>
+      <w:r>
+        <w:t>.</w:t>
+      </w:r>
+    </w:p>
+    <w:p>
+      <w:pPr>
+        <w:keepNext/>
+      </w:pPr>
+      <w:r>
+        <w:rPr>
+          <w:noProof/>
+        </w:rPr>
+        <w:drawing>
+          <wp:inline distT="0" distB="0" distL="0" distR="0" wp14:anchorId="03A6879C" wp14:editId="02DB56DC">
+            <wp:extent cx="5941695" cy="4622800"/>
+            <wp:effectExtent l="0" t="0" r="1905" b="6350"/>
+            <wp:docPr id="2103125584" name="Picture 10"/>
+            <wp:cNvGraphicFramePr>
+              <a:graphicFrameLocks xmlns:a="http://schemas.openxmlformats.org/drawingml/2006/main" noChangeAspect="1"/>
+            </wp:cNvGraphicFramePr>
+            <a:graphic xmlns:a="http://schemas.openxmlformats.org/drawingml/2006/main">
+              <a:graphicData uri="http://schemas.openxmlformats.org/drawingml/2006/picture">
+                <pic:pic xmlns:pic="http://schemas.openxmlformats.org/drawingml/2006/picture">
+                  <pic:nvPicPr>
+                    <pic:cNvPr id="0" name="Picture 5"/>
+                    <pic:cNvPicPr>
+                      <a:picLocks noChangeAspect="1" noChangeArrowheads="1"/>
+                    </pic:cNvPicPr>
+                  </pic:nvPicPr>
+                  <pic:blipFill>
+                    <a:blip r:embed="rId10">
+                      <a:extLst>
+                        <a:ext uri="{28A0092B-C50C-407E-A947-70E740481C1C}">
+                          <a14:useLocalDpi xmlns:a14="http://schemas.microsoft.com/office/drawing/2010/main" val="0"/>
+                        </a:ext>
+                      </a:extLst>
+                    </a:blip>
+                    <a:srcRect/>
+                    <a:stretch>
+                      <a:fillRect/>
+                    </a:stretch>
+                  </pic:blipFill>
+                  <pic:spPr bwMode="auto">
+                    <a:xfrm>
+                      <a:off x="0" y="0"/>
+                      <a:ext cx="5941695" cy="4622800"/>
+                    </a:xfrm>
+                    <a:prstGeom prst="rect">
+                      <a:avLst/>
+                    </a:prstGeom>
+                    <a:noFill/>
+                    <a:ln>
+                      <a:noFill/>
+                    </a:ln>
+                  </pic:spPr>
+                </pic:pic>
+              </a:graphicData>
+            </a:graphic>
+          </wp:inline>
+        </w:drawing>
+      </w:r>
+    </w:p>
+    <w:p>
+      <w:pPr>
+        <w:pStyle w:val="Caption"/>
+      </w:pPr>
+      <w:r>
+        <w:t xml:space="preserve">Figure </w:t>
+      </w:r>
+      <w:r>
+        <w:fldChar w:fldCharType="begin"/>
+      </w:r>
+      <w:r>
+        <w:instrText xml:space="preserve"> SEQ Figure \* ARABIC </w:instrText>
+      </w:r>
+      <w:r>
+        <w:fldChar w:fldCharType="separate"/>
+      </w:r>
+      <w:r>
+        <w:rPr>
+          <w:noProof/>
+        </w:rPr>
+        <w:t>3</w:t>
+      </w:r>
+      <w:r>
+        <w:fldChar w:fldCharType="end"/>
+      </w:r>
+      <w:r>
+        <w:t xml:space="preserve"> - </w:t>
+      </w:r>
+      <w:r>
+        <w:t>Reservation Workflow Activity Diagram</w:t>
+      </w:r>
+    </w:p>
+    <w:p>
+      <w:pPr>
+        <w:spacing w:line="278" w:lineRule="auto"/>
+      </w:pPr>
+      <w:r>
+        <w:br w:type="page"/>
+      </w:r>
+    </w:p>
+    <w:p/>
     <w:p/>
     <w:sectPr>
       <w:pgSz w:w="11906" w:h="16838" w:code="9"/>
@@ -1822,6 +2343,119 @@
     </w:lvl>
   </w:abstractNum>
   <w:abstractNum w:abstractNumId="4" w15:restartNumberingAfterBreak="0">
+    <w:nsid w:val="02D96F98"/>
+    <w:multiLevelType w:val="hybridMultilevel"/>
+    <w:tmpl w:val="C7E88CC4"/>
+    <w:lvl w:ilvl="0" w:tplc="04090005">
+      <w:start w:val="1"/>
+      <w:numFmt w:val="bullet"/>
+      <w:lvlText w:val=""/>
+      <w:lvlJc w:val="left"/>
+      <w:pPr>
+        <w:ind w:left="1080" w:hanging="360"/>
+      </w:pPr>
+      <w:rPr>
+        <w:rFonts w:ascii="Wingdings" w:hAnsi="Wingdings" w:hint="default"/>
+      </w:rPr>
+    </w:lvl>
+    <w:lvl w:ilvl="1" w:tplc="04090003" w:tentative="1">
+      <w:start w:val="1"/>
+      <w:numFmt w:val="bullet"/>
+      <w:lvlText w:val="o"/>
+      <w:lvlJc w:val="left"/>
+      <w:pPr>
+        <w:ind w:left="1800" w:hanging="360"/>
+      </w:pPr>
+      <w:rPr>
+        <w:rFonts w:ascii="Courier New" w:hAnsi="Courier New" w:cs="Courier New" w:hint="default"/>
+      </w:rPr>
+    </w:lvl>
+    <w:lvl w:ilvl="2" w:tplc="04090005" w:tentative="1">
+      <w:start w:val="1"/>
+      <w:numFmt w:val="bullet"/>
+      <w:lvlText w:val=""/>
+      <w:lvlJc w:val="left"/>
+      <w:pPr>
+        <w:ind w:left="2520" w:hanging="360"/>
+      </w:pPr>
+      <w:rPr>
+        <w:rFonts w:ascii="Wingdings" w:hAnsi="Wingdings" w:hint="default"/>
+      </w:rPr>
+    </w:lvl>
+    <w:lvl w:ilvl="3" w:tplc="04090001" w:tentative="1">
+      <w:start w:val="1"/>
+      <w:numFmt w:val="bullet"/>
+      <w:lvlText w:val=""/>
+      <w:lvlJc w:val="left"/>
+      <w:pPr>
+        <w:ind w:left="3240" w:hanging="360"/>
+      </w:pPr>
+      <w:rPr>
+        <w:rFonts w:ascii="Symbol" w:hAnsi="Symbol" w:hint="default"/>
+      </w:rPr>
+    </w:lvl>
+    <w:lvl w:ilvl="4" w:tplc="04090003" w:tentative="1">
+      <w:start w:val="1"/>
+      <w:numFmt w:val="bullet"/>
+      <w:lvlText w:val="o"/>
+      <w:lvlJc w:val="left"/>
+      <w:pPr>
+        <w:ind w:left="3960" w:hanging="360"/>
+      </w:pPr>
+      <w:rPr>
+        <w:rFonts w:ascii="Courier New" w:hAnsi="Courier New" w:cs="Courier New" w:hint="default"/>
+      </w:rPr>
+    </w:lvl>
+    <w:lvl w:ilvl="5" w:tplc="04090005" w:tentative="1">
+      <w:start w:val="1"/>
+      <w:numFmt w:val="bullet"/>
+      <w:lvlText w:val=""/>
+      <w:lvlJc w:val="left"/>
+      <w:pPr>
+        <w:ind w:left="4680" w:hanging="360"/>
+      </w:pPr>
+      <w:rPr>
+        <w:rFonts w:ascii="Wingdings" w:hAnsi="Wingdings" w:hint="default"/>
+      </w:rPr>
+    </w:lvl>
+    <w:lvl w:ilvl="6" w:tplc="04090001" w:tentative="1">
+      <w:start w:val="1"/>
+      <w:numFmt w:val="bullet"/>
+      <w:lvlText w:val=""/>
+      <w:lvlJc w:val="left"/>
+      <w:pPr>
+        <w:ind w:left="5400" w:hanging="360"/>
+      </w:pPr>
+      <w:rPr>
+        <w:rFonts w:ascii="Symbol" w:hAnsi="Symbol" w:hint="default"/>
+      </w:rPr>
+    </w:lvl>
+    <w:lvl w:ilvl="7" w:tplc="04090003" w:tentative="1">
+      <w:start w:val="1"/>
+      <w:numFmt w:val="bullet"/>
+      <w:lvlText w:val="o"/>
+      <w:lvlJc w:val="left"/>
+      <w:pPr>
+        <w:ind w:left="6120" w:hanging="360"/>
+      </w:pPr>
+      <w:rPr>
+        <w:rFonts w:ascii="Courier New" w:hAnsi="Courier New" w:cs="Courier New" w:hint="default"/>
+      </w:rPr>
+    </w:lvl>
+    <w:lvl w:ilvl="8" w:tplc="04090005" w:tentative="1">
+      <w:start w:val="1"/>
+      <w:numFmt w:val="bullet"/>
+      <w:lvlText w:val=""/>
+      <w:lvlJc w:val="left"/>
+      <w:pPr>
+        <w:ind w:left="6840" w:hanging="360"/>
+      </w:pPr>
+      <w:rPr>
+        <w:rFonts w:ascii="Wingdings" w:hAnsi="Wingdings" w:hint="default"/>
+      </w:rPr>
+    </w:lvl>
+  </w:abstractNum>
+  <w:abstractNum w:abstractNumId="5" w15:restartNumberingAfterBreak="0">
     <w:nsid w:val="038C4B22"/>
     <w:multiLevelType w:val="hybridMultilevel"/>
     <w:tmpl w:val="390E2614"/>
@@ -1934,7 +2568,7 @@
       </w:rPr>
     </w:lvl>
   </w:abstractNum>
-  <w:abstractNum w:abstractNumId="5" w15:restartNumberingAfterBreak="0">
+  <w:abstractNum w:abstractNumId="6" w15:restartNumberingAfterBreak="0">
     <w:nsid w:val="04351CD0"/>
     <w:multiLevelType w:val="hybridMultilevel"/>
     <w:tmpl w:val="4748F3C4"/>
@@ -2047,7 +2681,7 @@
       </w:rPr>
     </w:lvl>
   </w:abstractNum>
-  <w:abstractNum w:abstractNumId="6" w15:restartNumberingAfterBreak="0">
+  <w:abstractNum w:abstractNumId="7" w15:restartNumberingAfterBreak="0">
     <w:nsid w:val="0444578B"/>
     <w:multiLevelType w:val="multilevel"/>
     <w:tmpl w:val="6B840BA4"/>
@@ -2196,7 +2830,7 @@
       </w:rPr>
     </w:lvl>
   </w:abstractNum>
-  <w:abstractNum w:abstractNumId="7" w15:restartNumberingAfterBreak="0">
+  <w:abstractNum w:abstractNumId="8" w15:restartNumberingAfterBreak="0">
     <w:nsid w:val="06FA4547"/>
     <w:multiLevelType w:val="hybridMultilevel"/>
     <w:tmpl w:val="DA825754"/>
@@ -2309,7 +2943,120 @@
       </w:rPr>
     </w:lvl>
   </w:abstractNum>
-  <w:abstractNum w:abstractNumId="8" w15:restartNumberingAfterBreak="0">
+  <w:abstractNum w:abstractNumId="9" w15:restartNumberingAfterBreak="0">
+    <w:nsid w:val="0717208B"/>
+    <w:multiLevelType w:val="hybridMultilevel"/>
+    <w:tmpl w:val="5866C9A8"/>
+    <w:lvl w:ilvl="0" w:tplc="04090005">
+      <w:start w:val="1"/>
+      <w:numFmt w:val="bullet"/>
+      <w:lvlText w:val=""/>
+      <w:lvlJc w:val="left"/>
+      <w:pPr>
+        <w:ind w:left="1080" w:hanging="360"/>
+      </w:pPr>
+      <w:rPr>
+        <w:rFonts w:ascii="Wingdings" w:hAnsi="Wingdings" w:hint="default"/>
+      </w:rPr>
+    </w:lvl>
+    <w:lvl w:ilvl="1" w:tplc="04090003" w:tentative="1">
+      <w:start w:val="1"/>
+      <w:numFmt w:val="bullet"/>
+      <w:lvlText w:val="o"/>
+      <w:lvlJc w:val="left"/>
+      <w:pPr>
+        <w:ind w:left="1800" w:hanging="360"/>
+      </w:pPr>
+      <w:rPr>
+        <w:rFonts w:ascii="Courier New" w:hAnsi="Courier New" w:cs="Courier New" w:hint="default"/>
+      </w:rPr>
+    </w:lvl>
+    <w:lvl w:ilvl="2" w:tplc="04090005" w:tentative="1">
+      <w:start w:val="1"/>
+      <w:numFmt w:val="bullet"/>
+      <w:lvlText w:val=""/>
+      <w:lvlJc w:val="left"/>
+      <w:pPr>
+        <w:ind w:left="2520" w:hanging="360"/>
+      </w:pPr>
+      <w:rPr>
+        <w:rFonts w:ascii="Wingdings" w:hAnsi="Wingdings" w:hint="default"/>
+      </w:rPr>
+    </w:lvl>
+    <w:lvl w:ilvl="3" w:tplc="04090001" w:tentative="1">
+      <w:start w:val="1"/>
+      <w:numFmt w:val="bullet"/>
+      <w:lvlText w:val=""/>
+      <w:lvlJc w:val="left"/>
+      <w:pPr>
+        <w:ind w:left="3240" w:hanging="360"/>
+      </w:pPr>
+      <w:rPr>
+        <w:rFonts w:ascii="Symbol" w:hAnsi="Symbol" w:hint="default"/>
+      </w:rPr>
+    </w:lvl>
+    <w:lvl w:ilvl="4" w:tplc="04090003" w:tentative="1">
+      <w:start w:val="1"/>
+      <w:numFmt w:val="bullet"/>
+      <w:lvlText w:val="o"/>
+      <w:lvlJc w:val="left"/>
+      <w:pPr>
+        <w:ind w:left="3960" w:hanging="360"/>
+      </w:pPr>
+      <w:rPr>
+        <w:rFonts w:ascii="Courier New" w:hAnsi="Courier New" w:cs="Courier New" w:hint="default"/>
+      </w:rPr>
+    </w:lvl>
+    <w:lvl w:ilvl="5" w:tplc="04090005" w:tentative="1">
+      <w:start w:val="1"/>
+      <w:numFmt w:val="bullet"/>
+      <w:lvlText w:val=""/>
+      <w:lvlJc w:val="left"/>
+      <w:pPr>
+        <w:ind w:left="4680" w:hanging="360"/>
+      </w:pPr>
+      <w:rPr>
+        <w:rFonts w:ascii="Wingdings" w:hAnsi="Wingdings" w:hint="default"/>
+      </w:rPr>
+    </w:lvl>
+    <w:lvl w:ilvl="6" w:tplc="04090001" w:tentative="1">
+      <w:start w:val="1"/>
+      <w:numFmt w:val="bullet"/>
+      <w:lvlText w:val=""/>
+      <w:lvlJc w:val="left"/>
+      <w:pPr>
+        <w:ind w:left="5400" w:hanging="360"/>
+      </w:pPr>
+      <w:rPr>
+        <w:rFonts w:ascii="Symbol" w:hAnsi="Symbol" w:hint="default"/>
+      </w:rPr>
+    </w:lvl>
+    <w:lvl w:ilvl="7" w:tplc="04090003" w:tentative="1">
+      <w:start w:val="1"/>
+      <w:numFmt w:val="bullet"/>
+      <w:lvlText w:val="o"/>
+      <w:lvlJc w:val="left"/>
+      <w:pPr>
+        <w:ind w:left="6120" w:hanging="360"/>
+      </w:pPr>
+      <w:rPr>
+        <w:rFonts w:ascii="Courier New" w:hAnsi="Courier New" w:cs="Courier New" w:hint="default"/>
+      </w:rPr>
+    </w:lvl>
+    <w:lvl w:ilvl="8" w:tplc="04090005" w:tentative="1">
+      <w:start w:val="1"/>
+      <w:numFmt w:val="bullet"/>
+      <w:lvlText w:val=""/>
+      <w:lvlJc w:val="left"/>
+      <w:pPr>
+        <w:ind w:left="6840" w:hanging="360"/>
+      </w:pPr>
+      <w:rPr>
+        <w:rFonts w:ascii="Wingdings" w:hAnsi="Wingdings" w:hint="default"/>
+      </w:rPr>
+    </w:lvl>
+  </w:abstractNum>
+  <w:abstractNum w:abstractNumId="10" w15:restartNumberingAfterBreak="0">
     <w:nsid w:val="08BB19BF"/>
     <w:multiLevelType w:val="multilevel"/>
     <w:tmpl w:val="C5807BB2"/>
@@ -2458,7 +3205,7 @@
       </w:rPr>
     </w:lvl>
   </w:abstractNum>
-  <w:abstractNum w:abstractNumId="9" w15:restartNumberingAfterBreak="0">
+  <w:abstractNum w:abstractNumId="11" w15:restartNumberingAfterBreak="0">
     <w:nsid w:val="08D32D08"/>
     <w:multiLevelType w:val="multilevel"/>
     <w:tmpl w:val="A32449CA"/>
@@ -2607,7 +3354,7 @@
       </w:rPr>
     </w:lvl>
   </w:abstractNum>
-  <w:abstractNum w:abstractNumId="10" w15:restartNumberingAfterBreak="0">
+  <w:abstractNum w:abstractNumId="12" w15:restartNumberingAfterBreak="0">
     <w:nsid w:val="09E84C0F"/>
     <w:multiLevelType w:val="hybridMultilevel"/>
     <w:tmpl w:val="3754EFAC"/>
@@ -2720,7 +3467,7 @@
       </w:rPr>
     </w:lvl>
   </w:abstractNum>
-  <w:abstractNum w:abstractNumId="11" w15:restartNumberingAfterBreak="0">
+  <w:abstractNum w:abstractNumId="13" w15:restartNumberingAfterBreak="0">
     <w:nsid w:val="0AE82489"/>
     <w:multiLevelType w:val="multilevel"/>
     <w:tmpl w:val="B82C10D4"/>
@@ -2869,7 +3616,7 @@
       </w:rPr>
     </w:lvl>
   </w:abstractNum>
-  <w:abstractNum w:abstractNumId="12" w15:restartNumberingAfterBreak="0">
+  <w:abstractNum w:abstractNumId="14" w15:restartNumberingAfterBreak="0">
     <w:nsid w:val="0CC17936"/>
     <w:multiLevelType w:val="multilevel"/>
     <w:tmpl w:val="B5E0C4F8"/>
@@ -3018,7 +3765,7 @@
       </w:rPr>
     </w:lvl>
   </w:abstractNum>
-  <w:abstractNum w:abstractNumId="13" w15:restartNumberingAfterBreak="0">
+  <w:abstractNum w:abstractNumId="15" w15:restartNumberingAfterBreak="0">
     <w:nsid w:val="0E1040E2"/>
     <w:multiLevelType w:val="multilevel"/>
     <w:tmpl w:val="607CCC88"/>
@@ -3167,7 +3914,7 @@
       </w:rPr>
     </w:lvl>
   </w:abstractNum>
-  <w:abstractNum w:abstractNumId="14" w15:restartNumberingAfterBreak="0">
+  <w:abstractNum w:abstractNumId="16" w15:restartNumberingAfterBreak="0">
     <w:nsid w:val="0E2561E7"/>
     <w:multiLevelType w:val="hybridMultilevel"/>
     <w:tmpl w:val="2A6E4870"/>
@@ -3280,7 +4027,7 @@
       </w:rPr>
     </w:lvl>
   </w:abstractNum>
-  <w:abstractNum w:abstractNumId="15" w15:restartNumberingAfterBreak="0">
+  <w:abstractNum w:abstractNumId="17" w15:restartNumberingAfterBreak="0">
     <w:nsid w:val="0E841C27"/>
     <w:multiLevelType w:val="hybridMultilevel"/>
     <w:tmpl w:val="789C7F32"/>
@@ -3393,7 +4140,7 @@
       </w:rPr>
     </w:lvl>
   </w:abstractNum>
-  <w:abstractNum w:abstractNumId="16" w15:restartNumberingAfterBreak="0">
+  <w:abstractNum w:abstractNumId="18" w15:restartNumberingAfterBreak="0">
     <w:nsid w:val="0FAA2602"/>
     <w:multiLevelType w:val="hybridMultilevel"/>
     <w:tmpl w:val="C6C63128"/>
@@ -3506,7 +4253,7 @@
       </w:rPr>
     </w:lvl>
   </w:abstractNum>
-  <w:abstractNum w:abstractNumId="17" w15:restartNumberingAfterBreak="0">
+  <w:abstractNum w:abstractNumId="19" w15:restartNumberingAfterBreak="0">
     <w:nsid w:val="122550ED"/>
     <w:multiLevelType w:val="hybridMultilevel"/>
     <w:tmpl w:val="91ACE480"/>
@@ -3619,7 +4366,7 @@
       </w:rPr>
     </w:lvl>
   </w:abstractNum>
-  <w:abstractNum w:abstractNumId="18" w15:restartNumberingAfterBreak="0">
+  <w:abstractNum w:abstractNumId="20" w15:restartNumberingAfterBreak="0">
     <w:nsid w:val="124C1BAE"/>
     <w:multiLevelType w:val="hybridMultilevel"/>
     <w:tmpl w:val="04988FC0"/>
@@ -3732,7 +4479,7 @@
       </w:rPr>
     </w:lvl>
   </w:abstractNum>
-  <w:abstractNum w:abstractNumId="19" w15:restartNumberingAfterBreak="0">
+  <w:abstractNum w:abstractNumId="21" w15:restartNumberingAfterBreak="0">
     <w:nsid w:val="139F7557"/>
     <w:multiLevelType w:val="multilevel"/>
     <w:tmpl w:val="A984C1D4"/>
@@ -3881,7 +4628,7 @@
       </w:rPr>
     </w:lvl>
   </w:abstractNum>
-  <w:abstractNum w:abstractNumId="20" w15:restartNumberingAfterBreak="0">
+  <w:abstractNum w:abstractNumId="22" w15:restartNumberingAfterBreak="0">
     <w:nsid w:val="13A13D09"/>
     <w:multiLevelType w:val="multilevel"/>
     <w:tmpl w:val="92067DCC"/>
@@ -4030,7 +4777,7 @@
       </w:rPr>
     </w:lvl>
   </w:abstractNum>
-  <w:abstractNum w:abstractNumId="21" w15:restartNumberingAfterBreak="0">
+  <w:abstractNum w:abstractNumId="23" w15:restartNumberingAfterBreak="0">
     <w:nsid w:val="16D400B4"/>
     <w:multiLevelType w:val="hybridMultilevel"/>
     <w:tmpl w:val="58E6DFBE"/>
@@ -4143,7 +4890,7 @@
       </w:rPr>
     </w:lvl>
   </w:abstractNum>
-  <w:abstractNum w:abstractNumId="22" w15:restartNumberingAfterBreak="0">
+  <w:abstractNum w:abstractNumId="24" w15:restartNumberingAfterBreak="0">
     <w:nsid w:val="17236012"/>
     <w:multiLevelType w:val="hybridMultilevel"/>
     <w:tmpl w:val="DAFA46C8"/>
@@ -4256,7 +5003,7 @@
       </w:rPr>
     </w:lvl>
   </w:abstractNum>
-  <w:abstractNum w:abstractNumId="23" w15:restartNumberingAfterBreak="0">
+  <w:abstractNum w:abstractNumId="25" w15:restartNumberingAfterBreak="0">
     <w:nsid w:val="172B04C0"/>
     <w:multiLevelType w:val="hybridMultilevel"/>
     <w:tmpl w:val="B6C41D5E"/>
@@ -4369,7 +5116,7 @@
       </w:rPr>
     </w:lvl>
   </w:abstractNum>
-  <w:abstractNum w:abstractNumId="24" w15:restartNumberingAfterBreak="0">
+  <w:abstractNum w:abstractNumId="26" w15:restartNumberingAfterBreak="0">
     <w:nsid w:val="17485CCB"/>
     <w:multiLevelType w:val="multilevel"/>
     <w:tmpl w:val="397E1AE0"/>
@@ -4518,7 +5265,7 @@
       </w:rPr>
     </w:lvl>
   </w:abstractNum>
-  <w:abstractNum w:abstractNumId="25" w15:restartNumberingAfterBreak="0">
+  <w:abstractNum w:abstractNumId="27" w15:restartNumberingAfterBreak="0">
     <w:nsid w:val="17763D31"/>
     <w:multiLevelType w:val="hybridMultilevel"/>
     <w:tmpl w:val="6CE63304"/>
@@ -4631,7 +5378,7 @@
       </w:rPr>
     </w:lvl>
   </w:abstractNum>
-  <w:abstractNum w:abstractNumId="26" w15:restartNumberingAfterBreak="0">
+  <w:abstractNum w:abstractNumId="28" w15:restartNumberingAfterBreak="0">
     <w:nsid w:val="17B06937"/>
     <w:multiLevelType w:val="hybridMultilevel"/>
     <w:tmpl w:val="71089CF2"/>
@@ -4744,7 +5491,7 @@
       </w:rPr>
     </w:lvl>
   </w:abstractNum>
-  <w:abstractNum w:abstractNumId="27" w15:restartNumberingAfterBreak="0">
+  <w:abstractNum w:abstractNumId="29" w15:restartNumberingAfterBreak="0">
     <w:nsid w:val="190F0390"/>
     <w:multiLevelType w:val="multilevel"/>
     <w:tmpl w:val="CBE4A4A4"/>
@@ -4893,7 +5640,7 @@
       </w:rPr>
     </w:lvl>
   </w:abstractNum>
-  <w:abstractNum w:abstractNumId="28" w15:restartNumberingAfterBreak="0">
+  <w:abstractNum w:abstractNumId="30" w15:restartNumberingAfterBreak="0">
     <w:nsid w:val="195875B0"/>
     <w:multiLevelType w:val="multilevel"/>
     <w:tmpl w:val="615444D4"/>
@@ -5006,7 +5753,7 @@
       </w:pPr>
     </w:lvl>
   </w:abstractNum>
-  <w:abstractNum w:abstractNumId="29" w15:restartNumberingAfterBreak="0">
+  <w:abstractNum w:abstractNumId="31" w15:restartNumberingAfterBreak="0">
     <w:nsid w:val="197C6FD7"/>
     <w:multiLevelType w:val="hybridMultilevel"/>
     <w:tmpl w:val="D97CEAA8"/>
@@ -5119,7 +5866,7 @@
       </w:rPr>
     </w:lvl>
   </w:abstractNum>
-  <w:abstractNum w:abstractNumId="30" w15:restartNumberingAfterBreak="0">
+  <w:abstractNum w:abstractNumId="32" w15:restartNumberingAfterBreak="0">
     <w:nsid w:val="1CC60A94"/>
     <w:multiLevelType w:val="multilevel"/>
     <w:tmpl w:val="EB74741C"/>
@@ -5268,7 +6015,7 @@
       </w:rPr>
     </w:lvl>
   </w:abstractNum>
-  <w:abstractNum w:abstractNumId="31" w15:restartNumberingAfterBreak="0">
+  <w:abstractNum w:abstractNumId="33" w15:restartNumberingAfterBreak="0">
     <w:nsid w:val="1E6658CF"/>
     <w:multiLevelType w:val="multilevel"/>
     <w:tmpl w:val="762ABC5E"/>
@@ -5417,7 +6164,7 @@
       </w:rPr>
     </w:lvl>
   </w:abstractNum>
-  <w:abstractNum w:abstractNumId="32" w15:restartNumberingAfterBreak="0">
+  <w:abstractNum w:abstractNumId="34" w15:restartNumberingAfterBreak="0">
     <w:nsid w:val="1FA532B0"/>
     <w:multiLevelType w:val="multilevel"/>
     <w:tmpl w:val="8718294C"/>
@@ -5566,7 +6313,7 @@
       </w:rPr>
     </w:lvl>
   </w:abstractNum>
-  <w:abstractNum w:abstractNumId="33" w15:restartNumberingAfterBreak="0">
+  <w:abstractNum w:abstractNumId="35" w15:restartNumberingAfterBreak="0">
     <w:nsid w:val="215C77FD"/>
     <w:multiLevelType w:val="hybridMultilevel"/>
     <w:tmpl w:val="58F41D10"/>
@@ -5655,7 +6402,7 @@
       </w:pPr>
     </w:lvl>
   </w:abstractNum>
-  <w:abstractNum w:abstractNumId="34" w15:restartNumberingAfterBreak="0">
+  <w:abstractNum w:abstractNumId="36" w15:restartNumberingAfterBreak="0">
     <w:nsid w:val="218D5909"/>
     <w:multiLevelType w:val="hybridMultilevel"/>
     <w:tmpl w:val="CC989EE4"/>
@@ -5768,7 +6515,7 @@
       </w:rPr>
     </w:lvl>
   </w:abstractNum>
-  <w:abstractNum w:abstractNumId="35" w15:restartNumberingAfterBreak="0">
+  <w:abstractNum w:abstractNumId="37" w15:restartNumberingAfterBreak="0">
     <w:nsid w:val="23E010BA"/>
     <w:multiLevelType w:val="multilevel"/>
     <w:tmpl w:val="4A16907E"/>
@@ -5917,7 +6664,7 @@
       </w:rPr>
     </w:lvl>
   </w:abstractNum>
-  <w:abstractNum w:abstractNumId="36" w15:restartNumberingAfterBreak="0">
+  <w:abstractNum w:abstractNumId="38" w15:restartNumberingAfterBreak="0">
     <w:nsid w:val="2470127A"/>
     <w:multiLevelType w:val="multilevel"/>
     <w:tmpl w:val="309E9618"/>
@@ -6066,7 +6813,7 @@
       </w:rPr>
     </w:lvl>
   </w:abstractNum>
-  <w:abstractNum w:abstractNumId="37" w15:restartNumberingAfterBreak="0">
+  <w:abstractNum w:abstractNumId="39" w15:restartNumberingAfterBreak="0">
     <w:nsid w:val="24796798"/>
     <w:multiLevelType w:val="hybridMultilevel"/>
     <w:tmpl w:val="6622BEDC"/>
@@ -6155,7 +6902,7 @@
       </w:pPr>
     </w:lvl>
   </w:abstractNum>
-  <w:abstractNum w:abstractNumId="38" w15:restartNumberingAfterBreak="0">
+  <w:abstractNum w:abstractNumId="40" w15:restartNumberingAfterBreak="0">
     <w:nsid w:val="253B76EC"/>
     <w:multiLevelType w:val="multilevel"/>
     <w:tmpl w:val="2AA67CDA"/>
@@ -6304,7 +7051,7 @@
       </w:rPr>
     </w:lvl>
   </w:abstractNum>
-  <w:abstractNum w:abstractNumId="39" w15:restartNumberingAfterBreak="0">
+  <w:abstractNum w:abstractNumId="41" w15:restartNumberingAfterBreak="0">
     <w:nsid w:val="2E4D738C"/>
     <w:multiLevelType w:val="multilevel"/>
     <w:tmpl w:val="1540BBA2"/>
@@ -6453,7 +7200,7 @@
       </w:rPr>
     </w:lvl>
   </w:abstractNum>
-  <w:abstractNum w:abstractNumId="40" w15:restartNumberingAfterBreak="0">
+  <w:abstractNum w:abstractNumId="42" w15:restartNumberingAfterBreak="0">
     <w:nsid w:val="2F0041C7"/>
     <w:multiLevelType w:val="multilevel"/>
     <w:tmpl w:val="656414FE"/>
@@ -6602,7 +7349,7 @@
       </w:rPr>
     </w:lvl>
   </w:abstractNum>
-  <w:abstractNum w:abstractNumId="41" w15:restartNumberingAfterBreak="0">
+  <w:abstractNum w:abstractNumId="43" w15:restartNumberingAfterBreak="0">
     <w:nsid w:val="304F01FA"/>
     <w:multiLevelType w:val="multilevel"/>
     <w:tmpl w:val="151C4EC6"/>
@@ -6751,7 +7498,7 @@
       </w:rPr>
     </w:lvl>
   </w:abstractNum>
-  <w:abstractNum w:abstractNumId="42" w15:restartNumberingAfterBreak="0">
+  <w:abstractNum w:abstractNumId="44" w15:restartNumberingAfterBreak="0">
     <w:nsid w:val="30BD025D"/>
     <w:multiLevelType w:val="hybridMultilevel"/>
     <w:tmpl w:val="04381C82"/>
@@ -6840,7 +7587,7 @@
       </w:pPr>
     </w:lvl>
   </w:abstractNum>
-  <w:abstractNum w:abstractNumId="43" w15:restartNumberingAfterBreak="0">
+  <w:abstractNum w:abstractNumId="45" w15:restartNumberingAfterBreak="0">
     <w:nsid w:val="327C0BA6"/>
     <w:multiLevelType w:val="hybridMultilevel"/>
     <w:tmpl w:val="2A9047EE"/>
@@ -6953,7 +7700,7 @@
       </w:rPr>
     </w:lvl>
   </w:abstractNum>
-  <w:abstractNum w:abstractNumId="44" w15:restartNumberingAfterBreak="0">
+  <w:abstractNum w:abstractNumId="46" w15:restartNumberingAfterBreak="0">
     <w:nsid w:val="338D63E8"/>
     <w:multiLevelType w:val="hybridMultilevel"/>
     <w:tmpl w:val="28D0FB50"/>
@@ -7066,7 +7813,7 @@
       </w:rPr>
     </w:lvl>
   </w:abstractNum>
-  <w:abstractNum w:abstractNumId="45" w15:restartNumberingAfterBreak="0">
+  <w:abstractNum w:abstractNumId="47" w15:restartNumberingAfterBreak="0">
     <w:nsid w:val="34182771"/>
     <w:multiLevelType w:val="multilevel"/>
     <w:tmpl w:val="2AA67CDA"/>
@@ -7215,7 +7962,7 @@
       </w:rPr>
     </w:lvl>
   </w:abstractNum>
-  <w:abstractNum w:abstractNumId="46" w15:restartNumberingAfterBreak="0">
+  <w:abstractNum w:abstractNumId="48" w15:restartNumberingAfterBreak="0">
     <w:nsid w:val="35413E58"/>
     <w:multiLevelType w:val="hybridMultilevel"/>
     <w:tmpl w:val="03C64164"/>
@@ -7328,7 +8075,7 @@
       </w:rPr>
     </w:lvl>
   </w:abstractNum>
-  <w:abstractNum w:abstractNumId="47" w15:restartNumberingAfterBreak="0">
+  <w:abstractNum w:abstractNumId="49" w15:restartNumberingAfterBreak="0">
     <w:nsid w:val="35C86AF0"/>
     <w:multiLevelType w:val="multilevel"/>
     <w:tmpl w:val="8202FCD6"/>
@@ -7477,7 +8224,7 @@
       </w:rPr>
     </w:lvl>
   </w:abstractNum>
-  <w:abstractNum w:abstractNumId="48" w15:restartNumberingAfterBreak="0">
+  <w:abstractNum w:abstractNumId="50" w15:restartNumberingAfterBreak="0">
     <w:nsid w:val="3623194A"/>
     <w:multiLevelType w:val="multilevel"/>
     <w:tmpl w:val="63F4E6F0"/>
@@ -7626,7 +8373,7 @@
       </w:rPr>
     </w:lvl>
   </w:abstractNum>
-  <w:abstractNum w:abstractNumId="49" w15:restartNumberingAfterBreak="0">
+  <w:abstractNum w:abstractNumId="51" w15:restartNumberingAfterBreak="0">
     <w:nsid w:val="36E36979"/>
     <w:multiLevelType w:val="multilevel"/>
     <w:tmpl w:val="3D58C93A"/>
@@ -7775,7 +8522,7 @@
       </w:rPr>
     </w:lvl>
   </w:abstractNum>
-  <w:abstractNum w:abstractNumId="50" w15:restartNumberingAfterBreak="0">
+  <w:abstractNum w:abstractNumId="52" w15:restartNumberingAfterBreak="0">
     <w:nsid w:val="37B424C3"/>
     <w:multiLevelType w:val="hybridMultilevel"/>
     <w:tmpl w:val="18F030D4"/>
@@ -7888,7 +8635,7 @@
       </w:rPr>
     </w:lvl>
   </w:abstractNum>
-  <w:abstractNum w:abstractNumId="51" w15:restartNumberingAfterBreak="0">
+  <w:abstractNum w:abstractNumId="53" w15:restartNumberingAfterBreak="0">
     <w:nsid w:val="3BC10D30"/>
     <w:multiLevelType w:val="multilevel"/>
     <w:tmpl w:val="502AD78C"/>
@@ -8037,7 +8784,7 @@
       </w:rPr>
     </w:lvl>
   </w:abstractNum>
-  <w:abstractNum w:abstractNumId="52" w15:restartNumberingAfterBreak="0">
+  <w:abstractNum w:abstractNumId="54" w15:restartNumberingAfterBreak="0">
     <w:nsid w:val="3C276BB8"/>
     <w:multiLevelType w:val="multilevel"/>
     <w:tmpl w:val="2AA67CDA"/>
@@ -8186,7 +8933,7 @@
       </w:rPr>
     </w:lvl>
   </w:abstractNum>
-  <w:abstractNum w:abstractNumId="53" w15:restartNumberingAfterBreak="0">
+  <w:abstractNum w:abstractNumId="55" w15:restartNumberingAfterBreak="0">
     <w:nsid w:val="3C596808"/>
     <w:multiLevelType w:val="multilevel"/>
     <w:tmpl w:val="2AA67CDA"/>
@@ -8335,7 +9082,7 @@
       </w:rPr>
     </w:lvl>
   </w:abstractNum>
-  <w:abstractNum w:abstractNumId="54" w15:restartNumberingAfterBreak="0">
+  <w:abstractNum w:abstractNumId="56" w15:restartNumberingAfterBreak="0">
     <w:nsid w:val="3CBF280A"/>
     <w:multiLevelType w:val="multilevel"/>
     <w:tmpl w:val="A13E4362"/>
@@ -8484,7 +9231,7 @@
       </w:rPr>
     </w:lvl>
   </w:abstractNum>
-  <w:abstractNum w:abstractNumId="55" w15:restartNumberingAfterBreak="0">
+  <w:abstractNum w:abstractNumId="57" w15:restartNumberingAfterBreak="0">
     <w:nsid w:val="3CC7541B"/>
     <w:multiLevelType w:val="multilevel"/>
     <w:tmpl w:val="2AA67CDA"/>
@@ -8633,7 +9380,7 @@
       </w:rPr>
     </w:lvl>
   </w:abstractNum>
-  <w:abstractNum w:abstractNumId="56" w15:restartNumberingAfterBreak="0">
+  <w:abstractNum w:abstractNumId="58" w15:restartNumberingAfterBreak="0">
     <w:nsid w:val="3F5E3BA1"/>
     <w:multiLevelType w:val="multilevel"/>
     <w:tmpl w:val="2AA67CDA"/>
@@ -8782,7 +9529,7 @@
       </w:rPr>
     </w:lvl>
   </w:abstractNum>
-  <w:abstractNum w:abstractNumId="57" w15:restartNumberingAfterBreak="0">
+  <w:abstractNum w:abstractNumId="59" w15:restartNumberingAfterBreak="0">
     <w:nsid w:val="40431B1C"/>
     <w:multiLevelType w:val="multilevel"/>
     <w:tmpl w:val="5D8E77D0"/>
@@ -8931,7 +9678,7 @@
       </w:rPr>
     </w:lvl>
   </w:abstractNum>
-  <w:abstractNum w:abstractNumId="58" w15:restartNumberingAfterBreak="0">
+  <w:abstractNum w:abstractNumId="60" w15:restartNumberingAfterBreak="0">
     <w:nsid w:val="419E0199"/>
     <w:multiLevelType w:val="multilevel"/>
     <w:tmpl w:val="D6CA9606"/>
@@ -9080,7 +9827,7 @@
       </w:rPr>
     </w:lvl>
   </w:abstractNum>
-  <w:abstractNum w:abstractNumId="59" w15:restartNumberingAfterBreak="0">
+  <w:abstractNum w:abstractNumId="61" w15:restartNumberingAfterBreak="0">
     <w:nsid w:val="452F60FB"/>
     <w:multiLevelType w:val="hybridMultilevel"/>
     <w:tmpl w:val="892A990A"/>
@@ -9193,7 +9940,7 @@
       </w:rPr>
     </w:lvl>
   </w:abstractNum>
-  <w:abstractNum w:abstractNumId="60" w15:restartNumberingAfterBreak="0">
+  <w:abstractNum w:abstractNumId="62" w15:restartNumberingAfterBreak="0">
     <w:nsid w:val="47B65409"/>
     <w:multiLevelType w:val="multilevel"/>
     <w:tmpl w:val="2AA67CDA"/>
@@ -9342,7 +10089,7 @@
       </w:rPr>
     </w:lvl>
   </w:abstractNum>
-  <w:abstractNum w:abstractNumId="61" w15:restartNumberingAfterBreak="0">
+  <w:abstractNum w:abstractNumId="63" w15:restartNumberingAfterBreak="0">
     <w:nsid w:val="47BF2170"/>
     <w:multiLevelType w:val="multilevel"/>
     <w:tmpl w:val="D9681266"/>
@@ -9491,7 +10238,7 @@
       </w:rPr>
     </w:lvl>
   </w:abstractNum>
-  <w:abstractNum w:abstractNumId="62" w15:restartNumberingAfterBreak="0">
+  <w:abstractNum w:abstractNumId="64" w15:restartNumberingAfterBreak="0">
     <w:nsid w:val="47E5592F"/>
     <w:multiLevelType w:val="hybridMultilevel"/>
     <w:tmpl w:val="719AB9FA"/>
@@ -9604,7 +10351,7 @@
       </w:rPr>
     </w:lvl>
   </w:abstractNum>
-  <w:abstractNum w:abstractNumId="63" w15:restartNumberingAfterBreak="0">
+  <w:abstractNum w:abstractNumId="65" w15:restartNumberingAfterBreak="0">
     <w:nsid w:val="48C041A9"/>
     <w:multiLevelType w:val="multilevel"/>
     <w:tmpl w:val="59A694BC"/>
@@ -9753,7 +10500,7 @@
       </w:rPr>
     </w:lvl>
   </w:abstractNum>
-  <w:abstractNum w:abstractNumId="64" w15:restartNumberingAfterBreak="0">
+  <w:abstractNum w:abstractNumId="66" w15:restartNumberingAfterBreak="0">
     <w:nsid w:val="49D6568A"/>
     <w:multiLevelType w:val="multilevel"/>
     <w:tmpl w:val="559E29EC"/>
@@ -9902,7 +10649,7 @@
       </w:rPr>
     </w:lvl>
   </w:abstractNum>
-  <w:abstractNum w:abstractNumId="65" w15:restartNumberingAfterBreak="0">
+  <w:abstractNum w:abstractNumId="67" w15:restartNumberingAfterBreak="0">
     <w:nsid w:val="4AF73293"/>
     <w:multiLevelType w:val="hybridMultilevel"/>
     <w:tmpl w:val="F2962738"/>
@@ -10015,7 +10762,7 @@
       </w:rPr>
     </w:lvl>
   </w:abstractNum>
-  <w:abstractNum w:abstractNumId="66" w15:restartNumberingAfterBreak="0">
+  <w:abstractNum w:abstractNumId="68" w15:restartNumberingAfterBreak="0">
     <w:nsid w:val="4B375248"/>
     <w:multiLevelType w:val="multilevel"/>
     <w:tmpl w:val="B574C1C6"/>
@@ -10164,7 +10911,7 @@
       </w:rPr>
     </w:lvl>
   </w:abstractNum>
-  <w:abstractNum w:abstractNumId="67" w15:restartNumberingAfterBreak="0">
+  <w:abstractNum w:abstractNumId="69" w15:restartNumberingAfterBreak="0">
     <w:nsid w:val="4BA13766"/>
     <w:multiLevelType w:val="multilevel"/>
     <w:tmpl w:val="63F4E6F0"/>
@@ -10313,7 +11060,7 @@
       </w:rPr>
     </w:lvl>
   </w:abstractNum>
-  <w:abstractNum w:abstractNumId="68" w15:restartNumberingAfterBreak="0">
+  <w:abstractNum w:abstractNumId="70" w15:restartNumberingAfterBreak="0">
     <w:nsid w:val="4BA25441"/>
     <w:multiLevelType w:val="hybridMultilevel"/>
     <w:tmpl w:val="217E2E96"/>
@@ -10426,7 +11173,7 @@
       </w:rPr>
     </w:lvl>
   </w:abstractNum>
-  <w:abstractNum w:abstractNumId="69" w15:restartNumberingAfterBreak="0">
+  <w:abstractNum w:abstractNumId="71" w15:restartNumberingAfterBreak="0">
     <w:nsid w:val="4E276DCB"/>
     <w:multiLevelType w:val="hybridMultilevel"/>
     <w:tmpl w:val="B7C469B4"/>
@@ -10539,7 +11286,7 @@
       </w:rPr>
     </w:lvl>
   </w:abstractNum>
-  <w:abstractNum w:abstractNumId="70" w15:restartNumberingAfterBreak="0">
+  <w:abstractNum w:abstractNumId="72" w15:restartNumberingAfterBreak="0">
     <w:nsid w:val="4F053929"/>
     <w:multiLevelType w:val="hybridMultilevel"/>
     <w:tmpl w:val="2A78C678"/>
@@ -10652,7 +11399,7 @@
       </w:rPr>
     </w:lvl>
   </w:abstractNum>
-  <w:abstractNum w:abstractNumId="71" w15:restartNumberingAfterBreak="0">
+  <w:abstractNum w:abstractNumId="73" w15:restartNumberingAfterBreak="0">
     <w:nsid w:val="4FFB237E"/>
     <w:multiLevelType w:val="multilevel"/>
     <w:tmpl w:val="2AA67CDA"/>
@@ -10801,7 +11548,7 @@
       </w:rPr>
     </w:lvl>
   </w:abstractNum>
-  <w:abstractNum w:abstractNumId="72" w15:restartNumberingAfterBreak="0">
+  <w:abstractNum w:abstractNumId="74" w15:restartNumberingAfterBreak="0">
     <w:nsid w:val="51737FE0"/>
     <w:multiLevelType w:val="hybridMultilevel"/>
     <w:tmpl w:val="2B0604E6"/>
@@ -10914,7 +11661,7 @@
       </w:rPr>
     </w:lvl>
   </w:abstractNum>
-  <w:abstractNum w:abstractNumId="73" w15:restartNumberingAfterBreak="0">
+  <w:abstractNum w:abstractNumId="75" w15:restartNumberingAfterBreak="0">
     <w:nsid w:val="518B1885"/>
     <w:multiLevelType w:val="multilevel"/>
     <w:tmpl w:val="AE1AAC28"/>
@@ -11063,7 +11810,7 @@
       </w:rPr>
     </w:lvl>
   </w:abstractNum>
-  <w:abstractNum w:abstractNumId="74" w15:restartNumberingAfterBreak="0">
+  <w:abstractNum w:abstractNumId="76" w15:restartNumberingAfterBreak="0">
     <w:nsid w:val="51A86EF8"/>
     <w:multiLevelType w:val="multilevel"/>
     <w:tmpl w:val="FF2841D4"/>
@@ -11212,7 +11959,7 @@
       </w:rPr>
     </w:lvl>
   </w:abstractNum>
-  <w:abstractNum w:abstractNumId="75" w15:restartNumberingAfterBreak="0">
+  <w:abstractNum w:abstractNumId="77" w15:restartNumberingAfterBreak="0">
     <w:nsid w:val="51AB55CC"/>
     <w:multiLevelType w:val="multilevel"/>
     <w:tmpl w:val="5986D838"/>
@@ -11361,7 +12108,7 @@
       </w:rPr>
     </w:lvl>
   </w:abstractNum>
-  <w:abstractNum w:abstractNumId="76" w15:restartNumberingAfterBreak="0">
+  <w:abstractNum w:abstractNumId="78" w15:restartNumberingAfterBreak="0">
     <w:nsid w:val="521378FF"/>
     <w:multiLevelType w:val="multilevel"/>
     <w:tmpl w:val="7B002268"/>
@@ -11510,7 +12257,7 @@
       </w:rPr>
     </w:lvl>
   </w:abstractNum>
-  <w:abstractNum w:abstractNumId="77" w15:restartNumberingAfterBreak="0">
+  <w:abstractNum w:abstractNumId="79" w15:restartNumberingAfterBreak="0">
     <w:nsid w:val="521F2792"/>
     <w:multiLevelType w:val="multilevel"/>
     <w:tmpl w:val="9FB45386"/>
@@ -11659,7 +12406,7 @@
       </w:rPr>
     </w:lvl>
   </w:abstractNum>
-  <w:abstractNum w:abstractNumId="78" w15:restartNumberingAfterBreak="0">
+  <w:abstractNum w:abstractNumId="80" w15:restartNumberingAfterBreak="0">
     <w:nsid w:val="53390911"/>
     <w:multiLevelType w:val="multilevel"/>
     <w:tmpl w:val="1C380F12"/>
@@ -11808,7 +12555,7 @@
       </w:rPr>
     </w:lvl>
   </w:abstractNum>
-  <w:abstractNum w:abstractNumId="79" w15:restartNumberingAfterBreak="0">
+  <w:abstractNum w:abstractNumId="81" w15:restartNumberingAfterBreak="0">
     <w:nsid w:val="53CD23AC"/>
     <w:multiLevelType w:val="multilevel"/>
     <w:tmpl w:val="57BAE8F0"/>
@@ -11957,7 +12704,7 @@
       </w:rPr>
     </w:lvl>
   </w:abstractNum>
-  <w:abstractNum w:abstractNumId="80" w15:restartNumberingAfterBreak="0">
+  <w:abstractNum w:abstractNumId="82" w15:restartNumberingAfterBreak="0">
     <w:nsid w:val="5462791F"/>
     <w:multiLevelType w:val="hybridMultilevel"/>
     <w:tmpl w:val="FDE24C26"/>
@@ -12070,7 +12817,7 @@
       </w:rPr>
     </w:lvl>
   </w:abstractNum>
-  <w:abstractNum w:abstractNumId="81" w15:restartNumberingAfterBreak="0">
+  <w:abstractNum w:abstractNumId="83" w15:restartNumberingAfterBreak="0">
     <w:nsid w:val="547005EB"/>
     <w:multiLevelType w:val="multilevel"/>
     <w:tmpl w:val="F260CC5C"/>
@@ -12219,7 +12966,7 @@
       </w:rPr>
     </w:lvl>
   </w:abstractNum>
-  <w:abstractNum w:abstractNumId="82" w15:restartNumberingAfterBreak="0">
+  <w:abstractNum w:abstractNumId="84" w15:restartNumberingAfterBreak="0">
     <w:nsid w:val="58034221"/>
     <w:multiLevelType w:val="hybridMultilevel"/>
     <w:tmpl w:val="65D0619C"/>
@@ -12332,7 +13079,7 @@
       </w:rPr>
     </w:lvl>
   </w:abstractNum>
-  <w:abstractNum w:abstractNumId="83" w15:restartNumberingAfterBreak="0">
+  <w:abstractNum w:abstractNumId="85" w15:restartNumberingAfterBreak="0">
     <w:nsid w:val="59515319"/>
     <w:multiLevelType w:val="multilevel"/>
     <w:tmpl w:val="5AD8ACF0"/>
@@ -12481,7 +13228,7 @@
       </w:rPr>
     </w:lvl>
   </w:abstractNum>
-  <w:abstractNum w:abstractNumId="84" w15:restartNumberingAfterBreak="0">
+  <w:abstractNum w:abstractNumId="86" w15:restartNumberingAfterBreak="0">
     <w:nsid w:val="5A460390"/>
     <w:multiLevelType w:val="hybridMultilevel"/>
     <w:tmpl w:val="BD8E939C"/>
@@ -12594,7 +13341,7 @@
       </w:rPr>
     </w:lvl>
   </w:abstractNum>
-  <w:abstractNum w:abstractNumId="85" w15:restartNumberingAfterBreak="0">
+  <w:abstractNum w:abstractNumId="87" w15:restartNumberingAfterBreak="0">
     <w:nsid w:val="5CEE630B"/>
     <w:multiLevelType w:val="hybridMultilevel"/>
     <w:tmpl w:val="DE8E8DBA"/>
@@ -12707,7 +13454,7 @@
       </w:rPr>
     </w:lvl>
   </w:abstractNum>
-  <w:abstractNum w:abstractNumId="86" w15:restartNumberingAfterBreak="0">
+  <w:abstractNum w:abstractNumId="88" w15:restartNumberingAfterBreak="0">
     <w:nsid w:val="5D5A183C"/>
     <w:multiLevelType w:val="multilevel"/>
     <w:tmpl w:val="C804C34A"/>
@@ -12856,7 +13603,7 @@
       </w:rPr>
     </w:lvl>
   </w:abstractNum>
-  <w:abstractNum w:abstractNumId="87" w15:restartNumberingAfterBreak="0">
+  <w:abstractNum w:abstractNumId="89" w15:restartNumberingAfterBreak="0">
     <w:nsid w:val="5DF95194"/>
     <w:multiLevelType w:val="multilevel"/>
     <w:tmpl w:val="CC127E54"/>
@@ -13005,7 +13752,7 @@
       </w:rPr>
     </w:lvl>
   </w:abstractNum>
-  <w:abstractNum w:abstractNumId="88" w15:restartNumberingAfterBreak="0">
+  <w:abstractNum w:abstractNumId="90" w15:restartNumberingAfterBreak="0">
     <w:nsid w:val="5E6333E0"/>
     <w:multiLevelType w:val="hybridMultilevel"/>
     <w:tmpl w:val="A15497C8"/>
@@ -13118,7 +13865,7 @@
       </w:rPr>
     </w:lvl>
   </w:abstractNum>
-  <w:abstractNum w:abstractNumId="89" w15:restartNumberingAfterBreak="0">
+  <w:abstractNum w:abstractNumId="91" w15:restartNumberingAfterBreak="0">
     <w:nsid w:val="5E9C452C"/>
     <w:multiLevelType w:val="multilevel"/>
     <w:tmpl w:val="B8727936"/>
@@ -13267,7 +14014,156 @@
       </w:rPr>
     </w:lvl>
   </w:abstractNum>
-  <w:abstractNum w:abstractNumId="90" w15:restartNumberingAfterBreak="0">
+  <w:abstractNum w:abstractNumId="92" w15:restartNumberingAfterBreak="0">
+    <w:nsid w:val="5EC339A8"/>
+    <w:multiLevelType w:val="multilevel"/>
+    <w:tmpl w:val="36DAAD54"/>
+    <w:lvl w:ilvl="0">
+      <w:start w:val="1"/>
+      <w:numFmt w:val="bullet"/>
+      <w:lvlText w:val=""/>
+      <w:lvlJc w:val="left"/>
+      <w:pPr>
+        <w:tabs>
+          <w:tab w:val="num" w:pos="720"/>
+        </w:tabs>
+        <w:ind w:left="720" w:hanging="360"/>
+      </w:pPr>
+      <w:rPr>
+        <w:rFonts w:ascii="Symbol" w:hAnsi="Symbol" w:hint="default"/>
+        <w:sz w:val="20"/>
+      </w:rPr>
+    </w:lvl>
+    <w:lvl w:ilvl="1" w:tentative="1">
+      <w:start w:val="1"/>
+      <w:numFmt w:val="bullet"/>
+      <w:lvlText w:val="o"/>
+      <w:lvlJc w:val="left"/>
+      <w:pPr>
+        <w:tabs>
+          <w:tab w:val="num" w:pos="1440"/>
+        </w:tabs>
+        <w:ind w:left="1440" w:hanging="360"/>
+      </w:pPr>
+      <w:rPr>
+        <w:rFonts w:ascii="Courier New" w:hAnsi="Courier New" w:hint="default"/>
+        <w:sz w:val="20"/>
+      </w:rPr>
+    </w:lvl>
+    <w:lvl w:ilvl="2" w:tentative="1">
+      <w:start w:val="1"/>
+      <w:numFmt w:val="bullet"/>
+      <w:lvlText w:val=""/>
+      <w:lvlJc w:val="left"/>
+      <w:pPr>
+        <w:tabs>
+          <w:tab w:val="num" w:pos="2160"/>
+        </w:tabs>
+        <w:ind w:left="2160" w:hanging="360"/>
+      </w:pPr>
+      <w:rPr>
+        <w:rFonts w:ascii="Wingdings" w:hAnsi="Wingdings" w:hint="default"/>
+        <w:sz w:val="20"/>
+      </w:rPr>
+    </w:lvl>
+    <w:lvl w:ilvl="3" w:tentative="1">
+      <w:start w:val="1"/>
+      <w:numFmt w:val="bullet"/>
+      <w:lvlText w:val=""/>
+      <w:lvlJc w:val="left"/>
+      <w:pPr>
+        <w:tabs>
+          <w:tab w:val="num" w:pos="2880"/>
+        </w:tabs>
+        <w:ind w:left="2880" w:hanging="360"/>
+      </w:pPr>
+      <w:rPr>
+        <w:rFonts w:ascii="Wingdings" w:hAnsi="Wingdings" w:hint="default"/>
+        <w:sz w:val="20"/>
+      </w:rPr>
+    </w:lvl>
+    <w:lvl w:ilvl="4" w:tentative="1">
+      <w:start w:val="1"/>
+      <w:numFmt w:val="bullet"/>
+      <w:lvlText w:val=""/>
+      <w:lvlJc w:val="left"/>
+      <w:pPr>
+        <w:tabs>
+          <w:tab w:val="num" w:pos="3600"/>
+        </w:tabs>
+        <w:ind w:left="3600" w:hanging="360"/>
+      </w:pPr>
+      <w:rPr>
+        <w:rFonts w:ascii="Wingdings" w:hAnsi="Wingdings" w:hint="default"/>
+        <w:sz w:val="20"/>
+      </w:rPr>
+    </w:lvl>
+    <w:lvl w:ilvl="5" w:tentative="1">
+      <w:start w:val="1"/>
+      <w:numFmt w:val="bullet"/>
+      <w:lvlText w:val=""/>
+      <w:lvlJc w:val="left"/>
+      <w:pPr>
+        <w:tabs>
+          <w:tab w:val="num" w:pos="4320"/>
+        </w:tabs>
+        <w:ind w:left="4320" w:hanging="360"/>
+      </w:pPr>
+      <w:rPr>
+        <w:rFonts w:ascii="Wingdings" w:hAnsi="Wingdings" w:hint="default"/>
+        <w:sz w:val="20"/>
+      </w:rPr>
+    </w:lvl>
+    <w:lvl w:ilvl="6" w:tentative="1">
+      <w:start w:val="1"/>
+      <w:numFmt w:val="bullet"/>
+      <w:lvlText w:val=""/>
+      <w:lvlJc w:val="left"/>
+      <w:pPr>
+        <w:tabs>
+          <w:tab w:val="num" w:pos="5040"/>
+        </w:tabs>
+        <w:ind w:left="5040" w:hanging="360"/>
+      </w:pPr>
+      <w:rPr>
+        <w:rFonts w:ascii="Wingdings" w:hAnsi="Wingdings" w:hint="default"/>
+        <w:sz w:val="20"/>
+      </w:rPr>
+    </w:lvl>
+    <w:lvl w:ilvl="7" w:tentative="1">
+      <w:start w:val="1"/>
+      <w:numFmt w:val="bullet"/>
+      <w:lvlText w:val=""/>
+      <w:lvlJc w:val="left"/>
+      <w:pPr>
+        <w:tabs>
+          <w:tab w:val="num" w:pos="5760"/>
+        </w:tabs>
+        <w:ind w:left="5760" w:hanging="360"/>
+      </w:pPr>
+      <w:rPr>
+        <w:rFonts w:ascii="Wingdings" w:hAnsi="Wingdings" w:hint="default"/>
+        <w:sz w:val="20"/>
+      </w:rPr>
+    </w:lvl>
+    <w:lvl w:ilvl="8" w:tentative="1">
+      <w:start w:val="1"/>
+      <w:numFmt w:val="bullet"/>
+      <w:lvlText w:val=""/>
+      <w:lvlJc w:val="left"/>
+      <w:pPr>
+        <w:tabs>
+          <w:tab w:val="num" w:pos="6480"/>
+        </w:tabs>
+        <w:ind w:left="6480" w:hanging="360"/>
+      </w:pPr>
+      <w:rPr>
+        <w:rFonts w:ascii="Wingdings" w:hAnsi="Wingdings" w:hint="default"/>
+        <w:sz w:val="20"/>
+      </w:rPr>
+    </w:lvl>
+  </w:abstractNum>
+  <w:abstractNum w:abstractNumId="93" w15:restartNumberingAfterBreak="0">
     <w:nsid w:val="62385AA6"/>
     <w:multiLevelType w:val="multilevel"/>
     <w:tmpl w:val="B9EAECD4"/>
@@ -13416,7 +14312,7 @@
       </w:rPr>
     </w:lvl>
   </w:abstractNum>
-  <w:abstractNum w:abstractNumId="91" w15:restartNumberingAfterBreak="0">
+  <w:abstractNum w:abstractNumId="94" w15:restartNumberingAfterBreak="0">
     <w:nsid w:val="625D686D"/>
     <w:multiLevelType w:val="multilevel"/>
     <w:tmpl w:val="BC1C2048"/>
@@ -13565,7 +14461,7 @@
       </w:rPr>
     </w:lvl>
   </w:abstractNum>
-  <w:abstractNum w:abstractNumId="92" w15:restartNumberingAfterBreak="0">
+  <w:abstractNum w:abstractNumId="95" w15:restartNumberingAfterBreak="0">
     <w:nsid w:val="62B46951"/>
     <w:multiLevelType w:val="hybridMultilevel"/>
     <w:tmpl w:val="0FEAFEC6"/>
@@ -13678,7 +14574,7 @@
       </w:rPr>
     </w:lvl>
   </w:abstractNum>
-  <w:abstractNum w:abstractNumId="93" w15:restartNumberingAfterBreak="0">
+  <w:abstractNum w:abstractNumId="96" w15:restartNumberingAfterBreak="0">
     <w:nsid w:val="647819E3"/>
     <w:multiLevelType w:val="multilevel"/>
     <w:tmpl w:val="ABB278BC"/>
@@ -13827,7 +14723,7 @@
       </w:rPr>
     </w:lvl>
   </w:abstractNum>
-  <w:abstractNum w:abstractNumId="94" w15:restartNumberingAfterBreak="0">
+  <w:abstractNum w:abstractNumId="97" w15:restartNumberingAfterBreak="0">
     <w:nsid w:val="64F30198"/>
     <w:multiLevelType w:val="multilevel"/>
     <w:tmpl w:val="63F4E6F0"/>
@@ -13976,7 +14872,7 @@
       </w:rPr>
     </w:lvl>
   </w:abstractNum>
-  <w:abstractNum w:abstractNumId="95" w15:restartNumberingAfterBreak="0">
+  <w:abstractNum w:abstractNumId="98" w15:restartNumberingAfterBreak="0">
     <w:nsid w:val="65314293"/>
     <w:multiLevelType w:val="hybridMultilevel"/>
     <w:tmpl w:val="6688DFAC"/>
@@ -14089,7 +14985,7 @@
       </w:rPr>
     </w:lvl>
   </w:abstractNum>
-  <w:abstractNum w:abstractNumId="96" w15:restartNumberingAfterBreak="0">
+  <w:abstractNum w:abstractNumId="99" w15:restartNumberingAfterBreak="0">
     <w:nsid w:val="65CE4D0F"/>
     <w:multiLevelType w:val="hybridMultilevel"/>
     <w:tmpl w:val="DB668538"/>
@@ -14202,7 +15098,7 @@
       </w:rPr>
     </w:lvl>
   </w:abstractNum>
-  <w:abstractNum w:abstractNumId="97" w15:restartNumberingAfterBreak="0">
+  <w:abstractNum w:abstractNumId="100" w15:restartNumberingAfterBreak="0">
     <w:nsid w:val="661C7D73"/>
     <w:multiLevelType w:val="multilevel"/>
     <w:tmpl w:val="D9681266"/>
@@ -14351,7 +15247,7 @@
       </w:rPr>
     </w:lvl>
   </w:abstractNum>
-  <w:abstractNum w:abstractNumId="98" w15:restartNumberingAfterBreak="0">
+  <w:abstractNum w:abstractNumId="101" w15:restartNumberingAfterBreak="0">
     <w:nsid w:val="661F6F82"/>
     <w:multiLevelType w:val="multilevel"/>
     <w:tmpl w:val="53F8A934"/>
@@ -14500,7 +15396,7 @@
       </w:rPr>
     </w:lvl>
   </w:abstractNum>
-  <w:abstractNum w:abstractNumId="99" w15:restartNumberingAfterBreak="0">
+  <w:abstractNum w:abstractNumId="102" w15:restartNumberingAfterBreak="0">
     <w:nsid w:val="66E36FE0"/>
     <w:multiLevelType w:val="multilevel"/>
     <w:tmpl w:val="2AA67CDA"/>
@@ -14649,7 +15545,7 @@
       </w:rPr>
     </w:lvl>
   </w:abstractNum>
-  <w:abstractNum w:abstractNumId="100" w15:restartNumberingAfterBreak="0">
+  <w:abstractNum w:abstractNumId="103" w15:restartNumberingAfterBreak="0">
     <w:nsid w:val="68B94344"/>
     <w:multiLevelType w:val="multilevel"/>
     <w:tmpl w:val="9BA812D8"/>
@@ -14798,7 +15694,7 @@
       </w:rPr>
     </w:lvl>
   </w:abstractNum>
-  <w:abstractNum w:abstractNumId="101" w15:restartNumberingAfterBreak="0">
+  <w:abstractNum w:abstractNumId="104" w15:restartNumberingAfterBreak="0">
     <w:nsid w:val="69DE2C87"/>
     <w:multiLevelType w:val="hybridMultilevel"/>
     <w:tmpl w:val="F530F20A"/>
@@ -14911,7 +15807,7 @@
       </w:rPr>
     </w:lvl>
   </w:abstractNum>
-  <w:abstractNum w:abstractNumId="102" w15:restartNumberingAfterBreak="0">
+  <w:abstractNum w:abstractNumId="105" w15:restartNumberingAfterBreak="0">
     <w:nsid w:val="69ED672D"/>
     <w:multiLevelType w:val="multilevel"/>
     <w:tmpl w:val="CC08E300"/>
@@ -15060,7 +15956,7 @@
       </w:rPr>
     </w:lvl>
   </w:abstractNum>
-  <w:abstractNum w:abstractNumId="103" w15:restartNumberingAfterBreak="0">
+  <w:abstractNum w:abstractNumId="106" w15:restartNumberingAfterBreak="0">
     <w:nsid w:val="6A063EFD"/>
     <w:multiLevelType w:val="hybridMultilevel"/>
     <w:tmpl w:val="48703FBA"/>
@@ -15173,7 +16069,7 @@
       </w:rPr>
     </w:lvl>
   </w:abstractNum>
-  <w:abstractNum w:abstractNumId="104" w15:restartNumberingAfterBreak="0">
+  <w:abstractNum w:abstractNumId="107" w15:restartNumberingAfterBreak="0">
     <w:nsid w:val="6A825ABE"/>
     <w:multiLevelType w:val="multilevel"/>
     <w:tmpl w:val="0CD6F30E"/>
@@ -15322,7 +16218,7 @@
       </w:rPr>
     </w:lvl>
   </w:abstractNum>
-  <w:abstractNum w:abstractNumId="105" w15:restartNumberingAfterBreak="0">
+  <w:abstractNum w:abstractNumId="108" w15:restartNumberingAfterBreak="0">
     <w:nsid w:val="6B1D7832"/>
     <w:multiLevelType w:val="multilevel"/>
     <w:tmpl w:val="DD4646B2"/>
@@ -15471,7 +16367,7 @@
       </w:rPr>
     </w:lvl>
   </w:abstractNum>
-  <w:abstractNum w:abstractNumId="106" w15:restartNumberingAfterBreak="0">
+  <w:abstractNum w:abstractNumId="109" w15:restartNumberingAfterBreak="0">
     <w:nsid w:val="6C6D6667"/>
     <w:multiLevelType w:val="hybridMultilevel"/>
     <w:tmpl w:val="A744709C"/>
@@ -15584,7 +16480,7 @@
       </w:rPr>
     </w:lvl>
   </w:abstractNum>
-  <w:abstractNum w:abstractNumId="107" w15:restartNumberingAfterBreak="0">
+  <w:abstractNum w:abstractNumId="110" w15:restartNumberingAfterBreak="0">
     <w:nsid w:val="6CAD7EA5"/>
     <w:multiLevelType w:val="multilevel"/>
     <w:tmpl w:val="C472C5B0"/>
@@ -15733,7 +16629,7 @@
       </w:rPr>
     </w:lvl>
   </w:abstractNum>
-  <w:abstractNum w:abstractNumId="108" w15:restartNumberingAfterBreak="0">
+  <w:abstractNum w:abstractNumId="111" w15:restartNumberingAfterBreak="0">
     <w:nsid w:val="6E43557B"/>
     <w:multiLevelType w:val="multilevel"/>
     <w:tmpl w:val="323C7112"/>
@@ -15882,7 +16778,7 @@
       </w:rPr>
     </w:lvl>
   </w:abstractNum>
-  <w:abstractNum w:abstractNumId="109" w15:restartNumberingAfterBreak="0">
+  <w:abstractNum w:abstractNumId="112" w15:restartNumberingAfterBreak="0">
     <w:nsid w:val="6EA27D0A"/>
     <w:multiLevelType w:val="multilevel"/>
     <w:tmpl w:val="7BF0256C"/>
@@ -16031,7 +16927,7 @@
       </w:rPr>
     </w:lvl>
   </w:abstractNum>
-  <w:abstractNum w:abstractNumId="110" w15:restartNumberingAfterBreak="0">
+  <w:abstractNum w:abstractNumId="113" w15:restartNumberingAfterBreak="0">
     <w:nsid w:val="6EF86273"/>
     <w:multiLevelType w:val="multilevel"/>
     <w:tmpl w:val="2AA67CDA"/>
@@ -16180,7 +17076,7 @@
       </w:rPr>
     </w:lvl>
   </w:abstractNum>
-  <w:abstractNum w:abstractNumId="111" w15:restartNumberingAfterBreak="0">
+  <w:abstractNum w:abstractNumId="114" w15:restartNumberingAfterBreak="0">
     <w:nsid w:val="70874300"/>
     <w:multiLevelType w:val="hybridMultilevel"/>
     <w:tmpl w:val="1B3A0518"/>
@@ -16293,7 +17189,7 @@
       </w:rPr>
     </w:lvl>
   </w:abstractNum>
-  <w:abstractNum w:abstractNumId="112" w15:restartNumberingAfterBreak="0">
+  <w:abstractNum w:abstractNumId="115" w15:restartNumberingAfterBreak="0">
     <w:nsid w:val="7090251B"/>
     <w:multiLevelType w:val="hybridMultilevel"/>
     <w:tmpl w:val="67687EFE"/>
@@ -16406,7 +17302,7 @@
       </w:rPr>
     </w:lvl>
   </w:abstractNum>
-  <w:abstractNum w:abstractNumId="113" w15:restartNumberingAfterBreak="0">
+  <w:abstractNum w:abstractNumId="116" w15:restartNumberingAfterBreak="0">
     <w:nsid w:val="72031F81"/>
     <w:multiLevelType w:val="multilevel"/>
     <w:tmpl w:val="84400090"/>
@@ -16555,7 +17451,7 @@
       </w:rPr>
     </w:lvl>
   </w:abstractNum>
-  <w:abstractNum w:abstractNumId="114" w15:restartNumberingAfterBreak="0">
+  <w:abstractNum w:abstractNumId="117" w15:restartNumberingAfterBreak="0">
     <w:nsid w:val="722301E0"/>
     <w:multiLevelType w:val="multilevel"/>
     <w:tmpl w:val="1EE82E5A"/>
@@ -16704,7 +17600,7 @@
       </w:rPr>
     </w:lvl>
   </w:abstractNum>
-  <w:abstractNum w:abstractNumId="115" w15:restartNumberingAfterBreak="0">
+  <w:abstractNum w:abstractNumId="118" w15:restartNumberingAfterBreak="0">
     <w:nsid w:val="75144C65"/>
     <w:multiLevelType w:val="hybridMultilevel"/>
     <w:tmpl w:val="12127FAA"/>
@@ -16817,7 +17713,7 @@
       </w:rPr>
     </w:lvl>
   </w:abstractNum>
-  <w:abstractNum w:abstractNumId="116" w15:restartNumberingAfterBreak="0">
+  <w:abstractNum w:abstractNumId="119" w15:restartNumberingAfterBreak="0">
     <w:nsid w:val="75237F84"/>
     <w:multiLevelType w:val="hybridMultilevel"/>
     <w:tmpl w:val="5F0A6EF2"/>
@@ -16930,7 +17826,7 @@
       </w:rPr>
     </w:lvl>
   </w:abstractNum>
-  <w:abstractNum w:abstractNumId="117" w15:restartNumberingAfterBreak="0">
+  <w:abstractNum w:abstractNumId="120" w15:restartNumberingAfterBreak="0">
     <w:nsid w:val="758968F2"/>
     <w:multiLevelType w:val="multilevel"/>
     <w:tmpl w:val="D4241C4A"/>
@@ -17079,7 +17975,7 @@
       </w:rPr>
     </w:lvl>
   </w:abstractNum>
-  <w:abstractNum w:abstractNumId="118" w15:restartNumberingAfterBreak="0">
+  <w:abstractNum w:abstractNumId="121" w15:restartNumberingAfterBreak="0">
     <w:nsid w:val="75FF09B0"/>
     <w:multiLevelType w:val="multilevel"/>
     <w:tmpl w:val="C34A7734"/>
@@ -17228,7 +18124,7 @@
       </w:rPr>
     </w:lvl>
   </w:abstractNum>
-  <w:abstractNum w:abstractNumId="119" w15:restartNumberingAfterBreak="0">
+  <w:abstractNum w:abstractNumId="122" w15:restartNumberingAfterBreak="0">
     <w:nsid w:val="76864E3D"/>
     <w:multiLevelType w:val="hybridMultilevel"/>
     <w:tmpl w:val="9000C896"/>
@@ -17341,7 +18237,7 @@
       </w:rPr>
     </w:lvl>
   </w:abstractNum>
-  <w:abstractNum w:abstractNumId="120" w15:restartNumberingAfterBreak="0">
+  <w:abstractNum w:abstractNumId="123" w15:restartNumberingAfterBreak="0">
     <w:nsid w:val="77960362"/>
     <w:multiLevelType w:val="multilevel"/>
     <w:tmpl w:val="FEA0022E"/>
@@ -17490,7 +18386,156 @@
       </w:rPr>
     </w:lvl>
   </w:abstractNum>
-  <w:abstractNum w:abstractNumId="121" w15:restartNumberingAfterBreak="0">
+  <w:abstractNum w:abstractNumId="124" w15:restartNumberingAfterBreak="0">
+    <w:nsid w:val="78547E35"/>
+    <w:multiLevelType w:val="multilevel"/>
+    <w:tmpl w:val="FC1421DE"/>
+    <w:lvl w:ilvl="0">
+      <w:start w:val="1"/>
+      <w:numFmt w:val="bullet"/>
+      <w:lvlText w:val=""/>
+      <w:lvlJc w:val="left"/>
+      <w:pPr>
+        <w:tabs>
+          <w:tab w:val="num" w:pos="720"/>
+        </w:tabs>
+        <w:ind w:left="720" w:hanging="360"/>
+      </w:pPr>
+      <w:rPr>
+        <w:rFonts w:ascii="Symbol" w:hAnsi="Symbol" w:hint="default"/>
+        <w:sz w:val="20"/>
+      </w:rPr>
+    </w:lvl>
+    <w:lvl w:ilvl="1" w:tentative="1">
+      <w:start w:val="1"/>
+      <w:numFmt w:val="bullet"/>
+      <w:lvlText w:val="o"/>
+      <w:lvlJc w:val="left"/>
+      <w:pPr>
+        <w:tabs>
+          <w:tab w:val="num" w:pos="1440"/>
+        </w:tabs>
+        <w:ind w:left="1440" w:hanging="360"/>
+      </w:pPr>
+      <w:rPr>
+        <w:rFonts w:ascii="Courier New" w:hAnsi="Courier New" w:hint="default"/>
+        <w:sz w:val="20"/>
+      </w:rPr>
+    </w:lvl>
+    <w:lvl w:ilvl="2" w:tentative="1">
+      <w:start w:val="1"/>
+      <w:numFmt w:val="bullet"/>
+      <w:lvlText w:val=""/>
+      <w:lvlJc w:val="left"/>
+      <w:pPr>
+        <w:tabs>
+          <w:tab w:val="num" w:pos="2160"/>
+        </w:tabs>
+        <w:ind w:left="2160" w:hanging="360"/>
+      </w:pPr>
+      <w:rPr>
+        <w:rFonts w:ascii="Wingdings" w:hAnsi="Wingdings" w:hint="default"/>
+        <w:sz w:val="20"/>
+      </w:rPr>
+    </w:lvl>
+    <w:lvl w:ilvl="3" w:tentative="1">
+      <w:start w:val="1"/>
+      <w:numFmt w:val="bullet"/>
+      <w:lvlText w:val=""/>
+      <w:lvlJc w:val="left"/>
+      <w:pPr>
+        <w:tabs>
+          <w:tab w:val="num" w:pos="2880"/>
+        </w:tabs>
+        <w:ind w:left="2880" w:hanging="360"/>
+      </w:pPr>
+      <w:rPr>
+        <w:rFonts w:ascii="Wingdings" w:hAnsi="Wingdings" w:hint="default"/>
+        <w:sz w:val="20"/>
+      </w:rPr>
+    </w:lvl>
+    <w:lvl w:ilvl="4" w:tentative="1">
+      <w:start w:val="1"/>
+      <w:numFmt w:val="bullet"/>
+      <w:lvlText w:val=""/>
+      <w:lvlJc w:val="left"/>
+      <w:pPr>
+        <w:tabs>
+          <w:tab w:val="num" w:pos="3600"/>
+        </w:tabs>
+        <w:ind w:left="3600" w:hanging="360"/>
+      </w:pPr>
+      <w:rPr>
+        <w:rFonts w:ascii="Wingdings" w:hAnsi="Wingdings" w:hint="default"/>
+        <w:sz w:val="20"/>
+      </w:rPr>
+    </w:lvl>
+    <w:lvl w:ilvl="5" w:tentative="1">
+      <w:start w:val="1"/>
+      <w:numFmt w:val="bullet"/>
+      <w:lvlText w:val=""/>
+      <w:lvlJc w:val="left"/>
+      <w:pPr>
+        <w:tabs>
+          <w:tab w:val="num" w:pos="4320"/>
+        </w:tabs>
+        <w:ind w:left="4320" w:hanging="360"/>
+      </w:pPr>
+      <w:rPr>
+        <w:rFonts w:ascii="Wingdings" w:hAnsi="Wingdings" w:hint="default"/>
+        <w:sz w:val="20"/>
+      </w:rPr>
+    </w:lvl>
+    <w:lvl w:ilvl="6" w:tentative="1">
+      <w:start w:val="1"/>
+      <w:numFmt w:val="bullet"/>
+      <w:lvlText w:val=""/>
+      <w:lvlJc w:val="left"/>
+      <w:pPr>
+        <w:tabs>
+          <w:tab w:val="num" w:pos="5040"/>
+        </w:tabs>
+        <w:ind w:left="5040" w:hanging="360"/>
+      </w:pPr>
+      <w:rPr>
+        <w:rFonts w:ascii="Wingdings" w:hAnsi="Wingdings" w:hint="default"/>
+        <w:sz w:val="20"/>
+      </w:rPr>
+    </w:lvl>
+    <w:lvl w:ilvl="7" w:tentative="1">
+      <w:start w:val="1"/>
+      <w:numFmt w:val="bullet"/>
+      <w:lvlText w:val=""/>
+      <w:lvlJc w:val="left"/>
+      <w:pPr>
+        <w:tabs>
+          <w:tab w:val="num" w:pos="5760"/>
+        </w:tabs>
+        <w:ind w:left="5760" w:hanging="360"/>
+      </w:pPr>
+      <w:rPr>
+        <w:rFonts w:ascii="Wingdings" w:hAnsi="Wingdings" w:hint="default"/>
+        <w:sz w:val="20"/>
+      </w:rPr>
+    </w:lvl>
+    <w:lvl w:ilvl="8" w:tentative="1">
+      <w:start w:val="1"/>
+      <w:numFmt w:val="bullet"/>
+      <w:lvlText w:val=""/>
+      <w:lvlJc w:val="left"/>
+      <w:pPr>
+        <w:tabs>
+          <w:tab w:val="num" w:pos="6480"/>
+        </w:tabs>
+        <w:ind w:left="6480" w:hanging="360"/>
+      </w:pPr>
+      <w:rPr>
+        <w:rFonts w:ascii="Wingdings" w:hAnsi="Wingdings" w:hint="default"/>
+        <w:sz w:val="20"/>
+      </w:rPr>
+    </w:lvl>
+  </w:abstractNum>
+  <w:abstractNum w:abstractNumId="125" w15:restartNumberingAfterBreak="0">
     <w:nsid w:val="785A644F"/>
     <w:multiLevelType w:val="multilevel"/>
     <w:tmpl w:val="D1DC60FE"/>
@@ -17639,7 +18684,7 @@
       </w:rPr>
     </w:lvl>
   </w:abstractNum>
-  <w:abstractNum w:abstractNumId="122" w15:restartNumberingAfterBreak="0">
+  <w:abstractNum w:abstractNumId="126" w15:restartNumberingAfterBreak="0">
     <w:nsid w:val="78B62297"/>
     <w:multiLevelType w:val="multilevel"/>
     <w:tmpl w:val="2AA67CDA"/>
@@ -17788,7 +18833,7 @@
       </w:rPr>
     </w:lvl>
   </w:abstractNum>
-  <w:abstractNum w:abstractNumId="123" w15:restartNumberingAfterBreak="0">
+  <w:abstractNum w:abstractNumId="127" w15:restartNumberingAfterBreak="0">
     <w:nsid w:val="7BFA03DF"/>
     <w:multiLevelType w:val="hybridMultilevel"/>
     <w:tmpl w:val="536A979E"/>
@@ -17901,7 +18946,7 @@
       </w:rPr>
     </w:lvl>
   </w:abstractNum>
-  <w:abstractNum w:abstractNumId="124" w15:restartNumberingAfterBreak="0">
+  <w:abstractNum w:abstractNumId="128" w15:restartNumberingAfterBreak="0">
     <w:nsid w:val="7CA524B4"/>
     <w:multiLevelType w:val="hybridMultilevel"/>
     <w:tmpl w:val="957C4F4A"/>
@@ -18014,7 +19059,7 @@
       </w:rPr>
     </w:lvl>
   </w:abstractNum>
-  <w:abstractNum w:abstractNumId="125" w15:restartNumberingAfterBreak="0">
+  <w:abstractNum w:abstractNumId="129" w15:restartNumberingAfterBreak="0">
     <w:nsid w:val="7E1C597E"/>
     <w:multiLevelType w:val="multilevel"/>
     <w:tmpl w:val="2AA67CDA"/>
@@ -18163,7 +19208,7 @@
       </w:rPr>
     </w:lvl>
   </w:abstractNum>
-  <w:abstractNum w:abstractNumId="126" w15:restartNumberingAfterBreak="0">
+  <w:abstractNum w:abstractNumId="130" w15:restartNumberingAfterBreak="0">
     <w:nsid w:val="7EBD7710"/>
     <w:multiLevelType w:val="hybridMultilevel"/>
     <w:tmpl w:val="C8C6F7A0"/>
@@ -18276,7 +19321,7 @@
       </w:rPr>
     </w:lvl>
   </w:abstractNum>
-  <w:abstractNum w:abstractNumId="127" w15:restartNumberingAfterBreak="0">
+  <w:abstractNum w:abstractNumId="131" w15:restartNumberingAfterBreak="0">
     <w:nsid w:val="7F233031"/>
     <w:multiLevelType w:val="hybridMultilevel"/>
     <w:tmpl w:val="0D22564E"/>
@@ -18389,107 +19434,256 @@
       </w:rPr>
     </w:lvl>
   </w:abstractNum>
+  <w:abstractNum w:abstractNumId="132" w15:restartNumberingAfterBreak="0">
+    <w:nsid w:val="7F426DF2"/>
+    <w:multiLevelType w:val="multilevel"/>
+    <w:tmpl w:val="430EFE5E"/>
+    <w:lvl w:ilvl="0">
+      <w:start w:val="1"/>
+      <w:numFmt w:val="bullet"/>
+      <w:lvlText w:val=""/>
+      <w:lvlJc w:val="left"/>
+      <w:pPr>
+        <w:tabs>
+          <w:tab w:val="num" w:pos="720"/>
+        </w:tabs>
+        <w:ind w:left="720" w:hanging="360"/>
+      </w:pPr>
+      <w:rPr>
+        <w:rFonts w:ascii="Symbol" w:hAnsi="Symbol" w:hint="default"/>
+        <w:sz w:val="20"/>
+      </w:rPr>
+    </w:lvl>
+    <w:lvl w:ilvl="1">
+      <w:start w:val="1"/>
+      <w:numFmt w:val="bullet"/>
+      <w:lvlText w:val="o"/>
+      <w:lvlJc w:val="left"/>
+      <w:pPr>
+        <w:tabs>
+          <w:tab w:val="num" w:pos="1440"/>
+        </w:tabs>
+        <w:ind w:left="1440" w:hanging="360"/>
+      </w:pPr>
+      <w:rPr>
+        <w:rFonts w:ascii="Courier New" w:hAnsi="Courier New" w:hint="default"/>
+        <w:sz w:val="20"/>
+      </w:rPr>
+    </w:lvl>
+    <w:lvl w:ilvl="2" w:tentative="1">
+      <w:start w:val="1"/>
+      <w:numFmt w:val="bullet"/>
+      <w:lvlText w:val=""/>
+      <w:lvlJc w:val="left"/>
+      <w:pPr>
+        <w:tabs>
+          <w:tab w:val="num" w:pos="2160"/>
+        </w:tabs>
+        <w:ind w:left="2160" w:hanging="360"/>
+      </w:pPr>
+      <w:rPr>
+        <w:rFonts w:ascii="Wingdings" w:hAnsi="Wingdings" w:hint="default"/>
+        <w:sz w:val="20"/>
+      </w:rPr>
+    </w:lvl>
+    <w:lvl w:ilvl="3" w:tentative="1">
+      <w:start w:val="1"/>
+      <w:numFmt w:val="bullet"/>
+      <w:lvlText w:val=""/>
+      <w:lvlJc w:val="left"/>
+      <w:pPr>
+        <w:tabs>
+          <w:tab w:val="num" w:pos="2880"/>
+        </w:tabs>
+        <w:ind w:left="2880" w:hanging="360"/>
+      </w:pPr>
+      <w:rPr>
+        <w:rFonts w:ascii="Wingdings" w:hAnsi="Wingdings" w:hint="default"/>
+        <w:sz w:val="20"/>
+      </w:rPr>
+    </w:lvl>
+    <w:lvl w:ilvl="4" w:tentative="1">
+      <w:start w:val="1"/>
+      <w:numFmt w:val="bullet"/>
+      <w:lvlText w:val=""/>
+      <w:lvlJc w:val="left"/>
+      <w:pPr>
+        <w:tabs>
+          <w:tab w:val="num" w:pos="3600"/>
+        </w:tabs>
+        <w:ind w:left="3600" w:hanging="360"/>
+      </w:pPr>
+      <w:rPr>
+        <w:rFonts w:ascii="Wingdings" w:hAnsi="Wingdings" w:hint="default"/>
+        <w:sz w:val="20"/>
+      </w:rPr>
+    </w:lvl>
+    <w:lvl w:ilvl="5" w:tentative="1">
+      <w:start w:val="1"/>
+      <w:numFmt w:val="bullet"/>
+      <w:lvlText w:val=""/>
+      <w:lvlJc w:val="left"/>
+      <w:pPr>
+        <w:tabs>
+          <w:tab w:val="num" w:pos="4320"/>
+        </w:tabs>
+        <w:ind w:left="4320" w:hanging="360"/>
+      </w:pPr>
+      <w:rPr>
+        <w:rFonts w:ascii="Wingdings" w:hAnsi="Wingdings" w:hint="default"/>
+        <w:sz w:val="20"/>
+      </w:rPr>
+    </w:lvl>
+    <w:lvl w:ilvl="6" w:tentative="1">
+      <w:start w:val="1"/>
+      <w:numFmt w:val="bullet"/>
+      <w:lvlText w:val=""/>
+      <w:lvlJc w:val="left"/>
+      <w:pPr>
+        <w:tabs>
+          <w:tab w:val="num" w:pos="5040"/>
+        </w:tabs>
+        <w:ind w:left="5040" w:hanging="360"/>
+      </w:pPr>
+      <w:rPr>
+        <w:rFonts w:ascii="Wingdings" w:hAnsi="Wingdings" w:hint="default"/>
+        <w:sz w:val="20"/>
+      </w:rPr>
+    </w:lvl>
+    <w:lvl w:ilvl="7" w:tentative="1">
+      <w:start w:val="1"/>
+      <w:numFmt w:val="bullet"/>
+      <w:lvlText w:val=""/>
+      <w:lvlJc w:val="left"/>
+      <w:pPr>
+        <w:tabs>
+          <w:tab w:val="num" w:pos="5760"/>
+        </w:tabs>
+        <w:ind w:left="5760" w:hanging="360"/>
+      </w:pPr>
+      <w:rPr>
+        <w:rFonts w:ascii="Wingdings" w:hAnsi="Wingdings" w:hint="default"/>
+        <w:sz w:val="20"/>
+      </w:rPr>
+    </w:lvl>
+    <w:lvl w:ilvl="8" w:tentative="1">
+      <w:start w:val="1"/>
+      <w:numFmt w:val="bullet"/>
+      <w:lvlText w:val=""/>
+      <w:lvlJc w:val="left"/>
+      <w:pPr>
+        <w:tabs>
+          <w:tab w:val="num" w:pos="6480"/>
+        </w:tabs>
+        <w:ind w:left="6480" w:hanging="360"/>
+      </w:pPr>
+      <w:rPr>
+        <w:rFonts w:ascii="Wingdings" w:hAnsi="Wingdings" w:hint="default"/>
+        <w:sz w:val="20"/>
+      </w:rPr>
+    </w:lvl>
+  </w:abstractNum>
   <w:num w:numId="1" w16cid:durableId="425157302">
-    <w:abstractNumId w:val="48"/>
+    <w:abstractNumId w:val="50"/>
   </w:num>
   <w:num w:numId="2" w16cid:durableId="967664612">
-    <w:abstractNumId w:val="94"/>
+    <w:abstractNumId w:val="97"/>
   </w:num>
   <w:num w:numId="3" w16cid:durableId="361631616">
+    <w:abstractNumId w:val="69"/>
+  </w:num>
+  <w:num w:numId="4" w16cid:durableId="1409575397">
+    <w:abstractNumId w:val="82"/>
+  </w:num>
+  <w:num w:numId="5" w16cid:durableId="1647204897">
+    <w:abstractNumId w:val="128"/>
+  </w:num>
+  <w:num w:numId="6" w16cid:durableId="682589869">
+    <w:abstractNumId w:val="24"/>
+  </w:num>
+  <w:num w:numId="7" w16cid:durableId="679703478">
+    <w:abstractNumId w:val="104"/>
+  </w:num>
+  <w:num w:numId="8" w16cid:durableId="496455128">
+    <w:abstractNumId w:val="44"/>
+  </w:num>
+  <w:num w:numId="9" w16cid:durableId="1184633094">
+    <w:abstractNumId w:val="61"/>
+  </w:num>
+  <w:num w:numId="10" w16cid:durableId="71507387">
     <w:abstractNumId w:val="67"/>
   </w:num>
-  <w:num w:numId="4" w16cid:durableId="1409575397">
-    <w:abstractNumId w:val="80"/>
-  </w:num>
-  <w:num w:numId="5" w16cid:durableId="1647204897">
-    <w:abstractNumId w:val="124"/>
-  </w:num>
-  <w:num w:numId="6" w16cid:durableId="682589869">
-    <w:abstractNumId w:val="22"/>
-  </w:num>
-  <w:num w:numId="7" w16cid:durableId="679703478">
-    <w:abstractNumId w:val="101"/>
-  </w:num>
-  <w:num w:numId="8" w16cid:durableId="496455128">
-    <w:abstractNumId w:val="42"/>
-  </w:num>
-  <w:num w:numId="9" w16cid:durableId="1184633094">
-    <w:abstractNumId w:val="59"/>
-  </w:num>
-  <w:num w:numId="10" w16cid:durableId="71507387">
-    <w:abstractNumId w:val="65"/>
-  </w:num>
   <w:num w:numId="11" w16cid:durableId="1412503779">
-    <w:abstractNumId w:val="103"/>
+    <w:abstractNumId w:val="106"/>
   </w:num>
   <w:num w:numId="12" w16cid:durableId="1107113995">
-    <w:abstractNumId w:val="43"/>
+    <w:abstractNumId w:val="45"/>
   </w:num>
   <w:num w:numId="13" w16cid:durableId="2011055922">
+    <w:abstractNumId w:val="25"/>
+  </w:num>
+  <w:num w:numId="14" w16cid:durableId="1529222885">
+    <w:abstractNumId w:val="127"/>
+  </w:num>
+  <w:num w:numId="15" w16cid:durableId="836580755">
+    <w:abstractNumId w:val="18"/>
+  </w:num>
+  <w:num w:numId="16" w16cid:durableId="1344674502">
+    <w:abstractNumId w:val="86"/>
+  </w:num>
+  <w:num w:numId="17" w16cid:durableId="1320882603">
+    <w:abstractNumId w:val="114"/>
+  </w:num>
+  <w:num w:numId="18" w16cid:durableId="1139028372">
+    <w:abstractNumId w:val="46"/>
+  </w:num>
+  <w:num w:numId="19" w16cid:durableId="1525635473">
+    <w:abstractNumId w:val="95"/>
+  </w:num>
+  <w:num w:numId="20" w16cid:durableId="609623515">
+    <w:abstractNumId w:val="130"/>
+  </w:num>
+  <w:num w:numId="21" w16cid:durableId="165170997">
+    <w:abstractNumId w:val="109"/>
+  </w:num>
+  <w:num w:numId="22" w16cid:durableId="1620525290">
+    <w:abstractNumId w:val="31"/>
+  </w:num>
+  <w:num w:numId="23" w16cid:durableId="400753109">
+    <w:abstractNumId w:val="118"/>
+  </w:num>
+  <w:num w:numId="24" w16cid:durableId="193882219">
+    <w:abstractNumId w:val="6"/>
+  </w:num>
+  <w:num w:numId="25" w16cid:durableId="311981628">
+    <w:abstractNumId w:val="52"/>
+  </w:num>
+  <w:num w:numId="26" w16cid:durableId="2009166045">
+    <w:abstractNumId w:val="17"/>
+  </w:num>
+  <w:num w:numId="27" w16cid:durableId="2135174697">
     <w:abstractNumId w:val="23"/>
   </w:num>
-  <w:num w:numId="14" w16cid:durableId="1529222885">
-    <w:abstractNumId w:val="123"/>
+  <w:num w:numId="28" w16cid:durableId="353504740">
+    <w:abstractNumId w:val="19"/>
   </w:num>
-  <w:num w:numId="15" w16cid:durableId="836580755">
-    <w:abstractNumId w:val="16"/>
+  <w:num w:numId="29" w16cid:durableId="2124693280">
+    <w:abstractNumId w:val="99"/>
   </w:num>
-  <w:num w:numId="16" w16cid:durableId="1344674502">
-    <w:abstractNumId w:val="84"/>
+  <w:num w:numId="30" w16cid:durableId="1367099744">
+    <w:abstractNumId w:val="36"/>
   </w:num>
-  <w:num w:numId="17" w16cid:durableId="1320882603">
-    <w:abstractNumId w:val="111"/>
+  <w:num w:numId="31" w16cid:durableId="2011105642">
+    <w:abstractNumId w:val="87"/>
   </w:num>
-  <w:num w:numId="18" w16cid:durableId="1139028372">
-    <w:abstractNumId w:val="44"/>
+  <w:num w:numId="32" w16cid:durableId="831995364">
+    <w:abstractNumId w:val="28"/>
   </w:num>
-  <w:num w:numId="19" w16cid:durableId="1525635473">
-    <w:abstractNumId w:val="92"/>
-  </w:num>
-  <w:num w:numId="20" w16cid:durableId="609623515">
-    <w:abstractNumId w:val="126"/>
-  </w:num>
-  <w:num w:numId="21" w16cid:durableId="165170997">
-    <w:abstractNumId w:val="106"/>
-  </w:num>
-  <w:num w:numId="22" w16cid:durableId="1620525290">
-    <w:abstractNumId w:val="29"/>
-  </w:num>
-  <w:num w:numId="23" w16cid:durableId="400753109">
-    <w:abstractNumId w:val="115"/>
-  </w:num>
-  <w:num w:numId="24" w16cid:durableId="193882219">
+  <w:num w:numId="33" w16cid:durableId="851073403">
     <w:abstractNumId w:val="5"/>
   </w:num>
-  <w:num w:numId="25" w16cid:durableId="311981628">
-    <w:abstractNumId w:val="50"/>
-  </w:num>
-  <w:num w:numId="26" w16cid:durableId="2009166045">
-    <w:abstractNumId w:val="15"/>
-  </w:num>
-  <w:num w:numId="27" w16cid:durableId="2135174697">
-    <w:abstractNumId w:val="21"/>
-  </w:num>
-  <w:num w:numId="28" w16cid:durableId="353504740">
-    <w:abstractNumId w:val="17"/>
-  </w:num>
-  <w:num w:numId="29" w16cid:durableId="2124693280">
-    <w:abstractNumId w:val="96"/>
-  </w:num>
-  <w:num w:numId="30" w16cid:durableId="1367099744">
-    <w:abstractNumId w:val="34"/>
-  </w:num>
-  <w:num w:numId="31" w16cid:durableId="2011105642">
-    <w:abstractNumId w:val="85"/>
-  </w:num>
-  <w:num w:numId="32" w16cid:durableId="831995364">
-    <w:abstractNumId w:val="26"/>
-  </w:num>
-  <w:num w:numId="33" w16cid:durableId="851073403">
-    <w:abstractNumId w:val="4"/>
-  </w:num>
   <w:num w:numId="34" w16cid:durableId="1183666391">
-    <w:abstractNumId w:val="25"/>
+    <w:abstractNumId w:val="27"/>
   </w:num>
   <w:num w:numId="35" w16cid:durableId="697268929">
     <w:abstractNumId w:val="2"/>
@@ -18498,280 +19692,295 @@
     <w:abstractNumId w:val="3"/>
   </w:num>
   <w:num w:numId="37" w16cid:durableId="1849755457">
-    <w:abstractNumId w:val="116"/>
+    <w:abstractNumId w:val="119"/>
   </w:num>
   <w:num w:numId="38" w16cid:durableId="516505904">
+    <w:abstractNumId w:val="16"/>
+  </w:num>
+  <w:num w:numId="39" w16cid:durableId="906300072">
+    <w:abstractNumId w:val="20"/>
+  </w:num>
+  <w:num w:numId="40" w16cid:durableId="905338697">
+    <w:abstractNumId w:val="71"/>
+  </w:num>
+  <w:num w:numId="41" w16cid:durableId="501896635">
+    <w:abstractNumId w:val="48"/>
+  </w:num>
+  <w:num w:numId="42" w16cid:durableId="1953435156">
+    <w:abstractNumId w:val="72"/>
+  </w:num>
+  <w:num w:numId="43" w16cid:durableId="1060447452">
+    <w:abstractNumId w:val="84"/>
+  </w:num>
+  <w:num w:numId="44" w16cid:durableId="1772503672">
+    <w:abstractNumId w:val="64"/>
+  </w:num>
+  <w:num w:numId="45" w16cid:durableId="1650330222">
+    <w:abstractNumId w:val="70"/>
+  </w:num>
+  <w:num w:numId="46" w16cid:durableId="2102337934">
+    <w:abstractNumId w:val="30"/>
+  </w:num>
+  <w:num w:numId="47" w16cid:durableId="68767822">
+    <w:abstractNumId w:val="107"/>
+  </w:num>
+  <w:num w:numId="48" w16cid:durableId="1992058265">
+    <w:abstractNumId w:val="7"/>
+  </w:num>
+  <w:num w:numId="49" w16cid:durableId="788475134">
+    <w:abstractNumId w:val="125"/>
+  </w:num>
+  <w:num w:numId="50" w16cid:durableId="224419455">
+    <w:abstractNumId w:val="112"/>
+  </w:num>
+  <w:num w:numId="51" w16cid:durableId="1699575947">
+    <w:abstractNumId w:val="94"/>
+  </w:num>
+  <w:num w:numId="52" w16cid:durableId="1048916239">
+    <w:abstractNumId w:val="56"/>
+  </w:num>
+  <w:num w:numId="53" w16cid:durableId="1188711211">
+    <w:abstractNumId w:val="121"/>
+  </w:num>
+  <w:num w:numId="54" w16cid:durableId="447555614">
+    <w:abstractNumId w:val="96"/>
+  </w:num>
+  <w:num w:numId="55" w16cid:durableId="1679307268">
+    <w:abstractNumId w:val="53"/>
+  </w:num>
+  <w:num w:numId="56" w16cid:durableId="693773591">
+    <w:abstractNumId w:val="111"/>
+  </w:num>
+  <w:num w:numId="57" w16cid:durableId="1110473324">
+    <w:abstractNumId w:val="38"/>
+  </w:num>
+  <w:num w:numId="58" w16cid:durableId="842937968">
+    <w:abstractNumId w:val="68"/>
+  </w:num>
+  <w:num w:numId="59" w16cid:durableId="821121315">
+    <w:abstractNumId w:val="43"/>
+  </w:num>
+  <w:num w:numId="60" w16cid:durableId="2095394549">
+    <w:abstractNumId w:val="123"/>
+  </w:num>
+  <w:num w:numId="61" w16cid:durableId="1299921011">
+    <w:abstractNumId w:val="42"/>
+  </w:num>
+  <w:num w:numId="62" w16cid:durableId="1927420240">
+    <w:abstractNumId w:val="76"/>
+  </w:num>
+  <w:num w:numId="63" w16cid:durableId="41290043">
+    <w:abstractNumId w:val="81"/>
+  </w:num>
+  <w:num w:numId="64" w16cid:durableId="999846909">
+    <w:abstractNumId w:val="65"/>
+  </w:num>
+  <w:num w:numId="65" w16cid:durableId="1250969563">
+    <w:abstractNumId w:val="74"/>
+  </w:num>
+  <w:num w:numId="66" w16cid:durableId="484011382">
+    <w:abstractNumId w:val="105"/>
+  </w:num>
+  <w:num w:numId="67" w16cid:durableId="2008289242">
     <w:abstractNumId w:val="14"/>
   </w:num>
-  <w:num w:numId="39" w16cid:durableId="906300072">
-    <w:abstractNumId w:val="18"/>
+  <w:num w:numId="68" w16cid:durableId="1041637222">
+    <w:abstractNumId w:val="21"/>
   </w:num>
-  <w:num w:numId="40" w16cid:durableId="905338697">
-    <w:abstractNumId w:val="69"/>
+  <w:num w:numId="69" w16cid:durableId="1296839887">
+    <w:abstractNumId w:val="80"/>
   </w:num>
-  <w:num w:numId="41" w16cid:durableId="501896635">
-    <w:abstractNumId w:val="46"/>
-  </w:num>
-  <w:num w:numId="42" w16cid:durableId="1953435156">
-    <w:abstractNumId w:val="70"/>
-  </w:num>
-  <w:num w:numId="43" w16cid:durableId="1060447452">
-    <w:abstractNumId w:val="82"/>
-  </w:num>
-  <w:num w:numId="44" w16cid:durableId="1772503672">
-    <w:abstractNumId w:val="62"/>
-  </w:num>
-  <w:num w:numId="45" w16cid:durableId="1650330222">
-    <w:abstractNumId w:val="68"/>
-  </w:num>
-  <w:num w:numId="46" w16cid:durableId="2102337934">
-    <w:abstractNumId w:val="28"/>
-  </w:num>
-  <w:num w:numId="47" w16cid:durableId="68767822">
-    <w:abstractNumId w:val="104"/>
-  </w:num>
-  <w:num w:numId="48" w16cid:durableId="1992058265">
-    <w:abstractNumId w:val="6"/>
-  </w:num>
-  <w:num w:numId="49" w16cid:durableId="788475134">
-    <w:abstractNumId w:val="121"/>
-  </w:num>
-  <w:num w:numId="50" w16cid:durableId="224419455">
-    <w:abstractNumId w:val="109"/>
-  </w:num>
-  <w:num w:numId="51" w16cid:durableId="1699575947">
-    <w:abstractNumId w:val="91"/>
-  </w:num>
-  <w:num w:numId="52" w16cid:durableId="1048916239">
-    <w:abstractNumId w:val="54"/>
-  </w:num>
-  <w:num w:numId="53" w16cid:durableId="1188711211">
-    <w:abstractNumId w:val="118"/>
-  </w:num>
-  <w:num w:numId="54" w16cid:durableId="447555614">
+  <w:num w:numId="70" w16cid:durableId="336662050">
     <w:abstractNumId w:val="93"/>
   </w:num>
-  <w:num w:numId="55" w16cid:durableId="1679307268">
-    <w:abstractNumId w:val="51"/>
-  </w:num>
-  <w:num w:numId="56" w16cid:durableId="693773591">
-    <w:abstractNumId w:val="108"/>
-  </w:num>
-  <w:num w:numId="57" w16cid:durableId="1110473324">
-    <w:abstractNumId w:val="36"/>
-  </w:num>
-  <w:num w:numId="58" w16cid:durableId="842937968">
-    <w:abstractNumId w:val="66"/>
-  </w:num>
-  <w:num w:numId="59" w16cid:durableId="821121315">
-    <w:abstractNumId w:val="41"/>
-  </w:num>
-  <w:num w:numId="60" w16cid:durableId="2095394549">
-    <w:abstractNumId w:val="120"/>
-  </w:num>
-  <w:num w:numId="61" w16cid:durableId="1299921011">
-    <w:abstractNumId w:val="40"/>
-  </w:num>
-  <w:num w:numId="62" w16cid:durableId="1927420240">
-    <w:abstractNumId w:val="74"/>
-  </w:num>
-  <w:num w:numId="63" w16cid:durableId="41290043">
-    <w:abstractNumId w:val="79"/>
-  </w:num>
-  <w:num w:numId="64" w16cid:durableId="999846909">
-    <w:abstractNumId w:val="63"/>
-  </w:num>
-  <w:num w:numId="65" w16cid:durableId="1250969563">
-    <w:abstractNumId w:val="72"/>
-  </w:num>
-  <w:num w:numId="66" w16cid:durableId="484011382">
-    <w:abstractNumId w:val="102"/>
-  </w:num>
-  <w:num w:numId="67" w16cid:durableId="2008289242">
-    <w:abstractNumId w:val="12"/>
-  </w:num>
-  <w:num w:numId="68" w16cid:durableId="1041637222">
-    <w:abstractNumId w:val="19"/>
-  </w:num>
-  <w:num w:numId="69" w16cid:durableId="1296839887">
-    <w:abstractNumId w:val="78"/>
-  </w:num>
-  <w:num w:numId="70" w16cid:durableId="336662050">
-    <w:abstractNumId w:val="90"/>
-  </w:num>
   <w:num w:numId="71" w16cid:durableId="1460032333">
-    <w:abstractNumId w:val="107"/>
+    <w:abstractNumId w:val="110"/>
   </w:num>
   <w:num w:numId="72" w16cid:durableId="592400615">
-    <w:abstractNumId w:val="9"/>
+    <w:abstractNumId w:val="11"/>
   </w:num>
   <w:num w:numId="73" w16cid:durableId="1879049234">
+    <w:abstractNumId w:val="35"/>
+  </w:num>
+  <w:num w:numId="74" w16cid:durableId="1747679558">
+    <w:abstractNumId w:val="39"/>
+  </w:num>
+  <w:num w:numId="75" w16cid:durableId="55278029">
+    <w:abstractNumId w:val="32"/>
+  </w:num>
+  <w:num w:numId="76" w16cid:durableId="1032193382">
     <w:abstractNumId w:val="33"/>
   </w:num>
-  <w:num w:numId="74" w16cid:durableId="1747679558">
-    <w:abstractNumId w:val="37"/>
-  </w:num>
-  <w:num w:numId="75" w16cid:durableId="55278029">
-    <w:abstractNumId w:val="30"/>
-  </w:num>
-  <w:num w:numId="76" w16cid:durableId="1032193382">
-    <w:abstractNumId w:val="31"/>
-  </w:num>
   <w:num w:numId="77" w16cid:durableId="763109604">
-    <w:abstractNumId w:val="81"/>
+    <w:abstractNumId w:val="83"/>
   </w:num>
   <w:num w:numId="78" w16cid:durableId="2138137265">
-    <w:abstractNumId w:val="95"/>
+    <w:abstractNumId w:val="98"/>
   </w:num>
   <w:num w:numId="79" w16cid:durableId="343675924">
-    <w:abstractNumId w:val="112"/>
+    <w:abstractNumId w:val="115"/>
   </w:num>
   <w:num w:numId="80" w16cid:durableId="1823277442">
-    <w:abstractNumId w:val="39"/>
+    <w:abstractNumId w:val="41"/>
   </w:num>
   <w:num w:numId="81" w16cid:durableId="1686900155">
     <w:abstractNumId w:val="0"/>
   </w:num>
   <w:num w:numId="82" w16cid:durableId="1113326280">
+    <w:abstractNumId w:val="79"/>
+  </w:num>
+  <w:num w:numId="83" w16cid:durableId="1253051103">
+    <w:abstractNumId w:val="108"/>
+  </w:num>
+  <w:num w:numId="84" w16cid:durableId="444888444">
+    <w:abstractNumId w:val="49"/>
+  </w:num>
+  <w:num w:numId="85" w16cid:durableId="64299649">
+    <w:abstractNumId w:val="100"/>
+  </w:num>
+  <w:num w:numId="86" w16cid:durableId="868182992">
+    <w:abstractNumId w:val="63"/>
+  </w:num>
+  <w:num w:numId="87" w16cid:durableId="896863331">
+    <w:abstractNumId w:val="26"/>
+  </w:num>
+  <w:num w:numId="88" w16cid:durableId="505442826">
+    <w:abstractNumId w:val="103"/>
+  </w:num>
+  <w:num w:numId="89" w16cid:durableId="1858763908">
+    <w:abstractNumId w:val="37"/>
+  </w:num>
+  <w:num w:numId="90" w16cid:durableId="1896088176">
+    <w:abstractNumId w:val="15"/>
+  </w:num>
+  <w:num w:numId="91" w16cid:durableId="1284576603">
+    <w:abstractNumId w:val="88"/>
+  </w:num>
+  <w:num w:numId="92" w16cid:durableId="1963075542">
+    <w:abstractNumId w:val="10"/>
+  </w:num>
+  <w:num w:numId="93" w16cid:durableId="787627596">
+    <w:abstractNumId w:val="78"/>
+  </w:num>
+  <w:num w:numId="94" w16cid:durableId="2003925799">
+    <w:abstractNumId w:val="13"/>
+  </w:num>
+  <w:num w:numId="95" w16cid:durableId="1169102579">
+    <w:abstractNumId w:val="91"/>
+  </w:num>
+  <w:num w:numId="96" w16cid:durableId="1216501564">
+    <w:abstractNumId w:val="34"/>
+  </w:num>
+  <w:num w:numId="97" w16cid:durableId="261768216">
+    <w:abstractNumId w:val="113"/>
+  </w:num>
+  <w:num w:numId="98" w16cid:durableId="2141918721">
+    <w:abstractNumId w:val="73"/>
+  </w:num>
+  <w:num w:numId="99" w16cid:durableId="905841544">
+    <w:abstractNumId w:val="40"/>
+  </w:num>
+  <w:num w:numId="100" w16cid:durableId="1753887223">
+    <w:abstractNumId w:val="89"/>
+  </w:num>
+  <w:num w:numId="101" w16cid:durableId="1320184766">
+    <w:abstractNumId w:val="29"/>
+  </w:num>
+  <w:num w:numId="102" w16cid:durableId="465127606">
+    <w:abstractNumId w:val="57"/>
+  </w:num>
+  <w:num w:numId="103" w16cid:durableId="1640451435">
+    <w:abstractNumId w:val="55"/>
+  </w:num>
+  <w:num w:numId="104" w16cid:durableId="942029608">
+    <w:abstractNumId w:val="51"/>
+  </w:num>
+  <w:num w:numId="105" w16cid:durableId="70857193">
+    <w:abstractNumId w:val="59"/>
+  </w:num>
+  <w:num w:numId="106" w16cid:durableId="1617908629">
+    <w:abstractNumId w:val="117"/>
+  </w:num>
+  <w:num w:numId="107" w16cid:durableId="970137111">
+    <w:abstractNumId w:val="129"/>
+  </w:num>
+  <w:num w:numId="108" w16cid:durableId="383797013">
+    <w:abstractNumId w:val="47"/>
+  </w:num>
+  <w:num w:numId="109" w16cid:durableId="1459567304">
+    <w:abstractNumId w:val="58"/>
+  </w:num>
+  <w:num w:numId="110" w16cid:durableId="862745862">
+    <w:abstractNumId w:val="22"/>
+  </w:num>
+  <w:num w:numId="111" w16cid:durableId="1859536331">
+    <w:abstractNumId w:val="62"/>
+  </w:num>
+  <w:num w:numId="112" w16cid:durableId="2092697678">
+    <w:abstractNumId w:val="75"/>
+  </w:num>
+  <w:num w:numId="113" w16cid:durableId="1418403813">
+    <w:abstractNumId w:val="66"/>
+  </w:num>
+  <w:num w:numId="114" w16cid:durableId="1965042317">
+    <w:abstractNumId w:val="116"/>
+  </w:num>
+  <w:num w:numId="115" w16cid:durableId="670569040">
+    <w:abstractNumId w:val="54"/>
+  </w:num>
+  <w:num w:numId="116" w16cid:durableId="413823113">
+    <w:abstractNumId w:val="126"/>
+  </w:num>
+  <w:num w:numId="117" w16cid:durableId="1293747982">
+    <w:abstractNumId w:val="102"/>
+  </w:num>
+  <w:num w:numId="118" w16cid:durableId="2058698591">
+    <w:abstractNumId w:val="60"/>
+  </w:num>
+  <w:num w:numId="119" w16cid:durableId="892157361">
     <w:abstractNumId w:val="77"/>
   </w:num>
-  <w:num w:numId="83" w16cid:durableId="1253051103">
-    <w:abstractNumId w:val="105"/>
+  <w:num w:numId="120" w16cid:durableId="1449229938">
+    <w:abstractNumId w:val="120"/>
   </w:num>
-  <w:num w:numId="84" w16cid:durableId="444888444">
-    <w:abstractNumId w:val="47"/>
-  </w:num>
-  <w:num w:numId="85" w16cid:durableId="64299649">
-    <w:abstractNumId w:val="97"/>
-  </w:num>
-  <w:num w:numId="86" w16cid:durableId="868182992">
-    <w:abstractNumId w:val="61"/>
-  </w:num>
-  <w:num w:numId="87" w16cid:durableId="896863331">
-    <w:abstractNumId w:val="24"/>
-  </w:num>
-  <w:num w:numId="88" w16cid:durableId="505442826">
-    <w:abstractNumId w:val="100"/>
-  </w:num>
-  <w:num w:numId="89" w16cid:durableId="1858763908">
-    <w:abstractNumId w:val="35"/>
-  </w:num>
-  <w:num w:numId="90" w16cid:durableId="1896088176">
-    <w:abstractNumId w:val="13"/>
-  </w:num>
-  <w:num w:numId="91" w16cid:durableId="1284576603">
-    <w:abstractNumId w:val="86"/>
-  </w:num>
-  <w:num w:numId="92" w16cid:durableId="1963075542">
+  <w:num w:numId="121" w16cid:durableId="177283374">
     <w:abstractNumId w:val="8"/>
   </w:num>
-  <w:num w:numId="93" w16cid:durableId="787627596">
-    <w:abstractNumId w:val="76"/>
+  <w:num w:numId="122" w16cid:durableId="576598579">
+    <w:abstractNumId w:val="12"/>
   </w:num>
-  <w:num w:numId="94" w16cid:durableId="2003925799">
-    <w:abstractNumId w:val="11"/>
-  </w:num>
-  <w:num w:numId="95" w16cid:durableId="1169102579">
-    <w:abstractNumId w:val="89"/>
-  </w:num>
-  <w:num w:numId="96" w16cid:durableId="1216501564">
-    <w:abstractNumId w:val="32"/>
-  </w:num>
-  <w:num w:numId="97" w16cid:durableId="261768216">
-    <w:abstractNumId w:val="110"/>
-  </w:num>
-  <w:num w:numId="98" w16cid:durableId="2141918721">
-    <w:abstractNumId w:val="71"/>
-  </w:num>
-  <w:num w:numId="99" w16cid:durableId="905841544">
-    <w:abstractNumId w:val="38"/>
-  </w:num>
-  <w:num w:numId="100" w16cid:durableId="1753887223">
-    <w:abstractNumId w:val="87"/>
-  </w:num>
-  <w:num w:numId="101" w16cid:durableId="1320184766">
-    <w:abstractNumId w:val="27"/>
-  </w:num>
-  <w:num w:numId="102" w16cid:durableId="465127606">
-    <w:abstractNumId w:val="55"/>
-  </w:num>
-  <w:num w:numId="103" w16cid:durableId="1640451435">
-    <w:abstractNumId w:val="53"/>
-  </w:num>
-  <w:num w:numId="104" w16cid:durableId="942029608">
-    <w:abstractNumId w:val="49"/>
-  </w:num>
-  <w:num w:numId="105" w16cid:durableId="70857193">
-    <w:abstractNumId w:val="57"/>
-  </w:num>
-  <w:num w:numId="106" w16cid:durableId="1617908629">
-    <w:abstractNumId w:val="114"/>
-  </w:num>
-  <w:num w:numId="107" w16cid:durableId="970137111">
-    <w:abstractNumId w:val="125"/>
-  </w:num>
-  <w:num w:numId="108" w16cid:durableId="383797013">
-    <w:abstractNumId w:val="45"/>
-  </w:num>
-  <w:num w:numId="109" w16cid:durableId="1459567304">
-    <w:abstractNumId w:val="56"/>
-  </w:num>
-  <w:num w:numId="110" w16cid:durableId="862745862">
-    <w:abstractNumId w:val="20"/>
-  </w:num>
-  <w:num w:numId="111" w16cid:durableId="1859536331">
-    <w:abstractNumId w:val="60"/>
-  </w:num>
-  <w:num w:numId="112" w16cid:durableId="2092697678">
-    <w:abstractNumId w:val="73"/>
-  </w:num>
-  <w:num w:numId="113" w16cid:durableId="1418403813">
-    <w:abstractNumId w:val="64"/>
-  </w:num>
-  <w:num w:numId="114" w16cid:durableId="1965042317">
-    <w:abstractNumId w:val="113"/>
-  </w:num>
-  <w:num w:numId="115" w16cid:durableId="670569040">
-    <w:abstractNumId w:val="52"/>
-  </w:num>
-  <w:num w:numId="116" w16cid:durableId="413823113">
+  <w:num w:numId="123" w16cid:durableId="1495337109">
     <w:abstractNumId w:val="122"/>
   </w:num>
-  <w:num w:numId="117" w16cid:durableId="1293747982">
-    <w:abstractNumId w:val="99"/>
-  </w:num>
-  <w:num w:numId="118" w16cid:durableId="2058698591">
-    <w:abstractNumId w:val="58"/>
-  </w:num>
-  <w:num w:numId="119" w16cid:durableId="892157361">
-    <w:abstractNumId w:val="75"/>
-  </w:num>
-  <w:num w:numId="120" w16cid:durableId="1449229938">
-    <w:abstractNumId w:val="117"/>
-  </w:num>
-  <w:num w:numId="121" w16cid:durableId="177283374">
-    <w:abstractNumId w:val="7"/>
-  </w:num>
-  <w:num w:numId="122" w16cid:durableId="576598579">
-    <w:abstractNumId w:val="10"/>
-  </w:num>
-  <w:num w:numId="123" w16cid:durableId="1495337109">
-    <w:abstractNumId w:val="119"/>
-  </w:num>
   <w:num w:numId="124" w16cid:durableId="302319311">
-    <w:abstractNumId w:val="83"/>
+    <w:abstractNumId w:val="85"/>
   </w:num>
   <w:num w:numId="125" w16cid:durableId="1891844186">
-    <w:abstractNumId w:val="98"/>
+    <w:abstractNumId w:val="101"/>
   </w:num>
   <w:num w:numId="126" w16cid:durableId="256911009">
     <w:abstractNumId w:val="1"/>
   </w:num>
   <w:num w:numId="127" w16cid:durableId="1001927776">
-    <w:abstractNumId w:val="127"/>
+    <w:abstractNumId w:val="131"/>
   </w:num>
   <w:num w:numId="128" w16cid:durableId="1365057616">
-    <w:abstractNumId w:val="88"/>
+    <w:abstractNumId w:val="90"/>
+  </w:num>
+  <w:num w:numId="129" w16cid:durableId="2142647602">
+    <w:abstractNumId w:val="92"/>
+  </w:num>
+  <w:num w:numId="130" w16cid:durableId="1895652277">
+    <w:abstractNumId w:val="132"/>
+  </w:num>
+  <w:num w:numId="131" w16cid:durableId="1132407586">
+    <w:abstractNumId w:val="124"/>
+  </w:num>
+  <w:num w:numId="132" w16cid:durableId="1209996408">
+    <w:abstractNumId w:val="9"/>
+  </w:num>
+  <w:num w:numId="133" w16cid:durableId="1840802852">
+    <w:abstractNumId w:val="4"/>
   </w:num>
   <w:numIdMacAtCleanup w:val="45"/>
 </w:numbering>

</xml_diff>

<commit_message>
Payment & Review Submission Activity Diagram (#261) Customer Process Activity Diagrams (#257)
</commit_message>
<xml_diff>
--- a/Activity Specification Document.docx
+++ b/Activity Specification Document.docx
@@ -1754,6 +1754,669 @@
         <w:br w:type="page"/>
       </w:r>
     </w:p>
+    <w:p>
+      <w:pPr>
+        <w:pStyle w:val="Heading3"/>
+      </w:pPr>
+      <w:r>
+        <w:lastRenderedPageBreak/>
+        <w:t xml:space="preserve">4- </w:t>
+      </w:r>
+      <w:r>
+        <w:t>Payment &amp; Review Submission</w:t>
+      </w:r>
+      <w:r>
+        <w:t xml:space="preserve"> Activity</w:t>
+      </w:r>
+    </w:p>
+    <w:p>
+      <w:pPr>
+        <w:rPr>
+          <w:b/>
+          <w:bCs/>
+        </w:rPr>
+      </w:pPr>
+      <w:r>
+        <w:rPr>
+          <w:b/>
+          <w:bCs/>
+        </w:rPr>
+        <w:t>Purpose</w:t>
+      </w:r>
+    </w:p>
+    <w:p>
+      <w:r>
+        <w:t>Activity Diagram for Payment &amp; Review Submission presents the process involved in making the payment for the car reservation and subsequently providing the client review after the successful completion of the rental services provided in the KriGo website. The activity diagram shows the series of activities in the payment process using Edahabia payment system and reservation status update process.</w:t>
+      </w:r>
+    </w:p>
+    <w:p>
+      <w:pPr>
+        <w:rPr>
+          <w:b/>
+          <w:bCs/>
+        </w:rPr>
+      </w:pPr>
+      <w:r>
+        <w:rPr>
+          <w:b/>
+          <w:bCs/>
+        </w:rPr>
+        <w:t>Workflow Description</w:t>
+      </w:r>
+    </w:p>
+    <w:p>
+      <w:r>
+        <w:t xml:space="preserve">This is done by displaying a summary of the reservation made by the customer including the selected vehicle, period of time, and the total payment. The customer selects </w:t>
+      </w:r>
+      <w:r>
+        <w:rPr>
+          <w:b/>
+          <w:bCs/>
+        </w:rPr>
+        <w:t>Edahabia</w:t>
+      </w:r>
+      <w:r>
+        <w:t xml:space="preserve"> as the means of payment and fills in the necessary payment details.</w:t>
+      </w:r>
+    </w:p>
+    <w:p>
+      <w:r>
+        <w:t>These details are validated by the system and the payment request is forwarded to the online payment system for validation. In case the payment fails, the customer is notified of the failure of the transaction and he can either try again to make the payment or cancel the reservation.</w:t>
+      </w:r>
+    </w:p>
+    <w:p>
+      <w:r>
+        <w:t>Upon successful payment, the status of the reservation changes and a message confirming the payment is displayed to the customer.</w:t>
+      </w:r>
+    </w:p>
+    <w:p>
+      <w:r>
+        <w:t>At the end of the renting, the customer is given the opportunity to give feedback about his renting experience. This is done by filling in the rating and comments on the renting experience. The feedback is then validated and stored in the database</w:t>
+      </w:r>
+      <w:r>
+        <w:t>.</w:t>
+      </w:r>
+    </w:p>
+    <w:p>
+      <w:pPr>
+        <w:rPr>
+          <w:b/>
+          <w:bCs/>
+        </w:rPr>
+      </w:pPr>
+      <w:r>
+        <w:rPr>
+          <w:b/>
+          <w:bCs/>
+        </w:rPr>
+        <w:t>Main Activities</w:t>
+      </w:r>
+    </w:p>
+    <w:p>
+      <w:r>
+        <w:t>The Payment &amp; Review Submission Activity Diagram includes the following primary activities:</w:t>
+      </w:r>
+    </w:p>
+    <w:p>
+      <w:pPr>
+        <w:pStyle w:val="ListParagraph"/>
+        <w:numPr>
+          <w:ilvl w:val="0"/>
+          <w:numId w:val="137"/>
+        </w:numPr>
+        <w:spacing w:line="360" w:lineRule="auto"/>
+      </w:pPr>
+      <w:r>
+        <w:t>Display the reservation summary.</w:t>
+      </w:r>
+    </w:p>
+    <w:p>
+      <w:pPr>
+        <w:pStyle w:val="ListParagraph"/>
+        <w:numPr>
+          <w:ilvl w:val="0"/>
+          <w:numId w:val="137"/>
+        </w:numPr>
+        <w:spacing w:line="360" w:lineRule="auto"/>
+      </w:pPr>
+      <w:r>
+        <w:t>Select the Edahabia payment method.</w:t>
+      </w:r>
+    </w:p>
+    <w:p>
+      <w:pPr>
+        <w:pStyle w:val="ListParagraph"/>
+        <w:numPr>
+          <w:ilvl w:val="0"/>
+          <w:numId w:val="137"/>
+        </w:numPr>
+        <w:spacing w:line="360" w:lineRule="auto"/>
+      </w:pPr>
+      <w:r>
+        <w:t>Enter payment information.</w:t>
+      </w:r>
+    </w:p>
+    <w:p>
+      <w:pPr>
+        <w:pStyle w:val="ListParagraph"/>
+        <w:numPr>
+          <w:ilvl w:val="0"/>
+          <w:numId w:val="137"/>
+        </w:numPr>
+        <w:spacing w:line="360" w:lineRule="auto"/>
+      </w:pPr>
+      <w:r>
+        <w:t>Validate payment details.</w:t>
+      </w:r>
+    </w:p>
+    <w:p>
+      <w:pPr>
+        <w:pStyle w:val="ListParagraph"/>
+        <w:numPr>
+          <w:ilvl w:val="0"/>
+          <w:numId w:val="137"/>
+        </w:numPr>
+        <w:spacing w:line="360" w:lineRule="auto"/>
+      </w:pPr>
+      <w:r>
+        <w:t>Process the online payment.</w:t>
+      </w:r>
+    </w:p>
+    <w:p>
+      <w:pPr>
+        <w:pStyle w:val="ListParagraph"/>
+        <w:numPr>
+          <w:ilvl w:val="0"/>
+          <w:numId w:val="137"/>
+        </w:numPr>
+        <w:spacing w:line="360" w:lineRule="auto"/>
+      </w:pPr>
+      <w:r>
+        <w:t>Update the reservation status.</w:t>
+      </w:r>
+    </w:p>
+    <w:p>
+      <w:pPr>
+        <w:pStyle w:val="ListParagraph"/>
+        <w:numPr>
+          <w:ilvl w:val="0"/>
+          <w:numId w:val="137"/>
+        </w:numPr>
+        <w:spacing w:line="360" w:lineRule="auto"/>
+      </w:pPr>
+      <w:r>
+        <w:t>Display payment confirmation.</w:t>
+      </w:r>
+    </w:p>
+    <w:p>
+      <w:pPr>
+        <w:pStyle w:val="ListParagraph"/>
+        <w:numPr>
+          <w:ilvl w:val="0"/>
+          <w:numId w:val="137"/>
+        </w:numPr>
+        <w:spacing w:line="360" w:lineRule="auto"/>
+      </w:pPr>
+      <w:r>
+        <w:t>Complete the rental.</w:t>
+      </w:r>
+    </w:p>
+    <w:p>
+      <w:pPr>
+        <w:pStyle w:val="ListParagraph"/>
+        <w:numPr>
+          <w:ilvl w:val="0"/>
+          <w:numId w:val="137"/>
+        </w:numPr>
+        <w:spacing w:line="360" w:lineRule="auto"/>
+      </w:pPr>
+      <w:r>
+        <w:t>Enter a rating and written review.</w:t>
+      </w:r>
+    </w:p>
+    <w:p>
+      <w:pPr>
+        <w:pStyle w:val="ListParagraph"/>
+        <w:numPr>
+          <w:ilvl w:val="0"/>
+          <w:numId w:val="137"/>
+        </w:numPr>
+        <w:spacing w:line="360" w:lineRule="auto"/>
+      </w:pPr>
+      <w:r>
+        <w:t>Validate and save the review.</w:t>
+      </w:r>
+    </w:p>
+    <w:p>
+      <w:pPr>
+        <w:pStyle w:val="ListParagraph"/>
+        <w:numPr>
+          <w:ilvl w:val="0"/>
+          <w:numId w:val="137"/>
+        </w:numPr>
+        <w:spacing w:line="360" w:lineRule="auto"/>
+      </w:pPr>
+      <w:r>
+        <w:t>Display the review submission confirmation.</w:t>
+      </w:r>
+    </w:p>
+    <w:p>
+      <w:pPr>
+        <w:spacing w:line="278" w:lineRule="auto"/>
+        <w:rPr>
+          <w:b/>
+          <w:bCs/>
+        </w:rPr>
+      </w:pPr>
+      <w:r>
+        <w:rPr>
+          <w:b/>
+          <w:bCs/>
+        </w:rPr>
+        <w:br w:type="page"/>
+      </w:r>
+    </w:p>
+    <w:p>
+      <w:pPr>
+        <w:rPr>
+          <w:b/>
+          <w:bCs/>
+        </w:rPr>
+      </w:pPr>
+      <w:r>
+        <w:rPr>
+          <w:b/>
+          <w:bCs/>
+        </w:rPr>
+        <w:lastRenderedPageBreak/>
+        <w:t>Decision Points</w:t>
+      </w:r>
+    </w:p>
+    <w:p>
+      <w:r>
+        <w:t>The activity diagram contains three primary decision nodes:</w:t>
+      </w:r>
+    </w:p>
+    <w:p>
+      <w:pPr>
+        <w:numPr>
+          <w:ilvl w:val="0"/>
+          <w:numId w:val="135"/>
+        </w:numPr>
+      </w:pPr>
+      <w:r>
+        <w:rPr>
+          <w:b/>
+          <w:bCs/>
+        </w:rPr>
+        <w:t>Payment Successful?</w:t>
+      </w:r>
+    </w:p>
+    <w:p>
+      <w:pPr>
+        <w:numPr>
+          <w:ilvl w:val="1"/>
+          <w:numId w:val="135"/>
+        </w:numPr>
+        <w:spacing w:after="0"/>
+      </w:pPr>
+      <w:r>
+        <w:t xml:space="preserve">If </w:t>
+      </w:r>
+      <w:r>
+        <w:rPr>
+          <w:b/>
+          <w:bCs/>
+        </w:rPr>
+        <w:t>Yes</w:t>
+      </w:r>
+      <w:r>
+        <w:t>, the reservation status is updated and the payment is confirmed.</w:t>
+      </w:r>
+    </w:p>
+    <w:p>
+      <w:pPr>
+        <w:numPr>
+          <w:ilvl w:val="1"/>
+          <w:numId w:val="135"/>
+        </w:numPr>
+      </w:pPr>
+      <w:r>
+        <w:t xml:space="preserve">If </w:t>
+      </w:r>
+      <w:r>
+        <w:rPr>
+          <w:b/>
+          <w:bCs/>
+        </w:rPr>
+        <w:t>No</w:t>
+      </w:r>
+      <w:r>
+        <w:t>, the customer may retry the payment or cancel the transaction.</w:t>
+      </w:r>
+    </w:p>
+    <w:p>
+      <w:pPr>
+        <w:numPr>
+          <w:ilvl w:val="0"/>
+          <w:numId w:val="135"/>
+        </w:numPr>
+      </w:pPr>
+      <w:r>
+        <w:rPr>
+          <w:b/>
+          <w:bCs/>
+        </w:rPr>
+        <w:t>Retry Payment?</w:t>
+      </w:r>
+    </w:p>
+    <w:p>
+      <w:pPr>
+        <w:numPr>
+          <w:ilvl w:val="1"/>
+          <w:numId w:val="135"/>
+        </w:numPr>
+        <w:spacing w:after="0"/>
+      </w:pPr>
+      <w:r>
+        <w:t xml:space="preserve">If </w:t>
+      </w:r>
+      <w:r>
+        <w:rPr>
+          <w:b/>
+          <w:bCs/>
+        </w:rPr>
+        <w:t>Yes</w:t>
+      </w:r>
+      <w:r>
+        <w:t>, the customer re-enters the payment information.</w:t>
+      </w:r>
+    </w:p>
+    <w:p>
+      <w:pPr>
+        <w:numPr>
+          <w:ilvl w:val="1"/>
+          <w:numId w:val="135"/>
+        </w:numPr>
+      </w:pPr>
+      <w:r>
+        <w:t xml:space="preserve">If </w:t>
+      </w:r>
+      <w:r>
+        <w:rPr>
+          <w:b/>
+          <w:bCs/>
+        </w:rPr>
+        <w:t>No</w:t>
+      </w:r>
+      <w:r>
+        <w:t>, the payment process is canceled.</w:t>
+      </w:r>
+    </w:p>
+    <w:p>
+      <w:pPr>
+        <w:numPr>
+          <w:ilvl w:val="0"/>
+          <w:numId w:val="135"/>
+        </w:numPr>
+      </w:pPr>
+      <w:r>
+        <w:rPr>
+          <w:b/>
+          <w:bCs/>
+        </w:rPr>
+        <w:t>Submit Review?</w:t>
+      </w:r>
+    </w:p>
+    <w:p>
+      <w:pPr>
+        <w:numPr>
+          <w:ilvl w:val="1"/>
+          <w:numId w:val="135"/>
+        </w:numPr>
+        <w:spacing w:after="0"/>
+      </w:pPr>
+      <w:r>
+        <w:t xml:space="preserve">If </w:t>
+      </w:r>
+      <w:r>
+        <w:rPr>
+          <w:b/>
+          <w:bCs/>
+        </w:rPr>
+        <w:t>Yes</w:t>
+      </w:r>
+      <w:r>
+        <w:t>, the customer submits a rating and written review.</w:t>
+      </w:r>
+    </w:p>
+    <w:p>
+      <w:pPr>
+        <w:numPr>
+          <w:ilvl w:val="1"/>
+          <w:numId w:val="135"/>
+        </w:numPr>
+      </w:pPr>
+      <w:r>
+        <w:t xml:space="preserve">If </w:t>
+      </w:r>
+      <w:r>
+        <w:rPr>
+          <w:b/>
+          <w:bCs/>
+        </w:rPr>
+        <w:t>No</w:t>
+      </w:r>
+      <w:r>
+        <w:t>, the workflow ends after the payment process.</w:t>
+      </w:r>
+    </w:p>
+    <w:p>
+      <w:r>
+        <w:t>These decision points ensure secure payment processing while allowing customers to provide valuable feedback after completing their rental experience.</w:t>
+      </w:r>
+    </w:p>
+    <w:p>
+      <w:pPr>
+        <w:rPr>
+          <w:b/>
+          <w:bCs/>
+        </w:rPr>
+      </w:pPr>
+      <w:r>
+        <w:rPr>
+          <w:b/>
+          <w:bCs/>
+        </w:rPr>
+        <w:t>Alternative Flows</w:t>
+      </w:r>
+    </w:p>
+    <w:p>
+      <w:r>
+        <w:t>The Payment &amp; Review Submission Activity Diagram incorporates several alternative scenarios:</w:t>
+      </w:r>
+    </w:p>
+    <w:p>
+      <w:pPr>
+        <w:pStyle w:val="ListParagraph"/>
+        <w:numPr>
+          <w:ilvl w:val="0"/>
+          <w:numId w:val="138"/>
+        </w:numPr>
+      </w:pPr>
+      <w:r>
+        <w:t>Payment authorization fails and the customer retries the payment.</w:t>
+      </w:r>
+    </w:p>
+    <w:p>
+      <w:pPr>
+        <w:pStyle w:val="ListParagraph"/>
+        <w:numPr>
+          <w:ilvl w:val="0"/>
+          <w:numId w:val="138"/>
+        </w:numPr>
+      </w:pPr>
+      <w:r>
+        <w:t>Payment is canceled before successful completion.</w:t>
+      </w:r>
+    </w:p>
+    <w:p>
+      <w:pPr>
+        <w:pStyle w:val="ListParagraph"/>
+        <w:numPr>
+          <w:ilvl w:val="0"/>
+          <w:numId w:val="138"/>
+        </w:numPr>
+      </w:pPr>
+      <w:r>
+        <w:t>Customer completes the payment but chooses not to submit a review.</w:t>
+      </w:r>
+    </w:p>
+    <w:p>
+      <w:pPr>
+        <w:pStyle w:val="ListParagraph"/>
+        <w:numPr>
+          <w:ilvl w:val="0"/>
+          <w:numId w:val="138"/>
+        </w:numPr>
+      </w:pPr>
+      <w:r>
+        <w:t>Successful payment followed by successful review submission.</w:t>
+      </w:r>
+    </w:p>
+    <w:p>
+      <w:r>
+        <w:t>These alternative paths improve the flexibility and reliability of the payment and feedback processes while ensuring that reservation records and customer reviews are accurately maintained.</w:t>
+      </w:r>
+    </w:p>
+    <w:p>
+      <w:pPr>
+        <w:rPr>
+          <w:b/>
+          <w:bCs/>
+        </w:rPr>
+      </w:pPr>
+      <w:r>
+        <w:rPr>
+          <w:b/>
+          <w:bCs/>
+        </w:rPr>
+        <w:t>Conclusion</w:t>
+      </w:r>
+    </w:p>
+    <w:p>
+      <w:r>
+        <w:t>The activity diagram called Payment &amp; Review Submission is a detailed visual presentation of the activities that are to be performed in order to make the reservation payment and to receive the customer’s feedback using the KriGo system. The diagram shows the logical sequence of actions starting from the payment authorization to the option of leaving the feedback.</w:t>
+      </w:r>
+    </w:p>
+    <w:p>
+      <w:pPr>
+        <w:spacing w:line="278" w:lineRule="auto"/>
+      </w:pPr>
+      <w:r>
+        <w:br w:type="page"/>
+      </w:r>
+    </w:p>
+    <w:p>
+      <w:pPr>
+        <w:keepNext/>
+        <w:spacing w:line="278" w:lineRule="auto"/>
+      </w:pPr>
+      <w:r>
+        <w:rPr>
+          <w:noProof/>
+        </w:rPr>
+        <w:lastRenderedPageBreak/>
+        <w:drawing>
+          <wp:inline distT="0" distB="0" distL="0" distR="0" wp14:anchorId="1FBA2A0C" wp14:editId="2D453039">
+            <wp:extent cx="5941695" cy="7226300"/>
+            <wp:effectExtent l="0" t="0" r="1905" b="0"/>
+            <wp:docPr id="1993171410" name="Picture 11"/>
+            <wp:cNvGraphicFramePr>
+              <a:graphicFrameLocks xmlns:a="http://schemas.openxmlformats.org/drawingml/2006/main" noChangeAspect="1"/>
+            </wp:cNvGraphicFramePr>
+            <a:graphic xmlns:a="http://schemas.openxmlformats.org/drawingml/2006/main">
+              <a:graphicData uri="http://schemas.openxmlformats.org/drawingml/2006/picture">
+                <pic:pic xmlns:pic="http://schemas.openxmlformats.org/drawingml/2006/picture">
+                  <pic:nvPicPr>
+                    <pic:cNvPr id="0" name="Picture 7"/>
+                    <pic:cNvPicPr>
+                      <a:picLocks noChangeAspect="1" noChangeArrowheads="1"/>
+                    </pic:cNvPicPr>
+                  </pic:nvPicPr>
+                  <pic:blipFill>
+                    <a:blip r:embed="rId11">
+                      <a:extLst>
+                        <a:ext uri="{28A0092B-C50C-407E-A947-70E740481C1C}">
+                          <a14:useLocalDpi xmlns:a14="http://schemas.microsoft.com/office/drawing/2010/main" val="0"/>
+                        </a:ext>
+                      </a:extLst>
+                    </a:blip>
+                    <a:srcRect/>
+                    <a:stretch>
+                      <a:fillRect/>
+                    </a:stretch>
+                  </pic:blipFill>
+                  <pic:spPr bwMode="auto">
+                    <a:xfrm>
+                      <a:off x="0" y="0"/>
+                      <a:ext cx="5941695" cy="7226300"/>
+                    </a:xfrm>
+                    <a:prstGeom prst="rect">
+                      <a:avLst/>
+                    </a:prstGeom>
+                    <a:noFill/>
+                    <a:ln>
+                      <a:noFill/>
+                    </a:ln>
+                  </pic:spPr>
+                </pic:pic>
+              </a:graphicData>
+            </a:graphic>
+          </wp:inline>
+        </w:drawing>
+      </w:r>
+    </w:p>
+    <w:p>
+      <w:pPr>
+        <w:pStyle w:val="Caption"/>
+      </w:pPr>
+      <w:r>
+        <w:t xml:space="preserve">Figure </w:t>
+      </w:r>
+      <w:r>
+        <w:fldChar w:fldCharType="begin"/>
+      </w:r>
+      <w:r>
+        <w:instrText xml:space="preserve"> SEQ Figure \* ARABIC </w:instrText>
+      </w:r>
+      <w:r>
+        <w:fldChar w:fldCharType="separate"/>
+      </w:r>
+      <w:r>
+        <w:rPr>
+          <w:noProof/>
+        </w:rPr>
+        <w:t>4</w:t>
+      </w:r>
+      <w:r>
+        <w:fldChar w:fldCharType="end"/>
+      </w:r>
+      <w:r>
+        <w:t xml:space="preserve"> - </w:t>
+      </w:r>
+      <w:r>
+        <w:t>Payment &amp; Review Submission Activity Diagram</w:t>
+      </w:r>
+    </w:p>
+    <w:p>
+      <w:pPr>
+        <w:spacing w:line="278" w:lineRule="auto"/>
+      </w:pPr>
+      <w:r>
+        <w:br w:type="page"/>
+      </w:r>
+    </w:p>
     <w:p/>
     <w:p/>
     <w:sectPr>
@@ -4778,6 +5441,119 @@
     </w:lvl>
   </w:abstractNum>
   <w:abstractNum w:abstractNumId="23" w15:restartNumberingAfterBreak="0">
+    <w:nsid w:val="14DC6E23"/>
+    <w:multiLevelType w:val="hybridMultilevel"/>
+    <w:tmpl w:val="2ACC2CF2"/>
+    <w:lvl w:ilvl="0" w:tplc="04090005">
+      <w:start w:val="1"/>
+      <w:numFmt w:val="bullet"/>
+      <w:lvlText w:val=""/>
+      <w:lvlJc w:val="left"/>
+      <w:pPr>
+        <w:ind w:left="1080" w:hanging="360"/>
+      </w:pPr>
+      <w:rPr>
+        <w:rFonts w:ascii="Wingdings" w:hAnsi="Wingdings" w:hint="default"/>
+      </w:rPr>
+    </w:lvl>
+    <w:lvl w:ilvl="1" w:tplc="04090003" w:tentative="1">
+      <w:start w:val="1"/>
+      <w:numFmt w:val="bullet"/>
+      <w:lvlText w:val="o"/>
+      <w:lvlJc w:val="left"/>
+      <w:pPr>
+        <w:ind w:left="1800" w:hanging="360"/>
+      </w:pPr>
+      <w:rPr>
+        <w:rFonts w:ascii="Courier New" w:hAnsi="Courier New" w:cs="Courier New" w:hint="default"/>
+      </w:rPr>
+    </w:lvl>
+    <w:lvl w:ilvl="2" w:tplc="04090005" w:tentative="1">
+      <w:start w:val="1"/>
+      <w:numFmt w:val="bullet"/>
+      <w:lvlText w:val=""/>
+      <w:lvlJc w:val="left"/>
+      <w:pPr>
+        <w:ind w:left="2520" w:hanging="360"/>
+      </w:pPr>
+      <w:rPr>
+        <w:rFonts w:ascii="Wingdings" w:hAnsi="Wingdings" w:hint="default"/>
+      </w:rPr>
+    </w:lvl>
+    <w:lvl w:ilvl="3" w:tplc="04090001" w:tentative="1">
+      <w:start w:val="1"/>
+      <w:numFmt w:val="bullet"/>
+      <w:lvlText w:val=""/>
+      <w:lvlJc w:val="left"/>
+      <w:pPr>
+        <w:ind w:left="3240" w:hanging="360"/>
+      </w:pPr>
+      <w:rPr>
+        <w:rFonts w:ascii="Symbol" w:hAnsi="Symbol" w:hint="default"/>
+      </w:rPr>
+    </w:lvl>
+    <w:lvl w:ilvl="4" w:tplc="04090003" w:tentative="1">
+      <w:start w:val="1"/>
+      <w:numFmt w:val="bullet"/>
+      <w:lvlText w:val="o"/>
+      <w:lvlJc w:val="left"/>
+      <w:pPr>
+        <w:ind w:left="3960" w:hanging="360"/>
+      </w:pPr>
+      <w:rPr>
+        <w:rFonts w:ascii="Courier New" w:hAnsi="Courier New" w:cs="Courier New" w:hint="default"/>
+      </w:rPr>
+    </w:lvl>
+    <w:lvl w:ilvl="5" w:tplc="04090005" w:tentative="1">
+      <w:start w:val="1"/>
+      <w:numFmt w:val="bullet"/>
+      <w:lvlText w:val=""/>
+      <w:lvlJc w:val="left"/>
+      <w:pPr>
+        <w:ind w:left="4680" w:hanging="360"/>
+      </w:pPr>
+      <w:rPr>
+        <w:rFonts w:ascii="Wingdings" w:hAnsi="Wingdings" w:hint="default"/>
+      </w:rPr>
+    </w:lvl>
+    <w:lvl w:ilvl="6" w:tplc="04090001" w:tentative="1">
+      <w:start w:val="1"/>
+      <w:numFmt w:val="bullet"/>
+      <w:lvlText w:val=""/>
+      <w:lvlJc w:val="left"/>
+      <w:pPr>
+        <w:ind w:left="5400" w:hanging="360"/>
+      </w:pPr>
+      <w:rPr>
+        <w:rFonts w:ascii="Symbol" w:hAnsi="Symbol" w:hint="default"/>
+      </w:rPr>
+    </w:lvl>
+    <w:lvl w:ilvl="7" w:tplc="04090003" w:tentative="1">
+      <w:start w:val="1"/>
+      <w:numFmt w:val="bullet"/>
+      <w:lvlText w:val="o"/>
+      <w:lvlJc w:val="left"/>
+      <w:pPr>
+        <w:ind w:left="6120" w:hanging="360"/>
+      </w:pPr>
+      <w:rPr>
+        <w:rFonts w:ascii="Courier New" w:hAnsi="Courier New" w:cs="Courier New" w:hint="default"/>
+      </w:rPr>
+    </w:lvl>
+    <w:lvl w:ilvl="8" w:tplc="04090005" w:tentative="1">
+      <w:start w:val="1"/>
+      <w:numFmt w:val="bullet"/>
+      <w:lvlText w:val=""/>
+      <w:lvlJc w:val="left"/>
+      <w:pPr>
+        <w:ind w:left="6840" w:hanging="360"/>
+      </w:pPr>
+      <w:rPr>
+        <w:rFonts w:ascii="Wingdings" w:hAnsi="Wingdings" w:hint="default"/>
+      </w:rPr>
+    </w:lvl>
+  </w:abstractNum>
+  <w:abstractNum w:abstractNumId="24" w15:restartNumberingAfterBreak="0">
     <w:nsid w:val="16D400B4"/>
     <w:multiLevelType w:val="hybridMultilevel"/>
     <w:tmpl w:val="58E6DFBE"/>
@@ -4890,7 +5666,7 @@
       </w:rPr>
     </w:lvl>
   </w:abstractNum>
-  <w:abstractNum w:abstractNumId="24" w15:restartNumberingAfterBreak="0">
+  <w:abstractNum w:abstractNumId="25" w15:restartNumberingAfterBreak="0">
     <w:nsid w:val="17236012"/>
     <w:multiLevelType w:val="hybridMultilevel"/>
     <w:tmpl w:val="DAFA46C8"/>
@@ -5003,7 +5779,7 @@
       </w:rPr>
     </w:lvl>
   </w:abstractNum>
-  <w:abstractNum w:abstractNumId="25" w15:restartNumberingAfterBreak="0">
+  <w:abstractNum w:abstractNumId="26" w15:restartNumberingAfterBreak="0">
     <w:nsid w:val="172B04C0"/>
     <w:multiLevelType w:val="hybridMultilevel"/>
     <w:tmpl w:val="B6C41D5E"/>
@@ -5116,7 +5892,7 @@
       </w:rPr>
     </w:lvl>
   </w:abstractNum>
-  <w:abstractNum w:abstractNumId="26" w15:restartNumberingAfterBreak="0">
+  <w:abstractNum w:abstractNumId="27" w15:restartNumberingAfterBreak="0">
     <w:nsid w:val="17485CCB"/>
     <w:multiLevelType w:val="multilevel"/>
     <w:tmpl w:val="397E1AE0"/>
@@ -5265,7 +6041,7 @@
       </w:rPr>
     </w:lvl>
   </w:abstractNum>
-  <w:abstractNum w:abstractNumId="27" w15:restartNumberingAfterBreak="0">
+  <w:abstractNum w:abstractNumId="28" w15:restartNumberingAfterBreak="0">
     <w:nsid w:val="17763D31"/>
     <w:multiLevelType w:val="hybridMultilevel"/>
     <w:tmpl w:val="6CE63304"/>
@@ -5378,7 +6154,7 @@
       </w:rPr>
     </w:lvl>
   </w:abstractNum>
-  <w:abstractNum w:abstractNumId="28" w15:restartNumberingAfterBreak="0">
+  <w:abstractNum w:abstractNumId="29" w15:restartNumberingAfterBreak="0">
     <w:nsid w:val="17B06937"/>
     <w:multiLevelType w:val="hybridMultilevel"/>
     <w:tmpl w:val="71089CF2"/>
@@ -5491,7 +6267,156 @@
       </w:rPr>
     </w:lvl>
   </w:abstractNum>
-  <w:abstractNum w:abstractNumId="29" w15:restartNumberingAfterBreak="0">
+  <w:abstractNum w:abstractNumId="30" w15:restartNumberingAfterBreak="0">
+    <w:nsid w:val="18FD59FB"/>
+    <w:multiLevelType w:val="multilevel"/>
+    <w:tmpl w:val="942CD1D2"/>
+    <w:lvl w:ilvl="0">
+      <w:start w:val="1"/>
+      <w:numFmt w:val="bullet"/>
+      <w:lvlText w:val=""/>
+      <w:lvlJc w:val="left"/>
+      <w:pPr>
+        <w:tabs>
+          <w:tab w:val="num" w:pos="720"/>
+        </w:tabs>
+        <w:ind w:left="720" w:hanging="360"/>
+      </w:pPr>
+      <w:rPr>
+        <w:rFonts w:ascii="Symbol" w:hAnsi="Symbol" w:hint="default"/>
+        <w:sz w:val="20"/>
+      </w:rPr>
+    </w:lvl>
+    <w:lvl w:ilvl="1">
+      <w:start w:val="1"/>
+      <w:numFmt w:val="bullet"/>
+      <w:lvlText w:val="o"/>
+      <w:lvlJc w:val="left"/>
+      <w:pPr>
+        <w:tabs>
+          <w:tab w:val="num" w:pos="1440"/>
+        </w:tabs>
+        <w:ind w:left="1440" w:hanging="360"/>
+      </w:pPr>
+      <w:rPr>
+        <w:rFonts w:ascii="Courier New" w:hAnsi="Courier New" w:hint="default"/>
+        <w:sz w:val="20"/>
+      </w:rPr>
+    </w:lvl>
+    <w:lvl w:ilvl="2" w:tentative="1">
+      <w:start w:val="1"/>
+      <w:numFmt w:val="bullet"/>
+      <w:lvlText w:val=""/>
+      <w:lvlJc w:val="left"/>
+      <w:pPr>
+        <w:tabs>
+          <w:tab w:val="num" w:pos="2160"/>
+        </w:tabs>
+        <w:ind w:left="2160" w:hanging="360"/>
+      </w:pPr>
+      <w:rPr>
+        <w:rFonts w:ascii="Wingdings" w:hAnsi="Wingdings" w:hint="default"/>
+        <w:sz w:val="20"/>
+      </w:rPr>
+    </w:lvl>
+    <w:lvl w:ilvl="3" w:tentative="1">
+      <w:start w:val="1"/>
+      <w:numFmt w:val="bullet"/>
+      <w:lvlText w:val=""/>
+      <w:lvlJc w:val="left"/>
+      <w:pPr>
+        <w:tabs>
+          <w:tab w:val="num" w:pos="2880"/>
+        </w:tabs>
+        <w:ind w:left="2880" w:hanging="360"/>
+      </w:pPr>
+      <w:rPr>
+        <w:rFonts w:ascii="Wingdings" w:hAnsi="Wingdings" w:hint="default"/>
+        <w:sz w:val="20"/>
+      </w:rPr>
+    </w:lvl>
+    <w:lvl w:ilvl="4" w:tentative="1">
+      <w:start w:val="1"/>
+      <w:numFmt w:val="bullet"/>
+      <w:lvlText w:val=""/>
+      <w:lvlJc w:val="left"/>
+      <w:pPr>
+        <w:tabs>
+          <w:tab w:val="num" w:pos="3600"/>
+        </w:tabs>
+        <w:ind w:left="3600" w:hanging="360"/>
+      </w:pPr>
+      <w:rPr>
+        <w:rFonts w:ascii="Wingdings" w:hAnsi="Wingdings" w:hint="default"/>
+        <w:sz w:val="20"/>
+      </w:rPr>
+    </w:lvl>
+    <w:lvl w:ilvl="5" w:tentative="1">
+      <w:start w:val="1"/>
+      <w:numFmt w:val="bullet"/>
+      <w:lvlText w:val=""/>
+      <w:lvlJc w:val="left"/>
+      <w:pPr>
+        <w:tabs>
+          <w:tab w:val="num" w:pos="4320"/>
+        </w:tabs>
+        <w:ind w:left="4320" w:hanging="360"/>
+      </w:pPr>
+      <w:rPr>
+        <w:rFonts w:ascii="Wingdings" w:hAnsi="Wingdings" w:hint="default"/>
+        <w:sz w:val="20"/>
+      </w:rPr>
+    </w:lvl>
+    <w:lvl w:ilvl="6" w:tentative="1">
+      <w:start w:val="1"/>
+      <w:numFmt w:val="bullet"/>
+      <w:lvlText w:val=""/>
+      <w:lvlJc w:val="left"/>
+      <w:pPr>
+        <w:tabs>
+          <w:tab w:val="num" w:pos="5040"/>
+        </w:tabs>
+        <w:ind w:left="5040" w:hanging="360"/>
+      </w:pPr>
+      <w:rPr>
+        <w:rFonts w:ascii="Wingdings" w:hAnsi="Wingdings" w:hint="default"/>
+        <w:sz w:val="20"/>
+      </w:rPr>
+    </w:lvl>
+    <w:lvl w:ilvl="7" w:tentative="1">
+      <w:start w:val="1"/>
+      <w:numFmt w:val="bullet"/>
+      <w:lvlText w:val=""/>
+      <w:lvlJc w:val="left"/>
+      <w:pPr>
+        <w:tabs>
+          <w:tab w:val="num" w:pos="5760"/>
+        </w:tabs>
+        <w:ind w:left="5760" w:hanging="360"/>
+      </w:pPr>
+      <w:rPr>
+        <w:rFonts w:ascii="Wingdings" w:hAnsi="Wingdings" w:hint="default"/>
+        <w:sz w:val="20"/>
+      </w:rPr>
+    </w:lvl>
+    <w:lvl w:ilvl="8" w:tentative="1">
+      <w:start w:val="1"/>
+      <w:numFmt w:val="bullet"/>
+      <w:lvlText w:val=""/>
+      <w:lvlJc w:val="left"/>
+      <w:pPr>
+        <w:tabs>
+          <w:tab w:val="num" w:pos="6480"/>
+        </w:tabs>
+        <w:ind w:left="6480" w:hanging="360"/>
+      </w:pPr>
+      <w:rPr>
+        <w:rFonts w:ascii="Wingdings" w:hAnsi="Wingdings" w:hint="default"/>
+        <w:sz w:val="20"/>
+      </w:rPr>
+    </w:lvl>
+  </w:abstractNum>
+  <w:abstractNum w:abstractNumId="31" w15:restartNumberingAfterBreak="0">
     <w:nsid w:val="190F0390"/>
     <w:multiLevelType w:val="multilevel"/>
     <w:tmpl w:val="CBE4A4A4"/>
@@ -5640,7 +6565,7 @@
       </w:rPr>
     </w:lvl>
   </w:abstractNum>
-  <w:abstractNum w:abstractNumId="30" w15:restartNumberingAfterBreak="0">
+  <w:abstractNum w:abstractNumId="32" w15:restartNumberingAfterBreak="0">
     <w:nsid w:val="195875B0"/>
     <w:multiLevelType w:val="multilevel"/>
     <w:tmpl w:val="615444D4"/>
@@ -5753,7 +6678,7 @@
       </w:pPr>
     </w:lvl>
   </w:abstractNum>
-  <w:abstractNum w:abstractNumId="31" w15:restartNumberingAfterBreak="0">
+  <w:abstractNum w:abstractNumId="33" w15:restartNumberingAfterBreak="0">
     <w:nsid w:val="197C6FD7"/>
     <w:multiLevelType w:val="hybridMultilevel"/>
     <w:tmpl w:val="D97CEAA8"/>
@@ -5866,7 +6791,7 @@
       </w:rPr>
     </w:lvl>
   </w:abstractNum>
-  <w:abstractNum w:abstractNumId="32" w15:restartNumberingAfterBreak="0">
+  <w:abstractNum w:abstractNumId="34" w15:restartNumberingAfterBreak="0">
     <w:nsid w:val="1CC60A94"/>
     <w:multiLevelType w:val="multilevel"/>
     <w:tmpl w:val="EB74741C"/>
@@ -6015,7 +6940,7 @@
       </w:rPr>
     </w:lvl>
   </w:abstractNum>
-  <w:abstractNum w:abstractNumId="33" w15:restartNumberingAfterBreak="0">
+  <w:abstractNum w:abstractNumId="35" w15:restartNumberingAfterBreak="0">
     <w:nsid w:val="1E6658CF"/>
     <w:multiLevelType w:val="multilevel"/>
     <w:tmpl w:val="762ABC5E"/>
@@ -6164,7 +7089,7 @@
       </w:rPr>
     </w:lvl>
   </w:abstractNum>
-  <w:abstractNum w:abstractNumId="34" w15:restartNumberingAfterBreak="0">
+  <w:abstractNum w:abstractNumId="36" w15:restartNumberingAfterBreak="0">
     <w:nsid w:val="1FA532B0"/>
     <w:multiLevelType w:val="multilevel"/>
     <w:tmpl w:val="8718294C"/>
@@ -6313,7 +7238,7 @@
       </w:rPr>
     </w:lvl>
   </w:abstractNum>
-  <w:abstractNum w:abstractNumId="35" w15:restartNumberingAfterBreak="0">
+  <w:abstractNum w:abstractNumId="37" w15:restartNumberingAfterBreak="0">
     <w:nsid w:val="215C77FD"/>
     <w:multiLevelType w:val="hybridMultilevel"/>
     <w:tmpl w:val="58F41D10"/>
@@ -6402,7 +7327,7 @@
       </w:pPr>
     </w:lvl>
   </w:abstractNum>
-  <w:abstractNum w:abstractNumId="36" w15:restartNumberingAfterBreak="0">
+  <w:abstractNum w:abstractNumId="38" w15:restartNumberingAfterBreak="0">
     <w:nsid w:val="218D5909"/>
     <w:multiLevelType w:val="hybridMultilevel"/>
     <w:tmpl w:val="CC989EE4"/>
@@ -6515,7 +7440,7 @@
       </w:rPr>
     </w:lvl>
   </w:abstractNum>
-  <w:abstractNum w:abstractNumId="37" w15:restartNumberingAfterBreak="0">
+  <w:abstractNum w:abstractNumId="39" w15:restartNumberingAfterBreak="0">
     <w:nsid w:val="23E010BA"/>
     <w:multiLevelType w:val="multilevel"/>
     <w:tmpl w:val="4A16907E"/>
@@ -6664,7 +7589,7 @@
       </w:rPr>
     </w:lvl>
   </w:abstractNum>
-  <w:abstractNum w:abstractNumId="38" w15:restartNumberingAfterBreak="0">
+  <w:abstractNum w:abstractNumId="40" w15:restartNumberingAfterBreak="0">
     <w:nsid w:val="2470127A"/>
     <w:multiLevelType w:val="multilevel"/>
     <w:tmpl w:val="309E9618"/>
@@ -6813,7 +7738,7 @@
       </w:rPr>
     </w:lvl>
   </w:abstractNum>
-  <w:abstractNum w:abstractNumId="39" w15:restartNumberingAfterBreak="0">
+  <w:abstractNum w:abstractNumId="41" w15:restartNumberingAfterBreak="0">
     <w:nsid w:val="24796798"/>
     <w:multiLevelType w:val="hybridMultilevel"/>
     <w:tmpl w:val="6622BEDC"/>
@@ -6902,7 +7827,7 @@
       </w:pPr>
     </w:lvl>
   </w:abstractNum>
-  <w:abstractNum w:abstractNumId="40" w15:restartNumberingAfterBreak="0">
+  <w:abstractNum w:abstractNumId="42" w15:restartNumberingAfterBreak="0">
     <w:nsid w:val="253B76EC"/>
     <w:multiLevelType w:val="multilevel"/>
     <w:tmpl w:val="2AA67CDA"/>
@@ -7051,7 +7976,120 @@
       </w:rPr>
     </w:lvl>
   </w:abstractNum>
-  <w:abstractNum w:abstractNumId="41" w15:restartNumberingAfterBreak="0">
+  <w:abstractNum w:abstractNumId="43" w15:restartNumberingAfterBreak="0">
+    <w:nsid w:val="2D0F5EA7"/>
+    <w:multiLevelType w:val="hybridMultilevel"/>
+    <w:tmpl w:val="F68ABCD6"/>
+    <w:lvl w:ilvl="0" w:tplc="04090005">
+      <w:start w:val="1"/>
+      <w:numFmt w:val="bullet"/>
+      <w:lvlText w:val=""/>
+      <w:lvlJc w:val="left"/>
+      <w:pPr>
+        <w:ind w:left="1080" w:hanging="360"/>
+      </w:pPr>
+      <w:rPr>
+        <w:rFonts w:ascii="Wingdings" w:hAnsi="Wingdings" w:hint="default"/>
+      </w:rPr>
+    </w:lvl>
+    <w:lvl w:ilvl="1" w:tplc="04090003" w:tentative="1">
+      <w:start w:val="1"/>
+      <w:numFmt w:val="bullet"/>
+      <w:lvlText w:val="o"/>
+      <w:lvlJc w:val="left"/>
+      <w:pPr>
+        <w:ind w:left="1800" w:hanging="360"/>
+      </w:pPr>
+      <w:rPr>
+        <w:rFonts w:ascii="Courier New" w:hAnsi="Courier New" w:cs="Courier New" w:hint="default"/>
+      </w:rPr>
+    </w:lvl>
+    <w:lvl w:ilvl="2" w:tplc="04090005" w:tentative="1">
+      <w:start w:val="1"/>
+      <w:numFmt w:val="bullet"/>
+      <w:lvlText w:val=""/>
+      <w:lvlJc w:val="left"/>
+      <w:pPr>
+        <w:ind w:left="2520" w:hanging="360"/>
+      </w:pPr>
+      <w:rPr>
+        <w:rFonts w:ascii="Wingdings" w:hAnsi="Wingdings" w:hint="default"/>
+      </w:rPr>
+    </w:lvl>
+    <w:lvl w:ilvl="3" w:tplc="04090001" w:tentative="1">
+      <w:start w:val="1"/>
+      <w:numFmt w:val="bullet"/>
+      <w:lvlText w:val=""/>
+      <w:lvlJc w:val="left"/>
+      <w:pPr>
+        <w:ind w:left="3240" w:hanging="360"/>
+      </w:pPr>
+      <w:rPr>
+        <w:rFonts w:ascii="Symbol" w:hAnsi="Symbol" w:hint="default"/>
+      </w:rPr>
+    </w:lvl>
+    <w:lvl w:ilvl="4" w:tplc="04090003" w:tentative="1">
+      <w:start w:val="1"/>
+      <w:numFmt w:val="bullet"/>
+      <w:lvlText w:val="o"/>
+      <w:lvlJc w:val="left"/>
+      <w:pPr>
+        <w:ind w:left="3960" w:hanging="360"/>
+      </w:pPr>
+      <w:rPr>
+        <w:rFonts w:ascii="Courier New" w:hAnsi="Courier New" w:cs="Courier New" w:hint="default"/>
+      </w:rPr>
+    </w:lvl>
+    <w:lvl w:ilvl="5" w:tplc="04090005" w:tentative="1">
+      <w:start w:val="1"/>
+      <w:numFmt w:val="bullet"/>
+      <w:lvlText w:val=""/>
+      <w:lvlJc w:val="left"/>
+      <w:pPr>
+        <w:ind w:left="4680" w:hanging="360"/>
+      </w:pPr>
+      <w:rPr>
+        <w:rFonts w:ascii="Wingdings" w:hAnsi="Wingdings" w:hint="default"/>
+      </w:rPr>
+    </w:lvl>
+    <w:lvl w:ilvl="6" w:tplc="04090001" w:tentative="1">
+      <w:start w:val="1"/>
+      <w:numFmt w:val="bullet"/>
+      <w:lvlText w:val=""/>
+      <w:lvlJc w:val="left"/>
+      <w:pPr>
+        <w:ind w:left="5400" w:hanging="360"/>
+      </w:pPr>
+      <w:rPr>
+        <w:rFonts w:ascii="Symbol" w:hAnsi="Symbol" w:hint="default"/>
+      </w:rPr>
+    </w:lvl>
+    <w:lvl w:ilvl="7" w:tplc="04090003" w:tentative="1">
+      <w:start w:val="1"/>
+      <w:numFmt w:val="bullet"/>
+      <w:lvlText w:val="o"/>
+      <w:lvlJc w:val="left"/>
+      <w:pPr>
+        <w:ind w:left="6120" w:hanging="360"/>
+      </w:pPr>
+      <w:rPr>
+        <w:rFonts w:ascii="Courier New" w:hAnsi="Courier New" w:cs="Courier New" w:hint="default"/>
+      </w:rPr>
+    </w:lvl>
+    <w:lvl w:ilvl="8" w:tplc="04090005" w:tentative="1">
+      <w:start w:val="1"/>
+      <w:numFmt w:val="bullet"/>
+      <w:lvlText w:val=""/>
+      <w:lvlJc w:val="left"/>
+      <w:pPr>
+        <w:ind w:left="6840" w:hanging="360"/>
+      </w:pPr>
+      <w:rPr>
+        <w:rFonts w:ascii="Wingdings" w:hAnsi="Wingdings" w:hint="default"/>
+      </w:rPr>
+    </w:lvl>
+  </w:abstractNum>
+  <w:abstractNum w:abstractNumId="44" w15:restartNumberingAfterBreak="0">
     <w:nsid w:val="2E4D738C"/>
     <w:multiLevelType w:val="multilevel"/>
     <w:tmpl w:val="1540BBA2"/>
@@ -7200,7 +8238,7 @@
       </w:rPr>
     </w:lvl>
   </w:abstractNum>
-  <w:abstractNum w:abstractNumId="42" w15:restartNumberingAfterBreak="0">
+  <w:abstractNum w:abstractNumId="45" w15:restartNumberingAfterBreak="0">
     <w:nsid w:val="2F0041C7"/>
     <w:multiLevelType w:val="multilevel"/>
     <w:tmpl w:val="656414FE"/>
@@ -7349,7 +8387,7 @@
       </w:rPr>
     </w:lvl>
   </w:abstractNum>
-  <w:abstractNum w:abstractNumId="43" w15:restartNumberingAfterBreak="0">
+  <w:abstractNum w:abstractNumId="46" w15:restartNumberingAfterBreak="0">
     <w:nsid w:val="304F01FA"/>
     <w:multiLevelType w:val="multilevel"/>
     <w:tmpl w:val="151C4EC6"/>
@@ -7498,7 +8536,7 @@
       </w:rPr>
     </w:lvl>
   </w:abstractNum>
-  <w:abstractNum w:abstractNumId="44" w15:restartNumberingAfterBreak="0">
+  <w:abstractNum w:abstractNumId="47" w15:restartNumberingAfterBreak="0">
     <w:nsid w:val="30BD025D"/>
     <w:multiLevelType w:val="hybridMultilevel"/>
     <w:tmpl w:val="04381C82"/>
@@ -7587,7 +8625,7 @@
       </w:pPr>
     </w:lvl>
   </w:abstractNum>
-  <w:abstractNum w:abstractNumId="45" w15:restartNumberingAfterBreak="0">
+  <w:abstractNum w:abstractNumId="48" w15:restartNumberingAfterBreak="0">
     <w:nsid w:val="327C0BA6"/>
     <w:multiLevelType w:val="hybridMultilevel"/>
     <w:tmpl w:val="2A9047EE"/>
@@ -7700,7 +8738,7 @@
       </w:rPr>
     </w:lvl>
   </w:abstractNum>
-  <w:abstractNum w:abstractNumId="46" w15:restartNumberingAfterBreak="0">
+  <w:abstractNum w:abstractNumId="49" w15:restartNumberingAfterBreak="0">
     <w:nsid w:val="338D63E8"/>
     <w:multiLevelType w:val="hybridMultilevel"/>
     <w:tmpl w:val="28D0FB50"/>
@@ -7813,7 +8851,7 @@
       </w:rPr>
     </w:lvl>
   </w:abstractNum>
-  <w:abstractNum w:abstractNumId="47" w15:restartNumberingAfterBreak="0">
+  <w:abstractNum w:abstractNumId="50" w15:restartNumberingAfterBreak="0">
     <w:nsid w:val="34182771"/>
     <w:multiLevelType w:val="multilevel"/>
     <w:tmpl w:val="2AA67CDA"/>
@@ -7962,7 +9000,7 @@
       </w:rPr>
     </w:lvl>
   </w:abstractNum>
-  <w:abstractNum w:abstractNumId="48" w15:restartNumberingAfterBreak="0">
+  <w:abstractNum w:abstractNumId="51" w15:restartNumberingAfterBreak="0">
     <w:nsid w:val="35413E58"/>
     <w:multiLevelType w:val="hybridMultilevel"/>
     <w:tmpl w:val="03C64164"/>
@@ -8075,7 +9113,7 @@
       </w:rPr>
     </w:lvl>
   </w:abstractNum>
-  <w:abstractNum w:abstractNumId="49" w15:restartNumberingAfterBreak="0">
+  <w:abstractNum w:abstractNumId="52" w15:restartNumberingAfterBreak="0">
     <w:nsid w:val="35C86AF0"/>
     <w:multiLevelType w:val="multilevel"/>
     <w:tmpl w:val="8202FCD6"/>
@@ -8224,7 +9262,7 @@
       </w:rPr>
     </w:lvl>
   </w:abstractNum>
-  <w:abstractNum w:abstractNumId="50" w15:restartNumberingAfterBreak="0">
+  <w:abstractNum w:abstractNumId="53" w15:restartNumberingAfterBreak="0">
     <w:nsid w:val="3623194A"/>
     <w:multiLevelType w:val="multilevel"/>
     <w:tmpl w:val="63F4E6F0"/>
@@ -8373,7 +9411,7 @@
       </w:rPr>
     </w:lvl>
   </w:abstractNum>
-  <w:abstractNum w:abstractNumId="51" w15:restartNumberingAfterBreak="0">
+  <w:abstractNum w:abstractNumId="54" w15:restartNumberingAfterBreak="0">
     <w:nsid w:val="36E36979"/>
     <w:multiLevelType w:val="multilevel"/>
     <w:tmpl w:val="3D58C93A"/>
@@ -8522,7 +9560,7 @@
       </w:rPr>
     </w:lvl>
   </w:abstractNum>
-  <w:abstractNum w:abstractNumId="52" w15:restartNumberingAfterBreak="0">
+  <w:abstractNum w:abstractNumId="55" w15:restartNumberingAfterBreak="0">
     <w:nsid w:val="37B424C3"/>
     <w:multiLevelType w:val="hybridMultilevel"/>
     <w:tmpl w:val="18F030D4"/>
@@ -8635,7 +9673,7 @@
       </w:rPr>
     </w:lvl>
   </w:abstractNum>
-  <w:abstractNum w:abstractNumId="53" w15:restartNumberingAfterBreak="0">
+  <w:abstractNum w:abstractNumId="56" w15:restartNumberingAfterBreak="0">
     <w:nsid w:val="3BC10D30"/>
     <w:multiLevelType w:val="multilevel"/>
     <w:tmpl w:val="502AD78C"/>
@@ -8784,7 +9822,7 @@
       </w:rPr>
     </w:lvl>
   </w:abstractNum>
-  <w:abstractNum w:abstractNumId="54" w15:restartNumberingAfterBreak="0">
+  <w:abstractNum w:abstractNumId="57" w15:restartNumberingAfterBreak="0">
     <w:nsid w:val="3C276BB8"/>
     <w:multiLevelType w:val="multilevel"/>
     <w:tmpl w:val="2AA67CDA"/>
@@ -8933,7 +9971,7 @@
       </w:rPr>
     </w:lvl>
   </w:abstractNum>
-  <w:abstractNum w:abstractNumId="55" w15:restartNumberingAfterBreak="0">
+  <w:abstractNum w:abstractNumId="58" w15:restartNumberingAfterBreak="0">
     <w:nsid w:val="3C596808"/>
     <w:multiLevelType w:val="multilevel"/>
     <w:tmpl w:val="2AA67CDA"/>
@@ -9082,7 +10120,7 @@
       </w:rPr>
     </w:lvl>
   </w:abstractNum>
-  <w:abstractNum w:abstractNumId="56" w15:restartNumberingAfterBreak="0">
+  <w:abstractNum w:abstractNumId="59" w15:restartNumberingAfterBreak="0">
     <w:nsid w:val="3CBF280A"/>
     <w:multiLevelType w:val="multilevel"/>
     <w:tmpl w:val="A13E4362"/>
@@ -9231,7 +10269,7 @@
       </w:rPr>
     </w:lvl>
   </w:abstractNum>
-  <w:abstractNum w:abstractNumId="57" w15:restartNumberingAfterBreak="0">
+  <w:abstractNum w:abstractNumId="60" w15:restartNumberingAfterBreak="0">
     <w:nsid w:val="3CC7541B"/>
     <w:multiLevelType w:val="multilevel"/>
     <w:tmpl w:val="2AA67CDA"/>
@@ -9380,7 +10418,7 @@
       </w:rPr>
     </w:lvl>
   </w:abstractNum>
-  <w:abstractNum w:abstractNumId="58" w15:restartNumberingAfterBreak="0">
+  <w:abstractNum w:abstractNumId="61" w15:restartNumberingAfterBreak="0">
     <w:nsid w:val="3F5E3BA1"/>
     <w:multiLevelType w:val="multilevel"/>
     <w:tmpl w:val="2AA67CDA"/>
@@ -9529,7 +10567,7 @@
       </w:rPr>
     </w:lvl>
   </w:abstractNum>
-  <w:abstractNum w:abstractNumId="59" w15:restartNumberingAfterBreak="0">
+  <w:abstractNum w:abstractNumId="62" w15:restartNumberingAfterBreak="0">
     <w:nsid w:val="40431B1C"/>
     <w:multiLevelType w:val="multilevel"/>
     <w:tmpl w:val="5D8E77D0"/>
@@ -9678,7 +10716,7 @@
       </w:rPr>
     </w:lvl>
   </w:abstractNum>
-  <w:abstractNum w:abstractNumId="60" w15:restartNumberingAfterBreak="0">
+  <w:abstractNum w:abstractNumId="63" w15:restartNumberingAfterBreak="0">
     <w:nsid w:val="419E0199"/>
     <w:multiLevelType w:val="multilevel"/>
     <w:tmpl w:val="D6CA9606"/>
@@ -9827,7 +10865,7 @@
       </w:rPr>
     </w:lvl>
   </w:abstractNum>
-  <w:abstractNum w:abstractNumId="61" w15:restartNumberingAfterBreak="0">
+  <w:abstractNum w:abstractNumId="64" w15:restartNumberingAfterBreak="0">
     <w:nsid w:val="452F60FB"/>
     <w:multiLevelType w:val="hybridMultilevel"/>
     <w:tmpl w:val="892A990A"/>
@@ -9940,7 +10978,7 @@
       </w:rPr>
     </w:lvl>
   </w:abstractNum>
-  <w:abstractNum w:abstractNumId="62" w15:restartNumberingAfterBreak="0">
+  <w:abstractNum w:abstractNumId="65" w15:restartNumberingAfterBreak="0">
     <w:nsid w:val="47B65409"/>
     <w:multiLevelType w:val="multilevel"/>
     <w:tmpl w:val="2AA67CDA"/>
@@ -10089,7 +11127,7 @@
       </w:rPr>
     </w:lvl>
   </w:abstractNum>
-  <w:abstractNum w:abstractNumId="63" w15:restartNumberingAfterBreak="0">
+  <w:abstractNum w:abstractNumId="66" w15:restartNumberingAfterBreak="0">
     <w:nsid w:val="47BF2170"/>
     <w:multiLevelType w:val="multilevel"/>
     <w:tmpl w:val="D9681266"/>
@@ -10238,7 +11276,7 @@
       </w:rPr>
     </w:lvl>
   </w:abstractNum>
-  <w:abstractNum w:abstractNumId="64" w15:restartNumberingAfterBreak="0">
+  <w:abstractNum w:abstractNumId="67" w15:restartNumberingAfterBreak="0">
     <w:nsid w:val="47E5592F"/>
     <w:multiLevelType w:val="hybridMultilevel"/>
     <w:tmpl w:val="719AB9FA"/>
@@ -10351,7 +11389,7 @@
       </w:rPr>
     </w:lvl>
   </w:abstractNum>
-  <w:abstractNum w:abstractNumId="65" w15:restartNumberingAfterBreak="0">
+  <w:abstractNum w:abstractNumId="68" w15:restartNumberingAfterBreak="0">
     <w:nsid w:val="48C041A9"/>
     <w:multiLevelType w:val="multilevel"/>
     <w:tmpl w:val="59A694BC"/>
@@ -10500,7 +11538,7 @@
       </w:rPr>
     </w:lvl>
   </w:abstractNum>
-  <w:abstractNum w:abstractNumId="66" w15:restartNumberingAfterBreak="0">
+  <w:abstractNum w:abstractNumId="69" w15:restartNumberingAfterBreak="0">
     <w:nsid w:val="49D6568A"/>
     <w:multiLevelType w:val="multilevel"/>
     <w:tmpl w:val="559E29EC"/>
@@ -10649,7 +11687,7 @@
       </w:rPr>
     </w:lvl>
   </w:abstractNum>
-  <w:abstractNum w:abstractNumId="67" w15:restartNumberingAfterBreak="0">
+  <w:abstractNum w:abstractNumId="70" w15:restartNumberingAfterBreak="0">
     <w:nsid w:val="4AF73293"/>
     <w:multiLevelType w:val="hybridMultilevel"/>
     <w:tmpl w:val="F2962738"/>
@@ -10762,7 +11800,7 @@
       </w:rPr>
     </w:lvl>
   </w:abstractNum>
-  <w:abstractNum w:abstractNumId="68" w15:restartNumberingAfterBreak="0">
+  <w:abstractNum w:abstractNumId="71" w15:restartNumberingAfterBreak="0">
     <w:nsid w:val="4B375248"/>
     <w:multiLevelType w:val="multilevel"/>
     <w:tmpl w:val="B574C1C6"/>
@@ -10911,7 +11949,7 @@
       </w:rPr>
     </w:lvl>
   </w:abstractNum>
-  <w:abstractNum w:abstractNumId="69" w15:restartNumberingAfterBreak="0">
+  <w:abstractNum w:abstractNumId="72" w15:restartNumberingAfterBreak="0">
     <w:nsid w:val="4BA13766"/>
     <w:multiLevelType w:val="multilevel"/>
     <w:tmpl w:val="63F4E6F0"/>
@@ -11060,7 +12098,7 @@
       </w:rPr>
     </w:lvl>
   </w:abstractNum>
-  <w:abstractNum w:abstractNumId="70" w15:restartNumberingAfterBreak="0">
+  <w:abstractNum w:abstractNumId="73" w15:restartNumberingAfterBreak="0">
     <w:nsid w:val="4BA25441"/>
     <w:multiLevelType w:val="hybridMultilevel"/>
     <w:tmpl w:val="217E2E96"/>
@@ -11173,7 +12211,7 @@
       </w:rPr>
     </w:lvl>
   </w:abstractNum>
-  <w:abstractNum w:abstractNumId="71" w15:restartNumberingAfterBreak="0">
+  <w:abstractNum w:abstractNumId="74" w15:restartNumberingAfterBreak="0">
     <w:nsid w:val="4E276DCB"/>
     <w:multiLevelType w:val="hybridMultilevel"/>
     <w:tmpl w:val="B7C469B4"/>
@@ -11286,7 +12324,7 @@
       </w:rPr>
     </w:lvl>
   </w:abstractNum>
-  <w:abstractNum w:abstractNumId="72" w15:restartNumberingAfterBreak="0">
+  <w:abstractNum w:abstractNumId="75" w15:restartNumberingAfterBreak="0">
     <w:nsid w:val="4F053929"/>
     <w:multiLevelType w:val="hybridMultilevel"/>
     <w:tmpl w:val="2A78C678"/>
@@ -11399,7 +12437,7 @@
       </w:rPr>
     </w:lvl>
   </w:abstractNum>
-  <w:abstractNum w:abstractNumId="73" w15:restartNumberingAfterBreak="0">
+  <w:abstractNum w:abstractNumId="76" w15:restartNumberingAfterBreak="0">
     <w:nsid w:val="4FFB237E"/>
     <w:multiLevelType w:val="multilevel"/>
     <w:tmpl w:val="2AA67CDA"/>
@@ -11548,7 +12586,7 @@
       </w:rPr>
     </w:lvl>
   </w:abstractNum>
-  <w:abstractNum w:abstractNumId="74" w15:restartNumberingAfterBreak="0">
+  <w:abstractNum w:abstractNumId="77" w15:restartNumberingAfterBreak="0">
     <w:nsid w:val="51737FE0"/>
     <w:multiLevelType w:val="hybridMultilevel"/>
     <w:tmpl w:val="2B0604E6"/>
@@ -11661,7 +12699,7 @@
       </w:rPr>
     </w:lvl>
   </w:abstractNum>
-  <w:abstractNum w:abstractNumId="75" w15:restartNumberingAfterBreak="0">
+  <w:abstractNum w:abstractNumId="78" w15:restartNumberingAfterBreak="0">
     <w:nsid w:val="518B1885"/>
     <w:multiLevelType w:val="multilevel"/>
     <w:tmpl w:val="AE1AAC28"/>
@@ -11810,7 +12848,7 @@
       </w:rPr>
     </w:lvl>
   </w:abstractNum>
-  <w:abstractNum w:abstractNumId="76" w15:restartNumberingAfterBreak="0">
+  <w:abstractNum w:abstractNumId="79" w15:restartNumberingAfterBreak="0">
     <w:nsid w:val="51A86EF8"/>
     <w:multiLevelType w:val="multilevel"/>
     <w:tmpl w:val="FF2841D4"/>
@@ -11959,7 +12997,7 @@
       </w:rPr>
     </w:lvl>
   </w:abstractNum>
-  <w:abstractNum w:abstractNumId="77" w15:restartNumberingAfterBreak="0">
+  <w:abstractNum w:abstractNumId="80" w15:restartNumberingAfterBreak="0">
     <w:nsid w:val="51AB55CC"/>
     <w:multiLevelType w:val="multilevel"/>
     <w:tmpl w:val="5986D838"/>
@@ -12108,7 +13146,7 @@
       </w:rPr>
     </w:lvl>
   </w:abstractNum>
-  <w:abstractNum w:abstractNumId="78" w15:restartNumberingAfterBreak="0">
+  <w:abstractNum w:abstractNumId="81" w15:restartNumberingAfterBreak="0">
     <w:nsid w:val="521378FF"/>
     <w:multiLevelType w:val="multilevel"/>
     <w:tmpl w:val="7B002268"/>
@@ -12257,7 +13295,7 @@
       </w:rPr>
     </w:lvl>
   </w:abstractNum>
-  <w:abstractNum w:abstractNumId="79" w15:restartNumberingAfterBreak="0">
+  <w:abstractNum w:abstractNumId="82" w15:restartNumberingAfterBreak="0">
     <w:nsid w:val="521F2792"/>
     <w:multiLevelType w:val="multilevel"/>
     <w:tmpl w:val="9FB45386"/>
@@ -12406,7 +13444,7 @@
       </w:rPr>
     </w:lvl>
   </w:abstractNum>
-  <w:abstractNum w:abstractNumId="80" w15:restartNumberingAfterBreak="0">
+  <w:abstractNum w:abstractNumId="83" w15:restartNumberingAfterBreak="0">
     <w:nsid w:val="53390911"/>
     <w:multiLevelType w:val="multilevel"/>
     <w:tmpl w:val="1C380F12"/>
@@ -12555,7 +13593,7 @@
       </w:rPr>
     </w:lvl>
   </w:abstractNum>
-  <w:abstractNum w:abstractNumId="81" w15:restartNumberingAfterBreak="0">
+  <w:abstractNum w:abstractNumId="84" w15:restartNumberingAfterBreak="0">
     <w:nsid w:val="53CD23AC"/>
     <w:multiLevelType w:val="multilevel"/>
     <w:tmpl w:val="57BAE8F0"/>
@@ -12704,7 +13742,7 @@
       </w:rPr>
     </w:lvl>
   </w:abstractNum>
-  <w:abstractNum w:abstractNumId="82" w15:restartNumberingAfterBreak="0">
+  <w:abstractNum w:abstractNumId="85" w15:restartNumberingAfterBreak="0">
     <w:nsid w:val="5462791F"/>
     <w:multiLevelType w:val="hybridMultilevel"/>
     <w:tmpl w:val="FDE24C26"/>
@@ -12817,7 +13855,7 @@
       </w:rPr>
     </w:lvl>
   </w:abstractNum>
-  <w:abstractNum w:abstractNumId="83" w15:restartNumberingAfterBreak="0">
+  <w:abstractNum w:abstractNumId="86" w15:restartNumberingAfterBreak="0">
     <w:nsid w:val="547005EB"/>
     <w:multiLevelType w:val="multilevel"/>
     <w:tmpl w:val="F260CC5C"/>
@@ -12966,7 +14004,7 @@
       </w:rPr>
     </w:lvl>
   </w:abstractNum>
-  <w:abstractNum w:abstractNumId="84" w15:restartNumberingAfterBreak="0">
+  <w:abstractNum w:abstractNumId="87" w15:restartNumberingAfterBreak="0">
     <w:nsid w:val="58034221"/>
     <w:multiLevelType w:val="hybridMultilevel"/>
     <w:tmpl w:val="65D0619C"/>
@@ -13079,7 +14117,7 @@
       </w:rPr>
     </w:lvl>
   </w:abstractNum>
-  <w:abstractNum w:abstractNumId="85" w15:restartNumberingAfterBreak="0">
+  <w:abstractNum w:abstractNumId="88" w15:restartNumberingAfterBreak="0">
     <w:nsid w:val="59515319"/>
     <w:multiLevelType w:val="multilevel"/>
     <w:tmpl w:val="5AD8ACF0"/>
@@ -13228,7 +14266,7 @@
       </w:rPr>
     </w:lvl>
   </w:abstractNum>
-  <w:abstractNum w:abstractNumId="86" w15:restartNumberingAfterBreak="0">
+  <w:abstractNum w:abstractNumId="89" w15:restartNumberingAfterBreak="0">
     <w:nsid w:val="5A460390"/>
     <w:multiLevelType w:val="hybridMultilevel"/>
     <w:tmpl w:val="BD8E939C"/>
@@ -13341,7 +14379,7 @@
       </w:rPr>
     </w:lvl>
   </w:abstractNum>
-  <w:abstractNum w:abstractNumId="87" w15:restartNumberingAfterBreak="0">
+  <w:abstractNum w:abstractNumId="90" w15:restartNumberingAfterBreak="0">
     <w:nsid w:val="5CEE630B"/>
     <w:multiLevelType w:val="hybridMultilevel"/>
     <w:tmpl w:val="DE8E8DBA"/>
@@ -13454,7 +14492,7 @@
       </w:rPr>
     </w:lvl>
   </w:abstractNum>
-  <w:abstractNum w:abstractNumId="88" w15:restartNumberingAfterBreak="0">
+  <w:abstractNum w:abstractNumId="91" w15:restartNumberingAfterBreak="0">
     <w:nsid w:val="5D5A183C"/>
     <w:multiLevelType w:val="multilevel"/>
     <w:tmpl w:val="C804C34A"/>
@@ -13603,7 +14641,7 @@
       </w:rPr>
     </w:lvl>
   </w:abstractNum>
-  <w:abstractNum w:abstractNumId="89" w15:restartNumberingAfterBreak="0">
+  <w:abstractNum w:abstractNumId="92" w15:restartNumberingAfterBreak="0">
     <w:nsid w:val="5DF95194"/>
     <w:multiLevelType w:val="multilevel"/>
     <w:tmpl w:val="CC127E54"/>
@@ -13752,7 +14790,7 @@
       </w:rPr>
     </w:lvl>
   </w:abstractNum>
-  <w:abstractNum w:abstractNumId="90" w15:restartNumberingAfterBreak="0">
+  <w:abstractNum w:abstractNumId="93" w15:restartNumberingAfterBreak="0">
     <w:nsid w:val="5E6333E0"/>
     <w:multiLevelType w:val="hybridMultilevel"/>
     <w:tmpl w:val="A15497C8"/>
@@ -13865,7 +14903,7 @@
       </w:rPr>
     </w:lvl>
   </w:abstractNum>
-  <w:abstractNum w:abstractNumId="91" w15:restartNumberingAfterBreak="0">
+  <w:abstractNum w:abstractNumId="94" w15:restartNumberingAfterBreak="0">
     <w:nsid w:val="5E9C452C"/>
     <w:multiLevelType w:val="multilevel"/>
     <w:tmpl w:val="B8727936"/>
@@ -14014,7 +15052,7 @@
       </w:rPr>
     </w:lvl>
   </w:abstractNum>
-  <w:abstractNum w:abstractNumId="92" w15:restartNumberingAfterBreak="0">
+  <w:abstractNum w:abstractNumId="95" w15:restartNumberingAfterBreak="0">
     <w:nsid w:val="5EC339A8"/>
     <w:multiLevelType w:val="multilevel"/>
     <w:tmpl w:val="36DAAD54"/>
@@ -14163,7 +15201,7 @@
       </w:rPr>
     </w:lvl>
   </w:abstractNum>
-  <w:abstractNum w:abstractNumId="93" w15:restartNumberingAfterBreak="0">
+  <w:abstractNum w:abstractNumId="96" w15:restartNumberingAfterBreak="0">
     <w:nsid w:val="62385AA6"/>
     <w:multiLevelType w:val="multilevel"/>
     <w:tmpl w:val="B9EAECD4"/>
@@ -14312,7 +15350,7 @@
       </w:rPr>
     </w:lvl>
   </w:abstractNum>
-  <w:abstractNum w:abstractNumId="94" w15:restartNumberingAfterBreak="0">
+  <w:abstractNum w:abstractNumId="97" w15:restartNumberingAfterBreak="0">
     <w:nsid w:val="625D686D"/>
     <w:multiLevelType w:val="multilevel"/>
     <w:tmpl w:val="BC1C2048"/>
@@ -14461,7 +15499,7 @@
       </w:rPr>
     </w:lvl>
   </w:abstractNum>
-  <w:abstractNum w:abstractNumId="95" w15:restartNumberingAfterBreak="0">
+  <w:abstractNum w:abstractNumId="98" w15:restartNumberingAfterBreak="0">
     <w:nsid w:val="62B46951"/>
     <w:multiLevelType w:val="hybridMultilevel"/>
     <w:tmpl w:val="0FEAFEC6"/>
@@ -14574,7 +15612,7 @@
       </w:rPr>
     </w:lvl>
   </w:abstractNum>
-  <w:abstractNum w:abstractNumId="96" w15:restartNumberingAfterBreak="0">
+  <w:abstractNum w:abstractNumId="99" w15:restartNumberingAfterBreak="0">
     <w:nsid w:val="647819E3"/>
     <w:multiLevelType w:val="multilevel"/>
     <w:tmpl w:val="ABB278BC"/>
@@ -14723,7 +15761,7 @@
       </w:rPr>
     </w:lvl>
   </w:abstractNum>
-  <w:abstractNum w:abstractNumId="97" w15:restartNumberingAfterBreak="0">
+  <w:abstractNum w:abstractNumId="100" w15:restartNumberingAfterBreak="0">
     <w:nsid w:val="64F30198"/>
     <w:multiLevelType w:val="multilevel"/>
     <w:tmpl w:val="63F4E6F0"/>
@@ -14872,7 +15910,7 @@
       </w:rPr>
     </w:lvl>
   </w:abstractNum>
-  <w:abstractNum w:abstractNumId="98" w15:restartNumberingAfterBreak="0">
+  <w:abstractNum w:abstractNumId="101" w15:restartNumberingAfterBreak="0">
     <w:nsid w:val="65314293"/>
     <w:multiLevelType w:val="hybridMultilevel"/>
     <w:tmpl w:val="6688DFAC"/>
@@ -14985,7 +16023,7 @@
       </w:rPr>
     </w:lvl>
   </w:abstractNum>
-  <w:abstractNum w:abstractNumId="99" w15:restartNumberingAfterBreak="0">
+  <w:abstractNum w:abstractNumId="102" w15:restartNumberingAfterBreak="0">
     <w:nsid w:val="65CE4D0F"/>
     <w:multiLevelType w:val="hybridMultilevel"/>
     <w:tmpl w:val="DB668538"/>
@@ -15098,7 +16136,7 @@
       </w:rPr>
     </w:lvl>
   </w:abstractNum>
-  <w:abstractNum w:abstractNumId="100" w15:restartNumberingAfterBreak="0">
+  <w:abstractNum w:abstractNumId="103" w15:restartNumberingAfterBreak="0">
     <w:nsid w:val="661C7D73"/>
     <w:multiLevelType w:val="multilevel"/>
     <w:tmpl w:val="D9681266"/>
@@ -15247,7 +16285,7 @@
       </w:rPr>
     </w:lvl>
   </w:abstractNum>
-  <w:abstractNum w:abstractNumId="101" w15:restartNumberingAfterBreak="0">
+  <w:abstractNum w:abstractNumId="104" w15:restartNumberingAfterBreak="0">
     <w:nsid w:val="661F6F82"/>
     <w:multiLevelType w:val="multilevel"/>
     <w:tmpl w:val="53F8A934"/>
@@ -15396,7 +16434,7 @@
       </w:rPr>
     </w:lvl>
   </w:abstractNum>
-  <w:abstractNum w:abstractNumId="102" w15:restartNumberingAfterBreak="0">
+  <w:abstractNum w:abstractNumId="105" w15:restartNumberingAfterBreak="0">
     <w:nsid w:val="66E36FE0"/>
     <w:multiLevelType w:val="multilevel"/>
     <w:tmpl w:val="2AA67CDA"/>
@@ -15545,7 +16583,156 @@
       </w:rPr>
     </w:lvl>
   </w:abstractNum>
-  <w:abstractNum w:abstractNumId="103" w15:restartNumberingAfterBreak="0">
+  <w:abstractNum w:abstractNumId="106" w15:restartNumberingAfterBreak="0">
+    <w:nsid w:val="68205EC5"/>
+    <w:multiLevelType w:val="multilevel"/>
+    <w:tmpl w:val="EB4C8238"/>
+    <w:lvl w:ilvl="0">
+      <w:start w:val="1"/>
+      <w:numFmt w:val="bullet"/>
+      <w:lvlText w:val=""/>
+      <w:lvlJc w:val="left"/>
+      <w:pPr>
+        <w:tabs>
+          <w:tab w:val="num" w:pos="720"/>
+        </w:tabs>
+        <w:ind w:left="720" w:hanging="360"/>
+      </w:pPr>
+      <w:rPr>
+        <w:rFonts w:ascii="Symbol" w:hAnsi="Symbol" w:hint="default"/>
+        <w:sz w:val="20"/>
+      </w:rPr>
+    </w:lvl>
+    <w:lvl w:ilvl="1" w:tentative="1">
+      <w:start w:val="1"/>
+      <w:numFmt w:val="bullet"/>
+      <w:lvlText w:val="o"/>
+      <w:lvlJc w:val="left"/>
+      <w:pPr>
+        <w:tabs>
+          <w:tab w:val="num" w:pos="1440"/>
+        </w:tabs>
+        <w:ind w:left="1440" w:hanging="360"/>
+      </w:pPr>
+      <w:rPr>
+        <w:rFonts w:ascii="Courier New" w:hAnsi="Courier New" w:hint="default"/>
+        <w:sz w:val="20"/>
+      </w:rPr>
+    </w:lvl>
+    <w:lvl w:ilvl="2" w:tentative="1">
+      <w:start w:val="1"/>
+      <w:numFmt w:val="bullet"/>
+      <w:lvlText w:val=""/>
+      <w:lvlJc w:val="left"/>
+      <w:pPr>
+        <w:tabs>
+          <w:tab w:val="num" w:pos="2160"/>
+        </w:tabs>
+        <w:ind w:left="2160" w:hanging="360"/>
+      </w:pPr>
+      <w:rPr>
+        <w:rFonts w:ascii="Wingdings" w:hAnsi="Wingdings" w:hint="default"/>
+        <w:sz w:val="20"/>
+      </w:rPr>
+    </w:lvl>
+    <w:lvl w:ilvl="3" w:tentative="1">
+      <w:start w:val="1"/>
+      <w:numFmt w:val="bullet"/>
+      <w:lvlText w:val=""/>
+      <w:lvlJc w:val="left"/>
+      <w:pPr>
+        <w:tabs>
+          <w:tab w:val="num" w:pos="2880"/>
+        </w:tabs>
+        <w:ind w:left="2880" w:hanging="360"/>
+      </w:pPr>
+      <w:rPr>
+        <w:rFonts w:ascii="Wingdings" w:hAnsi="Wingdings" w:hint="default"/>
+        <w:sz w:val="20"/>
+      </w:rPr>
+    </w:lvl>
+    <w:lvl w:ilvl="4" w:tentative="1">
+      <w:start w:val="1"/>
+      <w:numFmt w:val="bullet"/>
+      <w:lvlText w:val=""/>
+      <w:lvlJc w:val="left"/>
+      <w:pPr>
+        <w:tabs>
+          <w:tab w:val="num" w:pos="3600"/>
+        </w:tabs>
+        <w:ind w:left="3600" w:hanging="360"/>
+      </w:pPr>
+      <w:rPr>
+        <w:rFonts w:ascii="Wingdings" w:hAnsi="Wingdings" w:hint="default"/>
+        <w:sz w:val="20"/>
+      </w:rPr>
+    </w:lvl>
+    <w:lvl w:ilvl="5" w:tentative="1">
+      <w:start w:val="1"/>
+      <w:numFmt w:val="bullet"/>
+      <w:lvlText w:val=""/>
+      <w:lvlJc w:val="left"/>
+      <w:pPr>
+        <w:tabs>
+          <w:tab w:val="num" w:pos="4320"/>
+        </w:tabs>
+        <w:ind w:left="4320" w:hanging="360"/>
+      </w:pPr>
+      <w:rPr>
+        <w:rFonts w:ascii="Wingdings" w:hAnsi="Wingdings" w:hint="default"/>
+        <w:sz w:val="20"/>
+      </w:rPr>
+    </w:lvl>
+    <w:lvl w:ilvl="6" w:tentative="1">
+      <w:start w:val="1"/>
+      <w:numFmt w:val="bullet"/>
+      <w:lvlText w:val=""/>
+      <w:lvlJc w:val="left"/>
+      <w:pPr>
+        <w:tabs>
+          <w:tab w:val="num" w:pos="5040"/>
+        </w:tabs>
+        <w:ind w:left="5040" w:hanging="360"/>
+      </w:pPr>
+      <w:rPr>
+        <w:rFonts w:ascii="Wingdings" w:hAnsi="Wingdings" w:hint="default"/>
+        <w:sz w:val="20"/>
+      </w:rPr>
+    </w:lvl>
+    <w:lvl w:ilvl="7" w:tentative="1">
+      <w:start w:val="1"/>
+      <w:numFmt w:val="bullet"/>
+      <w:lvlText w:val=""/>
+      <w:lvlJc w:val="left"/>
+      <w:pPr>
+        <w:tabs>
+          <w:tab w:val="num" w:pos="5760"/>
+        </w:tabs>
+        <w:ind w:left="5760" w:hanging="360"/>
+      </w:pPr>
+      <w:rPr>
+        <w:rFonts w:ascii="Wingdings" w:hAnsi="Wingdings" w:hint="default"/>
+        <w:sz w:val="20"/>
+      </w:rPr>
+    </w:lvl>
+    <w:lvl w:ilvl="8" w:tentative="1">
+      <w:start w:val="1"/>
+      <w:numFmt w:val="bullet"/>
+      <w:lvlText w:val=""/>
+      <w:lvlJc w:val="left"/>
+      <w:pPr>
+        <w:tabs>
+          <w:tab w:val="num" w:pos="6480"/>
+        </w:tabs>
+        <w:ind w:left="6480" w:hanging="360"/>
+      </w:pPr>
+      <w:rPr>
+        <w:rFonts w:ascii="Wingdings" w:hAnsi="Wingdings" w:hint="default"/>
+        <w:sz w:val="20"/>
+      </w:rPr>
+    </w:lvl>
+  </w:abstractNum>
+  <w:abstractNum w:abstractNumId="107" w15:restartNumberingAfterBreak="0">
     <w:nsid w:val="68B94344"/>
     <w:multiLevelType w:val="multilevel"/>
     <w:tmpl w:val="9BA812D8"/>
@@ -15694,7 +16881,7 @@
       </w:rPr>
     </w:lvl>
   </w:abstractNum>
-  <w:abstractNum w:abstractNumId="104" w15:restartNumberingAfterBreak="0">
+  <w:abstractNum w:abstractNumId="108" w15:restartNumberingAfterBreak="0">
     <w:nsid w:val="69DE2C87"/>
     <w:multiLevelType w:val="hybridMultilevel"/>
     <w:tmpl w:val="F530F20A"/>
@@ -15807,7 +16994,7 @@
       </w:rPr>
     </w:lvl>
   </w:abstractNum>
-  <w:abstractNum w:abstractNumId="105" w15:restartNumberingAfterBreak="0">
+  <w:abstractNum w:abstractNumId="109" w15:restartNumberingAfterBreak="0">
     <w:nsid w:val="69ED672D"/>
     <w:multiLevelType w:val="multilevel"/>
     <w:tmpl w:val="CC08E300"/>
@@ -15956,7 +17143,7 @@
       </w:rPr>
     </w:lvl>
   </w:abstractNum>
-  <w:abstractNum w:abstractNumId="106" w15:restartNumberingAfterBreak="0">
+  <w:abstractNum w:abstractNumId="110" w15:restartNumberingAfterBreak="0">
     <w:nsid w:val="6A063EFD"/>
     <w:multiLevelType w:val="hybridMultilevel"/>
     <w:tmpl w:val="48703FBA"/>
@@ -16069,7 +17256,7 @@
       </w:rPr>
     </w:lvl>
   </w:abstractNum>
-  <w:abstractNum w:abstractNumId="107" w15:restartNumberingAfterBreak="0">
+  <w:abstractNum w:abstractNumId="111" w15:restartNumberingAfterBreak="0">
     <w:nsid w:val="6A825ABE"/>
     <w:multiLevelType w:val="multilevel"/>
     <w:tmpl w:val="0CD6F30E"/>
@@ -16218,7 +17405,7 @@
       </w:rPr>
     </w:lvl>
   </w:abstractNum>
-  <w:abstractNum w:abstractNumId="108" w15:restartNumberingAfterBreak="0">
+  <w:abstractNum w:abstractNumId="112" w15:restartNumberingAfterBreak="0">
     <w:nsid w:val="6B1D7832"/>
     <w:multiLevelType w:val="multilevel"/>
     <w:tmpl w:val="DD4646B2"/>
@@ -16367,7 +17554,7 @@
       </w:rPr>
     </w:lvl>
   </w:abstractNum>
-  <w:abstractNum w:abstractNumId="109" w15:restartNumberingAfterBreak="0">
+  <w:abstractNum w:abstractNumId="113" w15:restartNumberingAfterBreak="0">
     <w:nsid w:val="6C6D6667"/>
     <w:multiLevelType w:val="hybridMultilevel"/>
     <w:tmpl w:val="A744709C"/>
@@ -16480,7 +17667,7 @@
       </w:rPr>
     </w:lvl>
   </w:abstractNum>
-  <w:abstractNum w:abstractNumId="110" w15:restartNumberingAfterBreak="0">
+  <w:abstractNum w:abstractNumId="114" w15:restartNumberingAfterBreak="0">
     <w:nsid w:val="6CAD7EA5"/>
     <w:multiLevelType w:val="multilevel"/>
     <w:tmpl w:val="C472C5B0"/>
@@ -16629,7 +17816,7 @@
       </w:rPr>
     </w:lvl>
   </w:abstractNum>
-  <w:abstractNum w:abstractNumId="111" w15:restartNumberingAfterBreak="0">
+  <w:abstractNum w:abstractNumId="115" w15:restartNumberingAfterBreak="0">
     <w:nsid w:val="6E43557B"/>
     <w:multiLevelType w:val="multilevel"/>
     <w:tmpl w:val="323C7112"/>
@@ -16778,7 +17965,7 @@
       </w:rPr>
     </w:lvl>
   </w:abstractNum>
-  <w:abstractNum w:abstractNumId="112" w15:restartNumberingAfterBreak="0">
+  <w:abstractNum w:abstractNumId="116" w15:restartNumberingAfterBreak="0">
     <w:nsid w:val="6EA27D0A"/>
     <w:multiLevelType w:val="multilevel"/>
     <w:tmpl w:val="7BF0256C"/>
@@ -16927,7 +18114,7 @@
       </w:rPr>
     </w:lvl>
   </w:abstractNum>
-  <w:abstractNum w:abstractNumId="113" w15:restartNumberingAfterBreak="0">
+  <w:abstractNum w:abstractNumId="117" w15:restartNumberingAfterBreak="0">
     <w:nsid w:val="6EF86273"/>
     <w:multiLevelType w:val="multilevel"/>
     <w:tmpl w:val="2AA67CDA"/>
@@ -17076,7 +18263,7 @@
       </w:rPr>
     </w:lvl>
   </w:abstractNum>
-  <w:abstractNum w:abstractNumId="114" w15:restartNumberingAfterBreak="0">
+  <w:abstractNum w:abstractNumId="118" w15:restartNumberingAfterBreak="0">
     <w:nsid w:val="70874300"/>
     <w:multiLevelType w:val="hybridMultilevel"/>
     <w:tmpl w:val="1B3A0518"/>
@@ -17189,7 +18376,7 @@
       </w:rPr>
     </w:lvl>
   </w:abstractNum>
-  <w:abstractNum w:abstractNumId="115" w15:restartNumberingAfterBreak="0">
+  <w:abstractNum w:abstractNumId="119" w15:restartNumberingAfterBreak="0">
     <w:nsid w:val="7090251B"/>
     <w:multiLevelType w:val="hybridMultilevel"/>
     <w:tmpl w:val="67687EFE"/>
@@ -17302,7 +18489,7 @@
       </w:rPr>
     </w:lvl>
   </w:abstractNum>
-  <w:abstractNum w:abstractNumId="116" w15:restartNumberingAfterBreak="0">
+  <w:abstractNum w:abstractNumId="120" w15:restartNumberingAfterBreak="0">
     <w:nsid w:val="72031F81"/>
     <w:multiLevelType w:val="multilevel"/>
     <w:tmpl w:val="84400090"/>
@@ -17451,7 +18638,7 @@
       </w:rPr>
     </w:lvl>
   </w:abstractNum>
-  <w:abstractNum w:abstractNumId="117" w15:restartNumberingAfterBreak="0">
+  <w:abstractNum w:abstractNumId="121" w15:restartNumberingAfterBreak="0">
     <w:nsid w:val="722301E0"/>
     <w:multiLevelType w:val="multilevel"/>
     <w:tmpl w:val="1EE82E5A"/>
@@ -17600,7 +18787,7 @@
       </w:rPr>
     </w:lvl>
   </w:abstractNum>
-  <w:abstractNum w:abstractNumId="118" w15:restartNumberingAfterBreak="0">
+  <w:abstractNum w:abstractNumId="122" w15:restartNumberingAfterBreak="0">
     <w:nsid w:val="75144C65"/>
     <w:multiLevelType w:val="hybridMultilevel"/>
     <w:tmpl w:val="12127FAA"/>
@@ -17713,7 +18900,7 @@
       </w:rPr>
     </w:lvl>
   </w:abstractNum>
-  <w:abstractNum w:abstractNumId="119" w15:restartNumberingAfterBreak="0">
+  <w:abstractNum w:abstractNumId="123" w15:restartNumberingAfterBreak="0">
     <w:nsid w:val="75237F84"/>
     <w:multiLevelType w:val="hybridMultilevel"/>
     <w:tmpl w:val="5F0A6EF2"/>
@@ -17826,7 +19013,7 @@
       </w:rPr>
     </w:lvl>
   </w:abstractNum>
-  <w:abstractNum w:abstractNumId="120" w15:restartNumberingAfterBreak="0">
+  <w:abstractNum w:abstractNumId="124" w15:restartNumberingAfterBreak="0">
     <w:nsid w:val="758968F2"/>
     <w:multiLevelType w:val="multilevel"/>
     <w:tmpl w:val="D4241C4A"/>
@@ -17975,7 +19162,7 @@
       </w:rPr>
     </w:lvl>
   </w:abstractNum>
-  <w:abstractNum w:abstractNumId="121" w15:restartNumberingAfterBreak="0">
+  <w:abstractNum w:abstractNumId="125" w15:restartNumberingAfterBreak="0">
     <w:nsid w:val="75FF09B0"/>
     <w:multiLevelType w:val="multilevel"/>
     <w:tmpl w:val="C34A7734"/>
@@ -18124,7 +19311,7 @@
       </w:rPr>
     </w:lvl>
   </w:abstractNum>
-  <w:abstractNum w:abstractNumId="122" w15:restartNumberingAfterBreak="0">
+  <w:abstractNum w:abstractNumId="126" w15:restartNumberingAfterBreak="0">
     <w:nsid w:val="76864E3D"/>
     <w:multiLevelType w:val="hybridMultilevel"/>
     <w:tmpl w:val="9000C896"/>
@@ -18237,7 +19424,156 @@
       </w:rPr>
     </w:lvl>
   </w:abstractNum>
-  <w:abstractNum w:abstractNumId="123" w15:restartNumberingAfterBreak="0">
+  <w:abstractNum w:abstractNumId="127" w15:restartNumberingAfterBreak="0">
+    <w:nsid w:val="777E68D9"/>
+    <w:multiLevelType w:val="multilevel"/>
+    <w:tmpl w:val="3F503B98"/>
+    <w:lvl w:ilvl="0">
+      <w:start w:val="1"/>
+      <w:numFmt w:val="bullet"/>
+      <w:lvlText w:val=""/>
+      <w:lvlJc w:val="left"/>
+      <w:pPr>
+        <w:tabs>
+          <w:tab w:val="num" w:pos="720"/>
+        </w:tabs>
+        <w:ind w:left="720" w:hanging="360"/>
+      </w:pPr>
+      <w:rPr>
+        <w:rFonts w:ascii="Symbol" w:hAnsi="Symbol" w:hint="default"/>
+        <w:sz w:val="20"/>
+      </w:rPr>
+    </w:lvl>
+    <w:lvl w:ilvl="1" w:tentative="1">
+      <w:start w:val="1"/>
+      <w:numFmt w:val="bullet"/>
+      <w:lvlText w:val="o"/>
+      <w:lvlJc w:val="left"/>
+      <w:pPr>
+        <w:tabs>
+          <w:tab w:val="num" w:pos="1440"/>
+        </w:tabs>
+        <w:ind w:left="1440" w:hanging="360"/>
+      </w:pPr>
+      <w:rPr>
+        <w:rFonts w:ascii="Courier New" w:hAnsi="Courier New" w:hint="default"/>
+        <w:sz w:val="20"/>
+      </w:rPr>
+    </w:lvl>
+    <w:lvl w:ilvl="2" w:tentative="1">
+      <w:start w:val="1"/>
+      <w:numFmt w:val="bullet"/>
+      <w:lvlText w:val=""/>
+      <w:lvlJc w:val="left"/>
+      <w:pPr>
+        <w:tabs>
+          <w:tab w:val="num" w:pos="2160"/>
+        </w:tabs>
+        <w:ind w:left="2160" w:hanging="360"/>
+      </w:pPr>
+      <w:rPr>
+        <w:rFonts w:ascii="Wingdings" w:hAnsi="Wingdings" w:hint="default"/>
+        <w:sz w:val="20"/>
+      </w:rPr>
+    </w:lvl>
+    <w:lvl w:ilvl="3" w:tentative="1">
+      <w:start w:val="1"/>
+      <w:numFmt w:val="bullet"/>
+      <w:lvlText w:val=""/>
+      <w:lvlJc w:val="left"/>
+      <w:pPr>
+        <w:tabs>
+          <w:tab w:val="num" w:pos="2880"/>
+        </w:tabs>
+        <w:ind w:left="2880" w:hanging="360"/>
+      </w:pPr>
+      <w:rPr>
+        <w:rFonts w:ascii="Wingdings" w:hAnsi="Wingdings" w:hint="default"/>
+        <w:sz w:val="20"/>
+      </w:rPr>
+    </w:lvl>
+    <w:lvl w:ilvl="4" w:tentative="1">
+      <w:start w:val="1"/>
+      <w:numFmt w:val="bullet"/>
+      <w:lvlText w:val=""/>
+      <w:lvlJc w:val="left"/>
+      <w:pPr>
+        <w:tabs>
+          <w:tab w:val="num" w:pos="3600"/>
+        </w:tabs>
+        <w:ind w:left="3600" w:hanging="360"/>
+      </w:pPr>
+      <w:rPr>
+        <w:rFonts w:ascii="Wingdings" w:hAnsi="Wingdings" w:hint="default"/>
+        <w:sz w:val="20"/>
+      </w:rPr>
+    </w:lvl>
+    <w:lvl w:ilvl="5" w:tentative="1">
+      <w:start w:val="1"/>
+      <w:numFmt w:val="bullet"/>
+      <w:lvlText w:val=""/>
+      <w:lvlJc w:val="left"/>
+      <w:pPr>
+        <w:tabs>
+          <w:tab w:val="num" w:pos="4320"/>
+        </w:tabs>
+        <w:ind w:left="4320" w:hanging="360"/>
+      </w:pPr>
+      <w:rPr>
+        <w:rFonts w:ascii="Wingdings" w:hAnsi="Wingdings" w:hint="default"/>
+        <w:sz w:val="20"/>
+      </w:rPr>
+    </w:lvl>
+    <w:lvl w:ilvl="6" w:tentative="1">
+      <w:start w:val="1"/>
+      <w:numFmt w:val="bullet"/>
+      <w:lvlText w:val=""/>
+      <w:lvlJc w:val="left"/>
+      <w:pPr>
+        <w:tabs>
+          <w:tab w:val="num" w:pos="5040"/>
+        </w:tabs>
+        <w:ind w:left="5040" w:hanging="360"/>
+      </w:pPr>
+      <w:rPr>
+        <w:rFonts w:ascii="Wingdings" w:hAnsi="Wingdings" w:hint="default"/>
+        <w:sz w:val="20"/>
+      </w:rPr>
+    </w:lvl>
+    <w:lvl w:ilvl="7" w:tentative="1">
+      <w:start w:val="1"/>
+      <w:numFmt w:val="bullet"/>
+      <w:lvlText w:val=""/>
+      <w:lvlJc w:val="left"/>
+      <w:pPr>
+        <w:tabs>
+          <w:tab w:val="num" w:pos="5760"/>
+        </w:tabs>
+        <w:ind w:left="5760" w:hanging="360"/>
+      </w:pPr>
+      <w:rPr>
+        <w:rFonts w:ascii="Wingdings" w:hAnsi="Wingdings" w:hint="default"/>
+        <w:sz w:val="20"/>
+      </w:rPr>
+    </w:lvl>
+    <w:lvl w:ilvl="8" w:tentative="1">
+      <w:start w:val="1"/>
+      <w:numFmt w:val="bullet"/>
+      <w:lvlText w:val=""/>
+      <w:lvlJc w:val="left"/>
+      <w:pPr>
+        <w:tabs>
+          <w:tab w:val="num" w:pos="6480"/>
+        </w:tabs>
+        <w:ind w:left="6480" w:hanging="360"/>
+      </w:pPr>
+      <w:rPr>
+        <w:rFonts w:ascii="Wingdings" w:hAnsi="Wingdings" w:hint="default"/>
+        <w:sz w:val="20"/>
+      </w:rPr>
+    </w:lvl>
+  </w:abstractNum>
+  <w:abstractNum w:abstractNumId="128" w15:restartNumberingAfterBreak="0">
     <w:nsid w:val="77960362"/>
     <w:multiLevelType w:val="multilevel"/>
     <w:tmpl w:val="FEA0022E"/>
@@ -18386,7 +19722,7 @@
       </w:rPr>
     </w:lvl>
   </w:abstractNum>
-  <w:abstractNum w:abstractNumId="124" w15:restartNumberingAfterBreak="0">
+  <w:abstractNum w:abstractNumId="129" w15:restartNumberingAfterBreak="0">
     <w:nsid w:val="78547E35"/>
     <w:multiLevelType w:val="multilevel"/>
     <w:tmpl w:val="FC1421DE"/>
@@ -18535,7 +19871,7 @@
       </w:rPr>
     </w:lvl>
   </w:abstractNum>
-  <w:abstractNum w:abstractNumId="125" w15:restartNumberingAfterBreak="0">
+  <w:abstractNum w:abstractNumId="130" w15:restartNumberingAfterBreak="0">
     <w:nsid w:val="785A644F"/>
     <w:multiLevelType w:val="multilevel"/>
     <w:tmpl w:val="D1DC60FE"/>
@@ -18684,7 +20020,7 @@
       </w:rPr>
     </w:lvl>
   </w:abstractNum>
-  <w:abstractNum w:abstractNumId="126" w15:restartNumberingAfterBreak="0">
+  <w:abstractNum w:abstractNumId="131" w15:restartNumberingAfterBreak="0">
     <w:nsid w:val="78B62297"/>
     <w:multiLevelType w:val="multilevel"/>
     <w:tmpl w:val="2AA67CDA"/>
@@ -18833,7 +20169,7 @@
       </w:rPr>
     </w:lvl>
   </w:abstractNum>
-  <w:abstractNum w:abstractNumId="127" w15:restartNumberingAfterBreak="0">
+  <w:abstractNum w:abstractNumId="132" w15:restartNumberingAfterBreak="0">
     <w:nsid w:val="7BFA03DF"/>
     <w:multiLevelType w:val="hybridMultilevel"/>
     <w:tmpl w:val="536A979E"/>
@@ -18946,7 +20282,7 @@
       </w:rPr>
     </w:lvl>
   </w:abstractNum>
-  <w:abstractNum w:abstractNumId="128" w15:restartNumberingAfterBreak="0">
+  <w:abstractNum w:abstractNumId="133" w15:restartNumberingAfterBreak="0">
     <w:nsid w:val="7CA524B4"/>
     <w:multiLevelType w:val="hybridMultilevel"/>
     <w:tmpl w:val="957C4F4A"/>
@@ -19059,7 +20395,7 @@
       </w:rPr>
     </w:lvl>
   </w:abstractNum>
-  <w:abstractNum w:abstractNumId="129" w15:restartNumberingAfterBreak="0">
+  <w:abstractNum w:abstractNumId="134" w15:restartNumberingAfterBreak="0">
     <w:nsid w:val="7E1C597E"/>
     <w:multiLevelType w:val="multilevel"/>
     <w:tmpl w:val="2AA67CDA"/>
@@ -19208,7 +20544,7 @@
       </w:rPr>
     </w:lvl>
   </w:abstractNum>
-  <w:abstractNum w:abstractNumId="130" w15:restartNumberingAfterBreak="0">
+  <w:abstractNum w:abstractNumId="135" w15:restartNumberingAfterBreak="0">
     <w:nsid w:val="7EBD7710"/>
     <w:multiLevelType w:val="hybridMultilevel"/>
     <w:tmpl w:val="C8C6F7A0"/>
@@ -19321,7 +20657,7 @@
       </w:rPr>
     </w:lvl>
   </w:abstractNum>
-  <w:abstractNum w:abstractNumId="131" w15:restartNumberingAfterBreak="0">
+  <w:abstractNum w:abstractNumId="136" w15:restartNumberingAfterBreak="0">
     <w:nsid w:val="7F233031"/>
     <w:multiLevelType w:val="hybridMultilevel"/>
     <w:tmpl w:val="0D22564E"/>
@@ -19434,7 +20770,7 @@
       </w:rPr>
     </w:lvl>
   </w:abstractNum>
-  <w:abstractNum w:abstractNumId="132" w15:restartNumberingAfterBreak="0">
+  <w:abstractNum w:abstractNumId="137" w15:restartNumberingAfterBreak="0">
     <w:nsid w:val="7F426DF2"/>
     <w:multiLevelType w:val="multilevel"/>
     <w:tmpl w:val="430EFE5E"/>
@@ -19584,106 +20920,106 @@
     </w:lvl>
   </w:abstractNum>
   <w:num w:numId="1" w16cid:durableId="425157302">
-    <w:abstractNumId w:val="50"/>
+    <w:abstractNumId w:val="53"/>
   </w:num>
   <w:num w:numId="2" w16cid:durableId="967664612">
-    <w:abstractNumId w:val="97"/>
+    <w:abstractNumId w:val="100"/>
   </w:num>
   <w:num w:numId="3" w16cid:durableId="361631616">
-    <w:abstractNumId w:val="69"/>
+    <w:abstractNumId w:val="72"/>
   </w:num>
   <w:num w:numId="4" w16cid:durableId="1409575397">
-    <w:abstractNumId w:val="82"/>
+    <w:abstractNumId w:val="85"/>
   </w:num>
   <w:num w:numId="5" w16cid:durableId="1647204897">
-    <w:abstractNumId w:val="128"/>
+    <w:abstractNumId w:val="133"/>
   </w:num>
   <w:num w:numId="6" w16cid:durableId="682589869">
-    <w:abstractNumId w:val="24"/>
+    <w:abstractNumId w:val="25"/>
   </w:num>
   <w:num w:numId="7" w16cid:durableId="679703478">
-    <w:abstractNumId w:val="104"/>
+    <w:abstractNumId w:val="108"/>
   </w:num>
   <w:num w:numId="8" w16cid:durableId="496455128">
-    <w:abstractNumId w:val="44"/>
+    <w:abstractNumId w:val="47"/>
   </w:num>
   <w:num w:numId="9" w16cid:durableId="1184633094">
-    <w:abstractNumId w:val="61"/>
+    <w:abstractNumId w:val="64"/>
   </w:num>
   <w:num w:numId="10" w16cid:durableId="71507387">
-    <w:abstractNumId w:val="67"/>
+    <w:abstractNumId w:val="70"/>
   </w:num>
   <w:num w:numId="11" w16cid:durableId="1412503779">
-    <w:abstractNumId w:val="106"/>
+    <w:abstractNumId w:val="110"/>
   </w:num>
   <w:num w:numId="12" w16cid:durableId="1107113995">
-    <w:abstractNumId w:val="45"/>
+    <w:abstractNumId w:val="48"/>
   </w:num>
   <w:num w:numId="13" w16cid:durableId="2011055922">
-    <w:abstractNumId w:val="25"/>
+    <w:abstractNumId w:val="26"/>
   </w:num>
   <w:num w:numId="14" w16cid:durableId="1529222885">
-    <w:abstractNumId w:val="127"/>
+    <w:abstractNumId w:val="132"/>
   </w:num>
   <w:num w:numId="15" w16cid:durableId="836580755">
     <w:abstractNumId w:val="18"/>
   </w:num>
   <w:num w:numId="16" w16cid:durableId="1344674502">
-    <w:abstractNumId w:val="86"/>
+    <w:abstractNumId w:val="89"/>
   </w:num>
   <w:num w:numId="17" w16cid:durableId="1320882603">
-    <w:abstractNumId w:val="114"/>
+    <w:abstractNumId w:val="118"/>
   </w:num>
   <w:num w:numId="18" w16cid:durableId="1139028372">
-    <w:abstractNumId w:val="46"/>
+    <w:abstractNumId w:val="49"/>
   </w:num>
   <w:num w:numId="19" w16cid:durableId="1525635473">
-    <w:abstractNumId w:val="95"/>
+    <w:abstractNumId w:val="98"/>
   </w:num>
   <w:num w:numId="20" w16cid:durableId="609623515">
-    <w:abstractNumId w:val="130"/>
+    <w:abstractNumId w:val="135"/>
   </w:num>
   <w:num w:numId="21" w16cid:durableId="165170997">
-    <w:abstractNumId w:val="109"/>
+    <w:abstractNumId w:val="113"/>
   </w:num>
   <w:num w:numId="22" w16cid:durableId="1620525290">
-    <w:abstractNumId w:val="31"/>
+    <w:abstractNumId w:val="33"/>
   </w:num>
   <w:num w:numId="23" w16cid:durableId="400753109">
-    <w:abstractNumId w:val="118"/>
+    <w:abstractNumId w:val="122"/>
   </w:num>
   <w:num w:numId="24" w16cid:durableId="193882219">
     <w:abstractNumId w:val="6"/>
   </w:num>
   <w:num w:numId="25" w16cid:durableId="311981628">
-    <w:abstractNumId w:val="52"/>
+    <w:abstractNumId w:val="55"/>
   </w:num>
   <w:num w:numId="26" w16cid:durableId="2009166045">
     <w:abstractNumId w:val="17"/>
   </w:num>
   <w:num w:numId="27" w16cid:durableId="2135174697">
-    <w:abstractNumId w:val="23"/>
+    <w:abstractNumId w:val="24"/>
   </w:num>
   <w:num w:numId="28" w16cid:durableId="353504740">
     <w:abstractNumId w:val="19"/>
   </w:num>
   <w:num w:numId="29" w16cid:durableId="2124693280">
-    <w:abstractNumId w:val="99"/>
+    <w:abstractNumId w:val="102"/>
   </w:num>
   <w:num w:numId="30" w16cid:durableId="1367099744">
-    <w:abstractNumId w:val="36"/>
+    <w:abstractNumId w:val="38"/>
   </w:num>
   <w:num w:numId="31" w16cid:durableId="2011105642">
-    <w:abstractNumId w:val="87"/>
+    <w:abstractNumId w:val="90"/>
   </w:num>
   <w:num w:numId="32" w16cid:durableId="831995364">
-    <w:abstractNumId w:val="28"/>
+    <w:abstractNumId w:val="29"/>
   </w:num>
   <w:num w:numId="33" w16cid:durableId="851073403">
     <w:abstractNumId w:val="5"/>
   </w:num>
   <w:num w:numId="34" w16cid:durableId="1183666391">
-    <w:abstractNumId w:val="27"/>
+    <w:abstractNumId w:val="28"/>
   </w:num>
   <w:num w:numId="35" w16cid:durableId="697268929">
     <w:abstractNumId w:val="2"/>
@@ -19692,7 +21028,7 @@
     <w:abstractNumId w:val="3"/>
   </w:num>
   <w:num w:numId="37" w16cid:durableId="1849755457">
-    <w:abstractNumId w:val="119"/>
+    <w:abstractNumId w:val="123"/>
   </w:num>
   <w:num w:numId="38" w16cid:durableId="516505904">
     <w:abstractNumId w:val="16"/>
@@ -19701,85 +21037,85 @@
     <w:abstractNumId w:val="20"/>
   </w:num>
   <w:num w:numId="40" w16cid:durableId="905338697">
-    <w:abstractNumId w:val="71"/>
+    <w:abstractNumId w:val="74"/>
   </w:num>
   <w:num w:numId="41" w16cid:durableId="501896635">
-    <w:abstractNumId w:val="48"/>
+    <w:abstractNumId w:val="51"/>
   </w:num>
   <w:num w:numId="42" w16cid:durableId="1953435156">
-    <w:abstractNumId w:val="72"/>
+    <w:abstractNumId w:val="75"/>
   </w:num>
   <w:num w:numId="43" w16cid:durableId="1060447452">
-    <w:abstractNumId w:val="84"/>
+    <w:abstractNumId w:val="87"/>
   </w:num>
   <w:num w:numId="44" w16cid:durableId="1772503672">
-    <w:abstractNumId w:val="64"/>
+    <w:abstractNumId w:val="67"/>
   </w:num>
   <w:num w:numId="45" w16cid:durableId="1650330222">
-    <w:abstractNumId w:val="70"/>
+    <w:abstractNumId w:val="73"/>
   </w:num>
   <w:num w:numId="46" w16cid:durableId="2102337934">
-    <w:abstractNumId w:val="30"/>
+    <w:abstractNumId w:val="32"/>
   </w:num>
   <w:num w:numId="47" w16cid:durableId="68767822">
-    <w:abstractNumId w:val="107"/>
+    <w:abstractNumId w:val="111"/>
   </w:num>
   <w:num w:numId="48" w16cid:durableId="1992058265">
     <w:abstractNumId w:val="7"/>
   </w:num>
   <w:num w:numId="49" w16cid:durableId="788475134">
+    <w:abstractNumId w:val="130"/>
+  </w:num>
+  <w:num w:numId="50" w16cid:durableId="224419455">
+    <w:abstractNumId w:val="116"/>
+  </w:num>
+  <w:num w:numId="51" w16cid:durableId="1699575947">
+    <w:abstractNumId w:val="97"/>
+  </w:num>
+  <w:num w:numId="52" w16cid:durableId="1048916239">
+    <w:abstractNumId w:val="59"/>
+  </w:num>
+  <w:num w:numId="53" w16cid:durableId="1188711211">
     <w:abstractNumId w:val="125"/>
   </w:num>
-  <w:num w:numId="50" w16cid:durableId="224419455">
-    <w:abstractNumId w:val="112"/>
+  <w:num w:numId="54" w16cid:durableId="447555614">
+    <w:abstractNumId w:val="99"/>
   </w:num>
-  <w:num w:numId="51" w16cid:durableId="1699575947">
-    <w:abstractNumId w:val="94"/>
-  </w:num>
-  <w:num w:numId="52" w16cid:durableId="1048916239">
+  <w:num w:numId="55" w16cid:durableId="1679307268">
     <w:abstractNumId w:val="56"/>
   </w:num>
-  <w:num w:numId="53" w16cid:durableId="1188711211">
-    <w:abstractNumId w:val="121"/>
-  </w:num>
-  <w:num w:numId="54" w16cid:durableId="447555614">
-    <w:abstractNumId w:val="96"/>
-  </w:num>
-  <w:num w:numId="55" w16cid:durableId="1679307268">
-    <w:abstractNumId w:val="53"/>
-  </w:num>
   <w:num w:numId="56" w16cid:durableId="693773591">
-    <w:abstractNumId w:val="111"/>
+    <w:abstractNumId w:val="115"/>
   </w:num>
   <w:num w:numId="57" w16cid:durableId="1110473324">
-    <w:abstractNumId w:val="38"/>
+    <w:abstractNumId w:val="40"/>
   </w:num>
   <w:num w:numId="58" w16cid:durableId="842937968">
+    <w:abstractNumId w:val="71"/>
+  </w:num>
+  <w:num w:numId="59" w16cid:durableId="821121315">
+    <w:abstractNumId w:val="46"/>
+  </w:num>
+  <w:num w:numId="60" w16cid:durableId="2095394549">
+    <w:abstractNumId w:val="128"/>
+  </w:num>
+  <w:num w:numId="61" w16cid:durableId="1299921011">
+    <w:abstractNumId w:val="45"/>
+  </w:num>
+  <w:num w:numId="62" w16cid:durableId="1927420240">
+    <w:abstractNumId w:val="79"/>
+  </w:num>
+  <w:num w:numId="63" w16cid:durableId="41290043">
+    <w:abstractNumId w:val="84"/>
+  </w:num>
+  <w:num w:numId="64" w16cid:durableId="999846909">
     <w:abstractNumId w:val="68"/>
   </w:num>
-  <w:num w:numId="59" w16cid:durableId="821121315">
-    <w:abstractNumId w:val="43"/>
-  </w:num>
-  <w:num w:numId="60" w16cid:durableId="2095394549">
-    <w:abstractNumId w:val="123"/>
-  </w:num>
-  <w:num w:numId="61" w16cid:durableId="1299921011">
-    <w:abstractNumId w:val="42"/>
-  </w:num>
-  <w:num w:numId="62" w16cid:durableId="1927420240">
-    <w:abstractNumId w:val="76"/>
-  </w:num>
-  <w:num w:numId="63" w16cid:durableId="41290043">
-    <w:abstractNumId w:val="81"/>
-  </w:num>
-  <w:num w:numId="64" w16cid:durableId="999846909">
-    <w:abstractNumId w:val="65"/>
-  </w:num>
   <w:num w:numId="65" w16cid:durableId="1250969563">
-    <w:abstractNumId w:val="74"/>
+    <w:abstractNumId w:val="77"/>
   </w:num>
   <w:num w:numId="66" w16cid:durableId="484011382">
-    <w:abstractNumId w:val="105"/>
+    <w:abstractNumId w:val="109"/>
   </w:num>
   <w:num w:numId="67" w16cid:durableId="2008289242">
     <w:abstractNumId w:val="14"/>
@@ -19788,160 +21124,160 @@
     <w:abstractNumId w:val="21"/>
   </w:num>
   <w:num w:numId="69" w16cid:durableId="1296839887">
-    <w:abstractNumId w:val="80"/>
+    <w:abstractNumId w:val="83"/>
   </w:num>
   <w:num w:numId="70" w16cid:durableId="336662050">
-    <w:abstractNumId w:val="93"/>
+    <w:abstractNumId w:val="96"/>
   </w:num>
   <w:num w:numId="71" w16cid:durableId="1460032333">
-    <w:abstractNumId w:val="110"/>
+    <w:abstractNumId w:val="114"/>
   </w:num>
   <w:num w:numId="72" w16cid:durableId="592400615">
     <w:abstractNumId w:val="11"/>
   </w:num>
   <w:num w:numId="73" w16cid:durableId="1879049234">
+    <w:abstractNumId w:val="37"/>
+  </w:num>
+  <w:num w:numId="74" w16cid:durableId="1747679558">
+    <w:abstractNumId w:val="41"/>
+  </w:num>
+  <w:num w:numId="75" w16cid:durableId="55278029">
+    <w:abstractNumId w:val="34"/>
+  </w:num>
+  <w:num w:numId="76" w16cid:durableId="1032193382">
     <w:abstractNumId w:val="35"/>
   </w:num>
-  <w:num w:numId="74" w16cid:durableId="1747679558">
-    <w:abstractNumId w:val="39"/>
-  </w:num>
-  <w:num w:numId="75" w16cid:durableId="55278029">
-    <w:abstractNumId w:val="32"/>
-  </w:num>
-  <w:num w:numId="76" w16cid:durableId="1032193382">
-    <w:abstractNumId w:val="33"/>
-  </w:num>
   <w:num w:numId="77" w16cid:durableId="763109604">
-    <w:abstractNumId w:val="83"/>
+    <w:abstractNumId w:val="86"/>
   </w:num>
   <w:num w:numId="78" w16cid:durableId="2138137265">
-    <w:abstractNumId w:val="98"/>
+    <w:abstractNumId w:val="101"/>
   </w:num>
   <w:num w:numId="79" w16cid:durableId="343675924">
-    <w:abstractNumId w:val="115"/>
+    <w:abstractNumId w:val="119"/>
   </w:num>
   <w:num w:numId="80" w16cid:durableId="1823277442">
-    <w:abstractNumId w:val="41"/>
+    <w:abstractNumId w:val="44"/>
   </w:num>
   <w:num w:numId="81" w16cid:durableId="1686900155">
     <w:abstractNumId w:val="0"/>
   </w:num>
   <w:num w:numId="82" w16cid:durableId="1113326280">
-    <w:abstractNumId w:val="79"/>
+    <w:abstractNumId w:val="82"/>
   </w:num>
   <w:num w:numId="83" w16cid:durableId="1253051103">
-    <w:abstractNumId w:val="108"/>
+    <w:abstractNumId w:val="112"/>
   </w:num>
   <w:num w:numId="84" w16cid:durableId="444888444">
-    <w:abstractNumId w:val="49"/>
+    <w:abstractNumId w:val="52"/>
   </w:num>
   <w:num w:numId="85" w16cid:durableId="64299649">
-    <w:abstractNumId w:val="100"/>
+    <w:abstractNumId w:val="103"/>
   </w:num>
   <w:num w:numId="86" w16cid:durableId="868182992">
-    <w:abstractNumId w:val="63"/>
+    <w:abstractNumId w:val="66"/>
   </w:num>
   <w:num w:numId="87" w16cid:durableId="896863331">
-    <w:abstractNumId w:val="26"/>
+    <w:abstractNumId w:val="27"/>
   </w:num>
   <w:num w:numId="88" w16cid:durableId="505442826">
-    <w:abstractNumId w:val="103"/>
+    <w:abstractNumId w:val="107"/>
   </w:num>
   <w:num w:numId="89" w16cid:durableId="1858763908">
-    <w:abstractNumId w:val="37"/>
+    <w:abstractNumId w:val="39"/>
   </w:num>
   <w:num w:numId="90" w16cid:durableId="1896088176">
     <w:abstractNumId w:val="15"/>
   </w:num>
   <w:num w:numId="91" w16cid:durableId="1284576603">
-    <w:abstractNumId w:val="88"/>
+    <w:abstractNumId w:val="91"/>
   </w:num>
   <w:num w:numId="92" w16cid:durableId="1963075542">
     <w:abstractNumId w:val="10"/>
   </w:num>
   <w:num w:numId="93" w16cid:durableId="787627596">
-    <w:abstractNumId w:val="78"/>
+    <w:abstractNumId w:val="81"/>
   </w:num>
   <w:num w:numId="94" w16cid:durableId="2003925799">
     <w:abstractNumId w:val="13"/>
   </w:num>
   <w:num w:numId="95" w16cid:durableId="1169102579">
-    <w:abstractNumId w:val="91"/>
+    <w:abstractNumId w:val="94"/>
   </w:num>
   <w:num w:numId="96" w16cid:durableId="1216501564">
-    <w:abstractNumId w:val="34"/>
+    <w:abstractNumId w:val="36"/>
   </w:num>
   <w:num w:numId="97" w16cid:durableId="261768216">
-    <w:abstractNumId w:val="113"/>
+    <w:abstractNumId w:val="117"/>
   </w:num>
   <w:num w:numId="98" w16cid:durableId="2141918721">
-    <w:abstractNumId w:val="73"/>
+    <w:abstractNumId w:val="76"/>
   </w:num>
   <w:num w:numId="99" w16cid:durableId="905841544">
-    <w:abstractNumId w:val="40"/>
+    <w:abstractNumId w:val="42"/>
   </w:num>
   <w:num w:numId="100" w16cid:durableId="1753887223">
-    <w:abstractNumId w:val="89"/>
+    <w:abstractNumId w:val="92"/>
   </w:num>
   <w:num w:numId="101" w16cid:durableId="1320184766">
-    <w:abstractNumId w:val="29"/>
+    <w:abstractNumId w:val="31"/>
   </w:num>
   <w:num w:numId="102" w16cid:durableId="465127606">
-    <w:abstractNumId w:val="57"/>
+    <w:abstractNumId w:val="60"/>
   </w:num>
   <w:num w:numId="103" w16cid:durableId="1640451435">
-    <w:abstractNumId w:val="55"/>
+    <w:abstractNumId w:val="58"/>
   </w:num>
   <w:num w:numId="104" w16cid:durableId="942029608">
-    <w:abstractNumId w:val="51"/>
+    <w:abstractNumId w:val="54"/>
   </w:num>
   <w:num w:numId="105" w16cid:durableId="70857193">
-    <w:abstractNumId w:val="59"/>
+    <w:abstractNumId w:val="62"/>
   </w:num>
   <w:num w:numId="106" w16cid:durableId="1617908629">
-    <w:abstractNumId w:val="117"/>
+    <w:abstractNumId w:val="121"/>
   </w:num>
   <w:num w:numId="107" w16cid:durableId="970137111">
-    <w:abstractNumId w:val="129"/>
+    <w:abstractNumId w:val="134"/>
   </w:num>
   <w:num w:numId="108" w16cid:durableId="383797013">
-    <w:abstractNumId w:val="47"/>
+    <w:abstractNumId w:val="50"/>
   </w:num>
   <w:num w:numId="109" w16cid:durableId="1459567304">
-    <w:abstractNumId w:val="58"/>
+    <w:abstractNumId w:val="61"/>
   </w:num>
   <w:num w:numId="110" w16cid:durableId="862745862">
     <w:abstractNumId w:val="22"/>
   </w:num>
   <w:num w:numId="111" w16cid:durableId="1859536331">
-    <w:abstractNumId w:val="62"/>
+    <w:abstractNumId w:val="65"/>
   </w:num>
   <w:num w:numId="112" w16cid:durableId="2092697678">
-    <w:abstractNumId w:val="75"/>
+    <w:abstractNumId w:val="78"/>
   </w:num>
   <w:num w:numId="113" w16cid:durableId="1418403813">
-    <w:abstractNumId w:val="66"/>
+    <w:abstractNumId w:val="69"/>
   </w:num>
   <w:num w:numId="114" w16cid:durableId="1965042317">
-    <w:abstractNumId w:val="116"/>
+    <w:abstractNumId w:val="120"/>
   </w:num>
   <w:num w:numId="115" w16cid:durableId="670569040">
-    <w:abstractNumId w:val="54"/>
+    <w:abstractNumId w:val="57"/>
   </w:num>
   <w:num w:numId="116" w16cid:durableId="413823113">
-    <w:abstractNumId w:val="126"/>
+    <w:abstractNumId w:val="131"/>
   </w:num>
   <w:num w:numId="117" w16cid:durableId="1293747982">
-    <w:abstractNumId w:val="102"/>
+    <w:abstractNumId w:val="105"/>
   </w:num>
   <w:num w:numId="118" w16cid:durableId="2058698591">
-    <w:abstractNumId w:val="60"/>
+    <w:abstractNumId w:val="63"/>
   </w:num>
   <w:num w:numId="119" w16cid:durableId="892157361">
-    <w:abstractNumId w:val="77"/>
+    <w:abstractNumId w:val="80"/>
   </w:num>
   <w:num w:numId="120" w16cid:durableId="1449229938">
-    <w:abstractNumId w:val="120"/>
+    <w:abstractNumId w:val="124"/>
   </w:num>
   <w:num w:numId="121" w16cid:durableId="177283374">
     <w:abstractNumId w:val="8"/>
@@ -19950,37 +21286,52 @@
     <w:abstractNumId w:val="12"/>
   </w:num>
   <w:num w:numId="123" w16cid:durableId="1495337109">
-    <w:abstractNumId w:val="122"/>
+    <w:abstractNumId w:val="126"/>
   </w:num>
   <w:num w:numId="124" w16cid:durableId="302319311">
-    <w:abstractNumId w:val="85"/>
+    <w:abstractNumId w:val="88"/>
   </w:num>
   <w:num w:numId="125" w16cid:durableId="1891844186">
-    <w:abstractNumId w:val="101"/>
+    <w:abstractNumId w:val="104"/>
   </w:num>
   <w:num w:numId="126" w16cid:durableId="256911009">
     <w:abstractNumId w:val="1"/>
   </w:num>
   <w:num w:numId="127" w16cid:durableId="1001927776">
-    <w:abstractNumId w:val="131"/>
+    <w:abstractNumId w:val="136"/>
   </w:num>
   <w:num w:numId="128" w16cid:durableId="1365057616">
-    <w:abstractNumId w:val="90"/>
+    <w:abstractNumId w:val="93"/>
   </w:num>
   <w:num w:numId="129" w16cid:durableId="2142647602">
-    <w:abstractNumId w:val="92"/>
+    <w:abstractNumId w:val="95"/>
   </w:num>
   <w:num w:numId="130" w16cid:durableId="1895652277">
-    <w:abstractNumId w:val="132"/>
+    <w:abstractNumId w:val="137"/>
   </w:num>
   <w:num w:numId="131" w16cid:durableId="1132407586">
-    <w:abstractNumId w:val="124"/>
+    <w:abstractNumId w:val="129"/>
   </w:num>
   <w:num w:numId="132" w16cid:durableId="1209996408">
     <w:abstractNumId w:val="9"/>
   </w:num>
   <w:num w:numId="133" w16cid:durableId="1840802852">
     <w:abstractNumId w:val="4"/>
+  </w:num>
+  <w:num w:numId="134" w16cid:durableId="220867256">
+    <w:abstractNumId w:val="106"/>
+  </w:num>
+  <w:num w:numId="135" w16cid:durableId="2026857351">
+    <w:abstractNumId w:val="30"/>
+  </w:num>
+  <w:num w:numId="136" w16cid:durableId="1236696510">
+    <w:abstractNumId w:val="127"/>
+  </w:num>
+  <w:num w:numId="137" w16cid:durableId="1156385716">
+    <w:abstractNumId w:val="43"/>
+  </w:num>
+  <w:num w:numId="138" w16cid:durableId="1088235058">
+    <w:abstractNumId w:val="23"/>
   </w:num>
   <w:numIdMacAtCleanup w:val="45"/>
 </w:numbering>

</xml_diff>

<commit_message>
Fleet Management Workflow (#263)
</commit_message>
<xml_diff>
--- a/Activity Specification Document.docx
+++ b/Activity Specification Document.docx
@@ -2411,6 +2411,558 @@
     </w:p>
     <w:p>
       <w:pPr>
+        <w:pStyle w:val="Heading3"/>
+      </w:pPr>
+      <w:r>
+        <w:br w:type="page"/>
+      </w:r>
+      <w:r>
+        <w:lastRenderedPageBreak/>
+        <w:t xml:space="preserve">5- </w:t>
+      </w:r>
+      <w:r>
+        <w:t xml:space="preserve">Fleet Management Workflow Activity </w:t>
+      </w:r>
+    </w:p>
+    <w:p>
+      <w:pPr>
+        <w:rPr>
+          <w:b/>
+          <w:bCs/>
+        </w:rPr>
+      </w:pPr>
+      <w:r>
+        <w:rPr>
+          <w:b/>
+          <w:bCs/>
+        </w:rPr>
+        <w:t>Purpose</w:t>
+      </w:r>
+    </w:p>
+    <w:p>
+      <w:r>
+        <w:t>The Fleet Management Workflow Activity Diagram is the diagram that shows the order of activities in the process of vehicle fleet management in the KriGo application. The diagram represents the process that the rental agency or the administrator uses while performing fleet management tasks, such as adding new cars, editing data about the car, maintaining it, and deleting cars from the list. The diagram demonstrates the control flow and validation steps used to keep data correct and up to date</w:t>
+      </w:r>
+      <w:r>
+        <w:t>.</w:t>
+      </w:r>
+    </w:p>
+    <w:p>
+      <w:pPr>
+        <w:rPr>
+          <w:b/>
+          <w:bCs/>
+        </w:rPr>
+      </w:pPr>
+      <w:r>
+        <w:rPr>
+          <w:b/>
+          <w:bCs/>
+        </w:rPr>
+        <w:t>Workflow Description</w:t>
+      </w:r>
+    </w:p>
+    <w:p>
+      <w:r>
+        <w:t>The process starts by either logging into the fleet management module by the agency/ administration or the system administrator. The user chooses the appropriate operation that could include adding a new vehicle, changing information about vehicles already added, scheduling the maintenance activities for the vehicle or deactivating a vehicle.</w:t>
+      </w:r>
+    </w:p>
+    <w:p>
+      <w:r>
+        <w:t>Based on the chosen operation, the information about the vehicle or the maintenance activity is inputted or updated. Prior to saving any data, the system will validate the information provided to make sure that all necessary information is there and follows the rules of the business.</w:t>
+      </w:r>
+    </w:p>
+    <w:p>
+      <w:r>
+        <w:t>In case of failure to pass the validation process, the system will provide the validation errors and give the chance to fix the issue and repeat the process again. Once the validation passed successfully, the information will be saved.</w:t>
+      </w:r>
+    </w:p>
+    <w:p>
+      <w:pPr>
+        <w:rPr>
+          <w:b/>
+          <w:bCs/>
+        </w:rPr>
+      </w:pPr>
+      <w:r>
+        <w:rPr>
+          <w:b/>
+          <w:bCs/>
+        </w:rPr>
+        <w:t>Main Activities</w:t>
+      </w:r>
+    </w:p>
+    <w:p>
+      <w:r>
+        <w:t>The Fleet Management Workflow Activity Diagram includes the following primary activities:</w:t>
+      </w:r>
+    </w:p>
+    <w:p>
+      <w:pPr>
+        <w:pStyle w:val="ListParagraph"/>
+        <w:numPr>
+          <w:ilvl w:val="0"/>
+          <w:numId w:val="143"/>
+        </w:numPr>
+      </w:pPr>
+      <w:r>
+        <w:t>Access the Fleet Management module.</w:t>
+      </w:r>
+    </w:p>
+    <w:p>
+      <w:pPr>
+        <w:pStyle w:val="ListParagraph"/>
+        <w:numPr>
+          <w:ilvl w:val="0"/>
+          <w:numId w:val="143"/>
+        </w:numPr>
+      </w:pPr>
+      <w:r>
+        <w:t>Select a fleet management operation.</w:t>
+      </w:r>
+    </w:p>
+    <w:p>
+      <w:pPr>
+        <w:pStyle w:val="ListParagraph"/>
+        <w:numPr>
+          <w:ilvl w:val="0"/>
+          <w:numId w:val="143"/>
+        </w:numPr>
+      </w:pPr>
+      <w:r>
+        <w:t>Add a new vehicle.</w:t>
+      </w:r>
+    </w:p>
+    <w:p>
+      <w:pPr>
+        <w:pStyle w:val="ListParagraph"/>
+        <w:numPr>
+          <w:ilvl w:val="0"/>
+          <w:numId w:val="143"/>
+        </w:numPr>
+      </w:pPr>
+      <w:r>
+        <w:t>Update vehicle information.</w:t>
+      </w:r>
+    </w:p>
+    <w:p>
+      <w:pPr>
+        <w:pStyle w:val="ListParagraph"/>
+        <w:numPr>
+          <w:ilvl w:val="0"/>
+          <w:numId w:val="143"/>
+        </w:numPr>
+      </w:pPr>
+      <w:r>
+        <w:t>Schedule vehicle maintenance.</w:t>
+      </w:r>
+    </w:p>
+    <w:p>
+      <w:pPr>
+        <w:pStyle w:val="ListParagraph"/>
+        <w:numPr>
+          <w:ilvl w:val="0"/>
+          <w:numId w:val="143"/>
+        </w:numPr>
+      </w:pPr>
+      <w:r>
+        <w:t>Remove a vehicle from the fleet.</w:t>
+      </w:r>
+    </w:p>
+    <w:p>
+      <w:pPr>
+        <w:pStyle w:val="ListParagraph"/>
+        <w:numPr>
+          <w:ilvl w:val="0"/>
+          <w:numId w:val="143"/>
+        </w:numPr>
+      </w:pPr>
+      <w:r>
+        <w:t>Validate submitted information.</w:t>
+      </w:r>
+    </w:p>
+    <w:p>
+      <w:pPr>
+        <w:pStyle w:val="ListParagraph"/>
+        <w:numPr>
+          <w:ilvl w:val="0"/>
+          <w:numId w:val="143"/>
+        </w:numPr>
+      </w:pPr>
+      <w:r>
+        <w:t>Update fleet records.</w:t>
+      </w:r>
+    </w:p>
+    <w:p>
+      <w:pPr>
+        <w:pStyle w:val="ListParagraph"/>
+        <w:numPr>
+          <w:ilvl w:val="0"/>
+          <w:numId w:val="143"/>
+        </w:numPr>
+      </w:pPr>
+      <w:r>
+        <w:t>Save changes.</w:t>
+      </w:r>
+    </w:p>
+    <w:p>
+      <w:pPr>
+        <w:pStyle w:val="ListParagraph"/>
+        <w:numPr>
+          <w:ilvl w:val="0"/>
+          <w:numId w:val="143"/>
+        </w:numPr>
+      </w:pPr>
+      <w:r>
+        <w:t>Display a confirmation message.</w:t>
+      </w:r>
+    </w:p>
+    <w:p>
+      <w:pPr>
+        <w:rPr>
+          <w:b/>
+          <w:bCs/>
+        </w:rPr>
+      </w:pPr>
+      <w:r>
+        <w:rPr>
+          <w:b/>
+          <w:bCs/>
+        </w:rPr>
+        <w:t>Decision Points</w:t>
+      </w:r>
+    </w:p>
+    <w:p>
+      <w:r>
+        <w:t>The activity diagram contains two primary decision nodes:</w:t>
+      </w:r>
+    </w:p>
+    <w:p>
+      <w:pPr>
+        <w:numPr>
+          <w:ilvl w:val="0"/>
+          <w:numId w:val="140"/>
+        </w:numPr>
+        <w:spacing w:after="0"/>
+      </w:pPr>
+      <w:r>
+        <w:rPr>
+          <w:b/>
+          <w:bCs/>
+        </w:rPr>
+        <w:t>Operation Type?</w:t>
+      </w:r>
+    </w:p>
+    <w:p>
+      <w:pPr>
+        <w:pStyle w:val="ListParagraph"/>
+        <w:numPr>
+          <w:ilvl w:val="0"/>
+          <w:numId w:val="144"/>
+        </w:numPr>
+      </w:pPr>
+      <w:r>
+        <w:t>Add Vehicle.</w:t>
+      </w:r>
+    </w:p>
+    <w:p>
+      <w:pPr>
+        <w:pStyle w:val="ListParagraph"/>
+        <w:numPr>
+          <w:ilvl w:val="0"/>
+          <w:numId w:val="144"/>
+        </w:numPr>
+      </w:pPr>
+      <w:r>
+        <w:t>Update Vehicle Information.</w:t>
+      </w:r>
+    </w:p>
+    <w:p>
+      <w:pPr>
+        <w:pStyle w:val="ListParagraph"/>
+        <w:numPr>
+          <w:ilvl w:val="0"/>
+          <w:numId w:val="144"/>
+        </w:numPr>
+      </w:pPr>
+      <w:r>
+        <w:t>Schedule Maintenance.</w:t>
+      </w:r>
+    </w:p>
+    <w:p>
+      <w:pPr>
+        <w:pStyle w:val="ListParagraph"/>
+        <w:numPr>
+          <w:ilvl w:val="0"/>
+          <w:numId w:val="144"/>
+        </w:numPr>
+      </w:pPr>
+      <w:r>
+        <w:t>Remove Vehicle.</w:t>
+      </w:r>
+    </w:p>
+    <w:p>
+      <w:pPr>
+        <w:numPr>
+          <w:ilvl w:val="0"/>
+          <w:numId w:val="140"/>
+        </w:numPr>
+        <w:spacing w:after="0"/>
+      </w:pPr>
+      <w:r>
+        <w:rPr>
+          <w:b/>
+          <w:bCs/>
+        </w:rPr>
+        <w:t>Information Valid?</w:t>
+      </w:r>
+    </w:p>
+    <w:p>
+      <w:pPr>
+        <w:numPr>
+          <w:ilvl w:val="1"/>
+          <w:numId w:val="140"/>
+        </w:numPr>
+        <w:spacing w:after="0"/>
+      </w:pPr>
+      <w:r>
+        <w:t xml:space="preserve">If </w:t>
+      </w:r>
+      <w:r>
+        <w:rPr>
+          <w:b/>
+          <w:bCs/>
+        </w:rPr>
+        <w:t>Yes</w:t>
+      </w:r>
+      <w:r>
+        <w:t>, the system updates the fleet records and saves the changes.</w:t>
+      </w:r>
+    </w:p>
+    <w:p>
+      <w:pPr>
+        <w:numPr>
+          <w:ilvl w:val="1"/>
+          <w:numId w:val="140"/>
+        </w:numPr>
+      </w:pPr>
+      <w:r>
+        <w:t xml:space="preserve">If </w:t>
+      </w:r>
+      <w:r>
+        <w:rPr>
+          <w:b/>
+          <w:bCs/>
+        </w:rPr>
+        <w:t>No</w:t>
+      </w:r>
+      <w:r>
+        <w:t>, validation errors are displayed and the user returns to correct the submitted information.</w:t>
+      </w:r>
+    </w:p>
+    <w:p>
+      <w:r>
+        <w:lastRenderedPageBreak/>
+        <w:t>These decision points ensure that only valid fleet information is stored while supporting multiple fleet management operations through a unified workflow.</w:t>
+      </w:r>
+    </w:p>
+    <w:p>
+      <w:pPr>
+        <w:rPr>
+          <w:b/>
+          <w:bCs/>
+        </w:rPr>
+      </w:pPr>
+      <w:r>
+        <w:rPr>
+          <w:b/>
+          <w:bCs/>
+        </w:rPr>
+        <w:t>Alternative Flows</w:t>
+      </w:r>
+    </w:p>
+    <w:p>
+      <w:r>
+        <w:t>The Fleet Management Workflow Activity Diagram incorporates several alternative scenarios:</w:t>
+      </w:r>
+    </w:p>
+    <w:p>
+      <w:pPr>
+        <w:pStyle w:val="ListParagraph"/>
+        <w:numPr>
+          <w:ilvl w:val="0"/>
+          <w:numId w:val="146"/>
+        </w:numPr>
+      </w:pPr>
+      <w:r>
+        <w:t>Adding a new vehicle to the fleet.</w:t>
+      </w:r>
+    </w:p>
+    <w:p>
+      <w:pPr>
+        <w:pStyle w:val="ListParagraph"/>
+        <w:numPr>
+          <w:ilvl w:val="0"/>
+          <w:numId w:val="146"/>
+        </w:numPr>
+      </w:pPr>
+      <w:r>
+        <w:t>Updating existing vehicle information.</w:t>
+      </w:r>
+    </w:p>
+    <w:p>
+      <w:pPr>
+        <w:pStyle w:val="ListParagraph"/>
+        <w:numPr>
+          <w:ilvl w:val="0"/>
+          <w:numId w:val="146"/>
+        </w:numPr>
+      </w:pPr>
+      <w:r>
+        <w:t>Scheduling maintenance for a vehicle.</w:t>
+      </w:r>
+    </w:p>
+    <w:p>
+      <w:pPr>
+        <w:pStyle w:val="ListParagraph"/>
+        <w:numPr>
+          <w:ilvl w:val="0"/>
+          <w:numId w:val="146"/>
+        </w:numPr>
+      </w:pPr>
+      <w:r>
+        <w:t>Removing a vehicle from the fleet.</w:t>
+      </w:r>
+    </w:p>
+    <w:p>
+      <w:pPr>
+        <w:pStyle w:val="ListParagraph"/>
+        <w:numPr>
+          <w:ilvl w:val="0"/>
+          <w:numId w:val="146"/>
+        </w:numPr>
+      </w:pPr>
+      <w:r>
+        <w:t>Submission of invalid or incomplete information requiring correction before processing.</w:t>
+      </w:r>
+    </w:p>
+    <w:p>
+      <w:r>
+        <w:t>These alternative paths ensure that the fleet management subsystem remains flexible while preserving the integrity and consistency of vehicle records.</w:t>
+      </w:r>
+    </w:p>
+    <w:p>
+      <w:pPr>
+        <w:rPr>
+          <w:b/>
+          <w:bCs/>
+        </w:rPr>
+      </w:pPr>
+      <w:r>
+        <w:rPr>
+          <w:b/>
+          <w:bCs/>
+        </w:rPr>
+        <w:t>Conclusion</w:t>
+      </w:r>
+    </w:p>
+    <w:p>
+      <w:r>
+        <w:t>The Fleet Management Workflow Activity Diagram is the most comprehensive diagram that depicts the process of managing the vehicle fleet in the KriGo platform. The activity diagram describes the logical process of fleet management, validation steps, and decisions that should be made in order to keep the records about the vehicles up to date. The activity diagram can be considered one of the behavioral models of the fleet management system.</w:t>
+      </w:r>
+    </w:p>
+    <w:p>
+      <w:pPr>
+        <w:keepNext/>
+      </w:pPr>
+      <w:r>
+        <w:rPr>
+          <w:noProof/>
+        </w:rPr>
+        <w:drawing>
+          <wp:inline distT="0" distB="0" distL="0" distR="0" wp14:anchorId="59832AE6" wp14:editId="6AC7391A">
+            <wp:extent cx="5941695" cy="3944620"/>
+            <wp:effectExtent l="0" t="0" r="1905" b="0"/>
+            <wp:docPr id="1237134028" name="Picture 12"/>
+            <wp:cNvGraphicFramePr>
+              <a:graphicFrameLocks xmlns:a="http://schemas.openxmlformats.org/drawingml/2006/main" noChangeAspect="1"/>
+            </wp:cNvGraphicFramePr>
+            <a:graphic xmlns:a="http://schemas.openxmlformats.org/drawingml/2006/main">
+              <a:graphicData uri="http://schemas.openxmlformats.org/drawingml/2006/picture">
+                <pic:pic xmlns:pic="http://schemas.openxmlformats.org/drawingml/2006/picture">
+                  <pic:nvPicPr>
+                    <pic:cNvPr id="0" name="Picture 9"/>
+                    <pic:cNvPicPr>
+                      <a:picLocks noChangeAspect="1" noChangeArrowheads="1"/>
+                    </pic:cNvPicPr>
+                  </pic:nvPicPr>
+                  <pic:blipFill>
+                    <a:blip r:embed="rId12">
+                      <a:extLst>
+                        <a:ext uri="{28A0092B-C50C-407E-A947-70E740481C1C}">
+                          <a14:useLocalDpi xmlns:a14="http://schemas.microsoft.com/office/drawing/2010/main" val="0"/>
+                        </a:ext>
+                      </a:extLst>
+                    </a:blip>
+                    <a:srcRect/>
+                    <a:stretch>
+                      <a:fillRect/>
+                    </a:stretch>
+                  </pic:blipFill>
+                  <pic:spPr bwMode="auto">
+                    <a:xfrm>
+                      <a:off x="0" y="0"/>
+                      <a:ext cx="5941695" cy="3944620"/>
+                    </a:xfrm>
+                    <a:prstGeom prst="rect">
+                      <a:avLst/>
+                    </a:prstGeom>
+                    <a:noFill/>
+                    <a:ln>
+                      <a:noFill/>
+                    </a:ln>
+                  </pic:spPr>
+                </pic:pic>
+              </a:graphicData>
+            </a:graphic>
+          </wp:inline>
+        </w:drawing>
+      </w:r>
+    </w:p>
+    <w:p>
+      <w:pPr>
+        <w:pStyle w:val="Caption"/>
+      </w:pPr>
+      <w:r>
+        <w:t xml:space="preserve">Figure </w:t>
+      </w:r>
+      <w:r>
+        <w:fldChar w:fldCharType="begin"/>
+      </w:r>
+      <w:r>
+        <w:instrText xml:space="preserve"> SEQ Figure \* ARABIC </w:instrText>
+      </w:r>
+      <w:r>
+        <w:fldChar w:fldCharType="separate"/>
+      </w:r>
+      <w:r>
+        <w:rPr>
+          <w:noProof/>
+        </w:rPr>
+        <w:t>5</w:t>
+      </w:r>
+      <w:r>
+        <w:fldChar w:fldCharType="end"/>
+      </w:r>
+      <w:r>
+        <w:t xml:space="preserve"> - </w:t>
+      </w:r>
+      <w:r>
+        <w:t>Fleet Management Workflow Activity Diagram</w:t>
+      </w:r>
+    </w:p>
+    <w:p>
+      <w:pPr>
         <w:spacing w:line="278" w:lineRule="auto"/>
       </w:pPr>
       <w:r>
@@ -3232,6 +3784,119 @@
     </w:lvl>
   </w:abstractNum>
   <w:abstractNum w:abstractNumId="6" w15:restartNumberingAfterBreak="0">
+    <w:nsid w:val="03B57922"/>
+    <w:multiLevelType w:val="hybridMultilevel"/>
+    <w:tmpl w:val="C1E03AA8"/>
+    <w:lvl w:ilvl="0" w:tplc="04090003">
+      <w:start w:val="1"/>
+      <w:numFmt w:val="bullet"/>
+      <w:lvlText w:val="o"/>
+      <w:lvlJc w:val="left"/>
+      <w:pPr>
+        <w:ind w:left="1800" w:hanging="360"/>
+      </w:pPr>
+      <w:rPr>
+        <w:rFonts w:ascii="Courier New" w:hAnsi="Courier New" w:cs="Courier New" w:hint="default"/>
+      </w:rPr>
+    </w:lvl>
+    <w:lvl w:ilvl="1" w:tplc="04090003" w:tentative="1">
+      <w:start w:val="1"/>
+      <w:numFmt w:val="bullet"/>
+      <w:lvlText w:val="o"/>
+      <w:lvlJc w:val="left"/>
+      <w:pPr>
+        <w:ind w:left="2520" w:hanging="360"/>
+      </w:pPr>
+      <w:rPr>
+        <w:rFonts w:ascii="Courier New" w:hAnsi="Courier New" w:cs="Courier New" w:hint="default"/>
+      </w:rPr>
+    </w:lvl>
+    <w:lvl w:ilvl="2" w:tplc="04090005" w:tentative="1">
+      <w:start w:val="1"/>
+      <w:numFmt w:val="bullet"/>
+      <w:lvlText w:val=""/>
+      <w:lvlJc w:val="left"/>
+      <w:pPr>
+        <w:ind w:left="3240" w:hanging="360"/>
+      </w:pPr>
+      <w:rPr>
+        <w:rFonts w:ascii="Wingdings" w:hAnsi="Wingdings" w:hint="default"/>
+      </w:rPr>
+    </w:lvl>
+    <w:lvl w:ilvl="3" w:tplc="04090001" w:tentative="1">
+      <w:start w:val="1"/>
+      <w:numFmt w:val="bullet"/>
+      <w:lvlText w:val=""/>
+      <w:lvlJc w:val="left"/>
+      <w:pPr>
+        <w:ind w:left="3960" w:hanging="360"/>
+      </w:pPr>
+      <w:rPr>
+        <w:rFonts w:ascii="Symbol" w:hAnsi="Symbol" w:hint="default"/>
+      </w:rPr>
+    </w:lvl>
+    <w:lvl w:ilvl="4" w:tplc="04090003" w:tentative="1">
+      <w:start w:val="1"/>
+      <w:numFmt w:val="bullet"/>
+      <w:lvlText w:val="o"/>
+      <w:lvlJc w:val="left"/>
+      <w:pPr>
+        <w:ind w:left="4680" w:hanging="360"/>
+      </w:pPr>
+      <w:rPr>
+        <w:rFonts w:ascii="Courier New" w:hAnsi="Courier New" w:cs="Courier New" w:hint="default"/>
+      </w:rPr>
+    </w:lvl>
+    <w:lvl w:ilvl="5" w:tplc="04090005" w:tentative="1">
+      <w:start w:val="1"/>
+      <w:numFmt w:val="bullet"/>
+      <w:lvlText w:val=""/>
+      <w:lvlJc w:val="left"/>
+      <w:pPr>
+        <w:ind w:left="5400" w:hanging="360"/>
+      </w:pPr>
+      <w:rPr>
+        <w:rFonts w:ascii="Wingdings" w:hAnsi="Wingdings" w:hint="default"/>
+      </w:rPr>
+    </w:lvl>
+    <w:lvl w:ilvl="6" w:tplc="04090001" w:tentative="1">
+      <w:start w:val="1"/>
+      <w:numFmt w:val="bullet"/>
+      <w:lvlText w:val=""/>
+      <w:lvlJc w:val="left"/>
+      <w:pPr>
+        <w:ind w:left="6120" w:hanging="360"/>
+      </w:pPr>
+      <w:rPr>
+        <w:rFonts w:ascii="Symbol" w:hAnsi="Symbol" w:hint="default"/>
+      </w:rPr>
+    </w:lvl>
+    <w:lvl w:ilvl="7" w:tplc="04090003" w:tentative="1">
+      <w:start w:val="1"/>
+      <w:numFmt w:val="bullet"/>
+      <w:lvlText w:val="o"/>
+      <w:lvlJc w:val="left"/>
+      <w:pPr>
+        <w:ind w:left="6840" w:hanging="360"/>
+      </w:pPr>
+      <w:rPr>
+        <w:rFonts w:ascii="Courier New" w:hAnsi="Courier New" w:cs="Courier New" w:hint="default"/>
+      </w:rPr>
+    </w:lvl>
+    <w:lvl w:ilvl="8" w:tplc="04090005" w:tentative="1">
+      <w:start w:val="1"/>
+      <w:numFmt w:val="bullet"/>
+      <w:lvlText w:val=""/>
+      <w:lvlJc w:val="left"/>
+      <w:pPr>
+        <w:ind w:left="7560" w:hanging="360"/>
+      </w:pPr>
+      <w:rPr>
+        <w:rFonts w:ascii="Wingdings" w:hAnsi="Wingdings" w:hint="default"/>
+      </w:rPr>
+    </w:lvl>
+  </w:abstractNum>
+  <w:abstractNum w:abstractNumId="7" w15:restartNumberingAfterBreak="0">
     <w:nsid w:val="04351CD0"/>
     <w:multiLevelType w:val="hybridMultilevel"/>
     <w:tmpl w:val="4748F3C4"/>
@@ -3344,7 +4009,7 @@
       </w:rPr>
     </w:lvl>
   </w:abstractNum>
-  <w:abstractNum w:abstractNumId="7" w15:restartNumberingAfterBreak="0">
+  <w:abstractNum w:abstractNumId="8" w15:restartNumberingAfterBreak="0">
     <w:nsid w:val="0444578B"/>
     <w:multiLevelType w:val="multilevel"/>
     <w:tmpl w:val="6B840BA4"/>
@@ -3493,7 +4158,156 @@
       </w:rPr>
     </w:lvl>
   </w:abstractNum>
-  <w:abstractNum w:abstractNumId="8" w15:restartNumberingAfterBreak="0">
+  <w:abstractNum w:abstractNumId="9" w15:restartNumberingAfterBreak="0">
+    <w:nsid w:val="053B666F"/>
+    <w:multiLevelType w:val="multilevel"/>
+    <w:tmpl w:val="E1BC67F6"/>
+    <w:lvl w:ilvl="0">
+      <w:start w:val="1"/>
+      <w:numFmt w:val="bullet"/>
+      <w:lvlText w:val=""/>
+      <w:lvlJc w:val="left"/>
+      <w:pPr>
+        <w:tabs>
+          <w:tab w:val="num" w:pos="720"/>
+        </w:tabs>
+        <w:ind w:left="720" w:hanging="360"/>
+      </w:pPr>
+      <w:rPr>
+        <w:rFonts w:ascii="Symbol" w:hAnsi="Symbol" w:hint="default"/>
+        <w:sz w:val="20"/>
+      </w:rPr>
+    </w:lvl>
+    <w:lvl w:ilvl="1">
+      <w:start w:val="1"/>
+      <w:numFmt w:val="bullet"/>
+      <w:lvlText w:val="o"/>
+      <w:lvlJc w:val="left"/>
+      <w:pPr>
+        <w:tabs>
+          <w:tab w:val="num" w:pos="1440"/>
+        </w:tabs>
+        <w:ind w:left="1440" w:hanging="360"/>
+      </w:pPr>
+      <w:rPr>
+        <w:rFonts w:ascii="Courier New" w:hAnsi="Courier New" w:hint="default"/>
+        <w:sz w:val="20"/>
+      </w:rPr>
+    </w:lvl>
+    <w:lvl w:ilvl="2" w:tentative="1">
+      <w:start w:val="1"/>
+      <w:numFmt w:val="bullet"/>
+      <w:lvlText w:val=""/>
+      <w:lvlJc w:val="left"/>
+      <w:pPr>
+        <w:tabs>
+          <w:tab w:val="num" w:pos="2160"/>
+        </w:tabs>
+        <w:ind w:left="2160" w:hanging="360"/>
+      </w:pPr>
+      <w:rPr>
+        <w:rFonts w:ascii="Wingdings" w:hAnsi="Wingdings" w:hint="default"/>
+        <w:sz w:val="20"/>
+      </w:rPr>
+    </w:lvl>
+    <w:lvl w:ilvl="3" w:tentative="1">
+      <w:start w:val="1"/>
+      <w:numFmt w:val="bullet"/>
+      <w:lvlText w:val=""/>
+      <w:lvlJc w:val="left"/>
+      <w:pPr>
+        <w:tabs>
+          <w:tab w:val="num" w:pos="2880"/>
+        </w:tabs>
+        <w:ind w:left="2880" w:hanging="360"/>
+      </w:pPr>
+      <w:rPr>
+        <w:rFonts w:ascii="Wingdings" w:hAnsi="Wingdings" w:hint="default"/>
+        <w:sz w:val="20"/>
+      </w:rPr>
+    </w:lvl>
+    <w:lvl w:ilvl="4" w:tentative="1">
+      <w:start w:val="1"/>
+      <w:numFmt w:val="bullet"/>
+      <w:lvlText w:val=""/>
+      <w:lvlJc w:val="left"/>
+      <w:pPr>
+        <w:tabs>
+          <w:tab w:val="num" w:pos="3600"/>
+        </w:tabs>
+        <w:ind w:left="3600" w:hanging="360"/>
+      </w:pPr>
+      <w:rPr>
+        <w:rFonts w:ascii="Wingdings" w:hAnsi="Wingdings" w:hint="default"/>
+        <w:sz w:val="20"/>
+      </w:rPr>
+    </w:lvl>
+    <w:lvl w:ilvl="5" w:tentative="1">
+      <w:start w:val="1"/>
+      <w:numFmt w:val="bullet"/>
+      <w:lvlText w:val=""/>
+      <w:lvlJc w:val="left"/>
+      <w:pPr>
+        <w:tabs>
+          <w:tab w:val="num" w:pos="4320"/>
+        </w:tabs>
+        <w:ind w:left="4320" w:hanging="360"/>
+      </w:pPr>
+      <w:rPr>
+        <w:rFonts w:ascii="Wingdings" w:hAnsi="Wingdings" w:hint="default"/>
+        <w:sz w:val="20"/>
+      </w:rPr>
+    </w:lvl>
+    <w:lvl w:ilvl="6" w:tentative="1">
+      <w:start w:val="1"/>
+      <w:numFmt w:val="bullet"/>
+      <w:lvlText w:val=""/>
+      <w:lvlJc w:val="left"/>
+      <w:pPr>
+        <w:tabs>
+          <w:tab w:val="num" w:pos="5040"/>
+        </w:tabs>
+        <w:ind w:left="5040" w:hanging="360"/>
+      </w:pPr>
+      <w:rPr>
+        <w:rFonts w:ascii="Wingdings" w:hAnsi="Wingdings" w:hint="default"/>
+        <w:sz w:val="20"/>
+      </w:rPr>
+    </w:lvl>
+    <w:lvl w:ilvl="7" w:tentative="1">
+      <w:start w:val="1"/>
+      <w:numFmt w:val="bullet"/>
+      <w:lvlText w:val=""/>
+      <w:lvlJc w:val="left"/>
+      <w:pPr>
+        <w:tabs>
+          <w:tab w:val="num" w:pos="5760"/>
+        </w:tabs>
+        <w:ind w:left="5760" w:hanging="360"/>
+      </w:pPr>
+      <w:rPr>
+        <w:rFonts w:ascii="Wingdings" w:hAnsi="Wingdings" w:hint="default"/>
+        <w:sz w:val="20"/>
+      </w:rPr>
+    </w:lvl>
+    <w:lvl w:ilvl="8" w:tentative="1">
+      <w:start w:val="1"/>
+      <w:numFmt w:val="bullet"/>
+      <w:lvlText w:val=""/>
+      <w:lvlJc w:val="left"/>
+      <w:pPr>
+        <w:tabs>
+          <w:tab w:val="num" w:pos="6480"/>
+        </w:tabs>
+        <w:ind w:left="6480" w:hanging="360"/>
+      </w:pPr>
+      <w:rPr>
+        <w:rFonts w:ascii="Wingdings" w:hAnsi="Wingdings" w:hint="default"/>
+        <w:sz w:val="20"/>
+      </w:rPr>
+    </w:lvl>
+  </w:abstractNum>
+  <w:abstractNum w:abstractNumId="10" w15:restartNumberingAfterBreak="0">
     <w:nsid w:val="06FA4547"/>
     <w:multiLevelType w:val="hybridMultilevel"/>
     <w:tmpl w:val="DA825754"/>
@@ -3606,7 +4420,7 @@
       </w:rPr>
     </w:lvl>
   </w:abstractNum>
-  <w:abstractNum w:abstractNumId="9" w15:restartNumberingAfterBreak="0">
+  <w:abstractNum w:abstractNumId="11" w15:restartNumberingAfterBreak="0">
     <w:nsid w:val="0717208B"/>
     <w:multiLevelType w:val="hybridMultilevel"/>
     <w:tmpl w:val="5866C9A8"/>
@@ -3719,7 +4533,7 @@
       </w:rPr>
     </w:lvl>
   </w:abstractNum>
-  <w:abstractNum w:abstractNumId="10" w15:restartNumberingAfterBreak="0">
+  <w:abstractNum w:abstractNumId="12" w15:restartNumberingAfterBreak="0">
     <w:nsid w:val="08BB19BF"/>
     <w:multiLevelType w:val="multilevel"/>
     <w:tmpl w:val="C5807BB2"/>
@@ -3868,7 +4682,7 @@
       </w:rPr>
     </w:lvl>
   </w:abstractNum>
-  <w:abstractNum w:abstractNumId="11" w15:restartNumberingAfterBreak="0">
+  <w:abstractNum w:abstractNumId="13" w15:restartNumberingAfterBreak="0">
     <w:nsid w:val="08D32D08"/>
     <w:multiLevelType w:val="multilevel"/>
     <w:tmpl w:val="A32449CA"/>
@@ -4017,7 +4831,7 @@
       </w:rPr>
     </w:lvl>
   </w:abstractNum>
-  <w:abstractNum w:abstractNumId="12" w15:restartNumberingAfterBreak="0">
+  <w:abstractNum w:abstractNumId="14" w15:restartNumberingAfterBreak="0">
     <w:nsid w:val="09E84C0F"/>
     <w:multiLevelType w:val="hybridMultilevel"/>
     <w:tmpl w:val="3754EFAC"/>
@@ -4130,7 +4944,7 @@
       </w:rPr>
     </w:lvl>
   </w:abstractNum>
-  <w:abstractNum w:abstractNumId="13" w15:restartNumberingAfterBreak="0">
+  <w:abstractNum w:abstractNumId="15" w15:restartNumberingAfterBreak="0">
     <w:nsid w:val="0AE82489"/>
     <w:multiLevelType w:val="multilevel"/>
     <w:tmpl w:val="B82C10D4"/>
@@ -4279,7 +5093,7 @@
       </w:rPr>
     </w:lvl>
   </w:abstractNum>
-  <w:abstractNum w:abstractNumId="14" w15:restartNumberingAfterBreak="0">
+  <w:abstractNum w:abstractNumId="16" w15:restartNumberingAfterBreak="0">
     <w:nsid w:val="0CC17936"/>
     <w:multiLevelType w:val="multilevel"/>
     <w:tmpl w:val="B5E0C4F8"/>
@@ -4428,7 +5242,156 @@
       </w:rPr>
     </w:lvl>
   </w:abstractNum>
-  <w:abstractNum w:abstractNumId="15" w15:restartNumberingAfterBreak="0">
+  <w:abstractNum w:abstractNumId="17" w15:restartNumberingAfterBreak="0">
+    <w:nsid w:val="0D367329"/>
+    <w:multiLevelType w:val="multilevel"/>
+    <w:tmpl w:val="66064F64"/>
+    <w:lvl w:ilvl="0">
+      <w:start w:val="1"/>
+      <w:numFmt w:val="bullet"/>
+      <w:lvlText w:val=""/>
+      <w:lvlJc w:val="left"/>
+      <w:pPr>
+        <w:tabs>
+          <w:tab w:val="num" w:pos="720"/>
+        </w:tabs>
+        <w:ind w:left="720" w:hanging="360"/>
+      </w:pPr>
+      <w:rPr>
+        <w:rFonts w:ascii="Symbol" w:hAnsi="Symbol" w:hint="default"/>
+        <w:sz w:val="20"/>
+      </w:rPr>
+    </w:lvl>
+    <w:lvl w:ilvl="1" w:tentative="1">
+      <w:start w:val="1"/>
+      <w:numFmt w:val="bullet"/>
+      <w:lvlText w:val="o"/>
+      <w:lvlJc w:val="left"/>
+      <w:pPr>
+        <w:tabs>
+          <w:tab w:val="num" w:pos="1440"/>
+        </w:tabs>
+        <w:ind w:left="1440" w:hanging="360"/>
+      </w:pPr>
+      <w:rPr>
+        <w:rFonts w:ascii="Courier New" w:hAnsi="Courier New" w:hint="default"/>
+        <w:sz w:val="20"/>
+      </w:rPr>
+    </w:lvl>
+    <w:lvl w:ilvl="2" w:tentative="1">
+      <w:start w:val="1"/>
+      <w:numFmt w:val="bullet"/>
+      <w:lvlText w:val=""/>
+      <w:lvlJc w:val="left"/>
+      <w:pPr>
+        <w:tabs>
+          <w:tab w:val="num" w:pos="2160"/>
+        </w:tabs>
+        <w:ind w:left="2160" w:hanging="360"/>
+      </w:pPr>
+      <w:rPr>
+        <w:rFonts w:ascii="Wingdings" w:hAnsi="Wingdings" w:hint="default"/>
+        <w:sz w:val="20"/>
+      </w:rPr>
+    </w:lvl>
+    <w:lvl w:ilvl="3" w:tentative="1">
+      <w:start w:val="1"/>
+      <w:numFmt w:val="bullet"/>
+      <w:lvlText w:val=""/>
+      <w:lvlJc w:val="left"/>
+      <w:pPr>
+        <w:tabs>
+          <w:tab w:val="num" w:pos="2880"/>
+        </w:tabs>
+        <w:ind w:left="2880" w:hanging="360"/>
+      </w:pPr>
+      <w:rPr>
+        <w:rFonts w:ascii="Wingdings" w:hAnsi="Wingdings" w:hint="default"/>
+        <w:sz w:val="20"/>
+      </w:rPr>
+    </w:lvl>
+    <w:lvl w:ilvl="4" w:tentative="1">
+      <w:start w:val="1"/>
+      <w:numFmt w:val="bullet"/>
+      <w:lvlText w:val=""/>
+      <w:lvlJc w:val="left"/>
+      <w:pPr>
+        <w:tabs>
+          <w:tab w:val="num" w:pos="3600"/>
+        </w:tabs>
+        <w:ind w:left="3600" w:hanging="360"/>
+      </w:pPr>
+      <w:rPr>
+        <w:rFonts w:ascii="Wingdings" w:hAnsi="Wingdings" w:hint="default"/>
+        <w:sz w:val="20"/>
+      </w:rPr>
+    </w:lvl>
+    <w:lvl w:ilvl="5" w:tentative="1">
+      <w:start w:val="1"/>
+      <w:numFmt w:val="bullet"/>
+      <w:lvlText w:val=""/>
+      <w:lvlJc w:val="left"/>
+      <w:pPr>
+        <w:tabs>
+          <w:tab w:val="num" w:pos="4320"/>
+        </w:tabs>
+        <w:ind w:left="4320" w:hanging="360"/>
+      </w:pPr>
+      <w:rPr>
+        <w:rFonts w:ascii="Wingdings" w:hAnsi="Wingdings" w:hint="default"/>
+        <w:sz w:val="20"/>
+      </w:rPr>
+    </w:lvl>
+    <w:lvl w:ilvl="6" w:tentative="1">
+      <w:start w:val="1"/>
+      <w:numFmt w:val="bullet"/>
+      <w:lvlText w:val=""/>
+      <w:lvlJc w:val="left"/>
+      <w:pPr>
+        <w:tabs>
+          <w:tab w:val="num" w:pos="5040"/>
+        </w:tabs>
+        <w:ind w:left="5040" w:hanging="360"/>
+      </w:pPr>
+      <w:rPr>
+        <w:rFonts w:ascii="Wingdings" w:hAnsi="Wingdings" w:hint="default"/>
+        <w:sz w:val="20"/>
+      </w:rPr>
+    </w:lvl>
+    <w:lvl w:ilvl="7" w:tentative="1">
+      <w:start w:val="1"/>
+      <w:numFmt w:val="bullet"/>
+      <w:lvlText w:val=""/>
+      <w:lvlJc w:val="left"/>
+      <w:pPr>
+        <w:tabs>
+          <w:tab w:val="num" w:pos="5760"/>
+        </w:tabs>
+        <w:ind w:left="5760" w:hanging="360"/>
+      </w:pPr>
+      <w:rPr>
+        <w:rFonts w:ascii="Wingdings" w:hAnsi="Wingdings" w:hint="default"/>
+        <w:sz w:val="20"/>
+      </w:rPr>
+    </w:lvl>
+    <w:lvl w:ilvl="8" w:tentative="1">
+      <w:start w:val="1"/>
+      <w:numFmt w:val="bullet"/>
+      <w:lvlText w:val=""/>
+      <w:lvlJc w:val="left"/>
+      <w:pPr>
+        <w:tabs>
+          <w:tab w:val="num" w:pos="6480"/>
+        </w:tabs>
+        <w:ind w:left="6480" w:hanging="360"/>
+      </w:pPr>
+      <w:rPr>
+        <w:rFonts w:ascii="Wingdings" w:hAnsi="Wingdings" w:hint="default"/>
+        <w:sz w:val="20"/>
+      </w:rPr>
+    </w:lvl>
+  </w:abstractNum>
+  <w:abstractNum w:abstractNumId="18" w15:restartNumberingAfterBreak="0">
     <w:nsid w:val="0E1040E2"/>
     <w:multiLevelType w:val="multilevel"/>
     <w:tmpl w:val="607CCC88"/>
@@ -4577,7 +5540,7 @@
       </w:rPr>
     </w:lvl>
   </w:abstractNum>
-  <w:abstractNum w:abstractNumId="16" w15:restartNumberingAfterBreak="0">
+  <w:abstractNum w:abstractNumId="19" w15:restartNumberingAfterBreak="0">
     <w:nsid w:val="0E2561E7"/>
     <w:multiLevelType w:val="hybridMultilevel"/>
     <w:tmpl w:val="2A6E4870"/>
@@ -4690,7 +5653,7 @@
       </w:rPr>
     </w:lvl>
   </w:abstractNum>
-  <w:abstractNum w:abstractNumId="17" w15:restartNumberingAfterBreak="0">
+  <w:abstractNum w:abstractNumId="20" w15:restartNumberingAfterBreak="0">
     <w:nsid w:val="0E841C27"/>
     <w:multiLevelType w:val="hybridMultilevel"/>
     <w:tmpl w:val="789C7F32"/>
@@ -4803,7 +5766,7 @@
       </w:rPr>
     </w:lvl>
   </w:abstractNum>
-  <w:abstractNum w:abstractNumId="18" w15:restartNumberingAfterBreak="0">
+  <w:abstractNum w:abstractNumId="21" w15:restartNumberingAfterBreak="0">
     <w:nsid w:val="0FAA2602"/>
     <w:multiLevelType w:val="hybridMultilevel"/>
     <w:tmpl w:val="C6C63128"/>
@@ -4916,7 +5879,7 @@
       </w:rPr>
     </w:lvl>
   </w:abstractNum>
-  <w:abstractNum w:abstractNumId="19" w15:restartNumberingAfterBreak="0">
+  <w:abstractNum w:abstractNumId="22" w15:restartNumberingAfterBreak="0">
     <w:nsid w:val="122550ED"/>
     <w:multiLevelType w:val="hybridMultilevel"/>
     <w:tmpl w:val="91ACE480"/>
@@ -5029,7 +5992,7 @@
       </w:rPr>
     </w:lvl>
   </w:abstractNum>
-  <w:abstractNum w:abstractNumId="20" w15:restartNumberingAfterBreak="0">
+  <w:abstractNum w:abstractNumId="23" w15:restartNumberingAfterBreak="0">
     <w:nsid w:val="124C1BAE"/>
     <w:multiLevelType w:val="hybridMultilevel"/>
     <w:tmpl w:val="04988FC0"/>
@@ -5142,7 +6105,7 @@
       </w:rPr>
     </w:lvl>
   </w:abstractNum>
-  <w:abstractNum w:abstractNumId="21" w15:restartNumberingAfterBreak="0">
+  <w:abstractNum w:abstractNumId="24" w15:restartNumberingAfterBreak="0">
     <w:nsid w:val="139F7557"/>
     <w:multiLevelType w:val="multilevel"/>
     <w:tmpl w:val="A984C1D4"/>
@@ -5291,7 +6254,7 @@
       </w:rPr>
     </w:lvl>
   </w:abstractNum>
-  <w:abstractNum w:abstractNumId="22" w15:restartNumberingAfterBreak="0">
+  <w:abstractNum w:abstractNumId="25" w15:restartNumberingAfterBreak="0">
     <w:nsid w:val="13A13D09"/>
     <w:multiLevelType w:val="multilevel"/>
     <w:tmpl w:val="92067DCC"/>
@@ -5440,7 +6403,7 @@
       </w:rPr>
     </w:lvl>
   </w:abstractNum>
-  <w:abstractNum w:abstractNumId="23" w15:restartNumberingAfterBreak="0">
+  <w:abstractNum w:abstractNumId="26" w15:restartNumberingAfterBreak="0">
     <w:nsid w:val="14DC6E23"/>
     <w:multiLevelType w:val="hybridMultilevel"/>
     <w:tmpl w:val="2ACC2CF2"/>
@@ -5553,7 +6516,120 @@
       </w:rPr>
     </w:lvl>
   </w:abstractNum>
-  <w:abstractNum w:abstractNumId="24" w15:restartNumberingAfterBreak="0">
+  <w:abstractNum w:abstractNumId="27" w15:restartNumberingAfterBreak="0">
+    <w:nsid w:val="161C5709"/>
+    <w:multiLevelType w:val="hybridMultilevel"/>
+    <w:tmpl w:val="F06CE1E0"/>
+    <w:lvl w:ilvl="0" w:tplc="04090005">
+      <w:start w:val="1"/>
+      <w:numFmt w:val="bullet"/>
+      <w:lvlText w:val=""/>
+      <w:lvlJc w:val="left"/>
+      <w:pPr>
+        <w:ind w:left="810" w:hanging="360"/>
+      </w:pPr>
+      <w:rPr>
+        <w:rFonts w:ascii="Wingdings" w:hAnsi="Wingdings" w:hint="default"/>
+      </w:rPr>
+    </w:lvl>
+    <w:lvl w:ilvl="1" w:tplc="FFFFFFFF" w:tentative="1">
+      <w:start w:val="1"/>
+      <w:numFmt w:val="bullet"/>
+      <w:lvlText w:val="o"/>
+      <w:lvlJc w:val="left"/>
+      <w:pPr>
+        <w:ind w:left="1530" w:hanging="360"/>
+      </w:pPr>
+      <w:rPr>
+        <w:rFonts w:ascii="Courier New" w:hAnsi="Courier New" w:cs="Courier New" w:hint="default"/>
+      </w:rPr>
+    </w:lvl>
+    <w:lvl w:ilvl="2" w:tplc="FFFFFFFF" w:tentative="1">
+      <w:start w:val="1"/>
+      <w:numFmt w:val="bullet"/>
+      <w:lvlText w:val=""/>
+      <w:lvlJc w:val="left"/>
+      <w:pPr>
+        <w:ind w:left="2250" w:hanging="360"/>
+      </w:pPr>
+      <w:rPr>
+        <w:rFonts w:ascii="Wingdings" w:hAnsi="Wingdings" w:hint="default"/>
+      </w:rPr>
+    </w:lvl>
+    <w:lvl w:ilvl="3" w:tplc="FFFFFFFF" w:tentative="1">
+      <w:start w:val="1"/>
+      <w:numFmt w:val="bullet"/>
+      <w:lvlText w:val=""/>
+      <w:lvlJc w:val="left"/>
+      <w:pPr>
+        <w:ind w:left="2970" w:hanging="360"/>
+      </w:pPr>
+      <w:rPr>
+        <w:rFonts w:ascii="Symbol" w:hAnsi="Symbol" w:hint="default"/>
+      </w:rPr>
+    </w:lvl>
+    <w:lvl w:ilvl="4" w:tplc="FFFFFFFF" w:tentative="1">
+      <w:start w:val="1"/>
+      <w:numFmt w:val="bullet"/>
+      <w:lvlText w:val="o"/>
+      <w:lvlJc w:val="left"/>
+      <w:pPr>
+        <w:ind w:left="3690" w:hanging="360"/>
+      </w:pPr>
+      <w:rPr>
+        <w:rFonts w:ascii="Courier New" w:hAnsi="Courier New" w:cs="Courier New" w:hint="default"/>
+      </w:rPr>
+    </w:lvl>
+    <w:lvl w:ilvl="5" w:tplc="FFFFFFFF" w:tentative="1">
+      <w:start w:val="1"/>
+      <w:numFmt w:val="bullet"/>
+      <w:lvlText w:val=""/>
+      <w:lvlJc w:val="left"/>
+      <w:pPr>
+        <w:ind w:left="4410" w:hanging="360"/>
+      </w:pPr>
+      <w:rPr>
+        <w:rFonts w:ascii="Wingdings" w:hAnsi="Wingdings" w:hint="default"/>
+      </w:rPr>
+    </w:lvl>
+    <w:lvl w:ilvl="6" w:tplc="FFFFFFFF" w:tentative="1">
+      <w:start w:val="1"/>
+      <w:numFmt w:val="bullet"/>
+      <w:lvlText w:val=""/>
+      <w:lvlJc w:val="left"/>
+      <w:pPr>
+        <w:ind w:left="5130" w:hanging="360"/>
+      </w:pPr>
+      <w:rPr>
+        <w:rFonts w:ascii="Symbol" w:hAnsi="Symbol" w:hint="default"/>
+      </w:rPr>
+    </w:lvl>
+    <w:lvl w:ilvl="7" w:tplc="FFFFFFFF" w:tentative="1">
+      <w:start w:val="1"/>
+      <w:numFmt w:val="bullet"/>
+      <w:lvlText w:val="o"/>
+      <w:lvlJc w:val="left"/>
+      <w:pPr>
+        <w:ind w:left="5850" w:hanging="360"/>
+      </w:pPr>
+      <w:rPr>
+        <w:rFonts w:ascii="Courier New" w:hAnsi="Courier New" w:cs="Courier New" w:hint="default"/>
+      </w:rPr>
+    </w:lvl>
+    <w:lvl w:ilvl="8" w:tplc="FFFFFFFF" w:tentative="1">
+      <w:start w:val="1"/>
+      <w:numFmt w:val="bullet"/>
+      <w:lvlText w:val=""/>
+      <w:lvlJc w:val="left"/>
+      <w:pPr>
+        <w:ind w:left="6570" w:hanging="360"/>
+      </w:pPr>
+      <w:rPr>
+        <w:rFonts w:ascii="Wingdings" w:hAnsi="Wingdings" w:hint="default"/>
+      </w:rPr>
+    </w:lvl>
+  </w:abstractNum>
+  <w:abstractNum w:abstractNumId="28" w15:restartNumberingAfterBreak="0">
     <w:nsid w:val="16D400B4"/>
     <w:multiLevelType w:val="hybridMultilevel"/>
     <w:tmpl w:val="58E6DFBE"/>
@@ -5666,7 +6742,7 @@
       </w:rPr>
     </w:lvl>
   </w:abstractNum>
-  <w:abstractNum w:abstractNumId="25" w15:restartNumberingAfterBreak="0">
+  <w:abstractNum w:abstractNumId="29" w15:restartNumberingAfterBreak="0">
     <w:nsid w:val="17236012"/>
     <w:multiLevelType w:val="hybridMultilevel"/>
     <w:tmpl w:val="DAFA46C8"/>
@@ -5779,7 +6855,7 @@
       </w:rPr>
     </w:lvl>
   </w:abstractNum>
-  <w:abstractNum w:abstractNumId="26" w15:restartNumberingAfterBreak="0">
+  <w:abstractNum w:abstractNumId="30" w15:restartNumberingAfterBreak="0">
     <w:nsid w:val="172B04C0"/>
     <w:multiLevelType w:val="hybridMultilevel"/>
     <w:tmpl w:val="B6C41D5E"/>
@@ -5892,7 +6968,7 @@
       </w:rPr>
     </w:lvl>
   </w:abstractNum>
-  <w:abstractNum w:abstractNumId="27" w15:restartNumberingAfterBreak="0">
+  <w:abstractNum w:abstractNumId="31" w15:restartNumberingAfterBreak="0">
     <w:nsid w:val="17485CCB"/>
     <w:multiLevelType w:val="multilevel"/>
     <w:tmpl w:val="397E1AE0"/>
@@ -6041,7 +7117,7 @@
       </w:rPr>
     </w:lvl>
   </w:abstractNum>
-  <w:abstractNum w:abstractNumId="28" w15:restartNumberingAfterBreak="0">
+  <w:abstractNum w:abstractNumId="32" w15:restartNumberingAfterBreak="0">
     <w:nsid w:val="17763D31"/>
     <w:multiLevelType w:val="hybridMultilevel"/>
     <w:tmpl w:val="6CE63304"/>
@@ -6154,7 +7230,156 @@
       </w:rPr>
     </w:lvl>
   </w:abstractNum>
-  <w:abstractNum w:abstractNumId="29" w15:restartNumberingAfterBreak="0">
+  <w:abstractNum w:abstractNumId="33" w15:restartNumberingAfterBreak="0">
+    <w:nsid w:val="17A835CF"/>
+    <w:multiLevelType w:val="multilevel"/>
+    <w:tmpl w:val="0C988B24"/>
+    <w:lvl w:ilvl="0">
+      <w:start w:val="1"/>
+      <w:numFmt w:val="bullet"/>
+      <w:lvlText w:val=""/>
+      <w:lvlJc w:val="left"/>
+      <w:pPr>
+        <w:tabs>
+          <w:tab w:val="num" w:pos="720"/>
+        </w:tabs>
+        <w:ind w:left="720" w:hanging="360"/>
+      </w:pPr>
+      <w:rPr>
+        <w:rFonts w:ascii="Symbol" w:hAnsi="Symbol" w:hint="default"/>
+        <w:sz w:val="20"/>
+      </w:rPr>
+    </w:lvl>
+    <w:lvl w:ilvl="1" w:tentative="1">
+      <w:start w:val="1"/>
+      <w:numFmt w:val="bullet"/>
+      <w:lvlText w:val="o"/>
+      <w:lvlJc w:val="left"/>
+      <w:pPr>
+        <w:tabs>
+          <w:tab w:val="num" w:pos="1440"/>
+        </w:tabs>
+        <w:ind w:left="1440" w:hanging="360"/>
+      </w:pPr>
+      <w:rPr>
+        <w:rFonts w:ascii="Courier New" w:hAnsi="Courier New" w:hint="default"/>
+        <w:sz w:val="20"/>
+      </w:rPr>
+    </w:lvl>
+    <w:lvl w:ilvl="2" w:tentative="1">
+      <w:start w:val="1"/>
+      <w:numFmt w:val="bullet"/>
+      <w:lvlText w:val=""/>
+      <w:lvlJc w:val="left"/>
+      <w:pPr>
+        <w:tabs>
+          <w:tab w:val="num" w:pos="2160"/>
+        </w:tabs>
+        <w:ind w:left="2160" w:hanging="360"/>
+      </w:pPr>
+      <w:rPr>
+        <w:rFonts w:ascii="Wingdings" w:hAnsi="Wingdings" w:hint="default"/>
+        <w:sz w:val="20"/>
+      </w:rPr>
+    </w:lvl>
+    <w:lvl w:ilvl="3" w:tentative="1">
+      <w:start w:val="1"/>
+      <w:numFmt w:val="bullet"/>
+      <w:lvlText w:val=""/>
+      <w:lvlJc w:val="left"/>
+      <w:pPr>
+        <w:tabs>
+          <w:tab w:val="num" w:pos="2880"/>
+        </w:tabs>
+        <w:ind w:left="2880" w:hanging="360"/>
+      </w:pPr>
+      <w:rPr>
+        <w:rFonts w:ascii="Wingdings" w:hAnsi="Wingdings" w:hint="default"/>
+        <w:sz w:val="20"/>
+      </w:rPr>
+    </w:lvl>
+    <w:lvl w:ilvl="4" w:tentative="1">
+      <w:start w:val="1"/>
+      <w:numFmt w:val="bullet"/>
+      <w:lvlText w:val=""/>
+      <w:lvlJc w:val="left"/>
+      <w:pPr>
+        <w:tabs>
+          <w:tab w:val="num" w:pos="3600"/>
+        </w:tabs>
+        <w:ind w:left="3600" w:hanging="360"/>
+      </w:pPr>
+      <w:rPr>
+        <w:rFonts w:ascii="Wingdings" w:hAnsi="Wingdings" w:hint="default"/>
+        <w:sz w:val="20"/>
+      </w:rPr>
+    </w:lvl>
+    <w:lvl w:ilvl="5" w:tentative="1">
+      <w:start w:val="1"/>
+      <w:numFmt w:val="bullet"/>
+      <w:lvlText w:val=""/>
+      <w:lvlJc w:val="left"/>
+      <w:pPr>
+        <w:tabs>
+          <w:tab w:val="num" w:pos="4320"/>
+        </w:tabs>
+        <w:ind w:left="4320" w:hanging="360"/>
+      </w:pPr>
+      <w:rPr>
+        <w:rFonts w:ascii="Wingdings" w:hAnsi="Wingdings" w:hint="default"/>
+        <w:sz w:val="20"/>
+      </w:rPr>
+    </w:lvl>
+    <w:lvl w:ilvl="6" w:tentative="1">
+      <w:start w:val="1"/>
+      <w:numFmt w:val="bullet"/>
+      <w:lvlText w:val=""/>
+      <w:lvlJc w:val="left"/>
+      <w:pPr>
+        <w:tabs>
+          <w:tab w:val="num" w:pos="5040"/>
+        </w:tabs>
+        <w:ind w:left="5040" w:hanging="360"/>
+      </w:pPr>
+      <w:rPr>
+        <w:rFonts w:ascii="Wingdings" w:hAnsi="Wingdings" w:hint="default"/>
+        <w:sz w:val="20"/>
+      </w:rPr>
+    </w:lvl>
+    <w:lvl w:ilvl="7" w:tentative="1">
+      <w:start w:val="1"/>
+      <w:numFmt w:val="bullet"/>
+      <w:lvlText w:val=""/>
+      <w:lvlJc w:val="left"/>
+      <w:pPr>
+        <w:tabs>
+          <w:tab w:val="num" w:pos="5760"/>
+        </w:tabs>
+        <w:ind w:left="5760" w:hanging="360"/>
+      </w:pPr>
+      <w:rPr>
+        <w:rFonts w:ascii="Wingdings" w:hAnsi="Wingdings" w:hint="default"/>
+        <w:sz w:val="20"/>
+      </w:rPr>
+    </w:lvl>
+    <w:lvl w:ilvl="8" w:tentative="1">
+      <w:start w:val="1"/>
+      <w:numFmt w:val="bullet"/>
+      <w:lvlText w:val=""/>
+      <w:lvlJc w:val="left"/>
+      <w:pPr>
+        <w:tabs>
+          <w:tab w:val="num" w:pos="6480"/>
+        </w:tabs>
+        <w:ind w:left="6480" w:hanging="360"/>
+      </w:pPr>
+      <w:rPr>
+        <w:rFonts w:ascii="Wingdings" w:hAnsi="Wingdings" w:hint="default"/>
+        <w:sz w:val="20"/>
+      </w:rPr>
+    </w:lvl>
+  </w:abstractNum>
+  <w:abstractNum w:abstractNumId="34" w15:restartNumberingAfterBreak="0">
     <w:nsid w:val="17B06937"/>
     <w:multiLevelType w:val="hybridMultilevel"/>
     <w:tmpl w:val="71089CF2"/>
@@ -6267,7 +7492,7 @@
       </w:rPr>
     </w:lvl>
   </w:abstractNum>
-  <w:abstractNum w:abstractNumId="30" w15:restartNumberingAfterBreak="0">
+  <w:abstractNum w:abstractNumId="35" w15:restartNumberingAfterBreak="0">
     <w:nsid w:val="18FD59FB"/>
     <w:multiLevelType w:val="multilevel"/>
     <w:tmpl w:val="942CD1D2"/>
@@ -6416,7 +7641,7 @@
       </w:rPr>
     </w:lvl>
   </w:abstractNum>
-  <w:abstractNum w:abstractNumId="31" w15:restartNumberingAfterBreak="0">
+  <w:abstractNum w:abstractNumId="36" w15:restartNumberingAfterBreak="0">
     <w:nsid w:val="190F0390"/>
     <w:multiLevelType w:val="multilevel"/>
     <w:tmpl w:val="CBE4A4A4"/>
@@ -6565,7 +7790,7 @@
       </w:rPr>
     </w:lvl>
   </w:abstractNum>
-  <w:abstractNum w:abstractNumId="32" w15:restartNumberingAfterBreak="0">
+  <w:abstractNum w:abstractNumId="37" w15:restartNumberingAfterBreak="0">
     <w:nsid w:val="195875B0"/>
     <w:multiLevelType w:val="multilevel"/>
     <w:tmpl w:val="615444D4"/>
@@ -6678,7 +7903,7 @@
       </w:pPr>
     </w:lvl>
   </w:abstractNum>
-  <w:abstractNum w:abstractNumId="33" w15:restartNumberingAfterBreak="0">
+  <w:abstractNum w:abstractNumId="38" w15:restartNumberingAfterBreak="0">
     <w:nsid w:val="197C6FD7"/>
     <w:multiLevelType w:val="hybridMultilevel"/>
     <w:tmpl w:val="D97CEAA8"/>
@@ -6791,7 +8016,7 @@
       </w:rPr>
     </w:lvl>
   </w:abstractNum>
-  <w:abstractNum w:abstractNumId="34" w15:restartNumberingAfterBreak="0">
+  <w:abstractNum w:abstractNumId="39" w15:restartNumberingAfterBreak="0">
     <w:nsid w:val="1CC60A94"/>
     <w:multiLevelType w:val="multilevel"/>
     <w:tmpl w:val="EB74741C"/>
@@ -6940,7 +8165,7 @@
       </w:rPr>
     </w:lvl>
   </w:abstractNum>
-  <w:abstractNum w:abstractNumId="35" w15:restartNumberingAfterBreak="0">
+  <w:abstractNum w:abstractNumId="40" w15:restartNumberingAfterBreak="0">
     <w:nsid w:val="1E6658CF"/>
     <w:multiLevelType w:val="multilevel"/>
     <w:tmpl w:val="762ABC5E"/>
@@ -7089,7 +8314,7 @@
       </w:rPr>
     </w:lvl>
   </w:abstractNum>
-  <w:abstractNum w:abstractNumId="36" w15:restartNumberingAfterBreak="0">
+  <w:abstractNum w:abstractNumId="41" w15:restartNumberingAfterBreak="0">
     <w:nsid w:val="1FA532B0"/>
     <w:multiLevelType w:val="multilevel"/>
     <w:tmpl w:val="8718294C"/>
@@ -7238,7 +8463,7 @@
       </w:rPr>
     </w:lvl>
   </w:abstractNum>
-  <w:abstractNum w:abstractNumId="37" w15:restartNumberingAfterBreak="0">
+  <w:abstractNum w:abstractNumId="42" w15:restartNumberingAfterBreak="0">
     <w:nsid w:val="215C77FD"/>
     <w:multiLevelType w:val="hybridMultilevel"/>
     <w:tmpl w:val="58F41D10"/>
@@ -7327,7 +8552,7 @@
       </w:pPr>
     </w:lvl>
   </w:abstractNum>
-  <w:abstractNum w:abstractNumId="38" w15:restartNumberingAfterBreak="0">
+  <w:abstractNum w:abstractNumId="43" w15:restartNumberingAfterBreak="0">
     <w:nsid w:val="218D5909"/>
     <w:multiLevelType w:val="hybridMultilevel"/>
     <w:tmpl w:val="CC989EE4"/>
@@ -7440,7 +8665,7 @@
       </w:rPr>
     </w:lvl>
   </w:abstractNum>
-  <w:abstractNum w:abstractNumId="39" w15:restartNumberingAfterBreak="0">
+  <w:abstractNum w:abstractNumId="44" w15:restartNumberingAfterBreak="0">
     <w:nsid w:val="23E010BA"/>
     <w:multiLevelType w:val="multilevel"/>
     <w:tmpl w:val="4A16907E"/>
@@ -7589,7 +8814,7 @@
       </w:rPr>
     </w:lvl>
   </w:abstractNum>
-  <w:abstractNum w:abstractNumId="40" w15:restartNumberingAfterBreak="0">
+  <w:abstractNum w:abstractNumId="45" w15:restartNumberingAfterBreak="0">
     <w:nsid w:val="2470127A"/>
     <w:multiLevelType w:val="multilevel"/>
     <w:tmpl w:val="309E9618"/>
@@ -7738,7 +8963,7 @@
       </w:rPr>
     </w:lvl>
   </w:abstractNum>
-  <w:abstractNum w:abstractNumId="41" w15:restartNumberingAfterBreak="0">
+  <w:abstractNum w:abstractNumId="46" w15:restartNumberingAfterBreak="0">
     <w:nsid w:val="24796798"/>
     <w:multiLevelType w:val="hybridMultilevel"/>
     <w:tmpl w:val="6622BEDC"/>
@@ -7827,7 +9052,7 @@
       </w:pPr>
     </w:lvl>
   </w:abstractNum>
-  <w:abstractNum w:abstractNumId="42" w15:restartNumberingAfterBreak="0">
+  <w:abstractNum w:abstractNumId="47" w15:restartNumberingAfterBreak="0">
     <w:nsid w:val="253B76EC"/>
     <w:multiLevelType w:val="multilevel"/>
     <w:tmpl w:val="2AA67CDA"/>
@@ -7976,7 +9201,7 @@
       </w:rPr>
     </w:lvl>
   </w:abstractNum>
-  <w:abstractNum w:abstractNumId="43" w15:restartNumberingAfterBreak="0">
+  <w:abstractNum w:abstractNumId="48" w15:restartNumberingAfterBreak="0">
     <w:nsid w:val="2D0F5EA7"/>
     <w:multiLevelType w:val="hybridMultilevel"/>
     <w:tmpl w:val="F68ABCD6"/>
@@ -8089,7 +9314,7 @@
       </w:rPr>
     </w:lvl>
   </w:abstractNum>
-  <w:abstractNum w:abstractNumId="44" w15:restartNumberingAfterBreak="0">
+  <w:abstractNum w:abstractNumId="49" w15:restartNumberingAfterBreak="0">
     <w:nsid w:val="2E4D738C"/>
     <w:multiLevelType w:val="multilevel"/>
     <w:tmpl w:val="1540BBA2"/>
@@ -8238,7 +9463,7 @@
       </w:rPr>
     </w:lvl>
   </w:abstractNum>
-  <w:abstractNum w:abstractNumId="45" w15:restartNumberingAfterBreak="0">
+  <w:abstractNum w:abstractNumId="50" w15:restartNumberingAfterBreak="0">
     <w:nsid w:val="2F0041C7"/>
     <w:multiLevelType w:val="multilevel"/>
     <w:tmpl w:val="656414FE"/>
@@ -8387,7 +9612,7 @@
       </w:rPr>
     </w:lvl>
   </w:abstractNum>
-  <w:abstractNum w:abstractNumId="46" w15:restartNumberingAfterBreak="0">
+  <w:abstractNum w:abstractNumId="51" w15:restartNumberingAfterBreak="0">
     <w:nsid w:val="304F01FA"/>
     <w:multiLevelType w:val="multilevel"/>
     <w:tmpl w:val="151C4EC6"/>
@@ -8536,7 +9761,7 @@
       </w:rPr>
     </w:lvl>
   </w:abstractNum>
-  <w:abstractNum w:abstractNumId="47" w15:restartNumberingAfterBreak="0">
+  <w:abstractNum w:abstractNumId="52" w15:restartNumberingAfterBreak="0">
     <w:nsid w:val="30BD025D"/>
     <w:multiLevelType w:val="hybridMultilevel"/>
     <w:tmpl w:val="04381C82"/>
@@ -8625,7 +9850,7 @@
       </w:pPr>
     </w:lvl>
   </w:abstractNum>
-  <w:abstractNum w:abstractNumId="48" w15:restartNumberingAfterBreak="0">
+  <w:abstractNum w:abstractNumId="53" w15:restartNumberingAfterBreak="0">
     <w:nsid w:val="327C0BA6"/>
     <w:multiLevelType w:val="hybridMultilevel"/>
     <w:tmpl w:val="2A9047EE"/>
@@ -8738,7 +9963,7 @@
       </w:rPr>
     </w:lvl>
   </w:abstractNum>
-  <w:abstractNum w:abstractNumId="49" w15:restartNumberingAfterBreak="0">
+  <w:abstractNum w:abstractNumId="54" w15:restartNumberingAfterBreak="0">
     <w:nsid w:val="338D63E8"/>
     <w:multiLevelType w:val="hybridMultilevel"/>
     <w:tmpl w:val="28D0FB50"/>
@@ -8851,7 +10076,7 @@
       </w:rPr>
     </w:lvl>
   </w:abstractNum>
-  <w:abstractNum w:abstractNumId="50" w15:restartNumberingAfterBreak="0">
+  <w:abstractNum w:abstractNumId="55" w15:restartNumberingAfterBreak="0">
     <w:nsid w:val="34182771"/>
     <w:multiLevelType w:val="multilevel"/>
     <w:tmpl w:val="2AA67CDA"/>
@@ -9000,7 +10225,7 @@
       </w:rPr>
     </w:lvl>
   </w:abstractNum>
-  <w:abstractNum w:abstractNumId="51" w15:restartNumberingAfterBreak="0">
+  <w:abstractNum w:abstractNumId="56" w15:restartNumberingAfterBreak="0">
     <w:nsid w:val="35413E58"/>
     <w:multiLevelType w:val="hybridMultilevel"/>
     <w:tmpl w:val="03C64164"/>
@@ -9113,7 +10338,7 @@
       </w:rPr>
     </w:lvl>
   </w:abstractNum>
-  <w:abstractNum w:abstractNumId="52" w15:restartNumberingAfterBreak="0">
+  <w:abstractNum w:abstractNumId="57" w15:restartNumberingAfterBreak="0">
     <w:nsid w:val="35C86AF0"/>
     <w:multiLevelType w:val="multilevel"/>
     <w:tmpl w:val="8202FCD6"/>
@@ -9262,7 +10487,7 @@
       </w:rPr>
     </w:lvl>
   </w:abstractNum>
-  <w:abstractNum w:abstractNumId="53" w15:restartNumberingAfterBreak="0">
+  <w:abstractNum w:abstractNumId="58" w15:restartNumberingAfterBreak="0">
     <w:nsid w:val="3623194A"/>
     <w:multiLevelType w:val="multilevel"/>
     <w:tmpl w:val="63F4E6F0"/>
@@ -9411,7 +10636,7 @@
       </w:rPr>
     </w:lvl>
   </w:abstractNum>
-  <w:abstractNum w:abstractNumId="54" w15:restartNumberingAfterBreak="0">
+  <w:abstractNum w:abstractNumId="59" w15:restartNumberingAfterBreak="0">
     <w:nsid w:val="36E36979"/>
     <w:multiLevelType w:val="multilevel"/>
     <w:tmpl w:val="3D58C93A"/>
@@ -9560,7 +10785,7 @@
       </w:rPr>
     </w:lvl>
   </w:abstractNum>
-  <w:abstractNum w:abstractNumId="55" w15:restartNumberingAfterBreak="0">
+  <w:abstractNum w:abstractNumId="60" w15:restartNumberingAfterBreak="0">
     <w:nsid w:val="37B424C3"/>
     <w:multiLevelType w:val="hybridMultilevel"/>
     <w:tmpl w:val="18F030D4"/>
@@ -9673,7 +10898,120 @@
       </w:rPr>
     </w:lvl>
   </w:abstractNum>
-  <w:abstractNum w:abstractNumId="56" w15:restartNumberingAfterBreak="0">
+  <w:abstractNum w:abstractNumId="61" w15:restartNumberingAfterBreak="0">
+    <w:nsid w:val="39FC34BD"/>
+    <w:multiLevelType w:val="hybridMultilevel"/>
+    <w:tmpl w:val="D0D4E132"/>
+    <w:lvl w:ilvl="0" w:tplc="04090005">
+      <w:start w:val="1"/>
+      <w:numFmt w:val="bullet"/>
+      <w:lvlText w:val=""/>
+      <w:lvlJc w:val="left"/>
+      <w:pPr>
+        <w:ind w:left="1080" w:hanging="360"/>
+      </w:pPr>
+      <w:rPr>
+        <w:rFonts w:ascii="Wingdings" w:hAnsi="Wingdings" w:hint="default"/>
+      </w:rPr>
+    </w:lvl>
+    <w:lvl w:ilvl="1" w:tplc="04090003" w:tentative="1">
+      <w:start w:val="1"/>
+      <w:numFmt w:val="bullet"/>
+      <w:lvlText w:val="o"/>
+      <w:lvlJc w:val="left"/>
+      <w:pPr>
+        <w:ind w:left="1800" w:hanging="360"/>
+      </w:pPr>
+      <w:rPr>
+        <w:rFonts w:ascii="Courier New" w:hAnsi="Courier New" w:cs="Courier New" w:hint="default"/>
+      </w:rPr>
+    </w:lvl>
+    <w:lvl w:ilvl="2" w:tplc="04090005" w:tentative="1">
+      <w:start w:val="1"/>
+      <w:numFmt w:val="bullet"/>
+      <w:lvlText w:val=""/>
+      <w:lvlJc w:val="left"/>
+      <w:pPr>
+        <w:ind w:left="2520" w:hanging="360"/>
+      </w:pPr>
+      <w:rPr>
+        <w:rFonts w:ascii="Wingdings" w:hAnsi="Wingdings" w:hint="default"/>
+      </w:rPr>
+    </w:lvl>
+    <w:lvl w:ilvl="3" w:tplc="04090001" w:tentative="1">
+      <w:start w:val="1"/>
+      <w:numFmt w:val="bullet"/>
+      <w:lvlText w:val=""/>
+      <w:lvlJc w:val="left"/>
+      <w:pPr>
+        <w:ind w:left="3240" w:hanging="360"/>
+      </w:pPr>
+      <w:rPr>
+        <w:rFonts w:ascii="Symbol" w:hAnsi="Symbol" w:hint="default"/>
+      </w:rPr>
+    </w:lvl>
+    <w:lvl w:ilvl="4" w:tplc="04090003" w:tentative="1">
+      <w:start w:val="1"/>
+      <w:numFmt w:val="bullet"/>
+      <w:lvlText w:val="o"/>
+      <w:lvlJc w:val="left"/>
+      <w:pPr>
+        <w:ind w:left="3960" w:hanging="360"/>
+      </w:pPr>
+      <w:rPr>
+        <w:rFonts w:ascii="Courier New" w:hAnsi="Courier New" w:cs="Courier New" w:hint="default"/>
+      </w:rPr>
+    </w:lvl>
+    <w:lvl w:ilvl="5" w:tplc="04090005" w:tentative="1">
+      <w:start w:val="1"/>
+      <w:numFmt w:val="bullet"/>
+      <w:lvlText w:val=""/>
+      <w:lvlJc w:val="left"/>
+      <w:pPr>
+        <w:ind w:left="4680" w:hanging="360"/>
+      </w:pPr>
+      <w:rPr>
+        <w:rFonts w:ascii="Wingdings" w:hAnsi="Wingdings" w:hint="default"/>
+      </w:rPr>
+    </w:lvl>
+    <w:lvl w:ilvl="6" w:tplc="04090001" w:tentative="1">
+      <w:start w:val="1"/>
+      <w:numFmt w:val="bullet"/>
+      <w:lvlText w:val=""/>
+      <w:lvlJc w:val="left"/>
+      <w:pPr>
+        <w:ind w:left="5400" w:hanging="360"/>
+      </w:pPr>
+      <w:rPr>
+        <w:rFonts w:ascii="Symbol" w:hAnsi="Symbol" w:hint="default"/>
+      </w:rPr>
+    </w:lvl>
+    <w:lvl w:ilvl="7" w:tplc="04090003" w:tentative="1">
+      <w:start w:val="1"/>
+      <w:numFmt w:val="bullet"/>
+      <w:lvlText w:val="o"/>
+      <w:lvlJc w:val="left"/>
+      <w:pPr>
+        <w:ind w:left="6120" w:hanging="360"/>
+      </w:pPr>
+      <w:rPr>
+        <w:rFonts w:ascii="Courier New" w:hAnsi="Courier New" w:cs="Courier New" w:hint="default"/>
+      </w:rPr>
+    </w:lvl>
+    <w:lvl w:ilvl="8" w:tplc="04090005" w:tentative="1">
+      <w:start w:val="1"/>
+      <w:numFmt w:val="bullet"/>
+      <w:lvlText w:val=""/>
+      <w:lvlJc w:val="left"/>
+      <w:pPr>
+        <w:ind w:left="6840" w:hanging="360"/>
+      </w:pPr>
+      <w:rPr>
+        <w:rFonts w:ascii="Wingdings" w:hAnsi="Wingdings" w:hint="default"/>
+      </w:rPr>
+    </w:lvl>
+  </w:abstractNum>
+  <w:abstractNum w:abstractNumId="62" w15:restartNumberingAfterBreak="0">
     <w:nsid w:val="3BC10D30"/>
     <w:multiLevelType w:val="multilevel"/>
     <w:tmpl w:val="502AD78C"/>
@@ -9822,7 +11160,7 @@
       </w:rPr>
     </w:lvl>
   </w:abstractNum>
-  <w:abstractNum w:abstractNumId="57" w15:restartNumberingAfterBreak="0">
+  <w:abstractNum w:abstractNumId="63" w15:restartNumberingAfterBreak="0">
     <w:nsid w:val="3C276BB8"/>
     <w:multiLevelType w:val="multilevel"/>
     <w:tmpl w:val="2AA67CDA"/>
@@ -9971,7 +11309,7 @@
       </w:rPr>
     </w:lvl>
   </w:abstractNum>
-  <w:abstractNum w:abstractNumId="58" w15:restartNumberingAfterBreak="0">
+  <w:abstractNum w:abstractNumId="64" w15:restartNumberingAfterBreak="0">
     <w:nsid w:val="3C596808"/>
     <w:multiLevelType w:val="multilevel"/>
     <w:tmpl w:val="2AA67CDA"/>
@@ -10120,7 +11458,7 @@
       </w:rPr>
     </w:lvl>
   </w:abstractNum>
-  <w:abstractNum w:abstractNumId="59" w15:restartNumberingAfterBreak="0">
+  <w:abstractNum w:abstractNumId="65" w15:restartNumberingAfterBreak="0">
     <w:nsid w:val="3CBF280A"/>
     <w:multiLevelType w:val="multilevel"/>
     <w:tmpl w:val="A13E4362"/>
@@ -10269,7 +11607,7 @@
       </w:rPr>
     </w:lvl>
   </w:abstractNum>
-  <w:abstractNum w:abstractNumId="60" w15:restartNumberingAfterBreak="0">
+  <w:abstractNum w:abstractNumId="66" w15:restartNumberingAfterBreak="0">
     <w:nsid w:val="3CC7541B"/>
     <w:multiLevelType w:val="multilevel"/>
     <w:tmpl w:val="2AA67CDA"/>
@@ -10418,7 +11756,7 @@
       </w:rPr>
     </w:lvl>
   </w:abstractNum>
-  <w:abstractNum w:abstractNumId="61" w15:restartNumberingAfterBreak="0">
+  <w:abstractNum w:abstractNumId="67" w15:restartNumberingAfterBreak="0">
     <w:nsid w:val="3F5E3BA1"/>
     <w:multiLevelType w:val="multilevel"/>
     <w:tmpl w:val="2AA67CDA"/>
@@ -10567,7 +11905,7 @@
       </w:rPr>
     </w:lvl>
   </w:abstractNum>
-  <w:abstractNum w:abstractNumId="62" w15:restartNumberingAfterBreak="0">
+  <w:abstractNum w:abstractNumId="68" w15:restartNumberingAfterBreak="0">
     <w:nsid w:val="40431B1C"/>
     <w:multiLevelType w:val="multilevel"/>
     <w:tmpl w:val="5D8E77D0"/>
@@ -10716,7 +12054,7 @@
       </w:rPr>
     </w:lvl>
   </w:abstractNum>
-  <w:abstractNum w:abstractNumId="63" w15:restartNumberingAfterBreak="0">
+  <w:abstractNum w:abstractNumId="69" w15:restartNumberingAfterBreak="0">
     <w:nsid w:val="419E0199"/>
     <w:multiLevelType w:val="multilevel"/>
     <w:tmpl w:val="D6CA9606"/>
@@ -10865,7 +12203,7 @@
       </w:rPr>
     </w:lvl>
   </w:abstractNum>
-  <w:abstractNum w:abstractNumId="64" w15:restartNumberingAfterBreak="0">
+  <w:abstractNum w:abstractNumId="70" w15:restartNumberingAfterBreak="0">
     <w:nsid w:val="452F60FB"/>
     <w:multiLevelType w:val="hybridMultilevel"/>
     <w:tmpl w:val="892A990A"/>
@@ -10978,7 +12316,7 @@
       </w:rPr>
     </w:lvl>
   </w:abstractNum>
-  <w:abstractNum w:abstractNumId="65" w15:restartNumberingAfterBreak="0">
+  <w:abstractNum w:abstractNumId="71" w15:restartNumberingAfterBreak="0">
     <w:nsid w:val="47B65409"/>
     <w:multiLevelType w:val="multilevel"/>
     <w:tmpl w:val="2AA67CDA"/>
@@ -11127,7 +12465,7 @@
       </w:rPr>
     </w:lvl>
   </w:abstractNum>
-  <w:abstractNum w:abstractNumId="66" w15:restartNumberingAfterBreak="0">
+  <w:abstractNum w:abstractNumId="72" w15:restartNumberingAfterBreak="0">
     <w:nsid w:val="47BF2170"/>
     <w:multiLevelType w:val="multilevel"/>
     <w:tmpl w:val="D9681266"/>
@@ -11276,7 +12614,7 @@
       </w:rPr>
     </w:lvl>
   </w:abstractNum>
-  <w:abstractNum w:abstractNumId="67" w15:restartNumberingAfterBreak="0">
+  <w:abstractNum w:abstractNumId="73" w15:restartNumberingAfterBreak="0">
     <w:nsid w:val="47E5592F"/>
     <w:multiLevelType w:val="hybridMultilevel"/>
     <w:tmpl w:val="719AB9FA"/>
@@ -11389,7 +12727,7 @@
       </w:rPr>
     </w:lvl>
   </w:abstractNum>
-  <w:abstractNum w:abstractNumId="68" w15:restartNumberingAfterBreak="0">
+  <w:abstractNum w:abstractNumId="74" w15:restartNumberingAfterBreak="0">
     <w:nsid w:val="48C041A9"/>
     <w:multiLevelType w:val="multilevel"/>
     <w:tmpl w:val="59A694BC"/>
@@ -11538,7 +12876,7 @@
       </w:rPr>
     </w:lvl>
   </w:abstractNum>
-  <w:abstractNum w:abstractNumId="69" w15:restartNumberingAfterBreak="0">
+  <w:abstractNum w:abstractNumId="75" w15:restartNumberingAfterBreak="0">
     <w:nsid w:val="49D6568A"/>
     <w:multiLevelType w:val="multilevel"/>
     <w:tmpl w:val="559E29EC"/>
@@ -11687,7 +13025,120 @@
       </w:rPr>
     </w:lvl>
   </w:abstractNum>
-  <w:abstractNum w:abstractNumId="70" w15:restartNumberingAfterBreak="0">
+  <w:abstractNum w:abstractNumId="76" w15:restartNumberingAfterBreak="0">
+    <w:nsid w:val="4A7C2BC0"/>
+    <w:multiLevelType w:val="hybridMultilevel"/>
+    <w:tmpl w:val="4E4ADB18"/>
+    <w:lvl w:ilvl="0" w:tplc="04090005">
+      <w:start w:val="1"/>
+      <w:numFmt w:val="bullet"/>
+      <w:lvlText w:val=""/>
+      <w:lvlJc w:val="left"/>
+      <w:pPr>
+        <w:ind w:left="1080" w:hanging="360"/>
+      </w:pPr>
+      <w:rPr>
+        <w:rFonts w:ascii="Wingdings" w:hAnsi="Wingdings" w:hint="default"/>
+      </w:rPr>
+    </w:lvl>
+    <w:lvl w:ilvl="1" w:tplc="04090003" w:tentative="1">
+      <w:start w:val="1"/>
+      <w:numFmt w:val="bullet"/>
+      <w:lvlText w:val="o"/>
+      <w:lvlJc w:val="left"/>
+      <w:pPr>
+        <w:ind w:left="1800" w:hanging="360"/>
+      </w:pPr>
+      <w:rPr>
+        <w:rFonts w:ascii="Courier New" w:hAnsi="Courier New" w:cs="Courier New" w:hint="default"/>
+      </w:rPr>
+    </w:lvl>
+    <w:lvl w:ilvl="2" w:tplc="04090005" w:tentative="1">
+      <w:start w:val="1"/>
+      <w:numFmt w:val="bullet"/>
+      <w:lvlText w:val=""/>
+      <w:lvlJc w:val="left"/>
+      <w:pPr>
+        <w:ind w:left="2520" w:hanging="360"/>
+      </w:pPr>
+      <w:rPr>
+        <w:rFonts w:ascii="Wingdings" w:hAnsi="Wingdings" w:hint="default"/>
+      </w:rPr>
+    </w:lvl>
+    <w:lvl w:ilvl="3" w:tplc="04090001" w:tentative="1">
+      <w:start w:val="1"/>
+      <w:numFmt w:val="bullet"/>
+      <w:lvlText w:val=""/>
+      <w:lvlJc w:val="left"/>
+      <w:pPr>
+        <w:ind w:left="3240" w:hanging="360"/>
+      </w:pPr>
+      <w:rPr>
+        <w:rFonts w:ascii="Symbol" w:hAnsi="Symbol" w:hint="default"/>
+      </w:rPr>
+    </w:lvl>
+    <w:lvl w:ilvl="4" w:tplc="04090003" w:tentative="1">
+      <w:start w:val="1"/>
+      <w:numFmt w:val="bullet"/>
+      <w:lvlText w:val="o"/>
+      <w:lvlJc w:val="left"/>
+      <w:pPr>
+        <w:ind w:left="3960" w:hanging="360"/>
+      </w:pPr>
+      <w:rPr>
+        <w:rFonts w:ascii="Courier New" w:hAnsi="Courier New" w:cs="Courier New" w:hint="default"/>
+      </w:rPr>
+    </w:lvl>
+    <w:lvl w:ilvl="5" w:tplc="04090005" w:tentative="1">
+      <w:start w:val="1"/>
+      <w:numFmt w:val="bullet"/>
+      <w:lvlText w:val=""/>
+      <w:lvlJc w:val="left"/>
+      <w:pPr>
+        <w:ind w:left="4680" w:hanging="360"/>
+      </w:pPr>
+      <w:rPr>
+        <w:rFonts w:ascii="Wingdings" w:hAnsi="Wingdings" w:hint="default"/>
+      </w:rPr>
+    </w:lvl>
+    <w:lvl w:ilvl="6" w:tplc="04090001" w:tentative="1">
+      <w:start w:val="1"/>
+      <w:numFmt w:val="bullet"/>
+      <w:lvlText w:val=""/>
+      <w:lvlJc w:val="left"/>
+      <w:pPr>
+        <w:ind w:left="5400" w:hanging="360"/>
+      </w:pPr>
+      <w:rPr>
+        <w:rFonts w:ascii="Symbol" w:hAnsi="Symbol" w:hint="default"/>
+      </w:rPr>
+    </w:lvl>
+    <w:lvl w:ilvl="7" w:tplc="04090003" w:tentative="1">
+      <w:start w:val="1"/>
+      <w:numFmt w:val="bullet"/>
+      <w:lvlText w:val="o"/>
+      <w:lvlJc w:val="left"/>
+      <w:pPr>
+        <w:ind w:left="6120" w:hanging="360"/>
+      </w:pPr>
+      <w:rPr>
+        <w:rFonts w:ascii="Courier New" w:hAnsi="Courier New" w:cs="Courier New" w:hint="default"/>
+      </w:rPr>
+    </w:lvl>
+    <w:lvl w:ilvl="8" w:tplc="04090005" w:tentative="1">
+      <w:start w:val="1"/>
+      <w:numFmt w:val="bullet"/>
+      <w:lvlText w:val=""/>
+      <w:lvlJc w:val="left"/>
+      <w:pPr>
+        <w:ind w:left="6840" w:hanging="360"/>
+      </w:pPr>
+      <w:rPr>
+        <w:rFonts w:ascii="Wingdings" w:hAnsi="Wingdings" w:hint="default"/>
+      </w:rPr>
+    </w:lvl>
+  </w:abstractNum>
+  <w:abstractNum w:abstractNumId="77" w15:restartNumberingAfterBreak="0">
     <w:nsid w:val="4AF73293"/>
     <w:multiLevelType w:val="hybridMultilevel"/>
     <w:tmpl w:val="F2962738"/>
@@ -11800,7 +13251,7 @@
       </w:rPr>
     </w:lvl>
   </w:abstractNum>
-  <w:abstractNum w:abstractNumId="71" w15:restartNumberingAfterBreak="0">
+  <w:abstractNum w:abstractNumId="78" w15:restartNumberingAfterBreak="0">
     <w:nsid w:val="4B375248"/>
     <w:multiLevelType w:val="multilevel"/>
     <w:tmpl w:val="B574C1C6"/>
@@ -11949,7 +13400,7 @@
       </w:rPr>
     </w:lvl>
   </w:abstractNum>
-  <w:abstractNum w:abstractNumId="72" w15:restartNumberingAfterBreak="0">
+  <w:abstractNum w:abstractNumId="79" w15:restartNumberingAfterBreak="0">
     <w:nsid w:val="4BA13766"/>
     <w:multiLevelType w:val="multilevel"/>
     <w:tmpl w:val="63F4E6F0"/>
@@ -12098,7 +13549,7 @@
       </w:rPr>
     </w:lvl>
   </w:abstractNum>
-  <w:abstractNum w:abstractNumId="73" w15:restartNumberingAfterBreak="0">
+  <w:abstractNum w:abstractNumId="80" w15:restartNumberingAfterBreak="0">
     <w:nsid w:val="4BA25441"/>
     <w:multiLevelType w:val="hybridMultilevel"/>
     <w:tmpl w:val="217E2E96"/>
@@ -12211,7 +13662,7 @@
       </w:rPr>
     </w:lvl>
   </w:abstractNum>
-  <w:abstractNum w:abstractNumId="74" w15:restartNumberingAfterBreak="0">
+  <w:abstractNum w:abstractNumId="81" w15:restartNumberingAfterBreak="0">
     <w:nsid w:val="4E276DCB"/>
     <w:multiLevelType w:val="hybridMultilevel"/>
     <w:tmpl w:val="B7C469B4"/>
@@ -12324,7 +13775,7 @@
       </w:rPr>
     </w:lvl>
   </w:abstractNum>
-  <w:abstractNum w:abstractNumId="75" w15:restartNumberingAfterBreak="0">
+  <w:abstractNum w:abstractNumId="82" w15:restartNumberingAfterBreak="0">
     <w:nsid w:val="4F053929"/>
     <w:multiLevelType w:val="hybridMultilevel"/>
     <w:tmpl w:val="2A78C678"/>
@@ -12437,7 +13888,120 @@
       </w:rPr>
     </w:lvl>
   </w:abstractNum>
-  <w:abstractNum w:abstractNumId="76" w15:restartNumberingAfterBreak="0">
+  <w:abstractNum w:abstractNumId="83" w15:restartNumberingAfterBreak="0">
+    <w:nsid w:val="4F750073"/>
+    <w:multiLevelType w:val="hybridMultilevel"/>
+    <w:tmpl w:val="EC7AB8FC"/>
+    <w:lvl w:ilvl="0" w:tplc="04090003">
+      <w:start w:val="1"/>
+      <w:numFmt w:val="bullet"/>
+      <w:lvlText w:val="o"/>
+      <w:lvlJc w:val="left"/>
+      <w:pPr>
+        <w:ind w:left="1080" w:hanging="360"/>
+      </w:pPr>
+      <w:rPr>
+        <w:rFonts w:ascii="Courier New" w:hAnsi="Courier New" w:cs="Courier New" w:hint="default"/>
+      </w:rPr>
+    </w:lvl>
+    <w:lvl w:ilvl="1" w:tplc="04090003" w:tentative="1">
+      <w:start w:val="1"/>
+      <w:numFmt w:val="bullet"/>
+      <w:lvlText w:val="o"/>
+      <w:lvlJc w:val="left"/>
+      <w:pPr>
+        <w:ind w:left="1800" w:hanging="360"/>
+      </w:pPr>
+      <w:rPr>
+        <w:rFonts w:ascii="Courier New" w:hAnsi="Courier New" w:cs="Courier New" w:hint="default"/>
+      </w:rPr>
+    </w:lvl>
+    <w:lvl w:ilvl="2" w:tplc="04090005" w:tentative="1">
+      <w:start w:val="1"/>
+      <w:numFmt w:val="bullet"/>
+      <w:lvlText w:val=""/>
+      <w:lvlJc w:val="left"/>
+      <w:pPr>
+        <w:ind w:left="2520" w:hanging="360"/>
+      </w:pPr>
+      <w:rPr>
+        <w:rFonts w:ascii="Wingdings" w:hAnsi="Wingdings" w:hint="default"/>
+      </w:rPr>
+    </w:lvl>
+    <w:lvl w:ilvl="3" w:tplc="04090001" w:tentative="1">
+      <w:start w:val="1"/>
+      <w:numFmt w:val="bullet"/>
+      <w:lvlText w:val=""/>
+      <w:lvlJc w:val="left"/>
+      <w:pPr>
+        <w:ind w:left="3240" w:hanging="360"/>
+      </w:pPr>
+      <w:rPr>
+        <w:rFonts w:ascii="Symbol" w:hAnsi="Symbol" w:hint="default"/>
+      </w:rPr>
+    </w:lvl>
+    <w:lvl w:ilvl="4" w:tplc="04090003" w:tentative="1">
+      <w:start w:val="1"/>
+      <w:numFmt w:val="bullet"/>
+      <w:lvlText w:val="o"/>
+      <w:lvlJc w:val="left"/>
+      <w:pPr>
+        <w:ind w:left="3960" w:hanging="360"/>
+      </w:pPr>
+      <w:rPr>
+        <w:rFonts w:ascii="Courier New" w:hAnsi="Courier New" w:cs="Courier New" w:hint="default"/>
+      </w:rPr>
+    </w:lvl>
+    <w:lvl w:ilvl="5" w:tplc="04090005" w:tentative="1">
+      <w:start w:val="1"/>
+      <w:numFmt w:val="bullet"/>
+      <w:lvlText w:val=""/>
+      <w:lvlJc w:val="left"/>
+      <w:pPr>
+        <w:ind w:left="4680" w:hanging="360"/>
+      </w:pPr>
+      <w:rPr>
+        <w:rFonts w:ascii="Wingdings" w:hAnsi="Wingdings" w:hint="default"/>
+      </w:rPr>
+    </w:lvl>
+    <w:lvl w:ilvl="6" w:tplc="04090001" w:tentative="1">
+      <w:start w:val="1"/>
+      <w:numFmt w:val="bullet"/>
+      <w:lvlText w:val=""/>
+      <w:lvlJc w:val="left"/>
+      <w:pPr>
+        <w:ind w:left="5400" w:hanging="360"/>
+      </w:pPr>
+      <w:rPr>
+        <w:rFonts w:ascii="Symbol" w:hAnsi="Symbol" w:hint="default"/>
+      </w:rPr>
+    </w:lvl>
+    <w:lvl w:ilvl="7" w:tplc="04090003" w:tentative="1">
+      <w:start w:val="1"/>
+      <w:numFmt w:val="bullet"/>
+      <w:lvlText w:val="o"/>
+      <w:lvlJc w:val="left"/>
+      <w:pPr>
+        <w:ind w:left="6120" w:hanging="360"/>
+      </w:pPr>
+      <w:rPr>
+        <w:rFonts w:ascii="Courier New" w:hAnsi="Courier New" w:cs="Courier New" w:hint="default"/>
+      </w:rPr>
+    </w:lvl>
+    <w:lvl w:ilvl="8" w:tplc="04090005" w:tentative="1">
+      <w:start w:val="1"/>
+      <w:numFmt w:val="bullet"/>
+      <w:lvlText w:val=""/>
+      <w:lvlJc w:val="left"/>
+      <w:pPr>
+        <w:ind w:left="6840" w:hanging="360"/>
+      </w:pPr>
+      <w:rPr>
+        <w:rFonts w:ascii="Wingdings" w:hAnsi="Wingdings" w:hint="default"/>
+      </w:rPr>
+    </w:lvl>
+  </w:abstractNum>
+  <w:abstractNum w:abstractNumId="84" w15:restartNumberingAfterBreak="0">
     <w:nsid w:val="4FFB237E"/>
     <w:multiLevelType w:val="multilevel"/>
     <w:tmpl w:val="2AA67CDA"/>
@@ -12586,7 +14150,7 @@
       </w:rPr>
     </w:lvl>
   </w:abstractNum>
-  <w:abstractNum w:abstractNumId="77" w15:restartNumberingAfterBreak="0">
+  <w:abstractNum w:abstractNumId="85" w15:restartNumberingAfterBreak="0">
     <w:nsid w:val="51737FE0"/>
     <w:multiLevelType w:val="hybridMultilevel"/>
     <w:tmpl w:val="2B0604E6"/>
@@ -12699,7 +14263,7 @@
       </w:rPr>
     </w:lvl>
   </w:abstractNum>
-  <w:abstractNum w:abstractNumId="78" w15:restartNumberingAfterBreak="0">
+  <w:abstractNum w:abstractNumId="86" w15:restartNumberingAfterBreak="0">
     <w:nsid w:val="518B1885"/>
     <w:multiLevelType w:val="multilevel"/>
     <w:tmpl w:val="AE1AAC28"/>
@@ -12848,7 +14412,7 @@
       </w:rPr>
     </w:lvl>
   </w:abstractNum>
-  <w:abstractNum w:abstractNumId="79" w15:restartNumberingAfterBreak="0">
+  <w:abstractNum w:abstractNumId="87" w15:restartNumberingAfterBreak="0">
     <w:nsid w:val="51A86EF8"/>
     <w:multiLevelType w:val="multilevel"/>
     <w:tmpl w:val="FF2841D4"/>
@@ -12997,7 +14561,7 @@
       </w:rPr>
     </w:lvl>
   </w:abstractNum>
-  <w:abstractNum w:abstractNumId="80" w15:restartNumberingAfterBreak="0">
+  <w:abstractNum w:abstractNumId="88" w15:restartNumberingAfterBreak="0">
     <w:nsid w:val="51AB55CC"/>
     <w:multiLevelType w:val="multilevel"/>
     <w:tmpl w:val="5986D838"/>
@@ -13146,7 +14710,7 @@
       </w:rPr>
     </w:lvl>
   </w:abstractNum>
-  <w:abstractNum w:abstractNumId="81" w15:restartNumberingAfterBreak="0">
+  <w:abstractNum w:abstractNumId="89" w15:restartNumberingAfterBreak="0">
     <w:nsid w:val="521378FF"/>
     <w:multiLevelType w:val="multilevel"/>
     <w:tmpl w:val="7B002268"/>
@@ -13295,7 +14859,7 @@
       </w:rPr>
     </w:lvl>
   </w:abstractNum>
-  <w:abstractNum w:abstractNumId="82" w15:restartNumberingAfterBreak="0">
+  <w:abstractNum w:abstractNumId="90" w15:restartNumberingAfterBreak="0">
     <w:nsid w:val="521F2792"/>
     <w:multiLevelType w:val="multilevel"/>
     <w:tmpl w:val="9FB45386"/>
@@ -13444,7 +15008,7 @@
       </w:rPr>
     </w:lvl>
   </w:abstractNum>
-  <w:abstractNum w:abstractNumId="83" w15:restartNumberingAfterBreak="0">
+  <w:abstractNum w:abstractNumId="91" w15:restartNumberingAfterBreak="0">
     <w:nsid w:val="53390911"/>
     <w:multiLevelType w:val="multilevel"/>
     <w:tmpl w:val="1C380F12"/>
@@ -13593,7 +15157,7 @@
       </w:rPr>
     </w:lvl>
   </w:abstractNum>
-  <w:abstractNum w:abstractNumId="84" w15:restartNumberingAfterBreak="0">
+  <w:abstractNum w:abstractNumId="92" w15:restartNumberingAfterBreak="0">
     <w:nsid w:val="53CD23AC"/>
     <w:multiLevelType w:val="multilevel"/>
     <w:tmpl w:val="57BAE8F0"/>
@@ -13742,7 +15306,7 @@
       </w:rPr>
     </w:lvl>
   </w:abstractNum>
-  <w:abstractNum w:abstractNumId="85" w15:restartNumberingAfterBreak="0">
+  <w:abstractNum w:abstractNumId="93" w15:restartNumberingAfterBreak="0">
     <w:nsid w:val="5462791F"/>
     <w:multiLevelType w:val="hybridMultilevel"/>
     <w:tmpl w:val="FDE24C26"/>
@@ -13855,7 +15419,7 @@
       </w:rPr>
     </w:lvl>
   </w:abstractNum>
-  <w:abstractNum w:abstractNumId="86" w15:restartNumberingAfterBreak="0">
+  <w:abstractNum w:abstractNumId="94" w15:restartNumberingAfterBreak="0">
     <w:nsid w:val="547005EB"/>
     <w:multiLevelType w:val="multilevel"/>
     <w:tmpl w:val="F260CC5C"/>
@@ -14004,7 +15568,7 @@
       </w:rPr>
     </w:lvl>
   </w:abstractNum>
-  <w:abstractNum w:abstractNumId="87" w15:restartNumberingAfterBreak="0">
+  <w:abstractNum w:abstractNumId="95" w15:restartNumberingAfterBreak="0">
     <w:nsid w:val="58034221"/>
     <w:multiLevelType w:val="hybridMultilevel"/>
     <w:tmpl w:val="65D0619C"/>
@@ -14117,7 +15681,7 @@
       </w:rPr>
     </w:lvl>
   </w:abstractNum>
-  <w:abstractNum w:abstractNumId="88" w15:restartNumberingAfterBreak="0">
+  <w:abstractNum w:abstractNumId="96" w15:restartNumberingAfterBreak="0">
     <w:nsid w:val="59515319"/>
     <w:multiLevelType w:val="multilevel"/>
     <w:tmpl w:val="5AD8ACF0"/>
@@ -14266,7 +15830,7 @@
       </w:rPr>
     </w:lvl>
   </w:abstractNum>
-  <w:abstractNum w:abstractNumId="89" w15:restartNumberingAfterBreak="0">
+  <w:abstractNum w:abstractNumId="97" w15:restartNumberingAfterBreak="0">
     <w:nsid w:val="5A460390"/>
     <w:multiLevelType w:val="hybridMultilevel"/>
     <w:tmpl w:val="BD8E939C"/>
@@ -14379,7 +15943,7 @@
       </w:rPr>
     </w:lvl>
   </w:abstractNum>
-  <w:abstractNum w:abstractNumId="90" w15:restartNumberingAfterBreak="0">
+  <w:abstractNum w:abstractNumId="98" w15:restartNumberingAfterBreak="0">
     <w:nsid w:val="5CEE630B"/>
     <w:multiLevelType w:val="hybridMultilevel"/>
     <w:tmpl w:val="DE8E8DBA"/>
@@ -14492,7 +16056,7 @@
       </w:rPr>
     </w:lvl>
   </w:abstractNum>
-  <w:abstractNum w:abstractNumId="91" w15:restartNumberingAfterBreak="0">
+  <w:abstractNum w:abstractNumId="99" w15:restartNumberingAfterBreak="0">
     <w:nsid w:val="5D5A183C"/>
     <w:multiLevelType w:val="multilevel"/>
     <w:tmpl w:val="C804C34A"/>
@@ -14641,7 +16205,7 @@
       </w:rPr>
     </w:lvl>
   </w:abstractNum>
-  <w:abstractNum w:abstractNumId="92" w15:restartNumberingAfterBreak="0">
+  <w:abstractNum w:abstractNumId="100" w15:restartNumberingAfterBreak="0">
     <w:nsid w:val="5DF95194"/>
     <w:multiLevelType w:val="multilevel"/>
     <w:tmpl w:val="CC127E54"/>
@@ -14790,7 +16354,7 @@
       </w:rPr>
     </w:lvl>
   </w:abstractNum>
-  <w:abstractNum w:abstractNumId="93" w15:restartNumberingAfterBreak="0">
+  <w:abstractNum w:abstractNumId="101" w15:restartNumberingAfterBreak="0">
     <w:nsid w:val="5E6333E0"/>
     <w:multiLevelType w:val="hybridMultilevel"/>
     <w:tmpl w:val="A15497C8"/>
@@ -14903,7 +16467,7 @@
       </w:rPr>
     </w:lvl>
   </w:abstractNum>
-  <w:abstractNum w:abstractNumId="94" w15:restartNumberingAfterBreak="0">
+  <w:abstractNum w:abstractNumId="102" w15:restartNumberingAfterBreak="0">
     <w:nsid w:val="5E9C452C"/>
     <w:multiLevelType w:val="multilevel"/>
     <w:tmpl w:val="B8727936"/>
@@ -15052,7 +16616,7 @@
       </w:rPr>
     </w:lvl>
   </w:abstractNum>
-  <w:abstractNum w:abstractNumId="95" w15:restartNumberingAfterBreak="0">
+  <w:abstractNum w:abstractNumId="103" w15:restartNumberingAfterBreak="0">
     <w:nsid w:val="5EC339A8"/>
     <w:multiLevelType w:val="multilevel"/>
     <w:tmpl w:val="36DAAD54"/>
@@ -15201,7 +16765,7 @@
       </w:rPr>
     </w:lvl>
   </w:abstractNum>
-  <w:abstractNum w:abstractNumId="96" w15:restartNumberingAfterBreak="0">
+  <w:abstractNum w:abstractNumId="104" w15:restartNumberingAfterBreak="0">
     <w:nsid w:val="62385AA6"/>
     <w:multiLevelType w:val="multilevel"/>
     <w:tmpl w:val="B9EAECD4"/>
@@ -15350,7 +16914,7 @@
       </w:rPr>
     </w:lvl>
   </w:abstractNum>
-  <w:abstractNum w:abstractNumId="97" w15:restartNumberingAfterBreak="0">
+  <w:abstractNum w:abstractNumId="105" w15:restartNumberingAfterBreak="0">
     <w:nsid w:val="625D686D"/>
     <w:multiLevelType w:val="multilevel"/>
     <w:tmpl w:val="BC1C2048"/>
@@ -15499,7 +17063,7 @@
       </w:rPr>
     </w:lvl>
   </w:abstractNum>
-  <w:abstractNum w:abstractNumId="98" w15:restartNumberingAfterBreak="0">
+  <w:abstractNum w:abstractNumId="106" w15:restartNumberingAfterBreak="0">
     <w:nsid w:val="62B46951"/>
     <w:multiLevelType w:val="hybridMultilevel"/>
     <w:tmpl w:val="0FEAFEC6"/>
@@ -15612,7 +17176,7 @@
       </w:rPr>
     </w:lvl>
   </w:abstractNum>
-  <w:abstractNum w:abstractNumId="99" w15:restartNumberingAfterBreak="0">
+  <w:abstractNum w:abstractNumId="107" w15:restartNumberingAfterBreak="0">
     <w:nsid w:val="647819E3"/>
     <w:multiLevelType w:val="multilevel"/>
     <w:tmpl w:val="ABB278BC"/>
@@ -15761,7 +17325,7 @@
       </w:rPr>
     </w:lvl>
   </w:abstractNum>
-  <w:abstractNum w:abstractNumId="100" w15:restartNumberingAfterBreak="0">
+  <w:abstractNum w:abstractNumId="108" w15:restartNumberingAfterBreak="0">
     <w:nsid w:val="64F30198"/>
     <w:multiLevelType w:val="multilevel"/>
     <w:tmpl w:val="63F4E6F0"/>
@@ -15910,7 +17474,7 @@
       </w:rPr>
     </w:lvl>
   </w:abstractNum>
-  <w:abstractNum w:abstractNumId="101" w15:restartNumberingAfterBreak="0">
+  <w:abstractNum w:abstractNumId="109" w15:restartNumberingAfterBreak="0">
     <w:nsid w:val="65314293"/>
     <w:multiLevelType w:val="hybridMultilevel"/>
     <w:tmpl w:val="6688DFAC"/>
@@ -16023,7 +17587,7 @@
       </w:rPr>
     </w:lvl>
   </w:abstractNum>
-  <w:abstractNum w:abstractNumId="102" w15:restartNumberingAfterBreak="0">
+  <w:abstractNum w:abstractNumId="110" w15:restartNumberingAfterBreak="0">
     <w:nsid w:val="65CE4D0F"/>
     <w:multiLevelType w:val="hybridMultilevel"/>
     <w:tmpl w:val="DB668538"/>
@@ -16136,7 +17700,7 @@
       </w:rPr>
     </w:lvl>
   </w:abstractNum>
-  <w:abstractNum w:abstractNumId="103" w15:restartNumberingAfterBreak="0">
+  <w:abstractNum w:abstractNumId="111" w15:restartNumberingAfterBreak="0">
     <w:nsid w:val="661C7D73"/>
     <w:multiLevelType w:val="multilevel"/>
     <w:tmpl w:val="D9681266"/>
@@ -16285,7 +17849,7 @@
       </w:rPr>
     </w:lvl>
   </w:abstractNum>
-  <w:abstractNum w:abstractNumId="104" w15:restartNumberingAfterBreak="0">
+  <w:abstractNum w:abstractNumId="112" w15:restartNumberingAfterBreak="0">
     <w:nsid w:val="661F6F82"/>
     <w:multiLevelType w:val="multilevel"/>
     <w:tmpl w:val="53F8A934"/>
@@ -16434,7 +17998,7 @@
       </w:rPr>
     </w:lvl>
   </w:abstractNum>
-  <w:abstractNum w:abstractNumId="105" w15:restartNumberingAfterBreak="0">
+  <w:abstractNum w:abstractNumId="113" w15:restartNumberingAfterBreak="0">
     <w:nsid w:val="66E36FE0"/>
     <w:multiLevelType w:val="multilevel"/>
     <w:tmpl w:val="2AA67CDA"/>
@@ -16583,7 +18147,7 @@
       </w:rPr>
     </w:lvl>
   </w:abstractNum>
-  <w:abstractNum w:abstractNumId="106" w15:restartNumberingAfterBreak="0">
+  <w:abstractNum w:abstractNumId="114" w15:restartNumberingAfterBreak="0">
     <w:nsid w:val="68205EC5"/>
     <w:multiLevelType w:val="multilevel"/>
     <w:tmpl w:val="EB4C8238"/>
@@ -16732,7 +18296,7 @@
       </w:rPr>
     </w:lvl>
   </w:abstractNum>
-  <w:abstractNum w:abstractNumId="107" w15:restartNumberingAfterBreak="0">
+  <w:abstractNum w:abstractNumId="115" w15:restartNumberingAfterBreak="0">
     <w:nsid w:val="68B94344"/>
     <w:multiLevelType w:val="multilevel"/>
     <w:tmpl w:val="9BA812D8"/>
@@ -16881,7 +18445,7 @@
       </w:rPr>
     </w:lvl>
   </w:abstractNum>
-  <w:abstractNum w:abstractNumId="108" w15:restartNumberingAfterBreak="0">
+  <w:abstractNum w:abstractNumId="116" w15:restartNumberingAfterBreak="0">
     <w:nsid w:val="69DE2C87"/>
     <w:multiLevelType w:val="hybridMultilevel"/>
     <w:tmpl w:val="F530F20A"/>
@@ -16994,7 +18558,7 @@
       </w:rPr>
     </w:lvl>
   </w:abstractNum>
-  <w:abstractNum w:abstractNumId="109" w15:restartNumberingAfterBreak="0">
+  <w:abstractNum w:abstractNumId="117" w15:restartNumberingAfterBreak="0">
     <w:nsid w:val="69ED672D"/>
     <w:multiLevelType w:val="multilevel"/>
     <w:tmpl w:val="CC08E300"/>
@@ -17143,7 +18707,7 @@
       </w:rPr>
     </w:lvl>
   </w:abstractNum>
-  <w:abstractNum w:abstractNumId="110" w15:restartNumberingAfterBreak="0">
+  <w:abstractNum w:abstractNumId="118" w15:restartNumberingAfterBreak="0">
     <w:nsid w:val="6A063EFD"/>
     <w:multiLevelType w:val="hybridMultilevel"/>
     <w:tmpl w:val="48703FBA"/>
@@ -17256,7 +18820,7 @@
       </w:rPr>
     </w:lvl>
   </w:abstractNum>
-  <w:abstractNum w:abstractNumId="111" w15:restartNumberingAfterBreak="0">
+  <w:abstractNum w:abstractNumId="119" w15:restartNumberingAfterBreak="0">
     <w:nsid w:val="6A825ABE"/>
     <w:multiLevelType w:val="multilevel"/>
     <w:tmpl w:val="0CD6F30E"/>
@@ -17405,7 +18969,7 @@
       </w:rPr>
     </w:lvl>
   </w:abstractNum>
-  <w:abstractNum w:abstractNumId="112" w15:restartNumberingAfterBreak="0">
+  <w:abstractNum w:abstractNumId="120" w15:restartNumberingAfterBreak="0">
     <w:nsid w:val="6B1D7832"/>
     <w:multiLevelType w:val="multilevel"/>
     <w:tmpl w:val="DD4646B2"/>
@@ -17554,7 +19118,7 @@
       </w:rPr>
     </w:lvl>
   </w:abstractNum>
-  <w:abstractNum w:abstractNumId="113" w15:restartNumberingAfterBreak="0">
+  <w:abstractNum w:abstractNumId="121" w15:restartNumberingAfterBreak="0">
     <w:nsid w:val="6C6D6667"/>
     <w:multiLevelType w:val="hybridMultilevel"/>
     <w:tmpl w:val="A744709C"/>
@@ -17667,7 +19231,7 @@
       </w:rPr>
     </w:lvl>
   </w:abstractNum>
-  <w:abstractNum w:abstractNumId="114" w15:restartNumberingAfterBreak="0">
+  <w:abstractNum w:abstractNumId="122" w15:restartNumberingAfterBreak="0">
     <w:nsid w:val="6CAD7EA5"/>
     <w:multiLevelType w:val="multilevel"/>
     <w:tmpl w:val="C472C5B0"/>
@@ -17816,7 +19380,7 @@
       </w:rPr>
     </w:lvl>
   </w:abstractNum>
-  <w:abstractNum w:abstractNumId="115" w15:restartNumberingAfterBreak="0">
+  <w:abstractNum w:abstractNumId="123" w15:restartNumberingAfterBreak="0">
     <w:nsid w:val="6E43557B"/>
     <w:multiLevelType w:val="multilevel"/>
     <w:tmpl w:val="323C7112"/>
@@ -17965,7 +19529,7 @@
       </w:rPr>
     </w:lvl>
   </w:abstractNum>
-  <w:abstractNum w:abstractNumId="116" w15:restartNumberingAfterBreak="0">
+  <w:abstractNum w:abstractNumId="124" w15:restartNumberingAfterBreak="0">
     <w:nsid w:val="6EA27D0A"/>
     <w:multiLevelType w:val="multilevel"/>
     <w:tmpl w:val="7BF0256C"/>
@@ -18114,7 +19678,7 @@
       </w:rPr>
     </w:lvl>
   </w:abstractNum>
-  <w:abstractNum w:abstractNumId="117" w15:restartNumberingAfterBreak="0">
+  <w:abstractNum w:abstractNumId="125" w15:restartNumberingAfterBreak="0">
     <w:nsid w:val="6EF86273"/>
     <w:multiLevelType w:val="multilevel"/>
     <w:tmpl w:val="2AA67CDA"/>
@@ -18263,7 +19827,7 @@
       </w:rPr>
     </w:lvl>
   </w:abstractNum>
-  <w:abstractNum w:abstractNumId="118" w15:restartNumberingAfterBreak="0">
+  <w:abstractNum w:abstractNumId="126" w15:restartNumberingAfterBreak="0">
     <w:nsid w:val="70874300"/>
     <w:multiLevelType w:val="hybridMultilevel"/>
     <w:tmpl w:val="1B3A0518"/>
@@ -18376,7 +19940,7 @@
       </w:rPr>
     </w:lvl>
   </w:abstractNum>
-  <w:abstractNum w:abstractNumId="119" w15:restartNumberingAfterBreak="0">
+  <w:abstractNum w:abstractNumId="127" w15:restartNumberingAfterBreak="0">
     <w:nsid w:val="7090251B"/>
     <w:multiLevelType w:val="hybridMultilevel"/>
     <w:tmpl w:val="67687EFE"/>
@@ -18489,7 +20053,7 @@
       </w:rPr>
     </w:lvl>
   </w:abstractNum>
-  <w:abstractNum w:abstractNumId="120" w15:restartNumberingAfterBreak="0">
+  <w:abstractNum w:abstractNumId="128" w15:restartNumberingAfterBreak="0">
     <w:nsid w:val="72031F81"/>
     <w:multiLevelType w:val="multilevel"/>
     <w:tmpl w:val="84400090"/>
@@ -18638,7 +20202,7 @@
       </w:rPr>
     </w:lvl>
   </w:abstractNum>
-  <w:abstractNum w:abstractNumId="121" w15:restartNumberingAfterBreak="0">
+  <w:abstractNum w:abstractNumId="129" w15:restartNumberingAfterBreak="0">
     <w:nsid w:val="722301E0"/>
     <w:multiLevelType w:val="multilevel"/>
     <w:tmpl w:val="1EE82E5A"/>
@@ -18787,7 +20351,7 @@
       </w:rPr>
     </w:lvl>
   </w:abstractNum>
-  <w:abstractNum w:abstractNumId="122" w15:restartNumberingAfterBreak="0">
+  <w:abstractNum w:abstractNumId="130" w15:restartNumberingAfterBreak="0">
     <w:nsid w:val="75144C65"/>
     <w:multiLevelType w:val="hybridMultilevel"/>
     <w:tmpl w:val="12127FAA"/>
@@ -18900,7 +20464,7 @@
       </w:rPr>
     </w:lvl>
   </w:abstractNum>
-  <w:abstractNum w:abstractNumId="123" w15:restartNumberingAfterBreak="0">
+  <w:abstractNum w:abstractNumId="131" w15:restartNumberingAfterBreak="0">
     <w:nsid w:val="75237F84"/>
     <w:multiLevelType w:val="hybridMultilevel"/>
     <w:tmpl w:val="5F0A6EF2"/>
@@ -19013,7 +20577,7 @@
       </w:rPr>
     </w:lvl>
   </w:abstractNum>
-  <w:abstractNum w:abstractNumId="124" w15:restartNumberingAfterBreak="0">
+  <w:abstractNum w:abstractNumId="132" w15:restartNumberingAfterBreak="0">
     <w:nsid w:val="758968F2"/>
     <w:multiLevelType w:val="multilevel"/>
     <w:tmpl w:val="D4241C4A"/>
@@ -19162,7 +20726,7 @@
       </w:rPr>
     </w:lvl>
   </w:abstractNum>
-  <w:abstractNum w:abstractNumId="125" w15:restartNumberingAfterBreak="0">
+  <w:abstractNum w:abstractNumId="133" w15:restartNumberingAfterBreak="0">
     <w:nsid w:val="75FF09B0"/>
     <w:multiLevelType w:val="multilevel"/>
     <w:tmpl w:val="C34A7734"/>
@@ -19311,7 +20875,7 @@
       </w:rPr>
     </w:lvl>
   </w:abstractNum>
-  <w:abstractNum w:abstractNumId="126" w15:restartNumberingAfterBreak="0">
+  <w:abstractNum w:abstractNumId="134" w15:restartNumberingAfterBreak="0">
     <w:nsid w:val="76864E3D"/>
     <w:multiLevelType w:val="hybridMultilevel"/>
     <w:tmpl w:val="9000C896"/>
@@ -19424,7 +20988,7 @@
       </w:rPr>
     </w:lvl>
   </w:abstractNum>
-  <w:abstractNum w:abstractNumId="127" w15:restartNumberingAfterBreak="0">
+  <w:abstractNum w:abstractNumId="135" w15:restartNumberingAfterBreak="0">
     <w:nsid w:val="777E68D9"/>
     <w:multiLevelType w:val="multilevel"/>
     <w:tmpl w:val="3F503B98"/>
@@ -19573,7 +21137,7 @@
       </w:rPr>
     </w:lvl>
   </w:abstractNum>
-  <w:abstractNum w:abstractNumId="128" w15:restartNumberingAfterBreak="0">
+  <w:abstractNum w:abstractNumId="136" w15:restartNumberingAfterBreak="0">
     <w:nsid w:val="77960362"/>
     <w:multiLevelType w:val="multilevel"/>
     <w:tmpl w:val="FEA0022E"/>
@@ -19722,7 +21286,7 @@
       </w:rPr>
     </w:lvl>
   </w:abstractNum>
-  <w:abstractNum w:abstractNumId="129" w15:restartNumberingAfterBreak="0">
+  <w:abstractNum w:abstractNumId="137" w15:restartNumberingAfterBreak="0">
     <w:nsid w:val="78547E35"/>
     <w:multiLevelType w:val="multilevel"/>
     <w:tmpl w:val="FC1421DE"/>
@@ -19871,7 +21435,7 @@
       </w:rPr>
     </w:lvl>
   </w:abstractNum>
-  <w:abstractNum w:abstractNumId="130" w15:restartNumberingAfterBreak="0">
+  <w:abstractNum w:abstractNumId="138" w15:restartNumberingAfterBreak="0">
     <w:nsid w:val="785A644F"/>
     <w:multiLevelType w:val="multilevel"/>
     <w:tmpl w:val="D1DC60FE"/>
@@ -20020,7 +21584,7 @@
       </w:rPr>
     </w:lvl>
   </w:abstractNum>
-  <w:abstractNum w:abstractNumId="131" w15:restartNumberingAfterBreak="0">
+  <w:abstractNum w:abstractNumId="139" w15:restartNumberingAfterBreak="0">
     <w:nsid w:val="78B62297"/>
     <w:multiLevelType w:val="multilevel"/>
     <w:tmpl w:val="2AA67CDA"/>
@@ -20169,7 +21733,7 @@
       </w:rPr>
     </w:lvl>
   </w:abstractNum>
-  <w:abstractNum w:abstractNumId="132" w15:restartNumberingAfterBreak="0">
+  <w:abstractNum w:abstractNumId="140" w15:restartNumberingAfterBreak="0">
     <w:nsid w:val="7BFA03DF"/>
     <w:multiLevelType w:val="hybridMultilevel"/>
     <w:tmpl w:val="536A979E"/>
@@ -20282,7 +21846,7 @@
       </w:rPr>
     </w:lvl>
   </w:abstractNum>
-  <w:abstractNum w:abstractNumId="133" w15:restartNumberingAfterBreak="0">
+  <w:abstractNum w:abstractNumId="141" w15:restartNumberingAfterBreak="0">
     <w:nsid w:val="7CA524B4"/>
     <w:multiLevelType w:val="hybridMultilevel"/>
     <w:tmpl w:val="957C4F4A"/>
@@ -20395,7 +21959,7 @@
       </w:rPr>
     </w:lvl>
   </w:abstractNum>
-  <w:abstractNum w:abstractNumId="134" w15:restartNumberingAfterBreak="0">
+  <w:abstractNum w:abstractNumId="142" w15:restartNumberingAfterBreak="0">
     <w:nsid w:val="7E1C597E"/>
     <w:multiLevelType w:val="multilevel"/>
     <w:tmpl w:val="2AA67CDA"/>
@@ -20544,7 +22108,7 @@
       </w:rPr>
     </w:lvl>
   </w:abstractNum>
-  <w:abstractNum w:abstractNumId="135" w15:restartNumberingAfterBreak="0">
+  <w:abstractNum w:abstractNumId="143" w15:restartNumberingAfterBreak="0">
     <w:nsid w:val="7EBD7710"/>
     <w:multiLevelType w:val="hybridMultilevel"/>
     <w:tmpl w:val="C8C6F7A0"/>
@@ -20657,7 +22221,7 @@
       </w:rPr>
     </w:lvl>
   </w:abstractNum>
-  <w:abstractNum w:abstractNumId="136" w15:restartNumberingAfterBreak="0">
+  <w:abstractNum w:abstractNumId="144" w15:restartNumberingAfterBreak="0">
     <w:nsid w:val="7F233031"/>
     <w:multiLevelType w:val="hybridMultilevel"/>
     <w:tmpl w:val="0D22564E"/>
@@ -20770,7 +22334,7 @@
       </w:rPr>
     </w:lvl>
   </w:abstractNum>
-  <w:abstractNum w:abstractNumId="137" w15:restartNumberingAfterBreak="0">
+  <w:abstractNum w:abstractNumId="145" w15:restartNumberingAfterBreak="0">
     <w:nsid w:val="7F426DF2"/>
     <w:multiLevelType w:val="multilevel"/>
     <w:tmpl w:val="430EFE5E"/>
@@ -20920,106 +22484,106 @@
     </w:lvl>
   </w:abstractNum>
   <w:num w:numId="1" w16cid:durableId="425157302">
+    <w:abstractNumId w:val="58"/>
+  </w:num>
+  <w:num w:numId="2" w16cid:durableId="967664612">
+    <w:abstractNumId w:val="108"/>
+  </w:num>
+  <w:num w:numId="3" w16cid:durableId="361631616">
+    <w:abstractNumId w:val="79"/>
+  </w:num>
+  <w:num w:numId="4" w16cid:durableId="1409575397">
+    <w:abstractNumId w:val="93"/>
+  </w:num>
+  <w:num w:numId="5" w16cid:durableId="1647204897">
+    <w:abstractNumId w:val="141"/>
+  </w:num>
+  <w:num w:numId="6" w16cid:durableId="682589869">
+    <w:abstractNumId w:val="29"/>
+  </w:num>
+  <w:num w:numId="7" w16cid:durableId="679703478">
+    <w:abstractNumId w:val="116"/>
+  </w:num>
+  <w:num w:numId="8" w16cid:durableId="496455128">
+    <w:abstractNumId w:val="52"/>
+  </w:num>
+  <w:num w:numId="9" w16cid:durableId="1184633094">
+    <w:abstractNumId w:val="70"/>
+  </w:num>
+  <w:num w:numId="10" w16cid:durableId="71507387">
+    <w:abstractNumId w:val="77"/>
+  </w:num>
+  <w:num w:numId="11" w16cid:durableId="1412503779">
+    <w:abstractNumId w:val="118"/>
+  </w:num>
+  <w:num w:numId="12" w16cid:durableId="1107113995">
     <w:abstractNumId w:val="53"/>
   </w:num>
-  <w:num w:numId="2" w16cid:durableId="967664612">
-    <w:abstractNumId w:val="100"/>
+  <w:num w:numId="13" w16cid:durableId="2011055922">
+    <w:abstractNumId w:val="30"/>
   </w:num>
-  <w:num w:numId="3" w16cid:durableId="361631616">
-    <w:abstractNumId w:val="72"/>
+  <w:num w:numId="14" w16cid:durableId="1529222885">
+    <w:abstractNumId w:val="140"/>
   </w:num>
-  <w:num w:numId="4" w16cid:durableId="1409575397">
-    <w:abstractNumId w:val="85"/>
+  <w:num w:numId="15" w16cid:durableId="836580755">
+    <w:abstractNumId w:val="21"/>
   </w:num>
-  <w:num w:numId="5" w16cid:durableId="1647204897">
-    <w:abstractNumId w:val="133"/>
+  <w:num w:numId="16" w16cid:durableId="1344674502">
+    <w:abstractNumId w:val="97"/>
   </w:num>
-  <w:num w:numId="6" w16cid:durableId="682589869">
-    <w:abstractNumId w:val="25"/>
+  <w:num w:numId="17" w16cid:durableId="1320882603">
+    <w:abstractNumId w:val="126"/>
   </w:num>
-  <w:num w:numId="7" w16cid:durableId="679703478">
-    <w:abstractNumId w:val="108"/>
+  <w:num w:numId="18" w16cid:durableId="1139028372">
+    <w:abstractNumId w:val="54"/>
   </w:num>
-  <w:num w:numId="8" w16cid:durableId="496455128">
-    <w:abstractNumId w:val="47"/>
+  <w:num w:numId="19" w16cid:durableId="1525635473">
+    <w:abstractNumId w:val="106"/>
   </w:num>
-  <w:num w:numId="9" w16cid:durableId="1184633094">
-    <w:abstractNumId w:val="64"/>
+  <w:num w:numId="20" w16cid:durableId="609623515">
+    <w:abstractNumId w:val="143"/>
   </w:num>
-  <w:num w:numId="10" w16cid:durableId="71507387">
-    <w:abstractNumId w:val="70"/>
+  <w:num w:numId="21" w16cid:durableId="165170997">
+    <w:abstractNumId w:val="121"/>
   </w:num>
-  <w:num w:numId="11" w16cid:durableId="1412503779">
+  <w:num w:numId="22" w16cid:durableId="1620525290">
+    <w:abstractNumId w:val="38"/>
+  </w:num>
+  <w:num w:numId="23" w16cid:durableId="400753109">
+    <w:abstractNumId w:val="130"/>
+  </w:num>
+  <w:num w:numId="24" w16cid:durableId="193882219">
+    <w:abstractNumId w:val="7"/>
+  </w:num>
+  <w:num w:numId="25" w16cid:durableId="311981628">
+    <w:abstractNumId w:val="60"/>
+  </w:num>
+  <w:num w:numId="26" w16cid:durableId="2009166045">
+    <w:abstractNumId w:val="20"/>
+  </w:num>
+  <w:num w:numId="27" w16cid:durableId="2135174697">
+    <w:abstractNumId w:val="28"/>
+  </w:num>
+  <w:num w:numId="28" w16cid:durableId="353504740">
+    <w:abstractNumId w:val="22"/>
+  </w:num>
+  <w:num w:numId="29" w16cid:durableId="2124693280">
     <w:abstractNumId w:val="110"/>
   </w:num>
-  <w:num w:numId="12" w16cid:durableId="1107113995">
-    <w:abstractNumId w:val="48"/>
+  <w:num w:numId="30" w16cid:durableId="1367099744">
+    <w:abstractNumId w:val="43"/>
   </w:num>
-  <w:num w:numId="13" w16cid:durableId="2011055922">
-    <w:abstractNumId w:val="26"/>
-  </w:num>
-  <w:num w:numId="14" w16cid:durableId="1529222885">
-    <w:abstractNumId w:val="132"/>
-  </w:num>
-  <w:num w:numId="15" w16cid:durableId="836580755">
-    <w:abstractNumId w:val="18"/>
-  </w:num>
-  <w:num w:numId="16" w16cid:durableId="1344674502">
-    <w:abstractNumId w:val="89"/>
-  </w:num>
-  <w:num w:numId="17" w16cid:durableId="1320882603">
-    <w:abstractNumId w:val="118"/>
-  </w:num>
-  <w:num w:numId="18" w16cid:durableId="1139028372">
-    <w:abstractNumId w:val="49"/>
-  </w:num>
-  <w:num w:numId="19" w16cid:durableId="1525635473">
+  <w:num w:numId="31" w16cid:durableId="2011105642">
     <w:abstractNumId w:val="98"/>
   </w:num>
-  <w:num w:numId="20" w16cid:durableId="609623515">
-    <w:abstractNumId w:val="135"/>
-  </w:num>
-  <w:num w:numId="21" w16cid:durableId="165170997">
-    <w:abstractNumId w:val="113"/>
-  </w:num>
-  <w:num w:numId="22" w16cid:durableId="1620525290">
-    <w:abstractNumId w:val="33"/>
-  </w:num>
-  <w:num w:numId="23" w16cid:durableId="400753109">
-    <w:abstractNumId w:val="122"/>
-  </w:num>
-  <w:num w:numId="24" w16cid:durableId="193882219">
-    <w:abstractNumId w:val="6"/>
-  </w:num>
-  <w:num w:numId="25" w16cid:durableId="311981628">
-    <w:abstractNumId w:val="55"/>
-  </w:num>
-  <w:num w:numId="26" w16cid:durableId="2009166045">
-    <w:abstractNumId w:val="17"/>
-  </w:num>
-  <w:num w:numId="27" w16cid:durableId="2135174697">
-    <w:abstractNumId w:val="24"/>
-  </w:num>
-  <w:num w:numId="28" w16cid:durableId="353504740">
-    <w:abstractNumId w:val="19"/>
-  </w:num>
-  <w:num w:numId="29" w16cid:durableId="2124693280">
-    <w:abstractNumId w:val="102"/>
-  </w:num>
-  <w:num w:numId="30" w16cid:durableId="1367099744">
-    <w:abstractNumId w:val="38"/>
-  </w:num>
-  <w:num w:numId="31" w16cid:durableId="2011105642">
-    <w:abstractNumId w:val="90"/>
-  </w:num>
   <w:num w:numId="32" w16cid:durableId="831995364">
-    <w:abstractNumId w:val="29"/>
+    <w:abstractNumId w:val="34"/>
   </w:num>
   <w:num w:numId="33" w16cid:durableId="851073403">
     <w:abstractNumId w:val="5"/>
   </w:num>
   <w:num w:numId="34" w16cid:durableId="1183666391">
-    <w:abstractNumId w:val="28"/>
+    <w:abstractNumId w:val="32"/>
   </w:num>
   <w:num w:numId="35" w16cid:durableId="697268929">
     <w:abstractNumId w:val="2"/>
@@ -21028,310 +22592,334 @@
     <w:abstractNumId w:val="3"/>
   </w:num>
   <w:num w:numId="37" w16cid:durableId="1849755457">
+    <w:abstractNumId w:val="131"/>
+  </w:num>
+  <w:num w:numId="38" w16cid:durableId="516505904">
+    <w:abstractNumId w:val="19"/>
+  </w:num>
+  <w:num w:numId="39" w16cid:durableId="906300072">
+    <w:abstractNumId w:val="23"/>
+  </w:num>
+  <w:num w:numId="40" w16cid:durableId="905338697">
+    <w:abstractNumId w:val="81"/>
+  </w:num>
+  <w:num w:numId="41" w16cid:durableId="501896635">
+    <w:abstractNumId w:val="56"/>
+  </w:num>
+  <w:num w:numId="42" w16cid:durableId="1953435156">
+    <w:abstractNumId w:val="82"/>
+  </w:num>
+  <w:num w:numId="43" w16cid:durableId="1060447452">
+    <w:abstractNumId w:val="95"/>
+  </w:num>
+  <w:num w:numId="44" w16cid:durableId="1772503672">
+    <w:abstractNumId w:val="73"/>
+  </w:num>
+  <w:num w:numId="45" w16cid:durableId="1650330222">
+    <w:abstractNumId w:val="80"/>
+  </w:num>
+  <w:num w:numId="46" w16cid:durableId="2102337934">
+    <w:abstractNumId w:val="37"/>
+  </w:num>
+  <w:num w:numId="47" w16cid:durableId="68767822">
+    <w:abstractNumId w:val="119"/>
+  </w:num>
+  <w:num w:numId="48" w16cid:durableId="1992058265">
+    <w:abstractNumId w:val="8"/>
+  </w:num>
+  <w:num w:numId="49" w16cid:durableId="788475134">
+    <w:abstractNumId w:val="138"/>
+  </w:num>
+  <w:num w:numId="50" w16cid:durableId="224419455">
+    <w:abstractNumId w:val="124"/>
+  </w:num>
+  <w:num w:numId="51" w16cid:durableId="1699575947">
+    <w:abstractNumId w:val="105"/>
+  </w:num>
+  <w:num w:numId="52" w16cid:durableId="1048916239">
+    <w:abstractNumId w:val="65"/>
+  </w:num>
+  <w:num w:numId="53" w16cid:durableId="1188711211">
+    <w:abstractNumId w:val="133"/>
+  </w:num>
+  <w:num w:numId="54" w16cid:durableId="447555614">
+    <w:abstractNumId w:val="107"/>
+  </w:num>
+  <w:num w:numId="55" w16cid:durableId="1679307268">
+    <w:abstractNumId w:val="62"/>
+  </w:num>
+  <w:num w:numId="56" w16cid:durableId="693773591">
     <w:abstractNumId w:val="123"/>
   </w:num>
-  <w:num w:numId="38" w16cid:durableId="516505904">
+  <w:num w:numId="57" w16cid:durableId="1110473324">
+    <w:abstractNumId w:val="45"/>
+  </w:num>
+  <w:num w:numId="58" w16cid:durableId="842937968">
+    <w:abstractNumId w:val="78"/>
+  </w:num>
+  <w:num w:numId="59" w16cid:durableId="821121315">
+    <w:abstractNumId w:val="51"/>
+  </w:num>
+  <w:num w:numId="60" w16cid:durableId="2095394549">
+    <w:abstractNumId w:val="136"/>
+  </w:num>
+  <w:num w:numId="61" w16cid:durableId="1299921011">
+    <w:abstractNumId w:val="50"/>
+  </w:num>
+  <w:num w:numId="62" w16cid:durableId="1927420240">
+    <w:abstractNumId w:val="87"/>
+  </w:num>
+  <w:num w:numId="63" w16cid:durableId="41290043">
+    <w:abstractNumId w:val="92"/>
+  </w:num>
+  <w:num w:numId="64" w16cid:durableId="999846909">
+    <w:abstractNumId w:val="74"/>
+  </w:num>
+  <w:num w:numId="65" w16cid:durableId="1250969563">
+    <w:abstractNumId w:val="85"/>
+  </w:num>
+  <w:num w:numId="66" w16cid:durableId="484011382">
+    <w:abstractNumId w:val="117"/>
+  </w:num>
+  <w:num w:numId="67" w16cid:durableId="2008289242">
     <w:abstractNumId w:val="16"/>
   </w:num>
-  <w:num w:numId="39" w16cid:durableId="906300072">
-    <w:abstractNumId w:val="20"/>
+  <w:num w:numId="68" w16cid:durableId="1041637222">
+    <w:abstractNumId w:val="24"/>
   </w:num>
-  <w:num w:numId="40" w16cid:durableId="905338697">
-    <w:abstractNumId w:val="74"/>
+  <w:num w:numId="69" w16cid:durableId="1296839887">
+    <w:abstractNumId w:val="91"/>
   </w:num>
-  <w:num w:numId="41" w16cid:durableId="501896635">
-    <w:abstractNumId w:val="51"/>
+  <w:num w:numId="70" w16cid:durableId="336662050">
+    <w:abstractNumId w:val="104"/>
   </w:num>
-  <w:num w:numId="42" w16cid:durableId="1953435156">
-    <w:abstractNumId w:val="75"/>
+  <w:num w:numId="71" w16cid:durableId="1460032333">
+    <w:abstractNumId w:val="122"/>
   </w:num>
-  <w:num w:numId="43" w16cid:durableId="1060447452">
-    <w:abstractNumId w:val="87"/>
+  <w:num w:numId="72" w16cid:durableId="592400615">
+    <w:abstractNumId w:val="13"/>
   </w:num>
-  <w:num w:numId="44" w16cid:durableId="1772503672">
-    <w:abstractNumId w:val="67"/>
+  <w:num w:numId="73" w16cid:durableId="1879049234">
+    <w:abstractNumId w:val="42"/>
   </w:num>
-  <w:num w:numId="45" w16cid:durableId="1650330222">
-    <w:abstractNumId w:val="73"/>
+  <w:num w:numId="74" w16cid:durableId="1747679558">
+    <w:abstractNumId w:val="46"/>
   </w:num>
-  <w:num w:numId="46" w16cid:durableId="2102337934">
-    <w:abstractNumId w:val="32"/>
+  <w:num w:numId="75" w16cid:durableId="55278029">
+    <w:abstractNumId w:val="39"/>
   </w:num>
-  <w:num w:numId="47" w16cid:durableId="68767822">
-    <w:abstractNumId w:val="111"/>
-  </w:num>
-  <w:num w:numId="48" w16cid:durableId="1992058265">
-    <w:abstractNumId w:val="7"/>
-  </w:num>
-  <w:num w:numId="49" w16cid:durableId="788475134">
-    <w:abstractNumId w:val="130"/>
-  </w:num>
-  <w:num w:numId="50" w16cid:durableId="224419455">
-    <w:abstractNumId w:val="116"/>
-  </w:num>
-  <w:num w:numId="51" w16cid:durableId="1699575947">
-    <w:abstractNumId w:val="97"/>
-  </w:num>
-  <w:num w:numId="52" w16cid:durableId="1048916239">
-    <w:abstractNumId w:val="59"/>
-  </w:num>
-  <w:num w:numId="53" w16cid:durableId="1188711211">
-    <w:abstractNumId w:val="125"/>
-  </w:num>
-  <w:num w:numId="54" w16cid:durableId="447555614">
-    <w:abstractNumId w:val="99"/>
-  </w:num>
-  <w:num w:numId="55" w16cid:durableId="1679307268">
-    <w:abstractNumId w:val="56"/>
-  </w:num>
-  <w:num w:numId="56" w16cid:durableId="693773591">
-    <w:abstractNumId w:val="115"/>
-  </w:num>
-  <w:num w:numId="57" w16cid:durableId="1110473324">
+  <w:num w:numId="76" w16cid:durableId="1032193382">
     <w:abstractNumId w:val="40"/>
   </w:num>
-  <w:num w:numId="58" w16cid:durableId="842937968">
-    <w:abstractNumId w:val="71"/>
+  <w:num w:numId="77" w16cid:durableId="763109604">
+    <w:abstractNumId w:val="94"/>
   </w:num>
-  <w:num w:numId="59" w16cid:durableId="821121315">
-    <w:abstractNumId w:val="46"/>
-  </w:num>
-  <w:num w:numId="60" w16cid:durableId="2095394549">
-    <w:abstractNumId w:val="128"/>
-  </w:num>
-  <w:num w:numId="61" w16cid:durableId="1299921011">
-    <w:abstractNumId w:val="45"/>
-  </w:num>
-  <w:num w:numId="62" w16cid:durableId="1927420240">
-    <w:abstractNumId w:val="79"/>
-  </w:num>
-  <w:num w:numId="63" w16cid:durableId="41290043">
-    <w:abstractNumId w:val="84"/>
-  </w:num>
-  <w:num w:numId="64" w16cid:durableId="999846909">
-    <w:abstractNumId w:val="68"/>
-  </w:num>
-  <w:num w:numId="65" w16cid:durableId="1250969563">
-    <w:abstractNumId w:val="77"/>
-  </w:num>
-  <w:num w:numId="66" w16cid:durableId="484011382">
+  <w:num w:numId="78" w16cid:durableId="2138137265">
     <w:abstractNumId w:val="109"/>
   </w:num>
-  <w:num w:numId="67" w16cid:durableId="2008289242">
-    <w:abstractNumId w:val="14"/>
-  </w:num>
-  <w:num w:numId="68" w16cid:durableId="1041637222">
-    <w:abstractNumId w:val="21"/>
-  </w:num>
-  <w:num w:numId="69" w16cid:durableId="1296839887">
-    <w:abstractNumId w:val="83"/>
-  </w:num>
-  <w:num w:numId="70" w16cid:durableId="336662050">
-    <w:abstractNumId w:val="96"/>
-  </w:num>
-  <w:num w:numId="71" w16cid:durableId="1460032333">
-    <w:abstractNumId w:val="114"/>
-  </w:num>
-  <w:num w:numId="72" w16cid:durableId="592400615">
-    <w:abstractNumId w:val="11"/>
-  </w:num>
-  <w:num w:numId="73" w16cid:durableId="1879049234">
-    <w:abstractNumId w:val="37"/>
-  </w:num>
-  <w:num w:numId="74" w16cid:durableId="1747679558">
-    <w:abstractNumId w:val="41"/>
-  </w:num>
-  <w:num w:numId="75" w16cid:durableId="55278029">
-    <w:abstractNumId w:val="34"/>
-  </w:num>
-  <w:num w:numId="76" w16cid:durableId="1032193382">
-    <w:abstractNumId w:val="35"/>
-  </w:num>
-  <w:num w:numId="77" w16cid:durableId="763109604">
-    <w:abstractNumId w:val="86"/>
-  </w:num>
-  <w:num w:numId="78" w16cid:durableId="2138137265">
-    <w:abstractNumId w:val="101"/>
-  </w:num>
   <w:num w:numId="79" w16cid:durableId="343675924">
-    <w:abstractNumId w:val="119"/>
+    <w:abstractNumId w:val="127"/>
   </w:num>
   <w:num w:numId="80" w16cid:durableId="1823277442">
-    <w:abstractNumId w:val="44"/>
+    <w:abstractNumId w:val="49"/>
   </w:num>
   <w:num w:numId="81" w16cid:durableId="1686900155">
     <w:abstractNumId w:val="0"/>
   </w:num>
   <w:num w:numId="82" w16cid:durableId="1113326280">
-    <w:abstractNumId w:val="82"/>
+    <w:abstractNumId w:val="90"/>
   </w:num>
   <w:num w:numId="83" w16cid:durableId="1253051103">
-    <w:abstractNumId w:val="112"/>
+    <w:abstractNumId w:val="120"/>
   </w:num>
   <w:num w:numId="84" w16cid:durableId="444888444">
-    <w:abstractNumId w:val="52"/>
+    <w:abstractNumId w:val="57"/>
   </w:num>
   <w:num w:numId="85" w16cid:durableId="64299649">
-    <w:abstractNumId w:val="103"/>
+    <w:abstractNumId w:val="111"/>
   </w:num>
   <w:num w:numId="86" w16cid:durableId="868182992">
+    <w:abstractNumId w:val="72"/>
+  </w:num>
+  <w:num w:numId="87" w16cid:durableId="896863331">
+    <w:abstractNumId w:val="31"/>
+  </w:num>
+  <w:num w:numId="88" w16cid:durableId="505442826">
+    <w:abstractNumId w:val="115"/>
+  </w:num>
+  <w:num w:numId="89" w16cid:durableId="1858763908">
+    <w:abstractNumId w:val="44"/>
+  </w:num>
+  <w:num w:numId="90" w16cid:durableId="1896088176">
+    <w:abstractNumId w:val="18"/>
+  </w:num>
+  <w:num w:numId="91" w16cid:durableId="1284576603">
+    <w:abstractNumId w:val="99"/>
+  </w:num>
+  <w:num w:numId="92" w16cid:durableId="1963075542">
+    <w:abstractNumId w:val="12"/>
+  </w:num>
+  <w:num w:numId="93" w16cid:durableId="787627596">
+    <w:abstractNumId w:val="89"/>
+  </w:num>
+  <w:num w:numId="94" w16cid:durableId="2003925799">
+    <w:abstractNumId w:val="15"/>
+  </w:num>
+  <w:num w:numId="95" w16cid:durableId="1169102579">
+    <w:abstractNumId w:val="102"/>
+  </w:num>
+  <w:num w:numId="96" w16cid:durableId="1216501564">
+    <w:abstractNumId w:val="41"/>
+  </w:num>
+  <w:num w:numId="97" w16cid:durableId="261768216">
+    <w:abstractNumId w:val="125"/>
+  </w:num>
+  <w:num w:numId="98" w16cid:durableId="2141918721">
+    <w:abstractNumId w:val="84"/>
+  </w:num>
+  <w:num w:numId="99" w16cid:durableId="905841544">
+    <w:abstractNumId w:val="47"/>
+  </w:num>
+  <w:num w:numId="100" w16cid:durableId="1753887223">
+    <w:abstractNumId w:val="100"/>
+  </w:num>
+  <w:num w:numId="101" w16cid:durableId="1320184766">
+    <w:abstractNumId w:val="36"/>
+  </w:num>
+  <w:num w:numId="102" w16cid:durableId="465127606">
     <w:abstractNumId w:val="66"/>
   </w:num>
-  <w:num w:numId="87" w16cid:durableId="896863331">
-    <w:abstractNumId w:val="27"/>
+  <w:num w:numId="103" w16cid:durableId="1640451435">
+    <w:abstractNumId w:val="64"/>
   </w:num>
-  <w:num w:numId="88" w16cid:durableId="505442826">
-    <w:abstractNumId w:val="107"/>
+  <w:num w:numId="104" w16cid:durableId="942029608">
+    <w:abstractNumId w:val="59"/>
   </w:num>
-  <w:num w:numId="89" w16cid:durableId="1858763908">
-    <w:abstractNumId w:val="39"/>
+  <w:num w:numId="105" w16cid:durableId="70857193">
+    <w:abstractNumId w:val="68"/>
   </w:num>
-  <w:num w:numId="90" w16cid:durableId="1896088176">
-    <w:abstractNumId w:val="15"/>
+  <w:num w:numId="106" w16cid:durableId="1617908629">
+    <w:abstractNumId w:val="129"/>
   </w:num>
-  <w:num w:numId="91" w16cid:durableId="1284576603">
-    <w:abstractNumId w:val="91"/>
+  <w:num w:numId="107" w16cid:durableId="970137111">
+    <w:abstractNumId w:val="142"/>
   </w:num>
-  <w:num w:numId="92" w16cid:durableId="1963075542">
+  <w:num w:numId="108" w16cid:durableId="383797013">
+    <w:abstractNumId w:val="55"/>
+  </w:num>
+  <w:num w:numId="109" w16cid:durableId="1459567304">
+    <w:abstractNumId w:val="67"/>
+  </w:num>
+  <w:num w:numId="110" w16cid:durableId="862745862">
+    <w:abstractNumId w:val="25"/>
+  </w:num>
+  <w:num w:numId="111" w16cid:durableId="1859536331">
+    <w:abstractNumId w:val="71"/>
+  </w:num>
+  <w:num w:numId="112" w16cid:durableId="2092697678">
+    <w:abstractNumId w:val="86"/>
+  </w:num>
+  <w:num w:numId="113" w16cid:durableId="1418403813">
+    <w:abstractNumId w:val="75"/>
+  </w:num>
+  <w:num w:numId="114" w16cid:durableId="1965042317">
+    <w:abstractNumId w:val="128"/>
+  </w:num>
+  <w:num w:numId="115" w16cid:durableId="670569040">
+    <w:abstractNumId w:val="63"/>
+  </w:num>
+  <w:num w:numId="116" w16cid:durableId="413823113">
+    <w:abstractNumId w:val="139"/>
+  </w:num>
+  <w:num w:numId="117" w16cid:durableId="1293747982">
+    <w:abstractNumId w:val="113"/>
+  </w:num>
+  <w:num w:numId="118" w16cid:durableId="2058698591">
+    <w:abstractNumId w:val="69"/>
+  </w:num>
+  <w:num w:numId="119" w16cid:durableId="892157361">
+    <w:abstractNumId w:val="88"/>
+  </w:num>
+  <w:num w:numId="120" w16cid:durableId="1449229938">
+    <w:abstractNumId w:val="132"/>
+  </w:num>
+  <w:num w:numId="121" w16cid:durableId="177283374">
     <w:abstractNumId w:val="10"/>
   </w:num>
-  <w:num w:numId="93" w16cid:durableId="787627596">
-    <w:abstractNumId w:val="81"/>
+  <w:num w:numId="122" w16cid:durableId="576598579">
+    <w:abstractNumId w:val="14"/>
   </w:num>
-  <w:num w:numId="94" w16cid:durableId="2003925799">
-    <w:abstractNumId w:val="13"/>
-  </w:num>
-  <w:num w:numId="95" w16cid:durableId="1169102579">
-    <w:abstractNumId w:val="94"/>
-  </w:num>
-  <w:num w:numId="96" w16cid:durableId="1216501564">
-    <w:abstractNumId w:val="36"/>
-  </w:num>
-  <w:num w:numId="97" w16cid:durableId="261768216">
-    <w:abstractNumId w:val="117"/>
-  </w:num>
-  <w:num w:numId="98" w16cid:durableId="2141918721">
-    <w:abstractNumId w:val="76"/>
-  </w:num>
-  <w:num w:numId="99" w16cid:durableId="905841544">
-    <w:abstractNumId w:val="42"/>
-  </w:num>
-  <w:num w:numId="100" w16cid:durableId="1753887223">
-    <w:abstractNumId w:val="92"/>
-  </w:num>
-  <w:num w:numId="101" w16cid:durableId="1320184766">
-    <w:abstractNumId w:val="31"/>
-  </w:num>
-  <w:num w:numId="102" w16cid:durableId="465127606">
-    <w:abstractNumId w:val="60"/>
-  </w:num>
-  <w:num w:numId="103" w16cid:durableId="1640451435">
-    <w:abstractNumId w:val="58"/>
-  </w:num>
-  <w:num w:numId="104" w16cid:durableId="942029608">
-    <w:abstractNumId w:val="54"/>
-  </w:num>
-  <w:num w:numId="105" w16cid:durableId="70857193">
-    <w:abstractNumId w:val="62"/>
-  </w:num>
-  <w:num w:numId="106" w16cid:durableId="1617908629">
-    <w:abstractNumId w:val="121"/>
-  </w:num>
-  <w:num w:numId="107" w16cid:durableId="970137111">
+  <w:num w:numId="123" w16cid:durableId="1495337109">
     <w:abstractNumId w:val="134"/>
   </w:num>
-  <w:num w:numId="108" w16cid:durableId="383797013">
-    <w:abstractNumId w:val="50"/>
-  </w:num>
-  <w:num w:numId="109" w16cid:durableId="1459567304">
-    <w:abstractNumId w:val="61"/>
-  </w:num>
-  <w:num w:numId="110" w16cid:durableId="862745862">
-    <w:abstractNumId w:val="22"/>
-  </w:num>
-  <w:num w:numId="111" w16cid:durableId="1859536331">
-    <w:abstractNumId w:val="65"/>
-  </w:num>
-  <w:num w:numId="112" w16cid:durableId="2092697678">
-    <w:abstractNumId w:val="78"/>
-  </w:num>
-  <w:num w:numId="113" w16cid:durableId="1418403813">
-    <w:abstractNumId w:val="69"/>
-  </w:num>
-  <w:num w:numId="114" w16cid:durableId="1965042317">
-    <w:abstractNumId w:val="120"/>
-  </w:num>
-  <w:num w:numId="115" w16cid:durableId="670569040">
-    <w:abstractNumId w:val="57"/>
-  </w:num>
-  <w:num w:numId="116" w16cid:durableId="413823113">
-    <w:abstractNumId w:val="131"/>
-  </w:num>
-  <w:num w:numId="117" w16cid:durableId="1293747982">
-    <w:abstractNumId w:val="105"/>
-  </w:num>
-  <w:num w:numId="118" w16cid:durableId="2058698591">
-    <w:abstractNumId w:val="63"/>
-  </w:num>
-  <w:num w:numId="119" w16cid:durableId="892157361">
-    <w:abstractNumId w:val="80"/>
-  </w:num>
-  <w:num w:numId="120" w16cid:durableId="1449229938">
-    <w:abstractNumId w:val="124"/>
-  </w:num>
-  <w:num w:numId="121" w16cid:durableId="177283374">
-    <w:abstractNumId w:val="8"/>
-  </w:num>
-  <w:num w:numId="122" w16cid:durableId="576598579">
-    <w:abstractNumId w:val="12"/>
-  </w:num>
-  <w:num w:numId="123" w16cid:durableId="1495337109">
-    <w:abstractNumId w:val="126"/>
-  </w:num>
   <w:num w:numId="124" w16cid:durableId="302319311">
-    <w:abstractNumId w:val="88"/>
+    <w:abstractNumId w:val="96"/>
   </w:num>
   <w:num w:numId="125" w16cid:durableId="1891844186">
-    <w:abstractNumId w:val="104"/>
+    <w:abstractNumId w:val="112"/>
   </w:num>
   <w:num w:numId="126" w16cid:durableId="256911009">
     <w:abstractNumId w:val="1"/>
   </w:num>
   <w:num w:numId="127" w16cid:durableId="1001927776">
-    <w:abstractNumId w:val="136"/>
+    <w:abstractNumId w:val="144"/>
   </w:num>
   <w:num w:numId="128" w16cid:durableId="1365057616">
-    <w:abstractNumId w:val="93"/>
+    <w:abstractNumId w:val="101"/>
   </w:num>
   <w:num w:numId="129" w16cid:durableId="2142647602">
-    <w:abstractNumId w:val="95"/>
+    <w:abstractNumId w:val="103"/>
   </w:num>
   <w:num w:numId="130" w16cid:durableId="1895652277">
+    <w:abstractNumId w:val="145"/>
+  </w:num>
+  <w:num w:numId="131" w16cid:durableId="1132407586">
     <w:abstractNumId w:val="137"/>
   </w:num>
-  <w:num w:numId="131" w16cid:durableId="1132407586">
-    <w:abstractNumId w:val="129"/>
-  </w:num>
   <w:num w:numId="132" w16cid:durableId="1209996408">
-    <w:abstractNumId w:val="9"/>
+    <w:abstractNumId w:val="11"/>
   </w:num>
   <w:num w:numId="133" w16cid:durableId="1840802852">
     <w:abstractNumId w:val="4"/>
   </w:num>
   <w:num w:numId="134" w16cid:durableId="220867256">
-    <w:abstractNumId w:val="106"/>
+    <w:abstractNumId w:val="114"/>
   </w:num>
   <w:num w:numId="135" w16cid:durableId="2026857351">
-    <w:abstractNumId w:val="30"/>
+    <w:abstractNumId w:val="35"/>
   </w:num>
   <w:num w:numId="136" w16cid:durableId="1236696510">
-    <w:abstractNumId w:val="127"/>
+    <w:abstractNumId w:val="135"/>
   </w:num>
   <w:num w:numId="137" w16cid:durableId="1156385716">
-    <w:abstractNumId w:val="43"/>
+    <w:abstractNumId w:val="48"/>
   </w:num>
   <w:num w:numId="138" w16cid:durableId="1088235058">
-    <w:abstractNumId w:val="23"/>
+    <w:abstractNumId w:val="26"/>
+  </w:num>
+  <w:num w:numId="139" w16cid:durableId="106968457">
+    <w:abstractNumId w:val="17"/>
+  </w:num>
+  <w:num w:numId="140" w16cid:durableId="1705979747">
+    <w:abstractNumId w:val="9"/>
+  </w:num>
+  <w:num w:numId="141" w16cid:durableId="1122117806">
+    <w:abstractNumId w:val="33"/>
+  </w:num>
+  <w:num w:numId="142" w16cid:durableId="2126385657">
+    <w:abstractNumId w:val="61"/>
+  </w:num>
+  <w:num w:numId="143" w16cid:durableId="1058674300">
+    <w:abstractNumId w:val="76"/>
+  </w:num>
+  <w:num w:numId="144" w16cid:durableId="756362112">
+    <w:abstractNumId w:val="6"/>
+  </w:num>
+  <w:num w:numId="145" w16cid:durableId="1612125897">
+    <w:abstractNumId w:val="83"/>
+  </w:num>
+  <w:num w:numId="146" w16cid:durableId="797142166">
+    <w:abstractNumId w:val="27"/>
   </w:num>
   <w:numIdMacAtCleanup w:val="45"/>
 </w:numbering>

</xml_diff>

<commit_message>
Branch & Employee Management Workflow (#266) Agency Operations Activity Diagrams (#262)
</commit_message>
<xml_diff>
--- a/Activity Specification Document.docx
+++ b/Activity Specification Document.docx
@@ -1475,6 +1475,7 @@
       <w:r>
         <w:t xml:space="preserve">If </w:t>
       </w:r>
+      <w:proofErr w:type="gramStart"/>
       <w:r>
         <w:rPr>
           <w:b/>
@@ -1482,6 +1483,7 @@
         </w:rPr>
         <w:t>Yes</w:t>
       </w:r>
+      <w:proofErr w:type="gramEnd"/>
       <w:r>
         <w:t>, the reservation process continues with rental cost calculation and reservation review.</w:t>
       </w:r>
@@ -1497,6 +1499,7 @@
       <w:r>
         <w:t xml:space="preserve">If </w:t>
       </w:r>
+      <w:proofErr w:type="gramStart"/>
       <w:r>
         <w:rPr>
           <w:b/>
@@ -1504,6 +1507,7 @@
         </w:rPr>
         <w:t>No</w:t>
       </w:r>
+      <w:proofErr w:type="gramEnd"/>
       <w:r>
         <w:t>, the customer is informed that the vehicle is unavailable and returns to the vehicle search process.</w:t>
       </w:r>
@@ -1534,6 +1538,7 @@
       <w:r>
         <w:t xml:space="preserve">If </w:t>
       </w:r>
+      <w:proofErr w:type="gramStart"/>
       <w:r>
         <w:rPr>
           <w:b/>
@@ -1541,6 +1546,7 @@
         </w:rPr>
         <w:t>Yes</w:t>
       </w:r>
+      <w:proofErr w:type="gramEnd"/>
       <w:r>
         <w:t>, the reservation is created and stored successfully.</w:t>
       </w:r>
@@ -1555,6 +1561,7 @@
       <w:r>
         <w:t xml:space="preserve">If </w:t>
       </w:r>
+      <w:proofErr w:type="gramStart"/>
       <w:r>
         <w:rPr>
           <w:b/>
@@ -1562,6 +1569,7 @@
         </w:rPr>
         <w:t>No</w:t>
       </w:r>
+      <w:proofErr w:type="gramEnd"/>
       <w:r>
         <w:t>, the reservation process is canceled without saving any data.</w:t>
       </w:r>
@@ -2063,6 +2071,7 @@
       <w:r>
         <w:t xml:space="preserve">If </w:t>
       </w:r>
+      <w:proofErr w:type="gramStart"/>
       <w:r>
         <w:rPr>
           <w:b/>
@@ -2070,6 +2079,7 @@
         </w:rPr>
         <w:t>Yes</w:t>
       </w:r>
+      <w:proofErr w:type="gramEnd"/>
       <w:r>
         <w:t>, the reservation status is updated and the payment is confirmed.</w:t>
       </w:r>
@@ -2084,6 +2094,7 @@
       <w:r>
         <w:t xml:space="preserve">If </w:t>
       </w:r>
+      <w:proofErr w:type="gramStart"/>
       <w:r>
         <w:rPr>
           <w:b/>
@@ -2091,6 +2102,7 @@
         </w:rPr>
         <w:t>No</w:t>
       </w:r>
+      <w:proofErr w:type="gramEnd"/>
       <w:r>
         <w:t>, the customer may retry the payment or cancel the transaction.</w:t>
       </w:r>
@@ -2121,6 +2133,7 @@
       <w:r>
         <w:t xml:space="preserve">If </w:t>
       </w:r>
+      <w:proofErr w:type="gramStart"/>
       <w:r>
         <w:rPr>
           <w:b/>
@@ -2128,6 +2141,7 @@
         </w:rPr>
         <w:t>Yes</w:t>
       </w:r>
+      <w:proofErr w:type="gramEnd"/>
       <w:r>
         <w:t>, the customer re-enters the payment information.</w:t>
       </w:r>
@@ -2142,6 +2156,7 @@
       <w:r>
         <w:t xml:space="preserve">If </w:t>
       </w:r>
+      <w:proofErr w:type="gramStart"/>
       <w:r>
         <w:rPr>
           <w:b/>
@@ -2149,6 +2164,7 @@
         </w:rPr>
         <w:t>No</w:t>
       </w:r>
+      <w:proofErr w:type="gramEnd"/>
       <w:r>
         <w:t>, the payment process is canceled.</w:t>
       </w:r>
@@ -2179,6 +2195,7 @@
       <w:r>
         <w:t xml:space="preserve">If </w:t>
       </w:r>
+      <w:proofErr w:type="gramStart"/>
       <w:r>
         <w:rPr>
           <w:b/>
@@ -2186,6 +2203,7 @@
         </w:rPr>
         <w:t>Yes</w:t>
       </w:r>
+      <w:proofErr w:type="gramEnd"/>
       <w:r>
         <w:t>, the customer submits a rating and written review.</w:t>
       </w:r>
@@ -2200,6 +2218,7 @@
       <w:r>
         <w:t xml:space="preserve">If </w:t>
       </w:r>
+      <w:proofErr w:type="gramStart"/>
       <w:r>
         <w:rPr>
           <w:b/>
@@ -2207,6 +2226,7 @@
         </w:rPr>
         <w:t>No</w:t>
       </w:r>
+      <w:proofErr w:type="gramEnd"/>
       <w:r>
         <w:t>, the workflow ends after the payment process.</w:t>
       </w:r>
@@ -2728,6 +2748,7 @@
       <w:r>
         <w:t xml:space="preserve">If </w:t>
       </w:r>
+      <w:proofErr w:type="gramStart"/>
       <w:r>
         <w:rPr>
           <w:b/>
@@ -2735,6 +2756,7 @@
         </w:rPr>
         <w:t>Yes</w:t>
       </w:r>
+      <w:proofErr w:type="gramEnd"/>
       <w:r>
         <w:t>, the system updates the fleet records and saves the changes.</w:t>
       </w:r>
@@ -2749,6 +2771,7 @@
       <w:r>
         <w:t xml:space="preserve">If </w:t>
       </w:r>
+      <w:proofErr w:type="gramStart"/>
       <w:r>
         <w:rPr>
           <w:b/>
@@ -2756,6 +2779,7 @@
         </w:rPr>
         <w:t>No</w:t>
       </w:r>
+      <w:proofErr w:type="gramEnd"/>
       <w:r>
         <w:t>, validation errors are displayed and the user returns to correct the submitted information.</w:t>
       </w:r>
@@ -2969,8 +2993,606 @@
         <w:br w:type="page"/>
       </w:r>
     </w:p>
+    <w:p>
+      <w:pPr>
+        <w:pStyle w:val="Heading3"/>
+      </w:pPr>
+      <w:r>
+        <w:lastRenderedPageBreak/>
+        <w:t xml:space="preserve">6- </w:t>
+      </w:r>
+      <w:r>
+        <w:t>Branch &amp; Employee Management Workflow Activity</w:t>
+      </w:r>
+    </w:p>
+    <w:p>
+      <w:pPr>
+        <w:rPr>
+          <w:b/>
+          <w:bCs/>
+        </w:rPr>
+      </w:pPr>
+      <w:r>
+        <w:rPr>
+          <w:b/>
+          <w:bCs/>
+        </w:rPr>
+        <w:t>Purpose</w:t>
+      </w:r>
+    </w:p>
+    <w:p>
+      <w:r>
+        <w:t>Activity Diagram of Workflow in Branches and Employee Management Workflow Activity Diagram provides a graphical depiction of the workflow related to management of branch offices and employee records in the KriGo framework. This activity diagram describes the activities carried out in the process of creation, modification, assignment, and removal of branches and employees by the system administrator or agency manager</w:t>
+      </w:r>
+      <w:r>
+        <w:t>.</w:t>
+      </w:r>
+    </w:p>
+    <w:p>
+      <w:pPr>
+        <w:rPr>
+          <w:b/>
+          <w:bCs/>
+        </w:rPr>
+      </w:pPr>
+      <w:r>
+        <w:rPr>
+          <w:b/>
+          <w:bCs/>
+        </w:rPr>
+        <w:t>Workflow Description</w:t>
+      </w:r>
+    </w:p>
+    <w:p>
+      <w:r>
+        <w:t>This process starts by the system administrator or agency manager logging into the Branch &amp; Employee Management module. The user will select the relevant management action to be performed, such as creation of a new branch, modification of existing branch information, creation of new employee, modification of existing employee information, assignment of employee to a branch or removal of existing branches and employees.</w:t>
+      </w:r>
+    </w:p>
+    <w:p>
+      <w:r>
+        <w:t>Depending on the selected action, the system will prompt the user for the relevant information to be updated. The system will then validate the entered information to ensure that the mandatory fields have been entered and the entered information conforms to the business rules of the system.</w:t>
+      </w:r>
+    </w:p>
+    <w:p>
+      <w:r>
+        <w:t>In case validation fails, the system will display validation errors and allow the user to modify the entered information. In case validation passes, the system will save the entered information and return a confirmation message stating the success of the action</w:t>
+      </w:r>
+      <w:r>
+        <w:t>.</w:t>
+      </w:r>
+    </w:p>
+    <w:p>
+      <w:pPr>
+        <w:rPr>
+          <w:b/>
+          <w:bCs/>
+        </w:rPr>
+      </w:pPr>
+      <w:r>
+        <w:rPr>
+          <w:b/>
+          <w:bCs/>
+        </w:rPr>
+        <w:t>Main Activities</w:t>
+      </w:r>
+    </w:p>
+    <w:p>
+      <w:r>
+        <w:t>The Branch &amp; Employee Management Workflow Activity Diagram includes the following primary activities:</w:t>
+      </w:r>
+    </w:p>
+    <w:p>
+      <w:pPr>
+        <w:pStyle w:val="ListParagraph"/>
+        <w:numPr>
+          <w:ilvl w:val="0"/>
+          <w:numId w:val="150"/>
+        </w:numPr>
+      </w:pPr>
+      <w:r>
+        <w:t>Access the Branch &amp; Employee Management module.</w:t>
+      </w:r>
+    </w:p>
+    <w:p>
+      <w:pPr>
+        <w:pStyle w:val="ListParagraph"/>
+        <w:numPr>
+          <w:ilvl w:val="0"/>
+          <w:numId w:val="150"/>
+        </w:numPr>
+      </w:pPr>
+      <w:r>
+        <w:t>Select a management operation.</w:t>
+      </w:r>
+    </w:p>
+    <w:p>
+      <w:pPr>
+        <w:pStyle w:val="ListParagraph"/>
+        <w:numPr>
+          <w:ilvl w:val="0"/>
+          <w:numId w:val="150"/>
+        </w:numPr>
+      </w:pPr>
+      <w:r>
+        <w:t>Add</w:t>
+      </w:r>
+      <w:r>
+        <w:t xml:space="preserve">, </w:t>
+      </w:r>
+      <w:r>
+        <w:t>Update</w:t>
+      </w:r>
+      <w:r>
+        <w:t>, Remove</w:t>
+      </w:r>
+      <w:r>
+        <w:t xml:space="preserve"> a branch.</w:t>
+      </w:r>
+    </w:p>
+    <w:p>
+      <w:pPr>
+        <w:pStyle w:val="ListParagraph"/>
+        <w:numPr>
+          <w:ilvl w:val="0"/>
+          <w:numId w:val="150"/>
+        </w:numPr>
+      </w:pPr>
+      <w:r>
+        <w:t>Add</w:t>
+      </w:r>
+      <w:r>
+        <w:t xml:space="preserve">, </w:t>
+      </w:r>
+      <w:r>
+        <w:t>Update</w:t>
+      </w:r>
+      <w:r>
+        <w:t>, Remove</w:t>
+      </w:r>
+      <w:r>
+        <w:t xml:space="preserve"> </w:t>
+      </w:r>
+      <w:r>
+        <w:t xml:space="preserve">an </w:t>
+      </w:r>
+      <w:r>
+        <w:t>employee.</w:t>
+      </w:r>
+    </w:p>
+    <w:p>
+      <w:pPr>
+        <w:pStyle w:val="ListParagraph"/>
+        <w:numPr>
+          <w:ilvl w:val="0"/>
+          <w:numId w:val="150"/>
+        </w:numPr>
+      </w:pPr>
+      <w:r>
+        <w:t>Assign an employee to a branch.</w:t>
+      </w:r>
+    </w:p>
+    <w:p>
+      <w:pPr>
+        <w:pStyle w:val="ListParagraph"/>
+        <w:numPr>
+          <w:ilvl w:val="0"/>
+          <w:numId w:val="150"/>
+        </w:numPr>
+      </w:pPr>
+      <w:r>
+        <w:t>Validate submitted information.</w:t>
+      </w:r>
+    </w:p>
+    <w:p>
+      <w:pPr>
+        <w:pStyle w:val="ListParagraph"/>
+        <w:numPr>
+          <w:ilvl w:val="0"/>
+          <w:numId w:val="150"/>
+        </w:numPr>
+      </w:pPr>
+      <w:r>
+        <w:t>Save changes.</w:t>
+      </w:r>
+    </w:p>
+    <w:p>
+      <w:pPr>
+        <w:pStyle w:val="ListParagraph"/>
+        <w:numPr>
+          <w:ilvl w:val="0"/>
+          <w:numId w:val="150"/>
+        </w:numPr>
+      </w:pPr>
+      <w:r>
+        <w:t>Update the database.</w:t>
+      </w:r>
+    </w:p>
+    <w:p>
+      <w:pPr>
+        <w:pStyle w:val="ListParagraph"/>
+        <w:numPr>
+          <w:ilvl w:val="0"/>
+          <w:numId w:val="150"/>
+        </w:numPr>
+      </w:pPr>
+      <w:r>
+        <w:t>Display a confirmation message.</w:t>
+      </w:r>
+    </w:p>
+    <w:p>
+      <w:pPr>
+        <w:rPr>
+          <w:b/>
+          <w:bCs/>
+        </w:rPr>
+      </w:pPr>
+      <w:r>
+        <w:rPr>
+          <w:b/>
+          <w:bCs/>
+        </w:rPr>
+        <w:t>Decision Points</w:t>
+      </w:r>
+    </w:p>
+    <w:p>
+      <w:r>
+        <w:t>The activity diagram contains two primary decision nodes:</w:t>
+      </w:r>
+    </w:p>
+    <w:p>
+      <w:pPr>
+        <w:numPr>
+          <w:ilvl w:val="0"/>
+          <w:numId w:val="148"/>
+        </w:numPr>
+      </w:pPr>
+      <w:r>
+        <w:rPr>
+          <w:b/>
+          <w:bCs/>
+        </w:rPr>
+        <w:t>Operation Type?</w:t>
+      </w:r>
+    </w:p>
+    <w:p>
+      <w:pPr>
+        <w:numPr>
+          <w:ilvl w:val="1"/>
+          <w:numId w:val="148"/>
+        </w:numPr>
+        <w:spacing w:after="0"/>
+      </w:pPr>
+      <w:r>
+        <w:t>Add</w:t>
+      </w:r>
+      <w:r>
+        <w:t xml:space="preserve">, </w:t>
+      </w:r>
+      <w:r>
+        <w:t>Update</w:t>
+      </w:r>
+      <w:r>
+        <w:t>, Remove</w:t>
+      </w:r>
+      <w:r>
+        <w:t xml:space="preserve"> Branch.</w:t>
+      </w:r>
+    </w:p>
+    <w:p>
+      <w:pPr>
+        <w:numPr>
+          <w:ilvl w:val="1"/>
+          <w:numId w:val="148"/>
+        </w:numPr>
+        <w:spacing w:after="0"/>
+      </w:pPr>
+      <w:r>
+        <w:t>Add</w:t>
+      </w:r>
+      <w:r>
+        <w:t xml:space="preserve">, </w:t>
+      </w:r>
+      <w:r>
+        <w:t>Update</w:t>
+      </w:r>
+      <w:r>
+        <w:t>, Remove</w:t>
+      </w:r>
+      <w:r>
+        <w:t xml:space="preserve"> Employee.</w:t>
+      </w:r>
+    </w:p>
+    <w:p>
+      <w:pPr>
+        <w:numPr>
+          <w:ilvl w:val="1"/>
+          <w:numId w:val="148"/>
+        </w:numPr>
+        <w:spacing w:after="0"/>
+      </w:pPr>
+      <w:r>
+        <w:t>Assign Employee to Branch.</w:t>
+      </w:r>
+    </w:p>
+    <w:p>
+      <w:pPr>
+        <w:numPr>
+          <w:ilvl w:val="0"/>
+          <w:numId w:val="148"/>
+        </w:numPr>
+      </w:pPr>
+      <w:r>
+        <w:rPr>
+          <w:b/>
+          <w:bCs/>
+        </w:rPr>
+        <w:t>Information Valid?</w:t>
+      </w:r>
+    </w:p>
+    <w:p>
+      <w:pPr>
+        <w:numPr>
+          <w:ilvl w:val="1"/>
+          <w:numId w:val="148"/>
+        </w:numPr>
+        <w:spacing w:after="0"/>
+      </w:pPr>
+      <w:r>
+        <w:t xml:space="preserve">If </w:t>
+      </w:r>
+      <w:r>
+        <w:rPr>
+          <w:b/>
+          <w:bCs/>
+        </w:rPr>
+        <w:t>yes</w:t>
+      </w:r>
+      <w:r>
+        <w:t>, the system saves the changes and updates the database.</w:t>
+      </w:r>
+    </w:p>
+    <w:p>
+      <w:pPr>
+        <w:numPr>
+          <w:ilvl w:val="1"/>
+          <w:numId w:val="148"/>
+        </w:numPr>
+        <w:spacing w:after="0"/>
+      </w:pPr>
+      <w:r>
+        <w:t xml:space="preserve">If </w:t>
+      </w:r>
+      <w:r>
+        <w:rPr>
+          <w:b/>
+          <w:bCs/>
+        </w:rPr>
+        <w:t>no</w:t>
+      </w:r>
+      <w:r>
+        <w:t>, validation errors are displayed and the user returns to the selected operation to correct the information.</w:t>
+      </w:r>
+    </w:p>
+    <w:p>
+      <w:r>
+        <w:lastRenderedPageBreak/>
+        <w:t>These decision points ensure that organizational records are updated accurately while supporting multiple branch and employee management operations through a unified workflow.</w:t>
+      </w:r>
+    </w:p>
+    <w:p>
+      <w:pPr>
+        <w:rPr>
+          <w:b/>
+          <w:bCs/>
+        </w:rPr>
+      </w:pPr>
+      <w:r>
+        <w:rPr>
+          <w:b/>
+          <w:bCs/>
+        </w:rPr>
+        <w:t>Alternative Flows</w:t>
+      </w:r>
+    </w:p>
+    <w:p>
+      <w:r>
+        <w:t>The Branch &amp; Employee Management Workflow Activity Diagram incorporates several alternative scenarios:</w:t>
+      </w:r>
+    </w:p>
+    <w:p>
+      <w:pPr>
+        <w:pStyle w:val="ListParagraph"/>
+        <w:numPr>
+          <w:ilvl w:val="0"/>
+          <w:numId w:val="151"/>
+        </w:numPr>
+      </w:pPr>
+      <w:r>
+        <w:t>Creating</w:t>
+      </w:r>
+      <w:r>
+        <w:t xml:space="preserve">, </w:t>
+      </w:r>
+      <w:r>
+        <w:t>Updating</w:t>
+      </w:r>
+      <w:r>
+        <w:t>, Removing</w:t>
+      </w:r>
+      <w:r>
+        <w:t xml:space="preserve"> a new branch.</w:t>
+      </w:r>
+    </w:p>
+    <w:p>
+      <w:pPr>
+        <w:pStyle w:val="ListParagraph"/>
+        <w:numPr>
+          <w:ilvl w:val="0"/>
+          <w:numId w:val="151"/>
+        </w:numPr>
+      </w:pPr>
+      <w:r>
+        <w:t>Registering, Updating, Removing</w:t>
+      </w:r>
+      <w:r>
+        <w:t xml:space="preserve"> branch </w:t>
+      </w:r>
+      <w:r>
+        <w:t>employee</w:t>
+      </w:r>
+      <w:r>
+        <w:t>.</w:t>
+      </w:r>
+    </w:p>
+    <w:p>
+      <w:pPr>
+        <w:pStyle w:val="ListParagraph"/>
+        <w:numPr>
+          <w:ilvl w:val="0"/>
+          <w:numId w:val="151"/>
+        </w:numPr>
+      </w:pPr>
+      <w:r>
+        <w:t>Assigning an employee to a specific branch.</w:t>
+      </w:r>
+    </w:p>
+    <w:p>
+      <w:pPr>
+        <w:pStyle w:val="ListParagraph"/>
+        <w:numPr>
+          <w:ilvl w:val="0"/>
+          <w:numId w:val="151"/>
+        </w:numPr>
+      </w:pPr>
+      <w:r>
+        <w:t>Submission of invalid or incomplete information requiring correction before processing.</w:t>
+      </w:r>
+    </w:p>
+    <w:p>
+      <w:r>
+        <w:t>These alternative paths provide flexibility for administrative tasks while preserving the integrity and consistency of branch and employee records.</w:t>
+      </w:r>
+    </w:p>
+    <w:p>
+      <w:pPr>
+        <w:rPr>
+          <w:b/>
+          <w:bCs/>
+        </w:rPr>
+      </w:pPr>
+      <w:r>
+        <w:rPr>
+          <w:b/>
+          <w:bCs/>
+        </w:rPr>
+        <w:t>Conclusion</w:t>
+      </w:r>
+    </w:p>
+    <w:p>
+      <w:r>
+        <w:t xml:space="preserve">Branch and Employee Management Workflow Activity Diagram </w:t>
+      </w:r>
+      <w:r>
+        <w:t>present</w:t>
+      </w:r>
+      <w:r>
+        <w:t xml:space="preserve"> a full overview of the administrative activities related to managing branches and employees in the KriGo system. It shows the sequence of the activities, validations, and decisions that need to be performed to ensure accuracy of the organizational data. Activity diagram is a very important behavioral model used to describe the administration subsystem</w:t>
+      </w:r>
+      <w:r>
+        <w:t>.</w:t>
+      </w:r>
+    </w:p>
     <w:p/>
-    <w:p/>
+    <w:p>
+      <w:pPr>
+        <w:keepNext/>
+      </w:pPr>
+      <w:r>
+        <w:rPr>
+          <w:noProof/>
+        </w:rPr>
+        <w:drawing>
+          <wp:inline distT="0" distB="0" distL="0" distR="0" wp14:anchorId="53F6110F" wp14:editId="417DA9FD">
+            <wp:extent cx="5941695" cy="2758440"/>
+            <wp:effectExtent l="0" t="0" r="1905" b="3810"/>
+            <wp:docPr id="662860672" name="Picture 13"/>
+            <wp:cNvGraphicFramePr>
+              <a:graphicFrameLocks xmlns:a="http://schemas.openxmlformats.org/drawingml/2006/main" noChangeAspect="1"/>
+            </wp:cNvGraphicFramePr>
+            <a:graphic xmlns:a="http://schemas.openxmlformats.org/drawingml/2006/main">
+              <a:graphicData uri="http://schemas.openxmlformats.org/drawingml/2006/picture">
+                <pic:pic xmlns:pic="http://schemas.openxmlformats.org/drawingml/2006/picture">
+                  <pic:nvPicPr>
+                    <pic:cNvPr id="0" name="Picture 11"/>
+                    <pic:cNvPicPr>
+                      <a:picLocks noChangeAspect="1" noChangeArrowheads="1"/>
+                    </pic:cNvPicPr>
+                  </pic:nvPicPr>
+                  <pic:blipFill>
+                    <a:blip r:embed="rId13" cstate="print">
+                      <a:extLst>
+                        <a:ext uri="{28A0092B-C50C-407E-A947-70E740481C1C}">
+                          <a14:useLocalDpi xmlns:a14="http://schemas.microsoft.com/office/drawing/2010/main" val="0"/>
+                        </a:ext>
+                      </a:extLst>
+                    </a:blip>
+                    <a:srcRect/>
+                    <a:stretch>
+                      <a:fillRect/>
+                    </a:stretch>
+                  </pic:blipFill>
+                  <pic:spPr bwMode="auto">
+                    <a:xfrm>
+                      <a:off x="0" y="0"/>
+                      <a:ext cx="5941695" cy="2758440"/>
+                    </a:xfrm>
+                    <a:prstGeom prst="rect">
+                      <a:avLst/>
+                    </a:prstGeom>
+                    <a:noFill/>
+                    <a:ln>
+                      <a:noFill/>
+                    </a:ln>
+                  </pic:spPr>
+                </pic:pic>
+              </a:graphicData>
+            </a:graphic>
+          </wp:inline>
+        </w:drawing>
+      </w:r>
+    </w:p>
+    <w:p>
+      <w:pPr>
+        <w:pStyle w:val="Caption"/>
+      </w:pPr>
+      <w:r>
+        <w:t xml:space="preserve">Figure </w:t>
+      </w:r>
+      <w:r>
+        <w:fldChar w:fldCharType="begin"/>
+      </w:r>
+      <w:r>
+        <w:instrText xml:space="preserve"> SEQ Figure \* ARABIC </w:instrText>
+      </w:r>
+      <w:r>
+        <w:fldChar w:fldCharType="separate"/>
+      </w:r>
+      <w:r>
+        <w:rPr>
+          <w:noProof/>
+        </w:rPr>
+        <w:t>6</w:t>
+      </w:r>
+      <w:r>
+        <w:fldChar w:fldCharType="end"/>
+      </w:r>
+      <w:r>
+        <w:t xml:space="preserve"> - </w:t>
+      </w:r>
+      <w:r>
+        <w:t>Branch &amp; Employee Management Workflow Activity Diagram</w:t>
+      </w:r>
+    </w:p>
     <w:sectPr>
       <w:pgSz w:w="11906" w:h="16838" w:code="9"/>
       <w:pgMar w:top="1411" w:right="850" w:bottom="1411" w:left="1699" w:header="720" w:footer="720" w:gutter="0"/>
@@ -4159,6 +4781,155 @@
     </w:lvl>
   </w:abstractNum>
   <w:abstractNum w:abstractNumId="9" w15:restartNumberingAfterBreak="0">
+    <w:nsid w:val="052F1ED8"/>
+    <w:multiLevelType w:val="multilevel"/>
+    <w:tmpl w:val="01961300"/>
+    <w:lvl w:ilvl="0">
+      <w:start w:val="1"/>
+      <w:numFmt w:val="bullet"/>
+      <w:lvlText w:val=""/>
+      <w:lvlJc w:val="left"/>
+      <w:pPr>
+        <w:tabs>
+          <w:tab w:val="num" w:pos="720"/>
+        </w:tabs>
+        <w:ind w:left="720" w:hanging="360"/>
+      </w:pPr>
+      <w:rPr>
+        <w:rFonts w:ascii="Symbol" w:hAnsi="Symbol" w:hint="default"/>
+        <w:sz w:val="20"/>
+      </w:rPr>
+    </w:lvl>
+    <w:lvl w:ilvl="1" w:tentative="1">
+      <w:start w:val="1"/>
+      <w:numFmt w:val="bullet"/>
+      <w:lvlText w:val="o"/>
+      <w:lvlJc w:val="left"/>
+      <w:pPr>
+        <w:tabs>
+          <w:tab w:val="num" w:pos="1440"/>
+        </w:tabs>
+        <w:ind w:left="1440" w:hanging="360"/>
+      </w:pPr>
+      <w:rPr>
+        <w:rFonts w:ascii="Courier New" w:hAnsi="Courier New" w:hint="default"/>
+        <w:sz w:val="20"/>
+      </w:rPr>
+    </w:lvl>
+    <w:lvl w:ilvl="2" w:tentative="1">
+      <w:start w:val="1"/>
+      <w:numFmt w:val="bullet"/>
+      <w:lvlText w:val=""/>
+      <w:lvlJc w:val="left"/>
+      <w:pPr>
+        <w:tabs>
+          <w:tab w:val="num" w:pos="2160"/>
+        </w:tabs>
+        <w:ind w:left="2160" w:hanging="360"/>
+      </w:pPr>
+      <w:rPr>
+        <w:rFonts w:ascii="Wingdings" w:hAnsi="Wingdings" w:hint="default"/>
+        <w:sz w:val="20"/>
+      </w:rPr>
+    </w:lvl>
+    <w:lvl w:ilvl="3" w:tentative="1">
+      <w:start w:val="1"/>
+      <w:numFmt w:val="bullet"/>
+      <w:lvlText w:val=""/>
+      <w:lvlJc w:val="left"/>
+      <w:pPr>
+        <w:tabs>
+          <w:tab w:val="num" w:pos="2880"/>
+        </w:tabs>
+        <w:ind w:left="2880" w:hanging="360"/>
+      </w:pPr>
+      <w:rPr>
+        <w:rFonts w:ascii="Wingdings" w:hAnsi="Wingdings" w:hint="default"/>
+        <w:sz w:val="20"/>
+      </w:rPr>
+    </w:lvl>
+    <w:lvl w:ilvl="4" w:tentative="1">
+      <w:start w:val="1"/>
+      <w:numFmt w:val="bullet"/>
+      <w:lvlText w:val=""/>
+      <w:lvlJc w:val="left"/>
+      <w:pPr>
+        <w:tabs>
+          <w:tab w:val="num" w:pos="3600"/>
+        </w:tabs>
+        <w:ind w:left="3600" w:hanging="360"/>
+      </w:pPr>
+      <w:rPr>
+        <w:rFonts w:ascii="Wingdings" w:hAnsi="Wingdings" w:hint="default"/>
+        <w:sz w:val="20"/>
+      </w:rPr>
+    </w:lvl>
+    <w:lvl w:ilvl="5" w:tentative="1">
+      <w:start w:val="1"/>
+      <w:numFmt w:val="bullet"/>
+      <w:lvlText w:val=""/>
+      <w:lvlJc w:val="left"/>
+      <w:pPr>
+        <w:tabs>
+          <w:tab w:val="num" w:pos="4320"/>
+        </w:tabs>
+        <w:ind w:left="4320" w:hanging="360"/>
+      </w:pPr>
+      <w:rPr>
+        <w:rFonts w:ascii="Wingdings" w:hAnsi="Wingdings" w:hint="default"/>
+        <w:sz w:val="20"/>
+      </w:rPr>
+    </w:lvl>
+    <w:lvl w:ilvl="6" w:tentative="1">
+      <w:start w:val="1"/>
+      <w:numFmt w:val="bullet"/>
+      <w:lvlText w:val=""/>
+      <w:lvlJc w:val="left"/>
+      <w:pPr>
+        <w:tabs>
+          <w:tab w:val="num" w:pos="5040"/>
+        </w:tabs>
+        <w:ind w:left="5040" w:hanging="360"/>
+      </w:pPr>
+      <w:rPr>
+        <w:rFonts w:ascii="Wingdings" w:hAnsi="Wingdings" w:hint="default"/>
+        <w:sz w:val="20"/>
+      </w:rPr>
+    </w:lvl>
+    <w:lvl w:ilvl="7" w:tentative="1">
+      <w:start w:val="1"/>
+      <w:numFmt w:val="bullet"/>
+      <w:lvlText w:val=""/>
+      <w:lvlJc w:val="left"/>
+      <w:pPr>
+        <w:tabs>
+          <w:tab w:val="num" w:pos="5760"/>
+        </w:tabs>
+        <w:ind w:left="5760" w:hanging="360"/>
+      </w:pPr>
+      <w:rPr>
+        <w:rFonts w:ascii="Wingdings" w:hAnsi="Wingdings" w:hint="default"/>
+        <w:sz w:val="20"/>
+      </w:rPr>
+    </w:lvl>
+    <w:lvl w:ilvl="8" w:tentative="1">
+      <w:start w:val="1"/>
+      <w:numFmt w:val="bullet"/>
+      <w:lvlText w:val=""/>
+      <w:lvlJc w:val="left"/>
+      <w:pPr>
+        <w:tabs>
+          <w:tab w:val="num" w:pos="6480"/>
+        </w:tabs>
+        <w:ind w:left="6480" w:hanging="360"/>
+      </w:pPr>
+      <w:rPr>
+        <w:rFonts w:ascii="Wingdings" w:hAnsi="Wingdings" w:hint="default"/>
+        <w:sz w:val="20"/>
+      </w:rPr>
+    </w:lvl>
+  </w:abstractNum>
+  <w:abstractNum w:abstractNumId="10" w15:restartNumberingAfterBreak="0">
     <w:nsid w:val="053B666F"/>
     <w:multiLevelType w:val="multilevel"/>
     <w:tmpl w:val="E1BC67F6"/>
@@ -4307,7 +5078,7 @@
       </w:rPr>
     </w:lvl>
   </w:abstractNum>
-  <w:abstractNum w:abstractNumId="10" w15:restartNumberingAfterBreak="0">
+  <w:abstractNum w:abstractNumId="11" w15:restartNumberingAfterBreak="0">
     <w:nsid w:val="06FA4547"/>
     <w:multiLevelType w:val="hybridMultilevel"/>
     <w:tmpl w:val="DA825754"/>
@@ -4420,7 +5191,7 @@
       </w:rPr>
     </w:lvl>
   </w:abstractNum>
-  <w:abstractNum w:abstractNumId="11" w15:restartNumberingAfterBreak="0">
+  <w:abstractNum w:abstractNumId="12" w15:restartNumberingAfterBreak="0">
     <w:nsid w:val="0717208B"/>
     <w:multiLevelType w:val="hybridMultilevel"/>
     <w:tmpl w:val="5866C9A8"/>
@@ -4533,7 +5304,7 @@
       </w:rPr>
     </w:lvl>
   </w:abstractNum>
-  <w:abstractNum w:abstractNumId="12" w15:restartNumberingAfterBreak="0">
+  <w:abstractNum w:abstractNumId="13" w15:restartNumberingAfterBreak="0">
     <w:nsid w:val="08BB19BF"/>
     <w:multiLevelType w:val="multilevel"/>
     <w:tmpl w:val="C5807BB2"/>
@@ -4682,7 +5453,7 @@
       </w:rPr>
     </w:lvl>
   </w:abstractNum>
-  <w:abstractNum w:abstractNumId="13" w15:restartNumberingAfterBreak="0">
+  <w:abstractNum w:abstractNumId="14" w15:restartNumberingAfterBreak="0">
     <w:nsid w:val="08D32D08"/>
     <w:multiLevelType w:val="multilevel"/>
     <w:tmpl w:val="A32449CA"/>
@@ -4831,7 +5602,7 @@
       </w:rPr>
     </w:lvl>
   </w:abstractNum>
-  <w:abstractNum w:abstractNumId="14" w15:restartNumberingAfterBreak="0">
+  <w:abstractNum w:abstractNumId="15" w15:restartNumberingAfterBreak="0">
     <w:nsid w:val="09E84C0F"/>
     <w:multiLevelType w:val="hybridMultilevel"/>
     <w:tmpl w:val="3754EFAC"/>
@@ -4944,7 +5715,7 @@
       </w:rPr>
     </w:lvl>
   </w:abstractNum>
-  <w:abstractNum w:abstractNumId="15" w15:restartNumberingAfterBreak="0">
+  <w:abstractNum w:abstractNumId="16" w15:restartNumberingAfterBreak="0">
     <w:nsid w:val="0AE82489"/>
     <w:multiLevelType w:val="multilevel"/>
     <w:tmpl w:val="B82C10D4"/>
@@ -5093,7 +5864,7 @@
       </w:rPr>
     </w:lvl>
   </w:abstractNum>
-  <w:abstractNum w:abstractNumId="16" w15:restartNumberingAfterBreak="0">
+  <w:abstractNum w:abstractNumId="17" w15:restartNumberingAfterBreak="0">
     <w:nsid w:val="0CC17936"/>
     <w:multiLevelType w:val="multilevel"/>
     <w:tmpl w:val="B5E0C4F8"/>
@@ -5242,7 +6013,7 @@
       </w:rPr>
     </w:lvl>
   </w:abstractNum>
-  <w:abstractNum w:abstractNumId="17" w15:restartNumberingAfterBreak="0">
+  <w:abstractNum w:abstractNumId="18" w15:restartNumberingAfterBreak="0">
     <w:nsid w:val="0D367329"/>
     <w:multiLevelType w:val="multilevel"/>
     <w:tmpl w:val="66064F64"/>
@@ -5391,7 +6162,7 @@
       </w:rPr>
     </w:lvl>
   </w:abstractNum>
-  <w:abstractNum w:abstractNumId="18" w15:restartNumberingAfterBreak="0">
+  <w:abstractNum w:abstractNumId="19" w15:restartNumberingAfterBreak="0">
     <w:nsid w:val="0E1040E2"/>
     <w:multiLevelType w:val="multilevel"/>
     <w:tmpl w:val="607CCC88"/>
@@ -5540,7 +6311,7 @@
       </w:rPr>
     </w:lvl>
   </w:abstractNum>
-  <w:abstractNum w:abstractNumId="19" w15:restartNumberingAfterBreak="0">
+  <w:abstractNum w:abstractNumId="20" w15:restartNumberingAfterBreak="0">
     <w:nsid w:val="0E2561E7"/>
     <w:multiLevelType w:val="hybridMultilevel"/>
     <w:tmpl w:val="2A6E4870"/>
@@ -5653,7 +6424,7 @@
       </w:rPr>
     </w:lvl>
   </w:abstractNum>
-  <w:abstractNum w:abstractNumId="20" w15:restartNumberingAfterBreak="0">
+  <w:abstractNum w:abstractNumId="21" w15:restartNumberingAfterBreak="0">
     <w:nsid w:val="0E841C27"/>
     <w:multiLevelType w:val="hybridMultilevel"/>
     <w:tmpl w:val="789C7F32"/>
@@ -5766,7 +6537,7 @@
       </w:rPr>
     </w:lvl>
   </w:abstractNum>
-  <w:abstractNum w:abstractNumId="21" w15:restartNumberingAfterBreak="0">
+  <w:abstractNum w:abstractNumId="22" w15:restartNumberingAfterBreak="0">
     <w:nsid w:val="0FAA2602"/>
     <w:multiLevelType w:val="hybridMultilevel"/>
     <w:tmpl w:val="C6C63128"/>
@@ -5879,7 +6650,7 @@
       </w:rPr>
     </w:lvl>
   </w:abstractNum>
-  <w:abstractNum w:abstractNumId="22" w15:restartNumberingAfterBreak="0">
+  <w:abstractNum w:abstractNumId="23" w15:restartNumberingAfterBreak="0">
     <w:nsid w:val="122550ED"/>
     <w:multiLevelType w:val="hybridMultilevel"/>
     <w:tmpl w:val="91ACE480"/>
@@ -5992,7 +6763,7 @@
       </w:rPr>
     </w:lvl>
   </w:abstractNum>
-  <w:abstractNum w:abstractNumId="23" w15:restartNumberingAfterBreak="0">
+  <w:abstractNum w:abstractNumId="24" w15:restartNumberingAfterBreak="0">
     <w:nsid w:val="124C1BAE"/>
     <w:multiLevelType w:val="hybridMultilevel"/>
     <w:tmpl w:val="04988FC0"/>
@@ -6105,7 +6876,7 @@
       </w:rPr>
     </w:lvl>
   </w:abstractNum>
-  <w:abstractNum w:abstractNumId="24" w15:restartNumberingAfterBreak="0">
+  <w:abstractNum w:abstractNumId="25" w15:restartNumberingAfterBreak="0">
     <w:nsid w:val="139F7557"/>
     <w:multiLevelType w:val="multilevel"/>
     <w:tmpl w:val="A984C1D4"/>
@@ -6254,7 +7025,7 @@
       </w:rPr>
     </w:lvl>
   </w:abstractNum>
-  <w:abstractNum w:abstractNumId="25" w15:restartNumberingAfterBreak="0">
+  <w:abstractNum w:abstractNumId="26" w15:restartNumberingAfterBreak="0">
     <w:nsid w:val="13A13D09"/>
     <w:multiLevelType w:val="multilevel"/>
     <w:tmpl w:val="92067DCC"/>
@@ -6403,7 +7174,7 @@
       </w:rPr>
     </w:lvl>
   </w:abstractNum>
-  <w:abstractNum w:abstractNumId="26" w15:restartNumberingAfterBreak="0">
+  <w:abstractNum w:abstractNumId="27" w15:restartNumberingAfterBreak="0">
     <w:nsid w:val="14DC6E23"/>
     <w:multiLevelType w:val="hybridMultilevel"/>
     <w:tmpl w:val="2ACC2CF2"/>
@@ -6516,7 +7287,7 @@
       </w:rPr>
     </w:lvl>
   </w:abstractNum>
-  <w:abstractNum w:abstractNumId="27" w15:restartNumberingAfterBreak="0">
+  <w:abstractNum w:abstractNumId="28" w15:restartNumberingAfterBreak="0">
     <w:nsid w:val="161C5709"/>
     <w:multiLevelType w:val="hybridMultilevel"/>
     <w:tmpl w:val="F06CE1E0"/>
@@ -6629,7 +7400,7 @@
       </w:rPr>
     </w:lvl>
   </w:abstractNum>
-  <w:abstractNum w:abstractNumId="28" w15:restartNumberingAfterBreak="0">
+  <w:abstractNum w:abstractNumId="29" w15:restartNumberingAfterBreak="0">
     <w:nsid w:val="16D400B4"/>
     <w:multiLevelType w:val="hybridMultilevel"/>
     <w:tmpl w:val="58E6DFBE"/>
@@ -6742,7 +7513,7 @@
       </w:rPr>
     </w:lvl>
   </w:abstractNum>
-  <w:abstractNum w:abstractNumId="29" w15:restartNumberingAfterBreak="0">
+  <w:abstractNum w:abstractNumId="30" w15:restartNumberingAfterBreak="0">
     <w:nsid w:val="17236012"/>
     <w:multiLevelType w:val="hybridMultilevel"/>
     <w:tmpl w:val="DAFA46C8"/>
@@ -6855,7 +7626,7 @@
       </w:rPr>
     </w:lvl>
   </w:abstractNum>
-  <w:abstractNum w:abstractNumId="30" w15:restartNumberingAfterBreak="0">
+  <w:abstractNum w:abstractNumId="31" w15:restartNumberingAfterBreak="0">
     <w:nsid w:val="172B04C0"/>
     <w:multiLevelType w:val="hybridMultilevel"/>
     <w:tmpl w:val="B6C41D5E"/>
@@ -6968,7 +7739,7 @@
       </w:rPr>
     </w:lvl>
   </w:abstractNum>
-  <w:abstractNum w:abstractNumId="31" w15:restartNumberingAfterBreak="0">
+  <w:abstractNum w:abstractNumId="32" w15:restartNumberingAfterBreak="0">
     <w:nsid w:val="17485CCB"/>
     <w:multiLevelType w:val="multilevel"/>
     <w:tmpl w:val="397E1AE0"/>
@@ -7117,7 +7888,7 @@
       </w:rPr>
     </w:lvl>
   </w:abstractNum>
-  <w:abstractNum w:abstractNumId="32" w15:restartNumberingAfterBreak="0">
+  <w:abstractNum w:abstractNumId="33" w15:restartNumberingAfterBreak="0">
     <w:nsid w:val="17763D31"/>
     <w:multiLevelType w:val="hybridMultilevel"/>
     <w:tmpl w:val="6CE63304"/>
@@ -7230,7 +8001,7 @@
       </w:rPr>
     </w:lvl>
   </w:abstractNum>
-  <w:abstractNum w:abstractNumId="33" w15:restartNumberingAfterBreak="0">
+  <w:abstractNum w:abstractNumId="34" w15:restartNumberingAfterBreak="0">
     <w:nsid w:val="17A835CF"/>
     <w:multiLevelType w:val="multilevel"/>
     <w:tmpl w:val="0C988B24"/>
@@ -7379,7 +8150,7 @@
       </w:rPr>
     </w:lvl>
   </w:abstractNum>
-  <w:abstractNum w:abstractNumId="34" w15:restartNumberingAfterBreak="0">
+  <w:abstractNum w:abstractNumId="35" w15:restartNumberingAfterBreak="0">
     <w:nsid w:val="17B06937"/>
     <w:multiLevelType w:val="hybridMultilevel"/>
     <w:tmpl w:val="71089CF2"/>
@@ -7492,7 +8263,7 @@
       </w:rPr>
     </w:lvl>
   </w:abstractNum>
-  <w:abstractNum w:abstractNumId="35" w15:restartNumberingAfterBreak="0">
+  <w:abstractNum w:abstractNumId="36" w15:restartNumberingAfterBreak="0">
     <w:nsid w:val="18FD59FB"/>
     <w:multiLevelType w:val="multilevel"/>
     <w:tmpl w:val="942CD1D2"/>
@@ -7641,7 +8412,7 @@
       </w:rPr>
     </w:lvl>
   </w:abstractNum>
-  <w:abstractNum w:abstractNumId="36" w15:restartNumberingAfterBreak="0">
+  <w:abstractNum w:abstractNumId="37" w15:restartNumberingAfterBreak="0">
     <w:nsid w:val="190F0390"/>
     <w:multiLevelType w:val="multilevel"/>
     <w:tmpl w:val="CBE4A4A4"/>
@@ -7790,7 +8561,7 @@
       </w:rPr>
     </w:lvl>
   </w:abstractNum>
-  <w:abstractNum w:abstractNumId="37" w15:restartNumberingAfterBreak="0">
+  <w:abstractNum w:abstractNumId="38" w15:restartNumberingAfterBreak="0">
     <w:nsid w:val="195875B0"/>
     <w:multiLevelType w:val="multilevel"/>
     <w:tmpl w:val="615444D4"/>
@@ -7903,7 +8674,7 @@
       </w:pPr>
     </w:lvl>
   </w:abstractNum>
-  <w:abstractNum w:abstractNumId="38" w15:restartNumberingAfterBreak="0">
+  <w:abstractNum w:abstractNumId="39" w15:restartNumberingAfterBreak="0">
     <w:nsid w:val="197C6FD7"/>
     <w:multiLevelType w:val="hybridMultilevel"/>
     <w:tmpl w:val="D97CEAA8"/>
@@ -8016,7 +8787,7 @@
       </w:rPr>
     </w:lvl>
   </w:abstractNum>
-  <w:abstractNum w:abstractNumId="39" w15:restartNumberingAfterBreak="0">
+  <w:abstractNum w:abstractNumId="40" w15:restartNumberingAfterBreak="0">
     <w:nsid w:val="1CC60A94"/>
     <w:multiLevelType w:val="multilevel"/>
     <w:tmpl w:val="EB74741C"/>
@@ -8165,7 +8936,7 @@
       </w:rPr>
     </w:lvl>
   </w:abstractNum>
-  <w:abstractNum w:abstractNumId="40" w15:restartNumberingAfterBreak="0">
+  <w:abstractNum w:abstractNumId="41" w15:restartNumberingAfterBreak="0">
     <w:nsid w:val="1E6658CF"/>
     <w:multiLevelType w:val="multilevel"/>
     <w:tmpl w:val="762ABC5E"/>
@@ -8314,7 +9085,7 @@
       </w:rPr>
     </w:lvl>
   </w:abstractNum>
-  <w:abstractNum w:abstractNumId="41" w15:restartNumberingAfterBreak="0">
+  <w:abstractNum w:abstractNumId="42" w15:restartNumberingAfterBreak="0">
     <w:nsid w:val="1FA532B0"/>
     <w:multiLevelType w:val="multilevel"/>
     <w:tmpl w:val="8718294C"/>
@@ -8463,7 +9234,7 @@
       </w:rPr>
     </w:lvl>
   </w:abstractNum>
-  <w:abstractNum w:abstractNumId="42" w15:restartNumberingAfterBreak="0">
+  <w:abstractNum w:abstractNumId="43" w15:restartNumberingAfterBreak="0">
     <w:nsid w:val="215C77FD"/>
     <w:multiLevelType w:val="hybridMultilevel"/>
     <w:tmpl w:val="58F41D10"/>
@@ -8552,7 +9323,7 @@
       </w:pPr>
     </w:lvl>
   </w:abstractNum>
-  <w:abstractNum w:abstractNumId="43" w15:restartNumberingAfterBreak="0">
+  <w:abstractNum w:abstractNumId="44" w15:restartNumberingAfterBreak="0">
     <w:nsid w:val="218D5909"/>
     <w:multiLevelType w:val="hybridMultilevel"/>
     <w:tmpl w:val="CC989EE4"/>
@@ -8665,7 +9436,7 @@
       </w:rPr>
     </w:lvl>
   </w:abstractNum>
-  <w:abstractNum w:abstractNumId="44" w15:restartNumberingAfterBreak="0">
+  <w:abstractNum w:abstractNumId="45" w15:restartNumberingAfterBreak="0">
     <w:nsid w:val="23E010BA"/>
     <w:multiLevelType w:val="multilevel"/>
     <w:tmpl w:val="4A16907E"/>
@@ -8814,7 +9585,7 @@
       </w:rPr>
     </w:lvl>
   </w:abstractNum>
-  <w:abstractNum w:abstractNumId="45" w15:restartNumberingAfterBreak="0">
+  <w:abstractNum w:abstractNumId="46" w15:restartNumberingAfterBreak="0">
     <w:nsid w:val="2470127A"/>
     <w:multiLevelType w:val="multilevel"/>
     <w:tmpl w:val="309E9618"/>
@@ -8963,7 +9734,7 @@
       </w:rPr>
     </w:lvl>
   </w:abstractNum>
-  <w:abstractNum w:abstractNumId="46" w15:restartNumberingAfterBreak="0">
+  <w:abstractNum w:abstractNumId="47" w15:restartNumberingAfterBreak="0">
     <w:nsid w:val="24796798"/>
     <w:multiLevelType w:val="hybridMultilevel"/>
     <w:tmpl w:val="6622BEDC"/>
@@ -9052,7 +9823,7 @@
       </w:pPr>
     </w:lvl>
   </w:abstractNum>
-  <w:abstractNum w:abstractNumId="47" w15:restartNumberingAfterBreak="0">
+  <w:abstractNum w:abstractNumId="48" w15:restartNumberingAfterBreak="0">
     <w:nsid w:val="253B76EC"/>
     <w:multiLevelType w:val="multilevel"/>
     <w:tmpl w:val="2AA67CDA"/>
@@ -9201,7 +9972,7 @@
       </w:rPr>
     </w:lvl>
   </w:abstractNum>
-  <w:abstractNum w:abstractNumId="48" w15:restartNumberingAfterBreak="0">
+  <w:abstractNum w:abstractNumId="49" w15:restartNumberingAfterBreak="0">
     <w:nsid w:val="2D0F5EA7"/>
     <w:multiLevelType w:val="hybridMultilevel"/>
     <w:tmpl w:val="F68ABCD6"/>
@@ -9314,7 +10085,7 @@
       </w:rPr>
     </w:lvl>
   </w:abstractNum>
-  <w:abstractNum w:abstractNumId="49" w15:restartNumberingAfterBreak="0">
+  <w:abstractNum w:abstractNumId="50" w15:restartNumberingAfterBreak="0">
     <w:nsid w:val="2E4D738C"/>
     <w:multiLevelType w:val="multilevel"/>
     <w:tmpl w:val="1540BBA2"/>
@@ -9463,7 +10234,7 @@
       </w:rPr>
     </w:lvl>
   </w:abstractNum>
-  <w:abstractNum w:abstractNumId="50" w15:restartNumberingAfterBreak="0">
+  <w:abstractNum w:abstractNumId="51" w15:restartNumberingAfterBreak="0">
     <w:nsid w:val="2F0041C7"/>
     <w:multiLevelType w:val="multilevel"/>
     <w:tmpl w:val="656414FE"/>
@@ -9612,7 +10383,7 @@
       </w:rPr>
     </w:lvl>
   </w:abstractNum>
-  <w:abstractNum w:abstractNumId="51" w15:restartNumberingAfterBreak="0">
+  <w:abstractNum w:abstractNumId="52" w15:restartNumberingAfterBreak="0">
     <w:nsid w:val="304F01FA"/>
     <w:multiLevelType w:val="multilevel"/>
     <w:tmpl w:val="151C4EC6"/>
@@ -9761,7 +10532,7 @@
       </w:rPr>
     </w:lvl>
   </w:abstractNum>
-  <w:abstractNum w:abstractNumId="52" w15:restartNumberingAfterBreak="0">
+  <w:abstractNum w:abstractNumId="53" w15:restartNumberingAfterBreak="0">
     <w:nsid w:val="30BD025D"/>
     <w:multiLevelType w:val="hybridMultilevel"/>
     <w:tmpl w:val="04381C82"/>
@@ -9850,7 +10621,7 @@
       </w:pPr>
     </w:lvl>
   </w:abstractNum>
-  <w:abstractNum w:abstractNumId="53" w15:restartNumberingAfterBreak="0">
+  <w:abstractNum w:abstractNumId="54" w15:restartNumberingAfterBreak="0">
     <w:nsid w:val="327C0BA6"/>
     <w:multiLevelType w:val="hybridMultilevel"/>
     <w:tmpl w:val="2A9047EE"/>
@@ -9963,7 +10734,7 @@
       </w:rPr>
     </w:lvl>
   </w:abstractNum>
-  <w:abstractNum w:abstractNumId="54" w15:restartNumberingAfterBreak="0">
+  <w:abstractNum w:abstractNumId="55" w15:restartNumberingAfterBreak="0">
     <w:nsid w:val="338D63E8"/>
     <w:multiLevelType w:val="hybridMultilevel"/>
     <w:tmpl w:val="28D0FB50"/>
@@ -10076,7 +10847,7 @@
       </w:rPr>
     </w:lvl>
   </w:abstractNum>
-  <w:abstractNum w:abstractNumId="55" w15:restartNumberingAfterBreak="0">
+  <w:abstractNum w:abstractNumId="56" w15:restartNumberingAfterBreak="0">
     <w:nsid w:val="34182771"/>
     <w:multiLevelType w:val="multilevel"/>
     <w:tmpl w:val="2AA67CDA"/>
@@ -10225,7 +10996,7 @@
       </w:rPr>
     </w:lvl>
   </w:abstractNum>
-  <w:abstractNum w:abstractNumId="56" w15:restartNumberingAfterBreak="0">
+  <w:abstractNum w:abstractNumId="57" w15:restartNumberingAfterBreak="0">
     <w:nsid w:val="35413E58"/>
     <w:multiLevelType w:val="hybridMultilevel"/>
     <w:tmpl w:val="03C64164"/>
@@ -10338,7 +11109,7 @@
       </w:rPr>
     </w:lvl>
   </w:abstractNum>
-  <w:abstractNum w:abstractNumId="57" w15:restartNumberingAfterBreak="0">
+  <w:abstractNum w:abstractNumId="58" w15:restartNumberingAfterBreak="0">
     <w:nsid w:val="35C86AF0"/>
     <w:multiLevelType w:val="multilevel"/>
     <w:tmpl w:val="8202FCD6"/>
@@ -10487,7 +11258,7 @@
       </w:rPr>
     </w:lvl>
   </w:abstractNum>
-  <w:abstractNum w:abstractNumId="58" w15:restartNumberingAfterBreak="0">
+  <w:abstractNum w:abstractNumId="59" w15:restartNumberingAfterBreak="0">
     <w:nsid w:val="3623194A"/>
     <w:multiLevelType w:val="multilevel"/>
     <w:tmpl w:val="63F4E6F0"/>
@@ -10636,7 +11407,7 @@
       </w:rPr>
     </w:lvl>
   </w:abstractNum>
-  <w:abstractNum w:abstractNumId="59" w15:restartNumberingAfterBreak="0">
+  <w:abstractNum w:abstractNumId="60" w15:restartNumberingAfterBreak="0">
     <w:nsid w:val="36E36979"/>
     <w:multiLevelType w:val="multilevel"/>
     <w:tmpl w:val="3D58C93A"/>
@@ -10785,7 +11556,7 @@
       </w:rPr>
     </w:lvl>
   </w:abstractNum>
-  <w:abstractNum w:abstractNumId="60" w15:restartNumberingAfterBreak="0">
+  <w:abstractNum w:abstractNumId="61" w15:restartNumberingAfterBreak="0">
     <w:nsid w:val="37B424C3"/>
     <w:multiLevelType w:val="hybridMultilevel"/>
     <w:tmpl w:val="18F030D4"/>
@@ -10898,7 +11669,7 @@
       </w:rPr>
     </w:lvl>
   </w:abstractNum>
-  <w:abstractNum w:abstractNumId="61" w15:restartNumberingAfterBreak="0">
+  <w:abstractNum w:abstractNumId="62" w15:restartNumberingAfterBreak="0">
     <w:nsid w:val="39FC34BD"/>
     <w:multiLevelType w:val="hybridMultilevel"/>
     <w:tmpl w:val="D0D4E132"/>
@@ -11011,7 +11782,7 @@
       </w:rPr>
     </w:lvl>
   </w:abstractNum>
-  <w:abstractNum w:abstractNumId="62" w15:restartNumberingAfterBreak="0">
+  <w:abstractNum w:abstractNumId="63" w15:restartNumberingAfterBreak="0">
     <w:nsid w:val="3BC10D30"/>
     <w:multiLevelType w:val="multilevel"/>
     <w:tmpl w:val="502AD78C"/>
@@ -11160,7 +11931,7 @@
       </w:rPr>
     </w:lvl>
   </w:abstractNum>
-  <w:abstractNum w:abstractNumId="63" w15:restartNumberingAfterBreak="0">
+  <w:abstractNum w:abstractNumId="64" w15:restartNumberingAfterBreak="0">
     <w:nsid w:val="3C276BB8"/>
     <w:multiLevelType w:val="multilevel"/>
     <w:tmpl w:val="2AA67CDA"/>
@@ -11309,7 +12080,7 @@
       </w:rPr>
     </w:lvl>
   </w:abstractNum>
-  <w:abstractNum w:abstractNumId="64" w15:restartNumberingAfterBreak="0">
+  <w:abstractNum w:abstractNumId="65" w15:restartNumberingAfterBreak="0">
     <w:nsid w:val="3C596808"/>
     <w:multiLevelType w:val="multilevel"/>
     <w:tmpl w:val="2AA67CDA"/>
@@ -11458,7 +12229,7 @@
       </w:rPr>
     </w:lvl>
   </w:abstractNum>
-  <w:abstractNum w:abstractNumId="65" w15:restartNumberingAfterBreak="0">
+  <w:abstractNum w:abstractNumId="66" w15:restartNumberingAfterBreak="0">
     <w:nsid w:val="3CBF280A"/>
     <w:multiLevelType w:val="multilevel"/>
     <w:tmpl w:val="A13E4362"/>
@@ -11607,7 +12378,7 @@
       </w:rPr>
     </w:lvl>
   </w:abstractNum>
-  <w:abstractNum w:abstractNumId="66" w15:restartNumberingAfterBreak="0">
+  <w:abstractNum w:abstractNumId="67" w15:restartNumberingAfterBreak="0">
     <w:nsid w:val="3CC7541B"/>
     <w:multiLevelType w:val="multilevel"/>
     <w:tmpl w:val="2AA67CDA"/>
@@ -11756,7 +12527,7 @@
       </w:rPr>
     </w:lvl>
   </w:abstractNum>
-  <w:abstractNum w:abstractNumId="67" w15:restartNumberingAfterBreak="0">
+  <w:abstractNum w:abstractNumId="68" w15:restartNumberingAfterBreak="0">
     <w:nsid w:val="3F5E3BA1"/>
     <w:multiLevelType w:val="multilevel"/>
     <w:tmpl w:val="2AA67CDA"/>
@@ -11905,7 +12676,7 @@
       </w:rPr>
     </w:lvl>
   </w:abstractNum>
-  <w:abstractNum w:abstractNumId="68" w15:restartNumberingAfterBreak="0">
+  <w:abstractNum w:abstractNumId="69" w15:restartNumberingAfterBreak="0">
     <w:nsid w:val="40431B1C"/>
     <w:multiLevelType w:val="multilevel"/>
     <w:tmpl w:val="5D8E77D0"/>
@@ -12054,7 +12825,7 @@
       </w:rPr>
     </w:lvl>
   </w:abstractNum>
-  <w:abstractNum w:abstractNumId="69" w15:restartNumberingAfterBreak="0">
+  <w:abstractNum w:abstractNumId="70" w15:restartNumberingAfterBreak="0">
     <w:nsid w:val="419E0199"/>
     <w:multiLevelType w:val="multilevel"/>
     <w:tmpl w:val="D6CA9606"/>
@@ -12203,7 +12974,7 @@
       </w:rPr>
     </w:lvl>
   </w:abstractNum>
-  <w:abstractNum w:abstractNumId="70" w15:restartNumberingAfterBreak="0">
+  <w:abstractNum w:abstractNumId="71" w15:restartNumberingAfterBreak="0">
     <w:nsid w:val="452F60FB"/>
     <w:multiLevelType w:val="hybridMultilevel"/>
     <w:tmpl w:val="892A990A"/>
@@ -12316,7 +13087,7 @@
       </w:rPr>
     </w:lvl>
   </w:abstractNum>
-  <w:abstractNum w:abstractNumId="71" w15:restartNumberingAfterBreak="0">
+  <w:abstractNum w:abstractNumId="72" w15:restartNumberingAfterBreak="0">
     <w:nsid w:val="47B65409"/>
     <w:multiLevelType w:val="multilevel"/>
     <w:tmpl w:val="2AA67CDA"/>
@@ -12465,7 +13236,7 @@
       </w:rPr>
     </w:lvl>
   </w:abstractNum>
-  <w:abstractNum w:abstractNumId="72" w15:restartNumberingAfterBreak="0">
+  <w:abstractNum w:abstractNumId="73" w15:restartNumberingAfterBreak="0">
     <w:nsid w:val="47BF2170"/>
     <w:multiLevelType w:val="multilevel"/>
     <w:tmpl w:val="D9681266"/>
@@ -12614,7 +13385,7 @@
       </w:rPr>
     </w:lvl>
   </w:abstractNum>
-  <w:abstractNum w:abstractNumId="73" w15:restartNumberingAfterBreak="0">
+  <w:abstractNum w:abstractNumId="74" w15:restartNumberingAfterBreak="0">
     <w:nsid w:val="47E5592F"/>
     <w:multiLevelType w:val="hybridMultilevel"/>
     <w:tmpl w:val="719AB9FA"/>
@@ -12727,7 +13498,7 @@
       </w:rPr>
     </w:lvl>
   </w:abstractNum>
-  <w:abstractNum w:abstractNumId="74" w15:restartNumberingAfterBreak="0">
+  <w:abstractNum w:abstractNumId="75" w15:restartNumberingAfterBreak="0">
     <w:nsid w:val="48C041A9"/>
     <w:multiLevelType w:val="multilevel"/>
     <w:tmpl w:val="59A694BC"/>
@@ -12876,7 +13647,7 @@
       </w:rPr>
     </w:lvl>
   </w:abstractNum>
-  <w:abstractNum w:abstractNumId="75" w15:restartNumberingAfterBreak="0">
+  <w:abstractNum w:abstractNumId="76" w15:restartNumberingAfterBreak="0">
     <w:nsid w:val="49D6568A"/>
     <w:multiLevelType w:val="multilevel"/>
     <w:tmpl w:val="559E29EC"/>
@@ -13025,7 +13796,7 @@
       </w:rPr>
     </w:lvl>
   </w:abstractNum>
-  <w:abstractNum w:abstractNumId="76" w15:restartNumberingAfterBreak="0">
+  <w:abstractNum w:abstractNumId="77" w15:restartNumberingAfterBreak="0">
     <w:nsid w:val="4A7C2BC0"/>
     <w:multiLevelType w:val="hybridMultilevel"/>
     <w:tmpl w:val="4E4ADB18"/>
@@ -13138,7 +13909,7 @@
       </w:rPr>
     </w:lvl>
   </w:abstractNum>
-  <w:abstractNum w:abstractNumId="77" w15:restartNumberingAfterBreak="0">
+  <w:abstractNum w:abstractNumId="78" w15:restartNumberingAfterBreak="0">
     <w:nsid w:val="4AF73293"/>
     <w:multiLevelType w:val="hybridMultilevel"/>
     <w:tmpl w:val="F2962738"/>
@@ -13251,7 +14022,7 @@
       </w:rPr>
     </w:lvl>
   </w:abstractNum>
-  <w:abstractNum w:abstractNumId="78" w15:restartNumberingAfterBreak="0">
+  <w:abstractNum w:abstractNumId="79" w15:restartNumberingAfterBreak="0">
     <w:nsid w:val="4B375248"/>
     <w:multiLevelType w:val="multilevel"/>
     <w:tmpl w:val="B574C1C6"/>
@@ -13400,7 +14171,7 @@
       </w:rPr>
     </w:lvl>
   </w:abstractNum>
-  <w:abstractNum w:abstractNumId="79" w15:restartNumberingAfterBreak="0">
+  <w:abstractNum w:abstractNumId="80" w15:restartNumberingAfterBreak="0">
     <w:nsid w:val="4BA13766"/>
     <w:multiLevelType w:val="multilevel"/>
     <w:tmpl w:val="63F4E6F0"/>
@@ -13549,7 +14320,7 @@
       </w:rPr>
     </w:lvl>
   </w:abstractNum>
-  <w:abstractNum w:abstractNumId="80" w15:restartNumberingAfterBreak="0">
+  <w:abstractNum w:abstractNumId="81" w15:restartNumberingAfterBreak="0">
     <w:nsid w:val="4BA25441"/>
     <w:multiLevelType w:val="hybridMultilevel"/>
     <w:tmpl w:val="217E2E96"/>
@@ -13662,7 +14433,7 @@
       </w:rPr>
     </w:lvl>
   </w:abstractNum>
-  <w:abstractNum w:abstractNumId="81" w15:restartNumberingAfterBreak="0">
+  <w:abstractNum w:abstractNumId="82" w15:restartNumberingAfterBreak="0">
     <w:nsid w:val="4E276DCB"/>
     <w:multiLevelType w:val="hybridMultilevel"/>
     <w:tmpl w:val="B7C469B4"/>
@@ -13775,7 +14546,7 @@
       </w:rPr>
     </w:lvl>
   </w:abstractNum>
-  <w:abstractNum w:abstractNumId="82" w15:restartNumberingAfterBreak="0">
+  <w:abstractNum w:abstractNumId="83" w15:restartNumberingAfterBreak="0">
     <w:nsid w:val="4F053929"/>
     <w:multiLevelType w:val="hybridMultilevel"/>
     <w:tmpl w:val="2A78C678"/>
@@ -13888,7 +14659,7 @@
       </w:rPr>
     </w:lvl>
   </w:abstractNum>
-  <w:abstractNum w:abstractNumId="83" w15:restartNumberingAfterBreak="0">
+  <w:abstractNum w:abstractNumId="84" w15:restartNumberingAfterBreak="0">
     <w:nsid w:val="4F750073"/>
     <w:multiLevelType w:val="hybridMultilevel"/>
     <w:tmpl w:val="EC7AB8FC"/>
@@ -14001,7 +14772,7 @@
       </w:rPr>
     </w:lvl>
   </w:abstractNum>
-  <w:abstractNum w:abstractNumId="84" w15:restartNumberingAfterBreak="0">
+  <w:abstractNum w:abstractNumId="85" w15:restartNumberingAfterBreak="0">
     <w:nsid w:val="4FFB237E"/>
     <w:multiLevelType w:val="multilevel"/>
     <w:tmpl w:val="2AA67CDA"/>
@@ -14150,7 +14921,7 @@
       </w:rPr>
     </w:lvl>
   </w:abstractNum>
-  <w:abstractNum w:abstractNumId="85" w15:restartNumberingAfterBreak="0">
+  <w:abstractNum w:abstractNumId="86" w15:restartNumberingAfterBreak="0">
     <w:nsid w:val="51737FE0"/>
     <w:multiLevelType w:val="hybridMultilevel"/>
     <w:tmpl w:val="2B0604E6"/>
@@ -14263,7 +15034,7 @@
       </w:rPr>
     </w:lvl>
   </w:abstractNum>
-  <w:abstractNum w:abstractNumId="86" w15:restartNumberingAfterBreak="0">
+  <w:abstractNum w:abstractNumId="87" w15:restartNumberingAfterBreak="0">
     <w:nsid w:val="518B1885"/>
     <w:multiLevelType w:val="multilevel"/>
     <w:tmpl w:val="AE1AAC28"/>
@@ -14412,7 +15183,7 @@
       </w:rPr>
     </w:lvl>
   </w:abstractNum>
-  <w:abstractNum w:abstractNumId="87" w15:restartNumberingAfterBreak="0">
+  <w:abstractNum w:abstractNumId="88" w15:restartNumberingAfterBreak="0">
     <w:nsid w:val="51A86EF8"/>
     <w:multiLevelType w:val="multilevel"/>
     <w:tmpl w:val="FF2841D4"/>
@@ -14561,7 +15332,7 @@
       </w:rPr>
     </w:lvl>
   </w:abstractNum>
-  <w:abstractNum w:abstractNumId="88" w15:restartNumberingAfterBreak="0">
+  <w:abstractNum w:abstractNumId="89" w15:restartNumberingAfterBreak="0">
     <w:nsid w:val="51AB55CC"/>
     <w:multiLevelType w:val="multilevel"/>
     <w:tmpl w:val="5986D838"/>
@@ -14710,7 +15481,7 @@
       </w:rPr>
     </w:lvl>
   </w:abstractNum>
-  <w:abstractNum w:abstractNumId="89" w15:restartNumberingAfterBreak="0">
+  <w:abstractNum w:abstractNumId="90" w15:restartNumberingAfterBreak="0">
     <w:nsid w:val="521378FF"/>
     <w:multiLevelType w:val="multilevel"/>
     <w:tmpl w:val="7B002268"/>
@@ -14859,7 +15630,7 @@
       </w:rPr>
     </w:lvl>
   </w:abstractNum>
-  <w:abstractNum w:abstractNumId="90" w15:restartNumberingAfterBreak="0">
+  <w:abstractNum w:abstractNumId="91" w15:restartNumberingAfterBreak="0">
     <w:nsid w:val="521F2792"/>
     <w:multiLevelType w:val="multilevel"/>
     <w:tmpl w:val="9FB45386"/>
@@ -15008,7 +15779,7 @@
       </w:rPr>
     </w:lvl>
   </w:abstractNum>
-  <w:abstractNum w:abstractNumId="91" w15:restartNumberingAfterBreak="0">
+  <w:abstractNum w:abstractNumId="92" w15:restartNumberingAfterBreak="0">
     <w:nsid w:val="53390911"/>
     <w:multiLevelType w:val="multilevel"/>
     <w:tmpl w:val="1C380F12"/>
@@ -15157,7 +15928,7 @@
       </w:rPr>
     </w:lvl>
   </w:abstractNum>
-  <w:abstractNum w:abstractNumId="92" w15:restartNumberingAfterBreak="0">
+  <w:abstractNum w:abstractNumId="93" w15:restartNumberingAfterBreak="0">
     <w:nsid w:val="53CD23AC"/>
     <w:multiLevelType w:val="multilevel"/>
     <w:tmpl w:val="57BAE8F0"/>
@@ -15306,7 +16077,7 @@
       </w:rPr>
     </w:lvl>
   </w:abstractNum>
-  <w:abstractNum w:abstractNumId="93" w15:restartNumberingAfterBreak="0">
+  <w:abstractNum w:abstractNumId="94" w15:restartNumberingAfterBreak="0">
     <w:nsid w:val="5462791F"/>
     <w:multiLevelType w:val="hybridMultilevel"/>
     <w:tmpl w:val="FDE24C26"/>
@@ -15419,7 +16190,7 @@
       </w:rPr>
     </w:lvl>
   </w:abstractNum>
-  <w:abstractNum w:abstractNumId="94" w15:restartNumberingAfterBreak="0">
+  <w:abstractNum w:abstractNumId="95" w15:restartNumberingAfterBreak="0">
     <w:nsid w:val="547005EB"/>
     <w:multiLevelType w:val="multilevel"/>
     <w:tmpl w:val="F260CC5C"/>
@@ -15568,7 +16339,7 @@
       </w:rPr>
     </w:lvl>
   </w:abstractNum>
-  <w:abstractNum w:abstractNumId="95" w15:restartNumberingAfterBreak="0">
+  <w:abstractNum w:abstractNumId="96" w15:restartNumberingAfterBreak="0">
     <w:nsid w:val="58034221"/>
     <w:multiLevelType w:val="hybridMultilevel"/>
     <w:tmpl w:val="65D0619C"/>
@@ -15681,7 +16452,7 @@
       </w:rPr>
     </w:lvl>
   </w:abstractNum>
-  <w:abstractNum w:abstractNumId="96" w15:restartNumberingAfterBreak="0">
+  <w:abstractNum w:abstractNumId="97" w15:restartNumberingAfterBreak="0">
     <w:nsid w:val="59515319"/>
     <w:multiLevelType w:val="multilevel"/>
     <w:tmpl w:val="5AD8ACF0"/>
@@ -15830,7 +16601,7 @@
       </w:rPr>
     </w:lvl>
   </w:abstractNum>
-  <w:abstractNum w:abstractNumId="97" w15:restartNumberingAfterBreak="0">
+  <w:abstractNum w:abstractNumId="98" w15:restartNumberingAfterBreak="0">
     <w:nsid w:val="5A460390"/>
     <w:multiLevelType w:val="hybridMultilevel"/>
     <w:tmpl w:val="BD8E939C"/>
@@ -15943,7 +16714,7 @@
       </w:rPr>
     </w:lvl>
   </w:abstractNum>
-  <w:abstractNum w:abstractNumId="98" w15:restartNumberingAfterBreak="0">
+  <w:abstractNum w:abstractNumId="99" w15:restartNumberingAfterBreak="0">
     <w:nsid w:val="5CEE630B"/>
     <w:multiLevelType w:val="hybridMultilevel"/>
     <w:tmpl w:val="DE8E8DBA"/>
@@ -16056,7 +16827,7 @@
       </w:rPr>
     </w:lvl>
   </w:abstractNum>
-  <w:abstractNum w:abstractNumId="99" w15:restartNumberingAfterBreak="0">
+  <w:abstractNum w:abstractNumId="100" w15:restartNumberingAfterBreak="0">
     <w:nsid w:val="5D5A183C"/>
     <w:multiLevelType w:val="multilevel"/>
     <w:tmpl w:val="C804C34A"/>
@@ -16205,7 +16976,7 @@
       </w:rPr>
     </w:lvl>
   </w:abstractNum>
-  <w:abstractNum w:abstractNumId="100" w15:restartNumberingAfterBreak="0">
+  <w:abstractNum w:abstractNumId="101" w15:restartNumberingAfterBreak="0">
     <w:nsid w:val="5DF95194"/>
     <w:multiLevelType w:val="multilevel"/>
     <w:tmpl w:val="CC127E54"/>
@@ -16354,7 +17125,7 @@
       </w:rPr>
     </w:lvl>
   </w:abstractNum>
-  <w:abstractNum w:abstractNumId="101" w15:restartNumberingAfterBreak="0">
+  <w:abstractNum w:abstractNumId="102" w15:restartNumberingAfterBreak="0">
     <w:nsid w:val="5E6333E0"/>
     <w:multiLevelType w:val="hybridMultilevel"/>
     <w:tmpl w:val="A15497C8"/>
@@ -16467,7 +17238,7 @@
       </w:rPr>
     </w:lvl>
   </w:abstractNum>
-  <w:abstractNum w:abstractNumId="102" w15:restartNumberingAfterBreak="0">
+  <w:abstractNum w:abstractNumId="103" w15:restartNumberingAfterBreak="0">
     <w:nsid w:val="5E9C452C"/>
     <w:multiLevelType w:val="multilevel"/>
     <w:tmpl w:val="B8727936"/>
@@ -16616,7 +17387,7 @@
       </w:rPr>
     </w:lvl>
   </w:abstractNum>
-  <w:abstractNum w:abstractNumId="103" w15:restartNumberingAfterBreak="0">
+  <w:abstractNum w:abstractNumId="104" w15:restartNumberingAfterBreak="0">
     <w:nsid w:val="5EC339A8"/>
     <w:multiLevelType w:val="multilevel"/>
     <w:tmpl w:val="36DAAD54"/>
@@ -16765,7 +17536,7 @@
       </w:rPr>
     </w:lvl>
   </w:abstractNum>
-  <w:abstractNum w:abstractNumId="104" w15:restartNumberingAfterBreak="0">
+  <w:abstractNum w:abstractNumId="105" w15:restartNumberingAfterBreak="0">
     <w:nsid w:val="62385AA6"/>
     <w:multiLevelType w:val="multilevel"/>
     <w:tmpl w:val="B9EAECD4"/>
@@ -16914,7 +17685,7 @@
       </w:rPr>
     </w:lvl>
   </w:abstractNum>
-  <w:abstractNum w:abstractNumId="105" w15:restartNumberingAfterBreak="0">
+  <w:abstractNum w:abstractNumId="106" w15:restartNumberingAfterBreak="0">
     <w:nsid w:val="625D686D"/>
     <w:multiLevelType w:val="multilevel"/>
     <w:tmpl w:val="BC1C2048"/>
@@ -17063,7 +17834,7 @@
       </w:rPr>
     </w:lvl>
   </w:abstractNum>
-  <w:abstractNum w:abstractNumId="106" w15:restartNumberingAfterBreak="0">
+  <w:abstractNum w:abstractNumId="107" w15:restartNumberingAfterBreak="0">
     <w:nsid w:val="62B46951"/>
     <w:multiLevelType w:val="hybridMultilevel"/>
     <w:tmpl w:val="0FEAFEC6"/>
@@ -17176,7 +17947,156 @@
       </w:rPr>
     </w:lvl>
   </w:abstractNum>
-  <w:abstractNum w:abstractNumId="107" w15:restartNumberingAfterBreak="0">
+  <w:abstractNum w:abstractNumId="108" w15:restartNumberingAfterBreak="0">
+    <w:nsid w:val="64014C6E"/>
+    <w:multiLevelType w:val="multilevel"/>
+    <w:tmpl w:val="96E42962"/>
+    <w:lvl w:ilvl="0">
+      <w:start w:val="1"/>
+      <w:numFmt w:val="bullet"/>
+      <w:lvlText w:val=""/>
+      <w:lvlJc w:val="left"/>
+      <w:pPr>
+        <w:tabs>
+          <w:tab w:val="num" w:pos="720"/>
+        </w:tabs>
+        <w:ind w:left="720" w:hanging="360"/>
+      </w:pPr>
+      <w:rPr>
+        <w:rFonts w:ascii="Symbol" w:hAnsi="Symbol" w:hint="default"/>
+        <w:sz w:val="20"/>
+      </w:rPr>
+    </w:lvl>
+    <w:lvl w:ilvl="1">
+      <w:start w:val="1"/>
+      <w:numFmt w:val="bullet"/>
+      <w:lvlText w:val="o"/>
+      <w:lvlJc w:val="left"/>
+      <w:pPr>
+        <w:tabs>
+          <w:tab w:val="num" w:pos="1440"/>
+        </w:tabs>
+        <w:ind w:left="1440" w:hanging="360"/>
+      </w:pPr>
+      <w:rPr>
+        <w:rFonts w:ascii="Courier New" w:hAnsi="Courier New" w:hint="default"/>
+        <w:sz w:val="20"/>
+      </w:rPr>
+    </w:lvl>
+    <w:lvl w:ilvl="2" w:tentative="1">
+      <w:start w:val="1"/>
+      <w:numFmt w:val="bullet"/>
+      <w:lvlText w:val=""/>
+      <w:lvlJc w:val="left"/>
+      <w:pPr>
+        <w:tabs>
+          <w:tab w:val="num" w:pos="2160"/>
+        </w:tabs>
+        <w:ind w:left="2160" w:hanging="360"/>
+      </w:pPr>
+      <w:rPr>
+        <w:rFonts w:ascii="Wingdings" w:hAnsi="Wingdings" w:hint="default"/>
+        <w:sz w:val="20"/>
+      </w:rPr>
+    </w:lvl>
+    <w:lvl w:ilvl="3" w:tentative="1">
+      <w:start w:val="1"/>
+      <w:numFmt w:val="bullet"/>
+      <w:lvlText w:val=""/>
+      <w:lvlJc w:val="left"/>
+      <w:pPr>
+        <w:tabs>
+          <w:tab w:val="num" w:pos="2880"/>
+        </w:tabs>
+        <w:ind w:left="2880" w:hanging="360"/>
+      </w:pPr>
+      <w:rPr>
+        <w:rFonts w:ascii="Wingdings" w:hAnsi="Wingdings" w:hint="default"/>
+        <w:sz w:val="20"/>
+      </w:rPr>
+    </w:lvl>
+    <w:lvl w:ilvl="4" w:tentative="1">
+      <w:start w:val="1"/>
+      <w:numFmt w:val="bullet"/>
+      <w:lvlText w:val=""/>
+      <w:lvlJc w:val="left"/>
+      <w:pPr>
+        <w:tabs>
+          <w:tab w:val="num" w:pos="3600"/>
+        </w:tabs>
+        <w:ind w:left="3600" w:hanging="360"/>
+      </w:pPr>
+      <w:rPr>
+        <w:rFonts w:ascii="Wingdings" w:hAnsi="Wingdings" w:hint="default"/>
+        <w:sz w:val="20"/>
+      </w:rPr>
+    </w:lvl>
+    <w:lvl w:ilvl="5" w:tentative="1">
+      <w:start w:val="1"/>
+      <w:numFmt w:val="bullet"/>
+      <w:lvlText w:val=""/>
+      <w:lvlJc w:val="left"/>
+      <w:pPr>
+        <w:tabs>
+          <w:tab w:val="num" w:pos="4320"/>
+        </w:tabs>
+        <w:ind w:left="4320" w:hanging="360"/>
+      </w:pPr>
+      <w:rPr>
+        <w:rFonts w:ascii="Wingdings" w:hAnsi="Wingdings" w:hint="default"/>
+        <w:sz w:val="20"/>
+      </w:rPr>
+    </w:lvl>
+    <w:lvl w:ilvl="6" w:tentative="1">
+      <w:start w:val="1"/>
+      <w:numFmt w:val="bullet"/>
+      <w:lvlText w:val=""/>
+      <w:lvlJc w:val="left"/>
+      <w:pPr>
+        <w:tabs>
+          <w:tab w:val="num" w:pos="5040"/>
+        </w:tabs>
+        <w:ind w:left="5040" w:hanging="360"/>
+      </w:pPr>
+      <w:rPr>
+        <w:rFonts w:ascii="Wingdings" w:hAnsi="Wingdings" w:hint="default"/>
+        <w:sz w:val="20"/>
+      </w:rPr>
+    </w:lvl>
+    <w:lvl w:ilvl="7" w:tentative="1">
+      <w:start w:val="1"/>
+      <w:numFmt w:val="bullet"/>
+      <w:lvlText w:val=""/>
+      <w:lvlJc w:val="left"/>
+      <w:pPr>
+        <w:tabs>
+          <w:tab w:val="num" w:pos="5760"/>
+        </w:tabs>
+        <w:ind w:left="5760" w:hanging="360"/>
+      </w:pPr>
+      <w:rPr>
+        <w:rFonts w:ascii="Wingdings" w:hAnsi="Wingdings" w:hint="default"/>
+        <w:sz w:val="20"/>
+      </w:rPr>
+    </w:lvl>
+    <w:lvl w:ilvl="8" w:tentative="1">
+      <w:start w:val="1"/>
+      <w:numFmt w:val="bullet"/>
+      <w:lvlText w:val=""/>
+      <w:lvlJc w:val="left"/>
+      <w:pPr>
+        <w:tabs>
+          <w:tab w:val="num" w:pos="6480"/>
+        </w:tabs>
+        <w:ind w:left="6480" w:hanging="360"/>
+      </w:pPr>
+      <w:rPr>
+        <w:rFonts w:ascii="Wingdings" w:hAnsi="Wingdings" w:hint="default"/>
+        <w:sz w:val="20"/>
+      </w:rPr>
+    </w:lvl>
+  </w:abstractNum>
+  <w:abstractNum w:abstractNumId="109" w15:restartNumberingAfterBreak="0">
     <w:nsid w:val="647819E3"/>
     <w:multiLevelType w:val="multilevel"/>
     <w:tmpl w:val="ABB278BC"/>
@@ -17325,7 +18245,7 @@
       </w:rPr>
     </w:lvl>
   </w:abstractNum>
-  <w:abstractNum w:abstractNumId="108" w15:restartNumberingAfterBreak="0">
+  <w:abstractNum w:abstractNumId="110" w15:restartNumberingAfterBreak="0">
     <w:nsid w:val="64F30198"/>
     <w:multiLevelType w:val="multilevel"/>
     <w:tmpl w:val="63F4E6F0"/>
@@ -17474,7 +18394,7 @@
       </w:rPr>
     </w:lvl>
   </w:abstractNum>
-  <w:abstractNum w:abstractNumId="109" w15:restartNumberingAfterBreak="0">
+  <w:abstractNum w:abstractNumId="111" w15:restartNumberingAfterBreak="0">
     <w:nsid w:val="65314293"/>
     <w:multiLevelType w:val="hybridMultilevel"/>
     <w:tmpl w:val="6688DFAC"/>
@@ -17587,7 +18507,7 @@
       </w:rPr>
     </w:lvl>
   </w:abstractNum>
-  <w:abstractNum w:abstractNumId="110" w15:restartNumberingAfterBreak="0">
+  <w:abstractNum w:abstractNumId="112" w15:restartNumberingAfterBreak="0">
     <w:nsid w:val="65CE4D0F"/>
     <w:multiLevelType w:val="hybridMultilevel"/>
     <w:tmpl w:val="DB668538"/>
@@ -17700,7 +18620,7 @@
       </w:rPr>
     </w:lvl>
   </w:abstractNum>
-  <w:abstractNum w:abstractNumId="111" w15:restartNumberingAfterBreak="0">
+  <w:abstractNum w:abstractNumId="113" w15:restartNumberingAfterBreak="0">
     <w:nsid w:val="661C7D73"/>
     <w:multiLevelType w:val="multilevel"/>
     <w:tmpl w:val="D9681266"/>
@@ -17849,7 +18769,7 @@
       </w:rPr>
     </w:lvl>
   </w:abstractNum>
-  <w:abstractNum w:abstractNumId="112" w15:restartNumberingAfterBreak="0">
+  <w:abstractNum w:abstractNumId="114" w15:restartNumberingAfterBreak="0">
     <w:nsid w:val="661F6F82"/>
     <w:multiLevelType w:val="multilevel"/>
     <w:tmpl w:val="53F8A934"/>
@@ -17998,7 +18918,7 @@
       </w:rPr>
     </w:lvl>
   </w:abstractNum>
-  <w:abstractNum w:abstractNumId="113" w15:restartNumberingAfterBreak="0">
+  <w:abstractNum w:abstractNumId="115" w15:restartNumberingAfterBreak="0">
     <w:nsid w:val="66E36FE0"/>
     <w:multiLevelType w:val="multilevel"/>
     <w:tmpl w:val="2AA67CDA"/>
@@ -18147,7 +19067,7 @@
       </w:rPr>
     </w:lvl>
   </w:abstractNum>
-  <w:abstractNum w:abstractNumId="114" w15:restartNumberingAfterBreak="0">
+  <w:abstractNum w:abstractNumId="116" w15:restartNumberingAfterBreak="0">
     <w:nsid w:val="68205EC5"/>
     <w:multiLevelType w:val="multilevel"/>
     <w:tmpl w:val="EB4C8238"/>
@@ -18296,7 +19216,7 @@
       </w:rPr>
     </w:lvl>
   </w:abstractNum>
-  <w:abstractNum w:abstractNumId="115" w15:restartNumberingAfterBreak="0">
+  <w:abstractNum w:abstractNumId="117" w15:restartNumberingAfterBreak="0">
     <w:nsid w:val="68B94344"/>
     <w:multiLevelType w:val="multilevel"/>
     <w:tmpl w:val="9BA812D8"/>
@@ -18445,7 +19365,7 @@
       </w:rPr>
     </w:lvl>
   </w:abstractNum>
-  <w:abstractNum w:abstractNumId="116" w15:restartNumberingAfterBreak="0">
+  <w:abstractNum w:abstractNumId="118" w15:restartNumberingAfterBreak="0">
     <w:nsid w:val="69DE2C87"/>
     <w:multiLevelType w:val="hybridMultilevel"/>
     <w:tmpl w:val="F530F20A"/>
@@ -18558,7 +19478,7 @@
       </w:rPr>
     </w:lvl>
   </w:abstractNum>
-  <w:abstractNum w:abstractNumId="117" w15:restartNumberingAfterBreak="0">
+  <w:abstractNum w:abstractNumId="119" w15:restartNumberingAfterBreak="0">
     <w:nsid w:val="69ED672D"/>
     <w:multiLevelType w:val="multilevel"/>
     <w:tmpl w:val="CC08E300"/>
@@ -18707,7 +19627,7 @@
       </w:rPr>
     </w:lvl>
   </w:abstractNum>
-  <w:abstractNum w:abstractNumId="118" w15:restartNumberingAfterBreak="0">
+  <w:abstractNum w:abstractNumId="120" w15:restartNumberingAfterBreak="0">
     <w:nsid w:val="6A063EFD"/>
     <w:multiLevelType w:val="hybridMultilevel"/>
     <w:tmpl w:val="48703FBA"/>
@@ -18820,7 +19740,7 @@
       </w:rPr>
     </w:lvl>
   </w:abstractNum>
-  <w:abstractNum w:abstractNumId="119" w15:restartNumberingAfterBreak="0">
+  <w:abstractNum w:abstractNumId="121" w15:restartNumberingAfterBreak="0">
     <w:nsid w:val="6A825ABE"/>
     <w:multiLevelType w:val="multilevel"/>
     <w:tmpl w:val="0CD6F30E"/>
@@ -18969,7 +19889,7 @@
       </w:rPr>
     </w:lvl>
   </w:abstractNum>
-  <w:abstractNum w:abstractNumId="120" w15:restartNumberingAfterBreak="0">
+  <w:abstractNum w:abstractNumId="122" w15:restartNumberingAfterBreak="0">
     <w:nsid w:val="6B1D7832"/>
     <w:multiLevelType w:val="multilevel"/>
     <w:tmpl w:val="DD4646B2"/>
@@ -19118,7 +20038,7 @@
       </w:rPr>
     </w:lvl>
   </w:abstractNum>
-  <w:abstractNum w:abstractNumId="121" w15:restartNumberingAfterBreak="0">
+  <w:abstractNum w:abstractNumId="123" w15:restartNumberingAfterBreak="0">
     <w:nsid w:val="6C6D6667"/>
     <w:multiLevelType w:val="hybridMultilevel"/>
     <w:tmpl w:val="A744709C"/>
@@ -19231,7 +20151,7 @@
       </w:rPr>
     </w:lvl>
   </w:abstractNum>
-  <w:abstractNum w:abstractNumId="122" w15:restartNumberingAfterBreak="0">
+  <w:abstractNum w:abstractNumId="124" w15:restartNumberingAfterBreak="0">
     <w:nsid w:val="6CAD7EA5"/>
     <w:multiLevelType w:val="multilevel"/>
     <w:tmpl w:val="C472C5B0"/>
@@ -19380,7 +20300,7 @@
       </w:rPr>
     </w:lvl>
   </w:abstractNum>
-  <w:abstractNum w:abstractNumId="123" w15:restartNumberingAfterBreak="0">
+  <w:abstractNum w:abstractNumId="125" w15:restartNumberingAfterBreak="0">
     <w:nsid w:val="6E43557B"/>
     <w:multiLevelType w:val="multilevel"/>
     <w:tmpl w:val="323C7112"/>
@@ -19529,7 +20449,7 @@
       </w:rPr>
     </w:lvl>
   </w:abstractNum>
-  <w:abstractNum w:abstractNumId="124" w15:restartNumberingAfterBreak="0">
+  <w:abstractNum w:abstractNumId="126" w15:restartNumberingAfterBreak="0">
     <w:nsid w:val="6EA27D0A"/>
     <w:multiLevelType w:val="multilevel"/>
     <w:tmpl w:val="7BF0256C"/>
@@ -19678,7 +20598,7 @@
       </w:rPr>
     </w:lvl>
   </w:abstractNum>
-  <w:abstractNum w:abstractNumId="125" w15:restartNumberingAfterBreak="0">
+  <w:abstractNum w:abstractNumId="127" w15:restartNumberingAfterBreak="0">
     <w:nsid w:val="6EF86273"/>
     <w:multiLevelType w:val="multilevel"/>
     <w:tmpl w:val="2AA67CDA"/>
@@ -19827,7 +20747,156 @@
       </w:rPr>
     </w:lvl>
   </w:abstractNum>
-  <w:abstractNum w:abstractNumId="126" w15:restartNumberingAfterBreak="0">
+  <w:abstractNum w:abstractNumId="128" w15:restartNumberingAfterBreak="0">
+    <w:nsid w:val="6F1425D4"/>
+    <w:multiLevelType w:val="multilevel"/>
+    <w:tmpl w:val="F71C8B08"/>
+    <w:lvl w:ilvl="0">
+      <w:start w:val="1"/>
+      <w:numFmt w:val="bullet"/>
+      <w:lvlText w:val=""/>
+      <w:lvlJc w:val="left"/>
+      <w:pPr>
+        <w:tabs>
+          <w:tab w:val="num" w:pos="720"/>
+        </w:tabs>
+        <w:ind w:left="720" w:hanging="360"/>
+      </w:pPr>
+      <w:rPr>
+        <w:rFonts w:ascii="Symbol" w:hAnsi="Symbol" w:hint="default"/>
+        <w:sz w:val="20"/>
+      </w:rPr>
+    </w:lvl>
+    <w:lvl w:ilvl="1" w:tentative="1">
+      <w:start w:val="1"/>
+      <w:numFmt w:val="bullet"/>
+      <w:lvlText w:val="o"/>
+      <w:lvlJc w:val="left"/>
+      <w:pPr>
+        <w:tabs>
+          <w:tab w:val="num" w:pos="1440"/>
+        </w:tabs>
+        <w:ind w:left="1440" w:hanging="360"/>
+      </w:pPr>
+      <w:rPr>
+        <w:rFonts w:ascii="Courier New" w:hAnsi="Courier New" w:hint="default"/>
+        <w:sz w:val="20"/>
+      </w:rPr>
+    </w:lvl>
+    <w:lvl w:ilvl="2" w:tentative="1">
+      <w:start w:val="1"/>
+      <w:numFmt w:val="bullet"/>
+      <w:lvlText w:val=""/>
+      <w:lvlJc w:val="left"/>
+      <w:pPr>
+        <w:tabs>
+          <w:tab w:val="num" w:pos="2160"/>
+        </w:tabs>
+        <w:ind w:left="2160" w:hanging="360"/>
+      </w:pPr>
+      <w:rPr>
+        <w:rFonts w:ascii="Wingdings" w:hAnsi="Wingdings" w:hint="default"/>
+        <w:sz w:val="20"/>
+      </w:rPr>
+    </w:lvl>
+    <w:lvl w:ilvl="3" w:tentative="1">
+      <w:start w:val="1"/>
+      <w:numFmt w:val="bullet"/>
+      <w:lvlText w:val=""/>
+      <w:lvlJc w:val="left"/>
+      <w:pPr>
+        <w:tabs>
+          <w:tab w:val="num" w:pos="2880"/>
+        </w:tabs>
+        <w:ind w:left="2880" w:hanging="360"/>
+      </w:pPr>
+      <w:rPr>
+        <w:rFonts w:ascii="Wingdings" w:hAnsi="Wingdings" w:hint="default"/>
+        <w:sz w:val="20"/>
+      </w:rPr>
+    </w:lvl>
+    <w:lvl w:ilvl="4" w:tentative="1">
+      <w:start w:val="1"/>
+      <w:numFmt w:val="bullet"/>
+      <w:lvlText w:val=""/>
+      <w:lvlJc w:val="left"/>
+      <w:pPr>
+        <w:tabs>
+          <w:tab w:val="num" w:pos="3600"/>
+        </w:tabs>
+        <w:ind w:left="3600" w:hanging="360"/>
+      </w:pPr>
+      <w:rPr>
+        <w:rFonts w:ascii="Wingdings" w:hAnsi="Wingdings" w:hint="default"/>
+        <w:sz w:val="20"/>
+      </w:rPr>
+    </w:lvl>
+    <w:lvl w:ilvl="5" w:tentative="1">
+      <w:start w:val="1"/>
+      <w:numFmt w:val="bullet"/>
+      <w:lvlText w:val=""/>
+      <w:lvlJc w:val="left"/>
+      <w:pPr>
+        <w:tabs>
+          <w:tab w:val="num" w:pos="4320"/>
+        </w:tabs>
+        <w:ind w:left="4320" w:hanging="360"/>
+      </w:pPr>
+      <w:rPr>
+        <w:rFonts w:ascii="Wingdings" w:hAnsi="Wingdings" w:hint="default"/>
+        <w:sz w:val="20"/>
+      </w:rPr>
+    </w:lvl>
+    <w:lvl w:ilvl="6" w:tentative="1">
+      <w:start w:val="1"/>
+      <w:numFmt w:val="bullet"/>
+      <w:lvlText w:val=""/>
+      <w:lvlJc w:val="left"/>
+      <w:pPr>
+        <w:tabs>
+          <w:tab w:val="num" w:pos="5040"/>
+        </w:tabs>
+        <w:ind w:left="5040" w:hanging="360"/>
+      </w:pPr>
+      <w:rPr>
+        <w:rFonts w:ascii="Wingdings" w:hAnsi="Wingdings" w:hint="default"/>
+        <w:sz w:val="20"/>
+      </w:rPr>
+    </w:lvl>
+    <w:lvl w:ilvl="7" w:tentative="1">
+      <w:start w:val="1"/>
+      <w:numFmt w:val="bullet"/>
+      <w:lvlText w:val=""/>
+      <w:lvlJc w:val="left"/>
+      <w:pPr>
+        <w:tabs>
+          <w:tab w:val="num" w:pos="5760"/>
+        </w:tabs>
+        <w:ind w:left="5760" w:hanging="360"/>
+      </w:pPr>
+      <w:rPr>
+        <w:rFonts w:ascii="Wingdings" w:hAnsi="Wingdings" w:hint="default"/>
+        <w:sz w:val="20"/>
+      </w:rPr>
+    </w:lvl>
+    <w:lvl w:ilvl="8" w:tentative="1">
+      <w:start w:val="1"/>
+      <w:numFmt w:val="bullet"/>
+      <w:lvlText w:val=""/>
+      <w:lvlJc w:val="left"/>
+      <w:pPr>
+        <w:tabs>
+          <w:tab w:val="num" w:pos="6480"/>
+        </w:tabs>
+        <w:ind w:left="6480" w:hanging="360"/>
+      </w:pPr>
+      <w:rPr>
+        <w:rFonts w:ascii="Wingdings" w:hAnsi="Wingdings" w:hint="default"/>
+        <w:sz w:val="20"/>
+      </w:rPr>
+    </w:lvl>
+  </w:abstractNum>
+  <w:abstractNum w:abstractNumId="129" w15:restartNumberingAfterBreak="0">
     <w:nsid w:val="70874300"/>
     <w:multiLevelType w:val="hybridMultilevel"/>
     <w:tmpl w:val="1B3A0518"/>
@@ -19940,7 +21009,7 @@
       </w:rPr>
     </w:lvl>
   </w:abstractNum>
-  <w:abstractNum w:abstractNumId="127" w15:restartNumberingAfterBreak="0">
+  <w:abstractNum w:abstractNumId="130" w15:restartNumberingAfterBreak="0">
     <w:nsid w:val="7090251B"/>
     <w:multiLevelType w:val="hybridMultilevel"/>
     <w:tmpl w:val="67687EFE"/>
@@ -20053,7 +21122,7 @@
       </w:rPr>
     </w:lvl>
   </w:abstractNum>
-  <w:abstractNum w:abstractNumId="128" w15:restartNumberingAfterBreak="0">
+  <w:abstractNum w:abstractNumId="131" w15:restartNumberingAfterBreak="0">
     <w:nsid w:val="72031F81"/>
     <w:multiLevelType w:val="multilevel"/>
     <w:tmpl w:val="84400090"/>
@@ -20202,7 +21271,7 @@
       </w:rPr>
     </w:lvl>
   </w:abstractNum>
-  <w:abstractNum w:abstractNumId="129" w15:restartNumberingAfterBreak="0">
+  <w:abstractNum w:abstractNumId="132" w15:restartNumberingAfterBreak="0">
     <w:nsid w:val="722301E0"/>
     <w:multiLevelType w:val="multilevel"/>
     <w:tmpl w:val="1EE82E5A"/>
@@ -20351,7 +21420,7 @@
       </w:rPr>
     </w:lvl>
   </w:abstractNum>
-  <w:abstractNum w:abstractNumId="130" w15:restartNumberingAfterBreak="0">
+  <w:abstractNum w:abstractNumId="133" w15:restartNumberingAfterBreak="0">
     <w:nsid w:val="75144C65"/>
     <w:multiLevelType w:val="hybridMultilevel"/>
     <w:tmpl w:val="12127FAA"/>
@@ -20464,7 +21533,7 @@
       </w:rPr>
     </w:lvl>
   </w:abstractNum>
-  <w:abstractNum w:abstractNumId="131" w15:restartNumberingAfterBreak="0">
+  <w:abstractNum w:abstractNumId="134" w15:restartNumberingAfterBreak="0">
     <w:nsid w:val="75237F84"/>
     <w:multiLevelType w:val="hybridMultilevel"/>
     <w:tmpl w:val="5F0A6EF2"/>
@@ -20577,7 +21646,7 @@
       </w:rPr>
     </w:lvl>
   </w:abstractNum>
-  <w:abstractNum w:abstractNumId="132" w15:restartNumberingAfterBreak="0">
+  <w:abstractNum w:abstractNumId="135" w15:restartNumberingAfterBreak="0">
     <w:nsid w:val="758968F2"/>
     <w:multiLevelType w:val="multilevel"/>
     <w:tmpl w:val="D4241C4A"/>
@@ -20726,7 +21795,120 @@
       </w:rPr>
     </w:lvl>
   </w:abstractNum>
-  <w:abstractNum w:abstractNumId="133" w15:restartNumberingAfterBreak="0">
+  <w:abstractNum w:abstractNumId="136" w15:restartNumberingAfterBreak="0">
+    <w:nsid w:val="75F3357C"/>
+    <w:multiLevelType w:val="hybridMultilevel"/>
+    <w:tmpl w:val="26723550"/>
+    <w:lvl w:ilvl="0" w:tplc="04090005">
+      <w:start w:val="1"/>
+      <w:numFmt w:val="bullet"/>
+      <w:lvlText w:val=""/>
+      <w:lvlJc w:val="left"/>
+      <w:pPr>
+        <w:ind w:left="1080" w:hanging="360"/>
+      </w:pPr>
+      <w:rPr>
+        <w:rFonts w:ascii="Wingdings" w:hAnsi="Wingdings" w:hint="default"/>
+      </w:rPr>
+    </w:lvl>
+    <w:lvl w:ilvl="1" w:tplc="04090003" w:tentative="1">
+      <w:start w:val="1"/>
+      <w:numFmt w:val="bullet"/>
+      <w:lvlText w:val="o"/>
+      <w:lvlJc w:val="left"/>
+      <w:pPr>
+        <w:ind w:left="1800" w:hanging="360"/>
+      </w:pPr>
+      <w:rPr>
+        <w:rFonts w:ascii="Courier New" w:hAnsi="Courier New" w:cs="Courier New" w:hint="default"/>
+      </w:rPr>
+    </w:lvl>
+    <w:lvl w:ilvl="2" w:tplc="04090005" w:tentative="1">
+      <w:start w:val="1"/>
+      <w:numFmt w:val="bullet"/>
+      <w:lvlText w:val=""/>
+      <w:lvlJc w:val="left"/>
+      <w:pPr>
+        <w:ind w:left="2520" w:hanging="360"/>
+      </w:pPr>
+      <w:rPr>
+        <w:rFonts w:ascii="Wingdings" w:hAnsi="Wingdings" w:hint="default"/>
+      </w:rPr>
+    </w:lvl>
+    <w:lvl w:ilvl="3" w:tplc="04090001" w:tentative="1">
+      <w:start w:val="1"/>
+      <w:numFmt w:val="bullet"/>
+      <w:lvlText w:val=""/>
+      <w:lvlJc w:val="left"/>
+      <w:pPr>
+        <w:ind w:left="3240" w:hanging="360"/>
+      </w:pPr>
+      <w:rPr>
+        <w:rFonts w:ascii="Symbol" w:hAnsi="Symbol" w:hint="default"/>
+      </w:rPr>
+    </w:lvl>
+    <w:lvl w:ilvl="4" w:tplc="04090003" w:tentative="1">
+      <w:start w:val="1"/>
+      <w:numFmt w:val="bullet"/>
+      <w:lvlText w:val="o"/>
+      <w:lvlJc w:val="left"/>
+      <w:pPr>
+        <w:ind w:left="3960" w:hanging="360"/>
+      </w:pPr>
+      <w:rPr>
+        <w:rFonts w:ascii="Courier New" w:hAnsi="Courier New" w:cs="Courier New" w:hint="default"/>
+      </w:rPr>
+    </w:lvl>
+    <w:lvl w:ilvl="5" w:tplc="04090005" w:tentative="1">
+      <w:start w:val="1"/>
+      <w:numFmt w:val="bullet"/>
+      <w:lvlText w:val=""/>
+      <w:lvlJc w:val="left"/>
+      <w:pPr>
+        <w:ind w:left="4680" w:hanging="360"/>
+      </w:pPr>
+      <w:rPr>
+        <w:rFonts w:ascii="Wingdings" w:hAnsi="Wingdings" w:hint="default"/>
+      </w:rPr>
+    </w:lvl>
+    <w:lvl w:ilvl="6" w:tplc="04090001" w:tentative="1">
+      <w:start w:val="1"/>
+      <w:numFmt w:val="bullet"/>
+      <w:lvlText w:val=""/>
+      <w:lvlJc w:val="left"/>
+      <w:pPr>
+        <w:ind w:left="5400" w:hanging="360"/>
+      </w:pPr>
+      <w:rPr>
+        <w:rFonts w:ascii="Symbol" w:hAnsi="Symbol" w:hint="default"/>
+      </w:rPr>
+    </w:lvl>
+    <w:lvl w:ilvl="7" w:tplc="04090003" w:tentative="1">
+      <w:start w:val="1"/>
+      <w:numFmt w:val="bullet"/>
+      <w:lvlText w:val="o"/>
+      <w:lvlJc w:val="left"/>
+      <w:pPr>
+        <w:ind w:left="6120" w:hanging="360"/>
+      </w:pPr>
+      <w:rPr>
+        <w:rFonts w:ascii="Courier New" w:hAnsi="Courier New" w:cs="Courier New" w:hint="default"/>
+      </w:rPr>
+    </w:lvl>
+    <w:lvl w:ilvl="8" w:tplc="04090005" w:tentative="1">
+      <w:start w:val="1"/>
+      <w:numFmt w:val="bullet"/>
+      <w:lvlText w:val=""/>
+      <w:lvlJc w:val="left"/>
+      <w:pPr>
+        <w:ind w:left="6840" w:hanging="360"/>
+      </w:pPr>
+      <w:rPr>
+        <w:rFonts w:ascii="Wingdings" w:hAnsi="Wingdings" w:hint="default"/>
+      </w:rPr>
+    </w:lvl>
+  </w:abstractNum>
+  <w:abstractNum w:abstractNumId="137" w15:restartNumberingAfterBreak="0">
     <w:nsid w:val="75FF09B0"/>
     <w:multiLevelType w:val="multilevel"/>
     <w:tmpl w:val="C34A7734"/>
@@ -20875,7 +22057,7 @@
       </w:rPr>
     </w:lvl>
   </w:abstractNum>
-  <w:abstractNum w:abstractNumId="134" w15:restartNumberingAfterBreak="0">
+  <w:abstractNum w:abstractNumId="138" w15:restartNumberingAfterBreak="0">
     <w:nsid w:val="76864E3D"/>
     <w:multiLevelType w:val="hybridMultilevel"/>
     <w:tmpl w:val="9000C896"/>
@@ -20988,7 +22170,120 @@
       </w:rPr>
     </w:lvl>
   </w:abstractNum>
-  <w:abstractNum w:abstractNumId="135" w15:restartNumberingAfterBreak="0">
+  <w:abstractNum w:abstractNumId="139" w15:restartNumberingAfterBreak="0">
+    <w:nsid w:val="774028FF"/>
+    <w:multiLevelType w:val="hybridMultilevel"/>
+    <w:tmpl w:val="EED036DC"/>
+    <w:lvl w:ilvl="0" w:tplc="04090005">
+      <w:start w:val="1"/>
+      <w:numFmt w:val="bullet"/>
+      <w:lvlText w:val=""/>
+      <w:lvlJc w:val="left"/>
+      <w:pPr>
+        <w:ind w:left="1080" w:hanging="360"/>
+      </w:pPr>
+      <w:rPr>
+        <w:rFonts w:ascii="Wingdings" w:hAnsi="Wingdings" w:hint="default"/>
+      </w:rPr>
+    </w:lvl>
+    <w:lvl w:ilvl="1" w:tplc="04090003" w:tentative="1">
+      <w:start w:val="1"/>
+      <w:numFmt w:val="bullet"/>
+      <w:lvlText w:val="o"/>
+      <w:lvlJc w:val="left"/>
+      <w:pPr>
+        <w:ind w:left="1800" w:hanging="360"/>
+      </w:pPr>
+      <w:rPr>
+        <w:rFonts w:ascii="Courier New" w:hAnsi="Courier New" w:cs="Courier New" w:hint="default"/>
+      </w:rPr>
+    </w:lvl>
+    <w:lvl w:ilvl="2" w:tplc="04090005" w:tentative="1">
+      <w:start w:val="1"/>
+      <w:numFmt w:val="bullet"/>
+      <w:lvlText w:val=""/>
+      <w:lvlJc w:val="left"/>
+      <w:pPr>
+        <w:ind w:left="2520" w:hanging="360"/>
+      </w:pPr>
+      <w:rPr>
+        <w:rFonts w:ascii="Wingdings" w:hAnsi="Wingdings" w:hint="default"/>
+      </w:rPr>
+    </w:lvl>
+    <w:lvl w:ilvl="3" w:tplc="04090001" w:tentative="1">
+      <w:start w:val="1"/>
+      <w:numFmt w:val="bullet"/>
+      <w:lvlText w:val=""/>
+      <w:lvlJc w:val="left"/>
+      <w:pPr>
+        <w:ind w:left="3240" w:hanging="360"/>
+      </w:pPr>
+      <w:rPr>
+        <w:rFonts w:ascii="Symbol" w:hAnsi="Symbol" w:hint="default"/>
+      </w:rPr>
+    </w:lvl>
+    <w:lvl w:ilvl="4" w:tplc="04090003" w:tentative="1">
+      <w:start w:val="1"/>
+      <w:numFmt w:val="bullet"/>
+      <w:lvlText w:val="o"/>
+      <w:lvlJc w:val="left"/>
+      <w:pPr>
+        <w:ind w:left="3960" w:hanging="360"/>
+      </w:pPr>
+      <w:rPr>
+        <w:rFonts w:ascii="Courier New" w:hAnsi="Courier New" w:cs="Courier New" w:hint="default"/>
+      </w:rPr>
+    </w:lvl>
+    <w:lvl w:ilvl="5" w:tplc="04090005" w:tentative="1">
+      <w:start w:val="1"/>
+      <w:numFmt w:val="bullet"/>
+      <w:lvlText w:val=""/>
+      <w:lvlJc w:val="left"/>
+      <w:pPr>
+        <w:ind w:left="4680" w:hanging="360"/>
+      </w:pPr>
+      <w:rPr>
+        <w:rFonts w:ascii="Wingdings" w:hAnsi="Wingdings" w:hint="default"/>
+      </w:rPr>
+    </w:lvl>
+    <w:lvl w:ilvl="6" w:tplc="04090001" w:tentative="1">
+      <w:start w:val="1"/>
+      <w:numFmt w:val="bullet"/>
+      <w:lvlText w:val=""/>
+      <w:lvlJc w:val="left"/>
+      <w:pPr>
+        <w:ind w:left="5400" w:hanging="360"/>
+      </w:pPr>
+      <w:rPr>
+        <w:rFonts w:ascii="Symbol" w:hAnsi="Symbol" w:hint="default"/>
+      </w:rPr>
+    </w:lvl>
+    <w:lvl w:ilvl="7" w:tplc="04090003" w:tentative="1">
+      <w:start w:val="1"/>
+      <w:numFmt w:val="bullet"/>
+      <w:lvlText w:val="o"/>
+      <w:lvlJc w:val="left"/>
+      <w:pPr>
+        <w:ind w:left="6120" w:hanging="360"/>
+      </w:pPr>
+      <w:rPr>
+        <w:rFonts w:ascii="Courier New" w:hAnsi="Courier New" w:cs="Courier New" w:hint="default"/>
+      </w:rPr>
+    </w:lvl>
+    <w:lvl w:ilvl="8" w:tplc="04090005" w:tentative="1">
+      <w:start w:val="1"/>
+      <w:numFmt w:val="bullet"/>
+      <w:lvlText w:val=""/>
+      <w:lvlJc w:val="left"/>
+      <w:pPr>
+        <w:ind w:left="6840" w:hanging="360"/>
+      </w:pPr>
+      <w:rPr>
+        <w:rFonts w:ascii="Wingdings" w:hAnsi="Wingdings" w:hint="default"/>
+      </w:rPr>
+    </w:lvl>
+  </w:abstractNum>
+  <w:abstractNum w:abstractNumId="140" w15:restartNumberingAfterBreak="0">
     <w:nsid w:val="777E68D9"/>
     <w:multiLevelType w:val="multilevel"/>
     <w:tmpl w:val="3F503B98"/>
@@ -21137,7 +22432,7 @@
       </w:rPr>
     </w:lvl>
   </w:abstractNum>
-  <w:abstractNum w:abstractNumId="136" w15:restartNumberingAfterBreak="0">
+  <w:abstractNum w:abstractNumId="141" w15:restartNumberingAfterBreak="0">
     <w:nsid w:val="77960362"/>
     <w:multiLevelType w:val="multilevel"/>
     <w:tmpl w:val="FEA0022E"/>
@@ -21286,7 +22581,7 @@
       </w:rPr>
     </w:lvl>
   </w:abstractNum>
-  <w:abstractNum w:abstractNumId="137" w15:restartNumberingAfterBreak="0">
+  <w:abstractNum w:abstractNumId="142" w15:restartNumberingAfterBreak="0">
     <w:nsid w:val="78547E35"/>
     <w:multiLevelType w:val="multilevel"/>
     <w:tmpl w:val="FC1421DE"/>
@@ -21435,7 +22730,7 @@
       </w:rPr>
     </w:lvl>
   </w:abstractNum>
-  <w:abstractNum w:abstractNumId="138" w15:restartNumberingAfterBreak="0">
+  <w:abstractNum w:abstractNumId="143" w15:restartNumberingAfterBreak="0">
     <w:nsid w:val="785A644F"/>
     <w:multiLevelType w:val="multilevel"/>
     <w:tmpl w:val="D1DC60FE"/>
@@ -21584,7 +22879,7 @@
       </w:rPr>
     </w:lvl>
   </w:abstractNum>
-  <w:abstractNum w:abstractNumId="139" w15:restartNumberingAfterBreak="0">
+  <w:abstractNum w:abstractNumId="144" w15:restartNumberingAfterBreak="0">
     <w:nsid w:val="78B62297"/>
     <w:multiLevelType w:val="multilevel"/>
     <w:tmpl w:val="2AA67CDA"/>
@@ -21733,7 +23028,7 @@
       </w:rPr>
     </w:lvl>
   </w:abstractNum>
-  <w:abstractNum w:abstractNumId="140" w15:restartNumberingAfterBreak="0">
+  <w:abstractNum w:abstractNumId="145" w15:restartNumberingAfterBreak="0">
     <w:nsid w:val="7BFA03DF"/>
     <w:multiLevelType w:val="hybridMultilevel"/>
     <w:tmpl w:val="536A979E"/>
@@ -21846,7 +23141,7 @@
       </w:rPr>
     </w:lvl>
   </w:abstractNum>
-  <w:abstractNum w:abstractNumId="141" w15:restartNumberingAfterBreak="0">
+  <w:abstractNum w:abstractNumId="146" w15:restartNumberingAfterBreak="0">
     <w:nsid w:val="7CA524B4"/>
     <w:multiLevelType w:val="hybridMultilevel"/>
     <w:tmpl w:val="957C4F4A"/>
@@ -21959,7 +23254,7 @@
       </w:rPr>
     </w:lvl>
   </w:abstractNum>
-  <w:abstractNum w:abstractNumId="142" w15:restartNumberingAfterBreak="0">
+  <w:abstractNum w:abstractNumId="147" w15:restartNumberingAfterBreak="0">
     <w:nsid w:val="7E1C597E"/>
     <w:multiLevelType w:val="multilevel"/>
     <w:tmpl w:val="2AA67CDA"/>
@@ -22108,7 +23403,7 @@
       </w:rPr>
     </w:lvl>
   </w:abstractNum>
-  <w:abstractNum w:abstractNumId="143" w15:restartNumberingAfterBreak="0">
+  <w:abstractNum w:abstractNumId="148" w15:restartNumberingAfterBreak="0">
     <w:nsid w:val="7EBD7710"/>
     <w:multiLevelType w:val="hybridMultilevel"/>
     <w:tmpl w:val="C8C6F7A0"/>
@@ -22221,7 +23516,7 @@
       </w:rPr>
     </w:lvl>
   </w:abstractNum>
-  <w:abstractNum w:abstractNumId="144" w15:restartNumberingAfterBreak="0">
+  <w:abstractNum w:abstractNumId="149" w15:restartNumberingAfterBreak="0">
     <w:nsid w:val="7F233031"/>
     <w:multiLevelType w:val="hybridMultilevel"/>
     <w:tmpl w:val="0D22564E"/>
@@ -22334,7 +23629,7 @@
       </w:rPr>
     </w:lvl>
   </w:abstractNum>
-  <w:abstractNum w:abstractNumId="145" w15:restartNumberingAfterBreak="0">
+  <w:abstractNum w:abstractNumId="150" w15:restartNumberingAfterBreak="0">
     <w:nsid w:val="7F426DF2"/>
     <w:multiLevelType w:val="multilevel"/>
     <w:tmpl w:val="430EFE5E"/>
@@ -22484,106 +23779,106 @@
     </w:lvl>
   </w:abstractNum>
   <w:num w:numId="1" w16cid:durableId="425157302">
-    <w:abstractNumId w:val="58"/>
+    <w:abstractNumId w:val="59"/>
   </w:num>
   <w:num w:numId="2" w16cid:durableId="967664612">
-    <w:abstractNumId w:val="108"/>
+    <w:abstractNumId w:val="110"/>
   </w:num>
   <w:num w:numId="3" w16cid:durableId="361631616">
-    <w:abstractNumId w:val="79"/>
+    <w:abstractNumId w:val="80"/>
   </w:num>
   <w:num w:numId="4" w16cid:durableId="1409575397">
-    <w:abstractNumId w:val="93"/>
+    <w:abstractNumId w:val="94"/>
   </w:num>
   <w:num w:numId="5" w16cid:durableId="1647204897">
-    <w:abstractNumId w:val="141"/>
+    <w:abstractNumId w:val="146"/>
   </w:num>
   <w:num w:numId="6" w16cid:durableId="682589869">
-    <w:abstractNumId w:val="29"/>
+    <w:abstractNumId w:val="30"/>
   </w:num>
   <w:num w:numId="7" w16cid:durableId="679703478">
-    <w:abstractNumId w:val="116"/>
+    <w:abstractNumId w:val="118"/>
   </w:num>
   <w:num w:numId="8" w16cid:durableId="496455128">
-    <w:abstractNumId w:val="52"/>
+    <w:abstractNumId w:val="53"/>
   </w:num>
   <w:num w:numId="9" w16cid:durableId="1184633094">
-    <w:abstractNumId w:val="70"/>
+    <w:abstractNumId w:val="71"/>
   </w:num>
   <w:num w:numId="10" w16cid:durableId="71507387">
-    <w:abstractNumId w:val="77"/>
+    <w:abstractNumId w:val="78"/>
   </w:num>
   <w:num w:numId="11" w16cid:durableId="1412503779">
-    <w:abstractNumId w:val="118"/>
+    <w:abstractNumId w:val="120"/>
   </w:num>
   <w:num w:numId="12" w16cid:durableId="1107113995">
-    <w:abstractNumId w:val="53"/>
+    <w:abstractNumId w:val="54"/>
   </w:num>
   <w:num w:numId="13" w16cid:durableId="2011055922">
-    <w:abstractNumId w:val="30"/>
+    <w:abstractNumId w:val="31"/>
   </w:num>
   <w:num w:numId="14" w16cid:durableId="1529222885">
-    <w:abstractNumId w:val="140"/>
+    <w:abstractNumId w:val="145"/>
   </w:num>
   <w:num w:numId="15" w16cid:durableId="836580755">
-    <w:abstractNumId w:val="21"/>
+    <w:abstractNumId w:val="22"/>
   </w:num>
   <w:num w:numId="16" w16cid:durableId="1344674502">
-    <w:abstractNumId w:val="97"/>
+    <w:abstractNumId w:val="98"/>
   </w:num>
   <w:num w:numId="17" w16cid:durableId="1320882603">
-    <w:abstractNumId w:val="126"/>
+    <w:abstractNumId w:val="129"/>
   </w:num>
   <w:num w:numId="18" w16cid:durableId="1139028372">
-    <w:abstractNumId w:val="54"/>
+    <w:abstractNumId w:val="55"/>
   </w:num>
   <w:num w:numId="19" w16cid:durableId="1525635473">
-    <w:abstractNumId w:val="106"/>
+    <w:abstractNumId w:val="107"/>
   </w:num>
   <w:num w:numId="20" w16cid:durableId="609623515">
-    <w:abstractNumId w:val="143"/>
+    <w:abstractNumId w:val="148"/>
   </w:num>
   <w:num w:numId="21" w16cid:durableId="165170997">
-    <w:abstractNumId w:val="121"/>
+    <w:abstractNumId w:val="123"/>
   </w:num>
   <w:num w:numId="22" w16cid:durableId="1620525290">
-    <w:abstractNumId w:val="38"/>
+    <w:abstractNumId w:val="39"/>
   </w:num>
   <w:num w:numId="23" w16cid:durableId="400753109">
-    <w:abstractNumId w:val="130"/>
+    <w:abstractNumId w:val="133"/>
   </w:num>
   <w:num w:numId="24" w16cid:durableId="193882219">
     <w:abstractNumId w:val="7"/>
   </w:num>
   <w:num w:numId="25" w16cid:durableId="311981628">
-    <w:abstractNumId w:val="60"/>
+    <w:abstractNumId w:val="61"/>
   </w:num>
   <w:num w:numId="26" w16cid:durableId="2009166045">
-    <w:abstractNumId w:val="20"/>
+    <w:abstractNumId w:val="21"/>
   </w:num>
   <w:num w:numId="27" w16cid:durableId="2135174697">
-    <w:abstractNumId w:val="28"/>
+    <w:abstractNumId w:val="29"/>
   </w:num>
   <w:num w:numId="28" w16cid:durableId="353504740">
-    <w:abstractNumId w:val="22"/>
+    <w:abstractNumId w:val="23"/>
   </w:num>
   <w:num w:numId="29" w16cid:durableId="2124693280">
-    <w:abstractNumId w:val="110"/>
+    <w:abstractNumId w:val="112"/>
   </w:num>
   <w:num w:numId="30" w16cid:durableId="1367099744">
-    <w:abstractNumId w:val="43"/>
+    <w:abstractNumId w:val="44"/>
   </w:num>
   <w:num w:numId="31" w16cid:durableId="2011105642">
-    <w:abstractNumId w:val="98"/>
+    <w:abstractNumId w:val="99"/>
   </w:num>
   <w:num w:numId="32" w16cid:durableId="831995364">
-    <w:abstractNumId w:val="34"/>
+    <w:abstractNumId w:val="35"/>
   </w:num>
   <w:num w:numId="33" w16cid:durableId="851073403">
     <w:abstractNumId w:val="5"/>
   </w:num>
   <w:num w:numId="34" w16cid:durableId="1183666391">
-    <w:abstractNumId w:val="32"/>
+    <w:abstractNumId w:val="33"/>
   </w:num>
   <w:num w:numId="35" w16cid:durableId="697268929">
     <w:abstractNumId w:val="2"/>
@@ -22592,334 +23887,349 @@
     <w:abstractNumId w:val="3"/>
   </w:num>
   <w:num w:numId="37" w16cid:durableId="1849755457">
-    <w:abstractNumId w:val="131"/>
+    <w:abstractNumId w:val="134"/>
   </w:num>
   <w:num w:numId="38" w16cid:durableId="516505904">
-    <w:abstractNumId w:val="19"/>
+    <w:abstractNumId w:val="20"/>
   </w:num>
   <w:num w:numId="39" w16cid:durableId="906300072">
-    <w:abstractNumId w:val="23"/>
+    <w:abstractNumId w:val="24"/>
   </w:num>
   <w:num w:numId="40" w16cid:durableId="905338697">
+    <w:abstractNumId w:val="82"/>
+  </w:num>
+  <w:num w:numId="41" w16cid:durableId="501896635">
+    <w:abstractNumId w:val="57"/>
+  </w:num>
+  <w:num w:numId="42" w16cid:durableId="1953435156">
+    <w:abstractNumId w:val="83"/>
+  </w:num>
+  <w:num w:numId="43" w16cid:durableId="1060447452">
+    <w:abstractNumId w:val="96"/>
+  </w:num>
+  <w:num w:numId="44" w16cid:durableId="1772503672">
+    <w:abstractNumId w:val="74"/>
+  </w:num>
+  <w:num w:numId="45" w16cid:durableId="1650330222">
     <w:abstractNumId w:val="81"/>
   </w:num>
-  <w:num w:numId="41" w16cid:durableId="501896635">
-    <w:abstractNumId w:val="56"/>
-  </w:num>
-  <w:num w:numId="42" w16cid:durableId="1953435156">
-    <w:abstractNumId w:val="82"/>
-  </w:num>
-  <w:num w:numId="43" w16cid:durableId="1060447452">
-    <w:abstractNumId w:val="95"/>
-  </w:num>
-  <w:num w:numId="44" w16cid:durableId="1772503672">
-    <w:abstractNumId w:val="73"/>
-  </w:num>
-  <w:num w:numId="45" w16cid:durableId="1650330222">
-    <w:abstractNumId w:val="80"/>
-  </w:num>
   <w:num w:numId="46" w16cid:durableId="2102337934">
-    <w:abstractNumId w:val="37"/>
+    <w:abstractNumId w:val="38"/>
   </w:num>
   <w:num w:numId="47" w16cid:durableId="68767822">
-    <w:abstractNumId w:val="119"/>
+    <w:abstractNumId w:val="121"/>
   </w:num>
   <w:num w:numId="48" w16cid:durableId="1992058265">
     <w:abstractNumId w:val="8"/>
   </w:num>
   <w:num w:numId="49" w16cid:durableId="788475134">
-    <w:abstractNumId w:val="138"/>
+    <w:abstractNumId w:val="143"/>
   </w:num>
   <w:num w:numId="50" w16cid:durableId="224419455">
+    <w:abstractNumId w:val="126"/>
+  </w:num>
+  <w:num w:numId="51" w16cid:durableId="1699575947">
+    <w:abstractNumId w:val="106"/>
+  </w:num>
+  <w:num w:numId="52" w16cid:durableId="1048916239">
+    <w:abstractNumId w:val="66"/>
+  </w:num>
+  <w:num w:numId="53" w16cid:durableId="1188711211">
+    <w:abstractNumId w:val="137"/>
+  </w:num>
+  <w:num w:numId="54" w16cid:durableId="447555614">
+    <w:abstractNumId w:val="109"/>
+  </w:num>
+  <w:num w:numId="55" w16cid:durableId="1679307268">
+    <w:abstractNumId w:val="63"/>
+  </w:num>
+  <w:num w:numId="56" w16cid:durableId="693773591">
+    <w:abstractNumId w:val="125"/>
+  </w:num>
+  <w:num w:numId="57" w16cid:durableId="1110473324">
+    <w:abstractNumId w:val="46"/>
+  </w:num>
+  <w:num w:numId="58" w16cid:durableId="842937968">
+    <w:abstractNumId w:val="79"/>
+  </w:num>
+  <w:num w:numId="59" w16cid:durableId="821121315">
+    <w:abstractNumId w:val="52"/>
+  </w:num>
+  <w:num w:numId="60" w16cid:durableId="2095394549">
+    <w:abstractNumId w:val="141"/>
+  </w:num>
+  <w:num w:numId="61" w16cid:durableId="1299921011">
+    <w:abstractNumId w:val="51"/>
+  </w:num>
+  <w:num w:numId="62" w16cid:durableId="1927420240">
+    <w:abstractNumId w:val="88"/>
+  </w:num>
+  <w:num w:numId="63" w16cid:durableId="41290043">
+    <w:abstractNumId w:val="93"/>
+  </w:num>
+  <w:num w:numId="64" w16cid:durableId="999846909">
+    <w:abstractNumId w:val="75"/>
+  </w:num>
+  <w:num w:numId="65" w16cid:durableId="1250969563">
+    <w:abstractNumId w:val="86"/>
+  </w:num>
+  <w:num w:numId="66" w16cid:durableId="484011382">
+    <w:abstractNumId w:val="119"/>
+  </w:num>
+  <w:num w:numId="67" w16cid:durableId="2008289242">
+    <w:abstractNumId w:val="17"/>
+  </w:num>
+  <w:num w:numId="68" w16cid:durableId="1041637222">
+    <w:abstractNumId w:val="25"/>
+  </w:num>
+  <w:num w:numId="69" w16cid:durableId="1296839887">
+    <w:abstractNumId w:val="92"/>
+  </w:num>
+  <w:num w:numId="70" w16cid:durableId="336662050">
+    <w:abstractNumId w:val="105"/>
+  </w:num>
+  <w:num w:numId="71" w16cid:durableId="1460032333">
     <w:abstractNumId w:val="124"/>
   </w:num>
-  <w:num w:numId="51" w16cid:durableId="1699575947">
-    <w:abstractNumId w:val="105"/>
-  </w:num>
-  <w:num w:numId="52" w16cid:durableId="1048916239">
-    <w:abstractNumId w:val="65"/>
-  </w:num>
-  <w:num w:numId="53" w16cid:durableId="1188711211">
-    <w:abstractNumId w:val="133"/>
-  </w:num>
-  <w:num w:numId="54" w16cid:durableId="447555614">
-    <w:abstractNumId w:val="107"/>
-  </w:num>
-  <w:num w:numId="55" w16cid:durableId="1679307268">
-    <w:abstractNumId w:val="62"/>
-  </w:num>
-  <w:num w:numId="56" w16cid:durableId="693773591">
-    <w:abstractNumId w:val="123"/>
-  </w:num>
-  <w:num w:numId="57" w16cid:durableId="1110473324">
-    <w:abstractNumId w:val="45"/>
-  </w:num>
-  <w:num w:numId="58" w16cid:durableId="842937968">
-    <w:abstractNumId w:val="78"/>
-  </w:num>
-  <w:num w:numId="59" w16cid:durableId="821121315">
-    <w:abstractNumId w:val="51"/>
-  </w:num>
-  <w:num w:numId="60" w16cid:durableId="2095394549">
-    <w:abstractNumId w:val="136"/>
-  </w:num>
-  <w:num w:numId="61" w16cid:durableId="1299921011">
-    <w:abstractNumId w:val="50"/>
-  </w:num>
-  <w:num w:numId="62" w16cid:durableId="1927420240">
-    <w:abstractNumId w:val="87"/>
-  </w:num>
-  <w:num w:numId="63" w16cid:durableId="41290043">
-    <w:abstractNumId w:val="92"/>
-  </w:num>
-  <w:num w:numId="64" w16cid:durableId="999846909">
-    <w:abstractNumId w:val="74"/>
-  </w:num>
-  <w:num w:numId="65" w16cid:durableId="1250969563">
-    <w:abstractNumId w:val="85"/>
-  </w:num>
-  <w:num w:numId="66" w16cid:durableId="484011382">
-    <w:abstractNumId w:val="117"/>
-  </w:num>
-  <w:num w:numId="67" w16cid:durableId="2008289242">
-    <w:abstractNumId w:val="16"/>
-  </w:num>
-  <w:num w:numId="68" w16cid:durableId="1041637222">
-    <w:abstractNumId w:val="24"/>
-  </w:num>
-  <w:num w:numId="69" w16cid:durableId="1296839887">
-    <w:abstractNumId w:val="91"/>
-  </w:num>
-  <w:num w:numId="70" w16cid:durableId="336662050">
-    <w:abstractNumId w:val="104"/>
-  </w:num>
-  <w:num w:numId="71" w16cid:durableId="1460032333">
-    <w:abstractNumId w:val="122"/>
-  </w:num>
   <w:num w:numId="72" w16cid:durableId="592400615">
-    <w:abstractNumId w:val="13"/>
+    <w:abstractNumId w:val="14"/>
   </w:num>
   <w:num w:numId="73" w16cid:durableId="1879049234">
-    <w:abstractNumId w:val="42"/>
+    <w:abstractNumId w:val="43"/>
   </w:num>
   <w:num w:numId="74" w16cid:durableId="1747679558">
-    <w:abstractNumId w:val="46"/>
+    <w:abstractNumId w:val="47"/>
   </w:num>
   <w:num w:numId="75" w16cid:durableId="55278029">
-    <w:abstractNumId w:val="39"/>
+    <w:abstractNumId w:val="40"/>
   </w:num>
   <w:num w:numId="76" w16cid:durableId="1032193382">
-    <w:abstractNumId w:val="40"/>
+    <w:abstractNumId w:val="41"/>
   </w:num>
   <w:num w:numId="77" w16cid:durableId="763109604">
-    <w:abstractNumId w:val="94"/>
+    <w:abstractNumId w:val="95"/>
   </w:num>
   <w:num w:numId="78" w16cid:durableId="2138137265">
-    <w:abstractNumId w:val="109"/>
+    <w:abstractNumId w:val="111"/>
   </w:num>
   <w:num w:numId="79" w16cid:durableId="343675924">
-    <w:abstractNumId w:val="127"/>
+    <w:abstractNumId w:val="130"/>
   </w:num>
   <w:num w:numId="80" w16cid:durableId="1823277442">
-    <w:abstractNumId w:val="49"/>
+    <w:abstractNumId w:val="50"/>
   </w:num>
   <w:num w:numId="81" w16cid:durableId="1686900155">
     <w:abstractNumId w:val="0"/>
   </w:num>
   <w:num w:numId="82" w16cid:durableId="1113326280">
+    <w:abstractNumId w:val="91"/>
+  </w:num>
+  <w:num w:numId="83" w16cid:durableId="1253051103">
+    <w:abstractNumId w:val="122"/>
+  </w:num>
+  <w:num w:numId="84" w16cid:durableId="444888444">
+    <w:abstractNumId w:val="58"/>
+  </w:num>
+  <w:num w:numId="85" w16cid:durableId="64299649">
+    <w:abstractNumId w:val="113"/>
+  </w:num>
+  <w:num w:numId="86" w16cid:durableId="868182992">
+    <w:abstractNumId w:val="73"/>
+  </w:num>
+  <w:num w:numId="87" w16cid:durableId="896863331">
+    <w:abstractNumId w:val="32"/>
+  </w:num>
+  <w:num w:numId="88" w16cid:durableId="505442826">
+    <w:abstractNumId w:val="117"/>
+  </w:num>
+  <w:num w:numId="89" w16cid:durableId="1858763908">
+    <w:abstractNumId w:val="45"/>
+  </w:num>
+  <w:num w:numId="90" w16cid:durableId="1896088176">
+    <w:abstractNumId w:val="19"/>
+  </w:num>
+  <w:num w:numId="91" w16cid:durableId="1284576603">
+    <w:abstractNumId w:val="100"/>
+  </w:num>
+  <w:num w:numId="92" w16cid:durableId="1963075542">
+    <w:abstractNumId w:val="13"/>
+  </w:num>
+  <w:num w:numId="93" w16cid:durableId="787627596">
     <w:abstractNumId w:val="90"/>
   </w:num>
-  <w:num w:numId="83" w16cid:durableId="1253051103">
-    <w:abstractNumId w:val="120"/>
+  <w:num w:numId="94" w16cid:durableId="2003925799">
+    <w:abstractNumId w:val="16"/>
   </w:num>
-  <w:num w:numId="84" w16cid:durableId="444888444">
-    <w:abstractNumId w:val="57"/>
+  <w:num w:numId="95" w16cid:durableId="1169102579">
+    <w:abstractNumId w:val="103"/>
   </w:num>
-  <w:num w:numId="85" w16cid:durableId="64299649">
-    <w:abstractNumId w:val="111"/>
+  <w:num w:numId="96" w16cid:durableId="1216501564">
+    <w:abstractNumId w:val="42"/>
   </w:num>
-  <w:num w:numId="86" w16cid:durableId="868182992">
+  <w:num w:numId="97" w16cid:durableId="261768216">
+    <w:abstractNumId w:val="127"/>
+  </w:num>
+  <w:num w:numId="98" w16cid:durableId="2141918721">
+    <w:abstractNumId w:val="85"/>
+  </w:num>
+  <w:num w:numId="99" w16cid:durableId="905841544">
+    <w:abstractNumId w:val="48"/>
+  </w:num>
+  <w:num w:numId="100" w16cid:durableId="1753887223">
+    <w:abstractNumId w:val="101"/>
+  </w:num>
+  <w:num w:numId="101" w16cid:durableId="1320184766">
+    <w:abstractNumId w:val="37"/>
+  </w:num>
+  <w:num w:numId="102" w16cid:durableId="465127606">
+    <w:abstractNumId w:val="67"/>
+  </w:num>
+  <w:num w:numId="103" w16cid:durableId="1640451435">
+    <w:abstractNumId w:val="65"/>
+  </w:num>
+  <w:num w:numId="104" w16cid:durableId="942029608">
+    <w:abstractNumId w:val="60"/>
+  </w:num>
+  <w:num w:numId="105" w16cid:durableId="70857193">
+    <w:abstractNumId w:val="69"/>
+  </w:num>
+  <w:num w:numId="106" w16cid:durableId="1617908629">
+    <w:abstractNumId w:val="132"/>
+  </w:num>
+  <w:num w:numId="107" w16cid:durableId="970137111">
+    <w:abstractNumId w:val="147"/>
+  </w:num>
+  <w:num w:numId="108" w16cid:durableId="383797013">
+    <w:abstractNumId w:val="56"/>
+  </w:num>
+  <w:num w:numId="109" w16cid:durableId="1459567304">
+    <w:abstractNumId w:val="68"/>
+  </w:num>
+  <w:num w:numId="110" w16cid:durableId="862745862">
+    <w:abstractNumId w:val="26"/>
+  </w:num>
+  <w:num w:numId="111" w16cid:durableId="1859536331">
     <w:abstractNumId w:val="72"/>
   </w:num>
-  <w:num w:numId="87" w16cid:durableId="896863331">
-    <w:abstractNumId w:val="31"/>
+  <w:num w:numId="112" w16cid:durableId="2092697678">
+    <w:abstractNumId w:val="87"/>
   </w:num>
-  <w:num w:numId="88" w16cid:durableId="505442826">
+  <w:num w:numId="113" w16cid:durableId="1418403813">
+    <w:abstractNumId w:val="76"/>
+  </w:num>
+  <w:num w:numId="114" w16cid:durableId="1965042317">
+    <w:abstractNumId w:val="131"/>
+  </w:num>
+  <w:num w:numId="115" w16cid:durableId="670569040">
+    <w:abstractNumId w:val="64"/>
+  </w:num>
+  <w:num w:numId="116" w16cid:durableId="413823113">
+    <w:abstractNumId w:val="144"/>
+  </w:num>
+  <w:num w:numId="117" w16cid:durableId="1293747982">
     <w:abstractNumId w:val="115"/>
   </w:num>
-  <w:num w:numId="89" w16cid:durableId="1858763908">
-    <w:abstractNumId w:val="44"/>
+  <w:num w:numId="118" w16cid:durableId="2058698591">
+    <w:abstractNumId w:val="70"/>
   </w:num>
-  <w:num w:numId="90" w16cid:durableId="1896088176">
-    <w:abstractNumId w:val="18"/>
-  </w:num>
-  <w:num w:numId="91" w16cid:durableId="1284576603">
-    <w:abstractNumId w:val="99"/>
-  </w:num>
-  <w:num w:numId="92" w16cid:durableId="1963075542">
-    <w:abstractNumId w:val="12"/>
-  </w:num>
-  <w:num w:numId="93" w16cid:durableId="787627596">
+  <w:num w:numId="119" w16cid:durableId="892157361">
     <w:abstractNumId w:val="89"/>
   </w:num>
-  <w:num w:numId="94" w16cid:durableId="2003925799">
+  <w:num w:numId="120" w16cid:durableId="1449229938">
+    <w:abstractNumId w:val="135"/>
+  </w:num>
+  <w:num w:numId="121" w16cid:durableId="177283374">
+    <w:abstractNumId w:val="11"/>
+  </w:num>
+  <w:num w:numId="122" w16cid:durableId="576598579">
     <w:abstractNumId w:val="15"/>
   </w:num>
-  <w:num w:numId="95" w16cid:durableId="1169102579">
-    <w:abstractNumId w:val="102"/>
-  </w:num>
-  <w:num w:numId="96" w16cid:durableId="1216501564">
-    <w:abstractNumId w:val="41"/>
-  </w:num>
-  <w:num w:numId="97" w16cid:durableId="261768216">
-    <w:abstractNumId w:val="125"/>
-  </w:num>
-  <w:num w:numId="98" w16cid:durableId="2141918721">
-    <w:abstractNumId w:val="84"/>
-  </w:num>
-  <w:num w:numId="99" w16cid:durableId="905841544">
-    <w:abstractNumId w:val="47"/>
-  </w:num>
-  <w:num w:numId="100" w16cid:durableId="1753887223">
-    <w:abstractNumId w:val="100"/>
-  </w:num>
-  <w:num w:numId="101" w16cid:durableId="1320184766">
-    <w:abstractNumId w:val="36"/>
-  </w:num>
-  <w:num w:numId="102" w16cid:durableId="465127606">
-    <w:abstractNumId w:val="66"/>
-  </w:num>
-  <w:num w:numId="103" w16cid:durableId="1640451435">
-    <w:abstractNumId w:val="64"/>
-  </w:num>
-  <w:num w:numId="104" w16cid:durableId="942029608">
-    <w:abstractNumId w:val="59"/>
-  </w:num>
-  <w:num w:numId="105" w16cid:durableId="70857193">
-    <w:abstractNumId w:val="68"/>
-  </w:num>
-  <w:num w:numId="106" w16cid:durableId="1617908629">
-    <w:abstractNumId w:val="129"/>
-  </w:num>
-  <w:num w:numId="107" w16cid:durableId="970137111">
-    <w:abstractNumId w:val="142"/>
-  </w:num>
-  <w:num w:numId="108" w16cid:durableId="383797013">
-    <w:abstractNumId w:val="55"/>
-  </w:num>
-  <w:num w:numId="109" w16cid:durableId="1459567304">
-    <w:abstractNumId w:val="67"/>
-  </w:num>
-  <w:num w:numId="110" w16cid:durableId="862745862">
-    <w:abstractNumId w:val="25"/>
-  </w:num>
-  <w:num w:numId="111" w16cid:durableId="1859536331">
-    <w:abstractNumId w:val="71"/>
-  </w:num>
-  <w:num w:numId="112" w16cid:durableId="2092697678">
-    <w:abstractNumId w:val="86"/>
-  </w:num>
-  <w:num w:numId="113" w16cid:durableId="1418403813">
-    <w:abstractNumId w:val="75"/>
-  </w:num>
-  <w:num w:numId="114" w16cid:durableId="1965042317">
-    <w:abstractNumId w:val="128"/>
-  </w:num>
-  <w:num w:numId="115" w16cid:durableId="670569040">
-    <w:abstractNumId w:val="63"/>
-  </w:num>
-  <w:num w:numId="116" w16cid:durableId="413823113">
-    <w:abstractNumId w:val="139"/>
-  </w:num>
-  <w:num w:numId="117" w16cid:durableId="1293747982">
-    <w:abstractNumId w:val="113"/>
-  </w:num>
-  <w:num w:numId="118" w16cid:durableId="2058698591">
-    <w:abstractNumId w:val="69"/>
-  </w:num>
-  <w:num w:numId="119" w16cid:durableId="892157361">
-    <w:abstractNumId w:val="88"/>
-  </w:num>
-  <w:num w:numId="120" w16cid:durableId="1449229938">
-    <w:abstractNumId w:val="132"/>
-  </w:num>
-  <w:num w:numId="121" w16cid:durableId="177283374">
-    <w:abstractNumId w:val="10"/>
-  </w:num>
-  <w:num w:numId="122" w16cid:durableId="576598579">
-    <w:abstractNumId w:val="14"/>
-  </w:num>
   <w:num w:numId="123" w16cid:durableId="1495337109">
-    <w:abstractNumId w:val="134"/>
+    <w:abstractNumId w:val="138"/>
   </w:num>
   <w:num w:numId="124" w16cid:durableId="302319311">
-    <w:abstractNumId w:val="96"/>
+    <w:abstractNumId w:val="97"/>
   </w:num>
   <w:num w:numId="125" w16cid:durableId="1891844186">
-    <w:abstractNumId w:val="112"/>
+    <w:abstractNumId w:val="114"/>
   </w:num>
   <w:num w:numId="126" w16cid:durableId="256911009">
     <w:abstractNumId w:val="1"/>
   </w:num>
   <w:num w:numId="127" w16cid:durableId="1001927776">
-    <w:abstractNumId w:val="144"/>
+    <w:abstractNumId w:val="149"/>
   </w:num>
   <w:num w:numId="128" w16cid:durableId="1365057616">
-    <w:abstractNumId w:val="101"/>
+    <w:abstractNumId w:val="102"/>
   </w:num>
   <w:num w:numId="129" w16cid:durableId="2142647602">
-    <w:abstractNumId w:val="103"/>
+    <w:abstractNumId w:val="104"/>
   </w:num>
   <w:num w:numId="130" w16cid:durableId="1895652277">
-    <w:abstractNumId w:val="145"/>
+    <w:abstractNumId w:val="150"/>
   </w:num>
   <w:num w:numId="131" w16cid:durableId="1132407586">
-    <w:abstractNumId w:val="137"/>
+    <w:abstractNumId w:val="142"/>
   </w:num>
   <w:num w:numId="132" w16cid:durableId="1209996408">
-    <w:abstractNumId w:val="11"/>
+    <w:abstractNumId w:val="12"/>
   </w:num>
   <w:num w:numId="133" w16cid:durableId="1840802852">
     <w:abstractNumId w:val="4"/>
   </w:num>
   <w:num w:numId="134" w16cid:durableId="220867256">
-    <w:abstractNumId w:val="114"/>
+    <w:abstractNumId w:val="116"/>
   </w:num>
   <w:num w:numId="135" w16cid:durableId="2026857351">
-    <w:abstractNumId w:val="35"/>
+    <w:abstractNumId w:val="36"/>
   </w:num>
   <w:num w:numId="136" w16cid:durableId="1236696510">
-    <w:abstractNumId w:val="135"/>
+    <w:abstractNumId w:val="140"/>
   </w:num>
   <w:num w:numId="137" w16cid:durableId="1156385716">
-    <w:abstractNumId w:val="48"/>
+    <w:abstractNumId w:val="49"/>
   </w:num>
   <w:num w:numId="138" w16cid:durableId="1088235058">
-    <w:abstractNumId w:val="26"/>
+    <w:abstractNumId w:val="27"/>
   </w:num>
   <w:num w:numId="139" w16cid:durableId="106968457">
-    <w:abstractNumId w:val="17"/>
+    <w:abstractNumId w:val="18"/>
   </w:num>
   <w:num w:numId="140" w16cid:durableId="1705979747">
-    <w:abstractNumId w:val="9"/>
+    <w:abstractNumId w:val="10"/>
   </w:num>
   <w:num w:numId="141" w16cid:durableId="1122117806">
-    <w:abstractNumId w:val="33"/>
+    <w:abstractNumId w:val="34"/>
   </w:num>
   <w:num w:numId="142" w16cid:durableId="2126385657">
-    <w:abstractNumId w:val="61"/>
+    <w:abstractNumId w:val="62"/>
   </w:num>
   <w:num w:numId="143" w16cid:durableId="1058674300">
-    <w:abstractNumId w:val="76"/>
+    <w:abstractNumId w:val="77"/>
   </w:num>
   <w:num w:numId="144" w16cid:durableId="756362112">
     <w:abstractNumId w:val="6"/>
   </w:num>
   <w:num w:numId="145" w16cid:durableId="1612125897">
-    <w:abstractNumId w:val="83"/>
+    <w:abstractNumId w:val="84"/>
   </w:num>
   <w:num w:numId="146" w16cid:durableId="797142166">
-    <w:abstractNumId w:val="27"/>
+    <w:abstractNumId w:val="28"/>
+  </w:num>
+  <w:num w:numId="147" w16cid:durableId="542138466">
+    <w:abstractNumId w:val="9"/>
+  </w:num>
+  <w:num w:numId="148" w16cid:durableId="1917398031">
+    <w:abstractNumId w:val="108"/>
+  </w:num>
+  <w:num w:numId="149" w16cid:durableId="524444307">
+    <w:abstractNumId w:val="128"/>
+  </w:num>
+  <w:num w:numId="150" w16cid:durableId="859783391">
+    <w:abstractNumId w:val="136"/>
+  </w:num>
+  <w:num w:numId="151" w16cid:durableId="2097357959">
+    <w:abstractNumId w:val="139"/>
   </w:num>
   <w:numIdMacAtCleanup w:val="45"/>
 </w:numbering>

</xml_diff>

<commit_message>
Agency Verification Workflow (#268)
</commit_message>
<xml_diff>
--- a/Activity Specification Document.docx
+++ b/Activity Specification Document.docx
@@ -3593,6 +3593,703 @@
         <w:t>Branch &amp; Employee Management Workflow Activity Diagram</w:t>
       </w:r>
     </w:p>
+    <w:p>
+      <w:pPr>
+        <w:tabs>
+          <w:tab w:val="left" w:pos="3165"/>
+        </w:tabs>
+      </w:pPr>
+      <w:r>
+        <w:tab/>
+      </w:r>
+    </w:p>
+    <w:p>
+      <w:pPr>
+        <w:spacing w:line="278" w:lineRule="auto"/>
+      </w:pPr>
+      <w:r>
+        <w:br w:type="page"/>
+      </w:r>
+    </w:p>
+    <w:p>
+      <w:pPr>
+        <w:pStyle w:val="Heading3"/>
+      </w:pPr>
+      <w:r>
+        <w:lastRenderedPageBreak/>
+        <w:t xml:space="preserve">7- </w:t>
+      </w:r>
+      <w:r>
+        <w:t xml:space="preserve">Agency Verification Workflow Activity </w:t>
+      </w:r>
+    </w:p>
+    <w:p>
+      <w:pPr>
+        <w:tabs>
+          <w:tab w:val="left" w:pos="3165"/>
+        </w:tabs>
+        <w:rPr>
+          <w:b/>
+          <w:bCs/>
+        </w:rPr>
+      </w:pPr>
+      <w:r>
+        <w:rPr>
+          <w:b/>
+          <w:bCs/>
+        </w:rPr>
+        <w:t>Purpose</w:t>
+      </w:r>
+    </w:p>
+    <w:p>
+      <w:pPr>
+        <w:tabs>
+          <w:tab w:val="left" w:pos="3165"/>
+        </w:tabs>
+      </w:pPr>
+      <w:r>
+        <w:t>This diagram shows the workflow that helps to verify the rental agency prior to its authorization to use the KriGo service. This procedure guarantees the legitimacy and proper documentation of the agencies and thus makes the platform reliable, credible, and secure.</w:t>
+      </w:r>
+    </w:p>
+    <w:p>
+      <w:pPr>
+        <w:tabs>
+          <w:tab w:val="left" w:pos="3165"/>
+        </w:tabs>
+        <w:rPr>
+          <w:b/>
+          <w:bCs/>
+        </w:rPr>
+      </w:pPr>
+      <w:r>
+        <w:rPr>
+          <w:b/>
+          <w:bCs/>
+        </w:rPr>
+        <w:t>Workflow Description</w:t>
+      </w:r>
+    </w:p>
+    <w:p>
+      <w:pPr>
+        <w:tabs>
+          <w:tab w:val="left" w:pos="3165"/>
+        </w:tabs>
+      </w:pPr>
+      <w:r>
+        <w:t>At first, the agency fills out its registration form and uploads all necessary verification documents, such as business licenses, registration certificates, and additional documents. The agency then submits the verification request for review.</w:t>
+      </w:r>
+    </w:p>
+    <w:p>
+      <w:pPr>
+        <w:tabs>
+          <w:tab w:val="left" w:pos="3165"/>
+        </w:tabs>
+      </w:pPr>
+      <w:r>
+        <w:t>The system administrator reviews the submitted application and checks the correctness of the documents attached to it. In case there are some lacking or incorrect documents in the application, the application will be denied and the agency will be informed about it.</w:t>
+      </w:r>
+    </w:p>
+    <w:p>
+      <w:pPr>
+        <w:tabs>
+          <w:tab w:val="left" w:pos="3165"/>
+        </w:tabs>
+      </w:pPr>
+      <w:r>
+        <w:t>If the documents are correct, the administrator will start to check the information provided by the agency. Then, based on the verification results, the administrator will either approve or deny the application. The approved agency will be able to use the platform as its account will be active, while the denied agency will be notified about this.</w:t>
+      </w:r>
+    </w:p>
+    <w:p>
+      <w:pPr>
+        <w:tabs>
+          <w:tab w:val="left" w:pos="3165"/>
+        </w:tabs>
+        <w:rPr>
+          <w:b/>
+          <w:bCs/>
+        </w:rPr>
+      </w:pPr>
+      <w:r>
+        <w:rPr>
+          <w:b/>
+          <w:bCs/>
+        </w:rPr>
+        <w:t>Main Activities</w:t>
+      </w:r>
+    </w:p>
+    <w:p>
+      <w:pPr>
+        <w:tabs>
+          <w:tab w:val="left" w:pos="3165"/>
+        </w:tabs>
+      </w:pPr>
+      <w:r>
+        <w:t>The Agency Verification Workflow Activity Diagram includes the following primary activities:</w:t>
+      </w:r>
+    </w:p>
+    <w:p>
+      <w:pPr>
+        <w:pStyle w:val="ListParagraph"/>
+        <w:numPr>
+          <w:ilvl w:val="0"/>
+          <w:numId w:val="155"/>
+        </w:numPr>
+        <w:tabs>
+          <w:tab w:val="left" w:pos="3165"/>
+        </w:tabs>
+      </w:pPr>
+      <w:r>
+        <w:t>Submit agency registration.</w:t>
+      </w:r>
+    </w:p>
+    <w:p>
+      <w:pPr>
+        <w:pStyle w:val="ListParagraph"/>
+        <w:numPr>
+          <w:ilvl w:val="0"/>
+          <w:numId w:val="155"/>
+        </w:numPr>
+        <w:tabs>
+          <w:tab w:val="left" w:pos="3165"/>
+        </w:tabs>
+      </w:pPr>
+      <w:r>
+        <w:t>Upload required verification documents.</w:t>
+      </w:r>
+    </w:p>
+    <w:p>
+      <w:pPr>
+        <w:pStyle w:val="ListParagraph"/>
+        <w:numPr>
+          <w:ilvl w:val="0"/>
+          <w:numId w:val="155"/>
+        </w:numPr>
+        <w:tabs>
+          <w:tab w:val="left" w:pos="3165"/>
+        </w:tabs>
+      </w:pPr>
+      <w:r>
+        <w:t>Submit the verification request.</w:t>
+      </w:r>
+    </w:p>
+    <w:p>
+      <w:pPr>
+        <w:pStyle w:val="ListParagraph"/>
+        <w:numPr>
+          <w:ilvl w:val="0"/>
+          <w:numId w:val="155"/>
+        </w:numPr>
+        <w:tabs>
+          <w:tab w:val="left" w:pos="3165"/>
+        </w:tabs>
+      </w:pPr>
+      <w:r>
+        <w:t>Review the application.</w:t>
+      </w:r>
+    </w:p>
+    <w:p>
+      <w:pPr>
+        <w:pStyle w:val="ListParagraph"/>
+        <w:numPr>
+          <w:ilvl w:val="0"/>
+          <w:numId w:val="155"/>
+        </w:numPr>
+        <w:tabs>
+          <w:tab w:val="left" w:pos="3165"/>
+        </w:tabs>
+      </w:pPr>
+      <w:r>
+        <w:t>Validate submitted documents.</w:t>
+      </w:r>
+    </w:p>
+    <w:p>
+      <w:pPr>
+        <w:pStyle w:val="ListParagraph"/>
+        <w:numPr>
+          <w:ilvl w:val="0"/>
+          <w:numId w:val="155"/>
+        </w:numPr>
+        <w:tabs>
+          <w:tab w:val="left" w:pos="3165"/>
+        </w:tabs>
+      </w:pPr>
+      <w:r>
+        <w:t>Verify agency information.</w:t>
+      </w:r>
+    </w:p>
+    <w:p>
+      <w:pPr>
+        <w:pStyle w:val="ListParagraph"/>
+        <w:numPr>
+          <w:ilvl w:val="0"/>
+          <w:numId w:val="155"/>
+        </w:numPr>
+        <w:tabs>
+          <w:tab w:val="left" w:pos="3165"/>
+        </w:tabs>
+      </w:pPr>
+      <w:r>
+        <w:t>Activate the agency account.</w:t>
+      </w:r>
+    </w:p>
+    <w:p>
+      <w:pPr>
+        <w:pStyle w:val="ListParagraph"/>
+        <w:numPr>
+          <w:ilvl w:val="0"/>
+          <w:numId w:val="155"/>
+        </w:numPr>
+        <w:tabs>
+          <w:tab w:val="left" w:pos="3165"/>
+        </w:tabs>
+      </w:pPr>
+      <w:r>
+        <w:t>Notify the agency of the verification result.</w:t>
+      </w:r>
+    </w:p>
+    <w:p>
+      <w:pPr>
+        <w:tabs>
+          <w:tab w:val="left" w:pos="3165"/>
+        </w:tabs>
+        <w:rPr>
+          <w:b/>
+          <w:bCs/>
+        </w:rPr>
+      </w:pPr>
+      <w:r>
+        <w:rPr>
+          <w:b/>
+          <w:bCs/>
+        </w:rPr>
+        <w:t>Decision Points</w:t>
+      </w:r>
+    </w:p>
+    <w:p>
+      <w:pPr>
+        <w:tabs>
+          <w:tab w:val="left" w:pos="3165"/>
+        </w:tabs>
+      </w:pPr>
+      <w:r>
+        <w:t>The activity diagram contains two primary decision nodes:</w:t>
+      </w:r>
+    </w:p>
+    <w:p>
+      <w:pPr>
+        <w:numPr>
+          <w:ilvl w:val="0"/>
+          <w:numId w:val="153"/>
+        </w:numPr>
+        <w:tabs>
+          <w:tab w:val="left" w:pos="3165"/>
+        </w:tabs>
+      </w:pPr>
+      <w:r>
+        <w:rPr>
+          <w:b/>
+          <w:bCs/>
+        </w:rPr>
+        <w:t>Documents Valid?</w:t>
+      </w:r>
+    </w:p>
+    <w:p>
+      <w:pPr>
+        <w:numPr>
+          <w:ilvl w:val="1"/>
+          <w:numId w:val="153"/>
+        </w:numPr>
+        <w:tabs>
+          <w:tab w:val="left" w:pos="3165"/>
+        </w:tabs>
+        <w:spacing w:after="0"/>
+      </w:pPr>
+      <w:r>
+        <w:t xml:space="preserve">If </w:t>
+      </w:r>
+      <w:r>
+        <w:rPr>
+          <w:b/>
+          <w:bCs/>
+        </w:rPr>
+        <w:t>yes</w:t>
+      </w:r>
+      <w:r>
+        <w:t>, the administrator proceeds with agency verification.</w:t>
+      </w:r>
+    </w:p>
+    <w:p>
+      <w:pPr>
+        <w:numPr>
+          <w:ilvl w:val="1"/>
+          <w:numId w:val="153"/>
+        </w:numPr>
+        <w:tabs>
+          <w:tab w:val="left" w:pos="3165"/>
+        </w:tabs>
+      </w:pPr>
+      <w:r>
+        <w:t xml:space="preserve">If </w:t>
+      </w:r>
+      <w:r>
+        <w:rPr>
+          <w:b/>
+          <w:bCs/>
+        </w:rPr>
+        <w:t>no</w:t>
+      </w:r>
+      <w:r>
+        <w:t>, the application is rejected and the agency is notified of missing or invalid documents.</w:t>
+      </w:r>
+    </w:p>
+    <w:p>
+      <w:pPr>
+        <w:numPr>
+          <w:ilvl w:val="0"/>
+          <w:numId w:val="153"/>
+        </w:numPr>
+        <w:tabs>
+          <w:tab w:val="left" w:pos="3165"/>
+        </w:tabs>
+      </w:pPr>
+      <w:r>
+        <w:rPr>
+          <w:b/>
+          <w:bCs/>
+        </w:rPr>
+        <w:t>Verification Approved?</w:t>
+      </w:r>
+    </w:p>
+    <w:p>
+      <w:pPr>
+        <w:numPr>
+          <w:ilvl w:val="1"/>
+          <w:numId w:val="153"/>
+        </w:numPr>
+        <w:tabs>
+          <w:tab w:val="left" w:pos="3165"/>
+        </w:tabs>
+        <w:spacing w:after="0"/>
+      </w:pPr>
+      <w:r>
+        <w:t xml:space="preserve">If </w:t>
+      </w:r>
+      <w:r>
+        <w:rPr>
+          <w:b/>
+          <w:bCs/>
+        </w:rPr>
+        <w:t>yes</w:t>
+      </w:r>
+      <w:r>
+        <w:t>, the agency account is activated and an approval notification is sent.</w:t>
+      </w:r>
+    </w:p>
+    <w:p>
+      <w:pPr>
+        <w:numPr>
+          <w:ilvl w:val="1"/>
+          <w:numId w:val="153"/>
+        </w:numPr>
+        <w:tabs>
+          <w:tab w:val="left" w:pos="3165"/>
+        </w:tabs>
+      </w:pPr>
+      <w:r>
+        <w:t xml:space="preserve">If </w:t>
+      </w:r>
+      <w:r>
+        <w:rPr>
+          <w:b/>
+          <w:bCs/>
+        </w:rPr>
+        <w:t>no</w:t>
+      </w:r>
+      <w:r>
+        <w:t>, the application is rejected and the agency receives a rejection notification.</w:t>
+      </w:r>
+    </w:p>
+    <w:p>
+      <w:pPr>
+        <w:tabs>
+          <w:tab w:val="left" w:pos="3165"/>
+        </w:tabs>
+      </w:pPr>
+      <w:r>
+        <w:t>These decision points ensure that only agencies meeting the platform's verification requirements are authorized to provide vehicle rental services.</w:t>
+      </w:r>
+    </w:p>
+    <w:p>
+      <w:pPr>
+        <w:spacing w:line="278" w:lineRule="auto"/>
+        <w:rPr>
+          <w:b/>
+          <w:bCs/>
+        </w:rPr>
+      </w:pPr>
+      <w:r>
+        <w:rPr>
+          <w:b/>
+          <w:bCs/>
+        </w:rPr>
+        <w:br w:type="page"/>
+      </w:r>
+    </w:p>
+    <w:p>
+      <w:pPr>
+        <w:tabs>
+          <w:tab w:val="left" w:pos="3165"/>
+        </w:tabs>
+        <w:rPr>
+          <w:b/>
+          <w:bCs/>
+        </w:rPr>
+      </w:pPr>
+      <w:r>
+        <w:rPr>
+          <w:b/>
+          <w:bCs/>
+        </w:rPr>
+        <w:lastRenderedPageBreak/>
+        <w:t>Alternative Flows</w:t>
+      </w:r>
+    </w:p>
+    <w:p>
+      <w:pPr>
+        <w:tabs>
+          <w:tab w:val="left" w:pos="3165"/>
+        </w:tabs>
+      </w:pPr>
+      <w:r>
+        <w:t>The Agency Verification Workflow Activity Diagram incorporates several alternative scenarios:</w:t>
+      </w:r>
+    </w:p>
+    <w:p>
+      <w:pPr>
+        <w:pStyle w:val="ListParagraph"/>
+        <w:numPr>
+          <w:ilvl w:val="0"/>
+          <w:numId w:val="156"/>
+        </w:numPr>
+        <w:tabs>
+          <w:tab w:val="left" w:pos="3165"/>
+        </w:tabs>
+      </w:pPr>
+      <w:r>
+        <w:t>Submission of incomplete or invalid verification documents.</w:t>
+      </w:r>
+    </w:p>
+    <w:p>
+      <w:pPr>
+        <w:pStyle w:val="ListParagraph"/>
+        <w:numPr>
+          <w:ilvl w:val="0"/>
+          <w:numId w:val="156"/>
+        </w:numPr>
+        <w:tabs>
+          <w:tab w:val="left" w:pos="3165"/>
+        </w:tabs>
+      </w:pPr>
+      <w:r>
+        <w:t>Rejection of the agency application following administrative review.</w:t>
+      </w:r>
+    </w:p>
+    <w:p>
+      <w:pPr>
+        <w:pStyle w:val="ListParagraph"/>
+        <w:numPr>
+          <w:ilvl w:val="0"/>
+          <w:numId w:val="156"/>
+        </w:numPr>
+        <w:tabs>
+          <w:tab w:val="left" w:pos="3165"/>
+        </w:tabs>
+      </w:pPr>
+      <w:r>
+        <w:t>Successful verification and activation of the agency account.</w:t>
+      </w:r>
+    </w:p>
+    <w:p>
+      <w:pPr>
+        <w:tabs>
+          <w:tab w:val="left" w:pos="3165"/>
+        </w:tabs>
+      </w:pPr>
+      <w:r>
+        <w:t>These alternative paths provide a controlled verification process while maintaining the integrity and trustworthiness of the KriGo platform.</w:t>
+      </w:r>
+    </w:p>
+    <w:p>
+      <w:pPr>
+        <w:tabs>
+          <w:tab w:val="left" w:pos="3165"/>
+        </w:tabs>
+        <w:rPr>
+          <w:b/>
+          <w:bCs/>
+        </w:rPr>
+      </w:pPr>
+      <w:r>
+        <w:rPr>
+          <w:b/>
+          <w:bCs/>
+        </w:rPr>
+        <w:t>Conclusion</w:t>
+      </w:r>
+    </w:p>
+    <w:p>
+      <w:pPr>
+        <w:tabs>
+          <w:tab w:val="left" w:pos="3165"/>
+        </w:tabs>
+      </w:pPr>
+      <w:r>
+        <w:t>Agency Verification Workflow Activity Diagram provides an extensive graphical description of the process of agency verification on KriGo platform. This diagram includes the steps that are taken in order to verify whether the agency can be approved or rejected from using KriGo services. Such activity diagram is used as an important behavior model to guarantee that only verified agencies will work on the platform</w:t>
+      </w:r>
+      <w:r>
+        <w:t>.</w:t>
+      </w:r>
+    </w:p>
+    <w:p>
+      <w:pPr>
+        <w:keepNext/>
+        <w:tabs>
+          <w:tab w:val="left" w:pos="3165"/>
+        </w:tabs>
+      </w:pPr>
+      <w:r>
+        <w:rPr>
+          <w:noProof/>
+        </w:rPr>
+        <w:drawing>
+          <wp:inline distT="0" distB="0" distL="0" distR="0" wp14:anchorId="5AB35B77" wp14:editId="52AFDFDD">
+            <wp:extent cx="5941695" cy="4347210"/>
+            <wp:effectExtent l="0" t="0" r="1905" b="0"/>
+            <wp:docPr id="2083043760" name="Picture 14"/>
+            <wp:cNvGraphicFramePr>
+              <a:graphicFrameLocks xmlns:a="http://schemas.openxmlformats.org/drawingml/2006/main" noChangeAspect="1"/>
+            </wp:cNvGraphicFramePr>
+            <a:graphic xmlns:a="http://schemas.openxmlformats.org/drawingml/2006/main">
+              <a:graphicData uri="http://schemas.openxmlformats.org/drawingml/2006/picture">
+                <pic:pic xmlns:pic="http://schemas.openxmlformats.org/drawingml/2006/picture">
+                  <pic:nvPicPr>
+                    <pic:cNvPr id="0" name="Picture 13"/>
+                    <pic:cNvPicPr>
+                      <a:picLocks noChangeAspect="1" noChangeArrowheads="1"/>
+                    </pic:cNvPicPr>
+                  </pic:nvPicPr>
+                  <pic:blipFill>
+                    <a:blip r:embed="rId14">
+                      <a:extLst>
+                        <a:ext uri="{28A0092B-C50C-407E-A947-70E740481C1C}">
+                          <a14:useLocalDpi xmlns:a14="http://schemas.microsoft.com/office/drawing/2010/main" val="0"/>
+                        </a:ext>
+                      </a:extLst>
+                    </a:blip>
+                    <a:srcRect/>
+                    <a:stretch>
+                      <a:fillRect/>
+                    </a:stretch>
+                  </pic:blipFill>
+                  <pic:spPr bwMode="auto">
+                    <a:xfrm>
+                      <a:off x="0" y="0"/>
+                      <a:ext cx="5941695" cy="4347210"/>
+                    </a:xfrm>
+                    <a:prstGeom prst="rect">
+                      <a:avLst/>
+                    </a:prstGeom>
+                    <a:noFill/>
+                    <a:ln>
+                      <a:noFill/>
+                    </a:ln>
+                  </pic:spPr>
+                </pic:pic>
+              </a:graphicData>
+            </a:graphic>
+          </wp:inline>
+        </w:drawing>
+      </w:r>
+    </w:p>
+    <w:p>
+      <w:pPr>
+        <w:pStyle w:val="Caption"/>
+      </w:pPr>
+      <w:r>
+        <w:t xml:space="preserve">Figure </w:t>
+      </w:r>
+      <w:r>
+        <w:fldChar w:fldCharType="begin"/>
+      </w:r>
+      <w:r>
+        <w:instrText xml:space="preserve"> SEQ Figure \* ARABIC </w:instrText>
+      </w:r>
+      <w:r>
+        <w:fldChar w:fldCharType="separate"/>
+      </w:r>
+      <w:r>
+        <w:rPr>
+          <w:noProof/>
+        </w:rPr>
+        <w:t>7</w:t>
+      </w:r>
+      <w:r>
+        <w:fldChar w:fldCharType="end"/>
+      </w:r>
+      <w:r>
+        <w:t xml:space="preserve"> - </w:t>
+      </w:r>
+      <w:r>
+        <w:t>Agency Verification Workflow Activity Diagram</w:t>
+      </w:r>
+    </w:p>
+    <w:p>
+      <w:pPr>
+        <w:rPr>
+          <w:i/>
+          <w:iCs/>
+          <w:color w:val="000000" w:themeColor="text1"/>
+          <w:sz w:val="20"/>
+          <w:szCs w:val="18"/>
+        </w:rPr>
+      </w:pPr>
+    </w:p>
+    <w:p>
+      <w:pPr>
+        <w:rPr>
+          <w:i/>
+          <w:iCs/>
+          <w:color w:val="000000" w:themeColor="text1"/>
+          <w:sz w:val="20"/>
+          <w:szCs w:val="18"/>
+        </w:rPr>
+      </w:pPr>
+    </w:p>
+    <w:p>
+      <w:pPr>
+        <w:tabs>
+          <w:tab w:val="left" w:pos="3120"/>
+        </w:tabs>
+      </w:pPr>
+      <w:r>
+        <w:tab/>
+      </w:r>
+    </w:p>
+    <w:p>
+      <w:pPr>
+        <w:spacing w:line="278" w:lineRule="auto"/>
+      </w:pPr>
+      <w:r>
+        <w:br w:type="page"/>
+      </w:r>
+    </w:p>
+    <w:p>
+      <w:pPr>
+        <w:tabs>
+          <w:tab w:val="left" w:pos="3120"/>
+        </w:tabs>
+      </w:pPr>
+    </w:p>
     <w:sectPr>
       <w:pgSz w:w="11906" w:h="16838" w:code="9"/>
       <w:pgMar w:top="1411" w:right="850" w:bottom="1411" w:left="1699" w:header="720" w:footer="720" w:gutter="0"/>
@@ -7288,6 +7985,155 @@
     </w:lvl>
   </w:abstractNum>
   <w:abstractNum w:abstractNumId="28" w15:restartNumberingAfterBreak="0">
+    <w:nsid w:val="15313512"/>
+    <w:multiLevelType w:val="multilevel"/>
+    <w:tmpl w:val="3D18208A"/>
+    <w:lvl w:ilvl="0">
+      <w:start w:val="1"/>
+      <w:numFmt w:val="bullet"/>
+      <w:lvlText w:val=""/>
+      <w:lvlJc w:val="left"/>
+      <w:pPr>
+        <w:tabs>
+          <w:tab w:val="num" w:pos="720"/>
+        </w:tabs>
+        <w:ind w:left="720" w:hanging="360"/>
+      </w:pPr>
+      <w:rPr>
+        <w:rFonts w:ascii="Symbol" w:hAnsi="Symbol" w:hint="default"/>
+        <w:sz w:val="20"/>
+      </w:rPr>
+    </w:lvl>
+    <w:lvl w:ilvl="1">
+      <w:start w:val="1"/>
+      <w:numFmt w:val="bullet"/>
+      <w:lvlText w:val="o"/>
+      <w:lvlJc w:val="left"/>
+      <w:pPr>
+        <w:tabs>
+          <w:tab w:val="num" w:pos="1440"/>
+        </w:tabs>
+        <w:ind w:left="1440" w:hanging="360"/>
+      </w:pPr>
+      <w:rPr>
+        <w:rFonts w:ascii="Courier New" w:hAnsi="Courier New" w:hint="default"/>
+        <w:sz w:val="20"/>
+      </w:rPr>
+    </w:lvl>
+    <w:lvl w:ilvl="2" w:tentative="1">
+      <w:start w:val="1"/>
+      <w:numFmt w:val="bullet"/>
+      <w:lvlText w:val=""/>
+      <w:lvlJc w:val="left"/>
+      <w:pPr>
+        <w:tabs>
+          <w:tab w:val="num" w:pos="2160"/>
+        </w:tabs>
+        <w:ind w:left="2160" w:hanging="360"/>
+      </w:pPr>
+      <w:rPr>
+        <w:rFonts w:ascii="Wingdings" w:hAnsi="Wingdings" w:hint="default"/>
+        <w:sz w:val="20"/>
+      </w:rPr>
+    </w:lvl>
+    <w:lvl w:ilvl="3" w:tentative="1">
+      <w:start w:val="1"/>
+      <w:numFmt w:val="bullet"/>
+      <w:lvlText w:val=""/>
+      <w:lvlJc w:val="left"/>
+      <w:pPr>
+        <w:tabs>
+          <w:tab w:val="num" w:pos="2880"/>
+        </w:tabs>
+        <w:ind w:left="2880" w:hanging="360"/>
+      </w:pPr>
+      <w:rPr>
+        <w:rFonts w:ascii="Wingdings" w:hAnsi="Wingdings" w:hint="default"/>
+        <w:sz w:val="20"/>
+      </w:rPr>
+    </w:lvl>
+    <w:lvl w:ilvl="4" w:tentative="1">
+      <w:start w:val="1"/>
+      <w:numFmt w:val="bullet"/>
+      <w:lvlText w:val=""/>
+      <w:lvlJc w:val="left"/>
+      <w:pPr>
+        <w:tabs>
+          <w:tab w:val="num" w:pos="3600"/>
+        </w:tabs>
+        <w:ind w:left="3600" w:hanging="360"/>
+      </w:pPr>
+      <w:rPr>
+        <w:rFonts w:ascii="Wingdings" w:hAnsi="Wingdings" w:hint="default"/>
+        <w:sz w:val="20"/>
+      </w:rPr>
+    </w:lvl>
+    <w:lvl w:ilvl="5" w:tentative="1">
+      <w:start w:val="1"/>
+      <w:numFmt w:val="bullet"/>
+      <w:lvlText w:val=""/>
+      <w:lvlJc w:val="left"/>
+      <w:pPr>
+        <w:tabs>
+          <w:tab w:val="num" w:pos="4320"/>
+        </w:tabs>
+        <w:ind w:left="4320" w:hanging="360"/>
+      </w:pPr>
+      <w:rPr>
+        <w:rFonts w:ascii="Wingdings" w:hAnsi="Wingdings" w:hint="default"/>
+        <w:sz w:val="20"/>
+      </w:rPr>
+    </w:lvl>
+    <w:lvl w:ilvl="6" w:tentative="1">
+      <w:start w:val="1"/>
+      <w:numFmt w:val="bullet"/>
+      <w:lvlText w:val=""/>
+      <w:lvlJc w:val="left"/>
+      <w:pPr>
+        <w:tabs>
+          <w:tab w:val="num" w:pos="5040"/>
+        </w:tabs>
+        <w:ind w:left="5040" w:hanging="360"/>
+      </w:pPr>
+      <w:rPr>
+        <w:rFonts w:ascii="Wingdings" w:hAnsi="Wingdings" w:hint="default"/>
+        <w:sz w:val="20"/>
+      </w:rPr>
+    </w:lvl>
+    <w:lvl w:ilvl="7" w:tentative="1">
+      <w:start w:val="1"/>
+      <w:numFmt w:val="bullet"/>
+      <w:lvlText w:val=""/>
+      <w:lvlJc w:val="left"/>
+      <w:pPr>
+        <w:tabs>
+          <w:tab w:val="num" w:pos="5760"/>
+        </w:tabs>
+        <w:ind w:left="5760" w:hanging="360"/>
+      </w:pPr>
+      <w:rPr>
+        <w:rFonts w:ascii="Wingdings" w:hAnsi="Wingdings" w:hint="default"/>
+        <w:sz w:val="20"/>
+      </w:rPr>
+    </w:lvl>
+    <w:lvl w:ilvl="8" w:tentative="1">
+      <w:start w:val="1"/>
+      <w:numFmt w:val="bullet"/>
+      <w:lvlText w:val=""/>
+      <w:lvlJc w:val="left"/>
+      <w:pPr>
+        <w:tabs>
+          <w:tab w:val="num" w:pos="6480"/>
+        </w:tabs>
+        <w:ind w:left="6480" w:hanging="360"/>
+      </w:pPr>
+      <w:rPr>
+        <w:rFonts w:ascii="Wingdings" w:hAnsi="Wingdings" w:hint="default"/>
+        <w:sz w:val="20"/>
+      </w:rPr>
+    </w:lvl>
+  </w:abstractNum>
+  <w:abstractNum w:abstractNumId="29" w15:restartNumberingAfterBreak="0">
     <w:nsid w:val="161C5709"/>
     <w:multiLevelType w:val="hybridMultilevel"/>
     <w:tmpl w:val="F06CE1E0"/>
@@ -7400,7 +8246,7 @@
       </w:rPr>
     </w:lvl>
   </w:abstractNum>
-  <w:abstractNum w:abstractNumId="29" w15:restartNumberingAfterBreak="0">
+  <w:abstractNum w:abstractNumId="30" w15:restartNumberingAfterBreak="0">
     <w:nsid w:val="16D400B4"/>
     <w:multiLevelType w:val="hybridMultilevel"/>
     <w:tmpl w:val="58E6DFBE"/>
@@ -7513,7 +8359,7 @@
       </w:rPr>
     </w:lvl>
   </w:abstractNum>
-  <w:abstractNum w:abstractNumId="30" w15:restartNumberingAfterBreak="0">
+  <w:abstractNum w:abstractNumId="31" w15:restartNumberingAfterBreak="0">
     <w:nsid w:val="17236012"/>
     <w:multiLevelType w:val="hybridMultilevel"/>
     <w:tmpl w:val="DAFA46C8"/>
@@ -7626,7 +8472,7 @@
       </w:rPr>
     </w:lvl>
   </w:abstractNum>
-  <w:abstractNum w:abstractNumId="31" w15:restartNumberingAfterBreak="0">
+  <w:abstractNum w:abstractNumId="32" w15:restartNumberingAfterBreak="0">
     <w:nsid w:val="172B04C0"/>
     <w:multiLevelType w:val="hybridMultilevel"/>
     <w:tmpl w:val="B6C41D5E"/>
@@ -7739,7 +8585,7 @@
       </w:rPr>
     </w:lvl>
   </w:abstractNum>
-  <w:abstractNum w:abstractNumId="32" w15:restartNumberingAfterBreak="0">
+  <w:abstractNum w:abstractNumId="33" w15:restartNumberingAfterBreak="0">
     <w:nsid w:val="17485CCB"/>
     <w:multiLevelType w:val="multilevel"/>
     <w:tmpl w:val="397E1AE0"/>
@@ -7888,7 +8734,7 @@
       </w:rPr>
     </w:lvl>
   </w:abstractNum>
-  <w:abstractNum w:abstractNumId="33" w15:restartNumberingAfterBreak="0">
+  <w:abstractNum w:abstractNumId="34" w15:restartNumberingAfterBreak="0">
     <w:nsid w:val="17763D31"/>
     <w:multiLevelType w:val="hybridMultilevel"/>
     <w:tmpl w:val="6CE63304"/>
@@ -8001,7 +8847,7 @@
       </w:rPr>
     </w:lvl>
   </w:abstractNum>
-  <w:abstractNum w:abstractNumId="34" w15:restartNumberingAfterBreak="0">
+  <w:abstractNum w:abstractNumId="35" w15:restartNumberingAfterBreak="0">
     <w:nsid w:val="17A835CF"/>
     <w:multiLevelType w:val="multilevel"/>
     <w:tmpl w:val="0C988B24"/>
@@ -8150,7 +8996,7 @@
       </w:rPr>
     </w:lvl>
   </w:abstractNum>
-  <w:abstractNum w:abstractNumId="35" w15:restartNumberingAfterBreak="0">
+  <w:abstractNum w:abstractNumId="36" w15:restartNumberingAfterBreak="0">
     <w:nsid w:val="17B06937"/>
     <w:multiLevelType w:val="hybridMultilevel"/>
     <w:tmpl w:val="71089CF2"/>
@@ -8263,7 +9109,7 @@
       </w:rPr>
     </w:lvl>
   </w:abstractNum>
-  <w:abstractNum w:abstractNumId="36" w15:restartNumberingAfterBreak="0">
+  <w:abstractNum w:abstractNumId="37" w15:restartNumberingAfterBreak="0">
     <w:nsid w:val="18FD59FB"/>
     <w:multiLevelType w:val="multilevel"/>
     <w:tmpl w:val="942CD1D2"/>
@@ -8412,7 +9258,7 @@
       </w:rPr>
     </w:lvl>
   </w:abstractNum>
-  <w:abstractNum w:abstractNumId="37" w15:restartNumberingAfterBreak="0">
+  <w:abstractNum w:abstractNumId="38" w15:restartNumberingAfterBreak="0">
     <w:nsid w:val="190F0390"/>
     <w:multiLevelType w:val="multilevel"/>
     <w:tmpl w:val="CBE4A4A4"/>
@@ -8561,7 +9407,7 @@
       </w:rPr>
     </w:lvl>
   </w:abstractNum>
-  <w:abstractNum w:abstractNumId="38" w15:restartNumberingAfterBreak="0">
+  <w:abstractNum w:abstractNumId="39" w15:restartNumberingAfterBreak="0">
     <w:nsid w:val="195875B0"/>
     <w:multiLevelType w:val="multilevel"/>
     <w:tmpl w:val="615444D4"/>
@@ -8674,7 +9520,7 @@
       </w:pPr>
     </w:lvl>
   </w:abstractNum>
-  <w:abstractNum w:abstractNumId="39" w15:restartNumberingAfterBreak="0">
+  <w:abstractNum w:abstractNumId="40" w15:restartNumberingAfterBreak="0">
     <w:nsid w:val="197C6FD7"/>
     <w:multiLevelType w:val="hybridMultilevel"/>
     <w:tmpl w:val="D97CEAA8"/>
@@ -8787,7 +9633,7 @@
       </w:rPr>
     </w:lvl>
   </w:abstractNum>
-  <w:abstractNum w:abstractNumId="40" w15:restartNumberingAfterBreak="0">
+  <w:abstractNum w:abstractNumId="41" w15:restartNumberingAfterBreak="0">
     <w:nsid w:val="1CC60A94"/>
     <w:multiLevelType w:val="multilevel"/>
     <w:tmpl w:val="EB74741C"/>
@@ -8936,7 +9782,7 @@
       </w:rPr>
     </w:lvl>
   </w:abstractNum>
-  <w:abstractNum w:abstractNumId="41" w15:restartNumberingAfterBreak="0">
+  <w:abstractNum w:abstractNumId="42" w15:restartNumberingAfterBreak="0">
     <w:nsid w:val="1E6658CF"/>
     <w:multiLevelType w:val="multilevel"/>
     <w:tmpl w:val="762ABC5E"/>
@@ -9085,7 +9931,7 @@
       </w:rPr>
     </w:lvl>
   </w:abstractNum>
-  <w:abstractNum w:abstractNumId="42" w15:restartNumberingAfterBreak="0">
+  <w:abstractNum w:abstractNumId="43" w15:restartNumberingAfterBreak="0">
     <w:nsid w:val="1FA532B0"/>
     <w:multiLevelType w:val="multilevel"/>
     <w:tmpl w:val="8718294C"/>
@@ -9234,7 +10080,7 @@
       </w:rPr>
     </w:lvl>
   </w:abstractNum>
-  <w:abstractNum w:abstractNumId="43" w15:restartNumberingAfterBreak="0">
+  <w:abstractNum w:abstractNumId="44" w15:restartNumberingAfterBreak="0">
     <w:nsid w:val="215C77FD"/>
     <w:multiLevelType w:val="hybridMultilevel"/>
     <w:tmpl w:val="58F41D10"/>
@@ -9323,7 +10169,7 @@
       </w:pPr>
     </w:lvl>
   </w:abstractNum>
-  <w:abstractNum w:abstractNumId="44" w15:restartNumberingAfterBreak="0">
+  <w:abstractNum w:abstractNumId="45" w15:restartNumberingAfterBreak="0">
     <w:nsid w:val="218D5909"/>
     <w:multiLevelType w:val="hybridMultilevel"/>
     <w:tmpl w:val="CC989EE4"/>
@@ -9436,7 +10282,7 @@
       </w:rPr>
     </w:lvl>
   </w:abstractNum>
-  <w:abstractNum w:abstractNumId="45" w15:restartNumberingAfterBreak="0">
+  <w:abstractNum w:abstractNumId="46" w15:restartNumberingAfterBreak="0">
     <w:nsid w:val="23E010BA"/>
     <w:multiLevelType w:val="multilevel"/>
     <w:tmpl w:val="4A16907E"/>
@@ -9585,7 +10431,7 @@
       </w:rPr>
     </w:lvl>
   </w:abstractNum>
-  <w:abstractNum w:abstractNumId="46" w15:restartNumberingAfterBreak="0">
+  <w:abstractNum w:abstractNumId="47" w15:restartNumberingAfterBreak="0">
     <w:nsid w:val="2470127A"/>
     <w:multiLevelType w:val="multilevel"/>
     <w:tmpl w:val="309E9618"/>
@@ -9734,7 +10580,7 @@
       </w:rPr>
     </w:lvl>
   </w:abstractNum>
-  <w:abstractNum w:abstractNumId="47" w15:restartNumberingAfterBreak="0">
+  <w:abstractNum w:abstractNumId="48" w15:restartNumberingAfterBreak="0">
     <w:nsid w:val="24796798"/>
     <w:multiLevelType w:val="hybridMultilevel"/>
     <w:tmpl w:val="6622BEDC"/>
@@ -9823,7 +10669,7 @@
       </w:pPr>
     </w:lvl>
   </w:abstractNum>
-  <w:abstractNum w:abstractNumId="48" w15:restartNumberingAfterBreak="0">
+  <w:abstractNum w:abstractNumId="49" w15:restartNumberingAfterBreak="0">
     <w:nsid w:val="253B76EC"/>
     <w:multiLevelType w:val="multilevel"/>
     <w:tmpl w:val="2AA67CDA"/>
@@ -9972,7 +10818,7 @@
       </w:rPr>
     </w:lvl>
   </w:abstractNum>
-  <w:abstractNum w:abstractNumId="49" w15:restartNumberingAfterBreak="0">
+  <w:abstractNum w:abstractNumId="50" w15:restartNumberingAfterBreak="0">
     <w:nsid w:val="2D0F5EA7"/>
     <w:multiLevelType w:val="hybridMultilevel"/>
     <w:tmpl w:val="F68ABCD6"/>
@@ -10085,7 +10931,7 @@
       </w:rPr>
     </w:lvl>
   </w:abstractNum>
-  <w:abstractNum w:abstractNumId="50" w15:restartNumberingAfterBreak="0">
+  <w:abstractNum w:abstractNumId="51" w15:restartNumberingAfterBreak="0">
     <w:nsid w:val="2E4D738C"/>
     <w:multiLevelType w:val="multilevel"/>
     <w:tmpl w:val="1540BBA2"/>
@@ -10234,7 +11080,7 @@
       </w:rPr>
     </w:lvl>
   </w:abstractNum>
-  <w:abstractNum w:abstractNumId="51" w15:restartNumberingAfterBreak="0">
+  <w:abstractNum w:abstractNumId="52" w15:restartNumberingAfterBreak="0">
     <w:nsid w:val="2F0041C7"/>
     <w:multiLevelType w:val="multilevel"/>
     <w:tmpl w:val="656414FE"/>
@@ -10383,7 +11229,120 @@
       </w:rPr>
     </w:lvl>
   </w:abstractNum>
-  <w:abstractNum w:abstractNumId="52" w15:restartNumberingAfterBreak="0">
+  <w:abstractNum w:abstractNumId="53" w15:restartNumberingAfterBreak="0">
+    <w:nsid w:val="2FAF0538"/>
+    <w:multiLevelType w:val="hybridMultilevel"/>
+    <w:tmpl w:val="EB1AC18C"/>
+    <w:lvl w:ilvl="0" w:tplc="04090005">
+      <w:start w:val="1"/>
+      <w:numFmt w:val="bullet"/>
+      <w:lvlText w:val=""/>
+      <w:lvlJc w:val="left"/>
+      <w:pPr>
+        <w:ind w:left="1080" w:hanging="360"/>
+      </w:pPr>
+      <w:rPr>
+        <w:rFonts w:ascii="Wingdings" w:hAnsi="Wingdings" w:hint="default"/>
+      </w:rPr>
+    </w:lvl>
+    <w:lvl w:ilvl="1" w:tplc="04090003" w:tentative="1">
+      <w:start w:val="1"/>
+      <w:numFmt w:val="bullet"/>
+      <w:lvlText w:val="o"/>
+      <w:lvlJc w:val="left"/>
+      <w:pPr>
+        <w:ind w:left="1800" w:hanging="360"/>
+      </w:pPr>
+      <w:rPr>
+        <w:rFonts w:ascii="Courier New" w:hAnsi="Courier New" w:cs="Courier New" w:hint="default"/>
+      </w:rPr>
+    </w:lvl>
+    <w:lvl w:ilvl="2" w:tplc="04090005" w:tentative="1">
+      <w:start w:val="1"/>
+      <w:numFmt w:val="bullet"/>
+      <w:lvlText w:val=""/>
+      <w:lvlJc w:val="left"/>
+      <w:pPr>
+        <w:ind w:left="2520" w:hanging="360"/>
+      </w:pPr>
+      <w:rPr>
+        <w:rFonts w:ascii="Wingdings" w:hAnsi="Wingdings" w:hint="default"/>
+      </w:rPr>
+    </w:lvl>
+    <w:lvl w:ilvl="3" w:tplc="04090001" w:tentative="1">
+      <w:start w:val="1"/>
+      <w:numFmt w:val="bullet"/>
+      <w:lvlText w:val=""/>
+      <w:lvlJc w:val="left"/>
+      <w:pPr>
+        <w:ind w:left="3240" w:hanging="360"/>
+      </w:pPr>
+      <w:rPr>
+        <w:rFonts w:ascii="Symbol" w:hAnsi="Symbol" w:hint="default"/>
+      </w:rPr>
+    </w:lvl>
+    <w:lvl w:ilvl="4" w:tplc="04090003" w:tentative="1">
+      <w:start w:val="1"/>
+      <w:numFmt w:val="bullet"/>
+      <w:lvlText w:val="o"/>
+      <w:lvlJc w:val="left"/>
+      <w:pPr>
+        <w:ind w:left="3960" w:hanging="360"/>
+      </w:pPr>
+      <w:rPr>
+        <w:rFonts w:ascii="Courier New" w:hAnsi="Courier New" w:cs="Courier New" w:hint="default"/>
+      </w:rPr>
+    </w:lvl>
+    <w:lvl w:ilvl="5" w:tplc="04090005" w:tentative="1">
+      <w:start w:val="1"/>
+      <w:numFmt w:val="bullet"/>
+      <w:lvlText w:val=""/>
+      <w:lvlJc w:val="left"/>
+      <w:pPr>
+        <w:ind w:left="4680" w:hanging="360"/>
+      </w:pPr>
+      <w:rPr>
+        <w:rFonts w:ascii="Wingdings" w:hAnsi="Wingdings" w:hint="default"/>
+      </w:rPr>
+    </w:lvl>
+    <w:lvl w:ilvl="6" w:tplc="04090001" w:tentative="1">
+      <w:start w:val="1"/>
+      <w:numFmt w:val="bullet"/>
+      <w:lvlText w:val=""/>
+      <w:lvlJc w:val="left"/>
+      <w:pPr>
+        <w:ind w:left="5400" w:hanging="360"/>
+      </w:pPr>
+      <w:rPr>
+        <w:rFonts w:ascii="Symbol" w:hAnsi="Symbol" w:hint="default"/>
+      </w:rPr>
+    </w:lvl>
+    <w:lvl w:ilvl="7" w:tplc="04090003" w:tentative="1">
+      <w:start w:val="1"/>
+      <w:numFmt w:val="bullet"/>
+      <w:lvlText w:val="o"/>
+      <w:lvlJc w:val="left"/>
+      <w:pPr>
+        <w:ind w:left="6120" w:hanging="360"/>
+      </w:pPr>
+      <w:rPr>
+        <w:rFonts w:ascii="Courier New" w:hAnsi="Courier New" w:cs="Courier New" w:hint="default"/>
+      </w:rPr>
+    </w:lvl>
+    <w:lvl w:ilvl="8" w:tplc="04090005" w:tentative="1">
+      <w:start w:val="1"/>
+      <w:numFmt w:val="bullet"/>
+      <w:lvlText w:val=""/>
+      <w:lvlJc w:val="left"/>
+      <w:pPr>
+        <w:ind w:left="6840" w:hanging="360"/>
+      </w:pPr>
+      <w:rPr>
+        <w:rFonts w:ascii="Wingdings" w:hAnsi="Wingdings" w:hint="default"/>
+      </w:rPr>
+    </w:lvl>
+  </w:abstractNum>
+  <w:abstractNum w:abstractNumId="54" w15:restartNumberingAfterBreak="0">
     <w:nsid w:val="304F01FA"/>
     <w:multiLevelType w:val="multilevel"/>
     <w:tmpl w:val="151C4EC6"/>
@@ -10532,7 +11491,7 @@
       </w:rPr>
     </w:lvl>
   </w:abstractNum>
-  <w:abstractNum w:abstractNumId="53" w15:restartNumberingAfterBreak="0">
+  <w:abstractNum w:abstractNumId="55" w15:restartNumberingAfterBreak="0">
     <w:nsid w:val="30BD025D"/>
     <w:multiLevelType w:val="hybridMultilevel"/>
     <w:tmpl w:val="04381C82"/>
@@ -10621,7 +11580,7 @@
       </w:pPr>
     </w:lvl>
   </w:abstractNum>
-  <w:abstractNum w:abstractNumId="54" w15:restartNumberingAfterBreak="0">
+  <w:abstractNum w:abstractNumId="56" w15:restartNumberingAfterBreak="0">
     <w:nsid w:val="327C0BA6"/>
     <w:multiLevelType w:val="hybridMultilevel"/>
     <w:tmpl w:val="2A9047EE"/>
@@ -10734,7 +11693,7 @@
       </w:rPr>
     </w:lvl>
   </w:abstractNum>
-  <w:abstractNum w:abstractNumId="55" w15:restartNumberingAfterBreak="0">
+  <w:abstractNum w:abstractNumId="57" w15:restartNumberingAfterBreak="0">
     <w:nsid w:val="338D63E8"/>
     <w:multiLevelType w:val="hybridMultilevel"/>
     <w:tmpl w:val="28D0FB50"/>
@@ -10847,7 +11806,7 @@
       </w:rPr>
     </w:lvl>
   </w:abstractNum>
-  <w:abstractNum w:abstractNumId="56" w15:restartNumberingAfterBreak="0">
+  <w:abstractNum w:abstractNumId="58" w15:restartNumberingAfterBreak="0">
     <w:nsid w:val="34182771"/>
     <w:multiLevelType w:val="multilevel"/>
     <w:tmpl w:val="2AA67CDA"/>
@@ -10996,7 +11955,7 @@
       </w:rPr>
     </w:lvl>
   </w:abstractNum>
-  <w:abstractNum w:abstractNumId="57" w15:restartNumberingAfterBreak="0">
+  <w:abstractNum w:abstractNumId="59" w15:restartNumberingAfterBreak="0">
     <w:nsid w:val="35413E58"/>
     <w:multiLevelType w:val="hybridMultilevel"/>
     <w:tmpl w:val="03C64164"/>
@@ -11109,7 +12068,7 @@
       </w:rPr>
     </w:lvl>
   </w:abstractNum>
-  <w:abstractNum w:abstractNumId="58" w15:restartNumberingAfterBreak="0">
+  <w:abstractNum w:abstractNumId="60" w15:restartNumberingAfterBreak="0">
     <w:nsid w:val="35C86AF0"/>
     <w:multiLevelType w:val="multilevel"/>
     <w:tmpl w:val="8202FCD6"/>
@@ -11258,7 +12217,7 @@
       </w:rPr>
     </w:lvl>
   </w:abstractNum>
-  <w:abstractNum w:abstractNumId="59" w15:restartNumberingAfterBreak="0">
+  <w:abstractNum w:abstractNumId="61" w15:restartNumberingAfterBreak="0">
     <w:nsid w:val="3623194A"/>
     <w:multiLevelType w:val="multilevel"/>
     <w:tmpl w:val="63F4E6F0"/>
@@ -11407,7 +12366,7 @@
       </w:rPr>
     </w:lvl>
   </w:abstractNum>
-  <w:abstractNum w:abstractNumId="60" w15:restartNumberingAfterBreak="0">
+  <w:abstractNum w:abstractNumId="62" w15:restartNumberingAfterBreak="0">
     <w:nsid w:val="36E36979"/>
     <w:multiLevelType w:val="multilevel"/>
     <w:tmpl w:val="3D58C93A"/>
@@ -11556,7 +12515,7 @@
       </w:rPr>
     </w:lvl>
   </w:abstractNum>
-  <w:abstractNum w:abstractNumId="61" w15:restartNumberingAfterBreak="0">
+  <w:abstractNum w:abstractNumId="63" w15:restartNumberingAfterBreak="0">
     <w:nsid w:val="37B424C3"/>
     <w:multiLevelType w:val="hybridMultilevel"/>
     <w:tmpl w:val="18F030D4"/>
@@ -11669,7 +12628,7 @@
       </w:rPr>
     </w:lvl>
   </w:abstractNum>
-  <w:abstractNum w:abstractNumId="62" w15:restartNumberingAfterBreak="0">
+  <w:abstractNum w:abstractNumId="64" w15:restartNumberingAfterBreak="0">
     <w:nsid w:val="39FC34BD"/>
     <w:multiLevelType w:val="hybridMultilevel"/>
     <w:tmpl w:val="D0D4E132"/>
@@ -11782,7 +12741,7 @@
       </w:rPr>
     </w:lvl>
   </w:abstractNum>
-  <w:abstractNum w:abstractNumId="63" w15:restartNumberingAfterBreak="0">
+  <w:abstractNum w:abstractNumId="65" w15:restartNumberingAfterBreak="0">
     <w:nsid w:val="3BC10D30"/>
     <w:multiLevelType w:val="multilevel"/>
     <w:tmpl w:val="502AD78C"/>
@@ -11931,7 +12890,7 @@
       </w:rPr>
     </w:lvl>
   </w:abstractNum>
-  <w:abstractNum w:abstractNumId="64" w15:restartNumberingAfterBreak="0">
+  <w:abstractNum w:abstractNumId="66" w15:restartNumberingAfterBreak="0">
     <w:nsid w:val="3C276BB8"/>
     <w:multiLevelType w:val="multilevel"/>
     <w:tmpl w:val="2AA67CDA"/>
@@ -12080,7 +13039,7 @@
       </w:rPr>
     </w:lvl>
   </w:abstractNum>
-  <w:abstractNum w:abstractNumId="65" w15:restartNumberingAfterBreak="0">
+  <w:abstractNum w:abstractNumId="67" w15:restartNumberingAfterBreak="0">
     <w:nsid w:val="3C596808"/>
     <w:multiLevelType w:val="multilevel"/>
     <w:tmpl w:val="2AA67CDA"/>
@@ -12229,7 +13188,7 @@
       </w:rPr>
     </w:lvl>
   </w:abstractNum>
-  <w:abstractNum w:abstractNumId="66" w15:restartNumberingAfterBreak="0">
+  <w:abstractNum w:abstractNumId="68" w15:restartNumberingAfterBreak="0">
     <w:nsid w:val="3CBF280A"/>
     <w:multiLevelType w:val="multilevel"/>
     <w:tmpl w:val="A13E4362"/>
@@ -12378,7 +13337,7 @@
       </w:rPr>
     </w:lvl>
   </w:abstractNum>
-  <w:abstractNum w:abstractNumId="67" w15:restartNumberingAfterBreak="0">
+  <w:abstractNum w:abstractNumId="69" w15:restartNumberingAfterBreak="0">
     <w:nsid w:val="3CC7541B"/>
     <w:multiLevelType w:val="multilevel"/>
     <w:tmpl w:val="2AA67CDA"/>
@@ -12527,7 +13486,7 @@
       </w:rPr>
     </w:lvl>
   </w:abstractNum>
-  <w:abstractNum w:abstractNumId="68" w15:restartNumberingAfterBreak="0">
+  <w:abstractNum w:abstractNumId="70" w15:restartNumberingAfterBreak="0">
     <w:nsid w:val="3F5E3BA1"/>
     <w:multiLevelType w:val="multilevel"/>
     <w:tmpl w:val="2AA67CDA"/>
@@ -12676,7 +13635,7 @@
       </w:rPr>
     </w:lvl>
   </w:abstractNum>
-  <w:abstractNum w:abstractNumId="69" w15:restartNumberingAfterBreak="0">
+  <w:abstractNum w:abstractNumId="71" w15:restartNumberingAfterBreak="0">
     <w:nsid w:val="40431B1C"/>
     <w:multiLevelType w:val="multilevel"/>
     <w:tmpl w:val="5D8E77D0"/>
@@ -12825,7 +13784,7 @@
       </w:rPr>
     </w:lvl>
   </w:abstractNum>
-  <w:abstractNum w:abstractNumId="70" w15:restartNumberingAfterBreak="0">
+  <w:abstractNum w:abstractNumId="72" w15:restartNumberingAfterBreak="0">
     <w:nsid w:val="419E0199"/>
     <w:multiLevelType w:val="multilevel"/>
     <w:tmpl w:val="D6CA9606"/>
@@ -12974,7 +13933,7 @@
       </w:rPr>
     </w:lvl>
   </w:abstractNum>
-  <w:abstractNum w:abstractNumId="71" w15:restartNumberingAfterBreak="0">
+  <w:abstractNum w:abstractNumId="73" w15:restartNumberingAfterBreak="0">
     <w:nsid w:val="452F60FB"/>
     <w:multiLevelType w:val="hybridMultilevel"/>
     <w:tmpl w:val="892A990A"/>
@@ -13087,7 +14046,7 @@
       </w:rPr>
     </w:lvl>
   </w:abstractNum>
-  <w:abstractNum w:abstractNumId="72" w15:restartNumberingAfterBreak="0">
+  <w:abstractNum w:abstractNumId="74" w15:restartNumberingAfterBreak="0">
     <w:nsid w:val="47B65409"/>
     <w:multiLevelType w:val="multilevel"/>
     <w:tmpl w:val="2AA67CDA"/>
@@ -13236,7 +14195,7 @@
       </w:rPr>
     </w:lvl>
   </w:abstractNum>
-  <w:abstractNum w:abstractNumId="73" w15:restartNumberingAfterBreak="0">
+  <w:abstractNum w:abstractNumId="75" w15:restartNumberingAfterBreak="0">
     <w:nsid w:val="47BF2170"/>
     <w:multiLevelType w:val="multilevel"/>
     <w:tmpl w:val="D9681266"/>
@@ -13385,7 +14344,7 @@
       </w:rPr>
     </w:lvl>
   </w:abstractNum>
-  <w:abstractNum w:abstractNumId="74" w15:restartNumberingAfterBreak="0">
+  <w:abstractNum w:abstractNumId="76" w15:restartNumberingAfterBreak="0">
     <w:nsid w:val="47E5592F"/>
     <w:multiLevelType w:val="hybridMultilevel"/>
     <w:tmpl w:val="719AB9FA"/>
@@ -13498,7 +14457,7 @@
       </w:rPr>
     </w:lvl>
   </w:abstractNum>
-  <w:abstractNum w:abstractNumId="75" w15:restartNumberingAfterBreak="0">
+  <w:abstractNum w:abstractNumId="77" w15:restartNumberingAfterBreak="0">
     <w:nsid w:val="48C041A9"/>
     <w:multiLevelType w:val="multilevel"/>
     <w:tmpl w:val="59A694BC"/>
@@ -13647,7 +14606,7 @@
       </w:rPr>
     </w:lvl>
   </w:abstractNum>
-  <w:abstractNum w:abstractNumId="76" w15:restartNumberingAfterBreak="0">
+  <w:abstractNum w:abstractNumId="78" w15:restartNumberingAfterBreak="0">
     <w:nsid w:val="49D6568A"/>
     <w:multiLevelType w:val="multilevel"/>
     <w:tmpl w:val="559E29EC"/>
@@ -13796,7 +14755,7 @@
       </w:rPr>
     </w:lvl>
   </w:abstractNum>
-  <w:abstractNum w:abstractNumId="77" w15:restartNumberingAfterBreak="0">
+  <w:abstractNum w:abstractNumId="79" w15:restartNumberingAfterBreak="0">
     <w:nsid w:val="4A7C2BC0"/>
     <w:multiLevelType w:val="hybridMultilevel"/>
     <w:tmpl w:val="4E4ADB18"/>
@@ -13909,7 +14868,7 @@
       </w:rPr>
     </w:lvl>
   </w:abstractNum>
-  <w:abstractNum w:abstractNumId="78" w15:restartNumberingAfterBreak="0">
+  <w:abstractNum w:abstractNumId="80" w15:restartNumberingAfterBreak="0">
     <w:nsid w:val="4AF73293"/>
     <w:multiLevelType w:val="hybridMultilevel"/>
     <w:tmpl w:val="F2962738"/>
@@ -14022,7 +14981,7 @@
       </w:rPr>
     </w:lvl>
   </w:abstractNum>
-  <w:abstractNum w:abstractNumId="79" w15:restartNumberingAfterBreak="0">
+  <w:abstractNum w:abstractNumId="81" w15:restartNumberingAfterBreak="0">
     <w:nsid w:val="4B375248"/>
     <w:multiLevelType w:val="multilevel"/>
     <w:tmpl w:val="B574C1C6"/>
@@ -14171,7 +15130,7 @@
       </w:rPr>
     </w:lvl>
   </w:abstractNum>
-  <w:abstractNum w:abstractNumId="80" w15:restartNumberingAfterBreak="0">
+  <w:abstractNum w:abstractNumId="82" w15:restartNumberingAfterBreak="0">
     <w:nsid w:val="4BA13766"/>
     <w:multiLevelType w:val="multilevel"/>
     <w:tmpl w:val="63F4E6F0"/>
@@ -14320,7 +15279,7 @@
       </w:rPr>
     </w:lvl>
   </w:abstractNum>
-  <w:abstractNum w:abstractNumId="81" w15:restartNumberingAfterBreak="0">
+  <w:abstractNum w:abstractNumId="83" w15:restartNumberingAfterBreak="0">
     <w:nsid w:val="4BA25441"/>
     <w:multiLevelType w:val="hybridMultilevel"/>
     <w:tmpl w:val="217E2E96"/>
@@ -14433,7 +15392,7 @@
       </w:rPr>
     </w:lvl>
   </w:abstractNum>
-  <w:abstractNum w:abstractNumId="82" w15:restartNumberingAfterBreak="0">
+  <w:abstractNum w:abstractNumId="84" w15:restartNumberingAfterBreak="0">
     <w:nsid w:val="4E276DCB"/>
     <w:multiLevelType w:val="hybridMultilevel"/>
     <w:tmpl w:val="B7C469B4"/>
@@ -14546,7 +15505,7 @@
       </w:rPr>
     </w:lvl>
   </w:abstractNum>
-  <w:abstractNum w:abstractNumId="83" w15:restartNumberingAfterBreak="0">
+  <w:abstractNum w:abstractNumId="85" w15:restartNumberingAfterBreak="0">
     <w:nsid w:val="4F053929"/>
     <w:multiLevelType w:val="hybridMultilevel"/>
     <w:tmpl w:val="2A78C678"/>
@@ -14659,7 +15618,7 @@
       </w:rPr>
     </w:lvl>
   </w:abstractNum>
-  <w:abstractNum w:abstractNumId="84" w15:restartNumberingAfterBreak="0">
+  <w:abstractNum w:abstractNumId="86" w15:restartNumberingAfterBreak="0">
     <w:nsid w:val="4F750073"/>
     <w:multiLevelType w:val="hybridMultilevel"/>
     <w:tmpl w:val="EC7AB8FC"/>
@@ -14772,7 +15731,7 @@
       </w:rPr>
     </w:lvl>
   </w:abstractNum>
-  <w:abstractNum w:abstractNumId="85" w15:restartNumberingAfterBreak="0">
+  <w:abstractNum w:abstractNumId="87" w15:restartNumberingAfterBreak="0">
     <w:nsid w:val="4FFB237E"/>
     <w:multiLevelType w:val="multilevel"/>
     <w:tmpl w:val="2AA67CDA"/>
@@ -14921,7 +15880,7 @@
       </w:rPr>
     </w:lvl>
   </w:abstractNum>
-  <w:abstractNum w:abstractNumId="86" w15:restartNumberingAfterBreak="0">
+  <w:abstractNum w:abstractNumId="88" w15:restartNumberingAfterBreak="0">
     <w:nsid w:val="51737FE0"/>
     <w:multiLevelType w:val="hybridMultilevel"/>
     <w:tmpl w:val="2B0604E6"/>
@@ -15034,7 +15993,7 @@
       </w:rPr>
     </w:lvl>
   </w:abstractNum>
-  <w:abstractNum w:abstractNumId="87" w15:restartNumberingAfterBreak="0">
+  <w:abstractNum w:abstractNumId="89" w15:restartNumberingAfterBreak="0">
     <w:nsid w:val="518B1885"/>
     <w:multiLevelType w:val="multilevel"/>
     <w:tmpl w:val="AE1AAC28"/>
@@ -15183,7 +16142,7 @@
       </w:rPr>
     </w:lvl>
   </w:abstractNum>
-  <w:abstractNum w:abstractNumId="88" w15:restartNumberingAfterBreak="0">
+  <w:abstractNum w:abstractNumId="90" w15:restartNumberingAfterBreak="0">
     <w:nsid w:val="51A86EF8"/>
     <w:multiLevelType w:val="multilevel"/>
     <w:tmpl w:val="FF2841D4"/>
@@ -15332,7 +16291,7 @@
       </w:rPr>
     </w:lvl>
   </w:abstractNum>
-  <w:abstractNum w:abstractNumId="89" w15:restartNumberingAfterBreak="0">
+  <w:abstractNum w:abstractNumId="91" w15:restartNumberingAfterBreak="0">
     <w:nsid w:val="51AB55CC"/>
     <w:multiLevelType w:val="multilevel"/>
     <w:tmpl w:val="5986D838"/>
@@ -15481,7 +16440,7 @@
       </w:rPr>
     </w:lvl>
   </w:abstractNum>
-  <w:abstractNum w:abstractNumId="90" w15:restartNumberingAfterBreak="0">
+  <w:abstractNum w:abstractNumId="92" w15:restartNumberingAfterBreak="0">
     <w:nsid w:val="521378FF"/>
     <w:multiLevelType w:val="multilevel"/>
     <w:tmpl w:val="7B002268"/>
@@ -15630,7 +16589,7 @@
       </w:rPr>
     </w:lvl>
   </w:abstractNum>
-  <w:abstractNum w:abstractNumId="91" w15:restartNumberingAfterBreak="0">
+  <w:abstractNum w:abstractNumId="93" w15:restartNumberingAfterBreak="0">
     <w:nsid w:val="521F2792"/>
     <w:multiLevelType w:val="multilevel"/>
     <w:tmpl w:val="9FB45386"/>
@@ -15779,7 +16738,7 @@
       </w:rPr>
     </w:lvl>
   </w:abstractNum>
-  <w:abstractNum w:abstractNumId="92" w15:restartNumberingAfterBreak="0">
+  <w:abstractNum w:abstractNumId="94" w15:restartNumberingAfterBreak="0">
     <w:nsid w:val="53390911"/>
     <w:multiLevelType w:val="multilevel"/>
     <w:tmpl w:val="1C380F12"/>
@@ -15928,7 +16887,7 @@
       </w:rPr>
     </w:lvl>
   </w:abstractNum>
-  <w:abstractNum w:abstractNumId="93" w15:restartNumberingAfterBreak="0">
+  <w:abstractNum w:abstractNumId="95" w15:restartNumberingAfterBreak="0">
     <w:nsid w:val="53CD23AC"/>
     <w:multiLevelType w:val="multilevel"/>
     <w:tmpl w:val="57BAE8F0"/>
@@ -16077,7 +17036,7 @@
       </w:rPr>
     </w:lvl>
   </w:abstractNum>
-  <w:abstractNum w:abstractNumId="94" w15:restartNumberingAfterBreak="0">
+  <w:abstractNum w:abstractNumId="96" w15:restartNumberingAfterBreak="0">
     <w:nsid w:val="5462791F"/>
     <w:multiLevelType w:val="hybridMultilevel"/>
     <w:tmpl w:val="FDE24C26"/>
@@ -16190,7 +17149,7 @@
       </w:rPr>
     </w:lvl>
   </w:abstractNum>
-  <w:abstractNum w:abstractNumId="95" w15:restartNumberingAfterBreak="0">
+  <w:abstractNum w:abstractNumId="97" w15:restartNumberingAfterBreak="0">
     <w:nsid w:val="547005EB"/>
     <w:multiLevelType w:val="multilevel"/>
     <w:tmpl w:val="F260CC5C"/>
@@ -16339,7 +17298,7 @@
       </w:rPr>
     </w:lvl>
   </w:abstractNum>
-  <w:abstractNum w:abstractNumId="96" w15:restartNumberingAfterBreak="0">
+  <w:abstractNum w:abstractNumId="98" w15:restartNumberingAfterBreak="0">
     <w:nsid w:val="58034221"/>
     <w:multiLevelType w:val="hybridMultilevel"/>
     <w:tmpl w:val="65D0619C"/>
@@ -16452,7 +17411,7 @@
       </w:rPr>
     </w:lvl>
   </w:abstractNum>
-  <w:abstractNum w:abstractNumId="97" w15:restartNumberingAfterBreak="0">
+  <w:abstractNum w:abstractNumId="99" w15:restartNumberingAfterBreak="0">
     <w:nsid w:val="59515319"/>
     <w:multiLevelType w:val="multilevel"/>
     <w:tmpl w:val="5AD8ACF0"/>
@@ -16601,7 +17560,7 @@
       </w:rPr>
     </w:lvl>
   </w:abstractNum>
-  <w:abstractNum w:abstractNumId="98" w15:restartNumberingAfterBreak="0">
+  <w:abstractNum w:abstractNumId="100" w15:restartNumberingAfterBreak="0">
     <w:nsid w:val="5A460390"/>
     <w:multiLevelType w:val="hybridMultilevel"/>
     <w:tmpl w:val="BD8E939C"/>
@@ -16714,7 +17673,7 @@
       </w:rPr>
     </w:lvl>
   </w:abstractNum>
-  <w:abstractNum w:abstractNumId="99" w15:restartNumberingAfterBreak="0">
+  <w:abstractNum w:abstractNumId="101" w15:restartNumberingAfterBreak="0">
     <w:nsid w:val="5CEE630B"/>
     <w:multiLevelType w:val="hybridMultilevel"/>
     <w:tmpl w:val="DE8E8DBA"/>
@@ -16827,7 +17786,7 @@
       </w:rPr>
     </w:lvl>
   </w:abstractNum>
-  <w:abstractNum w:abstractNumId="100" w15:restartNumberingAfterBreak="0">
+  <w:abstractNum w:abstractNumId="102" w15:restartNumberingAfterBreak="0">
     <w:nsid w:val="5D5A183C"/>
     <w:multiLevelType w:val="multilevel"/>
     <w:tmpl w:val="C804C34A"/>
@@ -16976,7 +17935,7 @@
       </w:rPr>
     </w:lvl>
   </w:abstractNum>
-  <w:abstractNum w:abstractNumId="101" w15:restartNumberingAfterBreak="0">
+  <w:abstractNum w:abstractNumId="103" w15:restartNumberingAfterBreak="0">
     <w:nsid w:val="5DF95194"/>
     <w:multiLevelType w:val="multilevel"/>
     <w:tmpl w:val="CC127E54"/>
@@ -17125,7 +18084,7 @@
       </w:rPr>
     </w:lvl>
   </w:abstractNum>
-  <w:abstractNum w:abstractNumId="102" w15:restartNumberingAfterBreak="0">
+  <w:abstractNum w:abstractNumId="104" w15:restartNumberingAfterBreak="0">
     <w:nsid w:val="5E6333E0"/>
     <w:multiLevelType w:val="hybridMultilevel"/>
     <w:tmpl w:val="A15497C8"/>
@@ -17238,7 +18197,7 @@
       </w:rPr>
     </w:lvl>
   </w:abstractNum>
-  <w:abstractNum w:abstractNumId="103" w15:restartNumberingAfterBreak="0">
+  <w:abstractNum w:abstractNumId="105" w15:restartNumberingAfterBreak="0">
     <w:nsid w:val="5E9C452C"/>
     <w:multiLevelType w:val="multilevel"/>
     <w:tmpl w:val="B8727936"/>
@@ -17387,7 +18346,7 @@
       </w:rPr>
     </w:lvl>
   </w:abstractNum>
-  <w:abstractNum w:abstractNumId="104" w15:restartNumberingAfterBreak="0">
+  <w:abstractNum w:abstractNumId="106" w15:restartNumberingAfterBreak="0">
     <w:nsid w:val="5EC339A8"/>
     <w:multiLevelType w:val="multilevel"/>
     <w:tmpl w:val="36DAAD54"/>
@@ -17536,7 +18495,156 @@
       </w:rPr>
     </w:lvl>
   </w:abstractNum>
-  <w:abstractNum w:abstractNumId="105" w15:restartNumberingAfterBreak="0">
+  <w:abstractNum w:abstractNumId="107" w15:restartNumberingAfterBreak="0">
+    <w:nsid w:val="605D2403"/>
+    <w:multiLevelType w:val="multilevel"/>
+    <w:tmpl w:val="5AF24F44"/>
+    <w:lvl w:ilvl="0">
+      <w:start w:val="1"/>
+      <w:numFmt w:val="bullet"/>
+      <w:lvlText w:val=""/>
+      <w:lvlJc w:val="left"/>
+      <w:pPr>
+        <w:tabs>
+          <w:tab w:val="num" w:pos="720"/>
+        </w:tabs>
+        <w:ind w:left="720" w:hanging="360"/>
+      </w:pPr>
+      <w:rPr>
+        <w:rFonts w:ascii="Symbol" w:hAnsi="Symbol" w:hint="default"/>
+        <w:sz w:val="20"/>
+      </w:rPr>
+    </w:lvl>
+    <w:lvl w:ilvl="1" w:tentative="1">
+      <w:start w:val="1"/>
+      <w:numFmt w:val="bullet"/>
+      <w:lvlText w:val="o"/>
+      <w:lvlJc w:val="left"/>
+      <w:pPr>
+        <w:tabs>
+          <w:tab w:val="num" w:pos="1440"/>
+        </w:tabs>
+        <w:ind w:left="1440" w:hanging="360"/>
+      </w:pPr>
+      <w:rPr>
+        <w:rFonts w:ascii="Courier New" w:hAnsi="Courier New" w:hint="default"/>
+        <w:sz w:val="20"/>
+      </w:rPr>
+    </w:lvl>
+    <w:lvl w:ilvl="2" w:tentative="1">
+      <w:start w:val="1"/>
+      <w:numFmt w:val="bullet"/>
+      <w:lvlText w:val=""/>
+      <w:lvlJc w:val="left"/>
+      <w:pPr>
+        <w:tabs>
+          <w:tab w:val="num" w:pos="2160"/>
+        </w:tabs>
+        <w:ind w:left="2160" w:hanging="360"/>
+      </w:pPr>
+      <w:rPr>
+        <w:rFonts w:ascii="Wingdings" w:hAnsi="Wingdings" w:hint="default"/>
+        <w:sz w:val="20"/>
+      </w:rPr>
+    </w:lvl>
+    <w:lvl w:ilvl="3" w:tentative="1">
+      <w:start w:val="1"/>
+      <w:numFmt w:val="bullet"/>
+      <w:lvlText w:val=""/>
+      <w:lvlJc w:val="left"/>
+      <w:pPr>
+        <w:tabs>
+          <w:tab w:val="num" w:pos="2880"/>
+        </w:tabs>
+        <w:ind w:left="2880" w:hanging="360"/>
+      </w:pPr>
+      <w:rPr>
+        <w:rFonts w:ascii="Wingdings" w:hAnsi="Wingdings" w:hint="default"/>
+        <w:sz w:val="20"/>
+      </w:rPr>
+    </w:lvl>
+    <w:lvl w:ilvl="4" w:tentative="1">
+      <w:start w:val="1"/>
+      <w:numFmt w:val="bullet"/>
+      <w:lvlText w:val=""/>
+      <w:lvlJc w:val="left"/>
+      <w:pPr>
+        <w:tabs>
+          <w:tab w:val="num" w:pos="3600"/>
+        </w:tabs>
+        <w:ind w:left="3600" w:hanging="360"/>
+      </w:pPr>
+      <w:rPr>
+        <w:rFonts w:ascii="Wingdings" w:hAnsi="Wingdings" w:hint="default"/>
+        <w:sz w:val="20"/>
+      </w:rPr>
+    </w:lvl>
+    <w:lvl w:ilvl="5" w:tentative="1">
+      <w:start w:val="1"/>
+      <w:numFmt w:val="bullet"/>
+      <w:lvlText w:val=""/>
+      <w:lvlJc w:val="left"/>
+      <w:pPr>
+        <w:tabs>
+          <w:tab w:val="num" w:pos="4320"/>
+        </w:tabs>
+        <w:ind w:left="4320" w:hanging="360"/>
+      </w:pPr>
+      <w:rPr>
+        <w:rFonts w:ascii="Wingdings" w:hAnsi="Wingdings" w:hint="default"/>
+        <w:sz w:val="20"/>
+      </w:rPr>
+    </w:lvl>
+    <w:lvl w:ilvl="6" w:tentative="1">
+      <w:start w:val="1"/>
+      <w:numFmt w:val="bullet"/>
+      <w:lvlText w:val=""/>
+      <w:lvlJc w:val="left"/>
+      <w:pPr>
+        <w:tabs>
+          <w:tab w:val="num" w:pos="5040"/>
+        </w:tabs>
+        <w:ind w:left="5040" w:hanging="360"/>
+      </w:pPr>
+      <w:rPr>
+        <w:rFonts w:ascii="Wingdings" w:hAnsi="Wingdings" w:hint="default"/>
+        <w:sz w:val="20"/>
+      </w:rPr>
+    </w:lvl>
+    <w:lvl w:ilvl="7" w:tentative="1">
+      <w:start w:val="1"/>
+      <w:numFmt w:val="bullet"/>
+      <w:lvlText w:val=""/>
+      <w:lvlJc w:val="left"/>
+      <w:pPr>
+        <w:tabs>
+          <w:tab w:val="num" w:pos="5760"/>
+        </w:tabs>
+        <w:ind w:left="5760" w:hanging="360"/>
+      </w:pPr>
+      <w:rPr>
+        <w:rFonts w:ascii="Wingdings" w:hAnsi="Wingdings" w:hint="default"/>
+        <w:sz w:val="20"/>
+      </w:rPr>
+    </w:lvl>
+    <w:lvl w:ilvl="8" w:tentative="1">
+      <w:start w:val="1"/>
+      <w:numFmt w:val="bullet"/>
+      <w:lvlText w:val=""/>
+      <w:lvlJc w:val="left"/>
+      <w:pPr>
+        <w:tabs>
+          <w:tab w:val="num" w:pos="6480"/>
+        </w:tabs>
+        <w:ind w:left="6480" w:hanging="360"/>
+      </w:pPr>
+      <w:rPr>
+        <w:rFonts w:ascii="Wingdings" w:hAnsi="Wingdings" w:hint="default"/>
+        <w:sz w:val="20"/>
+      </w:rPr>
+    </w:lvl>
+  </w:abstractNum>
+  <w:abstractNum w:abstractNumId="108" w15:restartNumberingAfterBreak="0">
     <w:nsid w:val="62385AA6"/>
     <w:multiLevelType w:val="multilevel"/>
     <w:tmpl w:val="B9EAECD4"/>
@@ -17685,7 +18793,7 @@
       </w:rPr>
     </w:lvl>
   </w:abstractNum>
-  <w:abstractNum w:abstractNumId="106" w15:restartNumberingAfterBreak="0">
+  <w:abstractNum w:abstractNumId="109" w15:restartNumberingAfterBreak="0">
     <w:nsid w:val="625D686D"/>
     <w:multiLevelType w:val="multilevel"/>
     <w:tmpl w:val="BC1C2048"/>
@@ -17834,7 +18942,7 @@
       </w:rPr>
     </w:lvl>
   </w:abstractNum>
-  <w:abstractNum w:abstractNumId="107" w15:restartNumberingAfterBreak="0">
+  <w:abstractNum w:abstractNumId="110" w15:restartNumberingAfterBreak="0">
     <w:nsid w:val="62B46951"/>
     <w:multiLevelType w:val="hybridMultilevel"/>
     <w:tmpl w:val="0FEAFEC6"/>
@@ -17947,7 +19055,7 @@
       </w:rPr>
     </w:lvl>
   </w:abstractNum>
-  <w:abstractNum w:abstractNumId="108" w15:restartNumberingAfterBreak="0">
+  <w:abstractNum w:abstractNumId="111" w15:restartNumberingAfterBreak="0">
     <w:nsid w:val="64014C6E"/>
     <w:multiLevelType w:val="multilevel"/>
     <w:tmpl w:val="96E42962"/>
@@ -18096,7 +19204,7 @@
       </w:rPr>
     </w:lvl>
   </w:abstractNum>
-  <w:abstractNum w:abstractNumId="109" w15:restartNumberingAfterBreak="0">
+  <w:abstractNum w:abstractNumId="112" w15:restartNumberingAfterBreak="0">
     <w:nsid w:val="647819E3"/>
     <w:multiLevelType w:val="multilevel"/>
     <w:tmpl w:val="ABB278BC"/>
@@ -18245,7 +19353,7 @@
       </w:rPr>
     </w:lvl>
   </w:abstractNum>
-  <w:abstractNum w:abstractNumId="110" w15:restartNumberingAfterBreak="0">
+  <w:abstractNum w:abstractNumId="113" w15:restartNumberingAfterBreak="0">
     <w:nsid w:val="64F30198"/>
     <w:multiLevelType w:val="multilevel"/>
     <w:tmpl w:val="63F4E6F0"/>
@@ -18394,7 +19502,7 @@
       </w:rPr>
     </w:lvl>
   </w:abstractNum>
-  <w:abstractNum w:abstractNumId="111" w15:restartNumberingAfterBreak="0">
+  <w:abstractNum w:abstractNumId="114" w15:restartNumberingAfterBreak="0">
     <w:nsid w:val="65314293"/>
     <w:multiLevelType w:val="hybridMultilevel"/>
     <w:tmpl w:val="6688DFAC"/>
@@ -18507,7 +19615,7 @@
       </w:rPr>
     </w:lvl>
   </w:abstractNum>
-  <w:abstractNum w:abstractNumId="112" w15:restartNumberingAfterBreak="0">
+  <w:abstractNum w:abstractNumId="115" w15:restartNumberingAfterBreak="0">
     <w:nsid w:val="65CE4D0F"/>
     <w:multiLevelType w:val="hybridMultilevel"/>
     <w:tmpl w:val="DB668538"/>
@@ -18620,7 +19728,7 @@
       </w:rPr>
     </w:lvl>
   </w:abstractNum>
-  <w:abstractNum w:abstractNumId="113" w15:restartNumberingAfterBreak="0">
+  <w:abstractNum w:abstractNumId="116" w15:restartNumberingAfterBreak="0">
     <w:nsid w:val="661C7D73"/>
     <w:multiLevelType w:val="multilevel"/>
     <w:tmpl w:val="D9681266"/>
@@ -18769,7 +19877,7 @@
       </w:rPr>
     </w:lvl>
   </w:abstractNum>
-  <w:abstractNum w:abstractNumId="114" w15:restartNumberingAfterBreak="0">
+  <w:abstractNum w:abstractNumId="117" w15:restartNumberingAfterBreak="0">
     <w:nsid w:val="661F6F82"/>
     <w:multiLevelType w:val="multilevel"/>
     <w:tmpl w:val="53F8A934"/>
@@ -18918,7 +20026,7 @@
       </w:rPr>
     </w:lvl>
   </w:abstractNum>
-  <w:abstractNum w:abstractNumId="115" w15:restartNumberingAfterBreak="0">
+  <w:abstractNum w:abstractNumId="118" w15:restartNumberingAfterBreak="0">
     <w:nsid w:val="66E36FE0"/>
     <w:multiLevelType w:val="multilevel"/>
     <w:tmpl w:val="2AA67CDA"/>
@@ -19067,7 +20175,7 @@
       </w:rPr>
     </w:lvl>
   </w:abstractNum>
-  <w:abstractNum w:abstractNumId="116" w15:restartNumberingAfterBreak="0">
+  <w:abstractNum w:abstractNumId="119" w15:restartNumberingAfterBreak="0">
     <w:nsid w:val="68205EC5"/>
     <w:multiLevelType w:val="multilevel"/>
     <w:tmpl w:val="EB4C8238"/>
@@ -19216,7 +20324,7 @@
       </w:rPr>
     </w:lvl>
   </w:abstractNum>
-  <w:abstractNum w:abstractNumId="117" w15:restartNumberingAfterBreak="0">
+  <w:abstractNum w:abstractNumId="120" w15:restartNumberingAfterBreak="0">
     <w:nsid w:val="68B94344"/>
     <w:multiLevelType w:val="multilevel"/>
     <w:tmpl w:val="9BA812D8"/>
@@ -19365,7 +20473,7 @@
       </w:rPr>
     </w:lvl>
   </w:abstractNum>
-  <w:abstractNum w:abstractNumId="118" w15:restartNumberingAfterBreak="0">
+  <w:abstractNum w:abstractNumId="121" w15:restartNumberingAfterBreak="0">
     <w:nsid w:val="69DE2C87"/>
     <w:multiLevelType w:val="hybridMultilevel"/>
     <w:tmpl w:val="F530F20A"/>
@@ -19478,7 +20586,7 @@
       </w:rPr>
     </w:lvl>
   </w:abstractNum>
-  <w:abstractNum w:abstractNumId="119" w15:restartNumberingAfterBreak="0">
+  <w:abstractNum w:abstractNumId="122" w15:restartNumberingAfterBreak="0">
     <w:nsid w:val="69ED672D"/>
     <w:multiLevelType w:val="multilevel"/>
     <w:tmpl w:val="CC08E300"/>
@@ -19627,7 +20735,7 @@
       </w:rPr>
     </w:lvl>
   </w:abstractNum>
-  <w:abstractNum w:abstractNumId="120" w15:restartNumberingAfterBreak="0">
+  <w:abstractNum w:abstractNumId="123" w15:restartNumberingAfterBreak="0">
     <w:nsid w:val="6A063EFD"/>
     <w:multiLevelType w:val="hybridMultilevel"/>
     <w:tmpl w:val="48703FBA"/>
@@ -19740,7 +20848,7 @@
       </w:rPr>
     </w:lvl>
   </w:abstractNum>
-  <w:abstractNum w:abstractNumId="121" w15:restartNumberingAfterBreak="0">
+  <w:abstractNum w:abstractNumId="124" w15:restartNumberingAfterBreak="0">
     <w:nsid w:val="6A825ABE"/>
     <w:multiLevelType w:val="multilevel"/>
     <w:tmpl w:val="0CD6F30E"/>
@@ -19889,7 +20997,7 @@
       </w:rPr>
     </w:lvl>
   </w:abstractNum>
-  <w:abstractNum w:abstractNumId="122" w15:restartNumberingAfterBreak="0">
+  <w:abstractNum w:abstractNumId="125" w15:restartNumberingAfterBreak="0">
     <w:nsid w:val="6B1D7832"/>
     <w:multiLevelType w:val="multilevel"/>
     <w:tmpl w:val="DD4646B2"/>
@@ -20038,7 +21146,7 @@
       </w:rPr>
     </w:lvl>
   </w:abstractNum>
-  <w:abstractNum w:abstractNumId="123" w15:restartNumberingAfterBreak="0">
+  <w:abstractNum w:abstractNumId="126" w15:restartNumberingAfterBreak="0">
     <w:nsid w:val="6C6D6667"/>
     <w:multiLevelType w:val="hybridMultilevel"/>
     <w:tmpl w:val="A744709C"/>
@@ -20151,7 +21259,7 @@
       </w:rPr>
     </w:lvl>
   </w:abstractNum>
-  <w:abstractNum w:abstractNumId="124" w15:restartNumberingAfterBreak="0">
+  <w:abstractNum w:abstractNumId="127" w15:restartNumberingAfterBreak="0">
     <w:nsid w:val="6CAD7EA5"/>
     <w:multiLevelType w:val="multilevel"/>
     <w:tmpl w:val="C472C5B0"/>
@@ -20300,7 +21408,7 @@
       </w:rPr>
     </w:lvl>
   </w:abstractNum>
-  <w:abstractNum w:abstractNumId="125" w15:restartNumberingAfterBreak="0">
+  <w:abstractNum w:abstractNumId="128" w15:restartNumberingAfterBreak="0">
     <w:nsid w:val="6E43557B"/>
     <w:multiLevelType w:val="multilevel"/>
     <w:tmpl w:val="323C7112"/>
@@ -20449,7 +21557,7 @@
       </w:rPr>
     </w:lvl>
   </w:abstractNum>
-  <w:abstractNum w:abstractNumId="126" w15:restartNumberingAfterBreak="0">
+  <w:abstractNum w:abstractNumId="129" w15:restartNumberingAfterBreak="0">
     <w:nsid w:val="6EA27D0A"/>
     <w:multiLevelType w:val="multilevel"/>
     <w:tmpl w:val="7BF0256C"/>
@@ -20598,7 +21706,7 @@
       </w:rPr>
     </w:lvl>
   </w:abstractNum>
-  <w:abstractNum w:abstractNumId="127" w15:restartNumberingAfterBreak="0">
+  <w:abstractNum w:abstractNumId="130" w15:restartNumberingAfterBreak="0">
     <w:nsid w:val="6EF86273"/>
     <w:multiLevelType w:val="multilevel"/>
     <w:tmpl w:val="2AA67CDA"/>
@@ -20747,7 +21855,7 @@
       </w:rPr>
     </w:lvl>
   </w:abstractNum>
-  <w:abstractNum w:abstractNumId="128" w15:restartNumberingAfterBreak="0">
+  <w:abstractNum w:abstractNumId="131" w15:restartNumberingAfterBreak="0">
     <w:nsid w:val="6F1425D4"/>
     <w:multiLevelType w:val="multilevel"/>
     <w:tmpl w:val="F71C8B08"/>
@@ -20896,7 +22004,7 @@
       </w:rPr>
     </w:lvl>
   </w:abstractNum>
-  <w:abstractNum w:abstractNumId="129" w15:restartNumberingAfterBreak="0">
+  <w:abstractNum w:abstractNumId="132" w15:restartNumberingAfterBreak="0">
     <w:nsid w:val="70874300"/>
     <w:multiLevelType w:val="hybridMultilevel"/>
     <w:tmpl w:val="1B3A0518"/>
@@ -21009,7 +22117,7 @@
       </w:rPr>
     </w:lvl>
   </w:abstractNum>
-  <w:abstractNum w:abstractNumId="130" w15:restartNumberingAfterBreak="0">
+  <w:abstractNum w:abstractNumId="133" w15:restartNumberingAfterBreak="0">
     <w:nsid w:val="7090251B"/>
     <w:multiLevelType w:val="hybridMultilevel"/>
     <w:tmpl w:val="67687EFE"/>
@@ -21122,7 +22230,7 @@
       </w:rPr>
     </w:lvl>
   </w:abstractNum>
-  <w:abstractNum w:abstractNumId="131" w15:restartNumberingAfterBreak="0">
+  <w:abstractNum w:abstractNumId="134" w15:restartNumberingAfterBreak="0">
     <w:nsid w:val="72031F81"/>
     <w:multiLevelType w:val="multilevel"/>
     <w:tmpl w:val="84400090"/>
@@ -21271,7 +22379,7 @@
       </w:rPr>
     </w:lvl>
   </w:abstractNum>
-  <w:abstractNum w:abstractNumId="132" w15:restartNumberingAfterBreak="0">
+  <w:abstractNum w:abstractNumId="135" w15:restartNumberingAfterBreak="0">
     <w:nsid w:val="722301E0"/>
     <w:multiLevelType w:val="multilevel"/>
     <w:tmpl w:val="1EE82E5A"/>
@@ -21420,7 +22528,7 @@
       </w:rPr>
     </w:lvl>
   </w:abstractNum>
-  <w:abstractNum w:abstractNumId="133" w15:restartNumberingAfterBreak="0">
+  <w:abstractNum w:abstractNumId="136" w15:restartNumberingAfterBreak="0">
     <w:nsid w:val="75144C65"/>
     <w:multiLevelType w:val="hybridMultilevel"/>
     <w:tmpl w:val="12127FAA"/>
@@ -21533,7 +22641,7 @@
       </w:rPr>
     </w:lvl>
   </w:abstractNum>
-  <w:abstractNum w:abstractNumId="134" w15:restartNumberingAfterBreak="0">
+  <w:abstractNum w:abstractNumId="137" w15:restartNumberingAfterBreak="0">
     <w:nsid w:val="75237F84"/>
     <w:multiLevelType w:val="hybridMultilevel"/>
     <w:tmpl w:val="5F0A6EF2"/>
@@ -21646,7 +22754,7 @@
       </w:rPr>
     </w:lvl>
   </w:abstractNum>
-  <w:abstractNum w:abstractNumId="135" w15:restartNumberingAfterBreak="0">
+  <w:abstractNum w:abstractNumId="138" w15:restartNumberingAfterBreak="0">
     <w:nsid w:val="758968F2"/>
     <w:multiLevelType w:val="multilevel"/>
     <w:tmpl w:val="D4241C4A"/>
@@ -21795,7 +22903,120 @@
       </w:rPr>
     </w:lvl>
   </w:abstractNum>
-  <w:abstractNum w:abstractNumId="136" w15:restartNumberingAfterBreak="0">
+  <w:abstractNum w:abstractNumId="139" w15:restartNumberingAfterBreak="0">
+    <w:nsid w:val="75C90201"/>
+    <w:multiLevelType w:val="hybridMultilevel"/>
+    <w:tmpl w:val="02D63AEC"/>
+    <w:lvl w:ilvl="0" w:tplc="04090005">
+      <w:start w:val="1"/>
+      <w:numFmt w:val="bullet"/>
+      <w:lvlText w:val=""/>
+      <w:lvlJc w:val="left"/>
+      <w:pPr>
+        <w:ind w:left="1080" w:hanging="360"/>
+      </w:pPr>
+      <w:rPr>
+        <w:rFonts w:ascii="Wingdings" w:hAnsi="Wingdings" w:hint="default"/>
+      </w:rPr>
+    </w:lvl>
+    <w:lvl w:ilvl="1" w:tplc="04090003" w:tentative="1">
+      <w:start w:val="1"/>
+      <w:numFmt w:val="bullet"/>
+      <w:lvlText w:val="o"/>
+      <w:lvlJc w:val="left"/>
+      <w:pPr>
+        <w:ind w:left="1800" w:hanging="360"/>
+      </w:pPr>
+      <w:rPr>
+        <w:rFonts w:ascii="Courier New" w:hAnsi="Courier New" w:cs="Courier New" w:hint="default"/>
+      </w:rPr>
+    </w:lvl>
+    <w:lvl w:ilvl="2" w:tplc="04090005" w:tentative="1">
+      <w:start w:val="1"/>
+      <w:numFmt w:val="bullet"/>
+      <w:lvlText w:val=""/>
+      <w:lvlJc w:val="left"/>
+      <w:pPr>
+        <w:ind w:left="2520" w:hanging="360"/>
+      </w:pPr>
+      <w:rPr>
+        <w:rFonts w:ascii="Wingdings" w:hAnsi="Wingdings" w:hint="default"/>
+      </w:rPr>
+    </w:lvl>
+    <w:lvl w:ilvl="3" w:tplc="04090001" w:tentative="1">
+      <w:start w:val="1"/>
+      <w:numFmt w:val="bullet"/>
+      <w:lvlText w:val=""/>
+      <w:lvlJc w:val="left"/>
+      <w:pPr>
+        <w:ind w:left="3240" w:hanging="360"/>
+      </w:pPr>
+      <w:rPr>
+        <w:rFonts w:ascii="Symbol" w:hAnsi="Symbol" w:hint="default"/>
+      </w:rPr>
+    </w:lvl>
+    <w:lvl w:ilvl="4" w:tplc="04090003" w:tentative="1">
+      <w:start w:val="1"/>
+      <w:numFmt w:val="bullet"/>
+      <w:lvlText w:val="o"/>
+      <w:lvlJc w:val="left"/>
+      <w:pPr>
+        <w:ind w:left="3960" w:hanging="360"/>
+      </w:pPr>
+      <w:rPr>
+        <w:rFonts w:ascii="Courier New" w:hAnsi="Courier New" w:cs="Courier New" w:hint="default"/>
+      </w:rPr>
+    </w:lvl>
+    <w:lvl w:ilvl="5" w:tplc="04090005" w:tentative="1">
+      <w:start w:val="1"/>
+      <w:numFmt w:val="bullet"/>
+      <w:lvlText w:val=""/>
+      <w:lvlJc w:val="left"/>
+      <w:pPr>
+        <w:ind w:left="4680" w:hanging="360"/>
+      </w:pPr>
+      <w:rPr>
+        <w:rFonts w:ascii="Wingdings" w:hAnsi="Wingdings" w:hint="default"/>
+      </w:rPr>
+    </w:lvl>
+    <w:lvl w:ilvl="6" w:tplc="04090001" w:tentative="1">
+      <w:start w:val="1"/>
+      <w:numFmt w:val="bullet"/>
+      <w:lvlText w:val=""/>
+      <w:lvlJc w:val="left"/>
+      <w:pPr>
+        <w:ind w:left="5400" w:hanging="360"/>
+      </w:pPr>
+      <w:rPr>
+        <w:rFonts w:ascii="Symbol" w:hAnsi="Symbol" w:hint="default"/>
+      </w:rPr>
+    </w:lvl>
+    <w:lvl w:ilvl="7" w:tplc="04090003" w:tentative="1">
+      <w:start w:val="1"/>
+      <w:numFmt w:val="bullet"/>
+      <w:lvlText w:val="o"/>
+      <w:lvlJc w:val="left"/>
+      <w:pPr>
+        <w:ind w:left="6120" w:hanging="360"/>
+      </w:pPr>
+      <w:rPr>
+        <w:rFonts w:ascii="Courier New" w:hAnsi="Courier New" w:cs="Courier New" w:hint="default"/>
+      </w:rPr>
+    </w:lvl>
+    <w:lvl w:ilvl="8" w:tplc="04090005" w:tentative="1">
+      <w:start w:val="1"/>
+      <w:numFmt w:val="bullet"/>
+      <w:lvlText w:val=""/>
+      <w:lvlJc w:val="left"/>
+      <w:pPr>
+        <w:ind w:left="6840" w:hanging="360"/>
+      </w:pPr>
+      <w:rPr>
+        <w:rFonts w:ascii="Wingdings" w:hAnsi="Wingdings" w:hint="default"/>
+      </w:rPr>
+    </w:lvl>
+  </w:abstractNum>
+  <w:abstractNum w:abstractNumId="140" w15:restartNumberingAfterBreak="0">
     <w:nsid w:val="75F3357C"/>
     <w:multiLevelType w:val="hybridMultilevel"/>
     <w:tmpl w:val="26723550"/>
@@ -21908,7 +23129,7 @@
       </w:rPr>
     </w:lvl>
   </w:abstractNum>
-  <w:abstractNum w:abstractNumId="137" w15:restartNumberingAfterBreak="0">
+  <w:abstractNum w:abstractNumId="141" w15:restartNumberingAfterBreak="0">
     <w:nsid w:val="75FF09B0"/>
     <w:multiLevelType w:val="multilevel"/>
     <w:tmpl w:val="C34A7734"/>
@@ -22057,7 +23278,7 @@
       </w:rPr>
     </w:lvl>
   </w:abstractNum>
-  <w:abstractNum w:abstractNumId="138" w15:restartNumberingAfterBreak="0">
+  <w:abstractNum w:abstractNumId="142" w15:restartNumberingAfterBreak="0">
     <w:nsid w:val="76864E3D"/>
     <w:multiLevelType w:val="hybridMultilevel"/>
     <w:tmpl w:val="9000C896"/>
@@ -22170,7 +23391,7 @@
       </w:rPr>
     </w:lvl>
   </w:abstractNum>
-  <w:abstractNum w:abstractNumId="139" w15:restartNumberingAfterBreak="0">
+  <w:abstractNum w:abstractNumId="143" w15:restartNumberingAfterBreak="0">
     <w:nsid w:val="774028FF"/>
     <w:multiLevelType w:val="hybridMultilevel"/>
     <w:tmpl w:val="EED036DC"/>
@@ -22283,7 +23504,7 @@
       </w:rPr>
     </w:lvl>
   </w:abstractNum>
-  <w:abstractNum w:abstractNumId="140" w15:restartNumberingAfterBreak="0">
+  <w:abstractNum w:abstractNumId="144" w15:restartNumberingAfterBreak="0">
     <w:nsid w:val="777E68D9"/>
     <w:multiLevelType w:val="multilevel"/>
     <w:tmpl w:val="3F503B98"/>
@@ -22432,7 +23653,7 @@
       </w:rPr>
     </w:lvl>
   </w:abstractNum>
-  <w:abstractNum w:abstractNumId="141" w15:restartNumberingAfterBreak="0">
+  <w:abstractNum w:abstractNumId="145" w15:restartNumberingAfterBreak="0">
     <w:nsid w:val="77960362"/>
     <w:multiLevelType w:val="multilevel"/>
     <w:tmpl w:val="FEA0022E"/>
@@ -22581,7 +23802,7 @@
       </w:rPr>
     </w:lvl>
   </w:abstractNum>
-  <w:abstractNum w:abstractNumId="142" w15:restartNumberingAfterBreak="0">
+  <w:abstractNum w:abstractNumId="146" w15:restartNumberingAfterBreak="0">
     <w:nsid w:val="78547E35"/>
     <w:multiLevelType w:val="multilevel"/>
     <w:tmpl w:val="FC1421DE"/>
@@ -22730,7 +23951,7 @@
       </w:rPr>
     </w:lvl>
   </w:abstractNum>
-  <w:abstractNum w:abstractNumId="143" w15:restartNumberingAfterBreak="0">
+  <w:abstractNum w:abstractNumId="147" w15:restartNumberingAfterBreak="0">
     <w:nsid w:val="785A644F"/>
     <w:multiLevelType w:val="multilevel"/>
     <w:tmpl w:val="D1DC60FE"/>
@@ -22879,7 +24100,7 @@
       </w:rPr>
     </w:lvl>
   </w:abstractNum>
-  <w:abstractNum w:abstractNumId="144" w15:restartNumberingAfterBreak="0">
+  <w:abstractNum w:abstractNumId="148" w15:restartNumberingAfterBreak="0">
     <w:nsid w:val="78B62297"/>
     <w:multiLevelType w:val="multilevel"/>
     <w:tmpl w:val="2AA67CDA"/>
@@ -23028,7 +24249,156 @@
       </w:rPr>
     </w:lvl>
   </w:abstractNum>
-  <w:abstractNum w:abstractNumId="145" w15:restartNumberingAfterBreak="0">
+  <w:abstractNum w:abstractNumId="149" w15:restartNumberingAfterBreak="0">
+    <w:nsid w:val="79E63650"/>
+    <w:multiLevelType w:val="multilevel"/>
+    <w:tmpl w:val="98AA5BE8"/>
+    <w:lvl w:ilvl="0">
+      <w:start w:val="1"/>
+      <w:numFmt w:val="bullet"/>
+      <w:lvlText w:val=""/>
+      <w:lvlJc w:val="left"/>
+      <w:pPr>
+        <w:tabs>
+          <w:tab w:val="num" w:pos="720"/>
+        </w:tabs>
+        <w:ind w:left="720" w:hanging="360"/>
+      </w:pPr>
+      <w:rPr>
+        <w:rFonts w:ascii="Symbol" w:hAnsi="Symbol" w:hint="default"/>
+        <w:sz w:val="20"/>
+      </w:rPr>
+    </w:lvl>
+    <w:lvl w:ilvl="1" w:tentative="1">
+      <w:start w:val="1"/>
+      <w:numFmt w:val="bullet"/>
+      <w:lvlText w:val="o"/>
+      <w:lvlJc w:val="left"/>
+      <w:pPr>
+        <w:tabs>
+          <w:tab w:val="num" w:pos="1440"/>
+        </w:tabs>
+        <w:ind w:left="1440" w:hanging="360"/>
+      </w:pPr>
+      <w:rPr>
+        <w:rFonts w:ascii="Courier New" w:hAnsi="Courier New" w:hint="default"/>
+        <w:sz w:val="20"/>
+      </w:rPr>
+    </w:lvl>
+    <w:lvl w:ilvl="2" w:tentative="1">
+      <w:start w:val="1"/>
+      <w:numFmt w:val="bullet"/>
+      <w:lvlText w:val=""/>
+      <w:lvlJc w:val="left"/>
+      <w:pPr>
+        <w:tabs>
+          <w:tab w:val="num" w:pos="2160"/>
+        </w:tabs>
+        <w:ind w:left="2160" w:hanging="360"/>
+      </w:pPr>
+      <w:rPr>
+        <w:rFonts w:ascii="Wingdings" w:hAnsi="Wingdings" w:hint="default"/>
+        <w:sz w:val="20"/>
+      </w:rPr>
+    </w:lvl>
+    <w:lvl w:ilvl="3" w:tentative="1">
+      <w:start w:val="1"/>
+      <w:numFmt w:val="bullet"/>
+      <w:lvlText w:val=""/>
+      <w:lvlJc w:val="left"/>
+      <w:pPr>
+        <w:tabs>
+          <w:tab w:val="num" w:pos="2880"/>
+        </w:tabs>
+        <w:ind w:left="2880" w:hanging="360"/>
+      </w:pPr>
+      <w:rPr>
+        <w:rFonts w:ascii="Wingdings" w:hAnsi="Wingdings" w:hint="default"/>
+        <w:sz w:val="20"/>
+      </w:rPr>
+    </w:lvl>
+    <w:lvl w:ilvl="4" w:tentative="1">
+      <w:start w:val="1"/>
+      <w:numFmt w:val="bullet"/>
+      <w:lvlText w:val=""/>
+      <w:lvlJc w:val="left"/>
+      <w:pPr>
+        <w:tabs>
+          <w:tab w:val="num" w:pos="3600"/>
+        </w:tabs>
+        <w:ind w:left="3600" w:hanging="360"/>
+      </w:pPr>
+      <w:rPr>
+        <w:rFonts w:ascii="Wingdings" w:hAnsi="Wingdings" w:hint="default"/>
+        <w:sz w:val="20"/>
+      </w:rPr>
+    </w:lvl>
+    <w:lvl w:ilvl="5" w:tentative="1">
+      <w:start w:val="1"/>
+      <w:numFmt w:val="bullet"/>
+      <w:lvlText w:val=""/>
+      <w:lvlJc w:val="left"/>
+      <w:pPr>
+        <w:tabs>
+          <w:tab w:val="num" w:pos="4320"/>
+        </w:tabs>
+        <w:ind w:left="4320" w:hanging="360"/>
+      </w:pPr>
+      <w:rPr>
+        <w:rFonts w:ascii="Wingdings" w:hAnsi="Wingdings" w:hint="default"/>
+        <w:sz w:val="20"/>
+      </w:rPr>
+    </w:lvl>
+    <w:lvl w:ilvl="6" w:tentative="1">
+      <w:start w:val="1"/>
+      <w:numFmt w:val="bullet"/>
+      <w:lvlText w:val=""/>
+      <w:lvlJc w:val="left"/>
+      <w:pPr>
+        <w:tabs>
+          <w:tab w:val="num" w:pos="5040"/>
+        </w:tabs>
+        <w:ind w:left="5040" w:hanging="360"/>
+      </w:pPr>
+      <w:rPr>
+        <w:rFonts w:ascii="Wingdings" w:hAnsi="Wingdings" w:hint="default"/>
+        <w:sz w:val="20"/>
+      </w:rPr>
+    </w:lvl>
+    <w:lvl w:ilvl="7" w:tentative="1">
+      <w:start w:val="1"/>
+      <w:numFmt w:val="bullet"/>
+      <w:lvlText w:val=""/>
+      <w:lvlJc w:val="left"/>
+      <w:pPr>
+        <w:tabs>
+          <w:tab w:val="num" w:pos="5760"/>
+        </w:tabs>
+        <w:ind w:left="5760" w:hanging="360"/>
+      </w:pPr>
+      <w:rPr>
+        <w:rFonts w:ascii="Wingdings" w:hAnsi="Wingdings" w:hint="default"/>
+        <w:sz w:val="20"/>
+      </w:rPr>
+    </w:lvl>
+    <w:lvl w:ilvl="8" w:tentative="1">
+      <w:start w:val="1"/>
+      <w:numFmt w:val="bullet"/>
+      <w:lvlText w:val=""/>
+      <w:lvlJc w:val="left"/>
+      <w:pPr>
+        <w:tabs>
+          <w:tab w:val="num" w:pos="6480"/>
+        </w:tabs>
+        <w:ind w:left="6480" w:hanging="360"/>
+      </w:pPr>
+      <w:rPr>
+        <w:rFonts w:ascii="Wingdings" w:hAnsi="Wingdings" w:hint="default"/>
+        <w:sz w:val="20"/>
+      </w:rPr>
+    </w:lvl>
+  </w:abstractNum>
+  <w:abstractNum w:abstractNumId="150" w15:restartNumberingAfterBreak="0">
     <w:nsid w:val="7BFA03DF"/>
     <w:multiLevelType w:val="hybridMultilevel"/>
     <w:tmpl w:val="536A979E"/>
@@ -23141,7 +24511,7 @@
       </w:rPr>
     </w:lvl>
   </w:abstractNum>
-  <w:abstractNum w:abstractNumId="146" w15:restartNumberingAfterBreak="0">
+  <w:abstractNum w:abstractNumId="151" w15:restartNumberingAfterBreak="0">
     <w:nsid w:val="7CA524B4"/>
     <w:multiLevelType w:val="hybridMultilevel"/>
     <w:tmpl w:val="957C4F4A"/>
@@ -23254,7 +24624,7 @@
       </w:rPr>
     </w:lvl>
   </w:abstractNum>
-  <w:abstractNum w:abstractNumId="147" w15:restartNumberingAfterBreak="0">
+  <w:abstractNum w:abstractNumId="152" w15:restartNumberingAfterBreak="0">
     <w:nsid w:val="7E1C597E"/>
     <w:multiLevelType w:val="multilevel"/>
     <w:tmpl w:val="2AA67CDA"/>
@@ -23403,7 +24773,7 @@
       </w:rPr>
     </w:lvl>
   </w:abstractNum>
-  <w:abstractNum w:abstractNumId="148" w15:restartNumberingAfterBreak="0">
+  <w:abstractNum w:abstractNumId="153" w15:restartNumberingAfterBreak="0">
     <w:nsid w:val="7EBD7710"/>
     <w:multiLevelType w:val="hybridMultilevel"/>
     <w:tmpl w:val="C8C6F7A0"/>
@@ -23516,7 +24886,7 @@
       </w:rPr>
     </w:lvl>
   </w:abstractNum>
-  <w:abstractNum w:abstractNumId="149" w15:restartNumberingAfterBreak="0">
+  <w:abstractNum w:abstractNumId="154" w15:restartNumberingAfterBreak="0">
     <w:nsid w:val="7F233031"/>
     <w:multiLevelType w:val="hybridMultilevel"/>
     <w:tmpl w:val="0D22564E"/>
@@ -23629,7 +24999,7 @@
       </w:rPr>
     </w:lvl>
   </w:abstractNum>
-  <w:abstractNum w:abstractNumId="150" w15:restartNumberingAfterBreak="0">
+  <w:abstractNum w:abstractNumId="155" w15:restartNumberingAfterBreak="0">
     <w:nsid w:val="7F426DF2"/>
     <w:multiLevelType w:val="multilevel"/>
     <w:tmpl w:val="430EFE5E"/>
@@ -23779,106 +25149,106 @@
     </w:lvl>
   </w:abstractNum>
   <w:num w:numId="1" w16cid:durableId="425157302">
-    <w:abstractNumId w:val="59"/>
+    <w:abstractNumId w:val="61"/>
   </w:num>
   <w:num w:numId="2" w16cid:durableId="967664612">
-    <w:abstractNumId w:val="110"/>
+    <w:abstractNumId w:val="113"/>
   </w:num>
   <w:num w:numId="3" w16cid:durableId="361631616">
+    <w:abstractNumId w:val="82"/>
+  </w:num>
+  <w:num w:numId="4" w16cid:durableId="1409575397">
+    <w:abstractNumId w:val="96"/>
+  </w:num>
+  <w:num w:numId="5" w16cid:durableId="1647204897">
+    <w:abstractNumId w:val="151"/>
+  </w:num>
+  <w:num w:numId="6" w16cid:durableId="682589869">
+    <w:abstractNumId w:val="31"/>
+  </w:num>
+  <w:num w:numId="7" w16cid:durableId="679703478">
+    <w:abstractNumId w:val="121"/>
+  </w:num>
+  <w:num w:numId="8" w16cid:durableId="496455128">
+    <w:abstractNumId w:val="55"/>
+  </w:num>
+  <w:num w:numId="9" w16cid:durableId="1184633094">
+    <w:abstractNumId w:val="73"/>
+  </w:num>
+  <w:num w:numId="10" w16cid:durableId="71507387">
     <w:abstractNumId w:val="80"/>
   </w:num>
-  <w:num w:numId="4" w16cid:durableId="1409575397">
-    <w:abstractNumId w:val="94"/>
-  </w:num>
-  <w:num w:numId="5" w16cid:durableId="1647204897">
-    <w:abstractNumId w:val="146"/>
-  </w:num>
-  <w:num w:numId="6" w16cid:durableId="682589869">
-    <w:abstractNumId w:val="30"/>
-  </w:num>
-  <w:num w:numId="7" w16cid:durableId="679703478">
-    <w:abstractNumId w:val="118"/>
-  </w:num>
-  <w:num w:numId="8" w16cid:durableId="496455128">
-    <w:abstractNumId w:val="53"/>
-  </w:num>
-  <w:num w:numId="9" w16cid:durableId="1184633094">
-    <w:abstractNumId w:val="71"/>
-  </w:num>
-  <w:num w:numId="10" w16cid:durableId="71507387">
-    <w:abstractNumId w:val="78"/>
-  </w:num>
   <w:num w:numId="11" w16cid:durableId="1412503779">
-    <w:abstractNumId w:val="120"/>
+    <w:abstractNumId w:val="123"/>
   </w:num>
   <w:num w:numId="12" w16cid:durableId="1107113995">
-    <w:abstractNumId w:val="54"/>
+    <w:abstractNumId w:val="56"/>
   </w:num>
   <w:num w:numId="13" w16cid:durableId="2011055922">
-    <w:abstractNumId w:val="31"/>
+    <w:abstractNumId w:val="32"/>
   </w:num>
   <w:num w:numId="14" w16cid:durableId="1529222885">
-    <w:abstractNumId w:val="145"/>
+    <w:abstractNumId w:val="150"/>
   </w:num>
   <w:num w:numId="15" w16cid:durableId="836580755">
     <w:abstractNumId w:val="22"/>
   </w:num>
   <w:num w:numId="16" w16cid:durableId="1344674502">
-    <w:abstractNumId w:val="98"/>
+    <w:abstractNumId w:val="100"/>
   </w:num>
   <w:num w:numId="17" w16cid:durableId="1320882603">
-    <w:abstractNumId w:val="129"/>
+    <w:abstractNumId w:val="132"/>
   </w:num>
   <w:num w:numId="18" w16cid:durableId="1139028372">
-    <w:abstractNumId w:val="55"/>
+    <w:abstractNumId w:val="57"/>
   </w:num>
   <w:num w:numId="19" w16cid:durableId="1525635473">
-    <w:abstractNumId w:val="107"/>
+    <w:abstractNumId w:val="110"/>
   </w:num>
   <w:num w:numId="20" w16cid:durableId="609623515">
-    <w:abstractNumId w:val="148"/>
+    <w:abstractNumId w:val="153"/>
   </w:num>
   <w:num w:numId="21" w16cid:durableId="165170997">
-    <w:abstractNumId w:val="123"/>
+    <w:abstractNumId w:val="126"/>
   </w:num>
   <w:num w:numId="22" w16cid:durableId="1620525290">
-    <w:abstractNumId w:val="39"/>
+    <w:abstractNumId w:val="40"/>
   </w:num>
   <w:num w:numId="23" w16cid:durableId="400753109">
-    <w:abstractNumId w:val="133"/>
+    <w:abstractNumId w:val="136"/>
   </w:num>
   <w:num w:numId="24" w16cid:durableId="193882219">
     <w:abstractNumId w:val="7"/>
   </w:num>
   <w:num w:numId="25" w16cid:durableId="311981628">
-    <w:abstractNumId w:val="61"/>
+    <w:abstractNumId w:val="63"/>
   </w:num>
   <w:num w:numId="26" w16cid:durableId="2009166045">
     <w:abstractNumId w:val="21"/>
   </w:num>
   <w:num w:numId="27" w16cid:durableId="2135174697">
-    <w:abstractNumId w:val="29"/>
+    <w:abstractNumId w:val="30"/>
   </w:num>
   <w:num w:numId="28" w16cid:durableId="353504740">
     <w:abstractNumId w:val="23"/>
   </w:num>
   <w:num w:numId="29" w16cid:durableId="2124693280">
-    <w:abstractNumId w:val="112"/>
+    <w:abstractNumId w:val="115"/>
   </w:num>
   <w:num w:numId="30" w16cid:durableId="1367099744">
-    <w:abstractNumId w:val="44"/>
+    <w:abstractNumId w:val="45"/>
   </w:num>
   <w:num w:numId="31" w16cid:durableId="2011105642">
-    <w:abstractNumId w:val="99"/>
+    <w:abstractNumId w:val="101"/>
   </w:num>
   <w:num w:numId="32" w16cid:durableId="831995364">
-    <w:abstractNumId w:val="35"/>
+    <w:abstractNumId w:val="36"/>
   </w:num>
   <w:num w:numId="33" w16cid:durableId="851073403">
     <w:abstractNumId w:val="5"/>
   </w:num>
   <w:num w:numId="34" w16cid:durableId="1183666391">
-    <w:abstractNumId w:val="33"/>
+    <w:abstractNumId w:val="34"/>
   </w:num>
   <w:num w:numId="35" w16cid:durableId="697268929">
     <w:abstractNumId w:val="2"/>
@@ -23887,7 +25257,7 @@
     <w:abstractNumId w:val="3"/>
   </w:num>
   <w:num w:numId="37" w16cid:durableId="1849755457">
-    <w:abstractNumId w:val="134"/>
+    <w:abstractNumId w:val="137"/>
   </w:num>
   <w:num w:numId="38" w16cid:durableId="516505904">
     <w:abstractNumId w:val="20"/>
@@ -23896,85 +25266,85 @@
     <w:abstractNumId w:val="24"/>
   </w:num>
   <w:num w:numId="40" w16cid:durableId="905338697">
-    <w:abstractNumId w:val="82"/>
+    <w:abstractNumId w:val="84"/>
   </w:num>
   <w:num w:numId="41" w16cid:durableId="501896635">
-    <w:abstractNumId w:val="57"/>
+    <w:abstractNumId w:val="59"/>
   </w:num>
   <w:num w:numId="42" w16cid:durableId="1953435156">
+    <w:abstractNumId w:val="85"/>
+  </w:num>
+  <w:num w:numId="43" w16cid:durableId="1060447452">
+    <w:abstractNumId w:val="98"/>
+  </w:num>
+  <w:num w:numId="44" w16cid:durableId="1772503672">
+    <w:abstractNumId w:val="76"/>
+  </w:num>
+  <w:num w:numId="45" w16cid:durableId="1650330222">
     <w:abstractNumId w:val="83"/>
   </w:num>
-  <w:num w:numId="43" w16cid:durableId="1060447452">
-    <w:abstractNumId w:val="96"/>
-  </w:num>
-  <w:num w:numId="44" w16cid:durableId="1772503672">
-    <w:abstractNumId w:val="74"/>
-  </w:num>
-  <w:num w:numId="45" w16cid:durableId="1650330222">
-    <w:abstractNumId w:val="81"/>
-  </w:num>
   <w:num w:numId="46" w16cid:durableId="2102337934">
-    <w:abstractNumId w:val="38"/>
+    <w:abstractNumId w:val="39"/>
   </w:num>
   <w:num w:numId="47" w16cid:durableId="68767822">
-    <w:abstractNumId w:val="121"/>
+    <w:abstractNumId w:val="124"/>
   </w:num>
   <w:num w:numId="48" w16cid:durableId="1992058265">
     <w:abstractNumId w:val="8"/>
   </w:num>
   <w:num w:numId="49" w16cid:durableId="788475134">
-    <w:abstractNumId w:val="143"/>
+    <w:abstractNumId w:val="147"/>
   </w:num>
   <w:num w:numId="50" w16cid:durableId="224419455">
-    <w:abstractNumId w:val="126"/>
+    <w:abstractNumId w:val="129"/>
   </w:num>
   <w:num w:numId="51" w16cid:durableId="1699575947">
-    <w:abstractNumId w:val="106"/>
+    <w:abstractNumId w:val="109"/>
   </w:num>
   <w:num w:numId="52" w16cid:durableId="1048916239">
-    <w:abstractNumId w:val="66"/>
+    <w:abstractNumId w:val="68"/>
   </w:num>
   <w:num w:numId="53" w16cid:durableId="1188711211">
-    <w:abstractNumId w:val="137"/>
+    <w:abstractNumId w:val="141"/>
   </w:num>
   <w:num w:numId="54" w16cid:durableId="447555614">
-    <w:abstractNumId w:val="109"/>
+    <w:abstractNumId w:val="112"/>
   </w:num>
   <w:num w:numId="55" w16cid:durableId="1679307268">
-    <w:abstractNumId w:val="63"/>
+    <w:abstractNumId w:val="65"/>
   </w:num>
   <w:num w:numId="56" w16cid:durableId="693773591">
-    <w:abstractNumId w:val="125"/>
+    <w:abstractNumId w:val="128"/>
   </w:num>
   <w:num w:numId="57" w16cid:durableId="1110473324">
-    <w:abstractNumId w:val="46"/>
+    <w:abstractNumId w:val="47"/>
   </w:num>
   <w:num w:numId="58" w16cid:durableId="842937968">
-    <w:abstractNumId w:val="79"/>
+    <w:abstractNumId w:val="81"/>
   </w:num>
   <w:num w:numId="59" w16cid:durableId="821121315">
+    <w:abstractNumId w:val="54"/>
+  </w:num>
+  <w:num w:numId="60" w16cid:durableId="2095394549">
+    <w:abstractNumId w:val="145"/>
+  </w:num>
+  <w:num w:numId="61" w16cid:durableId="1299921011">
     <w:abstractNumId w:val="52"/>
   </w:num>
-  <w:num w:numId="60" w16cid:durableId="2095394549">
-    <w:abstractNumId w:val="141"/>
+  <w:num w:numId="62" w16cid:durableId="1927420240">
+    <w:abstractNumId w:val="90"/>
   </w:num>
-  <w:num w:numId="61" w16cid:durableId="1299921011">
-    <w:abstractNumId w:val="51"/>
+  <w:num w:numId="63" w16cid:durableId="41290043">
+    <w:abstractNumId w:val="95"/>
   </w:num>
-  <w:num w:numId="62" w16cid:durableId="1927420240">
+  <w:num w:numId="64" w16cid:durableId="999846909">
+    <w:abstractNumId w:val="77"/>
+  </w:num>
+  <w:num w:numId="65" w16cid:durableId="1250969563">
     <w:abstractNumId w:val="88"/>
   </w:num>
-  <w:num w:numId="63" w16cid:durableId="41290043">
-    <w:abstractNumId w:val="93"/>
-  </w:num>
-  <w:num w:numId="64" w16cid:durableId="999846909">
-    <w:abstractNumId w:val="75"/>
-  </w:num>
-  <w:num w:numId="65" w16cid:durableId="1250969563">
-    <w:abstractNumId w:val="86"/>
-  </w:num>
   <w:num w:numId="66" w16cid:durableId="484011382">
-    <w:abstractNumId w:val="119"/>
+    <w:abstractNumId w:val="122"/>
   </w:num>
   <w:num w:numId="67" w16cid:durableId="2008289242">
     <w:abstractNumId w:val="17"/>
@@ -23983,160 +25353,160 @@
     <w:abstractNumId w:val="25"/>
   </w:num>
   <w:num w:numId="69" w16cid:durableId="1296839887">
-    <w:abstractNumId w:val="92"/>
+    <w:abstractNumId w:val="94"/>
   </w:num>
   <w:num w:numId="70" w16cid:durableId="336662050">
-    <w:abstractNumId w:val="105"/>
+    <w:abstractNumId w:val="108"/>
   </w:num>
   <w:num w:numId="71" w16cid:durableId="1460032333">
-    <w:abstractNumId w:val="124"/>
+    <w:abstractNumId w:val="127"/>
   </w:num>
   <w:num w:numId="72" w16cid:durableId="592400615">
     <w:abstractNumId w:val="14"/>
   </w:num>
   <w:num w:numId="73" w16cid:durableId="1879049234">
-    <w:abstractNumId w:val="43"/>
+    <w:abstractNumId w:val="44"/>
   </w:num>
   <w:num w:numId="74" w16cid:durableId="1747679558">
-    <w:abstractNumId w:val="47"/>
+    <w:abstractNumId w:val="48"/>
   </w:num>
   <w:num w:numId="75" w16cid:durableId="55278029">
-    <w:abstractNumId w:val="40"/>
+    <w:abstractNumId w:val="41"/>
   </w:num>
   <w:num w:numId="76" w16cid:durableId="1032193382">
-    <w:abstractNumId w:val="41"/>
+    <w:abstractNumId w:val="42"/>
   </w:num>
   <w:num w:numId="77" w16cid:durableId="763109604">
-    <w:abstractNumId w:val="95"/>
+    <w:abstractNumId w:val="97"/>
   </w:num>
   <w:num w:numId="78" w16cid:durableId="2138137265">
-    <w:abstractNumId w:val="111"/>
+    <w:abstractNumId w:val="114"/>
   </w:num>
   <w:num w:numId="79" w16cid:durableId="343675924">
-    <w:abstractNumId w:val="130"/>
+    <w:abstractNumId w:val="133"/>
   </w:num>
   <w:num w:numId="80" w16cid:durableId="1823277442">
-    <w:abstractNumId w:val="50"/>
+    <w:abstractNumId w:val="51"/>
   </w:num>
   <w:num w:numId="81" w16cid:durableId="1686900155">
     <w:abstractNumId w:val="0"/>
   </w:num>
   <w:num w:numId="82" w16cid:durableId="1113326280">
-    <w:abstractNumId w:val="91"/>
+    <w:abstractNumId w:val="93"/>
   </w:num>
   <w:num w:numId="83" w16cid:durableId="1253051103">
-    <w:abstractNumId w:val="122"/>
+    <w:abstractNumId w:val="125"/>
   </w:num>
   <w:num w:numId="84" w16cid:durableId="444888444">
-    <w:abstractNumId w:val="58"/>
+    <w:abstractNumId w:val="60"/>
   </w:num>
   <w:num w:numId="85" w16cid:durableId="64299649">
-    <w:abstractNumId w:val="113"/>
+    <w:abstractNumId w:val="116"/>
   </w:num>
   <w:num w:numId="86" w16cid:durableId="868182992">
-    <w:abstractNumId w:val="73"/>
+    <w:abstractNumId w:val="75"/>
   </w:num>
   <w:num w:numId="87" w16cid:durableId="896863331">
-    <w:abstractNumId w:val="32"/>
+    <w:abstractNumId w:val="33"/>
   </w:num>
   <w:num w:numId="88" w16cid:durableId="505442826">
-    <w:abstractNumId w:val="117"/>
+    <w:abstractNumId w:val="120"/>
   </w:num>
   <w:num w:numId="89" w16cid:durableId="1858763908">
-    <w:abstractNumId w:val="45"/>
+    <w:abstractNumId w:val="46"/>
   </w:num>
   <w:num w:numId="90" w16cid:durableId="1896088176">
     <w:abstractNumId w:val="19"/>
   </w:num>
   <w:num w:numId="91" w16cid:durableId="1284576603">
-    <w:abstractNumId w:val="100"/>
+    <w:abstractNumId w:val="102"/>
   </w:num>
   <w:num w:numId="92" w16cid:durableId="1963075542">
     <w:abstractNumId w:val="13"/>
   </w:num>
   <w:num w:numId="93" w16cid:durableId="787627596">
-    <w:abstractNumId w:val="90"/>
+    <w:abstractNumId w:val="92"/>
   </w:num>
   <w:num w:numId="94" w16cid:durableId="2003925799">
     <w:abstractNumId w:val="16"/>
   </w:num>
   <w:num w:numId="95" w16cid:durableId="1169102579">
+    <w:abstractNumId w:val="105"/>
+  </w:num>
+  <w:num w:numId="96" w16cid:durableId="1216501564">
+    <w:abstractNumId w:val="43"/>
+  </w:num>
+  <w:num w:numId="97" w16cid:durableId="261768216">
+    <w:abstractNumId w:val="130"/>
+  </w:num>
+  <w:num w:numId="98" w16cid:durableId="2141918721">
+    <w:abstractNumId w:val="87"/>
+  </w:num>
+  <w:num w:numId="99" w16cid:durableId="905841544">
+    <w:abstractNumId w:val="49"/>
+  </w:num>
+  <w:num w:numId="100" w16cid:durableId="1753887223">
     <w:abstractNumId w:val="103"/>
   </w:num>
-  <w:num w:numId="96" w16cid:durableId="1216501564">
-    <w:abstractNumId w:val="42"/>
-  </w:num>
-  <w:num w:numId="97" w16cid:durableId="261768216">
-    <w:abstractNumId w:val="127"/>
-  </w:num>
-  <w:num w:numId="98" w16cid:durableId="2141918721">
-    <w:abstractNumId w:val="85"/>
-  </w:num>
-  <w:num w:numId="99" w16cid:durableId="905841544">
-    <w:abstractNumId w:val="48"/>
-  </w:num>
-  <w:num w:numId="100" w16cid:durableId="1753887223">
-    <w:abstractNumId w:val="101"/>
-  </w:num>
   <w:num w:numId="101" w16cid:durableId="1320184766">
-    <w:abstractNumId w:val="37"/>
+    <w:abstractNumId w:val="38"/>
   </w:num>
   <w:num w:numId="102" w16cid:durableId="465127606">
+    <w:abstractNumId w:val="69"/>
+  </w:num>
+  <w:num w:numId="103" w16cid:durableId="1640451435">
     <w:abstractNumId w:val="67"/>
   </w:num>
-  <w:num w:numId="103" w16cid:durableId="1640451435">
-    <w:abstractNumId w:val="65"/>
-  </w:num>
   <w:num w:numId="104" w16cid:durableId="942029608">
-    <w:abstractNumId w:val="60"/>
+    <w:abstractNumId w:val="62"/>
   </w:num>
   <w:num w:numId="105" w16cid:durableId="70857193">
-    <w:abstractNumId w:val="69"/>
+    <w:abstractNumId w:val="71"/>
   </w:num>
   <w:num w:numId="106" w16cid:durableId="1617908629">
-    <w:abstractNumId w:val="132"/>
+    <w:abstractNumId w:val="135"/>
   </w:num>
   <w:num w:numId="107" w16cid:durableId="970137111">
-    <w:abstractNumId w:val="147"/>
+    <w:abstractNumId w:val="152"/>
   </w:num>
   <w:num w:numId="108" w16cid:durableId="383797013">
-    <w:abstractNumId w:val="56"/>
+    <w:abstractNumId w:val="58"/>
   </w:num>
   <w:num w:numId="109" w16cid:durableId="1459567304">
-    <w:abstractNumId w:val="68"/>
+    <w:abstractNumId w:val="70"/>
   </w:num>
   <w:num w:numId="110" w16cid:durableId="862745862">
     <w:abstractNumId w:val="26"/>
   </w:num>
   <w:num w:numId="111" w16cid:durableId="1859536331">
+    <w:abstractNumId w:val="74"/>
+  </w:num>
+  <w:num w:numId="112" w16cid:durableId="2092697678">
+    <w:abstractNumId w:val="89"/>
+  </w:num>
+  <w:num w:numId="113" w16cid:durableId="1418403813">
+    <w:abstractNumId w:val="78"/>
+  </w:num>
+  <w:num w:numId="114" w16cid:durableId="1965042317">
+    <w:abstractNumId w:val="134"/>
+  </w:num>
+  <w:num w:numId="115" w16cid:durableId="670569040">
+    <w:abstractNumId w:val="66"/>
+  </w:num>
+  <w:num w:numId="116" w16cid:durableId="413823113">
+    <w:abstractNumId w:val="148"/>
+  </w:num>
+  <w:num w:numId="117" w16cid:durableId="1293747982">
+    <w:abstractNumId w:val="118"/>
+  </w:num>
+  <w:num w:numId="118" w16cid:durableId="2058698591">
     <w:abstractNumId w:val="72"/>
   </w:num>
-  <w:num w:numId="112" w16cid:durableId="2092697678">
-    <w:abstractNumId w:val="87"/>
-  </w:num>
-  <w:num w:numId="113" w16cid:durableId="1418403813">
-    <w:abstractNumId w:val="76"/>
-  </w:num>
-  <w:num w:numId="114" w16cid:durableId="1965042317">
-    <w:abstractNumId w:val="131"/>
-  </w:num>
-  <w:num w:numId="115" w16cid:durableId="670569040">
-    <w:abstractNumId w:val="64"/>
-  </w:num>
-  <w:num w:numId="116" w16cid:durableId="413823113">
-    <w:abstractNumId w:val="144"/>
-  </w:num>
-  <w:num w:numId="117" w16cid:durableId="1293747982">
-    <w:abstractNumId w:val="115"/>
-  </w:num>
-  <w:num w:numId="118" w16cid:durableId="2058698591">
-    <w:abstractNumId w:val="70"/>
-  </w:num>
   <w:num w:numId="119" w16cid:durableId="892157361">
-    <w:abstractNumId w:val="89"/>
+    <w:abstractNumId w:val="91"/>
   </w:num>
   <w:num w:numId="120" w16cid:durableId="1449229938">
-    <w:abstractNumId w:val="135"/>
+    <w:abstractNumId w:val="138"/>
   </w:num>
   <w:num w:numId="121" w16cid:durableId="177283374">
     <w:abstractNumId w:val="11"/>
@@ -24145,31 +25515,31 @@
     <w:abstractNumId w:val="15"/>
   </w:num>
   <w:num w:numId="123" w16cid:durableId="1495337109">
-    <w:abstractNumId w:val="138"/>
+    <w:abstractNumId w:val="142"/>
   </w:num>
   <w:num w:numId="124" w16cid:durableId="302319311">
-    <w:abstractNumId w:val="97"/>
+    <w:abstractNumId w:val="99"/>
   </w:num>
   <w:num w:numId="125" w16cid:durableId="1891844186">
-    <w:abstractNumId w:val="114"/>
+    <w:abstractNumId w:val="117"/>
   </w:num>
   <w:num w:numId="126" w16cid:durableId="256911009">
     <w:abstractNumId w:val="1"/>
   </w:num>
   <w:num w:numId="127" w16cid:durableId="1001927776">
-    <w:abstractNumId w:val="149"/>
+    <w:abstractNumId w:val="154"/>
   </w:num>
   <w:num w:numId="128" w16cid:durableId="1365057616">
-    <w:abstractNumId w:val="102"/>
+    <w:abstractNumId w:val="104"/>
   </w:num>
   <w:num w:numId="129" w16cid:durableId="2142647602">
-    <w:abstractNumId w:val="104"/>
+    <w:abstractNumId w:val="106"/>
   </w:num>
   <w:num w:numId="130" w16cid:durableId="1895652277">
-    <w:abstractNumId w:val="150"/>
+    <w:abstractNumId w:val="155"/>
   </w:num>
   <w:num w:numId="131" w16cid:durableId="1132407586">
-    <w:abstractNumId w:val="142"/>
+    <w:abstractNumId w:val="146"/>
   </w:num>
   <w:num w:numId="132" w16cid:durableId="1209996408">
     <w:abstractNumId w:val="12"/>
@@ -24178,16 +25548,16 @@
     <w:abstractNumId w:val="4"/>
   </w:num>
   <w:num w:numId="134" w16cid:durableId="220867256">
-    <w:abstractNumId w:val="116"/>
+    <w:abstractNumId w:val="119"/>
   </w:num>
   <w:num w:numId="135" w16cid:durableId="2026857351">
-    <w:abstractNumId w:val="36"/>
+    <w:abstractNumId w:val="37"/>
   </w:num>
   <w:num w:numId="136" w16cid:durableId="1236696510">
-    <w:abstractNumId w:val="140"/>
+    <w:abstractNumId w:val="144"/>
   </w:num>
   <w:num w:numId="137" w16cid:durableId="1156385716">
-    <w:abstractNumId w:val="49"/>
+    <w:abstractNumId w:val="50"/>
   </w:num>
   <w:num w:numId="138" w16cid:durableId="1088235058">
     <w:abstractNumId w:val="27"/>
@@ -24199,36 +25569,51 @@
     <w:abstractNumId w:val="10"/>
   </w:num>
   <w:num w:numId="141" w16cid:durableId="1122117806">
-    <w:abstractNumId w:val="34"/>
+    <w:abstractNumId w:val="35"/>
   </w:num>
   <w:num w:numId="142" w16cid:durableId="2126385657">
-    <w:abstractNumId w:val="62"/>
+    <w:abstractNumId w:val="64"/>
   </w:num>
   <w:num w:numId="143" w16cid:durableId="1058674300">
-    <w:abstractNumId w:val="77"/>
+    <w:abstractNumId w:val="79"/>
   </w:num>
   <w:num w:numId="144" w16cid:durableId="756362112">
     <w:abstractNumId w:val="6"/>
   </w:num>
   <w:num w:numId="145" w16cid:durableId="1612125897">
-    <w:abstractNumId w:val="84"/>
+    <w:abstractNumId w:val="86"/>
   </w:num>
   <w:num w:numId="146" w16cid:durableId="797142166">
-    <w:abstractNumId w:val="28"/>
+    <w:abstractNumId w:val="29"/>
   </w:num>
   <w:num w:numId="147" w16cid:durableId="542138466">
     <w:abstractNumId w:val="9"/>
   </w:num>
   <w:num w:numId="148" w16cid:durableId="1917398031">
-    <w:abstractNumId w:val="108"/>
+    <w:abstractNumId w:val="111"/>
   </w:num>
   <w:num w:numId="149" w16cid:durableId="524444307">
-    <w:abstractNumId w:val="128"/>
+    <w:abstractNumId w:val="131"/>
   </w:num>
   <w:num w:numId="150" w16cid:durableId="859783391">
-    <w:abstractNumId w:val="136"/>
+    <w:abstractNumId w:val="140"/>
   </w:num>
   <w:num w:numId="151" w16cid:durableId="2097357959">
+    <w:abstractNumId w:val="143"/>
+  </w:num>
+  <w:num w:numId="152" w16cid:durableId="748579603">
+    <w:abstractNumId w:val="149"/>
+  </w:num>
+  <w:num w:numId="153" w16cid:durableId="1193568221">
+    <w:abstractNumId w:val="28"/>
+  </w:num>
+  <w:num w:numId="154" w16cid:durableId="913079688">
+    <w:abstractNumId w:val="107"/>
+  </w:num>
+  <w:num w:numId="155" w16cid:durableId="1216234668">
+    <w:abstractNumId w:val="53"/>
+  </w:num>
+  <w:num w:numId="156" w16cid:durableId="240020660">
     <w:abstractNumId w:val="139"/>
   </w:num>
   <w:numIdMacAtCleanup w:val="45"/>

</xml_diff>

<commit_message>
Content Moderation Workflow (#270)
</commit_message>
<xml_diff>
--- a/Activity Specification Document.docx
+++ b/Activity Specification Document.docx
@@ -4285,8 +4285,656 @@
     </w:p>
     <w:p>
       <w:pPr>
+        <w:pStyle w:val="Heading3"/>
+      </w:pPr>
+      <w:r>
+        <w:lastRenderedPageBreak/>
+        <w:t xml:space="preserve">8- </w:t>
+      </w:r>
+      <w:r>
+        <w:t>Content Moderation Workflow Activity Diagram Documentation</w:t>
+      </w:r>
+    </w:p>
+    <w:p>
+      <w:pPr>
         <w:tabs>
           <w:tab w:val="left" w:pos="3120"/>
+        </w:tabs>
+        <w:rPr>
+          <w:b/>
+          <w:bCs/>
+        </w:rPr>
+      </w:pPr>
+      <w:r>
+        <w:rPr>
+          <w:b/>
+          <w:bCs/>
+        </w:rPr>
+        <w:t>Purpose</w:t>
+      </w:r>
+    </w:p>
+    <w:p>
+      <w:pPr>
+        <w:tabs>
+          <w:tab w:val="left" w:pos="3120"/>
+        </w:tabs>
+      </w:pPr>
+      <w:r>
+        <w:t>The Content Moderation Workflow Activity Diagram provides an illustration of the procedure that the KriGo platform goes through to ensure that any user-generated content that gets published either before or after is moderated properly. The moderation process involves ensuring that all the reviews, comments, and other contributions adhere to the community guidelines of the platform.</w:t>
+      </w:r>
+    </w:p>
+    <w:p>
+      <w:pPr>
+        <w:tabs>
+          <w:tab w:val="left" w:pos="3120"/>
+        </w:tabs>
+        <w:rPr>
+          <w:b/>
+          <w:bCs/>
+        </w:rPr>
+      </w:pPr>
+      <w:r>
+        <w:rPr>
+          <w:b/>
+          <w:bCs/>
+        </w:rPr>
+        <w:t>Workflow Description</w:t>
+      </w:r>
+    </w:p>
+    <w:p>
+      <w:pPr>
+        <w:tabs>
+          <w:tab w:val="left" w:pos="3120"/>
+        </w:tabs>
+      </w:pPr>
+      <w:r>
+        <w:t>The process begins with the customers uploading their content through the KriGo system. The system will begin with validating the uploaded information to ensure all information needed is available and the information is in the correct format. After validation, there will be the moderation process where the system will screen the uploaded content for any language and content policies.</w:t>
+      </w:r>
+    </w:p>
+    <w:p>
+      <w:pPr>
+        <w:tabs>
+          <w:tab w:val="left" w:pos="3120"/>
+        </w:tabs>
+      </w:pPr>
+    </w:p>
+    <w:p>
+      <w:pPr>
+        <w:tabs>
+          <w:tab w:val="left" w:pos="3120"/>
+        </w:tabs>
+      </w:pPr>
+      <w:r>
+        <w:t>If no violation of the policies is detected, then the content is automatically published and a message to this effect is communicated to the customer. However, if the content violates the system’s policy on moderation, then the content will be flagged for further review by the system administrator. The administrator reviews the flagged content to determine if it complies with the moderation policy of the platform. If approved by the administrator, then the content will be published and a message will be sent to the customer indicating successful publication.</w:t>
+      </w:r>
+    </w:p>
+    <w:p>
+      <w:pPr>
+        <w:tabs>
+          <w:tab w:val="left" w:pos="3120"/>
+        </w:tabs>
+        <w:rPr>
+          <w:b/>
+          <w:bCs/>
+        </w:rPr>
+      </w:pPr>
+      <w:r>
+        <w:rPr>
+          <w:b/>
+          <w:bCs/>
+        </w:rPr>
+        <w:t>Main Activities</w:t>
+      </w:r>
+    </w:p>
+    <w:p>
+      <w:pPr>
+        <w:tabs>
+          <w:tab w:val="left" w:pos="3120"/>
+        </w:tabs>
+      </w:pPr>
+      <w:r>
+        <w:t>The Content Moderation Workflow Activity Diagram includes the following primary activities:</w:t>
+      </w:r>
+    </w:p>
+    <w:p>
+      <w:pPr>
+        <w:pStyle w:val="ListParagraph"/>
+        <w:numPr>
+          <w:ilvl w:val="0"/>
+          <w:numId w:val="160"/>
+        </w:numPr>
+        <w:tabs>
+          <w:tab w:val="left" w:pos="3120"/>
+        </w:tabs>
+      </w:pPr>
+      <w:r>
+        <w:t>Submit user-generated content.</w:t>
+      </w:r>
+    </w:p>
+    <w:p>
+      <w:pPr>
+        <w:pStyle w:val="ListParagraph"/>
+        <w:numPr>
+          <w:ilvl w:val="0"/>
+          <w:numId w:val="160"/>
+        </w:numPr>
+        <w:tabs>
+          <w:tab w:val="left" w:pos="3120"/>
+        </w:tabs>
+      </w:pPr>
+      <w:r>
+        <w:t>Validate the submission.</w:t>
+      </w:r>
+    </w:p>
+    <w:p>
+      <w:pPr>
+        <w:pStyle w:val="ListParagraph"/>
+        <w:numPr>
+          <w:ilvl w:val="0"/>
+          <w:numId w:val="160"/>
+        </w:numPr>
+        <w:tabs>
+          <w:tab w:val="left" w:pos="3120"/>
+        </w:tabs>
+      </w:pPr>
+      <w:r>
+        <w:t>Perform automatic content screening.</w:t>
+      </w:r>
+    </w:p>
+    <w:p>
+      <w:pPr>
+        <w:pStyle w:val="ListParagraph"/>
+        <w:numPr>
+          <w:ilvl w:val="0"/>
+          <w:numId w:val="160"/>
+        </w:numPr>
+        <w:tabs>
+          <w:tab w:val="left" w:pos="3120"/>
+        </w:tabs>
+      </w:pPr>
+      <w:r>
+        <w:t>Detect potential policy violations.</w:t>
+      </w:r>
+    </w:p>
+    <w:p>
+      <w:pPr>
+        <w:pStyle w:val="ListParagraph"/>
+        <w:numPr>
+          <w:ilvl w:val="0"/>
+          <w:numId w:val="160"/>
+        </w:numPr>
+        <w:tabs>
+          <w:tab w:val="left" w:pos="3120"/>
+        </w:tabs>
+      </w:pPr>
+      <w:r>
+        <w:t>Flag content for administrator review.</w:t>
+      </w:r>
+    </w:p>
+    <w:p>
+      <w:pPr>
+        <w:pStyle w:val="ListParagraph"/>
+        <w:numPr>
+          <w:ilvl w:val="0"/>
+          <w:numId w:val="160"/>
+        </w:numPr>
+        <w:tabs>
+          <w:tab w:val="left" w:pos="3120"/>
+        </w:tabs>
+      </w:pPr>
+      <w:r>
+        <w:t>Review flagged content.</w:t>
+      </w:r>
+    </w:p>
+    <w:p>
+      <w:pPr>
+        <w:pStyle w:val="ListParagraph"/>
+        <w:numPr>
+          <w:ilvl w:val="0"/>
+          <w:numId w:val="160"/>
+        </w:numPr>
+        <w:tabs>
+          <w:tab w:val="left" w:pos="3120"/>
+        </w:tabs>
+      </w:pPr>
+      <w:r>
+        <w:t>Publish approved content.</w:t>
+      </w:r>
+    </w:p>
+    <w:p>
+      <w:pPr>
+        <w:pStyle w:val="ListParagraph"/>
+        <w:numPr>
+          <w:ilvl w:val="0"/>
+          <w:numId w:val="160"/>
+        </w:numPr>
+        <w:tabs>
+          <w:tab w:val="left" w:pos="3120"/>
+        </w:tabs>
+      </w:pPr>
+      <w:r>
+        <w:t>Reject non-compliant content.</w:t>
+      </w:r>
+    </w:p>
+    <w:p>
+      <w:pPr>
+        <w:pStyle w:val="ListParagraph"/>
+        <w:numPr>
+          <w:ilvl w:val="0"/>
+          <w:numId w:val="160"/>
+        </w:numPr>
+        <w:tabs>
+          <w:tab w:val="left" w:pos="3120"/>
+        </w:tabs>
+      </w:pPr>
+      <w:r>
+        <w:t>Notify the customer of the moderation outcome.</w:t>
+      </w:r>
+    </w:p>
+    <w:p>
+      <w:pPr>
+        <w:tabs>
+          <w:tab w:val="left" w:pos="3120"/>
+        </w:tabs>
+        <w:rPr>
+          <w:b/>
+          <w:bCs/>
+        </w:rPr>
+      </w:pPr>
+      <w:r>
+        <w:rPr>
+          <w:b/>
+          <w:bCs/>
+        </w:rPr>
+        <w:t>Decision Points</w:t>
+      </w:r>
+    </w:p>
+    <w:p>
+      <w:pPr>
+        <w:tabs>
+          <w:tab w:val="left" w:pos="3120"/>
+        </w:tabs>
+      </w:pPr>
+      <w:r>
+        <w:t>The activity diagram contains two primary decision nodes:</w:t>
+      </w:r>
+    </w:p>
+    <w:p>
+      <w:pPr>
+        <w:numPr>
+          <w:ilvl w:val="0"/>
+          <w:numId w:val="158"/>
+        </w:numPr>
+        <w:tabs>
+          <w:tab w:val="left" w:pos="3120"/>
+        </w:tabs>
+      </w:pPr>
+      <w:r>
+        <w:rPr>
+          <w:b/>
+          <w:bCs/>
+        </w:rPr>
+        <w:t>Policy Violation Detected?</w:t>
+      </w:r>
+    </w:p>
+    <w:p>
+      <w:pPr>
+        <w:numPr>
+          <w:ilvl w:val="1"/>
+          <w:numId w:val="158"/>
+        </w:numPr>
+        <w:tabs>
+          <w:tab w:val="left" w:pos="3120"/>
+        </w:tabs>
+        <w:spacing w:after="0"/>
+      </w:pPr>
+      <w:r>
+        <w:t xml:space="preserve">If </w:t>
+      </w:r>
+      <w:r>
+        <w:rPr>
+          <w:b/>
+          <w:bCs/>
+        </w:rPr>
+        <w:t>yes</w:t>
+      </w:r>
+      <w:r>
+        <w:t>, the content is flagged for manual review.</w:t>
+      </w:r>
+    </w:p>
+    <w:p>
+      <w:pPr>
+        <w:numPr>
+          <w:ilvl w:val="1"/>
+          <w:numId w:val="158"/>
+        </w:numPr>
+        <w:tabs>
+          <w:tab w:val="left" w:pos="3120"/>
+        </w:tabs>
+      </w:pPr>
+      <w:r>
+        <w:t xml:space="preserve">If </w:t>
+      </w:r>
+      <w:r>
+        <w:rPr>
+          <w:b/>
+          <w:bCs/>
+        </w:rPr>
+        <w:t>no</w:t>
+      </w:r>
+      <w:r>
+        <w:t>, the content is published immediately.</w:t>
+      </w:r>
+    </w:p>
+    <w:p>
+      <w:pPr>
+        <w:numPr>
+          <w:ilvl w:val="0"/>
+          <w:numId w:val="158"/>
+        </w:numPr>
+        <w:tabs>
+          <w:tab w:val="left" w:pos="3120"/>
+        </w:tabs>
+      </w:pPr>
+      <w:r>
+        <w:rPr>
+          <w:b/>
+          <w:bCs/>
+        </w:rPr>
+        <w:t>Approve Content?</w:t>
+      </w:r>
+    </w:p>
+    <w:p>
+      <w:pPr>
+        <w:numPr>
+          <w:ilvl w:val="1"/>
+          <w:numId w:val="158"/>
+        </w:numPr>
+        <w:tabs>
+          <w:tab w:val="left" w:pos="3120"/>
+        </w:tabs>
+        <w:spacing w:after="0"/>
+      </w:pPr>
+      <w:r>
+        <w:t xml:space="preserve">If </w:t>
+      </w:r>
+      <w:r>
+        <w:rPr>
+          <w:b/>
+          <w:bCs/>
+        </w:rPr>
+        <w:t>yes</w:t>
+      </w:r>
+      <w:r>
+        <w:t>, the content is published.</w:t>
+      </w:r>
+    </w:p>
+    <w:p>
+      <w:pPr>
+        <w:numPr>
+          <w:ilvl w:val="1"/>
+          <w:numId w:val="158"/>
+        </w:numPr>
+        <w:tabs>
+          <w:tab w:val="left" w:pos="3120"/>
+        </w:tabs>
+      </w:pPr>
+      <w:r>
+        <w:t xml:space="preserve">If </w:t>
+      </w:r>
+      <w:r>
+        <w:rPr>
+          <w:b/>
+          <w:bCs/>
+        </w:rPr>
+        <w:t>no</w:t>
+      </w:r>
+      <w:r>
+        <w:t>, the content is rejected and remains unpublished.</w:t>
+      </w:r>
+    </w:p>
+    <w:p>
+      <w:pPr>
+        <w:tabs>
+          <w:tab w:val="left" w:pos="3120"/>
+        </w:tabs>
+      </w:pPr>
+      <w:r>
+        <w:t>These decision points ensure that inappropriate or non-compliant content is prevented from appearing on the platform while allowing legitimate contributions to be published efficiently.</w:t>
+      </w:r>
+    </w:p>
+    <w:p>
+      <w:pPr>
+        <w:tabs>
+          <w:tab w:val="left" w:pos="3120"/>
+        </w:tabs>
+        <w:rPr>
+          <w:b/>
+          <w:bCs/>
+        </w:rPr>
+      </w:pPr>
+      <w:r>
+        <w:rPr>
+          <w:b/>
+          <w:bCs/>
+        </w:rPr>
+        <w:lastRenderedPageBreak/>
+        <w:t>Alternative Flows</w:t>
+      </w:r>
+    </w:p>
+    <w:p>
+      <w:pPr>
+        <w:tabs>
+          <w:tab w:val="left" w:pos="3120"/>
+        </w:tabs>
+      </w:pPr>
+      <w:r>
+        <w:t>The Content Moderation Workflow Activity Diagram incorporates several alternative scenarios:</w:t>
+      </w:r>
+    </w:p>
+    <w:p>
+      <w:pPr>
+        <w:pStyle w:val="ListParagraph"/>
+        <w:numPr>
+          <w:ilvl w:val="0"/>
+          <w:numId w:val="161"/>
+        </w:numPr>
+        <w:tabs>
+          <w:tab w:val="left" w:pos="3120"/>
+        </w:tabs>
+      </w:pPr>
+      <w:r>
+        <w:t>Automatic approval and publication of compliant content.</w:t>
+      </w:r>
+    </w:p>
+    <w:p>
+      <w:pPr>
+        <w:pStyle w:val="ListParagraph"/>
+        <w:numPr>
+          <w:ilvl w:val="0"/>
+          <w:numId w:val="161"/>
+        </w:numPr>
+        <w:tabs>
+          <w:tab w:val="left" w:pos="3120"/>
+        </w:tabs>
+      </w:pPr>
+      <w:r>
+        <w:t>Automatic detection of suspected policy violations.</w:t>
+      </w:r>
+    </w:p>
+    <w:p>
+      <w:pPr>
+        <w:pStyle w:val="ListParagraph"/>
+        <w:numPr>
+          <w:ilvl w:val="0"/>
+          <w:numId w:val="161"/>
+        </w:numPr>
+        <w:tabs>
+          <w:tab w:val="left" w:pos="3120"/>
+        </w:tabs>
+      </w:pPr>
+      <w:r>
+        <w:t>Manual approval of flagged content after administrator review.</w:t>
+      </w:r>
+    </w:p>
+    <w:p>
+      <w:pPr>
+        <w:pStyle w:val="ListParagraph"/>
+        <w:numPr>
+          <w:ilvl w:val="0"/>
+          <w:numId w:val="161"/>
+        </w:numPr>
+        <w:tabs>
+          <w:tab w:val="left" w:pos="3120"/>
+        </w:tabs>
+      </w:pPr>
+      <w:r>
+        <w:t>Rejection of content that violates platform policies.</w:t>
+      </w:r>
+    </w:p>
+    <w:p>
+      <w:pPr>
+        <w:tabs>
+          <w:tab w:val="left" w:pos="3120"/>
+        </w:tabs>
+      </w:pPr>
+      <w:r>
+        <w:t>These alternative paths provide a balanced moderation process that combines automation for efficiency with human oversight for accurate decision-making.</w:t>
+      </w:r>
+    </w:p>
+    <w:p>
+      <w:pPr>
+        <w:tabs>
+          <w:tab w:val="left" w:pos="3120"/>
+        </w:tabs>
+        <w:rPr>
+          <w:b/>
+          <w:bCs/>
+        </w:rPr>
+      </w:pPr>
+      <w:r>
+        <w:rPr>
+          <w:b/>
+          <w:bCs/>
+        </w:rPr>
+        <w:t>Conclusion</w:t>
+      </w:r>
+    </w:p>
+    <w:p>
+      <w:pPr>
+        <w:tabs>
+          <w:tab w:val="left" w:pos="3120"/>
+        </w:tabs>
+      </w:pPr>
+      <w:r>
+        <w:t>The Activity Diagram on Content Moderation Workflow provides a detailed representation of the entire moderation process that is inherent to the KriGo system. This diagram describes the steps of actions, automatic validation checks, review by the administrators, and decision-making required for ensuring a safe and trusted space for the user-generated content.</w:t>
+      </w:r>
+    </w:p>
+    <w:p>
+      <w:pPr>
+        <w:keepNext/>
+        <w:tabs>
+          <w:tab w:val="left" w:pos="3120"/>
+        </w:tabs>
+      </w:pPr>
+      <w:r>
+        <w:rPr>
+          <w:noProof/>
+        </w:rPr>
+        <w:drawing>
+          <wp:inline distT="0" distB="0" distL="0" distR="0" wp14:anchorId="6001FCC6" wp14:editId="49E923C1">
+            <wp:extent cx="5941695" cy="5300980"/>
+            <wp:effectExtent l="0" t="0" r="1905" b="0"/>
+            <wp:docPr id="1932221446" name="Picture 15"/>
+            <wp:cNvGraphicFramePr>
+              <a:graphicFrameLocks xmlns:a="http://schemas.openxmlformats.org/drawingml/2006/main" noChangeAspect="1"/>
+            </wp:cNvGraphicFramePr>
+            <a:graphic xmlns:a="http://schemas.openxmlformats.org/drawingml/2006/main">
+              <a:graphicData uri="http://schemas.openxmlformats.org/drawingml/2006/picture">
+                <pic:pic xmlns:pic="http://schemas.openxmlformats.org/drawingml/2006/picture">
+                  <pic:nvPicPr>
+                    <pic:cNvPr id="0" name="Picture 15"/>
+                    <pic:cNvPicPr>
+                      <a:picLocks noChangeAspect="1" noChangeArrowheads="1"/>
+                    </pic:cNvPicPr>
+                  </pic:nvPicPr>
+                  <pic:blipFill>
+                    <a:blip r:embed="rId15">
+                      <a:extLst>
+                        <a:ext uri="{28A0092B-C50C-407E-A947-70E740481C1C}">
+                          <a14:useLocalDpi xmlns:a14="http://schemas.microsoft.com/office/drawing/2010/main" val="0"/>
+                        </a:ext>
+                      </a:extLst>
+                    </a:blip>
+                    <a:srcRect/>
+                    <a:stretch>
+                      <a:fillRect/>
+                    </a:stretch>
+                  </pic:blipFill>
+                  <pic:spPr bwMode="auto">
+                    <a:xfrm>
+                      <a:off x="0" y="0"/>
+                      <a:ext cx="5941695" cy="5300980"/>
+                    </a:xfrm>
+                    <a:prstGeom prst="rect">
+                      <a:avLst/>
+                    </a:prstGeom>
+                    <a:noFill/>
+                    <a:ln>
+                      <a:noFill/>
+                    </a:ln>
+                  </pic:spPr>
+                </pic:pic>
+              </a:graphicData>
+            </a:graphic>
+          </wp:inline>
+        </w:drawing>
+      </w:r>
+    </w:p>
+    <w:p>
+      <w:pPr>
+        <w:pStyle w:val="Caption"/>
+      </w:pPr>
+      <w:r>
+        <w:t xml:space="preserve">Figure </w:t>
+      </w:r>
+      <w:r>
+        <w:fldChar w:fldCharType="begin"/>
+      </w:r>
+      <w:r>
+        <w:instrText xml:space="preserve"> SEQ Figure \* ARABIC </w:instrText>
+      </w:r>
+      <w:r>
+        <w:fldChar w:fldCharType="separate"/>
+      </w:r>
+      <w:r>
+        <w:rPr>
+          <w:noProof/>
+        </w:rPr>
+        <w:t>8</w:t>
+      </w:r>
+      <w:r>
+        <w:fldChar w:fldCharType="end"/>
+      </w:r>
+      <w:r>
+        <w:t xml:space="preserve"> - </w:t>
+      </w:r>
+      <w:r>
+        <w:t>Content Moderation Workflow Activity Diagram</w:t>
+      </w:r>
+    </w:p>
+    <w:p>
+      <w:pPr>
+        <w:spacing w:line="278" w:lineRule="auto"/>
+      </w:pPr>
+      <w:r>
+        <w:br w:type="page"/>
+      </w:r>
+    </w:p>
+    <w:p>
+      <w:pPr>
+        <w:tabs>
+          <w:tab w:val="left" w:pos="2880"/>
         </w:tabs>
       </w:pPr>
     </w:p>
@@ -4877,6 +5525,155 @@
     </w:lvl>
   </w:abstractNum>
   <w:abstractNum w:abstractNumId="4" w15:restartNumberingAfterBreak="0">
+    <w:nsid w:val="02AD60EC"/>
+    <w:multiLevelType w:val="multilevel"/>
+    <w:tmpl w:val="FC6C73B0"/>
+    <w:lvl w:ilvl="0">
+      <w:start w:val="1"/>
+      <w:numFmt w:val="bullet"/>
+      <w:lvlText w:val=""/>
+      <w:lvlJc w:val="left"/>
+      <w:pPr>
+        <w:tabs>
+          <w:tab w:val="num" w:pos="720"/>
+        </w:tabs>
+        <w:ind w:left="720" w:hanging="360"/>
+      </w:pPr>
+      <w:rPr>
+        <w:rFonts w:ascii="Symbol" w:hAnsi="Symbol" w:hint="default"/>
+        <w:sz w:val="20"/>
+      </w:rPr>
+    </w:lvl>
+    <w:lvl w:ilvl="1" w:tentative="1">
+      <w:start w:val="1"/>
+      <w:numFmt w:val="bullet"/>
+      <w:lvlText w:val="o"/>
+      <w:lvlJc w:val="left"/>
+      <w:pPr>
+        <w:tabs>
+          <w:tab w:val="num" w:pos="1440"/>
+        </w:tabs>
+        <w:ind w:left="1440" w:hanging="360"/>
+      </w:pPr>
+      <w:rPr>
+        <w:rFonts w:ascii="Courier New" w:hAnsi="Courier New" w:hint="default"/>
+        <w:sz w:val="20"/>
+      </w:rPr>
+    </w:lvl>
+    <w:lvl w:ilvl="2" w:tentative="1">
+      <w:start w:val="1"/>
+      <w:numFmt w:val="bullet"/>
+      <w:lvlText w:val=""/>
+      <w:lvlJc w:val="left"/>
+      <w:pPr>
+        <w:tabs>
+          <w:tab w:val="num" w:pos="2160"/>
+        </w:tabs>
+        <w:ind w:left="2160" w:hanging="360"/>
+      </w:pPr>
+      <w:rPr>
+        <w:rFonts w:ascii="Wingdings" w:hAnsi="Wingdings" w:hint="default"/>
+        <w:sz w:val="20"/>
+      </w:rPr>
+    </w:lvl>
+    <w:lvl w:ilvl="3" w:tentative="1">
+      <w:start w:val="1"/>
+      <w:numFmt w:val="bullet"/>
+      <w:lvlText w:val=""/>
+      <w:lvlJc w:val="left"/>
+      <w:pPr>
+        <w:tabs>
+          <w:tab w:val="num" w:pos="2880"/>
+        </w:tabs>
+        <w:ind w:left="2880" w:hanging="360"/>
+      </w:pPr>
+      <w:rPr>
+        <w:rFonts w:ascii="Wingdings" w:hAnsi="Wingdings" w:hint="default"/>
+        <w:sz w:val="20"/>
+      </w:rPr>
+    </w:lvl>
+    <w:lvl w:ilvl="4" w:tentative="1">
+      <w:start w:val="1"/>
+      <w:numFmt w:val="bullet"/>
+      <w:lvlText w:val=""/>
+      <w:lvlJc w:val="left"/>
+      <w:pPr>
+        <w:tabs>
+          <w:tab w:val="num" w:pos="3600"/>
+        </w:tabs>
+        <w:ind w:left="3600" w:hanging="360"/>
+      </w:pPr>
+      <w:rPr>
+        <w:rFonts w:ascii="Wingdings" w:hAnsi="Wingdings" w:hint="default"/>
+        <w:sz w:val="20"/>
+      </w:rPr>
+    </w:lvl>
+    <w:lvl w:ilvl="5" w:tentative="1">
+      <w:start w:val="1"/>
+      <w:numFmt w:val="bullet"/>
+      <w:lvlText w:val=""/>
+      <w:lvlJc w:val="left"/>
+      <w:pPr>
+        <w:tabs>
+          <w:tab w:val="num" w:pos="4320"/>
+        </w:tabs>
+        <w:ind w:left="4320" w:hanging="360"/>
+      </w:pPr>
+      <w:rPr>
+        <w:rFonts w:ascii="Wingdings" w:hAnsi="Wingdings" w:hint="default"/>
+        <w:sz w:val="20"/>
+      </w:rPr>
+    </w:lvl>
+    <w:lvl w:ilvl="6" w:tentative="1">
+      <w:start w:val="1"/>
+      <w:numFmt w:val="bullet"/>
+      <w:lvlText w:val=""/>
+      <w:lvlJc w:val="left"/>
+      <w:pPr>
+        <w:tabs>
+          <w:tab w:val="num" w:pos="5040"/>
+        </w:tabs>
+        <w:ind w:left="5040" w:hanging="360"/>
+      </w:pPr>
+      <w:rPr>
+        <w:rFonts w:ascii="Wingdings" w:hAnsi="Wingdings" w:hint="default"/>
+        <w:sz w:val="20"/>
+      </w:rPr>
+    </w:lvl>
+    <w:lvl w:ilvl="7" w:tentative="1">
+      <w:start w:val="1"/>
+      <w:numFmt w:val="bullet"/>
+      <w:lvlText w:val=""/>
+      <w:lvlJc w:val="left"/>
+      <w:pPr>
+        <w:tabs>
+          <w:tab w:val="num" w:pos="5760"/>
+        </w:tabs>
+        <w:ind w:left="5760" w:hanging="360"/>
+      </w:pPr>
+      <w:rPr>
+        <w:rFonts w:ascii="Wingdings" w:hAnsi="Wingdings" w:hint="default"/>
+        <w:sz w:val="20"/>
+      </w:rPr>
+    </w:lvl>
+    <w:lvl w:ilvl="8" w:tentative="1">
+      <w:start w:val="1"/>
+      <w:numFmt w:val="bullet"/>
+      <w:lvlText w:val=""/>
+      <w:lvlJc w:val="left"/>
+      <w:pPr>
+        <w:tabs>
+          <w:tab w:val="num" w:pos="6480"/>
+        </w:tabs>
+        <w:ind w:left="6480" w:hanging="360"/>
+      </w:pPr>
+      <w:rPr>
+        <w:rFonts w:ascii="Wingdings" w:hAnsi="Wingdings" w:hint="default"/>
+        <w:sz w:val="20"/>
+      </w:rPr>
+    </w:lvl>
+  </w:abstractNum>
+  <w:abstractNum w:abstractNumId="5" w15:restartNumberingAfterBreak="0">
     <w:nsid w:val="02D96F98"/>
     <w:multiLevelType w:val="hybridMultilevel"/>
     <w:tmpl w:val="C7E88CC4"/>
@@ -4989,7 +5786,7 @@
       </w:rPr>
     </w:lvl>
   </w:abstractNum>
-  <w:abstractNum w:abstractNumId="5" w15:restartNumberingAfterBreak="0">
+  <w:abstractNum w:abstractNumId="6" w15:restartNumberingAfterBreak="0">
     <w:nsid w:val="038C4B22"/>
     <w:multiLevelType w:val="hybridMultilevel"/>
     <w:tmpl w:val="390E2614"/>
@@ -5102,7 +5899,7 @@
       </w:rPr>
     </w:lvl>
   </w:abstractNum>
-  <w:abstractNum w:abstractNumId="6" w15:restartNumberingAfterBreak="0">
+  <w:abstractNum w:abstractNumId="7" w15:restartNumberingAfterBreak="0">
     <w:nsid w:val="03B57922"/>
     <w:multiLevelType w:val="hybridMultilevel"/>
     <w:tmpl w:val="C1E03AA8"/>
@@ -5215,7 +6012,7 @@
       </w:rPr>
     </w:lvl>
   </w:abstractNum>
-  <w:abstractNum w:abstractNumId="7" w15:restartNumberingAfterBreak="0">
+  <w:abstractNum w:abstractNumId="8" w15:restartNumberingAfterBreak="0">
     <w:nsid w:val="04351CD0"/>
     <w:multiLevelType w:val="hybridMultilevel"/>
     <w:tmpl w:val="4748F3C4"/>
@@ -5328,7 +6125,7 @@
       </w:rPr>
     </w:lvl>
   </w:abstractNum>
-  <w:abstractNum w:abstractNumId="8" w15:restartNumberingAfterBreak="0">
+  <w:abstractNum w:abstractNumId="9" w15:restartNumberingAfterBreak="0">
     <w:nsid w:val="0444578B"/>
     <w:multiLevelType w:val="multilevel"/>
     <w:tmpl w:val="6B840BA4"/>
@@ -5477,7 +6274,7 @@
       </w:rPr>
     </w:lvl>
   </w:abstractNum>
-  <w:abstractNum w:abstractNumId="9" w15:restartNumberingAfterBreak="0">
+  <w:abstractNum w:abstractNumId="10" w15:restartNumberingAfterBreak="0">
     <w:nsid w:val="052F1ED8"/>
     <w:multiLevelType w:val="multilevel"/>
     <w:tmpl w:val="01961300"/>
@@ -5626,7 +6423,7 @@
       </w:rPr>
     </w:lvl>
   </w:abstractNum>
-  <w:abstractNum w:abstractNumId="10" w15:restartNumberingAfterBreak="0">
+  <w:abstractNum w:abstractNumId="11" w15:restartNumberingAfterBreak="0">
     <w:nsid w:val="053B666F"/>
     <w:multiLevelType w:val="multilevel"/>
     <w:tmpl w:val="E1BC67F6"/>
@@ -5775,7 +6572,7 @@
       </w:rPr>
     </w:lvl>
   </w:abstractNum>
-  <w:abstractNum w:abstractNumId="11" w15:restartNumberingAfterBreak="0">
+  <w:abstractNum w:abstractNumId="12" w15:restartNumberingAfterBreak="0">
     <w:nsid w:val="06FA4547"/>
     <w:multiLevelType w:val="hybridMultilevel"/>
     <w:tmpl w:val="DA825754"/>
@@ -5888,7 +6685,7 @@
       </w:rPr>
     </w:lvl>
   </w:abstractNum>
-  <w:abstractNum w:abstractNumId="12" w15:restartNumberingAfterBreak="0">
+  <w:abstractNum w:abstractNumId="13" w15:restartNumberingAfterBreak="0">
     <w:nsid w:val="0717208B"/>
     <w:multiLevelType w:val="hybridMultilevel"/>
     <w:tmpl w:val="5866C9A8"/>
@@ -6001,7 +6798,7 @@
       </w:rPr>
     </w:lvl>
   </w:abstractNum>
-  <w:abstractNum w:abstractNumId="13" w15:restartNumberingAfterBreak="0">
+  <w:abstractNum w:abstractNumId="14" w15:restartNumberingAfterBreak="0">
     <w:nsid w:val="08BB19BF"/>
     <w:multiLevelType w:val="multilevel"/>
     <w:tmpl w:val="C5807BB2"/>
@@ -6150,7 +6947,7 @@
       </w:rPr>
     </w:lvl>
   </w:abstractNum>
-  <w:abstractNum w:abstractNumId="14" w15:restartNumberingAfterBreak="0">
+  <w:abstractNum w:abstractNumId="15" w15:restartNumberingAfterBreak="0">
     <w:nsid w:val="08D32D08"/>
     <w:multiLevelType w:val="multilevel"/>
     <w:tmpl w:val="A32449CA"/>
@@ -6299,7 +7096,7 @@
       </w:rPr>
     </w:lvl>
   </w:abstractNum>
-  <w:abstractNum w:abstractNumId="15" w15:restartNumberingAfterBreak="0">
+  <w:abstractNum w:abstractNumId="16" w15:restartNumberingAfterBreak="0">
     <w:nsid w:val="09E84C0F"/>
     <w:multiLevelType w:val="hybridMultilevel"/>
     <w:tmpl w:val="3754EFAC"/>
@@ -6412,7 +7209,7 @@
       </w:rPr>
     </w:lvl>
   </w:abstractNum>
-  <w:abstractNum w:abstractNumId="16" w15:restartNumberingAfterBreak="0">
+  <w:abstractNum w:abstractNumId="17" w15:restartNumberingAfterBreak="0">
     <w:nsid w:val="0AE82489"/>
     <w:multiLevelType w:val="multilevel"/>
     <w:tmpl w:val="B82C10D4"/>
@@ -6561,7 +7358,7 @@
       </w:rPr>
     </w:lvl>
   </w:abstractNum>
-  <w:abstractNum w:abstractNumId="17" w15:restartNumberingAfterBreak="0">
+  <w:abstractNum w:abstractNumId="18" w15:restartNumberingAfterBreak="0">
     <w:nsid w:val="0CC17936"/>
     <w:multiLevelType w:val="multilevel"/>
     <w:tmpl w:val="B5E0C4F8"/>
@@ -6710,7 +7507,7 @@
       </w:rPr>
     </w:lvl>
   </w:abstractNum>
-  <w:abstractNum w:abstractNumId="18" w15:restartNumberingAfterBreak="0">
+  <w:abstractNum w:abstractNumId="19" w15:restartNumberingAfterBreak="0">
     <w:nsid w:val="0D367329"/>
     <w:multiLevelType w:val="multilevel"/>
     <w:tmpl w:val="66064F64"/>
@@ -6859,7 +7656,7 @@
       </w:rPr>
     </w:lvl>
   </w:abstractNum>
-  <w:abstractNum w:abstractNumId="19" w15:restartNumberingAfterBreak="0">
+  <w:abstractNum w:abstractNumId="20" w15:restartNumberingAfterBreak="0">
     <w:nsid w:val="0E1040E2"/>
     <w:multiLevelType w:val="multilevel"/>
     <w:tmpl w:val="607CCC88"/>
@@ -7008,7 +7805,7 @@
       </w:rPr>
     </w:lvl>
   </w:abstractNum>
-  <w:abstractNum w:abstractNumId="20" w15:restartNumberingAfterBreak="0">
+  <w:abstractNum w:abstractNumId="21" w15:restartNumberingAfterBreak="0">
     <w:nsid w:val="0E2561E7"/>
     <w:multiLevelType w:val="hybridMultilevel"/>
     <w:tmpl w:val="2A6E4870"/>
@@ -7121,7 +7918,7 @@
       </w:rPr>
     </w:lvl>
   </w:abstractNum>
-  <w:abstractNum w:abstractNumId="21" w15:restartNumberingAfterBreak="0">
+  <w:abstractNum w:abstractNumId="22" w15:restartNumberingAfterBreak="0">
     <w:nsid w:val="0E841C27"/>
     <w:multiLevelType w:val="hybridMultilevel"/>
     <w:tmpl w:val="789C7F32"/>
@@ -7234,7 +8031,7 @@
       </w:rPr>
     </w:lvl>
   </w:abstractNum>
-  <w:abstractNum w:abstractNumId="22" w15:restartNumberingAfterBreak="0">
+  <w:abstractNum w:abstractNumId="23" w15:restartNumberingAfterBreak="0">
     <w:nsid w:val="0FAA2602"/>
     <w:multiLevelType w:val="hybridMultilevel"/>
     <w:tmpl w:val="C6C63128"/>
@@ -7347,7 +8144,7 @@
       </w:rPr>
     </w:lvl>
   </w:abstractNum>
-  <w:abstractNum w:abstractNumId="23" w15:restartNumberingAfterBreak="0">
+  <w:abstractNum w:abstractNumId="24" w15:restartNumberingAfterBreak="0">
     <w:nsid w:val="122550ED"/>
     <w:multiLevelType w:val="hybridMultilevel"/>
     <w:tmpl w:val="91ACE480"/>
@@ -7460,7 +8257,7 @@
       </w:rPr>
     </w:lvl>
   </w:abstractNum>
-  <w:abstractNum w:abstractNumId="24" w15:restartNumberingAfterBreak="0">
+  <w:abstractNum w:abstractNumId="25" w15:restartNumberingAfterBreak="0">
     <w:nsid w:val="124C1BAE"/>
     <w:multiLevelType w:val="hybridMultilevel"/>
     <w:tmpl w:val="04988FC0"/>
@@ -7573,7 +8370,7 @@
       </w:rPr>
     </w:lvl>
   </w:abstractNum>
-  <w:abstractNum w:abstractNumId="25" w15:restartNumberingAfterBreak="0">
+  <w:abstractNum w:abstractNumId="26" w15:restartNumberingAfterBreak="0">
     <w:nsid w:val="139F7557"/>
     <w:multiLevelType w:val="multilevel"/>
     <w:tmpl w:val="A984C1D4"/>
@@ -7722,7 +8519,7 @@
       </w:rPr>
     </w:lvl>
   </w:abstractNum>
-  <w:abstractNum w:abstractNumId="26" w15:restartNumberingAfterBreak="0">
+  <w:abstractNum w:abstractNumId="27" w15:restartNumberingAfterBreak="0">
     <w:nsid w:val="13A13D09"/>
     <w:multiLevelType w:val="multilevel"/>
     <w:tmpl w:val="92067DCC"/>
@@ -7871,7 +8668,7 @@
       </w:rPr>
     </w:lvl>
   </w:abstractNum>
-  <w:abstractNum w:abstractNumId="27" w15:restartNumberingAfterBreak="0">
+  <w:abstractNum w:abstractNumId="28" w15:restartNumberingAfterBreak="0">
     <w:nsid w:val="14DC6E23"/>
     <w:multiLevelType w:val="hybridMultilevel"/>
     <w:tmpl w:val="2ACC2CF2"/>
@@ -7984,7 +8781,7 @@
       </w:rPr>
     </w:lvl>
   </w:abstractNum>
-  <w:abstractNum w:abstractNumId="28" w15:restartNumberingAfterBreak="0">
+  <w:abstractNum w:abstractNumId="29" w15:restartNumberingAfterBreak="0">
     <w:nsid w:val="15313512"/>
     <w:multiLevelType w:val="multilevel"/>
     <w:tmpl w:val="3D18208A"/>
@@ -8133,7 +8930,7 @@
       </w:rPr>
     </w:lvl>
   </w:abstractNum>
-  <w:abstractNum w:abstractNumId="29" w15:restartNumberingAfterBreak="0">
+  <w:abstractNum w:abstractNumId="30" w15:restartNumberingAfterBreak="0">
     <w:nsid w:val="161C5709"/>
     <w:multiLevelType w:val="hybridMultilevel"/>
     <w:tmpl w:val="F06CE1E0"/>
@@ -8246,7 +9043,7 @@
       </w:rPr>
     </w:lvl>
   </w:abstractNum>
-  <w:abstractNum w:abstractNumId="30" w15:restartNumberingAfterBreak="0">
+  <w:abstractNum w:abstractNumId="31" w15:restartNumberingAfterBreak="0">
     <w:nsid w:val="16D400B4"/>
     <w:multiLevelType w:val="hybridMultilevel"/>
     <w:tmpl w:val="58E6DFBE"/>
@@ -8359,7 +9156,7 @@
       </w:rPr>
     </w:lvl>
   </w:abstractNum>
-  <w:abstractNum w:abstractNumId="31" w15:restartNumberingAfterBreak="0">
+  <w:abstractNum w:abstractNumId="32" w15:restartNumberingAfterBreak="0">
     <w:nsid w:val="17236012"/>
     <w:multiLevelType w:val="hybridMultilevel"/>
     <w:tmpl w:val="DAFA46C8"/>
@@ -8472,7 +9269,7 @@
       </w:rPr>
     </w:lvl>
   </w:abstractNum>
-  <w:abstractNum w:abstractNumId="32" w15:restartNumberingAfterBreak="0">
+  <w:abstractNum w:abstractNumId="33" w15:restartNumberingAfterBreak="0">
     <w:nsid w:val="172B04C0"/>
     <w:multiLevelType w:val="hybridMultilevel"/>
     <w:tmpl w:val="B6C41D5E"/>
@@ -8585,7 +9382,7 @@
       </w:rPr>
     </w:lvl>
   </w:abstractNum>
-  <w:abstractNum w:abstractNumId="33" w15:restartNumberingAfterBreak="0">
+  <w:abstractNum w:abstractNumId="34" w15:restartNumberingAfterBreak="0">
     <w:nsid w:val="17485CCB"/>
     <w:multiLevelType w:val="multilevel"/>
     <w:tmpl w:val="397E1AE0"/>
@@ -8734,7 +9531,7 @@
       </w:rPr>
     </w:lvl>
   </w:abstractNum>
-  <w:abstractNum w:abstractNumId="34" w15:restartNumberingAfterBreak="0">
+  <w:abstractNum w:abstractNumId="35" w15:restartNumberingAfterBreak="0">
     <w:nsid w:val="17763D31"/>
     <w:multiLevelType w:val="hybridMultilevel"/>
     <w:tmpl w:val="6CE63304"/>
@@ -8847,7 +9644,7 @@
       </w:rPr>
     </w:lvl>
   </w:abstractNum>
-  <w:abstractNum w:abstractNumId="35" w15:restartNumberingAfterBreak="0">
+  <w:abstractNum w:abstractNumId="36" w15:restartNumberingAfterBreak="0">
     <w:nsid w:val="17A835CF"/>
     <w:multiLevelType w:val="multilevel"/>
     <w:tmpl w:val="0C988B24"/>
@@ -8996,7 +9793,7 @@
       </w:rPr>
     </w:lvl>
   </w:abstractNum>
-  <w:abstractNum w:abstractNumId="36" w15:restartNumberingAfterBreak="0">
+  <w:abstractNum w:abstractNumId="37" w15:restartNumberingAfterBreak="0">
     <w:nsid w:val="17B06937"/>
     <w:multiLevelType w:val="hybridMultilevel"/>
     <w:tmpl w:val="71089CF2"/>
@@ -9109,7 +9906,7 @@
       </w:rPr>
     </w:lvl>
   </w:abstractNum>
-  <w:abstractNum w:abstractNumId="37" w15:restartNumberingAfterBreak="0">
+  <w:abstractNum w:abstractNumId="38" w15:restartNumberingAfterBreak="0">
     <w:nsid w:val="18FD59FB"/>
     <w:multiLevelType w:val="multilevel"/>
     <w:tmpl w:val="942CD1D2"/>
@@ -9258,7 +10055,7 @@
       </w:rPr>
     </w:lvl>
   </w:abstractNum>
-  <w:abstractNum w:abstractNumId="38" w15:restartNumberingAfterBreak="0">
+  <w:abstractNum w:abstractNumId="39" w15:restartNumberingAfterBreak="0">
     <w:nsid w:val="190F0390"/>
     <w:multiLevelType w:val="multilevel"/>
     <w:tmpl w:val="CBE4A4A4"/>
@@ -9407,7 +10204,7 @@
       </w:rPr>
     </w:lvl>
   </w:abstractNum>
-  <w:abstractNum w:abstractNumId="39" w15:restartNumberingAfterBreak="0">
+  <w:abstractNum w:abstractNumId="40" w15:restartNumberingAfterBreak="0">
     <w:nsid w:val="195875B0"/>
     <w:multiLevelType w:val="multilevel"/>
     <w:tmpl w:val="615444D4"/>
@@ -9520,7 +10317,7 @@
       </w:pPr>
     </w:lvl>
   </w:abstractNum>
-  <w:abstractNum w:abstractNumId="40" w15:restartNumberingAfterBreak="0">
+  <w:abstractNum w:abstractNumId="41" w15:restartNumberingAfterBreak="0">
     <w:nsid w:val="197C6FD7"/>
     <w:multiLevelType w:val="hybridMultilevel"/>
     <w:tmpl w:val="D97CEAA8"/>
@@ -9633,7 +10430,7 @@
       </w:rPr>
     </w:lvl>
   </w:abstractNum>
-  <w:abstractNum w:abstractNumId="41" w15:restartNumberingAfterBreak="0">
+  <w:abstractNum w:abstractNumId="42" w15:restartNumberingAfterBreak="0">
     <w:nsid w:val="1CC60A94"/>
     <w:multiLevelType w:val="multilevel"/>
     <w:tmpl w:val="EB74741C"/>
@@ -9782,7 +10579,156 @@
       </w:rPr>
     </w:lvl>
   </w:abstractNum>
-  <w:abstractNum w:abstractNumId="42" w15:restartNumberingAfterBreak="0">
+  <w:abstractNum w:abstractNumId="43" w15:restartNumberingAfterBreak="0">
+    <w:nsid w:val="1E497DC6"/>
+    <w:multiLevelType w:val="multilevel"/>
+    <w:tmpl w:val="B7C826A4"/>
+    <w:lvl w:ilvl="0">
+      <w:start w:val="1"/>
+      <w:numFmt w:val="bullet"/>
+      <w:lvlText w:val=""/>
+      <w:lvlJc w:val="left"/>
+      <w:pPr>
+        <w:tabs>
+          <w:tab w:val="num" w:pos="720"/>
+        </w:tabs>
+        <w:ind w:left="720" w:hanging="360"/>
+      </w:pPr>
+      <w:rPr>
+        <w:rFonts w:ascii="Symbol" w:hAnsi="Symbol" w:hint="default"/>
+        <w:sz w:val="20"/>
+      </w:rPr>
+    </w:lvl>
+    <w:lvl w:ilvl="1" w:tentative="1">
+      <w:start w:val="1"/>
+      <w:numFmt w:val="bullet"/>
+      <w:lvlText w:val="o"/>
+      <w:lvlJc w:val="left"/>
+      <w:pPr>
+        <w:tabs>
+          <w:tab w:val="num" w:pos="1440"/>
+        </w:tabs>
+        <w:ind w:left="1440" w:hanging="360"/>
+      </w:pPr>
+      <w:rPr>
+        <w:rFonts w:ascii="Courier New" w:hAnsi="Courier New" w:hint="default"/>
+        <w:sz w:val="20"/>
+      </w:rPr>
+    </w:lvl>
+    <w:lvl w:ilvl="2" w:tentative="1">
+      <w:start w:val="1"/>
+      <w:numFmt w:val="bullet"/>
+      <w:lvlText w:val=""/>
+      <w:lvlJc w:val="left"/>
+      <w:pPr>
+        <w:tabs>
+          <w:tab w:val="num" w:pos="2160"/>
+        </w:tabs>
+        <w:ind w:left="2160" w:hanging="360"/>
+      </w:pPr>
+      <w:rPr>
+        <w:rFonts w:ascii="Wingdings" w:hAnsi="Wingdings" w:hint="default"/>
+        <w:sz w:val="20"/>
+      </w:rPr>
+    </w:lvl>
+    <w:lvl w:ilvl="3" w:tentative="1">
+      <w:start w:val="1"/>
+      <w:numFmt w:val="bullet"/>
+      <w:lvlText w:val=""/>
+      <w:lvlJc w:val="left"/>
+      <w:pPr>
+        <w:tabs>
+          <w:tab w:val="num" w:pos="2880"/>
+        </w:tabs>
+        <w:ind w:left="2880" w:hanging="360"/>
+      </w:pPr>
+      <w:rPr>
+        <w:rFonts w:ascii="Wingdings" w:hAnsi="Wingdings" w:hint="default"/>
+        <w:sz w:val="20"/>
+      </w:rPr>
+    </w:lvl>
+    <w:lvl w:ilvl="4" w:tentative="1">
+      <w:start w:val="1"/>
+      <w:numFmt w:val="bullet"/>
+      <w:lvlText w:val=""/>
+      <w:lvlJc w:val="left"/>
+      <w:pPr>
+        <w:tabs>
+          <w:tab w:val="num" w:pos="3600"/>
+        </w:tabs>
+        <w:ind w:left="3600" w:hanging="360"/>
+      </w:pPr>
+      <w:rPr>
+        <w:rFonts w:ascii="Wingdings" w:hAnsi="Wingdings" w:hint="default"/>
+        <w:sz w:val="20"/>
+      </w:rPr>
+    </w:lvl>
+    <w:lvl w:ilvl="5" w:tentative="1">
+      <w:start w:val="1"/>
+      <w:numFmt w:val="bullet"/>
+      <w:lvlText w:val=""/>
+      <w:lvlJc w:val="left"/>
+      <w:pPr>
+        <w:tabs>
+          <w:tab w:val="num" w:pos="4320"/>
+        </w:tabs>
+        <w:ind w:left="4320" w:hanging="360"/>
+      </w:pPr>
+      <w:rPr>
+        <w:rFonts w:ascii="Wingdings" w:hAnsi="Wingdings" w:hint="default"/>
+        <w:sz w:val="20"/>
+      </w:rPr>
+    </w:lvl>
+    <w:lvl w:ilvl="6" w:tentative="1">
+      <w:start w:val="1"/>
+      <w:numFmt w:val="bullet"/>
+      <w:lvlText w:val=""/>
+      <w:lvlJc w:val="left"/>
+      <w:pPr>
+        <w:tabs>
+          <w:tab w:val="num" w:pos="5040"/>
+        </w:tabs>
+        <w:ind w:left="5040" w:hanging="360"/>
+      </w:pPr>
+      <w:rPr>
+        <w:rFonts w:ascii="Wingdings" w:hAnsi="Wingdings" w:hint="default"/>
+        <w:sz w:val="20"/>
+      </w:rPr>
+    </w:lvl>
+    <w:lvl w:ilvl="7" w:tentative="1">
+      <w:start w:val="1"/>
+      <w:numFmt w:val="bullet"/>
+      <w:lvlText w:val=""/>
+      <w:lvlJc w:val="left"/>
+      <w:pPr>
+        <w:tabs>
+          <w:tab w:val="num" w:pos="5760"/>
+        </w:tabs>
+        <w:ind w:left="5760" w:hanging="360"/>
+      </w:pPr>
+      <w:rPr>
+        <w:rFonts w:ascii="Wingdings" w:hAnsi="Wingdings" w:hint="default"/>
+        <w:sz w:val="20"/>
+      </w:rPr>
+    </w:lvl>
+    <w:lvl w:ilvl="8" w:tentative="1">
+      <w:start w:val="1"/>
+      <w:numFmt w:val="bullet"/>
+      <w:lvlText w:val=""/>
+      <w:lvlJc w:val="left"/>
+      <w:pPr>
+        <w:tabs>
+          <w:tab w:val="num" w:pos="6480"/>
+        </w:tabs>
+        <w:ind w:left="6480" w:hanging="360"/>
+      </w:pPr>
+      <w:rPr>
+        <w:rFonts w:ascii="Wingdings" w:hAnsi="Wingdings" w:hint="default"/>
+        <w:sz w:val="20"/>
+      </w:rPr>
+    </w:lvl>
+  </w:abstractNum>
+  <w:abstractNum w:abstractNumId="44" w15:restartNumberingAfterBreak="0">
     <w:nsid w:val="1E6658CF"/>
     <w:multiLevelType w:val="multilevel"/>
     <w:tmpl w:val="762ABC5E"/>
@@ -9931,7 +10877,7 @@
       </w:rPr>
     </w:lvl>
   </w:abstractNum>
-  <w:abstractNum w:abstractNumId="43" w15:restartNumberingAfterBreak="0">
+  <w:abstractNum w:abstractNumId="45" w15:restartNumberingAfterBreak="0">
     <w:nsid w:val="1FA532B0"/>
     <w:multiLevelType w:val="multilevel"/>
     <w:tmpl w:val="8718294C"/>
@@ -10080,7 +11026,7 @@
       </w:rPr>
     </w:lvl>
   </w:abstractNum>
-  <w:abstractNum w:abstractNumId="44" w15:restartNumberingAfterBreak="0">
+  <w:abstractNum w:abstractNumId="46" w15:restartNumberingAfterBreak="0">
     <w:nsid w:val="215C77FD"/>
     <w:multiLevelType w:val="hybridMultilevel"/>
     <w:tmpl w:val="58F41D10"/>
@@ -10169,7 +11115,7 @@
       </w:pPr>
     </w:lvl>
   </w:abstractNum>
-  <w:abstractNum w:abstractNumId="45" w15:restartNumberingAfterBreak="0">
+  <w:abstractNum w:abstractNumId="47" w15:restartNumberingAfterBreak="0">
     <w:nsid w:val="218D5909"/>
     <w:multiLevelType w:val="hybridMultilevel"/>
     <w:tmpl w:val="CC989EE4"/>
@@ -10282,7 +11228,7 @@
       </w:rPr>
     </w:lvl>
   </w:abstractNum>
-  <w:abstractNum w:abstractNumId="46" w15:restartNumberingAfterBreak="0">
+  <w:abstractNum w:abstractNumId="48" w15:restartNumberingAfterBreak="0">
     <w:nsid w:val="23E010BA"/>
     <w:multiLevelType w:val="multilevel"/>
     <w:tmpl w:val="4A16907E"/>
@@ -10431,7 +11377,156 @@
       </w:rPr>
     </w:lvl>
   </w:abstractNum>
-  <w:abstractNum w:abstractNumId="47" w15:restartNumberingAfterBreak="0">
+  <w:abstractNum w:abstractNumId="49" w15:restartNumberingAfterBreak="0">
+    <w:nsid w:val="24116768"/>
+    <w:multiLevelType w:val="multilevel"/>
+    <w:tmpl w:val="9028B3D2"/>
+    <w:lvl w:ilvl="0">
+      <w:start w:val="1"/>
+      <w:numFmt w:val="bullet"/>
+      <w:lvlText w:val=""/>
+      <w:lvlJc w:val="left"/>
+      <w:pPr>
+        <w:tabs>
+          <w:tab w:val="num" w:pos="720"/>
+        </w:tabs>
+        <w:ind w:left="720" w:hanging="360"/>
+      </w:pPr>
+      <w:rPr>
+        <w:rFonts w:ascii="Symbol" w:hAnsi="Symbol" w:hint="default"/>
+        <w:sz w:val="20"/>
+      </w:rPr>
+    </w:lvl>
+    <w:lvl w:ilvl="1">
+      <w:start w:val="1"/>
+      <w:numFmt w:val="bullet"/>
+      <w:lvlText w:val="o"/>
+      <w:lvlJc w:val="left"/>
+      <w:pPr>
+        <w:tabs>
+          <w:tab w:val="num" w:pos="1440"/>
+        </w:tabs>
+        <w:ind w:left="1440" w:hanging="360"/>
+      </w:pPr>
+      <w:rPr>
+        <w:rFonts w:ascii="Courier New" w:hAnsi="Courier New" w:hint="default"/>
+        <w:sz w:val="20"/>
+      </w:rPr>
+    </w:lvl>
+    <w:lvl w:ilvl="2" w:tentative="1">
+      <w:start w:val="1"/>
+      <w:numFmt w:val="bullet"/>
+      <w:lvlText w:val=""/>
+      <w:lvlJc w:val="left"/>
+      <w:pPr>
+        <w:tabs>
+          <w:tab w:val="num" w:pos="2160"/>
+        </w:tabs>
+        <w:ind w:left="2160" w:hanging="360"/>
+      </w:pPr>
+      <w:rPr>
+        <w:rFonts w:ascii="Wingdings" w:hAnsi="Wingdings" w:hint="default"/>
+        <w:sz w:val="20"/>
+      </w:rPr>
+    </w:lvl>
+    <w:lvl w:ilvl="3" w:tentative="1">
+      <w:start w:val="1"/>
+      <w:numFmt w:val="bullet"/>
+      <w:lvlText w:val=""/>
+      <w:lvlJc w:val="left"/>
+      <w:pPr>
+        <w:tabs>
+          <w:tab w:val="num" w:pos="2880"/>
+        </w:tabs>
+        <w:ind w:left="2880" w:hanging="360"/>
+      </w:pPr>
+      <w:rPr>
+        <w:rFonts w:ascii="Wingdings" w:hAnsi="Wingdings" w:hint="default"/>
+        <w:sz w:val="20"/>
+      </w:rPr>
+    </w:lvl>
+    <w:lvl w:ilvl="4" w:tentative="1">
+      <w:start w:val="1"/>
+      <w:numFmt w:val="bullet"/>
+      <w:lvlText w:val=""/>
+      <w:lvlJc w:val="left"/>
+      <w:pPr>
+        <w:tabs>
+          <w:tab w:val="num" w:pos="3600"/>
+        </w:tabs>
+        <w:ind w:left="3600" w:hanging="360"/>
+      </w:pPr>
+      <w:rPr>
+        <w:rFonts w:ascii="Wingdings" w:hAnsi="Wingdings" w:hint="default"/>
+        <w:sz w:val="20"/>
+      </w:rPr>
+    </w:lvl>
+    <w:lvl w:ilvl="5" w:tentative="1">
+      <w:start w:val="1"/>
+      <w:numFmt w:val="bullet"/>
+      <w:lvlText w:val=""/>
+      <w:lvlJc w:val="left"/>
+      <w:pPr>
+        <w:tabs>
+          <w:tab w:val="num" w:pos="4320"/>
+        </w:tabs>
+        <w:ind w:left="4320" w:hanging="360"/>
+      </w:pPr>
+      <w:rPr>
+        <w:rFonts w:ascii="Wingdings" w:hAnsi="Wingdings" w:hint="default"/>
+        <w:sz w:val="20"/>
+      </w:rPr>
+    </w:lvl>
+    <w:lvl w:ilvl="6" w:tentative="1">
+      <w:start w:val="1"/>
+      <w:numFmt w:val="bullet"/>
+      <w:lvlText w:val=""/>
+      <w:lvlJc w:val="left"/>
+      <w:pPr>
+        <w:tabs>
+          <w:tab w:val="num" w:pos="5040"/>
+        </w:tabs>
+        <w:ind w:left="5040" w:hanging="360"/>
+      </w:pPr>
+      <w:rPr>
+        <w:rFonts w:ascii="Wingdings" w:hAnsi="Wingdings" w:hint="default"/>
+        <w:sz w:val="20"/>
+      </w:rPr>
+    </w:lvl>
+    <w:lvl w:ilvl="7" w:tentative="1">
+      <w:start w:val="1"/>
+      <w:numFmt w:val="bullet"/>
+      <w:lvlText w:val=""/>
+      <w:lvlJc w:val="left"/>
+      <w:pPr>
+        <w:tabs>
+          <w:tab w:val="num" w:pos="5760"/>
+        </w:tabs>
+        <w:ind w:left="5760" w:hanging="360"/>
+      </w:pPr>
+      <w:rPr>
+        <w:rFonts w:ascii="Wingdings" w:hAnsi="Wingdings" w:hint="default"/>
+        <w:sz w:val="20"/>
+      </w:rPr>
+    </w:lvl>
+    <w:lvl w:ilvl="8" w:tentative="1">
+      <w:start w:val="1"/>
+      <w:numFmt w:val="bullet"/>
+      <w:lvlText w:val=""/>
+      <w:lvlJc w:val="left"/>
+      <w:pPr>
+        <w:tabs>
+          <w:tab w:val="num" w:pos="6480"/>
+        </w:tabs>
+        <w:ind w:left="6480" w:hanging="360"/>
+      </w:pPr>
+      <w:rPr>
+        <w:rFonts w:ascii="Wingdings" w:hAnsi="Wingdings" w:hint="default"/>
+        <w:sz w:val="20"/>
+      </w:rPr>
+    </w:lvl>
+  </w:abstractNum>
+  <w:abstractNum w:abstractNumId="50" w15:restartNumberingAfterBreak="0">
     <w:nsid w:val="2470127A"/>
     <w:multiLevelType w:val="multilevel"/>
     <w:tmpl w:val="309E9618"/>
@@ -10580,7 +11675,7 @@
       </w:rPr>
     </w:lvl>
   </w:abstractNum>
-  <w:abstractNum w:abstractNumId="48" w15:restartNumberingAfterBreak="0">
+  <w:abstractNum w:abstractNumId="51" w15:restartNumberingAfterBreak="0">
     <w:nsid w:val="24796798"/>
     <w:multiLevelType w:val="hybridMultilevel"/>
     <w:tmpl w:val="6622BEDC"/>
@@ -10669,7 +11764,7 @@
       </w:pPr>
     </w:lvl>
   </w:abstractNum>
-  <w:abstractNum w:abstractNumId="49" w15:restartNumberingAfterBreak="0">
+  <w:abstractNum w:abstractNumId="52" w15:restartNumberingAfterBreak="0">
     <w:nsid w:val="253B76EC"/>
     <w:multiLevelType w:val="multilevel"/>
     <w:tmpl w:val="2AA67CDA"/>
@@ -10818,7 +11913,7 @@
       </w:rPr>
     </w:lvl>
   </w:abstractNum>
-  <w:abstractNum w:abstractNumId="50" w15:restartNumberingAfterBreak="0">
+  <w:abstractNum w:abstractNumId="53" w15:restartNumberingAfterBreak="0">
     <w:nsid w:val="2D0F5EA7"/>
     <w:multiLevelType w:val="hybridMultilevel"/>
     <w:tmpl w:val="F68ABCD6"/>
@@ -10931,7 +12026,7 @@
       </w:rPr>
     </w:lvl>
   </w:abstractNum>
-  <w:abstractNum w:abstractNumId="51" w15:restartNumberingAfterBreak="0">
+  <w:abstractNum w:abstractNumId="54" w15:restartNumberingAfterBreak="0">
     <w:nsid w:val="2E4D738C"/>
     <w:multiLevelType w:val="multilevel"/>
     <w:tmpl w:val="1540BBA2"/>
@@ -11080,7 +12175,7 @@
       </w:rPr>
     </w:lvl>
   </w:abstractNum>
-  <w:abstractNum w:abstractNumId="52" w15:restartNumberingAfterBreak="0">
+  <w:abstractNum w:abstractNumId="55" w15:restartNumberingAfterBreak="0">
     <w:nsid w:val="2F0041C7"/>
     <w:multiLevelType w:val="multilevel"/>
     <w:tmpl w:val="656414FE"/>
@@ -11229,7 +12324,7 @@
       </w:rPr>
     </w:lvl>
   </w:abstractNum>
-  <w:abstractNum w:abstractNumId="53" w15:restartNumberingAfterBreak="0">
+  <w:abstractNum w:abstractNumId="56" w15:restartNumberingAfterBreak="0">
     <w:nsid w:val="2FAF0538"/>
     <w:multiLevelType w:val="hybridMultilevel"/>
     <w:tmpl w:val="EB1AC18C"/>
@@ -11342,7 +12437,7 @@
       </w:rPr>
     </w:lvl>
   </w:abstractNum>
-  <w:abstractNum w:abstractNumId="54" w15:restartNumberingAfterBreak="0">
+  <w:abstractNum w:abstractNumId="57" w15:restartNumberingAfterBreak="0">
     <w:nsid w:val="304F01FA"/>
     <w:multiLevelType w:val="multilevel"/>
     <w:tmpl w:val="151C4EC6"/>
@@ -11491,7 +12586,7 @@
       </w:rPr>
     </w:lvl>
   </w:abstractNum>
-  <w:abstractNum w:abstractNumId="55" w15:restartNumberingAfterBreak="0">
+  <w:abstractNum w:abstractNumId="58" w15:restartNumberingAfterBreak="0">
     <w:nsid w:val="30BD025D"/>
     <w:multiLevelType w:val="hybridMultilevel"/>
     <w:tmpl w:val="04381C82"/>
@@ -11580,7 +12675,7 @@
       </w:pPr>
     </w:lvl>
   </w:abstractNum>
-  <w:abstractNum w:abstractNumId="56" w15:restartNumberingAfterBreak="0">
+  <w:abstractNum w:abstractNumId="59" w15:restartNumberingAfterBreak="0">
     <w:nsid w:val="327C0BA6"/>
     <w:multiLevelType w:val="hybridMultilevel"/>
     <w:tmpl w:val="2A9047EE"/>
@@ -11693,7 +12788,7 @@
       </w:rPr>
     </w:lvl>
   </w:abstractNum>
-  <w:abstractNum w:abstractNumId="57" w15:restartNumberingAfterBreak="0">
+  <w:abstractNum w:abstractNumId="60" w15:restartNumberingAfterBreak="0">
     <w:nsid w:val="338D63E8"/>
     <w:multiLevelType w:val="hybridMultilevel"/>
     <w:tmpl w:val="28D0FB50"/>
@@ -11806,7 +12901,7 @@
       </w:rPr>
     </w:lvl>
   </w:abstractNum>
-  <w:abstractNum w:abstractNumId="58" w15:restartNumberingAfterBreak="0">
+  <w:abstractNum w:abstractNumId="61" w15:restartNumberingAfterBreak="0">
     <w:nsid w:val="34182771"/>
     <w:multiLevelType w:val="multilevel"/>
     <w:tmpl w:val="2AA67CDA"/>
@@ -11955,7 +13050,7 @@
       </w:rPr>
     </w:lvl>
   </w:abstractNum>
-  <w:abstractNum w:abstractNumId="59" w15:restartNumberingAfterBreak="0">
+  <w:abstractNum w:abstractNumId="62" w15:restartNumberingAfterBreak="0">
     <w:nsid w:val="35413E58"/>
     <w:multiLevelType w:val="hybridMultilevel"/>
     <w:tmpl w:val="03C64164"/>
@@ -12068,7 +13163,7 @@
       </w:rPr>
     </w:lvl>
   </w:abstractNum>
-  <w:abstractNum w:abstractNumId="60" w15:restartNumberingAfterBreak="0">
+  <w:abstractNum w:abstractNumId="63" w15:restartNumberingAfterBreak="0">
     <w:nsid w:val="35C86AF0"/>
     <w:multiLevelType w:val="multilevel"/>
     <w:tmpl w:val="8202FCD6"/>
@@ -12217,7 +13312,7 @@
       </w:rPr>
     </w:lvl>
   </w:abstractNum>
-  <w:abstractNum w:abstractNumId="61" w15:restartNumberingAfterBreak="0">
+  <w:abstractNum w:abstractNumId="64" w15:restartNumberingAfterBreak="0">
     <w:nsid w:val="3623194A"/>
     <w:multiLevelType w:val="multilevel"/>
     <w:tmpl w:val="63F4E6F0"/>
@@ -12366,7 +13461,7 @@
       </w:rPr>
     </w:lvl>
   </w:abstractNum>
-  <w:abstractNum w:abstractNumId="62" w15:restartNumberingAfterBreak="0">
+  <w:abstractNum w:abstractNumId="65" w15:restartNumberingAfterBreak="0">
     <w:nsid w:val="36E36979"/>
     <w:multiLevelType w:val="multilevel"/>
     <w:tmpl w:val="3D58C93A"/>
@@ -12515,7 +13610,7 @@
       </w:rPr>
     </w:lvl>
   </w:abstractNum>
-  <w:abstractNum w:abstractNumId="63" w15:restartNumberingAfterBreak="0">
+  <w:abstractNum w:abstractNumId="66" w15:restartNumberingAfterBreak="0">
     <w:nsid w:val="37B424C3"/>
     <w:multiLevelType w:val="hybridMultilevel"/>
     <w:tmpl w:val="18F030D4"/>
@@ -12628,7 +13723,7 @@
       </w:rPr>
     </w:lvl>
   </w:abstractNum>
-  <w:abstractNum w:abstractNumId="64" w15:restartNumberingAfterBreak="0">
+  <w:abstractNum w:abstractNumId="67" w15:restartNumberingAfterBreak="0">
     <w:nsid w:val="39FC34BD"/>
     <w:multiLevelType w:val="hybridMultilevel"/>
     <w:tmpl w:val="D0D4E132"/>
@@ -12741,7 +13836,7 @@
       </w:rPr>
     </w:lvl>
   </w:abstractNum>
-  <w:abstractNum w:abstractNumId="65" w15:restartNumberingAfterBreak="0">
+  <w:abstractNum w:abstractNumId="68" w15:restartNumberingAfterBreak="0">
     <w:nsid w:val="3BC10D30"/>
     <w:multiLevelType w:val="multilevel"/>
     <w:tmpl w:val="502AD78C"/>
@@ -12890,7 +13985,7 @@
       </w:rPr>
     </w:lvl>
   </w:abstractNum>
-  <w:abstractNum w:abstractNumId="66" w15:restartNumberingAfterBreak="0">
+  <w:abstractNum w:abstractNumId="69" w15:restartNumberingAfterBreak="0">
     <w:nsid w:val="3C276BB8"/>
     <w:multiLevelType w:val="multilevel"/>
     <w:tmpl w:val="2AA67CDA"/>
@@ -13039,7 +14134,7 @@
       </w:rPr>
     </w:lvl>
   </w:abstractNum>
-  <w:abstractNum w:abstractNumId="67" w15:restartNumberingAfterBreak="0">
+  <w:abstractNum w:abstractNumId="70" w15:restartNumberingAfterBreak="0">
     <w:nsid w:val="3C596808"/>
     <w:multiLevelType w:val="multilevel"/>
     <w:tmpl w:val="2AA67CDA"/>
@@ -13188,7 +14283,7 @@
       </w:rPr>
     </w:lvl>
   </w:abstractNum>
-  <w:abstractNum w:abstractNumId="68" w15:restartNumberingAfterBreak="0">
+  <w:abstractNum w:abstractNumId="71" w15:restartNumberingAfterBreak="0">
     <w:nsid w:val="3CBF280A"/>
     <w:multiLevelType w:val="multilevel"/>
     <w:tmpl w:val="A13E4362"/>
@@ -13337,7 +14432,7 @@
       </w:rPr>
     </w:lvl>
   </w:abstractNum>
-  <w:abstractNum w:abstractNumId="69" w15:restartNumberingAfterBreak="0">
+  <w:abstractNum w:abstractNumId="72" w15:restartNumberingAfterBreak="0">
     <w:nsid w:val="3CC7541B"/>
     <w:multiLevelType w:val="multilevel"/>
     <w:tmpl w:val="2AA67CDA"/>
@@ -13486,7 +14581,7 @@
       </w:rPr>
     </w:lvl>
   </w:abstractNum>
-  <w:abstractNum w:abstractNumId="70" w15:restartNumberingAfterBreak="0">
+  <w:abstractNum w:abstractNumId="73" w15:restartNumberingAfterBreak="0">
     <w:nsid w:val="3F5E3BA1"/>
     <w:multiLevelType w:val="multilevel"/>
     <w:tmpl w:val="2AA67CDA"/>
@@ -13635,7 +14730,7 @@
       </w:rPr>
     </w:lvl>
   </w:abstractNum>
-  <w:abstractNum w:abstractNumId="71" w15:restartNumberingAfterBreak="0">
+  <w:abstractNum w:abstractNumId="74" w15:restartNumberingAfterBreak="0">
     <w:nsid w:val="40431B1C"/>
     <w:multiLevelType w:val="multilevel"/>
     <w:tmpl w:val="5D8E77D0"/>
@@ -13784,7 +14879,7 @@
       </w:rPr>
     </w:lvl>
   </w:abstractNum>
-  <w:abstractNum w:abstractNumId="72" w15:restartNumberingAfterBreak="0">
+  <w:abstractNum w:abstractNumId="75" w15:restartNumberingAfterBreak="0">
     <w:nsid w:val="419E0199"/>
     <w:multiLevelType w:val="multilevel"/>
     <w:tmpl w:val="D6CA9606"/>
@@ -13933,7 +15028,7 @@
       </w:rPr>
     </w:lvl>
   </w:abstractNum>
-  <w:abstractNum w:abstractNumId="73" w15:restartNumberingAfterBreak="0">
+  <w:abstractNum w:abstractNumId="76" w15:restartNumberingAfterBreak="0">
     <w:nsid w:val="452F60FB"/>
     <w:multiLevelType w:val="hybridMultilevel"/>
     <w:tmpl w:val="892A990A"/>
@@ -14046,7 +15141,7 @@
       </w:rPr>
     </w:lvl>
   </w:abstractNum>
-  <w:abstractNum w:abstractNumId="74" w15:restartNumberingAfterBreak="0">
+  <w:abstractNum w:abstractNumId="77" w15:restartNumberingAfterBreak="0">
     <w:nsid w:val="47B65409"/>
     <w:multiLevelType w:val="multilevel"/>
     <w:tmpl w:val="2AA67CDA"/>
@@ -14195,7 +15290,7 @@
       </w:rPr>
     </w:lvl>
   </w:abstractNum>
-  <w:abstractNum w:abstractNumId="75" w15:restartNumberingAfterBreak="0">
+  <w:abstractNum w:abstractNumId="78" w15:restartNumberingAfterBreak="0">
     <w:nsid w:val="47BF2170"/>
     <w:multiLevelType w:val="multilevel"/>
     <w:tmpl w:val="D9681266"/>
@@ -14344,7 +15439,7 @@
       </w:rPr>
     </w:lvl>
   </w:abstractNum>
-  <w:abstractNum w:abstractNumId="76" w15:restartNumberingAfterBreak="0">
+  <w:abstractNum w:abstractNumId="79" w15:restartNumberingAfterBreak="0">
     <w:nsid w:val="47E5592F"/>
     <w:multiLevelType w:val="hybridMultilevel"/>
     <w:tmpl w:val="719AB9FA"/>
@@ -14457,7 +15552,7 @@
       </w:rPr>
     </w:lvl>
   </w:abstractNum>
-  <w:abstractNum w:abstractNumId="77" w15:restartNumberingAfterBreak="0">
+  <w:abstractNum w:abstractNumId="80" w15:restartNumberingAfterBreak="0">
     <w:nsid w:val="48C041A9"/>
     <w:multiLevelType w:val="multilevel"/>
     <w:tmpl w:val="59A694BC"/>
@@ -14606,7 +15701,7 @@
       </w:rPr>
     </w:lvl>
   </w:abstractNum>
-  <w:abstractNum w:abstractNumId="78" w15:restartNumberingAfterBreak="0">
+  <w:abstractNum w:abstractNumId="81" w15:restartNumberingAfterBreak="0">
     <w:nsid w:val="49D6568A"/>
     <w:multiLevelType w:val="multilevel"/>
     <w:tmpl w:val="559E29EC"/>
@@ -14755,7 +15850,7 @@
       </w:rPr>
     </w:lvl>
   </w:abstractNum>
-  <w:abstractNum w:abstractNumId="79" w15:restartNumberingAfterBreak="0">
+  <w:abstractNum w:abstractNumId="82" w15:restartNumberingAfterBreak="0">
     <w:nsid w:val="4A7C2BC0"/>
     <w:multiLevelType w:val="hybridMultilevel"/>
     <w:tmpl w:val="4E4ADB18"/>
@@ -14868,7 +15963,7 @@
       </w:rPr>
     </w:lvl>
   </w:abstractNum>
-  <w:abstractNum w:abstractNumId="80" w15:restartNumberingAfterBreak="0">
+  <w:abstractNum w:abstractNumId="83" w15:restartNumberingAfterBreak="0">
     <w:nsid w:val="4AF73293"/>
     <w:multiLevelType w:val="hybridMultilevel"/>
     <w:tmpl w:val="F2962738"/>
@@ -14981,7 +16076,7 @@
       </w:rPr>
     </w:lvl>
   </w:abstractNum>
-  <w:abstractNum w:abstractNumId="81" w15:restartNumberingAfterBreak="0">
+  <w:abstractNum w:abstractNumId="84" w15:restartNumberingAfterBreak="0">
     <w:nsid w:val="4B375248"/>
     <w:multiLevelType w:val="multilevel"/>
     <w:tmpl w:val="B574C1C6"/>
@@ -15130,7 +16225,7 @@
       </w:rPr>
     </w:lvl>
   </w:abstractNum>
-  <w:abstractNum w:abstractNumId="82" w15:restartNumberingAfterBreak="0">
+  <w:abstractNum w:abstractNumId="85" w15:restartNumberingAfterBreak="0">
     <w:nsid w:val="4BA13766"/>
     <w:multiLevelType w:val="multilevel"/>
     <w:tmpl w:val="63F4E6F0"/>
@@ -15279,7 +16374,7 @@
       </w:rPr>
     </w:lvl>
   </w:abstractNum>
-  <w:abstractNum w:abstractNumId="83" w15:restartNumberingAfterBreak="0">
+  <w:abstractNum w:abstractNumId="86" w15:restartNumberingAfterBreak="0">
     <w:nsid w:val="4BA25441"/>
     <w:multiLevelType w:val="hybridMultilevel"/>
     <w:tmpl w:val="217E2E96"/>
@@ -15392,7 +16487,120 @@
       </w:rPr>
     </w:lvl>
   </w:abstractNum>
-  <w:abstractNum w:abstractNumId="84" w15:restartNumberingAfterBreak="0">
+  <w:abstractNum w:abstractNumId="87" w15:restartNumberingAfterBreak="0">
+    <w:nsid w:val="4BDF79AF"/>
+    <w:multiLevelType w:val="hybridMultilevel"/>
+    <w:tmpl w:val="09F0B06C"/>
+    <w:lvl w:ilvl="0" w:tplc="04090005">
+      <w:start w:val="1"/>
+      <w:numFmt w:val="bullet"/>
+      <w:lvlText w:val=""/>
+      <w:lvlJc w:val="left"/>
+      <w:pPr>
+        <w:ind w:left="1080" w:hanging="360"/>
+      </w:pPr>
+      <w:rPr>
+        <w:rFonts w:ascii="Wingdings" w:hAnsi="Wingdings" w:hint="default"/>
+      </w:rPr>
+    </w:lvl>
+    <w:lvl w:ilvl="1" w:tplc="04090003" w:tentative="1">
+      <w:start w:val="1"/>
+      <w:numFmt w:val="bullet"/>
+      <w:lvlText w:val="o"/>
+      <w:lvlJc w:val="left"/>
+      <w:pPr>
+        <w:ind w:left="1800" w:hanging="360"/>
+      </w:pPr>
+      <w:rPr>
+        <w:rFonts w:ascii="Courier New" w:hAnsi="Courier New" w:cs="Courier New" w:hint="default"/>
+      </w:rPr>
+    </w:lvl>
+    <w:lvl w:ilvl="2" w:tplc="04090005" w:tentative="1">
+      <w:start w:val="1"/>
+      <w:numFmt w:val="bullet"/>
+      <w:lvlText w:val=""/>
+      <w:lvlJc w:val="left"/>
+      <w:pPr>
+        <w:ind w:left="2520" w:hanging="360"/>
+      </w:pPr>
+      <w:rPr>
+        <w:rFonts w:ascii="Wingdings" w:hAnsi="Wingdings" w:hint="default"/>
+      </w:rPr>
+    </w:lvl>
+    <w:lvl w:ilvl="3" w:tplc="04090001" w:tentative="1">
+      <w:start w:val="1"/>
+      <w:numFmt w:val="bullet"/>
+      <w:lvlText w:val=""/>
+      <w:lvlJc w:val="left"/>
+      <w:pPr>
+        <w:ind w:left="3240" w:hanging="360"/>
+      </w:pPr>
+      <w:rPr>
+        <w:rFonts w:ascii="Symbol" w:hAnsi="Symbol" w:hint="default"/>
+      </w:rPr>
+    </w:lvl>
+    <w:lvl w:ilvl="4" w:tplc="04090003" w:tentative="1">
+      <w:start w:val="1"/>
+      <w:numFmt w:val="bullet"/>
+      <w:lvlText w:val="o"/>
+      <w:lvlJc w:val="left"/>
+      <w:pPr>
+        <w:ind w:left="3960" w:hanging="360"/>
+      </w:pPr>
+      <w:rPr>
+        <w:rFonts w:ascii="Courier New" w:hAnsi="Courier New" w:cs="Courier New" w:hint="default"/>
+      </w:rPr>
+    </w:lvl>
+    <w:lvl w:ilvl="5" w:tplc="04090005" w:tentative="1">
+      <w:start w:val="1"/>
+      <w:numFmt w:val="bullet"/>
+      <w:lvlText w:val=""/>
+      <w:lvlJc w:val="left"/>
+      <w:pPr>
+        <w:ind w:left="4680" w:hanging="360"/>
+      </w:pPr>
+      <w:rPr>
+        <w:rFonts w:ascii="Wingdings" w:hAnsi="Wingdings" w:hint="default"/>
+      </w:rPr>
+    </w:lvl>
+    <w:lvl w:ilvl="6" w:tplc="04090001" w:tentative="1">
+      <w:start w:val="1"/>
+      <w:numFmt w:val="bullet"/>
+      <w:lvlText w:val=""/>
+      <w:lvlJc w:val="left"/>
+      <w:pPr>
+        <w:ind w:left="5400" w:hanging="360"/>
+      </w:pPr>
+      <w:rPr>
+        <w:rFonts w:ascii="Symbol" w:hAnsi="Symbol" w:hint="default"/>
+      </w:rPr>
+    </w:lvl>
+    <w:lvl w:ilvl="7" w:tplc="04090003" w:tentative="1">
+      <w:start w:val="1"/>
+      <w:numFmt w:val="bullet"/>
+      <w:lvlText w:val="o"/>
+      <w:lvlJc w:val="left"/>
+      <w:pPr>
+        <w:ind w:left="6120" w:hanging="360"/>
+      </w:pPr>
+      <w:rPr>
+        <w:rFonts w:ascii="Courier New" w:hAnsi="Courier New" w:cs="Courier New" w:hint="default"/>
+      </w:rPr>
+    </w:lvl>
+    <w:lvl w:ilvl="8" w:tplc="04090005" w:tentative="1">
+      <w:start w:val="1"/>
+      <w:numFmt w:val="bullet"/>
+      <w:lvlText w:val=""/>
+      <w:lvlJc w:val="left"/>
+      <w:pPr>
+        <w:ind w:left="6840" w:hanging="360"/>
+      </w:pPr>
+      <w:rPr>
+        <w:rFonts w:ascii="Wingdings" w:hAnsi="Wingdings" w:hint="default"/>
+      </w:rPr>
+    </w:lvl>
+  </w:abstractNum>
+  <w:abstractNum w:abstractNumId="88" w15:restartNumberingAfterBreak="0">
     <w:nsid w:val="4E276DCB"/>
     <w:multiLevelType w:val="hybridMultilevel"/>
     <w:tmpl w:val="B7C469B4"/>
@@ -15505,7 +16713,7 @@
       </w:rPr>
     </w:lvl>
   </w:abstractNum>
-  <w:abstractNum w:abstractNumId="85" w15:restartNumberingAfterBreak="0">
+  <w:abstractNum w:abstractNumId="89" w15:restartNumberingAfterBreak="0">
     <w:nsid w:val="4F053929"/>
     <w:multiLevelType w:val="hybridMultilevel"/>
     <w:tmpl w:val="2A78C678"/>
@@ -15618,7 +16826,7 @@
       </w:rPr>
     </w:lvl>
   </w:abstractNum>
-  <w:abstractNum w:abstractNumId="86" w15:restartNumberingAfterBreak="0">
+  <w:abstractNum w:abstractNumId="90" w15:restartNumberingAfterBreak="0">
     <w:nsid w:val="4F750073"/>
     <w:multiLevelType w:val="hybridMultilevel"/>
     <w:tmpl w:val="EC7AB8FC"/>
@@ -15731,7 +16939,7 @@
       </w:rPr>
     </w:lvl>
   </w:abstractNum>
-  <w:abstractNum w:abstractNumId="87" w15:restartNumberingAfterBreak="0">
+  <w:abstractNum w:abstractNumId="91" w15:restartNumberingAfterBreak="0">
     <w:nsid w:val="4FFB237E"/>
     <w:multiLevelType w:val="multilevel"/>
     <w:tmpl w:val="2AA67CDA"/>
@@ -15880,7 +17088,7 @@
       </w:rPr>
     </w:lvl>
   </w:abstractNum>
-  <w:abstractNum w:abstractNumId="88" w15:restartNumberingAfterBreak="0">
+  <w:abstractNum w:abstractNumId="92" w15:restartNumberingAfterBreak="0">
     <w:nsid w:val="51737FE0"/>
     <w:multiLevelType w:val="hybridMultilevel"/>
     <w:tmpl w:val="2B0604E6"/>
@@ -15993,7 +17201,7 @@
       </w:rPr>
     </w:lvl>
   </w:abstractNum>
-  <w:abstractNum w:abstractNumId="89" w15:restartNumberingAfterBreak="0">
+  <w:abstractNum w:abstractNumId="93" w15:restartNumberingAfterBreak="0">
     <w:nsid w:val="518B1885"/>
     <w:multiLevelType w:val="multilevel"/>
     <w:tmpl w:val="AE1AAC28"/>
@@ -16142,7 +17350,7 @@
       </w:rPr>
     </w:lvl>
   </w:abstractNum>
-  <w:abstractNum w:abstractNumId="90" w15:restartNumberingAfterBreak="0">
+  <w:abstractNum w:abstractNumId="94" w15:restartNumberingAfterBreak="0">
     <w:nsid w:val="51A86EF8"/>
     <w:multiLevelType w:val="multilevel"/>
     <w:tmpl w:val="FF2841D4"/>
@@ -16291,7 +17499,7 @@
       </w:rPr>
     </w:lvl>
   </w:abstractNum>
-  <w:abstractNum w:abstractNumId="91" w15:restartNumberingAfterBreak="0">
+  <w:abstractNum w:abstractNumId="95" w15:restartNumberingAfterBreak="0">
     <w:nsid w:val="51AB55CC"/>
     <w:multiLevelType w:val="multilevel"/>
     <w:tmpl w:val="5986D838"/>
@@ -16440,7 +17648,7 @@
       </w:rPr>
     </w:lvl>
   </w:abstractNum>
-  <w:abstractNum w:abstractNumId="92" w15:restartNumberingAfterBreak="0">
+  <w:abstractNum w:abstractNumId="96" w15:restartNumberingAfterBreak="0">
     <w:nsid w:val="521378FF"/>
     <w:multiLevelType w:val="multilevel"/>
     <w:tmpl w:val="7B002268"/>
@@ -16589,7 +17797,7 @@
       </w:rPr>
     </w:lvl>
   </w:abstractNum>
-  <w:abstractNum w:abstractNumId="93" w15:restartNumberingAfterBreak="0">
+  <w:abstractNum w:abstractNumId="97" w15:restartNumberingAfterBreak="0">
     <w:nsid w:val="521F2792"/>
     <w:multiLevelType w:val="multilevel"/>
     <w:tmpl w:val="9FB45386"/>
@@ -16738,7 +17946,7 @@
       </w:rPr>
     </w:lvl>
   </w:abstractNum>
-  <w:abstractNum w:abstractNumId="94" w15:restartNumberingAfterBreak="0">
+  <w:abstractNum w:abstractNumId="98" w15:restartNumberingAfterBreak="0">
     <w:nsid w:val="53390911"/>
     <w:multiLevelType w:val="multilevel"/>
     <w:tmpl w:val="1C380F12"/>
@@ -16887,7 +18095,7 @@
       </w:rPr>
     </w:lvl>
   </w:abstractNum>
-  <w:abstractNum w:abstractNumId="95" w15:restartNumberingAfterBreak="0">
+  <w:abstractNum w:abstractNumId="99" w15:restartNumberingAfterBreak="0">
     <w:nsid w:val="53CD23AC"/>
     <w:multiLevelType w:val="multilevel"/>
     <w:tmpl w:val="57BAE8F0"/>
@@ -17036,7 +18244,7 @@
       </w:rPr>
     </w:lvl>
   </w:abstractNum>
-  <w:abstractNum w:abstractNumId="96" w15:restartNumberingAfterBreak="0">
+  <w:abstractNum w:abstractNumId="100" w15:restartNumberingAfterBreak="0">
     <w:nsid w:val="5462791F"/>
     <w:multiLevelType w:val="hybridMultilevel"/>
     <w:tmpl w:val="FDE24C26"/>
@@ -17149,7 +18357,7 @@
       </w:rPr>
     </w:lvl>
   </w:abstractNum>
-  <w:abstractNum w:abstractNumId="97" w15:restartNumberingAfterBreak="0">
+  <w:abstractNum w:abstractNumId="101" w15:restartNumberingAfterBreak="0">
     <w:nsid w:val="547005EB"/>
     <w:multiLevelType w:val="multilevel"/>
     <w:tmpl w:val="F260CC5C"/>
@@ -17298,7 +18506,7 @@
       </w:rPr>
     </w:lvl>
   </w:abstractNum>
-  <w:abstractNum w:abstractNumId="98" w15:restartNumberingAfterBreak="0">
+  <w:abstractNum w:abstractNumId="102" w15:restartNumberingAfterBreak="0">
     <w:nsid w:val="58034221"/>
     <w:multiLevelType w:val="hybridMultilevel"/>
     <w:tmpl w:val="65D0619C"/>
@@ -17411,7 +18619,7 @@
       </w:rPr>
     </w:lvl>
   </w:abstractNum>
-  <w:abstractNum w:abstractNumId="99" w15:restartNumberingAfterBreak="0">
+  <w:abstractNum w:abstractNumId="103" w15:restartNumberingAfterBreak="0">
     <w:nsid w:val="59515319"/>
     <w:multiLevelType w:val="multilevel"/>
     <w:tmpl w:val="5AD8ACF0"/>
@@ -17560,7 +18768,7 @@
       </w:rPr>
     </w:lvl>
   </w:abstractNum>
-  <w:abstractNum w:abstractNumId="100" w15:restartNumberingAfterBreak="0">
+  <w:abstractNum w:abstractNumId="104" w15:restartNumberingAfterBreak="0">
     <w:nsid w:val="5A460390"/>
     <w:multiLevelType w:val="hybridMultilevel"/>
     <w:tmpl w:val="BD8E939C"/>
@@ -17673,7 +18881,7 @@
       </w:rPr>
     </w:lvl>
   </w:abstractNum>
-  <w:abstractNum w:abstractNumId="101" w15:restartNumberingAfterBreak="0">
+  <w:abstractNum w:abstractNumId="105" w15:restartNumberingAfterBreak="0">
     <w:nsid w:val="5CEE630B"/>
     <w:multiLevelType w:val="hybridMultilevel"/>
     <w:tmpl w:val="DE8E8DBA"/>
@@ -17786,7 +18994,7 @@
       </w:rPr>
     </w:lvl>
   </w:abstractNum>
-  <w:abstractNum w:abstractNumId="102" w15:restartNumberingAfterBreak="0">
+  <w:abstractNum w:abstractNumId="106" w15:restartNumberingAfterBreak="0">
     <w:nsid w:val="5D5A183C"/>
     <w:multiLevelType w:val="multilevel"/>
     <w:tmpl w:val="C804C34A"/>
@@ -17935,7 +19143,7 @@
       </w:rPr>
     </w:lvl>
   </w:abstractNum>
-  <w:abstractNum w:abstractNumId="103" w15:restartNumberingAfterBreak="0">
+  <w:abstractNum w:abstractNumId="107" w15:restartNumberingAfterBreak="0">
     <w:nsid w:val="5DF95194"/>
     <w:multiLevelType w:val="multilevel"/>
     <w:tmpl w:val="CC127E54"/>
@@ -18084,7 +19292,7 @@
       </w:rPr>
     </w:lvl>
   </w:abstractNum>
-  <w:abstractNum w:abstractNumId="104" w15:restartNumberingAfterBreak="0">
+  <w:abstractNum w:abstractNumId="108" w15:restartNumberingAfterBreak="0">
     <w:nsid w:val="5E6333E0"/>
     <w:multiLevelType w:val="hybridMultilevel"/>
     <w:tmpl w:val="A15497C8"/>
@@ -18197,7 +19405,7 @@
       </w:rPr>
     </w:lvl>
   </w:abstractNum>
-  <w:abstractNum w:abstractNumId="105" w15:restartNumberingAfterBreak="0">
+  <w:abstractNum w:abstractNumId="109" w15:restartNumberingAfterBreak="0">
     <w:nsid w:val="5E9C452C"/>
     <w:multiLevelType w:val="multilevel"/>
     <w:tmpl w:val="B8727936"/>
@@ -18346,7 +19554,7 @@
       </w:rPr>
     </w:lvl>
   </w:abstractNum>
-  <w:abstractNum w:abstractNumId="106" w15:restartNumberingAfterBreak="0">
+  <w:abstractNum w:abstractNumId="110" w15:restartNumberingAfterBreak="0">
     <w:nsid w:val="5EC339A8"/>
     <w:multiLevelType w:val="multilevel"/>
     <w:tmpl w:val="36DAAD54"/>
@@ -18495,7 +19703,7 @@
       </w:rPr>
     </w:lvl>
   </w:abstractNum>
-  <w:abstractNum w:abstractNumId="107" w15:restartNumberingAfterBreak="0">
+  <w:abstractNum w:abstractNumId="111" w15:restartNumberingAfterBreak="0">
     <w:nsid w:val="605D2403"/>
     <w:multiLevelType w:val="multilevel"/>
     <w:tmpl w:val="5AF24F44"/>
@@ -18644,7 +19852,7 @@
       </w:rPr>
     </w:lvl>
   </w:abstractNum>
-  <w:abstractNum w:abstractNumId="108" w15:restartNumberingAfterBreak="0">
+  <w:abstractNum w:abstractNumId="112" w15:restartNumberingAfterBreak="0">
     <w:nsid w:val="62385AA6"/>
     <w:multiLevelType w:val="multilevel"/>
     <w:tmpl w:val="B9EAECD4"/>
@@ -18793,7 +20001,7 @@
       </w:rPr>
     </w:lvl>
   </w:abstractNum>
-  <w:abstractNum w:abstractNumId="109" w15:restartNumberingAfterBreak="0">
+  <w:abstractNum w:abstractNumId="113" w15:restartNumberingAfterBreak="0">
     <w:nsid w:val="625D686D"/>
     <w:multiLevelType w:val="multilevel"/>
     <w:tmpl w:val="BC1C2048"/>
@@ -18942,7 +20150,7 @@
       </w:rPr>
     </w:lvl>
   </w:abstractNum>
-  <w:abstractNum w:abstractNumId="110" w15:restartNumberingAfterBreak="0">
+  <w:abstractNum w:abstractNumId="114" w15:restartNumberingAfterBreak="0">
     <w:nsid w:val="62B46951"/>
     <w:multiLevelType w:val="hybridMultilevel"/>
     <w:tmpl w:val="0FEAFEC6"/>
@@ -19055,7 +20263,7 @@
       </w:rPr>
     </w:lvl>
   </w:abstractNum>
-  <w:abstractNum w:abstractNumId="111" w15:restartNumberingAfterBreak="0">
+  <w:abstractNum w:abstractNumId="115" w15:restartNumberingAfterBreak="0">
     <w:nsid w:val="64014C6E"/>
     <w:multiLevelType w:val="multilevel"/>
     <w:tmpl w:val="96E42962"/>
@@ -19204,7 +20412,7 @@
       </w:rPr>
     </w:lvl>
   </w:abstractNum>
-  <w:abstractNum w:abstractNumId="112" w15:restartNumberingAfterBreak="0">
+  <w:abstractNum w:abstractNumId="116" w15:restartNumberingAfterBreak="0">
     <w:nsid w:val="647819E3"/>
     <w:multiLevelType w:val="multilevel"/>
     <w:tmpl w:val="ABB278BC"/>
@@ -19353,7 +20561,7 @@
       </w:rPr>
     </w:lvl>
   </w:abstractNum>
-  <w:abstractNum w:abstractNumId="113" w15:restartNumberingAfterBreak="0">
+  <w:abstractNum w:abstractNumId="117" w15:restartNumberingAfterBreak="0">
     <w:nsid w:val="64F30198"/>
     <w:multiLevelType w:val="multilevel"/>
     <w:tmpl w:val="63F4E6F0"/>
@@ -19502,7 +20710,7 @@
       </w:rPr>
     </w:lvl>
   </w:abstractNum>
-  <w:abstractNum w:abstractNumId="114" w15:restartNumberingAfterBreak="0">
+  <w:abstractNum w:abstractNumId="118" w15:restartNumberingAfterBreak="0">
     <w:nsid w:val="65314293"/>
     <w:multiLevelType w:val="hybridMultilevel"/>
     <w:tmpl w:val="6688DFAC"/>
@@ -19615,7 +20823,7 @@
       </w:rPr>
     </w:lvl>
   </w:abstractNum>
-  <w:abstractNum w:abstractNumId="115" w15:restartNumberingAfterBreak="0">
+  <w:abstractNum w:abstractNumId="119" w15:restartNumberingAfterBreak="0">
     <w:nsid w:val="65CE4D0F"/>
     <w:multiLevelType w:val="hybridMultilevel"/>
     <w:tmpl w:val="DB668538"/>
@@ -19728,7 +20936,7 @@
       </w:rPr>
     </w:lvl>
   </w:abstractNum>
-  <w:abstractNum w:abstractNumId="116" w15:restartNumberingAfterBreak="0">
+  <w:abstractNum w:abstractNumId="120" w15:restartNumberingAfterBreak="0">
     <w:nsid w:val="661C7D73"/>
     <w:multiLevelType w:val="multilevel"/>
     <w:tmpl w:val="D9681266"/>
@@ -19877,7 +21085,7 @@
       </w:rPr>
     </w:lvl>
   </w:abstractNum>
-  <w:abstractNum w:abstractNumId="117" w15:restartNumberingAfterBreak="0">
+  <w:abstractNum w:abstractNumId="121" w15:restartNumberingAfterBreak="0">
     <w:nsid w:val="661F6F82"/>
     <w:multiLevelType w:val="multilevel"/>
     <w:tmpl w:val="53F8A934"/>
@@ -20026,7 +21234,7 @@
       </w:rPr>
     </w:lvl>
   </w:abstractNum>
-  <w:abstractNum w:abstractNumId="118" w15:restartNumberingAfterBreak="0">
+  <w:abstractNum w:abstractNumId="122" w15:restartNumberingAfterBreak="0">
     <w:nsid w:val="66E36FE0"/>
     <w:multiLevelType w:val="multilevel"/>
     <w:tmpl w:val="2AA67CDA"/>
@@ -20175,7 +21383,7 @@
       </w:rPr>
     </w:lvl>
   </w:abstractNum>
-  <w:abstractNum w:abstractNumId="119" w15:restartNumberingAfterBreak="0">
+  <w:abstractNum w:abstractNumId="123" w15:restartNumberingAfterBreak="0">
     <w:nsid w:val="68205EC5"/>
     <w:multiLevelType w:val="multilevel"/>
     <w:tmpl w:val="EB4C8238"/>
@@ -20324,7 +21532,7 @@
       </w:rPr>
     </w:lvl>
   </w:abstractNum>
-  <w:abstractNum w:abstractNumId="120" w15:restartNumberingAfterBreak="0">
+  <w:abstractNum w:abstractNumId="124" w15:restartNumberingAfterBreak="0">
     <w:nsid w:val="68B94344"/>
     <w:multiLevelType w:val="multilevel"/>
     <w:tmpl w:val="9BA812D8"/>
@@ -20473,7 +21681,7 @@
       </w:rPr>
     </w:lvl>
   </w:abstractNum>
-  <w:abstractNum w:abstractNumId="121" w15:restartNumberingAfterBreak="0">
+  <w:abstractNum w:abstractNumId="125" w15:restartNumberingAfterBreak="0">
     <w:nsid w:val="69DE2C87"/>
     <w:multiLevelType w:val="hybridMultilevel"/>
     <w:tmpl w:val="F530F20A"/>
@@ -20586,7 +21794,7 @@
       </w:rPr>
     </w:lvl>
   </w:abstractNum>
-  <w:abstractNum w:abstractNumId="122" w15:restartNumberingAfterBreak="0">
+  <w:abstractNum w:abstractNumId="126" w15:restartNumberingAfterBreak="0">
     <w:nsid w:val="69ED672D"/>
     <w:multiLevelType w:val="multilevel"/>
     <w:tmpl w:val="CC08E300"/>
@@ -20735,7 +21943,7 @@
       </w:rPr>
     </w:lvl>
   </w:abstractNum>
-  <w:abstractNum w:abstractNumId="123" w15:restartNumberingAfterBreak="0">
+  <w:abstractNum w:abstractNumId="127" w15:restartNumberingAfterBreak="0">
     <w:nsid w:val="6A063EFD"/>
     <w:multiLevelType w:val="hybridMultilevel"/>
     <w:tmpl w:val="48703FBA"/>
@@ -20848,7 +22056,7 @@
       </w:rPr>
     </w:lvl>
   </w:abstractNum>
-  <w:abstractNum w:abstractNumId="124" w15:restartNumberingAfterBreak="0">
+  <w:abstractNum w:abstractNumId="128" w15:restartNumberingAfterBreak="0">
     <w:nsid w:val="6A825ABE"/>
     <w:multiLevelType w:val="multilevel"/>
     <w:tmpl w:val="0CD6F30E"/>
@@ -20997,7 +22205,7 @@
       </w:rPr>
     </w:lvl>
   </w:abstractNum>
-  <w:abstractNum w:abstractNumId="125" w15:restartNumberingAfterBreak="0">
+  <w:abstractNum w:abstractNumId="129" w15:restartNumberingAfterBreak="0">
     <w:nsid w:val="6B1D7832"/>
     <w:multiLevelType w:val="multilevel"/>
     <w:tmpl w:val="DD4646B2"/>
@@ -21146,7 +22354,7 @@
       </w:rPr>
     </w:lvl>
   </w:abstractNum>
-  <w:abstractNum w:abstractNumId="126" w15:restartNumberingAfterBreak="0">
+  <w:abstractNum w:abstractNumId="130" w15:restartNumberingAfterBreak="0">
     <w:nsid w:val="6C6D6667"/>
     <w:multiLevelType w:val="hybridMultilevel"/>
     <w:tmpl w:val="A744709C"/>
@@ -21259,7 +22467,7 @@
       </w:rPr>
     </w:lvl>
   </w:abstractNum>
-  <w:abstractNum w:abstractNumId="127" w15:restartNumberingAfterBreak="0">
+  <w:abstractNum w:abstractNumId="131" w15:restartNumberingAfterBreak="0">
     <w:nsid w:val="6CAD7EA5"/>
     <w:multiLevelType w:val="multilevel"/>
     <w:tmpl w:val="C472C5B0"/>
@@ -21408,7 +22616,7 @@
       </w:rPr>
     </w:lvl>
   </w:abstractNum>
-  <w:abstractNum w:abstractNumId="128" w15:restartNumberingAfterBreak="0">
+  <w:abstractNum w:abstractNumId="132" w15:restartNumberingAfterBreak="0">
     <w:nsid w:val="6E43557B"/>
     <w:multiLevelType w:val="multilevel"/>
     <w:tmpl w:val="323C7112"/>
@@ -21557,7 +22765,120 @@
       </w:rPr>
     </w:lvl>
   </w:abstractNum>
-  <w:abstractNum w:abstractNumId="129" w15:restartNumberingAfterBreak="0">
+  <w:abstractNum w:abstractNumId="133" w15:restartNumberingAfterBreak="0">
+    <w:nsid w:val="6E4C2FCD"/>
+    <w:multiLevelType w:val="hybridMultilevel"/>
+    <w:tmpl w:val="1FE6FE7A"/>
+    <w:lvl w:ilvl="0" w:tplc="04090005">
+      <w:start w:val="1"/>
+      <w:numFmt w:val="bullet"/>
+      <w:lvlText w:val=""/>
+      <w:lvlJc w:val="left"/>
+      <w:pPr>
+        <w:ind w:left="1080" w:hanging="360"/>
+      </w:pPr>
+      <w:rPr>
+        <w:rFonts w:ascii="Wingdings" w:hAnsi="Wingdings" w:hint="default"/>
+      </w:rPr>
+    </w:lvl>
+    <w:lvl w:ilvl="1" w:tplc="04090003" w:tentative="1">
+      <w:start w:val="1"/>
+      <w:numFmt w:val="bullet"/>
+      <w:lvlText w:val="o"/>
+      <w:lvlJc w:val="left"/>
+      <w:pPr>
+        <w:ind w:left="1800" w:hanging="360"/>
+      </w:pPr>
+      <w:rPr>
+        <w:rFonts w:ascii="Courier New" w:hAnsi="Courier New" w:cs="Courier New" w:hint="default"/>
+      </w:rPr>
+    </w:lvl>
+    <w:lvl w:ilvl="2" w:tplc="04090005" w:tentative="1">
+      <w:start w:val="1"/>
+      <w:numFmt w:val="bullet"/>
+      <w:lvlText w:val=""/>
+      <w:lvlJc w:val="left"/>
+      <w:pPr>
+        <w:ind w:left="2520" w:hanging="360"/>
+      </w:pPr>
+      <w:rPr>
+        <w:rFonts w:ascii="Wingdings" w:hAnsi="Wingdings" w:hint="default"/>
+      </w:rPr>
+    </w:lvl>
+    <w:lvl w:ilvl="3" w:tplc="04090001" w:tentative="1">
+      <w:start w:val="1"/>
+      <w:numFmt w:val="bullet"/>
+      <w:lvlText w:val=""/>
+      <w:lvlJc w:val="left"/>
+      <w:pPr>
+        <w:ind w:left="3240" w:hanging="360"/>
+      </w:pPr>
+      <w:rPr>
+        <w:rFonts w:ascii="Symbol" w:hAnsi="Symbol" w:hint="default"/>
+      </w:rPr>
+    </w:lvl>
+    <w:lvl w:ilvl="4" w:tplc="04090003" w:tentative="1">
+      <w:start w:val="1"/>
+      <w:numFmt w:val="bullet"/>
+      <w:lvlText w:val="o"/>
+      <w:lvlJc w:val="left"/>
+      <w:pPr>
+        <w:ind w:left="3960" w:hanging="360"/>
+      </w:pPr>
+      <w:rPr>
+        <w:rFonts w:ascii="Courier New" w:hAnsi="Courier New" w:cs="Courier New" w:hint="default"/>
+      </w:rPr>
+    </w:lvl>
+    <w:lvl w:ilvl="5" w:tplc="04090005" w:tentative="1">
+      <w:start w:val="1"/>
+      <w:numFmt w:val="bullet"/>
+      <w:lvlText w:val=""/>
+      <w:lvlJc w:val="left"/>
+      <w:pPr>
+        <w:ind w:left="4680" w:hanging="360"/>
+      </w:pPr>
+      <w:rPr>
+        <w:rFonts w:ascii="Wingdings" w:hAnsi="Wingdings" w:hint="default"/>
+      </w:rPr>
+    </w:lvl>
+    <w:lvl w:ilvl="6" w:tplc="04090001" w:tentative="1">
+      <w:start w:val="1"/>
+      <w:numFmt w:val="bullet"/>
+      <w:lvlText w:val=""/>
+      <w:lvlJc w:val="left"/>
+      <w:pPr>
+        <w:ind w:left="5400" w:hanging="360"/>
+      </w:pPr>
+      <w:rPr>
+        <w:rFonts w:ascii="Symbol" w:hAnsi="Symbol" w:hint="default"/>
+      </w:rPr>
+    </w:lvl>
+    <w:lvl w:ilvl="7" w:tplc="04090003" w:tentative="1">
+      <w:start w:val="1"/>
+      <w:numFmt w:val="bullet"/>
+      <w:lvlText w:val="o"/>
+      <w:lvlJc w:val="left"/>
+      <w:pPr>
+        <w:ind w:left="6120" w:hanging="360"/>
+      </w:pPr>
+      <w:rPr>
+        <w:rFonts w:ascii="Courier New" w:hAnsi="Courier New" w:cs="Courier New" w:hint="default"/>
+      </w:rPr>
+    </w:lvl>
+    <w:lvl w:ilvl="8" w:tplc="04090005" w:tentative="1">
+      <w:start w:val="1"/>
+      <w:numFmt w:val="bullet"/>
+      <w:lvlText w:val=""/>
+      <w:lvlJc w:val="left"/>
+      <w:pPr>
+        <w:ind w:left="6840" w:hanging="360"/>
+      </w:pPr>
+      <w:rPr>
+        <w:rFonts w:ascii="Wingdings" w:hAnsi="Wingdings" w:hint="default"/>
+      </w:rPr>
+    </w:lvl>
+  </w:abstractNum>
+  <w:abstractNum w:abstractNumId="134" w15:restartNumberingAfterBreak="0">
     <w:nsid w:val="6EA27D0A"/>
     <w:multiLevelType w:val="multilevel"/>
     <w:tmpl w:val="7BF0256C"/>
@@ -21706,7 +23027,7 @@
       </w:rPr>
     </w:lvl>
   </w:abstractNum>
-  <w:abstractNum w:abstractNumId="130" w15:restartNumberingAfterBreak="0">
+  <w:abstractNum w:abstractNumId="135" w15:restartNumberingAfterBreak="0">
     <w:nsid w:val="6EF86273"/>
     <w:multiLevelType w:val="multilevel"/>
     <w:tmpl w:val="2AA67CDA"/>
@@ -21855,7 +23176,7 @@
       </w:rPr>
     </w:lvl>
   </w:abstractNum>
-  <w:abstractNum w:abstractNumId="131" w15:restartNumberingAfterBreak="0">
+  <w:abstractNum w:abstractNumId="136" w15:restartNumberingAfterBreak="0">
     <w:nsid w:val="6F1425D4"/>
     <w:multiLevelType w:val="multilevel"/>
     <w:tmpl w:val="F71C8B08"/>
@@ -22004,7 +23325,7 @@
       </w:rPr>
     </w:lvl>
   </w:abstractNum>
-  <w:abstractNum w:abstractNumId="132" w15:restartNumberingAfterBreak="0">
+  <w:abstractNum w:abstractNumId="137" w15:restartNumberingAfterBreak="0">
     <w:nsid w:val="70874300"/>
     <w:multiLevelType w:val="hybridMultilevel"/>
     <w:tmpl w:val="1B3A0518"/>
@@ -22117,7 +23438,7 @@
       </w:rPr>
     </w:lvl>
   </w:abstractNum>
-  <w:abstractNum w:abstractNumId="133" w15:restartNumberingAfterBreak="0">
+  <w:abstractNum w:abstractNumId="138" w15:restartNumberingAfterBreak="0">
     <w:nsid w:val="7090251B"/>
     <w:multiLevelType w:val="hybridMultilevel"/>
     <w:tmpl w:val="67687EFE"/>
@@ -22230,7 +23551,7 @@
       </w:rPr>
     </w:lvl>
   </w:abstractNum>
-  <w:abstractNum w:abstractNumId="134" w15:restartNumberingAfterBreak="0">
+  <w:abstractNum w:abstractNumId="139" w15:restartNumberingAfterBreak="0">
     <w:nsid w:val="72031F81"/>
     <w:multiLevelType w:val="multilevel"/>
     <w:tmpl w:val="84400090"/>
@@ -22379,7 +23700,7 @@
       </w:rPr>
     </w:lvl>
   </w:abstractNum>
-  <w:abstractNum w:abstractNumId="135" w15:restartNumberingAfterBreak="0">
+  <w:abstractNum w:abstractNumId="140" w15:restartNumberingAfterBreak="0">
     <w:nsid w:val="722301E0"/>
     <w:multiLevelType w:val="multilevel"/>
     <w:tmpl w:val="1EE82E5A"/>
@@ -22528,7 +23849,7 @@
       </w:rPr>
     </w:lvl>
   </w:abstractNum>
-  <w:abstractNum w:abstractNumId="136" w15:restartNumberingAfterBreak="0">
+  <w:abstractNum w:abstractNumId="141" w15:restartNumberingAfterBreak="0">
     <w:nsid w:val="75144C65"/>
     <w:multiLevelType w:val="hybridMultilevel"/>
     <w:tmpl w:val="12127FAA"/>
@@ -22641,7 +23962,7 @@
       </w:rPr>
     </w:lvl>
   </w:abstractNum>
-  <w:abstractNum w:abstractNumId="137" w15:restartNumberingAfterBreak="0">
+  <w:abstractNum w:abstractNumId="142" w15:restartNumberingAfterBreak="0">
     <w:nsid w:val="75237F84"/>
     <w:multiLevelType w:val="hybridMultilevel"/>
     <w:tmpl w:val="5F0A6EF2"/>
@@ -22754,7 +24075,7 @@
       </w:rPr>
     </w:lvl>
   </w:abstractNum>
-  <w:abstractNum w:abstractNumId="138" w15:restartNumberingAfterBreak="0">
+  <w:abstractNum w:abstractNumId="143" w15:restartNumberingAfterBreak="0">
     <w:nsid w:val="758968F2"/>
     <w:multiLevelType w:val="multilevel"/>
     <w:tmpl w:val="D4241C4A"/>
@@ -22903,7 +24224,7 @@
       </w:rPr>
     </w:lvl>
   </w:abstractNum>
-  <w:abstractNum w:abstractNumId="139" w15:restartNumberingAfterBreak="0">
+  <w:abstractNum w:abstractNumId="144" w15:restartNumberingAfterBreak="0">
     <w:nsid w:val="75C90201"/>
     <w:multiLevelType w:val="hybridMultilevel"/>
     <w:tmpl w:val="02D63AEC"/>
@@ -23016,7 +24337,7 @@
       </w:rPr>
     </w:lvl>
   </w:abstractNum>
-  <w:abstractNum w:abstractNumId="140" w15:restartNumberingAfterBreak="0">
+  <w:abstractNum w:abstractNumId="145" w15:restartNumberingAfterBreak="0">
     <w:nsid w:val="75F3357C"/>
     <w:multiLevelType w:val="hybridMultilevel"/>
     <w:tmpl w:val="26723550"/>
@@ -23129,7 +24450,7 @@
       </w:rPr>
     </w:lvl>
   </w:abstractNum>
-  <w:abstractNum w:abstractNumId="141" w15:restartNumberingAfterBreak="0">
+  <w:abstractNum w:abstractNumId="146" w15:restartNumberingAfterBreak="0">
     <w:nsid w:val="75FF09B0"/>
     <w:multiLevelType w:val="multilevel"/>
     <w:tmpl w:val="C34A7734"/>
@@ -23278,7 +24599,7 @@
       </w:rPr>
     </w:lvl>
   </w:abstractNum>
-  <w:abstractNum w:abstractNumId="142" w15:restartNumberingAfterBreak="0">
+  <w:abstractNum w:abstractNumId="147" w15:restartNumberingAfterBreak="0">
     <w:nsid w:val="76864E3D"/>
     <w:multiLevelType w:val="hybridMultilevel"/>
     <w:tmpl w:val="9000C896"/>
@@ -23391,7 +24712,7 @@
       </w:rPr>
     </w:lvl>
   </w:abstractNum>
-  <w:abstractNum w:abstractNumId="143" w15:restartNumberingAfterBreak="0">
+  <w:abstractNum w:abstractNumId="148" w15:restartNumberingAfterBreak="0">
     <w:nsid w:val="774028FF"/>
     <w:multiLevelType w:val="hybridMultilevel"/>
     <w:tmpl w:val="EED036DC"/>
@@ -23504,7 +24825,7 @@
       </w:rPr>
     </w:lvl>
   </w:abstractNum>
-  <w:abstractNum w:abstractNumId="144" w15:restartNumberingAfterBreak="0">
+  <w:abstractNum w:abstractNumId="149" w15:restartNumberingAfterBreak="0">
     <w:nsid w:val="777E68D9"/>
     <w:multiLevelType w:val="multilevel"/>
     <w:tmpl w:val="3F503B98"/>
@@ -23653,7 +24974,7 @@
       </w:rPr>
     </w:lvl>
   </w:abstractNum>
-  <w:abstractNum w:abstractNumId="145" w15:restartNumberingAfterBreak="0">
+  <w:abstractNum w:abstractNumId="150" w15:restartNumberingAfterBreak="0">
     <w:nsid w:val="77960362"/>
     <w:multiLevelType w:val="multilevel"/>
     <w:tmpl w:val="FEA0022E"/>
@@ -23802,7 +25123,7 @@
       </w:rPr>
     </w:lvl>
   </w:abstractNum>
-  <w:abstractNum w:abstractNumId="146" w15:restartNumberingAfterBreak="0">
+  <w:abstractNum w:abstractNumId="151" w15:restartNumberingAfterBreak="0">
     <w:nsid w:val="78547E35"/>
     <w:multiLevelType w:val="multilevel"/>
     <w:tmpl w:val="FC1421DE"/>
@@ -23951,7 +25272,7 @@
       </w:rPr>
     </w:lvl>
   </w:abstractNum>
-  <w:abstractNum w:abstractNumId="147" w15:restartNumberingAfterBreak="0">
+  <w:abstractNum w:abstractNumId="152" w15:restartNumberingAfterBreak="0">
     <w:nsid w:val="785A644F"/>
     <w:multiLevelType w:val="multilevel"/>
     <w:tmpl w:val="D1DC60FE"/>
@@ -24100,7 +25421,7 @@
       </w:rPr>
     </w:lvl>
   </w:abstractNum>
-  <w:abstractNum w:abstractNumId="148" w15:restartNumberingAfterBreak="0">
+  <w:abstractNum w:abstractNumId="153" w15:restartNumberingAfterBreak="0">
     <w:nsid w:val="78B62297"/>
     <w:multiLevelType w:val="multilevel"/>
     <w:tmpl w:val="2AA67CDA"/>
@@ -24249,7 +25570,7 @@
       </w:rPr>
     </w:lvl>
   </w:abstractNum>
-  <w:abstractNum w:abstractNumId="149" w15:restartNumberingAfterBreak="0">
+  <w:abstractNum w:abstractNumId="154" w15:restartNumberingAfterBreak="0">
     <w:nsid w:val="79E63650"/>
     <w:multiLevelType w:val="multilevel"/>
     <w:tmpl w:val="98AA5BE8"/>
@@ -24398,7 +25719,7 @@
       </w:rPr>
     </w:lvl>
   </w:abstractNum>
-  <w:abstractNum w:abstractNumId="150" w15:restartNumberingAfterBreak="0">
+  <w:abstractNum w:abstractNumId="155" w15:restartNumberingAfterBreak="0">
     <w:nsid w:val="7BFA03DF"/>
     <w:multiLevelType w:val="hybridMultilevel"/>
     <w:tmpl w:val="536A979E"/>
@@ -24511,7 +25832,7 @@
       </w:rPr>
     </w:lvl>
   </w:abstractNum>
-  <w:abstractNum w:abstractNumId="151" w15:restartNumberingAfterBreak="0">
+  <w:abstractNum w:abstractNumId="156" w15:restartNumberingAfterBreak="0">
     <w:nsid w:val="7CA524B4"/>
     <w:multiLevelType w:val="hybridMultilevel"/>
     <w:tmpl w:val="957C4F4A"/>
@@ -24624,7 +25945,7 @@
       </w:rPr>
     </w:lvl>
   </w:abstractNum>
-  <w:abstractNum w:abstractNumId="152" w15:restartNumberingAfterBreak="0">
+  <w:abstractNum w:abstractNumId="157" w15:restartNumberingAfterBreak="0">
     <w:nsid w:val="7E1C597E"/>
     <w:multiLevelType w:val="multilevel"/>
     <w:tmpl w:val="2AA67CDA"/>
@@ -24773,7 +26094,7 @@
       </w:rPr>
     </w:lvl>
   </w:abstractNum>
-  <w:abstractNum w:abstractNumId="153" w15:restartNumberingAfterBreak="0">
+  <w:abstractNum w:abstractNumId="158" w15:restartNumberingAfterBreak="0">
     <w:nsid w:val="7EBD7710"/>
     <w:multiLevelType w:val="hybridMultilevel"/>
     <w:tmpl w:val="C8C6F7A0"/>
@@ -24886,7 +26207,7 @@
       </w:rPr>
     </w:lvl>
   </w:abstractNum>
-  <w:abstractNum w:abstractNumId="154" w15:restartNumberingAfterBreak="0">
+  <w:abstractNum w:abstractNumId="159" w15:restartNumberingAfterBreak="0">
     <w:nsid w:val="7F233031"/>
     <w:multiLevelType w:val="hybridMultilevel"/>
     <w:tmpl w:val="0D22564E"/>
@@ -24999,7 +26320,7 @@
       </w:rPr>
     </w:lvl>
   </w:abstractNum>
-  <w:abstractNum w:abstractNumId="155" w15:restartNumberingAfterBreak="0">
+  <w:abstractNum w:abstractNumId="160" w15:restartNumberingAfterBreak="0">
     <w:nsid w:val="7F426DF2"/>
     <w:multiLevelType w:val="multilevel"/>
     <w:tmpl w:val="430EFE5E"/>
@@ -25149,106 +26470,106 @@
     </w:lvl>
   </w:abstractNum>
   <w:num w:numId="1" w16cid:durableId="425157302">
-    <w:abstractNumId w:val="61"/>
+    <w:abstractNumId w:val="64"/>
   </w:num>
   <w:num w:numId="2" w16cid:durableId="967664612">
-    <w:abstractNumId w:val="113"/>
+    <w:abstractNumId w:val="117"/>
   </w:num>
   <w:num w:numId="3" w16cid:durableId="361631616">
-    <w:abstractNumId w:val="82"/>
+    <w:abstractNumId w:val="85"/>
   </w:num>
   <w:num w:numId="4" w16cid:durableId="1409575397">
-    <w:abstractNumId w:val="96"/>
+    <w:abstractNumId w:val="100"/>
   </w:num>
   <w:num w:numId="5" w16cid:durableId="1647204897">
-    <w:abstractNumId w:val="151"/>
+    <w:abstractNumId w:val="156"/>
   </w:num>
   <w:num w:numId="6" w16cid:durableId="682589869">
+    <w:abstractNumId w:val="32"/>
+  </w:num>
+  <w:num w:numId="7" w16cid:durableId="679703478">
+    <w:abstractNumId w:val="125"/>
+  </w:num>
+  <w:num w:numId="8" w16cid:durableId="496455128">
+    <w:abstractNumId w:val="58"/>
+  </w:num>
+  <w:num w:numId="9" w16cid:durableId="1184633094">
+    <w:abstractNumId w:val="76"/>
+  </w:num>
+  <w:num w:numId="10" w16cid:durableId="71507387">
+    <w:abstractNumId w:val="83"/>
+  </w:num>
+  <w:num w:numId="11" w16cid:durableId="1412503779">
+    <w:abstractNumId w:val="127"/>
+  </w:num>
+  <w:num w:numId="12" w16cid:durableId="1107113995">
+    <w:abstractNumId w:val="59"/>
+  </w:num>
+  <w:num w:numId="13" w16cid:durableId="2011055922">
+    <w:abstractNumId w:val="33"/>
+  </w:num>
+  <w:num w:numId="14" w16cid:durableId="1529222885">
+    <w:abstractNumId w:val="155"/>
+  </w:num>
+  <w:num w:numId="15" w16cid:durableId="836580755">
+    <w:abstractNumId w:val="23"/>
+  </w:num>
+  <w:num w:numId="16" w16cid:durableId="1344674502">
+    <w:abstractNumId w:val="104"/>
+  </w:num>
+  <w:num w:numId="17" w16cid:durableId="1320882603">
+    <w:abstractNumId w:val="137"/>
+  </w:num>
+  <w:num w:numId="18" w16cid:durableId="1139028372">
+    <w:abstractNumId w:val="60"/>
+  </w:num>
+  <w:num w:numId="19" w16cid:durableId="1525635473">
+    <w:abstractNumId w:val="114"/>
+  </w:num>
+  <w:num w:numId="20" w16cid:durableId="609623515">
+    <w:abstractNumId w:val="158"/>
+  </w:num>
+  <w:num w:numId="21" w16cid:durableId="165170997">
+    <w:abstractNumId w:val="130"/>
+  </w:num>
+  <w:num w:numId="22" w16cid:durableId="1620525290">
+    <w:abstractNumId w:val="41"/>
+  </w:num>
+  <w:num w:numId="23" w16cid:durableId="400753109">
+    <w:abstractNumId w:val="141"/>
+  </w:num>
+  <w:num w:numId="24" w16cid:durableId="193882219">
+    <w:abstractNumId w:val="8"/>
+  </w:num>
+  <w:num w:numId="25" w16cid:durableId="311981628">
+    <w:abstractNumId w:val="66"/>
+  </w:num>
+  <w:num w:numId="26" w16cid:durableId="2009166045">
+    <w:abstractNumId w:val="22"/>
+  </w:num>
+  <w:num w:numId="27" w16cid:durableId="2135174697">
     <w:abstractNumId w:val="31"/>
   </w:num>
-  <w:num w:numId="7" w16cid:durableId="679703478">
-    <w:abstractNumId w:val="121"/>
-  </w:num>
-  <w:num w:numId="8" w16cid:durableId="496455128">
-    <w:abstractNumId w:val="55"/>
-  </w:num>
-  <w:num w:numId="9" w16cid:durableId="1184633094">
-    <w:abstractNumId w:val="73"/>
-  </w:num>
-  <w:num w:numId="10" w16cid:durableId="71507387">
-    <w:abstractNumId w:val="80"/>
-  </w:num>
-  <w:num w:numId="11" w16cid:durableId="1412503779">
-    <w:abstractNumId w:val="123"/>
-  </w:num>
-  <w:num w:numId="12" w16cid:durableId="1107113995">
-    <w:abstractNumId w:val="56"/>
-  </w:num>
-  <w:num w:numId="13" w16cid:durableId="2011055922">
-    <w:abstractNumId w:val="32"/>
-  </w:num>
-  <w:num w:numId="14" w16cid:durableId="1529222885">
-    <w:abstractNumId w:val="150"/>
-  </w:num>
-  <w:num w:numId="15" w16cid:durableId="836580755">
-    <w:abstractNumId w:val="22"/>
-  </w:num>
-  <w:num w:numId="16" w16cid:durableId="1344674502">
-    <w:abstractNumId w:val="100"/>
-  </w:num>
-  <w:num w:numId="17" w16cid:durableId="1320882603">
-    <w:abstractNumId w:val="132"/>
-  </w:num>
-  <w:num w:numId="18" w16cid:durableId="1139028372">
-    <w:abstractNumId w:val="57"/>
-  </w:num>
-  <w:num w:numId="19" w16cid:durableId="1525635473">
-    <w:abstractNumId w:val="110"/>
-  </w:num>
-  <w:num w:numId="20" w16cid:durableId="609623515">
-    <w:abstractNumId w:val="153"/>
-  </w:num>
-  <w:num w:numId="21" w16cid:durableId="165170997">
-    <w:abstractNumId w:val="126"/>
-  </w:num>
-  <w:num w:numId="22" w16cid:durableId="1620525290">
-    <w:abstractNumId w:val="40"/>
-  </w:num>
-  <w:num w:numId="23" w16cid:durableId="400753109">
-    <w:abstractNumId w:val="136"/>
-  </w:num>
-  <w:num w:numId="24" w16cid:durableId="193882219">
-    <w:abstractNumId w:val="7"/>
-  </w:num>
-  <w:num w:numId="25" w16cid:durableId="311981628">
-    <w:abstractNumId w:val="63"/>
-  </w:num>
-  <w:num w:numId="26" w16cid:durableId="2009166045">
-    <w:abstractNumId w:val="21"/>
-  </w:num>
-  <w:num w:numId="27" w16cid:durableId="2135174697">
-    <w:abstractNumId w:val="30"/>
-  </w:num>
   <w:num w:numId="28" w16cid:durableId="353504740">
-    <w:abstractNumId w:val="23"/>
+    <w:abstractNumId w:val="24"/>
   </w:num>
   <w:num w:numId="29" w16cid:durableId="2124693280">
-    <w:abstractNumId w:val="115"/>
+    <w:abstractNumId w:val="119"/>
   </w:num>
   <w:num w:numId="30" w16cid:durableId="1367099744">
-    <w:abstractNumId w:val="45"/>
+    <w:abstractNumId w:val="47"/>
   </w:num>
   <w:num w:numId="31" w16cid:durableId="2011105642">
-    <w:abstractNumId w:val="101"/>
+    <w:abstractNumId w:val="105"/>
   </w:num>
   <w:num w:numId="32" w16cid:durableId="831995364">
-    <w:abstractNumId w:val="36"/>
+    <w:abstractNumId w:val="37"/>
   </w:num>
   <w:num w:numId="33" w16cid:durableId="851073403">
-    <w:abstractNumId w:val="5"/>
+    <w:abstractNumId w:val="6"/>
   </w:num>
   <w:num w:numId="34" w16cid:durableId="1183666391">
-    <w:abstractNumId w:val="34"/>
+    <w:abstractNumId w:val="35"/>
   </w:num>
   <w:num w:numId="35" w16cid:durableId="697268929">
     <w:abstractNumId w:val="2"/>
@@ -25257,364 +26578,379 @@
     <w:abstractNumId w:val="3"/>
   </w:num>
   <w:num w:numId="37" w16cid:durableId="1849755457">
-    <w:abstractNumId w:val="137"/>
+    <w:abstractNumId w:val="142"/>
   </w:num>
   <w:num w:numId="38" w16cid:durableId="516505904">
-    <w:abstractNumId w:val="20"/>
+    <w:abstractNumId w:val="21"/>
   </w:num>
   <w:num w:numId="39" w16cid:durableId="906300072">
-    <w:abstractNumId w:val="24"/>
+    <w:abstractNumId w:val="25"/>
   </w:num>
   <w:num w:numId="40" w16cid:durableId="905338697">
+    <w:abstractNumId w:val="88"/>
+  </w:num>
+  <w:num w:numId="41" w16cid:durableId="501896635">
+    <w:abstractNumId w:val="62"/>
+  </w:num>
+  <w:num w:numId="42" w16cid:durableId="1953435156">
+    <w:abstractNumId w:val="89"/>
+  </w:num>
+  <w:num w:numId="43" w16cid:durableId="1060447452">
+    <w:abstractNumId w:val="102"/>
+  </w:num>
+  <w:num w:numId="44" w16cid:durableId="1772503672">
+    <w:abstractNumId w:val="79"/>
+  </w:num>
+  <w:num w:numId="45" w16cid:durableId="1650330222">
+    <w:abstractNumId w:val="86"/>
+  </w:num>
+  <w:num w:numId="46" w16cid:durableId="2102337934">
+    <w:abstractNumId w:val="40"/>
+  </w:num>
+  <w:num w:numId="47" w16cid:durableId="68767822">
+    <w:abstractNumId w:val="128"/>
+  </w:num>
+  <w:num w:numId="48" w16cid:durableId="1992058265">
+    <w:abstractNumId w:val="9"/>
+  </w:num>
+  <w:num w:numId="49" w16cid:durableId="788475134">
+    <w:abstractNumId w:val="152"/>
+  </w:num>
+  <w:num w:numId="50" w16cid:durableId="224419455">
+    <w:abstractNumId w:val="134"/>
+  </w:num>
+  <w:num w:numId="51" w16cid:durableId="1699575947">
+    <w:abstractNumId w:val="113"/>
+  </w:num>
+  <w:num w:numId="52" w16cid:durableId="1048916239">
+    <w:abstractNumId w:val="71"/>
+  </w:num>
+  <w:num w:numId="53" w16cid:durableId="1188711211">
+    <w:abstractNumId w:val="146"/>
+  </w:num>
+  <w:num w:numId="54" w16cid:durableId="447555614">
+    <w:abstractNumId w:val="116"/>
+  </w:num>
+  <w:num w:numId="55" w16cid:durableId="1679307268">
+    <w:abstractNumId w:val="68"/>
+  </w:num>
+  <w:num w:numId="56" w16cid:durableId="693773591">
+    <w:abstractNumId w:val="132"/>
+  </w:num>
+  <w:num w:numId="57" w16cid:durableId="1110473324">
+    <w:abstractNumId w:val="50"/>
+  </w:num>
+  <w:num w:numId="58" w16cid:durableId="842937968">
     <w:abstractNumId w:val="84"/>
   </w:num>
-  <w:num w:numId="41" w16cid:durableId="501896635">
-    <w:abstractNumId w:val="59"/>
+  <w:num w:numId="59" w16cid:durableId="821121315">
+    <w:abstractNumId w:val="57"/>
   </w:num>
-  <w:num w:numId="42" w16cid:durableId="1953435156">
-    <w:abstractNumId w:val="85"/>
+  <w:num w:numId="60" w16cid:durableId="2095394549">
+    <w:abstractNumId w:val="150"/>
   </w:num>
-  <w:num w:numId="43" w16cid:durableId="1060447452">
+  <w:num w:numId="61" w16cid:durableId="1299921011">
+    <w:abstractNumId w:val="55"/>
+  </w:num>
+  <w:num w:numId="62" w16cid:durableId="1927420240">
+    <w:abstractNumId w:val="94"/>
+  </w:num>
+  <w:num w:numId="63" w16cid:durableId="41290043">
+    <w:abstractNumId w:val="99"/>
+  </w:num>
+  <w:num w:numId="64" w16cid:durableId="999846909">
+    <w:abstractNumId w:val="80"/>
+  </w:num>
+  <w:num w:numId="65" w16cid:durableId="1250969563">
+    <w:abstractNumId w:val="92"/>
+  </w:num>
+  <w:num w:numId="66" w16cid:durableId="484011382">
+    <w:abstractNumId w:val="126"/>
+  </w:num>
+  <w:num w:numId="67" w16cid:durableId="2008289242">
+    <w:abstractNumId w:val="18"/>
+  </w:num>
+  <w:num w:numId="68" w16cid:durableId="1041637222">
+    <w:abstractNumId w:val="26"/>
+  </w:num>
+  <w:num w:numId="69" w16cid:durableId="1296839887">
     <w:abstractNumId w:val="98"/>
   </w:num>
-  <w:num w:numId="44" w16cid:durableId="1772503672">
-    <w:abstractNumId w:val="76"/>
-  </w:num>
-  <w:num w:numId="45" w16cid:durableId="1650330222">
-    <w:abstractNumId w:val="83"/>
-  </w:num>
-  <w:num w:numId="46" w16cid:durableId="2102337934">
-    <w:abstractNumId w:val="39"/>
-  </w:num>
-  <w:num w:numId="47" w16cid:durableId="68767822">
-    <w:abstractNumId w:val="124"/>
-  </w:num>
-  <w:num w:numId="48" w16cid:durableId="1992058265">
-    <w:abstractNumId w:val="8"/>
-  </w:num>
-  <w:num w:numId="49" w16cid:durableId="788475134">
-    <w:abstractNumId w:val="147"/>
-  </w:num>
-  <w:num w:numId="50" w16cid:durableId="224419455">
-    <w:abstractNumId w:val="129"/>
-  </w:num>
-  <w:num w:numId="51" w16cid:durableId="1699575947">
-    <w:abstractNumId w:val="109"/>
-  </w:num>
-  <w:num w:numId="52" w16cid:durableId="1048916239">
-    <w:abstractNumId w:val="68"/>
-  </w:num>
-  <w:num w:numId="53" w16cid:durableId="1188711211">
-    <w:abstractNumId w:val="141"/>
-  </w:num>
-  <w:num w:numId="54" w16cid:durableId="447555614">
+  <w:num w:numId="70" w16cid:durableId="336662050">
     <w:abstractNumId w:val="112"/>
   </w:num>
-  <w:num w:numId="55" w16cid:durableId="1679307268">
-    <w:abstractNumId w:val="65"/>
-  </w:num>
-  <w:num w:numId="56" w16cid:durableId="693773591">
-    <w:abstractNumId w:val="128"/>
-  </w:num>
-  <w:num w:numId="57" w16cid:durableId="1110473324">
-    <w:abstractNumId w:val="47"/>
-  </w:num>
-  <w:num w:numId="58" w16cid:durableId="842937968">
-    <w:abstractNumId w:val="81"/>
-  </w:num>
-  <w:num w:numId="59" w16cid:durableId="821121315">
-    <w:abstractNumId w:val="54"/>
-  </w:num>
-  <w:num w:numId="60" w16cid:durableId="2095394549">
-    <w:abstractNumId w:val="145"/>
-  </w:num>
-  <w:num w:numId="61" w16cid:durableId="1299921011">
-    <w:abstractNumId w:val="52"/>
-  </w:num>
-  <w:num w:numId="62" w16cid:durableId="1927420240">
-    <w:abstractNumId w:val="90"/>
-  </w:num>
-  <w:num w:numId="63" w16cid:durableId="41290043">
-    <w:abstractNumId w:val="95"/>
-  </w:num>
-  <w:num w:numId="64" w16cid:durableId="999846909">
-    <w:abstractNumId w:val="77"/>
-  </w:num>
-  <w:num w:numId="65" w16cid:durableId="1250969563">
-    <w:abstractNumId w:val="88"/>
-  </w:num>
-  <w:num w:numId="66" w16cid:durableId="484011382">
-    <w:abstractNumId w:val="122"/>
-  </w:num>
-  <w:num w:numId="67" w16cid:durableId="2008289242">
-    <w:abstractNumId w:val="17"/>
-  </w:num>
-  <w:num w:numId="68" w16cid:durableId="1041637222">
-    <w:abstractNumId w:val="25"/>
-  </w:num>
-  <w:num w:numId="69" w16cid:durableId="1296839887">
-    <w:abstractNumId w:val="94"/>
-  </w:num>
-  <w:num w:numId="70" w16cid:durableId="336662050">
-    <w:abstractNumId w:val="108"/>
-  </w:num>
   <w:num w:numId="71" w16cid:durableId="1460032333">
-    <w:abstractNumId w:val="127"/>
+    <w:abstractNumId w:val="131"/>
   </w:num>
   <w:num w:numId="72" w16cid:durableId="592400615">
-    <w:abstractNumId w:val="14"/>
+    <w:abstractNumId w:val="15"/>
   </w:num>
   <w:num w:numId="73" w16cid:durableId="1879049234">
+    <w:abstractNumId w:val="46"/>
+  </w:num>
+  <w:num w:numId="74" w16cid:durableId="1747679558">
+    <w:abstractNumId w:val="51"/>
+  </w:num>
+  <w:num w:numId="75" w16cid:durableId="55278029">
+    <w:abstractNumId w:val="42"/>
+  </w:num>
+  <w:num w:numId="76" w16cid:durableId="1032193382">
     <w:abstractNumId w:val="44"/>
   </w:num>
-  <w:num w:numId="74" w16cid:durableId="1747679558">
-    <w:abstractNumId w:val="48"/>
-  </w:num>
-  <w:num w:numId="75" w16cid:durableId="55278029">
-    <w:abstractNumId w:val="41"/>
-  </w:num>
-  <w:num w:numId="76" w16cid:durableId="1032193382">
-    <w:abstractNumId w:val="42"/>
-  </w:num>
   <w:num w:numId="77" w16cid:durableId="763109604">
-    <w:abstractNumId w:val="97"/>
+    <w:abstractNumId w:val="101"/>
   </w:num>
   <w:num w:numId="78" w16cid:durableId="2138137265">
-    <w:abstractNumId w:val="114"/>
+    <w:abstractNumId w:val="118"/>
   </w:num>
   <w:num w:numId="79" w16cid:durableId="343675924">
-    <w:abstractNumId w:val="133"/>
+    <w:abstractNumId w:val="138"/>
   </w:num>
   <w:num w:numId="80" w16cid:durableId="1823277442">
-    <w:abstractNumId w:val="51"/>
+    <w:abstractNumId w:val="54"/>
   </w:num>
   <w:num w:numId="81" w16cid:durableId="1686900155">
     <w:abstractNumId w:val="0"/>
   </w:num>
   <w:num w:numId="82" w16cid:durableId="1113326280">
+    <w:abstractNumId w:val="97"/>
+  </w:num>
+  <w:num w:numId="83" w16cid:durableId="1253051103">
+    <w:abstractNumId w:val="129"/>
+  </w:num>
+  <w:num w:numId="84" w16cid:durableId="444888444">
+    <w:abstractNumId w:val="63"/>
+  </w:num>
+  <w:num w:numId="85" w16cid:durableId="64299649">
+    <w:abstractNumId w:val="120"/>
+  </w:num>
+  <w:num w:numId="86" w16cid:durableId="868182992">
+    <w:abstractNumId w:val="78"/>
+  </w:num>
+  <w:num w:numId="87" w16cid:durableId="896863331">
+    <w:abstractNumId w:val="34"/>
+  </w:num>
+  <w:num w:numId="88" w16cid:durableId="505442826">
+    <w:abstractNumId w:val="124"/>
+  </w:num>
+  <w:num w:numId="89" w16cid:durableId="1858763908">
+    <w:abstractNumId w:val="48"/>
+  </w:num>
+  <w:num w:numId="90" w16cid:durableId="1896088176">
+    <w:abstractNumId w:val="20"/>
+  </w:num>
+  <w:num w:numId="91" w16cid:durableId="1284576603">
+    <w:abstractNumId w:val="106"/>
+  </w:num>
+  <w:num w:numId="92" w16cid:durableId="1963075542">
+    <w:abstractNumId w:val="14"/>
+  </w:num>
+  <w:num w:numId="93" w16cid:durableId="787627596">
+    <w:abstractNumId w:val="96"/>
+  </w:num>
+  <w:num w:numId="94" w16cid:durableId="2003925799">
+    <w:abstractNumId w:val="17"/>
+  </w:num>
+  <w:num w:numId="95" w16cid:durableId="1169102579">
+    <w:abstractNumId w:val="109"/>
+  </w:num>
+  <w:num w:numId="96" w16cid:durableId="1216501564">
+    <w:abstractNumId w:val="45"/>
+  </w:num>
+  <w:num w:numId="97" w16cid:durableId="261768216">
+    <w:abstractNumId w:val="135"/>
+  </w:num>
+  <w:num w:numId="98" w16cid:durableId="2141918721">
+    <w:abstractNumId w:val="91"/>
+  </w:num>
+  <w:num w:numId="99" w16cid:durableId="905841544">
+    <w:abstractNumId w:val="52"/>
+  </w:num>
+  <w:num w:numId="100" w16cid:durableId="1753887223">
+    <w:abstractNumId w:val="107"/>
+  </w:num>
+  <w:num w:numId="101" w16cid:durableId="1320184766">
+    <w:abstractNumId w:val="39"/>
+  </w:num>
+  <w:num w:numId="102" w16cid:durableId="465127606">
+    <w:abstractNumId w:val="72"/>
+  </w:num>
+  <w:num w:numId="103" w16cid:durableId="1640451435">
+    <w:abstractNumId w:val="70"/>
+  </w:num>
+  <w:num w:numId="104" w16cid:durableId="942029608">
+    <w:abstractNumId w:val="65"/>
+  </w:num>
+  <w:num w:numId="105" w16cid:durableId="70857193">
+    <w:abstractNumId w:val="74"/>
+  </w:num>
+  <w:num w:numId="106" w16cid:durableId="1617908629">
+    <w:abstractNumId w:val="140"/>
+  </w:num>
+  <w:num w:numId="107" w16cid:durableId="970137111">
+    <w:abstractNumId w:val="157"/>
+  </w:num>
+  <w:num w:numId="108" w16cid:durableId="383797013">
+    <w:abstractNumId w:val="61"/>
+  </w:num>
+  <w:num w:numId="109" w16cid:durableId="1459567304">
+    <w:abstractNumId w:val="73"/>
+  </w:num>
+  <w:num w:numId="110" w16cid:durableId="862745862">
+    <w:abstractNumId w:val="27"/>
+  </w:num>
+  <w:num w:numId="111" w16cid:durableId="1859536331">
+    <w:abstractNumId w:val="77"/>
+  </w:num>
+  <w:num w:numId="112" w16cid:durableId="2092697678">
     <w:abstractNumId w:val="93"/>
   </w:num>
-  <w:num w:numId="83" w16cid:durableId="1253051103">
-    <w:abstractNumId w:val="125"/>
+  <w:num w:numId="113" w16cid:durableId="1418403813">
+    <w:abstractNumId w:val="81"/>
   </w:num>
-  <w:num w:numId="84" w16cid:durableId="444888444">
-    <w:abstractNumId w:val="60"/>
+  <w:num w:numId="114" w16cid:durableId="1965042317">
+    <w:abstractNumId w:val="139"/>
   </w:num>
-  <w:num w:numId="85" w16cid:durableId="64299649">
-    <w:abstractNumId w:val="116"/>
+  <w:num w:numId="115" w16cid:durableId="670569040">
+    <w:abstractNumId w:val="69"/>
   </w:num>
-  <w:num w:numId="86" w16cid:durableId="868182992">
+  <w:num w:numId="116" w16cid:durableId="413823113">
+    <w:abstractNumId w:val="153"/>
+  </w:num>
+  <w:num w:numId="117" w16cid:durableId="1293747982">
+    <w:abstractNumId w:val="122"/>
+  </w:num>
+  <w:num w:numId="118" w16cid:durableId="2058698591">
     <w:abstractNumId w:val="75"/>
   </w:num>
-  <w:num w:numId="87" w16cid:durableId="896863331">
-    <w:abstractNumId w:val="33"/>
+  <w:num w:numId="119" w16cid:durableId="892157361">
+    <w:abstractNumId w:val="95"/>
   </w:num>
-  <w:num w:numId="88" w16cid:durableId="505442826">
-    <w:abstractNumId w:val="120"/>
+  <w:num w:numId="120" w16cid:durableId="1449229938">
+    <w:abstractNumId w:val="143"/>
   </w:num>
-  <w:num w:numId="89" w16cid:durableId="1858763908">
-    <w:abstractNumId w:val="46"/>
+  <w:num w:numId="121" w16cid:durableId="177283374">
+    <w:abstractNumId w:val="12"/>
   </w:num>
-  <w:num w:numId="90" w16cid:durableId="1896088176">
-    <w:abstractNumId w:val="19"/>
-  </w:num>
-  <w:num w:numId="91" w16cid:durableId="1284576603">
-    <w:abstractNumId w:val="102"/>
-  </w:num>
-  <w:num w:numId="92" w16cid:durableId="1963075542">
-    <w:abstractNumId w:val="13"/>
-  </w:num>
-  <w:num w:numId="93" w16cid:durableId="787627596">
-    <w:abstractNumId w:val="92"/>
-  </w:num>
-  <w:num w:numId="94" w16cid:durableId="2003925799">
+  <w:num w:numId="122" w16cid:durableId="576598579">
     <w:abstractNumId w:val="16"/>
   </w:num>
-  <w:num w:numId="95" w16cid:durableId="1169102579">
-    <w:abstractNumId w:val="105"/>
+  <w:num w:numId="123" w16cid:durableId="1495337109">
+    <w:abstractNumId w:val="147"/>
   </w:num>
-  <w:num w:numId="96" w16cid:durableId="1216501564">
-    <w:abstractNumId w:val="43"/>
-  </w:num>
-  <w:num w:numId="97" w16cid:durableId="261768216">
-    <w:abstractNumId w:val="130"/>
-  </w:num>
-  <w:num w:numId="98" w16cid:durableId="2141918721">
-    <w:abstractNumId w:val="87"/>
-  </w:num>
-  <w:num w:numId="99" w16cid:durableId="905841544">
-    <w:abstractNumId w:val="49"/>
-  </w:num>
-  <w:num w:numId="100" w16cid:durableId="1753887223">
+  <w:num w:numId="124" w16cid:durableId="302319311">
     <w:abstractNumId w:val="103"/>
   </w:num>
-  <w:num w:numId="101" w16cid:durableId="1320184766">
-    <w:abstractNumId w:val="38"/>
-  </w:num>
-  <w:num w:numId="102" w16cid:durableId="465127606">
-    <w:abstractNumId w:val="69"/>
-  </w:num>
-  <w:num w:numId="103" w16cid:durableId="1640451435">
-    <w:abstractNumId w:val="67"/>
-  </w:num>
-  <w:num w:numId="104" w16cid:durableId="942029608">
-    <w:abstractNumId w:val="62"/>
-  </w:num>
-  <w:num w:numId="105" w16cid:durableId="70857193">
-    <w:abstractNumId w:val="71"/>
-  </w:num>
-  <w:num w:numId="106" w16cid:durableId="1617908629">
-    <w:abstractNumId w:val="135"/>
-  </w:num>
-  <w:num w:numId="107" w16cid:durableId="970137111">
-    <w:abstractNumId w:val="152"/>
-  </w:num>
-  <w:num w:numId="108" w16cid:durableId="383797013">
-    <w:abstractNumId w:val="58"/>
-  </w:num>
-  <w:num w:numId="109" w16cid:durableId="1459567304">
-    <w:abstractNumId w:val="70"/>
-  </w:num>
-  <w:num w:numId="110" w16cid:durableId="862745862">
-    <w:abstractNumId w:val="26"/>
-  </w:num>
-  <w:num w:numId="111" w16cid:durableId="1859536331">
-    <w:abstractNumId w:val="74"/>
-  </w:num>
-  <w:num w:numId="112" w16cid:durableId="2092697678">
-    <w:abstractNumId w:val="89"/>
-  </w:num>
-  <w:num w:numId="113" w16cid:durableId="1418403813">
-    <w:abstractNumId w:val="78"/>
-  </w:num>
-  <w:num w:numId="114" w16cid:durableId="1965042317">
-    <w:abstractNumId w:val="134"/>
-  </w:num>
-  <w:num w:numId="115" w16cid:durableId="670569040">
-    <w:abstractNumId w:val="66"/>
-  </w:num>
-  <w:num w:numId="116" w16cid:durableId="413823113">
-    <w:abstractNumId w:val="148"/>
-  </w:num>
-  <w:num w:numId="117" w16cid:durableId="1293747982">
-    <w:abstractNumId w:val="118"/>
-  </w:num>
-  <w:num w:numId="118" w16cid:durableId="2058698591">
-    <w:abstractNumId w:val="72"/>
-  </w:num>
-  <w:num w:numId="119" w16cid:durableId="892157361">
-    <w:abstractNumId w:val="91"/>
-  </w:num>
-  <w:num w:numId="120" w16cid:durableId="1449229938">
-    <w:abstractNumId w:val="138"/>
-  </w:num>
-  <w:num w:numId="121" w16cid:durableId="177283374">
-    <w:abstractNumId w:val="11"/>
-  </w:num>
-  <w:num w:numId="122" w16cid:durableId="576598579">
-    <w:abstractNumId w:val="15"/>
-  </w:num>
-  <w:num w:numId="123" w16cid:durableId="1495337109">
-    <w:abstractNumId w:val="142"/>
-  </w:num>
-  <w:num w:numId="124" w16cid:durableId="302319311">
-    <w:abstractNumId w:val="99"/>
-  </w:num>
   <w:num w:numId="125" w16cid:durableId="1891844186">
-    <w:abstractNumId w:val="117"/>
+    <w:abstractNumId w:val="121"/>
   </w:num>
   <w:num w:numId="126" w16cid:durableId="256911009">
     <w:abstractNumId w:val="1"/>
   </w:num>
   <w:num w:numId="127" w16cid:durableId="1001927776">
+    <w:abstractNumId w:val="159"/>
+  </w:num>
+  <w:num w:numId="128" w16cid:durableId="1365057616">
+    <w:abstractNumId w:val="108"/>
+  </w:num>
+  <w:num w:numId="129" w16cid:durableId="2142647602">
+    <w:abstractNumId w:val="110"/>
+  </w:num>
+  <w:num w:numId="130" w16cid:durableId="1895652277">
+    <w:abstractNumId w:val="160"/>
+  </w:num>
+  <w:num w:numId="131" w16cid:durableId="1132407586">
+    <w:abstractNumId w:val="151"/>
+  </w:num>
+  <w:num w:numId="132" w16cid:durableId="1209996408">
+    <w:abstractNumId w:val="13"/>
+  </w:num>
+  <w:num w:numId="133" w16cid:durableId="1840802852">
+    <w:abstractNumId w:val="5"/>
+  </w:num>
+  <w:num w:numId="134" w16cid:durableId="220867256">
+    <w:abstractNumId w:val="123"/>
+  </w:num>
+  <w:num w:numId="135" w16cid:durableId="2026857351">
+    <w:abstractNumId w:val="38"/>
+  </w:num>
+  <w:num w:numId="136" w16cid:durableId="1236696510">
+    <w:abstractNumId w:val="149"/>
+  </w:num>
+  <w:num w:numId="137" w16cid:durableId="1156385716">
+    <w:abstractNumId w:val="53"/>
+  </w:num>
+  <w:num w:numId="138" w16cid:durableId="1088235058">
+    <w:abstractNumId w:val="28"/>
+  </w:num>
+  <w:num w:numId="139" w16cid:durableId="106968457">
+    <w:abstractNumId w:val="19"/>
+  </w:num>
+  <w:num w:numId="140" w16cid:durableId="1705979747">
+    <w:abstractNumId w:val="11"/>
+  </w:num>
+  <w:num w:numId="141" w16cid:durableId="1122117806">
+    <w:abstractNumId w:val="36"/>
+  </w:num>
+  <w:num w:numId="142" w16cid:durableId="2126385657">
+    <w:abstractNumId w:val="67"/>
+  </w:num>
+  <w:num w:numId="143" w16cid:durableId="1058674300">
+    <w:abstractNumId w:val="82"/>
+  </w:num>
+  <w:num w:numId="144" w16cid:durableId="756362112">
+    <w:abstractNumId w:val="7"/>
+  </w:num>
+  <w:num w:numId="145" w16cid:durableId="1612125897">
+    <w:abstractNumId w:val="90"/>
+  </w:num>
+  <w:num w:numId="146" w16cid:durableId="797142166">
+    <w:abstractNumId w:val="30"/>
+  </w:num>
+  <w:num w:numId="147" w16cid:durableId="542138466">
+    <w:abstractNumId w:val="10"/>
+  </w:num>
+  <w:num w:numId="148" w16cid:durableId="1917398031">
+    <w:abstractNumId w:val="115"/>
+  </w:num>
+  <w:num w:numId="149" w16cid:durableId="524444307">
+    <w:abstractNumId w:val="136"/>
+  </w:num>
+  <w:num w:numId="150" w16cid:durableId="859783391">
+    <w:abstractNumId w:val="145"/>
+  </w:num>
+  <w:num w:numId="151" w16cid:durableId="2097357959">
+    <w:abstractNumId w:val="148"/>
+  </w:num>
+  <w:num w:numId="152" w16cid:durableId="748579603">
     <w:abstractNumId w:val="154"/>
   </w:num>
-  <w:num w:numId="128" w16cid:durableId="1365057616">
-    <w:abstractNumId w:val="104"/>
+  <w:num w:numId="153" w16cid:durableId="1193568221">
+    <w:abstractNumId w:val="29"/>
   </w:num>
-  <w:num w:numId="129" w16cid:durableId="2142647602">
-    <w:abstractNumId w:val="106"/>
+  <w:num w:numId="154" w16cid:durableId="913079688">
+    <w:abstractNumId w:val="111"/>
   </w:num>
-  <w:num w:numId="130" w16cid:durableId="1895652277">
-    <w:abstractNumId w:val="155"/>
+  <w:num w:numId="155" w16cid:durableId="1216234668">
+    <w:abstractNumId w:val="56"/>
   </w:num>
-  <w:num w:numId="131" w16cid:durableId="1132407586">
-    <w:abstractNumId w:val="146"/>
+  <w:num w:numId="156" w16cid:durableId="240020660">
+    <w:abstractNumId w:val="144"/>
   </w:num>
-  <w:num w:numId="132" w16cid:durableId="1209996408">
-    <w:abstractNumId w:val="12"/>
+  <w:num w:numId="157" w16cid:durableId="1604263775">
+    <w:abstractNumId w:val="43"/>
   </w:num>
-  <w:num w:numId="133" w16cid:durableId="1840802852">
+  <w:num w:numId="158" w16cid:durableId="2053966958">
+    <w:abstractNumId w:val="49"/>
+  </w:num>
+  <w:num w:numId="159" w16cid:durableId="1269044918">
     <w:abstractNumId w:val="4"/>
   </w:num>
-  <w:num w:numId="134" w16cid:durableId="220867256">
-    <w:abstractNumId w:val="119"/>
+  <w:num w:numId="160" w16cid:durableId="640892086">
+    <w:abstractNumId w:val="87"/>
   </w:num>
-  <w:num w:numId="135" w16cid:durableId="2026857351">
-    <w:abstractNumId w:val="37"/>
-  </w:num>
-  <w:num w:numId="136" w16cid:durableId="1236696510">
-    <w:abstractNumId w:val="144"/>
-  </w:num>
-  <w:num w:numId="137" w16cid:durableId="1156385716">
-    <w:abstractNumId w:val="50"/>
-  </w:num>
-  <w:num w:numId="138" w16cid:durableId="1088235058">
-    <w:abstractNumId w:val="27"/>
-  </w:num>
-  <w:num w:numId="139" w16cid:durableId="106968457">
-    <w:abstractNumId w:val="18"/>
-  </w:num>
-  <w:num w:numId="140" w16cid:durableId="1705979747">
-    <w:abstractNumId w:val="10"/>
-  </w:num>
-  <w:num w:numId="141" w16cid:durableId="1122117806">
-    <w:abstractNumId w:val="35"/>
-  </w:num>
-  <w:num w:numId="142" w16cid:durableId="2126385657">
-    <w:abstractNumId w:val="64"/>
-  </w:num>
-  <w:num w:numId="143" w16cid:durableId="1058674300">
-    <w:abstractNumId w:val="79"/>
-  </w:num>
-  <w:num w:numId="144" w16cid:durableId="756362112">
-    <w:abstractNumId w:val="6"/>
-  </w:num>
-  <w:num w:numId="145" w16cid:durableId="1612125897">
-    <w:abstractNumId w:val="86"/>
-  </w:num>
-  <w:num w:numId="146" w16cid:durableId="797142166">
-    <w:abstractNumId w:val="29"/>
-  </w:num>
-  <w:num w:numId="147" w16cid:durableId="542138466">
-    <w:abstractNumId w:val="9"/>
-  </w:num>
-  <w:num w:numId="148" w16cid:durableId="1917398031">
-    <w:abstractNumId w:val="111"/>
-  </w:num>
-  <w:num w:numId="149" w16cid:durableId="524444307">
-    <w:abstractNumId w:val="131"/>
-  </w:num>
-  <w:num w:numId="150" w16cid:durableId="859783391">
-    <w:abstractNumId w:val="140"/>
-  </w:num>
-  <w:num w:numId="151" w16cid:durableId="2097357959">
-    <w:abstractNumId w:val="143"/>
-  </w:num>
-  <w:num w:numId="152" w16cid:durableId="748579603">
-    <w:abstractNumId w:val="149"/>
-  </w:num>
-  <w:num w:numId="153" w16cid:durableId="1193568221">
-    <w:abstractNumId w:val="28"/>
-  </w:num>
-  <w:num w:numId="154" w16cid:durableId="913079688">
-    <w:abstractNumId w:val="107"/>
-  </w:num>
-  <w:num w:numId="155" w16cid:durableId="1216234668">
-    <w:abstractNumId w:val="53"/>
-  </w:num>
-  <w:num w:numId="156" w16cid:durableId="240020660">
-    <w:abstractNumId w:val="139"/>
+  <w:num w:numId="161" w16cid:durableId="610010161">
+    <w:abstractNumId w:val="133"/>
   </w:num>
   <w:numIdMacAtCleanup w:val="45"/>
 </w:numbering>

</xml_diff>

<commit_message>
Dispute Resolution Workflow (#271) Administration Process Activity Diagrams (#267)
</commit_message>
<xml_diff>
--- a/Activity Specification Document.docx
+++ b/Activity Specification Document.docx
@@ -4292,7 +4292,7 @@
         <w:t xml:space="preserve">8- </w:t>
       </w:r>
       <w:r>
-        <w:t>Content Moderation Workflow Activity Diagram Documentation</w:t>
+        <w:t xml:space="preserve">Content Moderation Workflow Activity </w:t>
       </w:r>
     </w:p>
     <w:p>
@@ -4933,8 +4933,699 @@
     </w:p>
     <w:p>
       <w:pPr>
+        <w:pStyle w:val="Heading3"/>
+      </w:pPr>
+      <w:r>
+        <w:lastRenderedPageBreak/>
+        <w:t xml:space="preserve">9- </w:t>
+      </w:r>
+      <w:r>
+        <w:t xml:space="preserve">Dispute Resolution Workflow Activity </w:t>
+      </w:r>
+    </w:p>
+    <w:p>
+      <w:pPr>
         <w:tabs>
           <w:tab w:val="left" w:pos="2880"/>
+        </w:tabs>
+        <w:rPr>
+          <w:b/>
+          <w:bCs/>
+        </w:rPr>
+      </w:pPr>
+      <w:r>
+        <w:rPr>
+          <w:b/>
+          <w:bCs/>
+        </w:rPr>
+        <w:t>Purpose</w:t>
+      </w:r>
+    </w:p>
+    <w:p>
+      <w:pPr>
+        <w:tabs>
+          <w:tab w:val="left" w:pos="2880"/>
+        </w:tabs>
+      </w:pPr>
+      <w:r>
+        <w:t>The Dispute Resolution Workflow Activity Diagram presents the process followed by the KriGo platform in resolving disputes sent by customers or rental agencies. The main objective of this process is to provide for an unbiased analysis of the reported dispute, investigation of the reported case based on existing evidence, and making a resolution of the reported case.</w:t>
+      </w:r>
+    </w:p>
+    <w:p>
+      <w:pPr>
+        <w:tabs>
+          <w:tab w:val="left" w:pos="2880"/>
+        </w:tabs>
+        <w:rPr>
+          <w:b/>
+          <w:bCs/>
+        </w:rPr>
+      </w:pPr>
+      <w:r>
+        <w:rPr>
+          <w:b/>
+          <w:bCs/>
+        </w:rPr>
+        <w:t>Workflow Description</w:t>
+      </w:r>
+    </w:p>
+    <w:p>
+      <w:pPr>
+        <w:tabs>
+          <w:tab w:val="left" w:pos="2880"/>
+        </w:tabs>
+        <w:spacing w:after="0"/>
+      </w:pPr>
+      <w:r>
+        <w:t>Disputes are received by the KriGo platform whenever there is a problem with a reservation, payment, condition of the rented vehicle, or any other issues related to rentals. As a part of the dispute reporting process, the submitter provides supporting evidence such as photos or payment receipts.</w:t>
+      </w:r>
+    </w:p>
+    <w:p>
+      <w:pPr>
+        <w:tabs>
+          <w:tab w:val="left" w:pos="2880"/>
+        </w:tabs>
+        <w:spacing w:after="0"/>
+      </w:pPr>
+      <w:r>
+        <w:t>Information that has been submitted is validated in order to verify if all required information is submitted. In case of the lack of required information, the submitter is asked to provide it as a part of the dispute review process.</w:t>
+      </w:r>
+    </w:p>
+    <w:p>
+      <w:pPr>
+        <w:tabs>
+          <w:tab w:val="left" w:pos="2880"/>
+        </w:tabs>
+        <w:spacing w:after="0"/>
+      </w:pPr>
+      <w:r>
+        <w:t>After all information has been submitted successfully, the dispute is assigned to a system administrator who will review the case and analyze the available evidence. In case of the lack of evidence, the system administrator asks for additional evidence.</w:t>
+      </w:r>
+    </w:p>
+    <w:p>
+      <w:pPr>
+        <w:tabs>
+          <w:tab w:val="left" w:pos="2880"/>
+        </w:tabs>
+      </w:pPr>
+      <w:r>
+        <w:t>When all necessary work has been completed, the administrator makes the decision regarding the solution of the problem. The decision could be either approval of the refund or denial of the claim.</w:t>
+      </w:r>
+    </w:p>
+    <w:p>
+      <w:pPr>
+        <w:tabs>
+          <w:tab w:val="left" w:pos="2880"/>
+        </w:tabs>
+        <w:rPr>
+          <w:b/>
+          <w:bCs/>
+        </w:rPr>
+      </w:pPr>
+      <w:r>
+        <w:rPr>
+          <w:b/>
+          <w:bCs/>
+        </w:rPr>
+        <w:t>Main Activities</w:t>
+      </w:r>
+    </w:p>
+    <w:p>
+      <w:pPr>
+        <w:tabs>
+          <w:tab w:val="left" w:pos="2880"/>
+        </w:tabs>
+      </w:pPr>
+      <w:r>
+        <w:t>The Dispute Resolution Workflow Activity Diagram includes the following primary activities:</w:t>
+      </w:r>
+    </w:p>
+    <w:p>
+      <w:pPr>
+        <w:pStyle w:val="ListParagraph"/>
+        <w:numPr>
+          <w:ilvl w:val="0"/>
+          <w:numId w:val="165"/>
+        </w:numPr>
+        <w:tabs>
+          <w:tab w:val="left" w:pos="2880"/>
+        </w:tabs>
+      </w:pPr>
+      <w:r>
+        <w:t>Submit a dispute.</w:t>
+      </w:r>
+    </w:p>
+    <w:p>
+      <w:pPr>
+        <w:pStyle w:val="ListParagraph"/>
+        <w:numPr>
+          <w:ilvl w:val="0"/>
+          <w:numId w:val="165"/>
+        </w:numPr>
+        <w:tabs>
+          <w:tab w:val="left" w:pos="2880"/>
+        </w:tabs>
+      </w:pPr>
+      <w:r>
+        <w:t>Upload supporting evidence.</w:t>
+      </w:r>
+    </w:p>
+    <w:p>
+      <w:pPr>
+        <w:pStyle w:val="ListParagraph"/>
+        <w:numPr>
+          <w:ilvl w:val="0"/>
+          <w:numId w:val="165"/>
+        </w:numPr>
+        <w:tabs>
+          <w:tab w:val="left" w:pos="2880"/>
+        </w:tabs>
+      </w:pPr>
+      <w:r>
+        <w:t>Validate dispute information.</w:t>
+      </w:r>
+    </w:p>
+    <w:p>
+      <w:pPr>
+        <w:pStyle w:val="ListParagraph"/>
+        <w:numPr>
+          <w:ilvl w:val="0"/>
+          <w:numId w:val="165"/>
+        </w:numPr>
+        <w:tabs>
+          <w:tab w:val="left" w:pos="2880"/>
+        </w:tabs>
+      </w:pPr>
+      <w:r>
+        <w:t>Assign the dispute to an administrator.</w:t>
+      </w:r>
+    </w:p>
+    <w:p>
+      <w:pPr>
+        <w:pStyle w:val="ListParagraph"/>
+        <w:numPr>
+          <w:ilvl w:val="0"/>
+          <w:numId w:val="165"/>
+        </w:numPr>
+        <w:tabs>
+          <w:tab w:val="left" w:pos="2880"/>
+        </w:tabs>
+      </w:pPr>
+      <w:r>
+        <w:t>Review the dispute.</w:t>
+      </w:r>
+    </w:p>
+    <w:p>
+      <w:pPr>
+        <w:pStyle w:val="ListParagraph"/>
+        <w:numPr>
+          <w:ilvl w:val="0"/>
+          <w:numId w:val="165"/>
+        </w:numPr>
+        <w:tabs>
+          <w:tab w:val="left" w:pos="2880"/>
+        </w:tabs>
+      </w:pPr>
+      <w:r>
+        <w:t>Investigate the submitted evidence.</w:t>
+      </w:r>
+    </w:p>
+    <w:p>
+      <w:pPr>
+        <w:pStyle w:val="ListParagraph"/>
+        <w:numPr>
+          <w:ilvl w:val="0"/>
+          <w:numId w:val="165"/>
+        </w:numPr>
+        <w:tabs>
+          <w:tab w:val="left" w:pos="2880"/>
+        </w:tabs>
+      </w:pPr>
+      <w:r>
+        <w:t>Determine the appropriate resolution.</w:t>
+      </w:r>
+    </w:p>
+    <w:p>
+      <w:pPr>
+        <w:pStyle w:val="ListParagraph"/>
+        <w:numPr>
+          <w:ilvl w:val="0"/>
+          <w:numId w:val="165"/>
+        </w:numPr>
+        <w:tabs>
+          <w:tab w:val="left" w:pos="2880"/>
+        </w:tabs>
+      </w:pPr>
+      <w:r>
+        <w:t>Update the dispute status.</w:t>
+      </w:r>
+    </w:p>
+    <w:p>
+      <w:pPr>
+        <w:pStyle w:val="ListParagraph"/>
+        <w:numPr>
+          <w:ilvl w:val="0"/>
+          <w:numId w:val="165"/>
+        </w:numPr>
+        <w:tabs>
+          <w:tab w:val="left" w:pos="2880"/>
+        </w:tabs>
+      </w:pPr>
+      <w:r>
+        <w:t>Notify the customer and rental agency.</w:t>
+      </w:r>
+    </w:p>
+    <w:p>
+      <w:pPr>
+        <w:tabs>
+          <w:tab w:val="left" w:pos="2880"/>
+        </w:tabs>
+        <w:rPr>
+          <w:b/>
+          <w:bCs/>
+        </w:rPr>
+      </w:pPr>
+      <w:r>
+        <w:rPr>
+          <w:b/>
+          <w:bCs/>
+        </w:rPr>
+        <w:t>Decision Points</w:t>
+      </w:r>
+    </w:p>
+    <w:p>
+      <w:pPr>
+        <w:tabs>
+          <w:tab w:val="left" w:pos="2880"/>
+        </w:tabs>
+      </w:pPr>
+      <w:r>
+        <w:t>The activity diagram contains two primary decision nodes:</w:t>
+      </w:r>
+    </w:p>
+    <w:p>
+      <w:pPr>
+        <w:numPr>
+          <w:ilvl w:val="0"/>
+          <w:numId w:val="163"/>
+        </w:numPr>
+        <w:tabs>
+          <w:tab w:val="left" w:pos="2880"/>
+        </w:tabs>
+      </w:pPr>
+      <w:r>
+        <w:rPr>
+          <w:b/>
+          <w:bCs/>
+        </w:rPr>
+        <w:t>Information Complete?</w:t>
+      </w:r>
+    </w:p>
+    <w:p>
+      <w:pPr>
+        <w:numPr>
+          <w:ilvl w:val="1"/>
+          <w:numId w:val="163"/>
+        </w:numPr>
+        <w:tabs>
+          <w:tab w:val="left" w:pos="2880"/>
+        </w:tabs>
+        <w:spacing w:after="0"/>
+      </w:pPr>
+      <w:r>
+        <w:t xml:space="preserve">If </w:t>
+      </w:r>
+      <w:r>
+        <w:rPr>
+          <w:b/>
+          <w:bCs/>
+        </w:rPr>
+        <w:t>y</w:t>
+      </w:r>
+      <w:r>
+        <w:rPr>
+          <w:b/>
+          <w:bCs/>
+        </w:rPr>
+        <w:t>es</w:t>
+      </w:r>
+      <w:r>
+        <w:t>, the dispute proceeds to administrator review.</w:t>
+      </w:r>
+    </w:p>
+    <w:p>
+      <w:pPr>
+        <w:numPr>
+          <w:ilvl w:val="1"/>
+          <w:numId w:val="163"/>
+        </w:numPr>
+        <w:tabs>
+          <w:tab w:val="left" w:pos="2880"/>
+        </w:tabs>
+      </w:pPr>
+      <w:r>
+        <w:t xml:space="preserve">If </w:t>
+      </w:r>
+      <w:r>
+        <w:rPr>
+          <w:b/>
+          <w:bCs/>
+        </w:rPr>
+        <w:t>n</w:t>
+      </w:r>
+      <w:r>
+        <w:rPr>
+          <w:b/>
+          <w:bCs/>
+        </w:rPr>
+        <w:t>o</w:t>
+      </w:r>
+      <w:r>
+        <w:t>, the system requests additional information before processing continues.</w:t>
+      </w:r>
+    </w:p>
+    <w:p>
+      <w:pPr>
+        <w:numPr>
+          <w:ilvl w:val="0"/>
+          <w:numId w:val="163"/>
+        </w:numPr>
+        <w:tabs>
+          <w:tab w:val="left" w:pos="2880"/>
+        </w:tabs>
+      </w:pPr>
+      <w:r>
+        <w:rPr>
+          <w:b/>
+          <w:bCs/>
+        </w:rPr>
+        <w:t>Resolution Reached?</w:t>
+      </w:r>
+    </w:p>
+    <w:p>
+      <w:pPr>
+        <w:numPr>
+          <w:ilvl w:val="1"/>
+          <w:numId w:val="163"/>
+        </w:numPr>
+        <w:tabs>
+          <w:tab w:val="left" w:pos="2880"/>
+        </w:tabs>
+        <w:spacing w:after="0"/>
+      </w:pPr>
+      <w:r>
+        <w:t>If</w:t>
+      </w:r>
+      <w:r>
+        <w:t xml:space="preserve"> </w:t>
+      </w:r>
+      <w:r>
+        <w:rPr>
+          <w:b/>
+          <w:bCs/>
+        </w:rPr>
+        <w:t>y</w:t>
+      </w:r>
+      <w:r>
+        <w:rPr>
+          <w:b/>
+          <w:bCs/>
+        </w:rPr>
+        <w:t>es</w:t>
+      </w:r>
+      <w:r>
+        <w:t>, the administrator finalizes the dispute, updates its status, and notifies the involved parties.</w:t>
+      </w:r>
+    </w:p>
+    <w:p>
+      <w:pPr>
+        <w:numPr>
+          <w:ilvl w:val="1"/>
+          <w:numId w:val="163"/>
+        </w:numPr>
+        <w:tabs>
+          <w:tab w:val="left" w:pos="2880"/>
+        </w:tabs>
+      </w:pPr>
+      <w:r>
+        <w:t xml:space="preserve">If </w:t>
+      </w:r>
+      <w:r>
+        <w:rPr>
+          <w:b/>
+          <w:bCs/>
+        </w:rPr>
+        <w:t>no</w:t>
+      </w:r>
+      <w:r>
+        <w:t>, additional supporting evidence is requested to continue the investigation.</w:t>
+      </w:r>
+    </w:p>
+    <w:p>
+      <w:pPr>
+        <w:tabs>
+          <w:tab w:val="left" w:pos="2880"/>
+        </w:tabs>
+      </w:pPr>
+      <w:r>
+        <w:t>These decision points ensure that disputes are resolved only after sufficient information has been collected and carefully evaluated.</w:t>
+      </w:r>
+    </w:p>
+    <w:p>
+      <w:pPr>
+        <w:tabs>
+          <w:tab w:val="left" w:pos="2880"/>
+        </w:tabs>
+        <w:spacing w:after="0"/>
+        <w:rPr>
+          <w:b/>
+          <w:bCs/>
+        </w:rPr>
+      </w:pPr>
+      <w:r>
+        <w:rPr>
+          <w:b/>
+          <w:bCs/>
+        </w:rPr>
+        <w:lastRenderedPageBreak/>
+        <w:t>Alternative Flows</w:t>
+      </w:r>
+    </w:p>
+    <w:p>
+      <w:pPr>
+        <w:tabs>
+          <w:tab w:val="left" w:pos="2880"/>
+        </w:tabs>
+      </w:pPr>
+      <w:r>
+        <w:t>The Dispute Resolution Workflow Activity Diagram incorporates several alternative scenarios:</w:t>
+      </w:r>
+    </w:p>
+    <w:p>
+      <w:pPr>
+        <w:pStyle w:val="ListParagraph"/>
+        <w:numPr>
+          <w:ilvl w:val="0"/>
+          <w:numId w:val="166"/>
+        </w:numPr>
+        <w:tabs>
+          <w:tab w:val="left" w:pos="2880"/>
+        </w:tabs>
+      </w:pPr>
+      <w:r>
+        <w:t>Submission of incomplete dispute information requiring additional details.</w:t>
+      </w:r>
+    </w:p>
+    <w:p>
+      <w:pPr>
+        <w:pStyle w:val="ListParagraph"/>
+        <w:numPr>
+          <w:ilvl w:val="0"/>
+          <w:numId w:val="166"/>
+        </w:numPr>
+        <w:tabs>
+          <w:tab w:val="left" w:pos="2880"/>
+        </w:tabs>
+      </w:pPr>
+      <w:r>
+        <w:t>Investigation requiring further supporting evidence before a decision can be made.</w:t>
+      </w:r>
+    </w:p>
+    <w:p>
+      <w:pPr>
+        <w:pStyle w:val="ListParagraph"/>
+        <w:numPr>
+          <w:ilvl w:val="0"/>
+          <w:numId w:val="166"/>
+        </w:numPr>
+        <w:tabs>
+          <w:tab w:val="left" w:pos="2880"/>
+        </w:tabs>
+      </w:pPr>
+      <w:r>
+        <w:t>Successful dispute resolution after administrative review.</w:t>
+      </w:r>
+    </w:p>
+    <w:p>
+      <w:pPr>
+        <w:pStyle w:val="ListParagraph"/>
+        <w:numPr>
+          <w:ilvl w:val="0"/>
+          <w:numId w:val="166"/>
+        </w:numPr>
+        <w:tabs>
+          <w:tab w:val="left" w:pos="2880"/>
+        </w:tabs>
+      </w:pPr>
+      <w:r>
+        <w:t>Notification of the final decision to both the customer and the rental agency.</w:t>
+      </w:r>
+    </w:p>
+    <w:p>
+      <w:pPr>
+        <w:tabs>
+          <w:tab w:val="left" w:pos="2880"/>
+        </w:tabs>
+      </w:pPr>
+      <w:r>
+        <w:t>These alternative paths help ensure fairness, consistency, and transparency throughout the dispute resolution process.</w:t>
+      </w:r>
+    </w:p>
+    <w:p>
+      <w:pPr>
+        <w:tabs>
+          <w:tab w:val="left" w:pos="2880"/>
+        </w:tabs>
+        <w:rPr>
+          <w:b/>
+          <w:bCs/>
+        </w:rPr>
+      </w:pPr>
+      <w:r>
+        <w:rPr>
+          <w:b/>
+          <w:bCs/>
+        </w:rPr>
+        <w:t>Conclusion</w:t>
+      </w:r>
+    </w:p>
+    <w:p>
+      <w:pPr>
+        <w:tabs>
+          <w:tab w:val="left" w:pos="2880"/>
+        </w:tabs>
+      </w:pPr>
+      <w:r>
+        <w:t>Dispute Resolution Workflow Activity Diagram gives a complete illustration of how disputes are handled in the KriGo platform. The diagram clearly illustrates the sequence of actions, validation process, investigation steps, and decisions needed to resolve any disputes effectively between customers and agencies. The activity diagram plays a crucial role in behavioral modeling in order to maintain quality services and ensure that all stakeholders' interests are protected.</w:t>
+      </w:r>
+    </w:p>
+    <w:p>
+      <w:pPr>
+        <w:tabs>
+          <w:tab w:val="left" w:pos="2880"/>
+        </w:tabs>
+      </w:pPr>
+    </w:p>
+    <w:p>
+      <w:pPr>
+        <w:keepNext/>
+        <w:tabs>
+          <w:tab w:val="left" w:pos="2880"/>
+        </w:tabs>
+      </w:pPr>
+      <w:r>
+        <w:rPr>
+          <w:noProof/>
+        </w:rPr>
+        <w:drawing>
+          <wp:inline distT="0" distB="0" distL="0" distR="0" wp14:anchorId="116EFDE1" wp14:editId="4FB114A9">
+            <wp:extent cx="5941695" cy="5298440"/>
+            <wp:effectExtent l="0" t="0" r="1905" b="0"/>
+            <wp:docPr id="674506612" name="Picture 16"/>
+            <wp:cNvGraphicFramePr>
+              <a:graphicFrameLocks xmlns:a="http://schemas.openxmlformats.org/drawingml/2006/main" noChangeAspect="1"/>
+            </wp:cNvGraphicFramePr>
+            <a:graphic xmlns:a="http://schemas.openxmlformats.org/drawingml/2006/main">
+              <a:graphicData uri="http://schemas.openxmlformats.org/drawingml/2006/picture">
+                <pic:pic xmlns:pic="http://schemas.openxmlformats.org/drawingml/2006/picture">
+                  <pic:nvPicPr>
+                    <pic:cNvPr id="0" name="Picture 17"/>
+                    <pic:cNvPicPr>
+                      <a:picLocks noChangeAspect="1" noChangeArrowheads="1"/>
+                    </pic:cNvPicPr>
+                  </pic:nvPicPr>
+                  <pic:blipFill>
+                    <a:blip r:embed="rId16">
+                      <a:extLst>
+                        <a:ext uri="{28A0092B-C50C-407E-A947-70E740481C1C}">
+                          <a14:useLocalDpi xmlns:a14="http://schemas.microsoft.com/office/drawing/2010/main" val="0"/>
+                        </a:ext>
+                      </a:extLst>
+                    </a:blip>
+                    <a:srcRect/>
+                    <a:stretch>
+                      <a:fillRect/>
+                    </a:stretch>
+                  </pic:blipFill>
+                  <pic:spPr bwMode="auto">
+                    <a:xfrm>
+                      <a:off x="0" y="0"/>
+                      <a:ext cx="5941695" cy="5298440"/>
+                    </a:xfrm>
+                    <a:prstGeom prst="rect">
+                      <a:avLst/>
+                    </a:prstGeom>
+                    <a:noFill/>
+                    <a:ln>
+                      <a:noFill/>
+                    </a:ln>
+                  </pic:spPr>
+                </pic:pic>
+              </a:graphicData>
+            </a:graphic>
+          </wp:inline>
+        </w:drawing>
+      </w:r>
+    </w:p>
+    <w:p>
+      <w:pPr>
+        <w:pStyle w:val="Caption"/>
+      </w:pPr>
+      <w:r>
+        <w:t xml:space="preserve">Figure </w:t>
+      </w:r>
+      <w:r>
+        <w:fldChar w:fldCharType="begin"/>
+      </w:r>
+      <w:r>
+        <w:instrText xml:space="preserve"> SEQ Figure \* ARABIC </w:instrText>
+      </w:r>
+      <w:r>
+        <w:fldChar w:fldCharType="separate"/>
+      </w:r>
+      <w:r>
+        <w:rPr>
+          <w:noProof/>
+        </w:rPr>
+        <w:t>9</w:t>
+      </w:r>
+      <w:r>
+        <w:fldChar w:fldCharType="end"/>
+      </w:r>
+      <w:r>
+        <w:t xml:space="preserve"> - </w:t>
+      </w:r>
+      <w:r>
+        <w:t>Dispute Resolution Workflow Activity Diagram</w:t>
+      </w:r>
+      <w:r>
+        <w:tab/>
+      </w:r>
+    </w:p>
+    <w:p>
+      <w:pPr>
+        <w:tabs>
+          <w:tab w:val="left" w:pos="3645"/>
         </w:tabs>
       </w:pPr>
     </w:p>
@@ -18507,6 +19198,268 @@
     </w:lvl>
   </w:abstractNum>
   <w:abstractNum w:abstractNumId="102" w15:restartNumberingAfterBreak="0">
+    <w:nsid w:val="55961DEA"/>
+    <w:multiLevelType w:val="multilevel"/>
+    <w:tmpl w:val="AED821A4"/>
+    <w:lvl w:ilvl="0">
+      <w:start w:val="1"/>
+      <w:numFmt w:val="bullet"/>
+      <w:lvlText w:val=""/>
+      <w:lvlJc w:val="left"/>
+      <w:pPr>
+        <w:tabs>
+          <w:tab w:val="num" w:pos="720"/>
+        </w:tabs>
+        <w:ind w:left="720" w:hanging="360"/>
+      </w:pPr>
+      <w:rPr>
+        <w:rFonts w:ascii="Symbol" w:hAnsi="Symbol" w:hint="default"/>
+        <w:sz w:val="20"/>
+      </w:rPr>
+    </w:lvl>
+    <w:lvl w:ilvl="1" w:tentative="1">
+      <w:start w:val="1"/>
+      <w:numFmt w:val="bullet"/>
+      <w:lvlText w:val="o"/>
+      <w:lvlJc w:val="left"/>
+      <w:pPr>
+        <w:tabs>
+          <w:tab w:val="num" w:pos="1440"/>
+        </w:tabs>
+        <w:ind w:left="1440" w:hanging="360"/>
+      </w:pPr>
+      <w:rPr>
+        <w:rFonts w:ascii="Courier New" w:hAnsi="Courier New" w:hint="default"/>
+        <w:sz w:val="20"/>
+      </w:rPr>
+    </w:lvl>
+    <w:lvl w:ilvl="2" w:tentative="1">
+      <w:start w:val="1"/>
+      <w:numFmt w:val="bullet"/>
+      <w:lvlText w:val=""/>
+      <w:lvlJc w:val="left"/>
+      <w:pPr>
+        <w:tabs>
+          <w:tab w:val="num" w:pos="2160"/>
+        </w:tabs>
+        <w:ind w:left="2160" w:hanging="360"/>
+      </w:pPr>
+      <w:rPr>
+        <w:rFonts w:ascii="Wingdings" w:hAnsi="Wingdings" w:hint="default"/>
+        <w:sz w:val="20"/>
+      </w:rPr>
+    </w:lvl>
+    <w:lvl w:ilvl="3" w:tentative="1">
+      <w:start w:val="1"/>
+      <w:numFmt w:val="bullet"/>
+      <w:lvlText w:val=""/>
+      <w:lvlJc w:val="left"/>
+      <w:pPr>
+        <w:tabs>
+          <w:tab w:val="num" w:pos="2880"/>
+        </w:tabs>
+        <w:ind w:left="2880" w:hanging="360"/>
+      </w:pPr>
+      <w:rPr>
+        <w:rFonts w:ascii="Wingdings" w:hAnsi="Wingdings" w:hint="default"/>
+        <w:sz w:val="20"/>
+      </w:rPr>
+    </w:lvl>
+    <w:lvl w:ilvl="4" w:tentative="1">
+      <w:start w:val="1"/>
+      <w:numFmt w:val="bullet"/>
+      <w:lvlText w:val=""/>
+      <w:lvlJc w:val="left"/>
+      <w:pPr>
+        <w:tabs>
+          <w:tab w:val="num" w:pos="3600"/>
+        </w:tabs>
+        <w:ind w:left="3600" w:hanging="360"/>
+      </w:pPr>
+      <w:rPr>
+        <w:rFonts w:ascii="Wingdings" w:hAnsi="Wingdings" w:hint="default"/>
+        <w:sz w:val="20"/>
+      </w:rPr>
+    </w:lvl>
+    <w:lvl w:ilvl="5" w:tentative="1">
+      <w:start w:val="1"/>
+      <w:numFmt w:val="bullet"/>
+      <w:lvlText w:val=""/>
+      <w:lvlJc w:val="left"/>
+      <w:pPr>
+        <w:tabs>
+          <w:tab w:val="num" w:pos="4320"/>
+        </w:tabs>
+        <w:ind w:left="4320" w:hanging="360"/>
+      </w:pPr>
+      <w:rPr>
+        <w:rFonts w:ascii="Wingdings" w:hAnsi="Wingdings" w:hint="default"/>
+        <w:sz w:val="20"/>
+      </w:rPr>
+    </w:lvl>
+    <w:lvl w:ilvl="6" w:tentative="1">
+      <w:start w:val="1"/>
+      <w:numFmt w:val="bullet"/>
+      <w:lvlText w:val=""/>
+      <w:lvlJc w:val="left"/>
+      <w:pPr>
+        <w:tabs>
+          <w:tab w:val="num" w:pos="5040"/>
+        </w:tabs>
+        <w:ind w:left="5040" w:hanging="360"/>
+      </w:pPr>
+      <w:rPr>
+        <w:rFonts w:ascii="Wingdings" w:hAnsi="Wingdings" w:hint="default"/>
+        <w:sz w:val="20"/>
+      </w:rPr>
+    </w:lvl>
+    <w:lvl w:ilvl="7" w:tentative="1">
+      <w:start w:val="1"/>
+      <w:numFmt w:val="bullet"/>
+      <w:lvlText w:val=""/>
+      <w:lvlJc w:val="left"/>
+      <w:pPr>
+        <w:tabs>
+          <w:tab w:val="num" w:pos="5760"/>
+        </w:tabs>
+        <w:ind w:left="5760" w:hanging="360"/>
+      </w:pPr>
+      <w:rPr>
+        <w:rFonts w:ascii="Wingdings" w:hAnsi="Wingdings" w:hint="default"/>
+        <w:sz w:val="20"/>
+      </w:rPr>
+    </w:lvl>
+    <w:lvl w:ilvl="8" w:tentative="1">
+      <w:start w:val="1"/>
+      <w:numFmt w:val="bullet"/>
+      <w:lvlText w:val=""/>
+      <w:lvlJc w:val="left"/>
+      <w:pPr>
+        <w:tabs>
+          <w:tab w:val="num" w:pos="6480"/>
+        </w:tabs>
+        <w:ind w:left="6480" w:hanging="360"/>
+      </w:pPr>
+      <w:rPr>
+        <w:rFonts w:ascii="Wingdings" w:hAnsi="Wingdings" w:hint="default"/>
+        <w:sz w:val="20"/>
+      </w:rPr>
+    </w:lvl>
+  </w:abstractNum>
+  <w:abstractNum w:abstractNumId="103" w15:restartNumberingAfterBreak="0">
+    <w:nsid w:val="55EC0440"/>
+    <w:multiLevelType w:val="hybridMultilevel"/>
+    <w:tmpl w:val="67C69668"/>
+    <w:lvl w:ilvl="0" w:tplc="04090005">
+      <w:start w:val="1"/>
+      <w:numFmt w:val="bullet"/>
+      <w:lvlText w:val=""/>
+      <w:lvlJc w:val="left"/>
+      <w:pPr>
+        <w:ind w:left="1080" w:hanging="360"/>
+      </w:pPr>
+      <w:rPr>
+        <w:rFonts w:ascii="Wingdings" w:hAnsi="Wingdings" w:hint="default"/>
+      </w:rPr>
+    </w:lvl>
+    <w:lvl w:ilvl="1" w:tplc="04090003" w:tentative="1">
+      <w:start w:val="1"/>
+      <w:numFmt w:val="bullet"/>
+      <w:lvlText w:val="o"/>
+      <w:lvlJc w:val="left"/>
+      <w:pPr>
+        <w:ind w:left="1800" w:hanging="360"/>
+      </w:pPr>
+      <w:rPr>
+        <w:rFonts w:ascii="Courier New" w:hAnsi="Courier New" w:cs="Courier New" w:hint="default"/>
+      </w:rPr>
+    </w:lvl>
+    <w:lvl w:ilvl="2" w:tplc="04090005" w:tentative="1">
+      <w:start w:val="1"/>
+      <w:numFmt w:val="bullet"/>
+      <w:lvlText w:val=""/>
+      <w:lvlJc w:val="left"/>
+      <w:pPr>
+        <w:ind w:left="2520" w:hanging="360"/>
+      </w:pPr>
+      <w:rPr>
+        <w:rFonts w:ascii="Wingdings" w:hAnsi="Wingdings" w:hint="default"/>
+      </w:rPr>
+    </w:lvl>
+    <w:lvl w:ilvl="3" w:tplc="04090001" w:tentative="1">
+      <w:start w:val="1"/>
+      <w:numFmt w:val="bullet"/>
+      <w:lvlText w:val=""/>
+      <w:lvlJc w:val="left"/>
+      <w:pPr>
+        <w:ind w:left="3240" w:hanging="360"/>
+      </w:pPr>
+      <w:rPr>
+        <w:rFonts w:ascii="Symbol" w:hAnsi="Symbol" w:hint="default"/>
+      </w:rPr>
+    </w:lvl>
+    <w:lvl w:ilvl="4" w:tplc="04090003" w:tentative="1">
+      <w:start w:val="1"/>
+      <w:numFmt w:val="bullet"/>
+      <w:lvlText w:val="o"/>
+      <w:lvlJc w:val="left"/>
+      <w:pPr>
+        <w:ind w:left="3960" w:hanging="360"/>
+      </w:pPr>
+      <w:rPr>
+        <w:rFonts w:ascii="Courier New" w:hAnsi="Courier New" w:cs="Courier New" w:hint="default"/>
+      </w:rPr>
+    </w:lvl>
+    <w:lvl w:ilvl="5" w:tplc="04090005" w:tentative="1">
+      <w:start w:val="1"/>
+      <w:numFmt w:val="bullet"/>
+      <w:lvlText w:val=""/>
+      <w:lvlJc w:val="left"/>
+      <w:pPr>
+        <w:ind w:left="4680" w:hanging="360"/>
+      </w:pPr>
+      <w:rPr>
+        <w:rFonts w:ascii="Wingdings" w:hAnsi="Wingdings" w:hint="default"/>
+      </w:rPr>
+    </w:lvl>
+    <w:lvl w:ilvl="6" w:tplc="04090001" w:tentative="1">
+      <w:start w:val="1"/>
+      <w:numFmt w:val="bullet"/>
+      <w:lvlText w:val=""/>
+      <w:lvlJc w:val="left"/>
+      <w:pPr>
+        <w:ind w:left="5400" w:hanging="360"/>
+      </w:pPr>
+      <w:rPr>
+        <w:rFonts w:ascii="Symbol" w:hAnsi="Symbol" w:hint="default"/>
+      </w:rPr>
+    </w:lvl>
+    <w:lvl w:ilvl="7" w:tplc="04090003" w:tentative="1">
+      <w:start w:val="1"/>
+      <w:numFmt w:val="bullet"/>
+      <w:lvlText w:val="o"/>
+      <w:lvlJc w:val="left"/>
+      <w:pPr>
+        <w:ind w:left="6120" w:hanging="360"/>
+      </w:pPr>
+      <w:rPr>
+        <w:rFonts w:ascii="Courier New" w:hAnsi="Courier New" w:cs="Courier New" w:hint="default"/>
+      </w:rPr>
+    </w:lvl>
+    <w:lvl w:ilvl="8" w:tplc="04090005" w:tentative="1">
+      <w:start w:val="1"/>
+      <w:numFmt w:val="bullet"/>
+      <w:lvlText w:val=""/>
+      <w:lvlJc w:val="left"/>
+      <w:pPr>
+        <w:ind w:left="6840" w:hanging="360"/>
+      </w:pPr>
+      <w:rPr>
+        <w:rFonts w:ascii="Wingdings" w:hAnsi="Wingdings" w:hint="default"/>
+      </w:rPr>
+    </w:lvl>
+  </w:abstractNum>
+  <w:abstractNum w:abstractNumId="104" w15:restartNumberingAfterBreak="0">
     <w:nsid w:val="58034221"/>
     <w:multiLevelType w:val="hybridMultilevel"/>
     <w:tmpl w:val="65D0619C"/>
@@ -18619,7 +19572,156 @@
       </w:rPr>
     </w:lvl>
   </w:abstractNum>
-  <w:abstractNum w:abstractNumId="103" w15:restartNumberingAfterBreak="0">
+  <w:abstractNum w:abstractNumId="105" w15:restartNumberingAfterBreak="0">
+    <w:nsid w:val="583F3D9C"/>
+    <w:multiLevelType w:val="multilevel"/>
+    <w:tmpl w:val="8E4C5D4A"/>
+    <w:lvl w:ilvl="0">
+      <w:start w:val="1"/>
+      <w:numFmt w:val="bullet"/>
+      <w:lvlText w:val=""/>
+      <w:lvlJc w:val="left"/>
+      <w:pPr>
+        <w:tabs>
+          <w:tab w:val="num" w:pos="720"/>
+        </w:tabs>
+        <w:ind w:left="720" w:hanging="360"/>
+      </w:pPr>
+      <w:rPr>
+        <w:rFonts w:ascii="Symbol" w:hAnsi="Symbol" w:hint="default"/>
+        <w:sz w:val="20"/>
+      </w:rPr>
+    </w:lvl>
+    <w:lvl w:ilvl="1">
+      <w:start w:val="1"/>
+      <w:numFmt w:val="bullet"/>
+      <w:lvlText w:val="o"/>
+      <w:lvlJc w:val="left"/>
+      <w:pPr>
+        <w:tabs>
+          <w:tab w:val="num" w:pos="1440"/>
+        </w:tabs>
+        <w:ind w:left="1440" w:hanging="360"/>
+      </w:pPr>
+      <w:rPr>
+        <w:rFonts w:ascii="Courier New" w:hAnsi="Courier New" w:hint="default"/>
+        <w:sz w:val="20"/>
+      </w:rPr>
+    </w:lvl>
+    <w:lvl w:ilvl="2" w:tentative="1">
+      <w:start w:val="1"/>
+      <w:numFmt w:val="bullet"/>
+      <w:lvlText w:val=""/>
+      <w:lvlJc w:val="left"/>
+      <w:pPr>
+        <w:tabs>
+          <w:tab w:val="num" w:pos="2160"/>
+        </w:tabs>
+        <w:ind w:left="2160" w:hanging="360"/>
+      </w:pPr>
+      <w:rPr>
+        <w:rFonts w:ascii="Wingdings" w:hAnsi="Wingdings" w:hint="default"/>
+        <w:sz w:val="20"/>
+      </w:rPr>
+    </w:lvl>
+    <w:lvl w:ilvl="3" w:tentative="1">
+      <w:start w:val="1"/>
+      <w:numFmt w:val="bullet"/>
+      <w:lvlText w:val=""/>
+      <w:lvlJc w:val="left"/>
+      <w:pPr>
+        <w:tabs>
+          <w:tab w:val="num" w:pos="2880"/>
+        </w:tabs>
+        <w:ind w:left="2880" w:hanging="360"/>
+      </w:pPr>
+      <w:rPr>
+        <w:rFonts w:ascii="Wingdings" w:hAnsi="Wingdings" w:hint="default"/>
+        <w:sz w:val="20"/>
+      </w:rPr>
+    </w:lvl>
+    <w:lvl w:ilvl="4" w:tentative="1">
+      <w:start w:val="1"/>
+      <w:numFmt w:val="bullet"/>
+      <w:lvlText w:val=""/>
+      <w:lvlJc w:val="left"/>
+      <w:pPr>
+        <w:tabs>
+          <w:tab w:val="num" w:pos="3600"/>
+        </w:tabs>
+        <w:ind w:left="3600" w:hanging="360"/>
+      </w:pPr>
+      <w:rPr>
+        <w:rFonts w:ascii="Wingdings" w:hAnsi="Wingdings" w:hint="default"/>
+        <w:sz w:val="20"/>
+      </w:rPr>
+    </w:lvl>
+    <w:lvl w:ilvl="5" w:tentative="1">
+      <w:start w:val="1"/>
+      <w:numFmt w:val="bullet"/>
+      <w:lvlText w:val=""/>
+      <w:lvlJc w:val="left"/>
+      <w:pPr>
+        <w:tabs>
+          <w:tab w:val="num" w:pos="4320"/>
+        </w:tabs>
+        <w:ind w:left="4320" w:hanging="360"/>
+      </w:pPr>
+      <w:rPr>
+        <w:rFonts w:ascii="Wingdings" w:hAnsi="Wingdings" w:hint="default"/>
+        <w:sz w:val="20"/>
+      </w:rPr>
+    </w:lvl>
+    <w:lvl w:ilvl="6" w:tentative="1">
+      <w:start w:val="1"/>
+      <w:numFmt w:val="bullet"/>
+      <w:lvlText w:val=""/>
+      <w:lvlJc w:val="left"/>
+      <w:pPr>
+        <w:tabs>
+          <w:tab w:val="num" w:pos="5040"/>
+        </w:tabs>
+        <w:ind w:left="5040" w:hanging="360"/>
+      </w:pPr>
+      <w:rPr>
+        <w:rFonts w:ascii="Wingdings" w:hAnsi="Wingdings" w:hint="default"/>
+        <w:sz w:val="20"/>
+      </w:rPr>
+    </w:lvl>
+    <w:lvl w:ilvl="7" w:tentative="1">
+      <w:start w:val="1"/>
+      <w:numFmt w:val="bullet"/>
+      <w:lvlText w:val=""/>
+      <w:lvlJc w:val="left"/>
+      <w:pPr>
+        <w:tabs>
+          <w:tab w:val="num" w:pos="5760"/>
+        </w:tabs>
+        <w:ind w:left="5760" w:hanging="360"/>
+      </w:pPr>
+      <w:rPr>
+        <w:rFonts w:ascii="Wingdings" w:hAnsi="Wingdings" w:hint="default"/>
+        <w:sz w:val="20"/>
+      </w:rPr>
+    </w:lvl>
+    <w:lvl w:ilvl="8" w:tentative="1">
+      <w:start w:val="1"/>
+      <w:numFmt w:val="bullet"/>
+      <w:lvlText w:val=""/>
+      <w:lvlJc w:val="left"/>
+      <w:pPr>
+        <w:tabs>
+          <w:tab w:val="num" w:pos="6480"/>
+        </w:tabs>
+        <w:ind w:left="6480" w:hanging="360"/>
+      </w:pPr>
+      <w:rPr>
+        <w:rFonts w:ascii="Wingdings" w:hAnsi="Wingdings" w:hint="default"/>
+        <w:sz w:val="20"/>
+      </w:rPr>
+    </w:lvl>
+  </w:abstractNum>
+  <w:abstractNum w:abstractNumId="106" w15:restartNumberingAfterBreak="0">
     <w:nsid w:val="59515319"/>
     <w:multiLevelType w:val="multilevel"/>
     <w:tmpl w:val="5AD8ACF0"/>
@@ -18768,7 +19870,7 @@
       </w:rPr>
     </w:lvl>
   </w:abstractNum>
-  <w:abstractNum w:abstractNumId="104" w15:restartNumberingAfterBreak="0">
+  <w:abstractNum w:abstractNumId="107" w15:restartNumberingAfterBreak="0">
     <w:nsid w:val="5A460390"/>
     <w:multiLevelType w:val="hybridMultilevel"/>
     <w:tmpl w:val="BD8E939C"/>
@@ -18881,7 +19983,7 @@
       </w:rPr>
     </w:lvl>
   </w:abstractNum>
-  <w:abstractNum w:abstractNumId="105" w15:restartNumberingAfterBreak="0">
+  <w:abstractNum w:abstractNumId="108" w15:restartNumberingAfterBreak="0">
     <w:nsid w:val="5CEE630B"/>
     <w:multiLevelType w:val="hybridMultilevel"/>
     <w:tmpl w:val="DE8E8DBA"/>
@@ -18994,7 +20096,7 @@
       </w:rPr>
     </w:lvl>
   </w:abstractNum>
-  <w:abstractNum w:abstractNumId="106" w15:restartNumberingAfterBreak="0">
+  <w:abstractNum w:abstractNumId="109" w15:restartNumberingAfterBreak="0">
     <w:nsid w:val="5D5A183C"/>
     <w:multiLevelType w:val="multilevel"/>
     <w:tmpl w:val="C804C34A"/>
@@ -19143,7 +20245,7 @@
       </w:rPr>
     </w:lvl>
   </w:abstractNum>
-  <w:abstractNum w:abstractNumId="107" w15:restartNumberingAfterBreak="0">
+  <w:abstractNum w:abstractNumId="110" w15:restartNumberingAfterBreak="0">
     <w:nsid w:val="5DF95194"/>
     <w:multiLevelType w:val="multilevel"/>
     <w:tmpl w:val="CC127E54"/>
@@ -19292,7 +20394,7 @@
       </w:rPr>
     </w:lvl>
   </w:abstractNum>
-  <w:abstractNum w:abstractNumId="108" w15:restartNumberingAfterBreak="0">
+  <w:abstractNum w:abstractNumId="111" w15:restartNumberingAfterBreak="0">
     <w:nsid w:val="5E6333E0"/>
     <w:multiLevelType w:val="hybridMultilevel"/>
     <w:tmpl w:val="A15497C8"/>
@@ -19405,7 +20507,7 @@
       </w:rPr>
     </w:lvl>
   </w:abstractNum>
-  <w:abstractNum w:abstractNumId="109" w15:restartNumberingAfterBreak="0">
+  <w:abstractNum w:abstractNumId="112" w15:restartNumberingAfterBreak="0">
     <w:nsid w:val="5E9C452C"/>
     <w:multiLevelType w:val="multilevel"/>
     <w:tmpl w:val="B8727936"/>
@@ -19554,7 +20656,7 @@
       </w:rPr>
     </w:lvl>
   </w:abstractNum>
-  <w:abstractNum w:abstractNumId="110" w15:restartNumberingAfterBreak="0">
+  <w:abstractNum w:abstractNumId="113" w15:restartNumberingAfterBreak="0">
     <w:nsid w:val="5EC339A8"/>
     <w:multiLevelType w:val="multilevel"/>
     <w:tmpl w:val="36DAAD54"/>
@@ -19703,7 +20805,7 @@
       </w:rPr>
     </w:lvl>
   </w:abstractNum>
-  <w:abstractNum w:abstractNumId="111" w15:restartNumberingAfterBreak="0">
+  <w:abstractNum w:abstractNumId="114" w15:restartNumberingAfterBreak="0">
     <w:nsid w:val="605D2403"/>
     <w:multiLevelType w:val="multilevel"/>
     <w:tmpl w:val="5AF24F44"/>
@@ -19852,7 +20954,7 @@
       </w:rPr>
     </w:lvl>
   </w:abstractNum>
-  <w:abstractNum w:abstractNumId="112" w15:restartNumberingAfterBreak="0">
+  <w:abstractNum w:abstractNumId="115" w15:restartNumberingAfterBreak="0">
     <w:nsid w:val="62385AA6"/>
     <w:multiLevelType w:val="multilevel"/>
     <w:tmpl w:val="B9EAECD4"/>
@@ -20001,7 +21103,7 @@
       </w:rPr>
     </w:lvl>
   </w:abstractNum>
-  <w:abstractNum w:abstractNumId="113" w15:restartNumberingAfterBreak="0">
+  <w:abstractNum w:abstractNumId="116" w15:restartNumberingAfterBreak="0">
     <w:nsid w:val="625D686D"/>
     <w:multiLevelType w:val="multilevel"/>
     <w:tmpl w:val="BC1C2048"/>
@@ -20150,7 +21252,7 @@
       </w:rPr>
     </w:lvl>
   </w:abstractNum>
-  <w:abstractNum w:abstractNumId="114" w15:restartNumberingAfterBreak="0">
+  <w:abstractNum w:abstractNumId="117" w15:restartNumberingAfterBreak="0">
     <w:nsid w:val="62B46951"/>
     <w:multiLevelType w:val="hybridMultilevel"/>
     <w:tmpl w:val="0FEAFEC6"/>
@@ -20263,7 +21365,7 @@
       </w:rPr>
     </w:lvl>
   </w:abstractNum>
-  <w:abstractNum w:abstractNumId="115" w15:restartNumberingAfterBreak="0">
+  <w:abstractNum w:abstractNumId="118" w15:restartNumberingAfterBreak="0">
     <w:nsid w:val="64014C6E"/>
     <w:multiLevelType w:val="multilevel"/>
     <w:tmpl w:val="96E42962"/>
@@ -20412,7 +21514,7 @@
       </w:rPr>
     </w:lvl>
   </w:abstractNum>
-  <w:abstractNum w:abstractNumId="116" w15:restartNumberingAfterBreak="0">
+  <w:abstractNum w:abstractNumId="119" w15:restartNumberingAfterBreak="0">
     <w:nsid w:val="647819E3"/>
     <w:multiLevelType w:val="multilevel"/>
     <w:tmpl w:val="ABB278BC"/>
@@ -20561,7 +21663,7 @@
       </w:rPr>
     </w:lvl>
   </w:abstractNum>
-  <w:abstractNum w:abstractNumId="117" w15:restartNumberingAfterBreak="0">
+  <w:abstractNum w:abstractNumId="120" w15:restartNumberingAfterBreak="0">
     <w:nsid w:val="64F30198"/>
     <w:multiLevelType w:val="multilevel"/>
     <w:tmpl w:val="63F4E6F0"/>
@@ -20710,7 +21812,7 @@
       </w:rPr>
     </w:lvl>
   </w:abstractNum>
-  <w:abstractNum w:abstractNumId="118" w15:restartNumberingAfterBreak="0">
+  <w:abstractNum w:abstractNumId="121" w15:restartNumberingAfterBreak="0">
     <w:nsid w:val="65314293"/>
     <w:multiLevelType w:val="hybridMultilevel"/>
     <w:tmpl w:val="6688DFAC"/>
@@ -20823,7 +21925,7 @@
       </w:rPr>
     </w:lvl>
   </w:abstractNum>
-  <w:abstractNum w:abstractNumId="119" w15:restartNumberingAfterBreak="0">
+  <w:abstractNum w:abstractNumId="122" w15:restartNumberingAfterBreak="0">
     <w:nsid w:val="65CE4D0F"/>
     <w:multiLevelType w:val="hybridMultilevel"/>
     <w:tmpl w:val="DB668538"/>
@@ -20936,7 +22038,7 @@
       </w:rPr>
     </w:lvl>
   </w:abstractNum>
-  <w:abstractNum w:abstractNumId="120" w15:restartNumberingAfterBreak="0">
+  <w:abstractNum w:abstractNumId="123" w15:restartNumberingAfterBreak="0">
     <w:nsid w:val="661C7D73"/>
     <w:multiLevelType w:val="multilevel"/>
     <w:tmpl w:val="D9681266"/>
@@ -21085,7 +22187,7 @@
       </w:rPr>
     </w:lvl>
   </w:abstractNum>
-  <w:abstractNum w:abstractNumId="121" w15:restartNumberingAfterBreak="0">
+  <w:abstractNum w:abstractNumId="124" w15:restartNumberingAfterBreak="0">
     <w:nsid w:val="661F6F82"/>
     <w:multiLevelType w:val="multilevel"/>
     <w:tmpl w:val="53F8A934"/>
@@ -21234,7 +22336,7 @@
       </w:rPr>
     </w:lvl>
   </w:abstractNum>
-  <w:abstractNum w:abstractNumId="122" w15:restartNumberingAfterBreak="0">
+  <w:abstractNum w:abstractNumId="125" w15:restartNumberingAfterBreak="0">
     <w:nsid w:val="66E36FE0"/>
     <w:multiLevelType w:val="multilevel"/>
     <w:tmpl w:val="2AA67CDA"/>
@@ -21383,7 +22485,7 @@
       </w:rPr>
     </w:lvl>
   </w:abstractNum>
-  <w:abstractNum w:abstractNumId="123" w15:restartNumberingAfterBreak="0">
+  <w:abstractNum w:abstractNumId="126" w15:restartNumberingAfterBreak="0">
     <w:nsid w:val="68205EC5"/>
     <w:multiLevelType w:val="multilevel"/>
     <w:tmpl w:val="EB4C8238"/>
@@ -21532,7 +22634,7 @@
       </w:rPr>
     </w:lvl>
   </w:abstractNum>
-  <w:abstractNum w:abstractNumId="124" w15:restartNumberingAfterBreak="0">
+  <w:abstractNum w:abstractNumId="127" w15:restartNumberingAfterBreak="0">
     <w:nsid w:val="68B94344"/>
     <w:multiLevelType w:val="multilevel"/>
     <w:tmpl w:val="9BA812D8"/>
@@ -21681,7 +22783,7 @@
       </w:rPr>
     </w:lvl>
   </w:abstractNum>
-  <w:abstractNum w:abstractNumId="125" w15:restartNumberingAfterBreak="0">
+  <w:abstractNum w:abstractNumId="128" w15:restartNumberingAfterBreak="0">
     <w:nsid w:val="69DE2C87"/>
     <w:multiLevelType w:val="hybridMultilevel"/>
     <w:tmpl w:val="F530F20A"/>
@@ -21794,7 +22896,7 @@
       </w:rPr>
     </w:lvl>
   </w:abstractNum>
-  <w:abstractNum w:abstractNumId="126" w15:restartNumberingAfterBreak="0">
+  <w:abstractNum w:abstractNumId="129" w15:restartNumberingAfterBreak="0">
     <w:nsid w:val="69ED672D"/>
     <w:multiLevelType w:val="multilevel"/>
     <w:tmpl w:val="CC08E300"/>
@@ -21943,7 +23045,7 @@
       </w:rPr>
     </w:lvl>
   </w:abstractNum>
-  <w:abstractNum w:abstractNumId="127" w15:restartNumberingAfterBreak="0">
+  <w:abstractNum w:abstractNumId="130" w15:restartNumberingAfterBreak="0">
     <w:nsid w:val="6A063EFD"/>
     <w:multiLevelType w:val="hybridMultilevel"/>
     <w:tmpl w:val="48703FBA"/>
@@ -22056,7 +23158,7 @@
       </w:rPr>
     </w:lvl>
   </w:abstractNum>
-  <w:abstractNum w:abstractNumId="128" w15:restartNumberingAfterBreak="0">
+  <w:abstractNum w:abstractNumId="131" w15:restartNumberingAfterBreak="0">
     <w:nsid w:val="6A825ABE"/>
     <w:multiLevelType w:val="multilevel"/>
     <w:tmpl w:val="0CD6F30E"/>
@@ -22205,7 +23307,7 @@
       </w:rPr>
     </w:lvl>
   </w:abstractNum>
-  <w:abstractNum w:abstractNumId="129" w15:restartNumberingAfterBreak="0">
+  <w:abstractNum w:abstractNumId="132" w15:restartNumberingAfterBreak="0">
     <w:nsid w:val="6B1D7832"/>
     <w:multiLevelType w:val="multilevel"/>
     <w:tmpl w:val="DD4646B2"/>
@@ -22354,7 +23456,7 @@
       </w:rPr>
     </w:lvl>
   </w:abstractNum>
-  <w:abstractNum w:abstractNumId="130" w15:restartNumberingAfterBreak="0">
+  <w:abstractNum w:abstractNumId="133" w15:restartNumberingAfterBreak="0">
     <w:nsid w:val="6C6D6667"/>
     <w:multiLevelType w:val="hybridMultilevel"/>
     <w:tmpl w:val="A744709C"/>
@@ -22467,7 +23569,7 @@
       </w:rPr>
     </w:lvl>
   </w:abstractNum>
-  <w:abstractNum w:abstractNumId="131" w15:restartNumberingAfterBreak="0">
+  <w:abstractNum w:abstractNumId="134" w15:restartNumberingAfterBreak="0">
     <w:nsid w:val="6CAD7EA5"/>
     <w:multiLevelType w:val="multilevel"/>
     <w:tmpl w:val="C472C5B0"/>
@@ -22616,7 +23718,7 @@
       </w:rPr>
     </w:lvl>
   </w:abstractNum>
-  <w:abstractNum w:abstractNumId="132" w15:restartNumberingAfterBreak="0">
+  <w:abstractNum w:abstractNumId="135" w15:restartNumberingAfterBreak="0">
     <w:nsid w:val="6E43557B"/>
     <w:multiLevelType w:val="multilevel"/>
     <w:tmpl w:val="323C7112"/>
@@ -22765,7 +23867,7 @@
       </w:rPr>
     </w:lvl>
   </w:abstractNum>
-  <w:abstractNum w:abstractNumId="133" w15:restartNumberingAfterBreak="0">
+  <w:abstractNum w:abstractNumId="136" w15:restartNumberingAfterBreak="0">
     <w:nsid w:val="6E4C2FCD"/>
     <w:multiLevelType w:val="hybridMultilevel"/>
     <w:tmpl w:val="1FE6FE7A"/>
@@ -22878,7 +23980,7 @@
       </w:rPr>
     </w:lvl>
   </w:abstractNum>
-  <w:abstractNum w:abstractNumId="134" w15:restartNumberingAfterBreak="0">
+  <w:abstractNum w:abstractNumId="137" w15:restartNumberingAfterBreak="0">
     <w:nsid w:val="6EA27D0A"/>
     <w:multiLevelType w:val="multilevel"/>
     <w:tmpl w:val="7BF0256C"/>
@@ -23027,7 +24129,7 @@
       </w:rPr>
     </w:lvl>
   </w:abstractNum>
-  <w:abstractNum w:abstractNumId="135" w15:restartNumberingAfterBreak="0">
+  <w:abstractNum w:abstractNumId="138" w15:restartNumberingAfterBreak="0">
     <w:nsid w:val="6EF86273"/>
     <w:multiLevelType w:val="multilevel"/>
     <w:tmpl w:val="2AA67CDA"/>
@@ -23176,7 +24278,7 @@
       </w:rPr>
     </w:lvl>
   </w:abstractNum>
-  <w:abstractNum w:abstractNumId="136" w15:restartNumberingAfterBreak="0">
+  <w:abstractNum w:abstractNumId="139" w15:restartNumberingAfterBreak="0">
     <w:nsid w:val="6F1425D4"/>
     <w:multiLevelType w:val="multilevel"/>
     <w:tmpl w:val="F71C8B08"/>
@@ -23325,7 +24427,156 @@
       </w:rPr>
     </w:lvl>
   </w:abstractNum>
-  <w:abstractNum w:abstractNumId="137" w15:restartNumberingAfterBreak="0">
+  <w:abstractNum w:abstractNumId="140" w15:restartNumberingAfterBreak="0">
+    <w:nsid w:val="6F304959"/>
+    <w:multiLevelType w:val="multilevel"/>
+    <w:tmpl w:val="57AA766C"/>
+    <w:lvl w:ilvl="0">
+      <w:start w:val="1"/>
+      <w:numFmt w:val="bullet"/>
+      <w:lvlText w:val=""/>
+      <w:lvlJc w:val="left"/>
+      <w:pPr>
+        <w:tabs>
+          <w:tab w:val="num" w:pos="720"/>
+        </w:tabs>
+        <w:ind w:left="720" w:hanging="360"/>
+      </w:pPr>
+      <w:rPr>
+        <w:rFonts w:ascii="Symbol" w:hAnsi="Symbol" w:hint="default"/>
+        <w:sz w:val="20"/>
+      </w:rPr>
+    </w:lvl>
+    <w:lvl w:ilvl="1" w:tentative="1">
+      <w:start w:val="1"/>
+      <w:numFmt w:val="bullet"/>
+      <w:lvlText w:val="o"/>
+      <w:lvlJc w:val="left"/>
+      <w:pPr>
+        <w:tabs>
+          <w:tab w:val="num" w:pos="1440"/>
+        </w:tabs>
+        <w:ind w:left="1440" w:hanging="360"/>
+      </w:pPr>
+      <w:rPr>
+        <w:rFonts w:ascii="Courier New" w:hAnsi="Courier New" w:hint="default"/>
+        <w:sz w:val="20"/>
+      </w:rPr>
+    </w:lvl>
+    <w:lvl w:ilvl="2" w:tentative="1">
+      <w:start w:val="1"/>
+      <w:numFmt w:val="bullet"/>
+      <w:lvlText w:val=""/>
+      <w:lvlJc w:val="left"/>
+      <w:pPr>
+        <w:tabs>
+          <w:tab w:val="num" w:pos="2160"/>
+        </w:tabs>
+        <w:ind w:left="2160" w:hanging="360"/>
+      </w:pPr>
+      <w:rPr>
+        <w:rFonts w:ascii="Wingdings" w:hAnsi="Wingdings" w:hint="default"/>
+        <w:sz w:val="20"/>
+      </w:rPr>
+    </w:lvl>
+    <w:lvl w:ilvl="3" w:tentative="1">
+      <w:start w:val="1"/>
+      <w:numFmt w:val="bullet"/>
+      <w:lvlText w:val=""/>
+      <w:lvlJc w:val="left"/>
+      <w:pPr>
+        <w:tabs>
+          <w:tab w:val="num" w:pos="2880"/>
+        </w:tabs>
+        <w:ind w:left="2880" w:hanging="360"/>
+      </w:pPr>
+      <w:rPr>
+        <w:rFonts w:ascii="Wingdings" w:hAnsi="Wingdings" w:hint="default"/>
+        <w:sz w:val="20"/>
+      </w:rPr>
+    </w:lvl>
+    <w:lvl w:ilvl="4" w:tentative="1">
+      <w:start w:val="1"/>
+      <w:numFmt w:val="bullet"/>
+      <w:lvlText w:val=""/>
+      <w:lvlJc w:val="left"/>
+      <w:pPr>
+        <w:tabs>
+          <w:tab w:val="num" w:pos="3600"/>
+        </w:tabs>
+        <w:ind w:left="3600" w:hanging="360"/>
+      </w:pPr>
+      <w:rPr>
+        <w:rFonts w:ascii="Wingdings" w:hAnsi="Wingdings" w:hint="default"/>
+        <w:sz w:val="20"/>
+      </w:rPr>
+    </w:lvl>
+    <w:lvl w:ilvl="5" w:tentative="1">
+      <w:start w:val="1"/>
+      <w:numFmt w:val="bullet"/>
+      <w:lvlText w:val=""/>
+      <w:lvlJc w:val="left"/>
+      <w:pPr>
+        <w:tabs>
+          <w:tab w:val="num" w:pos="4320"/>
+        </w:tabs>
+        <w:ind w:left="4320" w:hanging="360"/>
+      </w:pPr>
+      <w:rPr>
+        <w:rFonts w:ascii="Wingdings" w:hAnsi="Wingdings" w:hint="default"/>
+        <w:sz w:val="20"/>
+      </w:rPr>
+    </w:lvl>
+    <w:lvl w:ilvl="6" w:tentative="1">
+      <w:start w:val="1"/>
+      <w:numFmt w:val="bullet"/>
+      <w:lvlText w:val=""/>
+      <w:lvlJc w:val="left"/>
+      <w:pPr>
+        <w:tabs>
+          <w:tab w:val="num" w:pos="5040"/>
+        </w:tabs>
+        <w:ind w:left="5040" w:hanging="360"/>
+      </w:pPr>
+      <w:rPr>
+        <w:rFonts w:ascii="Wingdings" w:hAnsi="Wingdings" w:hint="default"/>
+        <w:sz w:val="20"/>
+      </w:rPr>
+    </w:lvl>
+    <w:lvl w:ilvl="7" w:tentative="1">
+      <w:start w:val="1"/>
+      <w:numFmt w:val="bullet"/>
+      <w:lvlText w:val=""/>
+      <w:lvlJc w:val="left"/>
+      <w:pPr>
+        <w:tabs>
+          <w:tab w:val="num" w:pos="5760"/>
+        </w:tabs>
+        <w:ind w:left="5760" w:hanging="360"/>
+      </w:pPr>
+      <w:rPr>
+        <w:rFonts w:ascii="Wingdings" w:hAnsi="Wingdings" w:hint="default"/>
+        <w:sz w:val="20"/>
+      </w:rPr>
+    </w:lvl>
+    <w:lvl w:ilvl="8" w:tentative="1">
+      <w:start w:val="1"/>
+      <w:numFmt w:val="bullet"/>
+      <w:lvlText w:val=""/>
+      <w:lvlJc w:val="left"/>
+      <w:pPr>
+        <w:tabs>
+          <w:tab w:val="num" w:pos="6480"/>
+        </w:tabs>
+        <w:ind w:left="6480" w:hanging="360"/>
+      </w:pPr>
+      <w:rPr>
+        <w:rFonts w:ascii="Wingdings" w:hAnsi="Wingdings" w:hint="default"/>
+        <w:sz w:val="20"/>
+      </w:rPr>
+    </w:lvl>
+  </w:abstractNum>
+  <w:abstractNum w:abstractNumId="141" w15:restartNumberingAfterBreak="0">
     <w:nsid w:val="70874300"/>
     <w:multiLevelType w:val="hybridMultilevel"/>
     <w:tmpl w:val="1B3A0518"/>
@@ -23438,7 +24689,7 @@
       </w:rPr>
     </w:lvl>
   </w:abstractNum>
-  <w:abstractNum w:abstractNumId="138" w15:restartNumberingAfterBreak="0">
+  <w:abstractNum w:abstractNumId="142" w15:restartNumberingAfterBreak="0">
     <w:nsid w:val="7090251B"/>
     <w:multiLevelType w:val="hybridMultilevel"/>
     <w:tmpl w:val="67687EFE"/>
@@ -23551,7 +24802,7 @@
       </w:rPr>
     </w:lvl>
   </w:abstractNum>
-  <w:abstractNum w:abstractNumId="139" w15:restartNumberingAfterBreak="0">
+  <w:abstractNum w:abstractNumId="143" w15:restartNumberingAfterBreak="0">
     <w:nsid w:val="72031F81"/>
     <w:multiLevelType w:val="multilevel"/>
     <w:tmpl w:val="84400090"/>
@@ -23700,7 +24951,7 @@
       </w:rPr>
     </w:lvl>
   </w:abstractNum>
-  <w:abstractNum w:abstractNumId="140" w15:restartNumberingAfterBreak="0">
+  <w:abstractNum w:abstractNumId="144" w15:restartNumberingAfterBreak="0">
     <w:nsid w:val="722301E0"/>
     <w:multiLevelType w:val="multilevel"/>
     <w:tmpl w:val="1EE82E5A"/>
@@ -23849,7 +25100,7 @@
       </w:rPr>
     </w:lvl>
   </w:abstractNum>
-  <w:abstractNum w:abstractNumId="141" w15:restartNumberingAfterBreak="0">
+  <w:abstractNum w:abstractNumId="145" w15:restartNumberingAfterBreak="0">
     <w:nsid w:val="75144C65"/>
     <w:multiLevelType w:val="hybridMultilevel"/>
     <w:tmpl w:val="12127FAA"/>
@@ -23962,7 +25213,7 @@
       </w:rPr>
     </w:lvl>
   </w:abstractNum>
-  <w:abstractNum w:abstractNumId="142" w15:restartNumberingAfterBreak="0">
+  <w:abstractNum w:abstractNumId="146" w15:restartNumberingAfterBreak="0">
     <w:nsid w:val="75237F84"/>
     <w:multiLevelType w:val="hybridMultilevel"/>
     <w:tmpl w:val="5F0A6EF2"/>
@@ -24075,7 +25326,7 @@
       </w:rPr>
     </w:lvl>
   </w:abstractNum>
-  <w:abstractNum w:abstractNumId="143" w15:restartNumberingAfterBreak="0">
+  <w:abstractNum w:abstractNumId="147" w15:restartNumberingAfterBreak="0">
     <w:nsid w:val="758968F2"/>
     <w:multiLevelType w:val="multilevel"/>
     <w:tmpl w:val="D4241C4A"/>
@@ -24224,7 +25475,7 @@
       </w:rPr>
     </w:lvl>
   </w:abstractNum>
-  <w:abstractNum w:abstractNumId="144" w15:restartNumberingAfterBreak="0">
+  <w:abstractNum w:abstractNumId="148" w15:restartNumberingAfterBreak="0">
     <w:nsid w:val="75C90201"/>
     <w:multiLevelType w:val="hybridMultilevel"/>
     <w:tmpl w:val="02D63AEC"/>
@@ -24337,7 +25588,7 @@
       </w:rPr>
     </w:lvl>
   </w:abstractNum>
-  <w:abstractNum w:abstractNumId="145" w15:restartNumberingAfterBreak="0">
+  <w:abstractNum w:abstractNumId="149" w15:restartNumberingAfterBreak="0">
     <w:nsid w:val="75F3357C"/>
     <w:multiLevelType w:val="hybridMultilevel"/>
     <w:tmpl w:val="26723550"/>
@@ -24450,7 +25701,7 @@
       </w:rPr>
     </w:lvl>
   </w:abstractNum>
-  <w:abstractNum w:abstractNumId="146" w15:restartNumberingAfterBreak="0">
+  <w:abstractNum w:abstractNumId="150" w15:restartNumberingAfterBreak="0">
     <w:nsid w:val="75FF09B0"/>
     <w:multiLevelType w:val="multilevel"/>
     <w:tmpl w:val="C34A7734"/>
@@ -24599,7 +25850,7 @@
       </w:rPr>
     </w:lvl>
   </w:abstractNum>
-  <w:abstractNum w:abstractNumId="147" w15:restartNumberingAfterBreak="0">
+  <w:abstractNum w:abstractNumId="151" w15:restartNumberingAfterBreak="0">
     <w:nsid w:val="76864E3D"/>
     <w:multiLevelType w:val="hybridMultilevel"/>
     <w:tmpl w:val="9000C896"/>
@@ -24712,7 +25963,7 @@
       </w:rPr>
     </w:lvl>
   </w:abstractNum>
-  <w:abstractNum w:abstractNumId="148" w15:restartNumberingAfterBreak="0">
+  <w:abstractNum w:abstractNumId="152" w15:restartNumberingAfterBreak="0">
     <w:nsid w:val="774028FF"/>
     <w:multiLevelType w:val="hybridMultilevel"/>
     <w:tmpl w:val="EED036DC"/>
@@ -24825,7 +26076,7 @@
       </w:rPr>
     </w:lvl>
   </w:abstractNum>
-  <w:abstractNum w:abstractNumId="149" w15:restartNumberingAfterBreak="0">
+  <w:abstractNum w:abstractNumId="153" w15:restartNumberingAfterBreak="0">
     <w:nsid w:val="777E68D9"/>
     <w:multiLevelType w:val="multilevel"/>
     <w:tmpl w:val="3F503B98"/>
@@ -24974,7 +26225,7 @@
       </w:rPr>
     </w:lvl>
   </w:abstractNum>
-  <w:abstractNum w:abstractNumId="150" w15:restartNumberingAfterBreak="0">
+  <w:abstractNum w:abstractNumId="154" w15:restartNumberingAfterBreak="0">
     <w:nsid w:val="77960362"/>
     <w:multiLevelType w:val="multilevel"/>
     <w:tmpl w:val="FEA0022E"/>
@@ -25123,7 +26374,7 @@
       </w:rPr>
     </w:lvl>
   </w:abstractNum>
-  <w:abstractNum w:abstractNumId="151" w15:restartNumberingAfterBreak="0">
+  <w:abstractNum w:abstractNumId="155" w15:restartNumberingAfterBreak="0">
     <w:nsid w:val="78547E35"/>
     <w:multiLevelType w:val="multilevel"/>
     <w:tmpl w:val="FC1421DE"/>
@@ -25272,7 +26523,120 @@
       </w:rPr>
     </w:lvl>
   </w:abstractNum>
-  <w:abstractNum w:abstractNumId="152" w15:restartNumberingAfterBreak="0">
+  <w:abstractNum w:abstractNumId="156" w15:restartNumberingAfterBreak="0">
+    <w:nsid w:val="78553766"/>
+    <w:multiLevelType w:val="hybridMultilevel"/>
+    <w:tmpl w:val="246CBCB4"/>
+    <w:lvl w:ilvl="0" w:tplc="04090005">
+      <w:start w:val="1"/>
+      <w:numFmt w:val="bullet"/>
+      <w:lvlText w:val=""/>
+      <w:lvlJc w:val="left"/>
+      <w:pPr>
+        <w:ind w:left="1080" w:hanging="360"/>
+      </w:pPr>
+      <w:rPr>
+        <w:rFonts w:ascii="Wingdings" w:hAnsi="Wingdings" w:hint="default"/>
+      </w:rPr>
+    </w:lvl>
+    <w:lvl w:ilvl="1" w:tplc="04090003" w:tentative="1">
+      <w:start w:val="1"/>
+      <w:numFmt w:val="bullet"/>
+      <w:lvlText w:val="o"/>
+      <w:lvlJc w:val="left"/>
+      <w:pPr>
+        <w:ind w:left="1800" w:hanging="360"/>
+      </w:pPr>
+      <w:rPr>
+        <w:rFonts w:ascii="Courier New" w:hAnsi="Courier New" w:cs="Courier New" w:hint="default"/>
+      </w:rPr>
+    </w:lvl>
+    <w:lvl w:ilvl="2" w:tplc="04090005" w:tentative="1">
+      <w:start w:val="1"/>
+      <w:numFmt w:val="bullet"/>
+      <w:lvlText w:val=""/>
+      <w:lvlJc w:val="left"/>
+      <w:pPr>
+        <w:ind w:left="2520" w:hanging="360"/>
+      </w:pPr>
+      <w:rPr>
+        <w:rFonts w:ascii="Wingdings" w:hAnsi="Wingdings" w:hint="default"/>
+      </w:rPr>
+    </w:lvl>
+    <w:lvl w:ilvl="3" w:tplc="04090001" w:tentative="1">
+      <w:start w:val="1"/>
+      <w:numFmt w:val="bullet"/>
+      <w:lvlText w:val=""/>
+      <w:lvlJc w:val="left"/>
+      <w:pPr>
+        <w:ind w:left="3240" w:hanging="360"/>
+      </w:pPr>
+      <w:rPr>
+        <w:rFonts w:ascii="Symbol" w:hAnsi="Symbol" w:hint="default"/>
+      </w:rPr>
+    </w:lvl>
+    <w:lvl w:ilvl="4" w:tplc="04090003" w:tentative="1">
+      <w:start w:val="1"/>
+      <w:numFmt w:val="bullet"/>
+      <w:lvlText w:val="o"/>
+      <w:lvlJc w:val="left"/>
+      <w:pPr>
+        <w:ind w:left="3960" w:hanging="360"/>
+      </w:pPr>
+      <w:rPr>
+        <w:rFonts w:ascii="Courier New" w:hAnsi="Courier New" w:cs="Courier New" w:hint="default"/>
+      </w:rPr>
+    </w:lvl>
+    <w:lvl w:ilvl="5" w:tplc="04090005" w:tentative="1">
+      <w:start w:val="1"/>
+      <w:numFmt w:val="bullet"/>
+      <w:lvlText w:val=""/>
+      <w:lvlJc w:val="left"/>
+      <w:pPr>
+        <w:ind w:left="4680" w:hanging="360"/>
+      </w:pPr>
+      <w:rPr>
+        <w:rFonts w:ascii="Wingdings" w:hAnsi="Wingdings" w:hint="default"/>
+      </w:rPr>
+    </w:lvl>
+    <w:lvl w:ilvl="6" w:tplc="04090001" w:tentative="1">
+      <w:start w:val="1"/>
+      <w:numFmt w:val="bullet"/>
+      <w:lvlText w:val=""/>
+      <w:lvlJc w:val="left"/>
+      <w:pPr>
+        <w:ind w:left="5400" w:hanging="360"/>
+      </w:pPr>
+      <w:rPr>
+        <w:rFonts w:ascii="Symbol" w:hAnsi="Symbol" w:hint="default"/>
+      </w:rPr>
+    </w:lvl>
+    <w:lvl w:ilvl="7" w:tplc="04090003" w:tentative="1">
+      <w:start w:val="1"/>
+      <w:numFmt w:val="bullet"/>
+      <w:lvlText w:val="o"/>
+      <w:lvlJc w:val="left"/>
+      <w:pPr>
+        <w:ind w:left="6120" w:hanging="360"/>
+      </w:pPr>
+      <w:rPr>
+        <w:rFonts w:ascii="Courier New" w:hAnsi="Courier New" w:cs="Courier New" w:hint="default"/>
+      </w:rPr>
+    </w:lvl>
+    <w:lvl w:ilvl="8" w:tplc="04090005" w:tentative="1">
+      <w:start w:val="1"/>
+      <w:numFmt w:val="bullet"/>
+      <w:lvlText w:val=""/>
+      <w:lvlJc w:val="left"/>
+      <w:pPr>
+        <w:ind w:left="6840" w:hanging="360"/>
+      </w:pPr>
+      <w:rPr>
+        <w:rFonts w:ascii="Wingdings" w:hAnsi="Wingdings" w:hint="default"/>
+      </w:rPr>
+    </w:lvl>
+  </w:abstractNum>
+  <w:abstractNum w:abstractNumId="157" w15:restartNumberingAfterBreak="0">
     <w:nsid w:val="785A644F"/>
     <w:multiLevelType w:val="multilevel"/>
     <w:tmpl w:val="D1DC60FE"/>
@@ -25421,7 +26785,7 @@
       </w:rPr>
     </w:lvl>
   </w:abstractNum>
-  <w:abstractNum w:abstractNumId="153" w15:restartNumberingAfterBreak="0">
+  <w:abstractNum w:abstractNumId="158" w15:restartNumberingAfterBreak="0">
     <w:nsid w:val="78B62297"/>
     <w:multiLevelType w:val="multilevel"/>
     <w:tmpl w:val="2AA67CDA"/>
@@ -25570,7 +26934,7 @@
       </w:rPr>
     </w:lvl>
   </w:abstractNum>
-  <w:abstractNum w:abstractNumId="154" w15:restartNumberingAfterBreak="0">
+  <w:abstractNum w:abstractNumId="159" w15:restartNumberingAfterBreak="0">
     <w:nsid w:val="79E63650"/>
     <w:multiLevelType w:val="multilevel"/>
     <w:tmpl w:val="98AA5BE8"/>
@@ -25719,7 +27083,7 @@
       </w:rPr>
     </w:lvl>
   </w:abstractNum>
-  <w:abstractNum w:abstractNumId="155" w15:restartNumberingAfterBreak="0">
+  <w:abstractNum w:abstractNumId="160" w15:restartNumberingAfterBreak="0">
     <w:nsid w:val="7BFA03DF"/>
     <w:multiLevelType w:val="hybridMultilevel"/>
     <w:tmpl w:val="536A979E"/>
@@ -25832,7 +27196,7 @@
       </w:rPr>
     </w:lvl>
   </w:abstractNum>
-  <w:abstractNum w:abstractNumId="156" w15:restartNumberingAfterBreak="0">
+  <w:abstractNum w:abstractNumId="161" w15:restartNumberingAfterBreak="0">
     <w:nsid w:val="7CA524B4"/>
     <w:multiLevelType w:val="hybridMultilevel"/>
     <w:tmpl w:val="957C4F4A"/>
@@ -25945,7 +27309,7 @@
       </w:rPr>
     </w:lvl>
   </w:abstractNum>
-  <w:abstractNum w:abstractNumId="157" w15:restartNumberingAfterBreak="0">
+  <w:abstractNum w:abstractNumId="162" w15:restartNumberingAfterBreak="0">
     <w:nsid w:val="7E1C597E"/>
     <w:multiLevelType w:val="multilevel"/>
     <w:tmpl w:val="2AA67CDA"/>
@@ -26094,7 +27458,7 @@
       </w:rPr>
     </w:lvl>
   </w:abstractNum>
-  <w:abstractNum w:abstractNumId="158" w15:restartNumberingAfterBreak="0">
+  <w:abstractNum w:abstractNumId="163" w15:restartNumberingAfterBreak="0">
     <w:nsid w:val="7EBD7710"/>
     <w:multiLevelType w:val="hybridMultilevel"/>
     <w:tmpl w:val="C8C6F7A0"/>
@@ -26207,7 +27571,7 @@
       </w:rPr>
     </w:lvl>
   </w:abstractNum>
-  <w:abstractNum w:abstractNumId="159" w15:restartNumberingAfterBreak="0">
+  <w:abstractNum w:abstractNumId="164" w15:restartNumberingAfterBreak="0">
     <w:nsid w:val="7F233031"/>
     <w:multiLevelType w:val="hybridMultilevel"/>
     <w:tmpl w:val="0D22564E"/>
@@ -26320,7 +27684,7 @@
       </w:rPr>
     </w:lvl>
   </w:abstractNum>
-  <w:abstractNum w:abstractNumId="160" w15:restartNumberingAfterBreak="0">
+  <w:abstractNum w:abstractNumId="165" w15:restartNumberingAfterBreak="0">
     <w:nsid w:val="7F426DF2"/>
     <w:multiLevelType w:val="multilevel"/>
     <w:tmpl w:val="430EFE5E"/>
@@ -26473,7 +27837,7 @@
     <w:abstractNumId w:val="64"/>
   </w:num>
   <w:num w:numId="2" w16cid:durableId="967664612">
-    <w:abstractNumId w:val="117"/>
+    <w:abstractNumId w:val="120"/>
   </w:num>
   <w:num w:numId="3" w16cid:durableId="361631616">
     <w:abstractNumId w:val="85"/>
@@ -26482,13 +27846,13 @@
     <w:abstractNumId w:val="100"/>
   </w:num>
   <w:num w:numId="5" w16cid:durableId="1647204897">
-    <w:abstractNumId w:val="156"/>
+    <w:abstractNumId w:val="161"/>
   </w:num>
   <w:num w:numId="6" w16cid:durableId="682589869">
     <w:abstractNumId w:val="32"/>
   </w:num>
   <w:num w:numId="7" w16cid:durableId="679703478">
-    <w:abstractNumId w:val="125"/>
+    <w:abstractNumId w:val="128"/>
   </w:num>
   <w:num w:numId="8" w16cid:durableId="496455128">
     <w:abstractNumId w:val="58"/>
@@ -26500,7 +27864,7 @@
     <w:abstractNumId w:val="83"/>
   </w:num>
   <w:num w:numId="11" w16cid:durableId="1412503779">
-    <w:abstractNumId w:val="127"/>
+    <w:abstractNumId w:val="130"/>
   </w:num>
   <w:num w:numId="12" w16cid:durableId="1107113995">
     <w:abstractNumId w:val="59"/>
@@ -26509,34 +27873,34 @@
     <w:abstractNumId w:val="33"/>
   </w:num>
   <w:num w:numId="14" w16cid:durableId="1529222885">
-    <w:abstractNumId w:val="155"/>
+    <w:abstractNumId w:val="160"/>
   </w:num>
   <w:num w:numId="15" w16cid:durableId="836580755">
     <w:abstractNumId w:val="23"/>
   </w:num>
   <w:num w:numId="16" w16cid:durableId="1344674502">
-    <w:abstractNumId w:val="104"/>
+    <w:abstractNumId w:val="107"/>
   </w:num>
   <w:num w:numId="17" w16cid:durableId="1320882603">
-    <w:abstractNumId w:val="137"/>
+    <w:abstractNumId w:val="141"/>
   </w:num>
   <w:num w:numId="18" w16cid:durableId="1139028372">
     <w:abstractNumId w:val="60"/>
   </w:num>
   <w:num w:numId="19" w16cid:durableId="1525635473">
-    <w:abstractNumId w:val="114"/>
+    <w:abstractNumId w:val="117"/>
   </w:num>
   <w:num w:numId="20" w16cid:durableId="609623515">
-    <w:abstractNumId w:val="158"/>
+    <w:abstractNumId w:val="163"/>
   </w:num>
   <w:num w:numId="21" w16cid:durableId="165170997">
-    <w:abstractNumId w:val="130"/>
+    <w:abstractNumId w:val="133"/>
   </w:num>
   <w:num w:numId="22" w16cid:durableId="1620525290">
     <w:abstractNumId w:val="41"/>
   </w:num>
   <w:num w:numId="23" w16cid:durableId="400753109">
-    <w:abstractNumId w:val="141"/>
+    <w:abstractNumId w:val="145"/>
   </w:num>
   <w:num w:numId="24" w16cid:durableId="193882219">
     <w:abstractNumId w:val="8"/>
@@ -26554,13 +27918,13 @@
     <w:abstractNumId w:val="24"/>
   </w:num>
   <w:num w:numId="29" w16cid:durableId="2124693280">
-    <w:abstractNumId w:val="119"/>
+    <w:abstractNumId w:val="122"/>
   </w:num>
   <w:num w:numId="30" w16cid:durableId="1367099744">
     <w:abstractNumId w:val="47"/>
   </w:num>
   <w:num w:numId="31" w16cid:durableId="2011105642">
-    <w:abstractNumId w:val="105"/>
+    <w:abstractNumId w:val="108"/>
   </w:num>
   <w:num w:numId="32" w16cid:durableId="831995364">
     <w:abstractNumId w:val="37"/>
@@ -26578,7 +27942,7 @@
     <w:abstractNumId w:val="3"/>
   </w:num>
   <w:num w:numId="37" w16cid:durableId="1849755457">
-    <w:abstractNumId w:val="142"/>
+    <w:abstractNumId w:val="146"/>
   </w:num>
   <w:num w:numId="38" w16cid:durableId="516505904">
     <w:abstractNumId w:val="21"/>
@@ -26596,7 +27960,7 @@
     <w:abstractNumId w:val="89"/>
   </w:num>
   <w:num w:numId="43" w16cid:durableId="1060447452">
-    <w:abstractNumId w:val="102"/>
+    <w:abstractNumId w:val="104"/>
   </w:num>
   <w:num w:numId="44" w16cid:durableId="1772503672">
     <w:abstractNumId w:val="79"/>
@@ -26608,34 +27972,34 @@
     <w:abstractNumId w:val="40"/>
   </w:num>
   <w:num w:numId="47" w16cid:durableId="68767822">
-    <w:abstractNumId w:val="128"/>
+    <w:abstractNumId w:val="131"/>
   </w:num>
   <w:num w:numId="48" w16cid:durableId="1992058265">
     <w:abstractNumId w:val="9"/>
   </w:num>
   <w:num w:numId="49" w16cid:durableId="788475134">
-    <w:abstractNumId w:val="152"/>
+    <w:abstractNumId w:val="157"/>
   </w:num>
   <w:num w:numId="50" w16cid:durableId="224419455">
-    <w:abstractNumId w:val="134"/>
+    <w:abstractNumId w:val="137"/>
   </w:num>
   <w:num w:numId="51" w16cid:durableId="1699575947">
-    <w:abstractNumId w:val="113"/>
+    <w:abstractNumId w:val="116"/>
   </w:num>
   <w:num w:numId="52" w16cid:durableId="1048916239">
     <w:abstractNumId w:val="71"/>
   </w:num>
   <w:num w:numId="53" w16cid:durableId="1188711211">
-    <w:abstractNumId w:val="146"/>
+    <w:abstractNumId w:val="150"/>
   </w:num>
   <w:num w:numId="54" w16cid:durableId="447555614">
-    <w:abstractNumId w:val="116"/>
+    <w:abstractNumId w:val="119"/>
   </w:num>
   <w:num w:numId="55" w16cid:durableId="1679307268">
     <w:abstractNumId w:val="68"/>
   </w:num>
   <w:num w:numId="56" w16cid:durableId="693773591">
-    <w:abstractNumId w:val="132"/>
+    <w:abstractNumId w:val="135"/>
   </w:num>
   <w:num w:numId="57" w16cid:durableId="1110473324">
     <w:abstractNumId w:val="50"/>
@@ -26647,7 +28011,7 @@
     <w:abstractNumId w:val="57"/>
   </w:num>
   <w:num w:numId="60" w16cid:durableId="2095394549">
-    <w:abstractNumId w:val="150"/>
+    <w:abstractNumId w:val="154"/>
   </w:num>
   <w:num w:numId="61" w16cid:durableId="1299921011">
     <w:abstractNumId w:val="55"/>
@@ -26665,7 +28029,7 @@
     <w:abstractNumId w:val="92"/>
   </w:num>
   <w:num w:numId="66" w16cid:durableId="484011382">
-    <w:abstractNumId w:val="126"/>
+    <w:abstractNumId w:val="129"/>
   </w:num>
   <w:num w:numId="67" w16cid:durableId="2008289242">
     <w:abstractNumId w:val="18"/>
@@ -26677,10 +28041,10 @@
     <w:abstractNumId w:val="98"/>
   </w:num>
   <w:num w:numId="70" w16cid:durableId="336662050">
-    <w:abstractNumId w:val="112"/>
+    <w:abstractNumId w:val="115"/>
   </w:num>
   <w:num w:numId="71" w16cid:durableId="1460032333">
-    <w:abstractNumId w:val="131"/>
+    <w:abstractNumId w:val="134"/>
   </w:num>
   <w:num w:numId="72" w16cid:durableId="592400615">
     <w:abstractNumId w:val="15"/>
@@ -26701,10 +28065,10 @@
     <w:abstractNumId w:val="101"/>
   </w:num>
   <w:num w:numId="78" w16cid:durableId="2138137265">
-    <w:abstractNumId w:val="118"/>
+    <w:abstractNumId w:val="121"/>
   </w:num>
   <w:num w:numId="79" w16cid:durableId="343675924">
-    <w:abstractNumId w:val="138"/>
+    <w:abstractNumId w:val="142"/>
   </w:num>
   <w:num w:numId="80" w16cid:durableId="1823277442">
     <w:abstractNumId w:val="54"/>
@@ -26716,13 +28080,13 @@
     <w:abstractNumId w:val="97"/>
   </w:num>
   <w:num w:numId="83" w16cid:durableId="1253051103">
-    <w:abstractNumId w:val="129"/>
+    <w:abstractNumId w:val="132"/>
   </w:num>
   <w:num w:numId="84" w16cid:durableId="444888444">
     <w:abstractNumId w:val="63"/>
   </w:num>
   <w:num w:numId="85" w16cid:durableId="64299649">
-    <w:abstractNumId w:val="120"/>
+    <w:abstractNumId w:val="123"/>
   </w:num>
   <w:num w:numId="86" w16cid:durableId="868182992">
     <w:abstractNumId w:val="78"/>
@@ -26731,7 +28095,7 @@
     <w:abstractNumId w:val="34"/>
   </w:num>
   <w:num w:numId="88" w16cid:durableId="505442826">
-    <w:abstractNumId w:val="124"/>
+    <w:abstractNumId w:val="127"/>
   </w:num>
   <w:num w:numId="89" w16cid:durableId="1858763908">
     <w:abstractNumId w:val="48"/>
@@ -26740,7 +28104,7 @@
     <w:abstractNumId w:val="20"/>
   </w:num>
   <w:num w:numId="91" w16cid:durableId="1284576603">
-    <w:abstractNumId w:val="106"/>
+    <w:abstractNumId w:val="109"/>
   </w:num>
   <w:num w:numId="92" w16cid:durableId="1963075542">
     <w:abstractNumId w:val="14"/>
@@ -26752,13 +28116,13 @@
     <w:abstractNumId w:val="17"/>
   </w:num>
   <w:num w:numId="95" w16cid:durableId="1169102579">
-    <w:abstractNumId w:val="109"/>
+    <w:abstractNumId w:val="112"/>
   </w:num>
   <w:num w:numId="96" w16cid:durableId="1216501564">
     <w:abstractNumId w:val="45"/>
   </w:num>
   <w:num w:numId="97" w16cid:durableId="261768216">
-    <w:abstractNumId w:val="135"/>
+    <w:abstractNumId w:val="138"/>
   </w:num>
   <w:num w:numId="98" w16cid:durableId="2141918721">
     <w:abstractNumId w:val="91"/>
@@ -26767,7 +28131,7 @@
     <w:abstractNumId w:val="52"/>
   </w:num>
   <w:num w:numId="100" w16cid:durableId="1753887223">
-    <w:abstractNumId w:val="107"/>
+    <w:abstractNumId w:val="110"/>
   </w:num>
   <w:num w:numId="101" w16cid:durableId="1320184766">
     <w:abstractNumId w:val="39"/>
@@ -26785,10 +28149,10 @@
     <w:abstractNumId w:val="74"/>
   </w:num>
   <w:num w:numId="106" w16cid:durableId="1617908629">
-    <w:abstractNumId w:val="140"/>
+    <w:abstractNumId w:val="144"/>
   </w:num>
   <w:num w:numId="107" w16cid:durableId="970137111">
-    <w:abstractNumId w:val="157"/>
+    <w:abstractNumId w:val="162"/>
   </w:num>
   <w:num w:numId="108" w16cid:durableId="383797013">
     <w:abstractNumId w:val="61"/>
@@ -26809,16 +28173,16 @@
     <w:abstractNumId w:val="81"/>
   </w:num>
   <w:num w:numId="114" w16cid:durableId="1965042317">
-    <w:abstractNumId w:val="139"/>
+    <w:abstractNumId w:val="143"/>
   </w:num>
   <w:num w:numId="115" w16cid:durableId="670569040">
     <w:abstractNumId w:val="69"/>
   </w:num>
   <w:num w:numId="116" w16cid:durableId="413823113">
-    <w:abstractNumId w:val="153"/>
+    <w:abstractNumId w:val="158"/>
   </w:num>
   <w:num w:numId="117" w16cid:durableId="1293747982">
-    <w:abstractNumId w:val="122"/>
+    <w:abstractNumId w:val="125"/>
   </w:num>
   <w:num w:numId="118" w16cid:durableId="2058698591">
     <w:abstractNumId w:val="75"/>
@@ -26827,7 +28191,7 @@
     <w:abstractNumId w:val="95"/>
   </w:num>
   <w:num w:numId="120" w16cid:durableId="1449229938">
-    <w:abstractNumId w:val="143"/>
+    <w:abstractNumId w:val="147"/>
   </w:num>
   <w:num w:numId="121" w16cid:durableId="177283374">
     <w:abstractNumId w:val="12"/>
@@ -26836,31 +28200,31 @@
     <w:abstractNumId w:val="16"/>
   </w:num>
   <w:num w:numId="123" w16cid:durableId="1495337109">
-    <w:abstractNumId w:val="147"/>
+    <w:abstractNumId w:val="151"/>
   </w:num>
   <w:num w:numId="124" w16cid:durableId="302319311">
-    <w:abstractNumId w:val="103"/>
+    <w:abstractNumId w:val="106"/>
   </w:num>
   <w:num w:numId="125" w16cid:durableId="1891844186">
-    <w:abstractNumId w:val="121"/>
+    <w:abstractNumId w:val="124"/>
   </w:num>
   <w:num w:numId="126" w16cid:durableId="256911009">
     <w:abstractNumId w:val="1"/>
   </w:num>
   <w:num w:numId="127" w16cid:durableId="1001927776">
-    <w:abstractNumId w:val="159"/>
+    <w:abstractNumId w:val="164"/>
   </w:num>
   <w:num w:numId="128" w16cid:durableId="1365057616">
-    <w:abstractNumId w:val="108"/>
+    <w:abstractNumId w:val="111"/>
   </w:num>
   <w:num w:numId="129" w16cid:durableId="2142647602">
-    <w:abstractNumId w:val="110"/>
+    <w:abstractNumId w:val="113"/>
   </w:num>
   <w:num w:numId="130" w16cid:durableId="1895652277">
-    <w:abstractNumId w:val="160"/>
+    <w:abstractNumId w:val="165"/>
   </w:num>
   <w:num w:numId="131" w16cid:durableId="1132407586">
-    <w:abstractNumId w:val="151"/>
+    <w:abstractNumId w:val="155"/>
   </w:num>
   <w:num w:numId="132" w16cid:durableId="1209996408">
     <w:abstractNumId w:val="13"/>
@@ -26869,13 +28233,13 @@
     <w:abstractNumId w:val="5"/>
   </w:num>
   <w:num w:numId="134" w16cid:durableId="220867256">
-    <w:abstractNumId w:val="123"/>
+    <w:abstractNumId w:val="126"/>
   </w:num>
   <w:num w:numId="135" w16cid:durableId="2026857351">
     <w:abstractNumId w:val="38"/>
   </w:num>
   <w:num w:numId="136" w16cid:durableId="1236696510">
-    <w:abstractNumId w:val="149"/>
+    <w:abstractNumId w:val="153"/>
   </w:num>
   <w:num w:numId="137" w16cid:durableId="1156385716">
     <w:abstractNumId w:val="53"/>
@@ -26911,31 +28275,31 @@
     <w:abstractNumId w:val="10"/>
   </w:num>
   <w:num w:numId="148" w16cid:durableId="1917398031">
-    <w:abstractNumId w:val="115"/>
+    <w:abstractNumId w:val="118"/>
   </w:num>
   <w:num w:numId="149" w16cid:durableId="524444307">
-    <w:abstractNumId w:val="136"/>
+    <w:abstractNumId w:val="139"/>
   </w:num>
   <w:num w:numId="150" w16cid:durableId="859783391">
-    <w:abstractNumId w:val="145"/>
+    <w:abstractNumId w:val="149"/>
   </w:num>
   <w:num w:numId="151" w16cid:durableId="2097357959">
-    <w:abstractNumId w:val="148"/>
+    <w:abstractNumId w:val="152"/>
   </w:num>
   <w:num w:numId="152" w16cid:durableId="748579603">
-    <w:abstractNumId w:val="154"/>
+    <w:abstractNumId w:val="159"/>
   </w:num>
   <w:num w:numId="153" w16cid:durableId="1193568221">
     <w:abstractNumId w:val="29"/>
   </w:num>
   <w:num w:numId="154" w16cid:durableId="913079688">
-    <w:abstractNumId w:val="111"/>
+    <w:abstractNumId w:val="114"/>
   </w:num>
   <w:num w:numId="155" w16cid:durableId="1216234668">
     <w:abstractNumId w:val="56"/>
   </w:num>
   <w:num w:numId="156" w16cid:durableId="240020660">
-    <w:abstractNumId w:val="144"/>
+    <w:abstractNumId w:val="148"/>
   </w:num>
   <w:num w:numId="157" w16cid:durableId="1604263775">
     <w:abstractNumId w:val="43"/>
@@ -26950,7 +28314,22 @@
     <w:abstractNumId w:val="87"/>
   </w:num>
   <w:num w:numId="161" w16cid:durableId="610010161">
-    <w:abstractNumId w:val="133"/>
+    <w:abstractNumId w:val="136"/>
+  </w:num>
+  <w:num w:numId="162" w16cid:durableId="1104762223">
+    <w:abstractNumId w:val="140"/>
+  </w:num>
+  <w:num w:numId="163" w16cid:durableId="596792981">
+    <w:abstractNumId w:val="105"/>
+  </w:num>
+  <w:num w:numId="164" w16cid:durableId="2035573063">
+    <w:abstractNumId w:val="102"/>
+  </w:num>
+  <w:num w:numId="165" w16cid:durableId="1444885796">
+    <w:abstractNumId w:val="103"/>
+  </w:num>
+  <w:num w:numId="166" w16cid:durableId="1898589376">
+    <w:abstractNumId w:val="156"/>
   </w:num>
   <w:numIdMacAtCleanup w:val="45"/>
 </w:numbering>

</xml_diff>

<commit_message>
AI Assistant Workflow (#274)
</commit_message>
<xml_diff>
--- a/Activity Specification Document.docx
+++ b/Activity Specification Document.docx
@@ -6147,6 +6147,538 @@
     </w:p>
     <w:p>
       <w:pPr>
+        <w:pStyle w:val="Heading3"/>
+      </w:pPr>
+      <w:r>
+        <w:lastRenderedPageBreak/>
+        <w:t xml:space="preserve">11- </w:t>
+      </w:r>
+      <w:r>
+        <w:t>AI Assistant Workflow Activity</w:t>
+      </w:r>
+    </w:p>
+    <w:p>
+      <w:pPr>
+        <w:tabs>
+          <w:tab w:val="left" w:pos="3645"/>
+        </w:tabs>
+        <w:rPr>
+          <w:b/>
+          <w:bCs/>
+        </w:rPr>
+      </w:pPr>
+      <w:r>
+        <w:rPr>
+          <w:b/>
+          <w:bCs/>
+        </w:rPr>
+        <w:t>Purpose</w:t>
+      </w:r>
+    </w:p>
+    <w:p>
+      <w:pPr>
+        <w:tabs>
+          <w:tab w:val="left" w:pos="3645"/>
+        </w:tabs>
+      </w:pPr>
+      <w:r>
+        <w:t>AI Assistant Workflow Activity Diagram shows the process through which users will interact with the AI assistant that forms part of the KriGo system. This workflow explains how users' requests will be processed, relevant information will be extracted, and intelligent responses will be formulated to assist in reservations, questions about vehicles, payment transactions, and any other questions related to the platform.</w:t>
+      </w:r>
+    </w:p>
+    <w:p>
+      <w:pPr>
+        <w:tabs>
+          <w:tab w:val="left" w:pos="3645"/>
+        </w:tabs>
+        <w:rPr>
+          <w:b/>
+          <w:bCs/>
+        </w:rPr>
+      </w:pPr>
+      <w:r>
+        <w:rPr>
+          <w:b/>
+          <w:bCs/>
+        </w:rPr>
+        <w:t>Workflow Description</w:t>
+      </w:r>
+    </w:p>
+    <w:p>
+      <w:pPr>
+        <w:tabs>
+          <w:tab w:val="left" w:pos="3645"/>
+        </w:tabs>
+      </w:pPr>
+      <w:r>
+        <w:t>The workflow begins with the user asking the AI assistant a question or making a request. The system will analyze the user's input and identify the nature of the request. Relevant information will then be extracted and used to generate a natural language response to the request. If there is no suitable response, the system will advise the user to contact customer support.</w:t>
+      </w:r>
+    </w:p>
+    <w:p>
+      <w:pPr>
+        <w:tabs>
+          <w:tab w:val="left" w:pos="3645"/>
+        </w:tabs>
+        <w:rPr>
+          <w:b/>
+          <w:bCs/>
+        </w:rPr>
+      </w:pPr>
+      <w:r>
+        <w:rPr>
+          <w:b/>
+          <w:bCs/>
+        </w:rPr>
+        <w:t>Main Activities</w:t>
+      </w:r>
+    </w:p>
+    <w:p>
+      <w:pPr>
+        <w:pStyle w:val="ListParagraph"/>
+        <w:numPr>
+          <w:ilvl w:val="0"/>
+          <w:numId w:val="172"/>
+        </w:numPr>
+        <w:tabs>
+          <w:tab w:val="left" w:pos="3645"/>
+        </w:tabs>
+      </w:pPr>
+      <w:r>
+        <w:t>Open the AI assistant.</w:t>
+      </w:r>
+    </w:p>
+    <w:p>
+      <w:pPr>
+        <w:pStyle w:val="ListParagraph"/>
+        <w:numPr>
+          <w:ilvl w:val="0"/>
+          <w:numId w:val="172"/>
+        </w:numPr>
+        <w:tabs>
+          <w:tab w:val="left" w:pos="3645"/>
+        </w:tabs>
+      </w:pPr>
+      <w:r>
+        <w:t>Enter a question.</w:t>
+      </w:r>
+    </w:p>
+    <w:p>
+      <w:pPr>
+        <w:pStyle w:val="ListParagraph"/>
+        <w:numPr>
+          <w:ilvl w:val="0"/>
+          <w:numId w:val="172"/>
+        </w:numPr>
+        <w:tabs>
+          <w:tab w:val="left" w:pos="3645"/>
+        </w:tabs>
+      </w:pPr>
+      <w:r>
+        <w:t>Process the user request.</w:t>
+      </w:r>
+    </w:p>
+    <w:p>
+      <w:pPr>
+        <w:pStyle w:val="ListParagraph"/>
+        <w:numPr>
+          <w:ilvl w:val="0"/>
+          <w:numId w:val="172"/>
+        </w:numPr>
+        <w:tabs>
+          <w:tab w:val="left" w:pos="3645"/>
+        </w:tabs>
+      </w:pPr>
+      <w:r>
+        <w:t>Determine the request type.</w:t>
+      </w:r>
+    </w:p>
+    <w:p>
+      <w:pPr>
+        <w:pStyle w:val="ListParagraph"/>
+        <w:numPr>
+          <w:ilvl w:val="0"/>
+          <w:numId w:val="172"/>
+        </w:numPr>
+        <w:tabs>
+          <w:tab w:val="left" w:pos="3645"/>
+        </w:tabs>
+      </w:pPr>
+      <w:r>
+        <w:t>Retrieve relevant information.</w:t>
+      </w:r>
+    </w:p>
+    <w:p>
+      <w:pPr>
+        <w:pStyle w:val="ListParagraph"/>
+        <w:numPr>
+          <w:ilvl w:val="0"/>
+          <w:numId w:val="172"/>
+        </w:numPr>
+        <w:tabs>
+          <w:tab w:val="left" w:pos="3645"/>
+        </w:tabs>
+      </w:pPr>
+      <w:r>
+        <w:t>Generate an AI response.</w:t>
+      </w:r>
+    </w:p>
+    <w:p>
+      <w:pPr>
+        <w:pStyle w:val="ListParagraph"/>
+        <w:numPr>
+          <w:ilvl w:val="0"/>
+          <w:numId w:val="172"/>
+        </w:numPr>
+        <w:tabs>
+          <w:tab w:val="left" w:pos="3645"/>
+        </w:tabs>
+      </w:pPr>
+      <w:r>
+        <w:t>Display the response or recommend customer support.</w:t>
+      </w:r>
+    </w:p>
+    <w:p>
+      <w:pPr>
+        <w:tabs>
+          <w:tab w:val="left" w:pos="3645"/>
+        </w:tabs>
+        <w:rPr>
+          <w:b/>
+          <w:bCs/>
+        </w:rPr>
+      </w:pPr>
+      <w:r>
+        <w:rPr>
+          <w:b/>
+          <w:bCs/>
+        </w:rPr>
+        <w:t>Decision Point</w:t>
+      </w:r>
+    </w:p>
+    <w:p>
+      <w:pPr>
+        <w:tabs>
+          <w:tab w:val="left" w:pos="3645"/>
+        </w:tabs>
+      </w:pPr>
+      <w:r>
+        <w:rPr>
+          <w:noProof/>
+        </w:rPr>
+        <mc:AlternateContent>
+          <mc:Choice Requires="wps">
+            <w:drawing>
+              <wp:anchor distT="0" distB="0" distL="114300" distR="114300" simplePos="0" relativeHeight="251666432" behindDoc="0" locked="0" layoutInCell="1" allowOverlap="1" wp14:anchorId="2EFF6CF0" wp14:editId="4C0A8E94">
+                <wp:simplePos x="0" y="0"/>
+                <wp:positionH relativeFrom="column">
+                  <wp:posOffset>2921635</wp:posOffset>
+                </wp:positionH>
+                <wp:positionV relativeFrom="paragraph">
+                  <wp:posOffset>4090670</wp:posOffset>
+                </wp:positionV>
+                <wp:extent cx="3219450" cy="635"/>
+                <wp:effectExtent l="0" t="0" r="0" b="0"/>
+                <wp:wrapSquare wrapText="bothSides"/>
+                <wp:docPr id="1117625285" name="Text Box 1"/>
+                <wp:cNvGraphicFramePr/>
+                <a:graphic xmlns:a="http://schemas.openxmlformats.org/drawingml/2006/main">
+                  <a:graphicData uri="http://schemas.microsoft.com/office/word/2010/wordprocessingShape">
+                    <wps:wsp>
+                      <wps:cNvSpPr txBox="1"/>
+                      <wps:spPr>
+                        <a:xfrm>
+                          <a:off x="0" y="0"/>
+                          <a:ext cx="3219450" cy="635"/>
+                        </a:xfrm>
+                        <a:prstGeom prst="rect">
+                          <a:avLst/>
+                        </a:prstGeom>
+                        <a:solidFill>
+                          <a:prstClr val="white"/>
+                        </a:solidFill>
+                        <a:ln>
+                          <a:noFill/>
+                        </a:ln>
+                      </wps:spPr>
+                      <wps:txbx>
+                        <w:txbxContent>
+                          <w:p>
+                            <w:pPr>
+                              <w:pStyle w:val="Caption"/>
+                              <w:rPr>
+                                <w:noProof/>
+                              </w:rPr>
+                            </w:pPr>
+                            <w:r>
+                              <w:t xml:space="preserve">Figure </w:t>
+                            </w:r>
+                            <w:r>
+                              <w:fldChar w:fldCharType="begin"/>
+                            </w:r>
+                            <w:r>
+                              <w:instrText xml:space="preserve"> SEQ Figure \* ARABIC </w:instrText>
+                            </w:r>
+                            <w:r>
+                              <w:fldChar w:fldCharType="separate"/>
+                            </w:r>
+                            <w:r>
+                              <w:rPr>
+                                <w:noProof/>
+                              </w:rPr>
+                              <w:t>11</w:t>
+                            </w:r>
+                            <w:r>
+                              <w:fldChar w:fldCharType="end"/>
+                            </w:r>
+                            <w:r>
+                              <w:t xml:space="preserve"> - </w:t>
+                            </w:r>
+                            <w:r>
+                              <w:t>AI Assistant Workflow Activity Diagram</w:t>
+                            </w:r>
+                          </w:p>
+                        </w:txbxContent>
+                      </wps:txbx>
+                      <wps:bodyPr rot="0" spcFirstLastPara="0" vertOverflow="overflow" horzOverflow="overflow" vert="horz" wrap="square" lIns="0" tIns="0" rIns="0" bIns="0" numCol="1" spcCol="0" rtlCol="0" fromWordArt="0" anchor="t" anchorCtr="0" forceAA="0" compatLnSpc="1">
+                        <a:prstTxWarp prst="textNoShape">
+                          <a:avLst/>
+                        </a:prstTxWarp>
+                        <a:spAutoFit/>
+                      </wps:bodyPr>
+                    </wps:wsp>
+                  </a:graphicData>
+                </a:graphic>
+              </wp:anchor>
+            </w:drawing>
+          </mc:Choice>
+          <mc:Fallback>
+            <w:pict>
+              <v:shape w14:anchorId="2EFF6CF0" id="_x0000_s1028" type="#_x0000_t202" style="position:absolute;margin-left:230.05pt;margin-top:322.1pt;width:253.5pt;height:.05pt;z-index:251666432;visibility:visible;mso-wrap-style:square;mso-wrap-distance-left:9pt;mso-wrap-distance-top:0;mso-wrap-distance-right:9pt;mso-wrap-distance-bottom:0;mso-position-horizontal:absolute;mso-position-horizontal-relative:text;mso-position-vertical:absolute;mso-position-vertical-relative:text;v-text-anchor:top" o:gfxdata="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" stroked="f">
+                <v:textbox style="mso-fit-shape-to-text:t" inset="0,0,0,0">
+                  <w:txbxContent>
+                    <w:p>
+                      <w:pPr>
+                        <w:pStyle w:val="Caption"/>
+                        <w:rPr>
+                          <w:noProof/>
+                        </w:rPr>
+                      </w:pPr>
+                      <w:r>
+                        <w:t xml:space="preserve">Figure </w:t>
+                      </w:r>
+                      <w:r>
+                        <w:fldChar w:fldCharType="begin"/>
+                      </w:r>
+                      <w:r>
+                        <w:instrText xml:space="preserve"> SEQ Figure \* ARABIC </w:instrText>
+                      </w:r>
+                      <w:r>
+                        <w:fldChar w:fldCharType="separate"/>
+                      </w:r>
+                      <w:r>
+                        <w:rPr>
+                          <w:noProof/>
+                        </w:rPr>
+                        <w:t>11</w:t>
+                      </w:r>
+                      <w:r>
+                        <w:fldChar w:fldCharType="end"/>
+                      </w:r>
+                      <w:r>
+                        <w:t xml:space="preserve"> - </w:t>
+                      </w:r>
+                      <w:r>
+                        <w:t>AI Assistant Workflow Activity Diagram</w:t>
+                      </w:r>
+                    </w:p>
+                  </w:txbxContent>
+                </v:textbox>
+                <w10:wrap type="square"/>
+              </v:shape>
+            </w:pict>
+          </mc:Fallback>
+        </mc:AlternateContent>
+      </w:r>
+      <w:r>
+        <w:rPr>
+          <w:noProof/>
+        </w:rPr>
+        <w:drawing>
+          <wp:anchor distT="0" distB="0" distL="114300" distR="114300" simplePos="0" relativeHeight="251664384" behindDoc="0" locked="0" layoutInCell="1" allowOverlap="1" wp14:anchorId="73C0AB17" wp14:editId="32AE6B7D">
+            <wp:simplePos x="0" y="0"/>
+            <wp:positionH relativeFrom="column">
+              <wp:posOffset>2921635</wp:posOffset>
+            </wp:positionH>
+            <wp:positionV relativeFrom="paragraph">
+              <wp:posOffset>157480</wp:posOffset>
+            </wp:positionV>
+            <wp:extent cx="3219450" cy="3993515"/>
+            <wp:effectExtent l="0" t="0" r="0" b="6985"/>
+            <wp:wrapSquare wrapText="bothSides"/>
+            <wp:docPr id="1035495581" name="Picture 18"/>
+            <wp:cNvGraphicFramePr>
+              <a:graphicFrameLocks xmlns:a="http://schemas.openxmlformats.org/drawingml/2006/main" noChangeAspect="1"/>
+            </wp:cNvGraphicFramePr>
+            <a:graphic xmlns:a="http://schemas.openxmlformats.org/drawingml/2006/main">
+              <a:graphicData uri="http://schemas.openxmlformats.org/drawingml/2006/picture">
+                <pic:pic xmlns:pic="http://schemas.openxmlformats.org/drawingml/2006/picture">
+                  <pic:nvPicPr>
+                    <pic:cNvPr id="0" name="Picture 21"/>
+                    <pic:cNvPicPr>
+                      <a:picLocks noChangeAspect="1" noChangeArrowheads="1"/>
+                    </pic:cNvPicPr>
+                  </pic:nvPicPr>
+                  <pic:blipFill>
+                    <a:blip r:embed="rId18">
+                      <a:extLst>
+                        <a:ext uri="{28A0092B-C50C-407E-A947-70E740481C1C}">
+                          <a14:useLocalDpi xmlns:a14="http://schemas.microsoft.com/office/drawing/2010/main" val="0"/>
+                        </a:ext>
+                      </a:extLst>
+                    </a:blip>
+                    <a:srcRect/>
+                    <a:stretch>
+                      <a:fillRect/>
+                    </a:stretch>
+                  </pic:blipFill>
+                  <pic:spPr bwMode="auto">
+                    <a:xfrm>
+                      <a:off x="0" y="0"/>
+                      <a:ext cx="3219450" cy="3993515"/>
+                    </a:xfrm>
+                    <a:prstGeom prst="rect">
+                      <a:avLst/>
+                    </a:prstGeom>
+                    <a:noFill/>
+                    <a:ln>
+                      <a:noFill/>
+                    </a:ln>
+                  </pic:spPr>
+                </pic:pic>
+              </a:graphicData>
+            </a:graphic>
+            <wp14:sizeRelH relativeFrom="margin">
+              <wp14:pctWidth>0</wp14:pctWidth>
+            </wp14:sizeRelH>
+            <wp14:sizeRelV relativeFrom="margin">
+              <wp14:pctHeight>0</wp14:pctHeight>
+            </wp14:sizeRelV>
+          </wp:anchor>
+        </w:drawing>
+      </w:r>
+      <w:r>
+        <w:rPr>
+          <w:b/>
+          <w:bCs/>
+        </w:rPr>
+        <w:t>Response Available?</w:t>
+      </w:r>
+    </w:p>
+    <w:p>
+      <w:pPr>
+        <w:numPr>
+          <w:ilvl w:val="0"/>
+          <w:numId w:val="171"/>
+        </w:numPr>
+        <w:tabs>
+          <w:tab w:val="left" w:pos="3645"/>
+        </w:tabs>
+        <w:spacing w:after="0"/>
+      </w:pPr>
+      <w:r>
+        <w:rPr>
+          <w:b/>
+          <w:bCs/>
+        </w:rPr>
+        <w:t>Yes:</w:t>
+      </w:r>
+      <w:r>
+        <w:t xml:space="preserve"> Display the generated response.</w:t>
+      </w:r>
+    </w:p>
+    <w:p>
+      <w:pPr>
+        <w:numPr>
+          <w:ilvl w:val="0"/>
+          <w:numId w:val="171"/>
+        </w:numPr>
+        <w:tabs>
+          <w:tab w:val="left" w:pos="3645"/>
+        </w:tabs>
+      </w:pPr>
+      <w:r>
+        <w:rPr>
+          <w:b/>
+          <w:bCs/>
+        </w:rPr>
+        <w:t>No:</w:t>
+      </w:r>
+      <w:r>
+        <w:t xml:space="preserve"> Suggest contacting customer support.</w:t>
+      </w:r>
+    </w:p>
+    <w:p>
+      <w:pPr>
+        <w:tabs>
+          <w:tab w:val="left" w:pos="3645"/>
+        </w:tabs>
+        <w:rPr>
+          <w:b/>
+          <w:bCs/>
+        </w:rPr>
+      </w:pPr>
+    </w:p>
+    <w:p>
+      <w:pPr>
+        <w:tabs>
+          <w:tab w:val="left" w:pos="3645"/>
+        </w:tabs>
+        <w:rPr>
+          <w:b/>
+          <w:bCs/>
+        </w:rPr>
+      </w:pPr>
+      <w:r>
+        <w:rPr>
+          <w:b/>
+          <w:bCs/>
+        </w:rPr>
+        <w:t>Conclusion</w:t>
+      </w:r>
+    </w:p>
+    <w:p>
+      <w:pPr>
+        <w:tabs>
+          <w:tab w:val="left" w:pos="3645"/>
+        </w:tabs>
+      </w:pPr>
+      <w:r>
+        <w:t>Workflow diagram for Activity of AI Assistant shows how Conversational AI helps in customer support through intelligent real time support, while any un-resolved queries are routed to the customer support team</w:t>
+      </w:r>
+      <w:r>
+        <w:t>.</w:t>
+      </w:r>
+    </w:p>
+    <w:p>
+      <w:pPr>
+        <w:spacing w:line="278" w:lineRule="auto"/>
+      </w:pPr>
+      <w:r>
+        <w:br w:type="page"/>
+      </w:r>
+    </w:p>
+    <w:p>
+      <w:pPr>
+        <w:tabs>
+          <w:tab w:val="left" w:pos="3645"/>
+        </w:tabs>
+      </w:pPr>
+      <w:r>
+        <w:lastRenderedPageBreak/>
+        <w:t xml:space="preserve"> </w:t>
+      </w:r>
+    </w:p>
+    <w:p>
+      <w:pPr>
         <w:tabs>
           <w:tab w:val="left" w:pos="3645"/>
         </w:tabs>
@@ -16065,6 +16597,155 @@
     </w:lvl>
   </w:abstractNum>
   <w:abstractNum w:abstractNumId="75" w15:restartNumberingAfterBreak="0">
+    <w:nsid w:val="3F166EB0"/>
+    <w:multiLevelType w:val="multilevel"/>
+    <w:tmpl w:val="414C6912"/>
+    <w:lvl w:ilvl="0">
+      <w:start w:val="1"/>
+      <w:numFmt w:val="bullet"/>
+      <w:lvlText w:val=""/>
+      <w:lvlJc w:val="left"/>
+      <w:pPr>
+        <w:tabs>
+          <w:tab w:val="num" w:pos="720"/>
+        </w:tabs>
+        <w:ind w:left="720" w:hanging="360"/>
+      </w:pPr>
+      <w:rPr>
+        <w:rFonts w:ascii="Symbol" w:hAnsi="Symbol" w:hint="default"/>
+        <w:sz w:val="20"/>
+      </w:rPr>
+    </w:lvl>
+    <w:lvl w:ilvl="1" w:tentative="1">
+      <w:start w:val="1"/>
+      <w:numFmt w:val="bullet"/>
+      <w:lvlText w:val="o"/>
+      <w:lvlJc w:val="left"/>
+      <w:pPr>
+        <w:tabs>
+          <w:tab w:val="num" w:pos="1440"/>
+        </w:tabs>
+        <w:ind w:left="1440" w:hanging="360"/>
+      </w:pPr>
+      <w:rPr>
+        <w:rFonts w:ascii="Courier New" w:hAnsi="Courier New" w:hint="default"/>
+        <w:sz w:val="20"/>
+      </w:rPr>
+    </w:lvl>
+    <w:lvl w:ilvl="2" w:tentative="1">
+      <w:start w:val="1"/>
+      <w:numFmt w:val="bullet"/>
+      <w:lvlText w:val=""/>
+      <w:lvlJc w:val="left"/>
+      <w:pPr>
+        <w:tabs>
+          <w:tab w:val="num" w:pos="2160"/>
+        </w:tabs>
+        <w:ind w:left="2160" w:hanging="360"/>
+      </w:pPr>
+      <w:rPr>
+        <w:rFonts w:ascii="Wingdings" w:hAnsi="Wingdings" w:hint="default"/>
+        <w:sz w:val="20"/>
+      </w:rPr>
+    </w:lvl>
+    <w:lvl w:ilvl="3" w:tentative="1">
+      <w:start w:val="1"/>
+      <w:numFmt w:val="bullet"/>
+      <w:lvlText w:val=""/>
+      <w:lvlJc w:val="left"/>
+      <w:pPr>
+        <w:tabs>
+          <w:tab w:val="num" w:pos="2880"/>
+        </w:tabs>
+        <w:ind w:left="2880" w:hanging="360"/>
+      </w:pPr>
+      <w:rPr>
+        <w:rFonts w:ascii="Wingdings" w:hAnsi="Wingdings" w:hint="default"/>
+        <w:sz w:val="20"/>
+      </w:rPr>
+    </w:lvl>
+    <w:lvl w:ilvl="4" w:tentative="1">
+      <w:start w:val="1"/>
+      <w:numFmt w:val="bullet"/>
+      <w:lvlText w:val=""/>
+      <w:lvlJc w:val="left"/>
+      <w:pPr>
+        <w:tabs>
+          <w:tab w:val="num" w:pos="3600"/>
+        </w:tabs>
+        <w:ind w:left="3600" w:hanging="360"/>
+      </w:pPr>
+      <w:rPr>
+        <w:rFonts w:ascii="Wingdings" w:hAnsi="Wingdings" w:hint="default"/>
+        <w:sz w:val="20"/>
+      </w:rPr>
+    </w:lvl>
+    <w:lvl w:ilvl="5" w:tentative="1">
+      <w:start w:val="1"/>
+      <w:numFmt w:val="bullet"/>
+      <w:lvlText w:val=""/>
+      <w:lvlJc w:val="left"/>
+      <w:pPr>
+        <w:tabs>
+          <w:tab w:val="num" w:pos="4320"/>
+        </w:tabs>
+        <w:ind w:left="4320" w:hanging="360"/>
+      </w:pPr>
+      <w:rPr>
+        <w:rFonts w:ascii="Wingdings" w:hAnsi="Wingdings" w:hint="default"/>
+        <w:sz w:val="20"/>
+      </w:rPr>
+    </w:lvl>
+    <w:lvl w:ilvl="6" w:tentative="1">
+      <w:start w:val="1"/>
+      <w:numFmt w:val="bullet"/>
+      <w:lvlText w:val=""/>
+      <w:lvlJc w:val="left"/>
+      <w:pPr>
+        <w:tabs>
+          <w:tab w:val="num" w:pos="5040"/>
+        </w:tabs>
+        <w:ind w:left="5040" w:hanging="360"/>
+      </w:pPr>
+      <w:rPr>
+        <w:rFonts w:ascii="Wingdings" w:hAnsi="Wingdings" w:hint="default"/>
+        <w:sz w:val="20"/>
+      </w:rPr>
+    </w:lvl>
+    <w:lvl w:ilvl="7" w:tentative="1">
+      <w:start w:val="1"/>
+      <w:numFmt w:val="bullet"/>
+      <w:lvlText w:val=""/>
+      <w:lvlJc w:val="left"/>
+      <w:pPr>
+        <w:tabs>
+          <w:tab w:val="num" w:pos="5760"/>
+        </w:tabs>
+        <w:ind w:left="5760" w:hanging="360"/>
+      </w:pPr>
+      <w:rPr>
+        <w:rFonts w:ascii="Wingdings" w:hAnsi="Wingdings" w:hint="default"/>
+        <w:sz w:val="20"/>
+      </w:rPr>
+    </w:lvl>
+    <w:lvl w:ilvl="8" w:tentative="1">
+      <w:start w:val="1"/>
+      <w:numFmt w:val="bullet"/>
+      <w:lvlText w:val=""/>
+      <w:lvlJc w:val="left"/>
+      <w:pPr>
+        <w:tabs>
+          <w:tab w:val="num" w:pos="6480"/>
+        </w:tabs>
+        <w:ind w:left="6480" w:hanging="360"/>
+      </w:pPr>
+      <w:rPr>
+        <w:rFonts w:ascii="Wingdings" w:hAnsi="Wingdings" w:hint="default"/>
+        <w:sz w:val="20"/>
+      </w:rPr>
+    </w:lvl>
+  </w:abstractNum>
+  <w:abstractNum w:abstractNumId="76" w15:restartNumberingAfterBreak="0">
     <w:nsid w:val="3F5E3BA1"/>
     <w:multiLevelType w:val="multilevel"/>
     <w:tmpl w:val="2AA67CDA"/>
@@ -16213,7 +16894,7 @@
       </w:rPr>
     </w:lvl>
   </w:abstractNum>
-  <w:abstractNum w:abstractNumId="76" w15:restartNumberingAfterBreak="0">
+  <w:abstractNum w:abstractNumId="77" w15:restartNumberingAfterBreak="0">
     <w:nsid w:val="40431B1C"/>
     <w:multiLevelType w:val="multilevel"/>
     <w:tmpl w:val="5D8E77D0"/>
@@ -16362,7 +17043,7 @@
       </w:rPr>
     </w:lvl>
   </w:abstractNum>
-  <w:abstractNum w:abstractNumId="77" w15:restartNumberingAfterBreak="0">
+  <w:abstractNum w:abstractNumId="78" w15:restartNumberingAfterBreak="0">
     <w:nsid w:val="419E0199"/>
     <w:multiLevelType w:val="multilevel"/>
     <w:tmpl w:val="D6CA9606"/>
@@ -16511,7 +17192,7 @@
       </w:rPr>
     </w:lvl>
   </w:abstractNum>
-  <w:abstractNum w:abstractNumId="78" w15:restartNumberingAfterBreak="0">
+  <w:abstractNum w:abstractNumId="79" w15:restartNumberingAfterBreak="0">
     <w:nsid w:val="452F60FB"/>
     <w:multiLevelType w:val="hybridMultilevel"/>
     <w:tmpl w:val="892A990A"/>
@@ -16624,7 +17305,7 @@
       </w:rPr>
     </w:lvl>
   </w:abstractNum>
-  <w:abstractNum w:abstractNumId="79" w15:restartNumberingAfterBreak="0">
+  <w:abstractNum w:abstractNumId="80" w15:restartNumberingAfterBreak="0">
     <w:nsid w:val="47B65409"/>
     <w:multiLevelType w:val="multilevel"/>
     <w:tmpl w:val="2AA67CDA"/>
@@ -16773,7 +17454,7 @@
       </w:rPr>
     </w:lvl>
   </w:abstractNum>
-  <w:abstractNum w:abstractNumId="80" w15:restartNumberingAfterBreak="0">
+  <w:abstractNum w:abstractNumId="81" w15:restartNumberingAfterBreak="0">
     <w:nsid w:val="47BF2170"/>
     <w:multiLevelType w:val="multilevel"/>
     <w:tmpl w:val="D9681266"/>
@@ -16922,7 +17603,7 @@
       </w:rPr>
     </w:lvl>
   </w:abstractNum>
-  <w:abstractNum w:abstractNumId="81" w15:restartNumberingAfterBreak="0">
+  <w:abstractNum w:abstractNumId="82" w15:restartNumberingAfterBreak="0">
     <w:nsid w:val="47E5592F"/>
     <w:multiLevelType w:val="hybridMultilevel"/>
     <w:tmpl w:val="719AB9FA"/>
@@ -17035,7 +17716,7 @@
       </w:rPr>
     </w:lvl>
   </w:abstractNum>
-  <w:abstractNum w:abstractNumId="82" w15:restartNumberingAfterBreak="0">
+  <w:abstractNum w:abstractNumId="83" w15:restartNumberingAfterBreak="0">
     <w:nsid w:val="48C041A9"/>
     <w:multiLevelType w:val="multilevel"/>
     <w:tmpl w:val="59A694BC"/>
@@ -17184,7 +17865,7 @@
       </w:rPr>
     </w:lvl>
   </w:abstractNum>
-  <w:abstractNum w:abstractNumId="83" w15:restartNumberingAfterBreak="0">
+  <w:abstractNum w:abstractNumId="84" w15:restartNumberingAfterBreak="0">
     <w:nsid w:val="49D6568A"/>
     <w:multiLevelType w:val="multilevel"/>
     <w:tmpl w:val="559E29EC"/>
@@ -17333,7 +18014,7 @@
       </w:rPr>
     </w:lvl>
   </w:abstractNum>
-  <w:abstractNum w:abstractNumId="84" w15:restartNumberingAfterBreak="0">
+  <w:abstractNum w:abstractNumId="85" w15:restartNumberingAfterBreak="0">
     <w:nsid w:val="4A7C2BC0"/>
     <w:multiLevelType w:val="hybridMultilevel"/>
     <w:tmpl w:val="4E4ADB18"/>
@@ -17446,7 +18127,7 @@
       </w:rPr>
     </w:lvl>
   </w:abstractNum>
-  <w:abstractNum w:abstractNumId="85" w15:restartNumberingAfterBreak="0">
+  <w:abstractNum w:abstractNumId="86" w15:restartNumberingAfterBreak="0">
     <w:nsid w:val="4AF73293"/>
     <w:multiLevelType w:val="hybridMultilevel"/>
     <w:tmpl w:val="F2962738"/>
@@ -17559,7 +18240,7 @@
       </w:rPr>
     </w:lvl>
   </w:abstractNum>
-  <w:abstractNum w:abstractNumId="86" w15:restartNumberingAfterBreak="0">
+  <w:abstractNum w:abstractNumId="87" w15:restartNumberingAfterBreak="0">
     <w:nsid w:val="4B375248"/>
     <w:multiLevelType w:val="multilevel"/>
     <w:tmpl w:val="B574C1C6"/>
@@ -17708,7 +18389,7 @@
       </w:rPr>
     </w:lvl>
   </w:abstractNum>
-  <w:abstractNum w:abstractNumId="87" w15:restartNumberingAfterBreak="0">
+  <w:abstractNum w:abstractNumId="88" w15:restartNumberingAfterBreak="0">
     <w:nsid w:val="4BA13766"/>
     <w:multiLevelType w:val="multilevel"/>
     <w:tmpl w:val="63F4E6F0"/>
@@ -17857,7 +18538,7 @@
       </w:rPr>
     </w:lvl>
   </w:abstractNum>
-  <w:abstractNum w:abstractNumId="88" w15:restartNumberingAfterBreak="0">
+  <w:abstractNum w:abstractNumId="89" w15:restartNumberingAfterBreak="0">
     <w:nsid w:val="4BA25441"/>
     <w:multiLevelType w:val="hybridMultilevel"/>
     <w:tmpl w:val="217E2E96"/>
@@ -17970,7 +18651,7 @@
       </w:rPr>
     </w:lvl>
   </w:abstractNum>
-  <w:abstractNum w:abstractNumId="89" w15:restartNumberingAfterBreak="0">
+  <w:abstractNum w:abstractNumId="90" w15:restartNumberingAfterBreak="0">
     <w:nsid w:val="4BDF79AF"/>
     <w:multiLevelType w:val="hybridMultilevel"/>
     <w:tmpl w:val="09F0B06C"/>
@@ -18083,7 +18764,7 @@
       </w:rPr>
     </w:lvl>
   </w:abstractNum>
-  <w:abstractNum w:abstractNumId="90" w15:restartNumberingAfterBreak="0">
+  <w:abstractNum w:abstractNumId="91" w15:restartNumberingAfterBreak="0">
     <w:nsid w:val="4E276DCB"/>
     <w:multiLevelType w:val="hybridMultilevel"/>
     <w:tmpl w:val="B7C469B4"/>
@@ -18196,7 +18877,7 @@
       </w:rPr>
     </w:lvl>
   </w:abstractNum>
-  <w:abstractNum w:abstractNumId="91" w15:restartNumberingAfterBreak="0">
+  <w:abstractNum w:abstractNumId="92" w15:restartNumberingAfterBreak="0">
     <w:nsid w:val="4F053929"/>
     <w:multiLevelType w:val="hybridMultilevel"/>
     <w:tmpl w:val="2A78C678"/>
@@ -18309,7 +18990,7 @@
       </w:rPr>
     </w:lvl>
   </w:abstractNum>
-  <w:abstractNum w:abstractNumId="92" w15:restartNumberingAfterBreak="0">
+  <w:abstractNum w:abstractNumId="93" w15:restartNumberingAfterBreak="0">
     <w:nsid w:val="4F750073"/>
     <w:multiLevelType w:val="hybridMultilevel"/>
     <w:tmpl w:val="EC7AB8FC"/>
@@ -18422,7 +19103,7 @@
       </w:rPr>
     </w:lvl>
   </w:abstractNum>
-  <w:abstractNum w:abstractNumId="93" w15:restartNumberingAfterBreak="0">
+  <w:abstractNum w:abstractNumId="94" w15:restartNumberingAfterBreak="0">
     <w:nsid w:val="4FFB237E"/>
     <w:multiLevelType w:val="multilevel"/>
     <w:tmpl w:val="2AA67CDA"/>
@@ -18571,7 +19252,7 @@
       </w:rPr>
     </w:lvl>
   </w:abstractNum>
-  <w:abstractNum w:abstractNumId="94" w15:restartNumberingAfterBreak="0">
+  <w:abstractNum w:abstractNumId="95" w15:restartNumberingAfterBreak="0">
     <w:nsid w:val="51737FE0"/>
     <w:multiLevelType w:val="hybridMultilevel"/>
     <w:tmpl w:val="2B0604E6"/>
@@ -18684,7 +19365,7 @@
       </w:rPr>
     </w:lvl>
   </w:abstractNum>
-  <w:abstractNum w:abstractNumId="95" w15:restartNumberingAfterBreak="0">
+  <w:abstractNum w:abstractNumId="96" w15:restartNumberingAfterBreak="0">
     <w:nsid w:val="518B1885"/>
     <w:multiLevelType w:val="multilevel"/>
     <w:tmpl w:val="AE1AAC28"/>
@@ -18833,7 +19514,7 @@
       </w:rPr>
     </w:lvl>
   </w:abstractNum>
-  <w:abstractNum w:abstractNumId="96" w15:restartNumberingAfterBreak="0">
+  <w:abstractNum w:abstractNumId="97" w15:restartNumberingAfterBreak="0">
     <w:nsid w:val="51A86EF8"/>
     <w:multiLevelType w:val="multilevel"/>
     <w:tmpl w:val="FF2841D4"/>
@@ -18982,7 +19663,7 @@
       </w:rPr>
     </w:lvl>
   </w:abstractNum>
-  <w:abstractNum w:abstractNumId="97" w15:restartNumberingAfterBreak="0">
+  <w:abstractNum w:abstractNumId="98" w15:restartNumberingAfterBreak="0">
     <w:nsid w:val="51AB55CC"/>
     <w:multiLevelType w:val="multilevel"/>
     <w:tmpl w:val="5986D838"/>
@@ -19131,7 +19812,7 @@
       </w:rPr>
     </w:lvl>
   </w:abstractNum>
-  <w:abstractNum w:abstractNumId="98" w15:restartNumberingAfterBreak="0">
+  <w:abstractNum w:abstractNumId="99" w15:restartNumberingAfterBreak="0">
     <w:nsid w:val="521378FF"/>
     <w:multiLevelType w:val="multilevel"/>
     <w:tmpl w:val="7B002268"/>
@@ -19280,7 +19961,7 @@
       </w:rPr>
     </w:lvl>
   </w:abstractNum>
-  <w:abstractNum w:abstractNumId="99" w15:restartNumberingAfterBreak="0">
+  <w:abstractNum w:abstractNumId="100" w15:restartNumberingAfterBreak="0">
     <w:nsid w:val="521F2792"/>
     <w:multiLevelType w:val="multilevel"/>
     <w:tmpl w:val="9FB45386"/>
@@ -19429,7 +20110,7 @@
       </w:rPr>
     </w:lvl>
   </w:abstractNum>
-  <w:abstractNum w:abstractNumId="100" w15:restartNumberingAfterBreak="0">
+  <w:abstractNum w:abstractNumId="101" w15:restartNumberingAfterBreak="0">
     <w:nsid w:val="53390911"/>
     <w:multiLevelType w:val="multilevel"/>
     <w:tmpl w:val="1C380F12"/>
@@ -19578,7 +20259,7 @@
       </w:rPr>
     </w:lvl>
   </w:abstractNum>
-  <w:abstractNum w:abstractNumId="101" w15:restartNumberingAfterBreak="0">
+  <w:abstractNum w:abstractNumId="102" w15:restartNumberingAfterBreak="0">
     <w:nsid w:val="53CD23AC"/>
     <w:multiLevelType w:val="multilevel"/>
     <w:tmpl w:val="57BAE8F0"/>
@@ -19727,7 +20408,7 @@
       </w:rPr>
     </w:lvl>
   </w:abstractNum>
-  <w:abstractNum w:abstractNumId="102" w15:restartNumberingAfterBreak="0">
+  <w:abstractNum w:abstractNumId="103" w15:restartNumberingAfterBreak="0">
     <w:nsid w:val="5462791F"/>
     <w:multiLevelType w:val="hybridMultilevel"/>
     <w:tmpl w:val="FDE24C26"/>
@@ -19840,7 +20521,7 @@
       </w:rPr>
     </w:lvl>
   </w:abstractNum>
-  <w:abstractNum w:abstractNumId="103" w15:restartNumberingAfterBreak="0">
+  <w:abstractNum w:abstractNumId="104" w15:restartNumberingAfterBreak="0">
     <w:nsid w:val="547005EB"/>
     <w:multiLevelType w:val="multilevel"/>
     <w:tmpl w:val="F260CC5C"/>
@@ -19989,7 +20670,7 @@
       </w:rPr>
     </w:lvl>
   </w:abstractNum>
-  <w:abstractNum w:abstractNumId="104" w15:restartNumberingAfterBreak="0">
+  <w:abstractNum w:abstractNumId="105" w15:restartNumberingAfterBreak="0">
     <w:nsid w:val="55961DEA"/>
     <w:multiLevelType w:val="multilevel"/>
     <w:tmpl w:val="AED821A4"/>
@@ -20138,7 +20819,7 @@
       </w:rPr>
     </w:lvl>
   </w:abstractNum>
-  <w:abstractNum w:abstractNumId="105" w15:restartNumberingAfterBreak="0">
+  <w:abstractNum w:abstractNumId="106" w15:restartNumberingAfterBreak="0">
     <w:nsid w:val="55EC0440"/>
     <w:multiLevelType w:val="hybridMultilevel"/>
     <w:tmpl w:val="67C69668"/>
@@ -20251,7 +20932,7 @@
       </w:rPr>
     </w:lvl>
   </w:abstractNum>
-  <w:abstractNum w:abstractNumId="106" w15:restartNumberingAfterBreak="0">
+  <w:abstractNum w:abstractNumId="107" w15:restartNumberingAfterBreak="0">
     <w:nsid w:val="58034221"/>
     <w:multiLevelType w:val="hybridMultilevel"/>
     <w:tmpl w:val="65D0619C"/>
@@ -20364,7 +21045,156 @@
       </w:rPr>
     </w:lvl>
   </w:abstractNum>
-  <w:abstractNum w:abstractNumId="107" w15:restartNumberingAfterBreak="0">
+  <w:abstractNum w:abstractNumId="108" w15:restartNumberingAfterBreak="0">
+    <w:nsid w:val="583419A0"/>
+    <w:multiLevelType w:val="multilevel"/>
+    <w:tmpl w:val="6EE47FD8"/>
+    <w:lvl w:ilvl="0">
+      <w:start w:val="1"/>
+      <w:numFmt w:val="bullet"/>
+      <w:lvlText w:val=""/>
+      <w:lvlJc w:val="left"/>
+      <w:pPr>
+        <w:tabs>
+          <w:tab w:val="num" w:pos="720"/>
+        </w:tabs>
+        <w:ind w:left="720" w:hanging="360"/>
+      </w:pPr>
+      <w:rPr>
+        <w:rFonts w:ascii="Symbol" w:hAnsi="Symbol" w:hint="default"/>
+        <w:sz w:val="20"/>
+      </w:rPr>
+    </w:lvl>
+    <w:lvl w:ilvl="1" w:tentative="1">
+      <w:start w:val="1"/>
+      <w:numFmt w:val="bullet"/>
+      <w:lvlText w:val="o"/>
+      <w:lvlJc w:val="left"/>
+      <w:pPr>
+        <w:tabs>
+          <w:tab w:val="num" w:pos="1440"/>
+        </w:tabs>
+        <w:ind w:left="1440" w:hanging="360"/>
+      </w:pPr>
+      <w:rPr>
+        <w:rFonts w:ascii="Courier New" w:hAnsi="Courier New" w:hint="default"/>
+        <w:sz w:val="20"/>
+      </w:rPr>
+    </w:lvl>
+    <w:lvl w:ilvl="2" w:tentative="1">
+      <w:start w:val="1"/>
+      <w:numFmt w:val="bullet"/>
+      <w:lvlText w:val=""/>
+      <w:lvlJc w:val="left"/>
+      <w:pPr>
+        <w:tabs>
+          <w:tab w:val="num" w:pos="2160"/>
+        </w:tabs>
+        <w:ind w:left="2160" w:hanging="360"/>
+      </w:pPr>
+      <w:rPr>
+        <w:rFonts w:ascii="Wingdings" w:hAnsi="Wingdings" w:hint="default"/>
+        <w:sz w:val="20"/>
+      </w:rPr>
+    </w:lvl>
+    <w:lvl w:ilvl="3" w:tentative="1">
+      <w:start w:val="1"/>
+      <w:numFmt w:val="bullet"/>
+      <w:lvlText w:val=""/>
+      <w:lvlJc w:val="left"/>
+      <w:pPr>
+        <w:tabs>
+          <w:tab w:val="num" w:pos="2880"/>
+        </w:tabs>
+        <w:ind w:left="2880" w:hanging="360"/>
+      </w:pPr>
+      <w:rPr>
+        <w:rFonts w:ascii="Wingdings" w:hAnsi="Wingdings" w:hint="default"/>
+        <w:sz w:val="20"/>
+      </w:rPr>
+    </w:lvl>
+    <w:lvl w:ilvl="4" w:tentative="1">
+      <w:start w:val="1"/>
+      <w:numFmt w:val="bullet"/>
+      <w:lvlText w:val=""/>
+      <w:lvlJc w:val="left"/>
+      <w:pPr>
+        <w:tabs>
+          <w:tab w:val="num" w:pos="3600"/>
+        </w:tabs>
+        <w:ind w:left="3600" w:hanging="360"/>
+      </w:pPr>
+      <w:rPr>
+        <w:rFonts w:ascii="Wingdings" w:hAnsi="Wingdings" w:hint="default"/>
+        <w:sz w:val="20"/>
+      </w:rPr>
+    </w:lvl>
+    <w:lvl w:ilvl="5" w:tentative="1">
+      <w:start w:val="1"/>
+      <w:numFmt w:val="bullet"/>
+      <w:lvlText w:val=""/>
+      <w:lvlJc w:val="left"/>
+      <w:pPr>
+        <w:tabs>
+          <w:tab w:val="num" w:pos="4320"/>
+        </w:tabs>
+        <w:ind w:left="4320" w:hanging="360"/>
+      </w:pPr>
+      <w:rPr>
+        <w:rFonts w:ascii="Wingdings" w:hAnsi="Wingdings" w:hint="default"/>
+        <w:sz w:val="20"/>
+      </w:rPr>
+    </w:lvl>
+    <w:lvl w:ilvl="6" w:tentative="1">
+      <w:start w:val="1"/>
+      <w:numFmt w:val="bullet"/>
+      <w:lvlText w:val=""/>
+      <w:lvlJc w:val="left"/>
+      <w:pPr>
+        <w:tabs>
+          <w:tab w:val="num" w:pos="5040"/>
+        </w:tabs>
+        <w:ind w:left="5040" w:hanging="360"/>
+      </w:pPr>
+      <w:rPr>
+        <w:rFonts w:ascii="Wingdings" w:hAnsi="Wingdings" w:hint="default"/>
+        <w:sz w:val="20"/>
+      </w:rPr>
+    </w:lvl>
+    <w:lvl w:ilvl="7" w:tentative="1">
+      <w:start w:val="1"/>
+      <w:numFmt w:val="bullet"/>
+      <w:lvlText w:val=""/>
+      <w:lvlJc w:val="left"/>
+      <w:pPr>
+        <w:tabs>
+          <w:tab w:val="num" w:pos="5760"/>
+        </w:tabs>
+        <w:ind w:left="5760" w:hanging="360"/>
+      </w:pPr>
+      <w:rPr>
+        <w:rFonts w:ascii="Wingdings" w:hAnsi="Wingdings" w:hint="default"/>
+        <w:sz w:val="20"/>
+      </w:rPr>
+    </w:lvl>
+    <w:lvl w:ilvl="8" w:tentative="1">
+      <w:start w:val="1"/>
+      <w:numFmt w:val="bullet"/>
+      <w:lvlText w:val=""/>
+      <w:lvlJc w:val="left"/>
+      <w:pPr>
+        <w:tabs>
+          <w:tab w:val="num" w:pos="6480"/>
+        </w:tabs>
+        <w:ind w:left="6480" w:hanging="360"/>
+      </w:pPr>
+      <w:rPr>
+        <w:rFonts w:ascii="Wingdings" w:hAnsi="Wingdings" w:hint="default"/>
+        <w:sz w:val="20"/>
+      </w:rPr>
+    </w:lvl>
+  </w:abstractNum>
+  <w:abstractNum w:abstractNumId="109" w15:restartNumberingAfterBreak="0">
     <w:nsid w:val="583F3D9C"/>
     <w:multiLevelType w:val="multilevel"/>
     <w:tmpl w:val="8E4C5D4A"/>
@@ -20513,7 +21343,7 @@
       </w:rPr>
     </w:lvl>
   </w:abstractNum>
-  <w:abstractNum w:abstractNumId="108" w15:restartNumberingAfterBreak="0">
+  <w:abstractNum w:abstractNumId="110" w15:restartNumberingAfterBreak="0">
     <w:nsid w:val="59515319"/>
     <w:multiLevelType w:val="multilevel"/>
     <w:tmpl w:val="5AD8ACF0"/>
@@ -20662,7 +21492,7 @@
       </w:rPr>
     </w:lvl>
   </w:abstractNum>
-  <w:abstractNum w:abstractNumId="109" w15:restartNumberingAfterBreak="0">
+  <w:abstractNum w:abstractNumId="111" w15:restartNumberingAfterBreak="0">
     <w:nsid w:val="5A460390"/>
     <w:multiLevelType w:val="hybridMultilevel"/>
     <w:tmpl w:val="BD8E939C"/>
@@ -20775,7 +21605,7 @@
       </w:rPr>
     </w:lvl>
   </w:abstractNum>
-  <w:abstractNum w:abstractNumId="110" w15:restartNumberingAfterBreak="0">
+  <w:abstractNum w:abstractNumId="112" w15:restartNumberingAfterBreak="0">
     <w:nsid w:val="5C25321F"/>
     <w:multiLevelType w:val="multilevel"/>
     <w:tmpl w:val="16D68826"/>
@@ -20924,7 +21754,7 @@
       </w:rPr>
     </w:lvl>
   </w:abstractNum>
-  <w:abstractNum w:abstractNumId="111" w15:restartNumberingAfterBreak="0">
+  <w:abstractNum w:abstractNumId="113" w15:restartNumberingAfterBreak="0">
     <w:nsid w:val="5CEE630B"/>
     <w:multiLevelType w:val="hybridMultilevel"/>
     <w:tmpl w:val="DE8E8DBA"/>
@@ -21037,7 +21867,7 @@
       </w:rPr>
     </w:lvl>
   </w:abstractNum>
-  <w:abstractNum w:abstractNumId="112" w15:restartNumberingAfterBreak="0">
+  <w:abstractNum w:abstractNumId="114" w15:restartNumberingAfterBreak="0">
     <w:nsid w:val="5D5A183C"/>
     <w:multiLevelType w:val="multilevel"/>
     <w:tmpl w:val="C804C34A"/>
@@ -21186,7 +22016,7 @@
       </w:rPr>
     </w:lvl>
   </w:abstractNum>
-  <w:abstractNum w:abstractNumId="113" w15:restartNumberingAfterBreak="0">
+  <w:abstractNum w:abstractNumId="115" w15:restartNumberingAfterBreak="0">
     <w:nsid w:val="5DF95194"/>
     <w:multiLevelType w:val="multilevel"/>
     <w:tmpl w:val="CC127E54"/>
@@ -21335,7 +22165,7 @@
       </w:rPr>
     </w:lvl>
   </w:abstractNum>
-  <w:abstractNum w:abstractNumId="114" w15:restartNumberingAfterBreak="0">
+  <w:abstractNum w:abstractNumId="116" w15:restartNumberingAfterBreak="0">
     <w:nsid w:val="5E6333E0"/>
     <w:multiLevelType w:val="hybridMultilevel"/>
     <w:tmpl w:val="A15497C8"/>
@@ -21448,7 +22278,7 @@
       </w:rPr>
     </w:lvl>
   </w:abstractNum>
-  <w:abstractNum w:abstractNumId="115" w15:restartNumberingAfterBreak="0">
+  <w:abstractNum w:abstractNumId="117" w15:restartNumberingAfterBreak="0">
     <w:nsid w:val="5E9C452C"/>
     <w:multiLevelType w:val="multilevel"/>
     <w:tmpl w:val="B8727936"/>
@@ -21597,7 +22427,7 @@
       </w:rPr>
     </w:lvl>
   </w:abstractNum>
-  <w:abstractNum w:abstractNumId="116" w15:restartNumberingAfterBreak="0">
+  <w:abstractNum w:abstractNumId="118" w15:restartNumberingAfterBreak="0">
     <w:nsid w:val="5EC339A8"/>
     <w:multiLevelType w:val="multilevel"/>
     <w:tmpl w:val="36DAAD54"/>
@@ -21746,7 +22576,7 @@
       </w:rPr>
     </w:lvl>
   </w:abstractNum>
-  <w:abstractNum w:abstractNumId="117" w15:restartNumberingAfterBreak="0">
+  <w:abstractNum w:abstractNumId="119" w15:restartNumberingAfterBreak="0">
     <w:nsid w:val="605D2403"/>
     <w:multiLevelType w:val="multilevel"/>
     <w:tmpl w:val="5AF24F44"/>
@@ -21895,7 +22725,7 @@
       </w:rPr>
     </w:lvl>
   </w:abstractNum>
-  <w:abstractNum w:abstractNumId="118" w15:restartNumberingAfterBreak="0">
+  <w:abstractNum w:abstractNumId="120" w15:restartNumberingAfterBreak="0">
     <w:nsid w:val="62385AA6"/>
     <w:multiLevelType w:val="multilevel"/>
     <w:tmpl w:val="B9EAECD4"/>
@@ -22044,7 +22874,7 @@
       </w:rPr>
     </w:lvl>
   </w:abstractNum>
-  <w:abstractNum w:abstractNumId="119" w15:restartNumberingAfterBreak="0">
+  <w:abstractNum w:abstractNumId="121" w15:restartNumberingAfterBreak="0">
     <w:nsid w:val="625D686D"/>
     <w:multiLevelType w:val="multilevel"/>
     <w:tmpl w:val="BC1C2048"/>
@@ -22193,7 +23023,7 @@
       </w:rPr>
     </w:lvl>
   </w:abstractNum>
-  <w:abstractNum w:abstractNumId="120" w15:restartNumberingAfterBreak="0">
+  <w:abstractNum w:abstractNumId="122" w15:restartNumberingAfterBreak="0">
     <w:nsid w:val="62B46951"/>
     <w:multiLevelType w:val="hybridMultilevel"/>
     <w:tmpl w:val="0FEAFEC6"/>
@@ -22306,7 +23136,7 @@
       </w:rPr>
     </w:lvl>
   </w:abstractNum>
-  <w:abstractNum w:abstractNumId="121" w15:restartNumberingAfterBreak="0">
+  <w:abstractNum w:abstractNumId="123" w15:restartNumberingAfterBreak="0">
     <w:nsid w:val="64014C6E"/>
     <w:multiLevelType w:val="multilevel"/>
     <w:tmpl w:val="96E42962"/>
@@ -22455,7 +23285,7 @@
       </w:rPr>
     </w:lvl>
   </w:abstractNum>
-  <w:abstractNum w:abstractNumId="122" w15:restartNumberingAfterBreak="0">
+  <w:abstractNum w:abstractNumId="124" w15:restartNumberingAfterBreak="0">
     <w:nsid w:val="647819E3"/>
     <w:multiLevelType w:val="multilevel"/>
     <w:tmpl w:val="ABB278BC"/>
@@ -22604,7 +23434,7 @@
       </w:rPr>
     </w:lvl>
   </w:abstractNum>
-  <w:abstractNum w:abstractNumId="123" w15:restartNumberingAfterBreak="0">
+  <w:abstractNum w:abstractNumId="125" w15:restartNumberingAfterBreak="0">
     <w:nsid w:val="64F30198"/>
     <w:multiLevelType w:val="multilevel"/>
     <w:tmpl w:val="63F4E6F0"/>
@@ -22753,7 +23583,7 @@
       </w:rPr>
     </w:lvl>
   </w:abstractNum>
-  <w:abstractNum w:abstractNumId="124" w15:restartNumberingAfterBreak="0">
+  <w:abstractNum w:abstractNumId="126" w15:restartNumberingAfterBreak="0">
     <w:nsid w:val="65314293"/>
     <w:multiLevelType w:val="hybridMultilevel"/>
     <w:tmpl w:val="6688DFAC"/>
@@ -22866,7 +23696,120 @@
       </w:rPr>
     </w:lvl>
   </w:abstractNum>
-  <w:abstractNum w:abstractNumId="125" w15:restartNumberingAfterBreak="0">
+  <w:abstractNum w:abstractNumId="127" w15:restartNumberingAfterBreak="0">
+    <w:nsid w:val="657A47E4"/>
+    <w:multiLevelType w:val="hybridMultilevel"/>
+    <w:tmpl w:val="98CAEF8A"/>
+    <w:lvl w:ilvl="0" w:tplc="04090005">
+      <w:start w:val="1"/>
+      <w:numFmt w:val="bullet"/>
+      <w:lvlText w:val=""/>
+      <w:lvlJc w:val="left"/>
+      <w:pPr>
+        <w:ind w:left="1080" w:hanging="360"/>
+      </w:pPr>
+      <w:rPr>
+        <w:rFonts w:ascii="Wingdings" w:hAnsi="Wingdings" w:hint="default"/>
+      </w:rPr>
+    </w:lvl>
+    <w:lvl w:ilvl="1" w:tplc="04090003" w:tentative="1">
+      <w:start w:val="1"/>
+      <w:numFmt w:val="bullet"/>
+      <w:lvlText w:val="o"/>
+      <w:lvlJc w:val="left"/>
+      <w:pPr>
+        <w:ind w:left="1800" w:hanging="360"/>
+      </w:pPr>
+      <w:rPr>
+        <w:rFonts w:ascii="Courier New" w:hAnsi="Courier New" w:cs="Courier New" w:hint="default"/>
+      </w:rPr>
+    </w:lvl>
+    <w:lvl w:ilvl="2" w:tplc="04090005" w:tentative="1">
+      <w:start w:val="1"/>
+      <w:numFmt w:val="bullet"/>
+      <w:lvlText w:val=""/>
+      <w:lvlJc w:val="left"/>
+      <w:pPr>
+        <w:ind w:left="2520" w:hanging="360"/>
+      </w:pPr>
+      <w:rPr>
+        <w:rFonts w:ascii="Wingdings" w:hAnsi="Wingdings" w:hint="default"/>
+      </w:rPr>
+    </w:lvl>
+    <w:lvl w:ilvl="3" w:tplc="04090001" w:tentative="1">
+      <w:start w:val="1"/>
+      <w:numFmt w:val="bullet"/>
+      <w:lvlText w:val=""/>
+      <w:lvlJc w:val="left"/>
+      <w:pPr>
+        <w:ind w:left="3240" w:hanging="360"/>
+      </w:pPr>
+      <w:rPr>
+        <w:rFonts w:ascii="Symbol" w:hAnsi="Symbol" w:hint="default"/>
+      </w:rPr>
+    </w:lvl>
+    <w:lvl w:ilvl="4" w:tplc="04090003" w:tentative="1">
+      <w:start w:val="1"/>
+      <w:numFmt w:val="bullet"/>
+      <w:lvlText w:val="o"/>
+      <w:lvlJc w:val="left"/>
+      <w:pPr>
+        <w:ind w:left="3960" w:hanging="360"/>
+      </w:pPr>
+      <w:rPr>
+        <w:rFonts w:ascii="Courier New" w:hAnsi="Courier New" w:cs="Courier New" w:hint="default"/>
+      </w:rPr>
+    </w:lvl>
+    <w:lvl w:ilvl="5" w:tplc="04090005" w:tentative="1">
+      <w:start w:val="1"/>
+      <w:numFmt w:val="bullet"/>
+      <w:lvlText w:val=""/>
+      <w:lvlJc w:val="left"/>
+      <w:pPr>
+        <w:ind w:left="4680" w:hanging="360"/>
+      </w:pPr>
+      <w:rPr>
+        <w:rFonts w:ascii="Wingdings" w:hAnsi="Wingdings" w:hint="default"/>
+      </w:rPr>
+    </w:lvl>
+    <w:lvl w:ilvl="6" w:tplc="04090001" w:tentative="1">
+      <w:start w:val="1"/>
+      <w:numFmt w:val="bullet"/>
+      <w:lvlText w:val=""/>
+      <w:lvlJc w:val="left"/>
+      <w:pPr>
+        <w:ind w:left="5400" w:hanging="360"/>
+      </w:pPr>
+      <w:rPr>
+        <w:rFonts w:ascii="Symbol" w:hAnsi="Symbol" w:hint="default"/>
+      </w:rPr>
+    </w:lvl>
+    <w:lvl w:ilvl="7" w:tplc="04090003" w:tentative="1">
+      <w:start w:val="1"/>
+      <w:numFmt w:val="bullet"/>
+      <w:lvlText w:val="o"/>
+      <w:lvlJc w:val="left"/>
+      <w:pPr>
+        <w:ind w:left="6120" w:hanging="360"/>
+      </w:pPr>
+      <w:rPr>
+        <w:rFonts w:ascii="Courier New" w:hAnsi="Courier New" w:cs="Courier New" w:hint="default"/>
+      </w:rPr>
+    </w:lvl>
+    <w:lvl w:ilvl="8" w:tplc="04090005" w:tentative="1">
+      <w:start w:val="1"/>
+      <w:numFmt w:val="bullet"/>
+      <w:lvlText w:val=""/>
+      <w:lvlJc w:val="left"/>
+      <w:pPr>
+        <w:ind w:left="6840" w:hanging="360"/>
+      </w:pPr>
+      <w:rPr>
+        <w:rFonts w:ascii="Wingdings" w:hAnsi="Wingdings" w:hint="default"/>
+      </w:rPr>
+    </w:lvl>
+  </w:abstractNum>
+  <w:abstractNum w:abstractNumId="128" w15:restartNumberingAfterBreak="0">
     <w:nsid w:val="65CE4D0F"/>
     <w:multiLevelType w:val="hybridMultilevel"/>
     <w:tmpl w:val="DB668538"/>
@@ -22979,7 +23922,7 @@
       </w:rPr>
     </w:lvl>
   </w:abstractNum>
-  <w:abstractNum w:abstractNumId="126" w15:restartNumberingAfterBreak="0">
+  <w:abstractNum w:abstractNumId="129" w15:restartNumberingAfterBreak="0">
     <w:nsid w:val="661C7D73"/>
     <w:multiLevelType w:val="multilevel"/>
     <w:tmpl w:val="D9681266"/>
@@ -23128,7 +24071,7 @@
       </w:rPr>
     </w:lvl>
   </w:abstractNum>
-  <w:abstractNum w:abstractNumId="127" w15:restartNumberingAfterBreak="0">
+  <w:abstractNum w:abstractNumId="130" w15:restartNumberingAfterBreak="0">
     <w:nsid w:val="661F6F82"/>
     <w:multiLevelType w:val="multilevel"/>
     <w:tmpl w:val="53F8A934"/>
@@ -23277,7 +24220,7 @@
       </w:rPr>
     </w:lvl>
   </w:abstractNum>
-  <w:abstractNum w:abstractNumId="128" w15:restartNumberingAfterBreak="0">
+  <w:abstractNum w:abstractNumId="131" w15:restartNumberingAfterBreak="0">
     <w:nsid w:val="66E36FE0"/>
     <w:multiLevelType w:val="multilevel"/>
     <w:tmpl w:val="2AA67CDA"/>
@@ -23426,7 +24369,7 @@
       </w:rPr>
     </w:lvl>
   </w:abstractNum>
-  <w:abstractNum w:abstractNumId="129" w15:restartNumberingAfterBreak="0">
+  <w:abstractNum w:abstractNumId="132" w15:restartNumberingAfterBreak="0">
     <w:nsid w:val="68205EC5"/>
     <w:multiLevelType w:val="multilevel"/>
     <w:tmpl w:val="EB4C8238"/>
@@ -23575,7 +24518,7 @@
       </w:rPr>
     </w:lvl>
   </w:abstractNum>
-  <w:abstractNum w:abstractNumId="130" w15:restartNumberingAfterBreak="0">
+  <w:abstractNum w:abstractNumId="133" w15:restartNumberingAfterBreak="0">
     <w:nsid w:val="68B94344"/>
     <w:multiLevelType w:val="multilevel"/>
     <w:tmpl w:val="9BA812D8"/>
@@ -23724,7 +24667,7 @@
       </w:rPr>
     </w:lvl>
   </w:abstractNum>
-  <w:abstractNum w:abstractNumId="131" w15:restartNumberingAfterBreak="0">
+  <w:abstractNum w:abstractNumId="134" w15:restartNumberingAfterBreak="0">
     <w:nsid w:val="69DE2C87"/>
     <w:multiLevelType w:val="hybridMultilevel"/>
     <w:tmpl w:val="F530F20A"/>
@@ -23837,7 +24780,7 @@
       </w:rPr>
     </w:lvl>
   </w:abstractNum>
-  <w:abstractNum w:abstractNumId="132" w15:restartNumberingAfterBreak="0">
+  <w:abstractNum w:abstractNumId="135" w15:restartNumberingAfterBreak="0">
     <w:nsid w:val="69ED672D"/>
     <w:multiLevelType w:val="multilevel"/>
     <w:tmpl w:val="CC08E300"/>
@@ -23986,7 +24929,7 @@
       </w:rPr>
     </w:lvl>
   </w:abstractNum>
-  <w:abstractNum w:abstractNumId="133" w15:restartNumberingAfterBreak="0">
+  <w:abstractNum w:abstractNumId="136" w15:restartNumberingAfterBreak="0">
     <w:nsid w:val="6A063EFD"/>
     <w:multiLevelType w:val="hybridMultilevel"/>
     <w:tmpl w:val="48703FBA"/>
@@ -24099,7 +25042,7 @@
       </w:rPr>
     </w:lvl>
   </w:abstractNum>
-  <w:abstractNum w:abstractNumId="134" w15:restartNumberingAfterBreak="0">
+  <w:abstractNum w:abstractNumId="137" w15:restartNumberingAfterBreak="0">
     <w:nsid w:val="6A825ABE"/>
     <w:multiLevelType w:val="multilevel"/>
     <w:tmpl w:val="0CD6F30E"/>
@@ -24248,7 +25191,7 @@
       </w:rPr>
     </w:lvl>
   </w:abstractNum>
-  <w:abstractNum w:abstractNumId="135" w15:restartNumberingAfterBreak="0">
+  <w:abstractNum w:abstractNumId="138" w15:restartNumberingAfterBreak="0">
     <w:nsid w:val="6B1D7832"/>
     <w:multiLevelType w:val="multilevel"/>
     <w:tmpl w:val="DD4646B2"/>
@@ -24397,7 +25340,7 @@
       </w:rPr>
     </w:lvl>
   </w:abstractNum>
-  <w:abstractNum w:abstractNumId="136" w15:restartNumberingAfterBreak="0">
+  <w:abstractNum w:abstractNumId="139" w15:restartNumberingAfterBreak="0">
     <w:nsid w:val="6C6D6667"/>
     <w:multiLevelType w:val="hybridMultilevel"/>
     <w:tmpl w:val="A744709C"/>
@@ -24510,7 +25453,7 @@
       </w:rPr>
     </w:lvl>
   </w:abstractNum>
-  <w:abstractNum w:abstractNumId="137" w15:restartNumberingAfterBreak="0">
+  <w:abstractNum w:abstractNumId="140" w15:restartNumberingAfterBreak="0">
     <w:nsid w:val="6CAD7EA5"/>
     <w:multiLevelType w:val="multilevel"/>
     <w:tmpl w:val="C472C5B0"/>
@@ -24659,7 +25602,7 @@
       </w:rPr>
     </w:lvl>
   </w:abstractNum>
-  <w:abstractNum w:abstractNumId="138" w15:restartNumberingAfterBreak="0">
+  <w:abstractNum w:abstractNumId="141" w15:restartNumberingAfterBreak="0">
     <w:nsid w:val="6E43557B"/>
     <w:multiLevelType w:val="multilevel"/>
     <w:tmpl w:val="323C7112"/>
@@ -24808,7 +25751,7 @@
       </w:rPr>
     </w:lvl>
   </w:abstractNum>
-  <w:abstractNum w:abstractNumId="139" w15:restartNumberingAfterBreak="0">
+  <w:abstractNum w:abstractNumId="142" w15:restartNumberingAfterBreak="0">
     <w:nsid w:val="6E4C2FCD"/>
     <w:multiLevelType w:val="hybridMultilevel"/>
     <w:tmpl w:val="1FE6FE7A"/>
@@ -24921,7 +25864,7 @@
       </w:rPr>
     </w:lvl>
   </w:abstractNum>
-  <w:abstractNum w:abstractNumId="140" w15:restartNumberingAfterBreak="0">
+  <w:abstractNum w:abstractNumId="143" w15:restartNumberingAfterBreak="0">
     <w:nsid w:val="6EA27D0A"/>
     <w:multiLevelType w:val="multilevel"/>
     <w:tmpl w:val="7BF0256C"/>
@@ -25070,7 +26013,7 @@
       </w:rPr>
     </w:lvl>
   </w:abstractNum>
-  <w:abstractNum w:abstractNumId="141" w15:restartNumberingAfterBreak="0">
+  <w:abstractNum w:abstractNumId="144" w15:restartNumberingAfterBreak="0">
     <w:nsid w:val="6EF86273"/>
     <w:multiLevelType w:val="multilevel"/>
     <w:tmpl w:val="2AA67CDA"/>
@@ -25219,7 +26162,7 @@
       </w:rPr>
     </w:lvl>
   </w:abstractNum>
-  <w:abstractNum w:abstractNumId="142" w15:restartNumberingAfterBreak="0">
+  <w:abstractNum w:abstractNumId="145" w15:restartNumberingAfterBreak="0">
     <w:nsid w:val="6F1425D4"/>
     <w:multiLevelType w:val="multilevel"/>
     <w:tmpl w:val="F71C8B08"/>
@@ -25368,7 +26311,7 @@
       </w:rPr>
     </w:lvl>
   </w:abstractNum>
-  <w:abstractNum w:abstractNumId="143" w15:restartNumberingAfterBreak="0">
+  <w:abstractNum w:abstractNumId="146" w15:restartNumberingAfterBreak="0">
     <w:nsid w:val="6F304959"/>
     <w:multiLevelType w:val="multilevel"/>
     <w:tmpl w:val="57AA766C"/>
@@ -25517,7 +26460,7 @@
       </w:rPr>
     </w:lvl>
   </w:abstractNum>
-  <w:abstractNum w:abstractNumId="144" w15:restartNumberingAfterBreak="0">
+  <w:abstractNum w:abstractNumId="147" w15:restartNumberingAfterBreak="0">
     <w:nsid w:val="70874300"/>
     <w:multiLevelType w:val="hybridMultilevel"/>
     <w:tmpl w:val="1B3A0518"/>
@@ -25630,7 +26573,7 @@
       </w:rPr>
     </w:lvl>
   </w:abstractNum>
-  <w:abstractNum w:abstractNumId="145" w15:restartNumberingAfterBreak="0">
+  <w:abstractNum w:abstractNumId="148" w15:restartNumberingAfterBreak="0">
     <w:nsid w:val="7090251B"/>
     <w:multiLevelType w:val="hybridMultilevel"/>
     <w:tmpl w:val="67687EFE"/>
@@ -25743,7 +26686,7 @@
       </w:rPr>
     </w:lvl>
   </w:abstractNum>
-  <w:abstractNum w:abstractNumId="146" w15:restartNumberingAfterBreak="0">
+  <w:abstractNum w:abstractNumId="149" w15:restartNumberingAfterBreak="0">
     <w:nsid w:val="72031F81"/>
     <w:multiLevelType w:val="multilevel"/>
     <w:tmpl w:val="84400090"/>
@@ -25892,7 +26835,7 @@
       </w:rPr>
     </w:lvl>
   </w:abstractNum>
-  <w:abstractNum w:abstractNumId="147" w15:restartNumberingAfterBreak="0">
+  <w:abstractNum w:abstractNumId="150" w15:restartNumberingAfterBreak="0">
     <w:nsid w:val="722301E0"/>
     <w:multiLevelType w:val="multilevel"/>
     <w:tmpl w:val="1EE82E5A"/>
@@ -26041,7 +26984,7 @@
       </w:rPr>
     </w:lvl>
   </w:abstractNum>
-  <w:abstractNum w:abstractNumId="148" w15:restartNumberingAfterBreak="0">
+  <w:abstractNum w:abstractNumId="151" w15:restartNumberingAfterBreak="0">
     <w:nsid w:val="75144C65"/>
     <w:multiLevelType w:val="hybridMultilevel"/>
     <w:tmpl w:val="12127FAA"/>
@@ -26154,7 +27097,7 @@
       </w:rPr>
     </w:lvl>
   </w:abstractNum>
-  <w:abstractNum w:abstractNumId="149" w15:restartNumberingAfterBreak="0">
+  <w:abstractNum w:abstractNumId="152" w15:restartNumberingAfterBreak="0">
     <w:nsid w:val="75237F84"/>
     <w:multiLevelType w:val="hybridMultilevel"/>
     <w:tmpl w:val="5F0A6EF2"/>
@@ -26267,7 +27210,7 @@
       </w:rPr>
     </w:lvl>
   </w:abstractNum>
-  <w:abstractNum w:abstractNumId="150" w15:restartNumberingAfterBreak="0">
+  <w:abstractNum w:abstractNumId="153" w15:restartNumberingAfterBreak="0">
     <w:nsid w:val="758968F2"/>
     <w:multiLevelType w:val="multilevel"/>
     <w:tmpl w:val="D4241C4A"/>
@@ -26416,7 +27359,7 @@
       </w:rPr>
     </w:lvl>
   </w:abstractNum>
-  <w:abstractNum w:abstractNumId="151" w15:restartNumberingAfterBreak="0">
+  <w:abstractNum w:abstractNumId="154" w15:restartNumberingAfterBreak="0">
     <w:nsid w:val="75C90201"/>
     <w:multiLevelType w:val="hybridMultilevel"/>
     <w:tmpl w:val="02D63AEC"/>
@@ -26529,7 +27472,7 @@
       </w:rPr>
     </w:lvl>
   </w:abstractNum>
-  <w:abstractNum w:abstractNumId="152" w15:restartNumberingAfterBreak="0">
+  <w:abstractNum w:abstractNumId="155" w15:restartNumberingAfterBreak="0">
     <w:nsid w:val="75F3357C"/>
     <w:multiLevelType w:val="hybridMultilevel"/>
     <w:tmpl w:val="26723550"/>
@@ -26642,7 +27585,7 @@
       </w:rPr>
     </w:lvl>
   </w:abstractNum>
-  <w:abstractNum w:abstractNumId="153" w15:restartNumberingAfterBreak="0">
+  <w:abstractNum w:abstractNumId="156" w15:restartNumberingAfterBreak="0">
     <w:nsid w:val="75FF09B0"/>
     <w:multiLevelType w:val="multilevel"/>
     <w:tmpl w:val="C34A7734"/>
@@ -26791,7 +27734,7 @@
       </w:rPr>
     </w:lvl>
   </w:abstractNum>
-  <w:abstractNum w:abstractNumId="154" w15:restartNumberingAfterBreak="0">
+  <w:abstractNum w:abstractNumId="157" w15:restartNumberingAfterBreak="0">
     <w:nsid w:val="76864E3D"/>
     <w:multiLevelType w:val="hybridMultilevel"/>
     <w:tmpl w:val="9000C896"/>
@@ -26904,7 +27847,7 @@
       </w:rPr>
     </w:lvl>
   </w:abstractNum>
-  <w:abstractNum w:abstractNumId="155" w15:restartNumberingAfterBreak="0">
+  <w:abstractNum w:abstractNumId="158" w15:restartNumberingAfterBreak="0">
     <w:nsid w:val="774028FF"/>
     <w:multiLevelType w:val="hybridMultilevel"/>
     <w:tmpl w:val="EED036DC"/>
@@ -27017,7 +27960,7 @@
       </w:rPr>
     </w:lvl>
   </w:abstractNum>
-  <w:abstractNum w:abstractNumId="156" w15:restartNumberingAfterBreak="0">
+  <w:abstractNum w:abstractNumId="159" w15:restartNumberingAfterBreak="0">
     <w:nsid w:val="777E68D9"/>
     <w:multiLevelType w:val="multilevel"/>
     <w:tmpl w:val="3F503B98"/>
@@ -27166,7 +28109,7 @@
       </w:rPr>
     </w:lvl>
   </w:abstractNum>
-  <w:abstractNum w:abstractNumId="157" w15:restartNumberingAfterBreak="0">
+  <w:abstractNum w:abstractNumId="160" w15:restartNumberingAfterBreak="0">
     <w:nsid w:val="77960362"/>
     <w:multiLevelType w:val="multilevel"/>
     <w:tmpl w:val="FEA0022E"/>
@@ -27315,7 +28258,7 @@
       </w:rPr>
     </w:lvl>
   </w:abstractNum>
-  <w:abstractNum w:abstractNumId="158" w15:restartNumberingAfterBreak="0">
+  <w:abstractNum w:abstractNumId="161" w15:restartNumberingAfterBreak="0">
     <w:nsid w:val="78547E35"/>
     <w:multiLevelType w:val="multilevel"/>
     <w:tmpl w:val="FC1421DE"/>
@@ -27464,7 +28407,7 @@
       </w:rPr>
     </w:lvl>
   </w:abstractNum>
-  <w:abstractNum w:abstractNumId="159" w15:restartNumberingAfterBreak="0">
+  <w:abstractNum w:abstractNumId="162" w15:restartNumberingAfterBreak="0">
     <w:nsid w:val="78553766"/>
     <w:multiLevelType w:val="hybridMultilevel"/>
     <w:tmpl w:val="246CBCB4"/>
@@ -27577,7 +28520,7 @@
       </w:rPr>
     </w:lvl>
   </w:abstractNum>
-  <w:abstractNum w:abstractNumId="160" w15:restartNumberingAfterBreak="0">
+  <w:abstractNum w:abstractNumId="163" w15:restartNumberingAfterBreak="0">
     <w:nsid w:val="785A644F"/>
     <w:multiLevelType w:val="multilevel"/>
     <w:tmpl w:val="D1DC60FE"/>
@@ -27726,7 +28669,7 @@
       </w:rPr>
     </w:lvl>
   </w:abstractNum>
-  <w:abstractNum w:abstractNumId="161" w15:restartNumberingAfterBreak="0">
+  <w:abstractNum w:abstractNumId="164" w15:restartNumberingAfterBreak="0">
     <w:nsid w:val="78B62297"/>
     <w:multiLevelType w:val="multilevel"/>
     <w:tmpl w:val="2AA67CDA"/>
@@ -27875,7 +28818,7 @@
       </w:rPr>
     </w:lvl>
   </w:abstractNum>
-  <w:abstractNum w:abstractNumId="162" w15:restartNumberingAfterBreak="0">
+  <w:abstractNum w:abstractNumId="165" w15:restartNumberingAfterBreak="0">
     <w:nsid w:val="79E63650"/>
     <w:multiLevelType w:val="multilevel"/>
     <w:tmpl w:val="98AA5BE8"/>
@@ -28024,7 +28967,7 @@
       </w:rPr>
     </w:lvl>
   </w:abstractNum>
-  <w:abstractNum w:abstractNumId="163" w15:restartNumberingAfterBreak="0">
+  <w:abstractNum w:abstractNumId="166" w15:restartNumberingAfterBreak="0">
     <w:nsid w:val="7BFA03DF"/>
     <w:multiLevelType w:val="hybridMultilevel"/>
     <w:tmpl w:val="536A979E"/>
@@ -28137,7 +29080,7 @@
       </w:rPr>
     </w:lvl>
   </w:abstractNum>
-  <w:abstractNum w:abstractNumId="164" w15:restartNumberingAfterBreak="0">
+  <w:abstractNum w:abstractNumId="167" w15:restartNumberingAfterBreak="0">
     <w:nsid w:val="7CA524B4"/>
     <w:multiLevelType w:val="hybridMultilevel"/>
     <w:tmpl w:val="957C4F4A"/>
@@ -28250,7 +29193,7 @@
       </w:rPr>
     </w:lvl>
   </w:abstractNum>
-  <w:abstractNum w:abstractNumId="165" w15:restartNumberingAfterBreak="0">
+  <w:abstractNum w:abstractNumId="168" w15:restartNumberingAfterBreak="0">
     <w:nsid w:val="7E1C597E"/>
     <w:multiLevelType w:val="multilevel"/>
     <w:tmpl w:val="2AA67CDA"/>
@@ -28399,7 +29342,7 @@
       </w:rPr>
     </w:lvl>
   </w:abstractNum>
-  <w:abstractNum w:abstractNumId="166" w15:restartNumberingAfterBreak="0">
+  <w:abstractNum w:abstractNumId="169" w15:restartNumberingAfterBreak="0">
     <w:nsid w:val="7EBD7710"/>
     <w:multiLevelType w:val="hybridMultilevel"/>
     <w:tmpl w:val="C8C6F7A0"/>
@@ -28512,7 +29455,7 @@
       </w:rPr>
     </w:lvl>
   </w:abstractNum>
-  <w:abstractNum w:abstractNumId="167" w15:restartNumberingAfterBreak="0">
+  <w:abstractNum w:abstractNumId="170" w15:restartNumberingAfterBreak="0">
     <w:nsid w:val="7F233031"/>
     <w:multiLevelType w:val="hybridMultilevel"/>
     <w:tmpl w:val="0D22564E"/>
@@ -28625,7 +29568,7 @@
       </w:rPr>
     </w:lvl>
   </w:abstractNum>
-  <w:abstractNum w:abstractNumId="168" w15:restartNumberingAfterBreak="0">
+  <w:abstractNum w:abstractNumId="171" w15:restartNumberingAfterBreak="0">
     <w:nsid w:val="7F426DF2"/>
     <w:multiLevelType w:val="multilevel"/>
     <w:tmpl w:val="430EFE5E"/>
@@ -28778,34 +29721,34 @@
     <w:abstractNumId w:val="65"/>
   </w:num>
   <w:num w:numId="2" w16cid:durableId="967664612">
-    <w:abstractNumId w:val="123"/>
+    <w:abstractNumId w:val="125"/>
   </w:num>
   <w:num w:numId="3" w16cid:durableId="361631616">
-    <w:abstractNumId w:val="87"/>
+    <w:abstractNumId w:val="88"/>
   </w:num>
   <w:num w:numId="4" w16cid:durableId="1409575397">
-    <w:abstractNumId w:val="102"/>
+    <w:abstractNumId w:val="103"/>
   </w:num>
   <w:num w:numId="5" w16cid:durableId="1647204897">
-    <w:abstractNumId w:val="164"/>
+    <w:abstractNumId w:val="167"/>
   </w:num>
   <w:num w:numId="6" w16cid:durableId="682589869">
     <w:abstractNumId w:val="32"/>
   </w:num>
   <w:num w:numId="7" w16cid:durableId="679703478">
-    <w:abstractNumId w:val="131"/>
+    <w:abstractNumId w:val="134"/>
   </w:num>
   <w:num w:numId="8" w16cid:durableId="496455128">
     <w:abstractNumId w:val="58"/>
   </w:num>
   <w:num w:numId="9" w16cid:durableId="1184633094">
-    <w:abstractNumId w:val="78"/>
+    <w:abstractNumId w:val="79"/>
   </w:num>
   <w:num w:numId="10" w16cid:durableId="71507387">
-    <w:abstractNumId w:val="85"/>
+    <w:abstractNumId w:val="86"/>
   </w:num>
   <w:num w:numId="11" w16cid:durableId="1412503779">
-    <w:abstractNumId w:val="133"/>
+    <w:abstractNumId w:val="136"/>
   </w:num>
   <w:num w:numId="12" w16cid:durableId="1107113995">
     <w:abstractNumId w:val="59"/>
@@ -28814,34 +29757,34 @@
     <w:abstractNumId w:val="33"/>
   </w:num>
   <w:num w:numId="14" w16cid:durableId="1529222885">
-    <w:abstractNumId w:val="163"/>
+    <w:abstractNumId w:val="166"/>
   </w:num>
   <w:num w:numId="15" w16cid:durableId="836580755">
     <w:abstractNumId w:val="23"/>
   </w:num>
   <w:num w:numId="16" w16cid:durableId="1344674502">
-    <w:abstractNumId w:val="109"/>
+    <w:abstractNumId w:val="111"/>
   </w:num>
   <w:num w:numId="17" w16cid:durableId="1320882603">
-    <w:abstractNumId w:val="144"/>
+    <w:abstractNumId w:val="147"/>
   </w:num>
   <w:num w:numId="18" w16cid:durableId="1139028372">
     <w:abstractNumId w:val="60"/>
   </w:num>
   <w:num w:numId="19" w16cid:durableId="1525635473">
-    <w:abstractNumId w:val="120"/>
+    <w:abstractNumId w:val="122"/>
   </w:num>
   <w:num w:numId="20" w16cid:durableId="609623515">
-    <w:abstractNumId w:val="166"/>
+    <w:abstractNumId w:val="169"/>
   </w:num>
   <w:num w:numId="21" w16cid:durableId="165170997">
-    <w:abstractNumId w:val="136"/>
+    <w:abstractNumId w:val="139"/>
   </w:num>
   <w:num w:numId="22" w16cid:durableId="1620525290">
     <w:abstractNumId w:val="41"/>
   </w:num>
   <w:num w:numId="23" w16cid:durableId="400753109">
-    <w:abstractNumId w:val="148"/>
+    <w:abstractNumId w:val="151"/>
   </w:num>
   <w:num w:numId="24" w16cid:durableId="193882219">
     <w:abstractNumId w:val="8"/>
@@ -28859,13 +29802,13 @@
     <w:abstractNumId w:val="24"/>
   </w:num>
   <w:num w:numId="29" w16cid:durableId="2124693280">
-    <w:abstractNumId w:val="125"/>
+    <w:abstractNumId w:val="128"/>
   </w:num>
   <w:num w:numId="30" w16cid:durableId="1367099744">
     <w:abstractNumId w:val="47"/>
   </w:num>
   <w:num w:numId="31" w16cid:durableId="2011105642">
-    <w:abstractNumId w:val="111"/>
+    <w:abstractNumId w:val="113"/>
   </w:num>
   <w:num w:numId="32" w16cid:durableId="831995364">
     <w:abstractNumId w:val="37"/>
@@ -28883,7 +29826,7 @@
     <w:abstractNumId w:val="3"/>
   </w:num>
   <w:num w:numId="37" w16cid:durableId="1849755457">
-    <w:abstractNumId w:val="149"/>
+    <w:abstractNumId w:val="152"/>
   </w:num>
   <w:num w:numId="38" w16cid:durableId="516505904">
     <w:abstractNumId w:val="21"/>
@@ -28892,85 +29835,85 @@
     <w:abstractNumId w:val="25"/>
   </w:num>
   <w:num w:numId="40" w16cid:durableId="905338697">
-    <w:abstractNumId w:val="90"/>
+    <w:abstractNumId w:val="91"/>
   </w:num>
   <w:num w:numId="41" w16cid:durableId="501896635">
     <w:abstractNumId w:val="62"/>
   </w:num>
   <w:num w:numId="42" w16cid:durableId="1953435156">
-    <w:abstractNumId w:val="91"/>
+    <w:abstractNumId w:val="92"/>
   </w:num>
   <w:num w:numId="43" w16cid:durableId="1060447452">
-    <w:abstractNumId w:val="106"/>
+    <w:abstractNumId w:val="107"/>
   </w:num>
   <w:num w:numId="44" w16cid:durableId="1772503672">
-    <w:abstractNumId w:val="81"/>
+    <w:abstractNumId w:val="82"/>
   </w:num>
   <w:num w:numId="45" w16cid:durableId="1650330222">
-    <w:abstractNumId w:val="88"/>
+    <w:abstractNumId w:val="89"/>
   </w:num>
   <w:num w:numId="46" w16cid:durableId="2102337934">
     <w:abstractNumId w:val="40"/>
   </w:num>
   <w:num w:numId="47" w16cid:durableId="68767822">
-    <w:abstractNumId w:val="134"/>
+    <w:abstractNumId w:val="137"/>
   </w:num>
   <w:num w:numId="48" w16cid:durableId="1992058265">
     <w:abstractNumId w:val="9"/>
   </w:num>
   <w:num w:numId="49" w16cid:durableId="788475134">
-    <w:abstractNumId w:val="160"/>
+    <w:abstractNumId w:val="163"/>
   </w:num>
   <w:num w:numId="50" w16cid:durableId="224419455">
-    <w:abstractNumId w:val="140"/>
+    <w:abstractNumId w:val="143"/>
   </w:num>
   <w:num w:numId="51" w16cid:durableId="1699575947">
-    <w:abstractNumId w:val="119"/>
+    <w:abstractNumId w:val="121"/>
   </w:num>
   <w:num w:numId="52" w16cid:durableId="1048916239">
     <w:abstractNumId w:val="73"/>
   </w:num>
   <w:num w:numId="53" w16cid:durableId="1188711211">
-    <w:abstractNumId w:val="153"/>
+    <w:abstractNumId w:val="156"/>
   </w:num>
   <w:num w:numId="54" w16cid:durableId="447555614">
-    <w:abstractNumId w:val="122"/>
+    <w:abstractNumId w:val="124"/>
   </w:num>
   <w:num w:numId="55" w16cid:durableId="1679307268">
     <w:abstractNumId w:val="70"/>
   </w:num>
   <w:num w:numId="56" w16cid:durableId="693773591">
-    <w:abstractNumId w:val="138"/>
+    <w:abstractNumId w:val="141"/>
   </w:num>
   <w:num w:numId="57" w16cid:durableId="1110473324">
     <w:abstractNumId w:val="50"/>
   </w:num>
   <w:num w:numId="58" w16cid:durableId="842937968">
-    <w:abstractNumId w:val="86"/>
+    <w:abstractNumId w:val="87"/>
   </w:num>
   <w:num w:numId="59" w16cid:durableId="821121315">
     <w:abstractNumId w:val="57"/>
   </w:num>
   <w:num w:numId="60" w16cid:durableId="2095394549">
-    <w:abstractNumId w:val="157"/>
+    <w:abstractNumId w:val="160"/>
   </w:num>
   <w:num w:numId="61" w16cid:durableId="1299921011">
     <w:abstractNumId w:val="55"/>
   </w:num>
   <w:num w:numId="62" w16cid:durableId="1927420240">
-    <w:abstractNumId w:val="96"/>
+    <w:abstractNumId w:val="97"/>
   </w:num>
   <w:num w:numId="63" w16cid:durableId="41290043">
-    <w:abstractNumId w:val="101"/>
+    <w:abstractNumId w:val="102"/>
   </w:num>
   <w:num w:numId="64" w16cid:durableId="999846909">
-    <w:abstractNumId w:val="82"/>
+    <w:abstractNumId w:val="83"/>
   </w:num>
   <w:num w:numId="65" w16cid:durableId="1250969563">
-    <w:abstractNumId w:val="94"/>
+    <w:abstractNumId w:val="95"/>
   </w:num>
   <w:num w:numId="66" w16cid:durableId="484011382">
-    <w:abstractNumId w:val="132"/>
+    <w:abstractNumId w:val="135"/>
   </w:num>
   <w:num w:numId="67" w16cid:durableId="2008289242">
     <w:abstractNumId w:val="18"/>
@@ -28979,13 +29922,13 @@
     <w:abstractNumId w:val="26"/>
   </w:num>
   <w:num w:numId="69" w16cid:durableId="1296839887">
-    <w:abstractNumId w:val="100"/>
+    <w:abstractNumId w:val="101"/>
   </w:num>
   <w:num w:numId="70" w16cid:durableId="336662050">
-    <w:abstractNumId w:val="118"/>
+    <w:abstractNumId w:val="120"/>
   </w:num>
   <w:num w:numId="71" w16cid:durableId="1460032333">
-    <w:abstractNumId w:val="137"/>
+    <w:abstractNumId w:val="140"/>
   </w:num>
   <w:num w:numId="72" w16cid:durableId="592400615">
     <w:abstractNumId w:val="15"/>
@@ -29003,13 +29946,13 @@
     <w:abstractNumId w:val="44"/>
   </w:num>
   <w:num w:numId="77" w16cid:durableId="763109604">
-    <w:abstractNumId w:val="103"/>
+    <w:abstractNumId w:val="104"/>
   </w:num>
   <w:num w:numId="78" w16cid:durableId="2138137265">
-    <w:abstractNumId w:val="124"/>
+    <w:abstractNumId w:val="126"/>
   </w:num>
   <w:num w:numId="79" w16cid:durableId="343675924">
-    <w:abstractNumId w:val="145"/>
+    <w:abstractNumId w:val="148"/>
   </w:num>
   <w:num w:numId="80" w16cid:durableId="1823277442">
     <w:abstractNumId w:val="54"/>
@@ -29018,25 +29961,25 @@
     <w:abstractNumId w:val="0"/>
   </w:num>
   <w:num w:numId="82" w16cid:durableId="1113326280">
-    <w:abstractNumId w:val="99"/>
+    <w:abstractNumId w:val="100"/>
   </w:num>
   <w:num w:numId="83" w16cid:durableId="1253051103">
-    <w:abstractNumId w:val="135"/>
+    <w:abstractNumId w:val="138"/>
   </w:num>
   <w:num w:numId="84" w16cid:durableId="444888444">
     <w:abstractNumId w:val="64"/>
   </w:num>
   <w:num w:numId="85" w16cid:durableId="64299649">
-    <w:abstractNumId w:val="126"/>
+    <w:abstractNumId w:val="129"/>
   </w:num>
   <w:num w:numId="86" w16cid:durableId="868182992">
-    <w:abstractNumId w:val="80"/>
+    <w:abstractNumId w:val="81"/>
   </w:num>
   <w:num w:numId="87" w16cid:durableId="896863331">
     <w:abstractNumId w:val="34"/>
   </w:num>
   <w:num w:numId="88" w16cid:durableId="505442826">
-    <w:abstractNumId w:val="130"/>
+    <w:abstractNumId w:val="133"/>
   </w:num>
   <w:num w:numId="89" w16cid:durableId="1858763908">
     <w:abstractNumId w:val="48"/>
@@ -29045,34 +29988,34 @@
     <w:abstractNumId w:val="20"/>
   </w:num>
   <w:num w:numId="91" w16cid:durableId="1284576603">
-    <w:abstractNumId w:val="112"/>
+    <w:abstractNumId w:val="114"/>
   </w:num>
   <w:num w:numId="92" w16cid:durableId="1963075542">
     <w:abstractNumId w:val="14"/>
   </w:num>
   <w:num w:numId="93" w16cid:durableId="787627596">
-    <w:abstractNumId w:val="98"/>
+    <w:abstractNumId w:val="99"/>
   </w:num>
   <w:num w:numId="94" w16cid:durableId="2003925799">
     <w:abstractNumId w:val="17"/>
   </w:num>
   <w:num w:numId="95" w16cid:durableId="1169102579">
-    <w:abstractNumId w:val="115"/>
+    <w:abstractNumId w:val="117"/>
   </w:num>
   <w:num w:numId="96" w16cid:durableId="1216501564">
     <w:abstractNumId w:val="45"/>
   </w:num>
   <w:num w:numId="97" w16cid:durableId="261768216">
-    <w:abstractNumId w:val="141"/>
+    <w:abstractNumId w:val="144"/>
   </w:num>
   <w:num w:numId="98" w16cid:durableId="2141918721">
-    <w:abstractNumId w:val="93"/>
+    <w:abstractNumId w:val="94"/>
   </w:num>
   <w:num w:numId="99" w16cid:durableId="905841544">
     <w:abstractNumId w:val="52"/>
   </w:num>
   <w:num w:numId="100" w16cid:durableId="1753887223">
-    <w:abstractNumId w:val="113"/>
+    <w:abstractNumId w:val="115"/>
   </w:num>
   <w:num w:numId="101" w16cid:durableId="1320184766">
     <w:abstractNumId w:val="39"/>
@@ -29087,52 +30030,52 @@
     <w:abstractNumId w:val="66"/>
   </w:num>
   <w:num w:numId="105" w16cid:durableId="70857193">
-    <w:abstractNumId w:val="76"/>
+    <w:abstractNumId w:val="77"/>
   </w:num>
   <w:num w:numId="106" w16cid:durableId="1617908629">
-    <w:abstractNumId w:val="147"/>
+    <w:abstractNumId w:val="150"/>
   </w:num>
   <w:num w:numId="107" w16cid:durableId="970137111">
-    <w:abstractNumId w:val="165"/>
+    <w:abstractNumId w:val="168"/>
   </w:num>
   <w:num w:numId="108" w16cid:durableId="383797013">
     <w:abstractNumId w:val="61"/>
   </w:num>
   <w:num w:numId="109" w16cid:durableId="1459567304">
-    <w:abstractNumId w:val="75"/>
+    <w:abstractNumId w:val="76"/>
   </w:num>
   <w:num w:numId="110" w16cid:durableId="862745862">
     <w:abstractNumId w:val="27"/>
   </w:num>
   <w:num w:numId="111" w16cid:durableId="1859536331">
-    <w:abstractNumId w:val="79"/>
+    <w:abstractNumId w:val="80"/>
   </w:num>
   <w:num w:numId="112" w16cid:durableId="2092697678">
-    <w:abstractNumId w:val="95"/>
+    <w:abstractNumId w:val="96"/>
   </w:num>
   <w:num w:numId="113" w16cid:durableId="1418403813">
-    <w:abstractNumId w:val="83"/>
+    <w:abstractNumId w:val="84"/>
   </w:num>
   <w:num w:numId="114" w16cid:durableId="1965042317">
-    <w:abstractNumId w:val="146"/>
+    <w:abstractNumId w:val="149"/>
   </w:num>
   <w:num w:numId="115" w16cid:durableId="670569040">
     <w:abstractNumId w:val="71"/>
   </w:num>
   <w:num w:numId="116" w16cid:durableId="413823113">
-    <w:abstractNumId w:val="161"/>
+    <w:abstractNumId w:val="164"/>
   </w:num>
   <w:num w:numId="117" w16cid:durableId="1293747982">
-    <w:abstractNumId w:val="128"/>
+    <w:abstractNumId w:val="131"/>
   </w:num>
   <w:num w:numId="118" w16cid:durableId="2058698591">
-    <w:abstractNumId w:val="77"/>
+    <w:abstractNumId w:val="78"/>
   </w:num>
   <w:num w:numId="119" w16cid:durableId="892157361">
-    <w:abstractNumId w:val="97"/>
+    <w:abstractNumId w:val="98"/>
   </w:num>
   <w:num w:numId="120" w16cid:durableId="1449229938">
-    <w:abstractNumId w:val="150"/>
+    <w:abstractNumId w:val="153"/>
   </w:num>
   <w:num w:numId="121" w16cid:durableId="177283374">
     <w:abstractNumId w:val="12"/>
@@ -29141,31 +30084,31 @@
     <w:abstractNumId w:val="16"/>
   </w:num>
   <w:num w:numId="123" w16cid:durableId="1495337109">
-    <w:abstractNumId w:val="154"/>
+    <w:abstractNumId w:val="157"/>
   </w:num>
   <w:num w:numId="124" w16cid:durableId="302319311">
-    <w:abstractNumId w:val="108"/>
+    <w:abstractNumId w:val="110"/>
   </w:num>
   <w:num w:numId="125" w16cid:durableId="1891844186">
-    <w:abstractNumId w:val="127"/>
+    <w:abstractNumId w:val="130"/>
   </w:num>
   <w:num w:numId="126" w16cid:durableId="256911009">
     <w:abstractNumId w:val="1"/>
   </w:num>
   <w:num w:numId="127" w16cid:durableId="1001927776">
-    <w:abstractNumId w:val="167"/>
+    <w:abstractNumId w:val="170"/>
   </w:num>
   <w:num w:numId="128" w16cid:durableId="1365057616">
-    <w:abstractNumId w:val="114"/>
+    <w:abstractNumId w:val="116"/>
   </w:num>
   <w:num w:numId="129" w16cid:durableId="2142647602">
-    <w:abstractNumId w:val="116"/>
+    <w:abstractNumId w:val="118"/>
   </w:num>
   <w:num w:numId="130" w16cid:durableId="1895652277">
-    <w:abstractNumId w:val="168"/>
+    <w:abstractNumId w:val="171"/>
   </w:num>
   <w:num w:numId="131" w16cid:durableId="1132407586">
-    <w:abstractNumId w:val="158"/>
+    <w:abstractNumId w:val="161"/>
   </w:num>
   <w:num w:numId="132" w16cid:durableId="1209996408">
     <w:abstractNumId w:val="13"/>
@@ -29174,13 +30117,13 @@
     <w:abstractNumId w:val="5"/>
   </w:num>
   <w:num w:numId="134" w16cid:durableId="220867256">
-    <w:abstractNumId w:val="129"/>
+    <w:abstractNumId w:val="132"/>
   </w:num>
   <w:num w:numId="135" w16cid:durableId="2026857351">
     <w:abstractNumId w:val="38"/>
   </w:num>
   <w:num w:numId="136" w16cid:durableId="1236696510">
-    <w:abstractNumId w:val="156"/>
+    <w:abstractNumId w:val="159"/>
   </w:num>
   <w:num w:numId="137" w16cid:durableId="1156385716">
     <w:abstractNumId w:val="53"/>
@@ -29201,13 +30144,13 @@
     <w:abstractNumId w:val="68"/>
   </w:num>
   <w:num w:numId="143" w16cid:durableId="1058674300">
-    <w:abstractNumId w:val="84"/>
+    <w:abstractNumId w:val="85"/>
   </w:num>
   <w:num w:numId="144" w16cid:durableId="756362112">
     <w:abstractNumId w:val="7"/>
   </w:num>
   <w:num w:numId="145" w16cid:durableId="1612125897">
-    <w:abstractNumId w:val="92"/>
+    <w:abstractNumId w:val="93"/>
   </w:num>
   <w:num w:numId="146" w16cid:durableId="797142166">
     <w:abstractNumId w:val="30"/>
@@ -29216,31 +30159,31 @@
     <w:abstractNumId w:val="10"/>
   </w:num>
   <w:num w:numId="148" w16cid:durableId="1917398031">
-    <w:abstractNumId w:val="121"/>
+    <w:abstractNumId w:val="123"/>
   </w:num>
   <w:num w:numId="149" w16cid:durableId="524444307">
-    <w:abstractNumId w:val="142"/>
+    <w:abstractNumId w:val="145"/>
   </w:num>
   <w:num w:numId="150" w16cid:durableId="859783391">
-    <w:abstractNumId w:val="152"/>
+    <w:abstractNumId w:val="155"/>
   </w:num>
   <w:num w:numId="151" w16cid:durableId="2097357959">
-    <w:abstractNumId w:val="155"/>
+    <w:abstractNumId w:val="158"/>
   </w:num>
   <w:num w:numId="152" w16cid:durableId="748579603">
-    <w:abstractNumId w:val="162"/>
+    <w:abstractNumId w:val="165"/>
   </w:num>
   <w:num w:numId="153" w16cid:durableId="1193568221">
     <w:abstractNumId w:val="29"/>
   </w:num>
   <w:num w:numId="154" w16cid:durableId="913079688">
-    <w:abstractNumId w:val="117"/>
+    <w:abstractNumId w:val="119"/>
   </w:num>
   <w:num w:numId="155" w16cid:durableId="1216234668">
     <w:abstractNumId w:val="56"/>
   </w:num>
   <w:num w:numId="156" w16cid:durableId="240020660">
-    <w:abstractNumId w:val="151"/>
+    <w:abstractNumId w:val="154"/>
   </w:num>
   <w:num w:numId="157" w16cid:durableId="1604263775">
     <w:abstractNumId w:val="43"/>
@@ -29252,34 +30195,43 @@
     <w:abstractNumId w:val="4"/>
   </w:num>
   <w:num w:numId="160" w16cid:durableId="640892086">
-    <w:abstractNumId w:val="89"/>
+    <w:abstractNumId w:val="90"/>
   </w:num>
   <w:num w:numId="161" w16cid:durableId="610010161">
-    <w:abstractNumId w:val="139"/>
+    <w:abstractNumId w:val="142"/>
   </w:num>
   <w:num w:numId="162" w16cid:durableId="1104762223">
-    <w:abstractNumId w:val="143"/>
+    <w:abstractNumId w:val="146"/>
   </w:num>
   <w:num w:numId="163" w16cid:durableId="596792981">
-    <w:abstractNumId w:val="107"/>
+    <w:abstractNumId w:val="109"/>
   </w:num>
   <w:num w:numId="164" w16cid:durableId="2035573063">
-    <w:abstractNumId w:val="104"/>
+    <w:abstractNumId w:val="105"/>
   </w:num>
   <w:num w:numId="165" w16cid:durableId="1444885796">
-    <w:abstractNumId w:val="105"/>
+    <w:abstractNumId w:val="106"/>
   </w:num>
   <w:num w:numId="166" w16cid:durableId="1898589376">
-    <w:abstractNumId w:val="159"/>
+    <w:abstractNumId w:val="162"/>
   </w:num>
   <w:num w:numId="167" w16cid:durableId="1031300584">
-    <w:abstractNumId w:val="110"/>
+    <w:abstractNumId w:val="112"/>
   </w:num>
   <w:num w:numId="168" w16cid:durableId="12998393">
     <w:abstractNumId w:val="69"/>
   </w:num>
   <w:num w:numId="169" w16cid:durableId="1888099200">
     <w:abstractNumId w:val="63"/>
+  </w:num>
+  <w:num w:numId="170" w16cid:durableId="749038013">
+    <w:abstractNumId w:val="75"/>
+  </w:num>
+  <w:num w:numId="171" w16cid:durableId="107625264">
+    <w:abstractNumId w:val="108"/>
+  </w:num>
+  <w:num w:numId="172" w16cid:durableId="644552680">
+    <w:abstractNumId w:val="127"/>
   </w:num>
   <w:numIdMacAtCleanup w:val="45"/>
 </w:numbering>

</xml_diff>

<commit_message>
Analytics Generation Workflow (#275) AI & Analytics Activity Diagrams (#272)
</commit_message>
<xml_diff>
--- a/Activity Specification Document.docx
+++ b/Activity Specification Document.docx
@@ -6668,14 +6668,574 @@
     </w:p>
     <w:p>
       <w:pPr>
+        <w:pStyle w:val="Heading3"/>
+        <w:rPr>
+          <w:rFonts w:eastAsiaTheme="minorHAnsi"/>
+        </w:rPr>
+      </w:pPr>
+      <w:r>
+        <w:rPr>
+          <w:rFonts w:eastAsiaTheme="minorHAnsi"/>
+        </w:rPr>
+        <w:lastRenderedPageBreak/>
+        <w:t xml:space="preserve">12- </w:t>
+      </w:r>
+      <w:r>
+        <w:rPr>
+          <w:rFonts w:eastAsiaTheme="minorHAnsi"/>
+        </w:rPr>
+        <w:t>Analytics Generation Workflow Activity</w:t>
+      </w:r>
+    </w:p>
+    <w:p>
+      <w:pPr>
         <w:tabs>
           <w:tab w:val="left" w:pos="3645"/>
         </w:tabs>
-      </w:pPr>
-      <w:r>
-        <w:lastRenderedPageBreak/>
+        <w:rPr>
+          <w:b/>
+          <w:bCs/>
+        </w:rPr>
+      </w:pPr>
+      <w:r>
+        <w:rPr>
+          <w:b/>
+          <w:bCs/>
+        </w:rPr>
+        <w:t>Purpose</w:t>
+      </w:r>
+    </w:p>
+    <w:p>
+      <w:pPr>
+        <w:tabs>
+          <w:tab w:val="left" w:pos="3645"/>
+        </w:tabs>
+      </w:pPr>
+      <w:r>
+        <w:t>Analytics Generation Workflow Activity Diagram shows the way in which the KriGo platform collects operational data, performs analysis and derives business insights for the administration. This workflow assists in making data-driven decisions through conversion of reservation, payment and fleet data into meaningful reports and dashboards.</w:t>
+      </w:r>
+      <w:r>
         <w:t xml:space="preserve"> </w:t>
       </w:r>
+    </w:p>
+    <w:p>
+      <w:pPr>
+        <w:tabs>
+          <w:tab w:val="left" w:pos="3645"/>
+        </w:tabs>
+        <w:rPr>
+          <w:b/>
+          <w:bCs/>
+        </w:rPr>
+      </w:pPr>
+      <w:r>
+        <w:rPr>
+          <w:b/>
+          <w:bCs/>
+        </w:rPr>
+        <w:t>Workflow Description</w:t>
+      </w:r>
+    </w:p>
+    <w:p>
+      <w:pPr>
+        <w:tabs>
+          <w:tab w:val="left" w:pos="3645"/>
+        </w:tabs>
+      </w:pPr>
+      <w:r>
+        <w:t>This workflow starts when the system administrator makes a request for an analytics report. The system accesses reservation data, payment transactions, and fleet management data stored in the database. Datasets are processed in the analytics engine for calculation of KPIs and trends to make visual reports.</w:t>
+      </w:r>
+    </w:p>
+    <w:p>
+      <w:pPr>
+        <w:tabs>
+          <w:tab w:val="left" w:pos="3645"/>
+        </w:tabs>
+      </w:pPr>
+      <w:r>
+        <w:t>Depending on whether the data is sufficient, either dashboards and analytics reports will be generated for presentation to the administrator or the system will notify the administrator that analytics reports cannot be created because of insufficient data for the selected criteria.</w:t>
+      </w:r>
+    </w:p>
+    <w:p>
+      <w:pPr>
+        <w:tabs>
+          <w:tab w:val="left" w:pos="3645"/>
+        </w:tabs>
+        <w:rPr>
+          <w:b/>
+          <w:bCs/>
+        </w:rPr>
+      </w:pPr>
+      <w:r>
+        <w:rPr>
+          <w:b/>
+          <w:bCs/>
+        </w:rPr>
+        <w:t>Main Activities</w:t>
+      </w:r>
+    </w:p>
+    <w:p>
+      <w:pPr>
+        <w:pStyle w:val="ListParagraph"/>
+        <w:numPr>
+          <w:ilvl w:val="0"/>
+          <w:numId w:val="175"/>
+        </w:numPr>
+        <w:tabs>
+          <w:tab w:val="left" w:pos="3645"/>
+        </w:tabs>
+      </w:pPr>
+      <w:r>
+        <w:t>Request analytics report.</w:t>
+      </w:r>
+    </w:p>
+    <w:p>
+      <w:pPr>
+        <w:pStyle w:val="ListParagraph"/>
+        <w:numPr>
+          <w:ilvl w:val="0"/>
+          <w:numId w:val="175"/>
+        </w:numPr>
+        <w:tabs>
+          <w:tab w:val="left" w:pos="3645"/>
+        </w:tabs>
+      </w:pPr>
+      <w:r>
+        <w:t xml:space="preserve">Retrieve </w:t>
+      </w:r>
+      <w:r>
+        <w:t>data</w:t>
+      </w:r>
+      <w:r>
+        <w:t xml:space="preserve"> </w:t>
+      </w:r>
+      <w:r>
+        <w:t xml:space="preserve">of </w:t>
+      </w:r>
+      <w:r>
+        <w:t>reservation</w:t>
+      </w:r>
+      <w:r>
+        <w:t xml:space="preserve">, </w:t>
+      </w:r>
+      <w:r>
+        <w:t>payment</w:t>
+      </w:r>
+      <w:r>
+        <w:t xml:space="preserve">, </w:t>
+      </w:r>
+      <w:r>
+        <w:t>fleet</w:t>
+      </w:r>
+      <w:r>
+        <w:t>.</w:t>
+      </w:r>
+    </w:p>
+    <w:p>
+      <w:pPr>
+        <w:pStyle w:val="ListParagraph"/>
+        <w:numPr>
+          <w:ilvl w:val="0"/>
+          <w:numId w:val="175"/>
+        </w:numPr>
+        <w:tabs>
+          <w:tab w:val="left" w:pos="3645"/>
+        </w:tabs>
+      </w:pPr>
+      <w:r>
+        <w:t>Aggregate operational data.</w:t>
+      </w:r>
+    </w:p>
+    <w:p>
+      <w:pPr>
+        <w:pStyle w:val="ListParagraph"/>
+        <w:numPr>
+          <w:ilvl w:val="0"/>
+          <w:numId w:val="175"/>
+        </w:numPr>
+        <w:tabs>
+          <w:tab w:val="left" w:pos="3645"/>
+        </w:tabs>
+      </w:pPr>
+      <w:r>
+        <w:t>Generate analytics.</w:t>
+      </w:r>
+    </w:p>
+    <w:p>
+      <w:pPr>
+        <w:pStyle w:val="ListParagraph"/>
+        <w:numPr>
+          <w:ilvl w:val="0"/>
+          <w:numId w:val="175"/>
+        </w:numPr>
+        <w:tabs>
+          <w:tab w:val="left" w:pos="3645"/>
+        </w:tabs>
+      </w:pPr>
+      <w:r>
+        <w:rPr>
+          <w:noProof/>
+        </w:rPr>
+        <mc:AlternateContent>
+          <mc:Choice Requires="wps">
+            <w:drawing>
+              <wp:anchor distT="0" distB="0" distL="114300" distR="114300" simplePos="0" relativeHeight="251669504" behindDoc="0" locked="0" layoutInCell="1" allowOverlap="1" wp14:anchorId="2DF4E8A1" wp14:editId="593664CF">
+                <wp:simplePos x="0" y="0"/>
+                <wp:positionH relativeFrom="column">
+                  <wp:posOffset>2978150</wp:posOffset>
+                </wp:positionH>
+                <wp:positionV relativeFrom="paragraph">
+                  <wp:posOffset>4464685</wp:posOffset>
+                </wp:positionV>
+                <wp:extent cx="3221355" cy="635"/>
+                <wp:effectExtent l="0" t="0" r="0" b="0"/>
+                <wp:wrapSquare wrapText="bothSides"/>
+                <wp:docPr id="145610018" name="Text Box 1"/>
+                <wp:cNvGraphicFramePr/>
+                <a:graphic xmlns:a="http://schemas.openxmlformats.org/drawingml/2006/main">
+                  <a:graphicData uri="http://schemas.microsoft.com/office/word/2010/wordprocessingShape">
+                    <wps:wsp>
+                      <wps:cNvSpPr txBox="1"/>
+                      <wps:spPr>
+                        <a:xfrm>
+                          <a:off x="0" y="0"/>
+                          <a:ext cx="3221355" cy="635"/>
+                        </a:xfrm>
+                        <a:prstGeom prst="rect">
+                          <a:avLst/>
+                        </a:prstGeom>
+                        <a:solidFill>
+                          <a:prstClr val="white"/>
+                        </a:solidFill>
+                        <a:ln>
+                          <a:noFill/>
+                        </a:ln>
+                      </wps:spPr>
+                      <wps:txbx>
+                        <w:txbxContent>
+                          <w:p>
+                            <w:pPr>
+                              <w:pStyle w:val="Caption"/>
+                              <w:rPr>
+                                <w:noProof/>
+                              </w:rPr>
+                            </w:pPr>
+                            <w:r>
+                              <w:t xml:space="preserve">Figure </w:t>
+                            </w:r>
+                            <w:r>
+                              <w:fldChar w:fldCharType="begin"/>
+                            </w:r>
+                            <w:r>
+                              <w:instrText xml:space="preserve"> SEQ Figure \* ARABIC </w:instrText>
+                            </w:r>
+                            <w:r>
+                              <w:fldChar w:fldCharType="separate"/>
+                            </w:r>
+                            <w:r>
+                              <w:rPr>
+                                <w:noProof/>
+                              </w:rPr>
+                              <w:t>12</w:t>
+                            </w:r>
+                            <w:r>
+                              <w:fldChar w:fldCharType="end"/>
+                            </w:r>
+                            <w:r>
+                              <w:t xml:space="preserve"> - </w:t>
+                            </w:r>
+                            <w:r>
+                              <w:t>AI Analytics Generation Workflow Activity Diagram</w:t>
+                            </w:r>
+                          </w:p>
+                        </w:txbxContent>
+                      </wps:txbx>
+                      <wps:bodyPr rot="0" spcFirstLastPara="0" vertOverflow="overflow" horzOverflow="overflow" vert="horz" wrap="square" lIns="0" tIns="0" rIns="0" bIns="0" numCol="1" spcCol="0" rtlCol="0" fromWordArt="0" anchor="t" anchorCtr="0" forceAA="0" compatLnSpc="1">
+                        <a:prstTxWarp prst="textNoShape">
+                          <a:avLst/>
+                        </a:prstTxWarp>
+                        <a:spAutoFit/>
+                      </wps:bodyPr>
+                    </wps:wsp>
+                  </a:graphicData>
+                </a:graphic>
+              </wp:anchor>
+            </w:drawing>
+          </mc:Choice>
+          <mc:Fallback>
+            <w:pict>
+              <v:shape w14:anchorId="2DF4E8A1" id="_x0000_s1029" type="#_x0000_t202" style="position:absolute;left:0;text-align:left;margin-left:234.5pt;margin-top:351.55pt;width:253.65pt;height:.05pt;z-index:251669504;visibility:visible;mso-wrap-style:square;mso-wrap-distance-left:9pt;mso-wrap-distance-top:0;mso-wrap-distance-right:9pt;mso-wrap-distance-bottom:0;mso-position-horizontal:absolute;mso-position-horizontal-relative:text;mso-position-vertical:absolute;mso-position-vertical-relative:text;v-text-anchor:top" o:gfxdata="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" stroked="f">
+                <v:textbox style="mso-fit-shape-to-text:t" inset="0,0,0,0">
+                  <w:txbxContent>
+                    <w:p>
+                      <w:pPr>
+                        <w:pStyle w:val="Caption"/>
+                        <w:rPr>
+                          <w:noProof/>
+                        </w:rPr>
+                      </w:pPr>
+                      <w:r>
+                        <w:t xml:space="preserve">Figure </w:t>
+                      </w:r>
+                      <w:r>
+                        <w:fldChar w:fldCharType="begin"/>
+                      </w:r>
+                      <w:r>
+                        <w:instrText xml:space="preserve"> SEQ Figure \* ARABIC </w:instrText>
+                      </w:r>
+                      <w:r>
+                        <w:fldChar w:fldCharType="separate"/>
+                      </w:r>
+                      <w:r>
+                        <w:rPr>
+                          <w:noProof/>
+                        </w:rPr>
+                        <w:t>12</w:t>
+                      </w:r>
+                      <w:r>
+                        <w:fldChar w:fldCharType="end"/>
+                      </w:r>
+                      <w:r>
+                        <w:t xml:space="preserve"> - </w:t>
+                      </w:r>
+                      <w:r>
+                        <w:t>AI Analytics Generation Workflow Activity Diagram</w:t>
+                      </w:r>
+                    </w:p>
+                  </w:txbxContent>
+                </v:textbox>
+                <w10:wrap type="square"/>
+              </v:shape>
+            </w:pict>
+          </mc:Fallback>
+        </mc:AlternateContent>
+      </w:r>
+      <w:r>
+        <w:rPr>
+          <w:noProof/>
+        </w:rPr>
+        <w:drawing>
+          <wp:anchor distT="0" distB="0" distL="114300" distR="114300" simplePos="0" relativeHeight="251667456" behindDoc="0" locked="0" layoutInCell="1" allowOverlap="1" wp14:anchorId="04710C35" wp14:editId="55323246">
+            <wp:simplePos x="0" y="0"/>
+            <wp:positionH relativeFrom="column">
+              <wp:posOffset>2978150</wp:posOffset>
+            </wp:positionH>
+            <wp:positionV relativeFrom="paragraph">
+              <wp:posOffset>109220</wp:posOffset>
+            </wp:positionV>
+            <wp:extent cx="3221355" cy="4298830"/>
+            <wp:effectExtent l="0" t="0" r="0" b="6985"/>
+            <wp:wrapSquare wrapText="bothSides"/>
+            <wp:docPr id="2032707828" name="Picture 19"/>
+            <wp:cNvGraphicFramePr>
+              <a:graphicFrameLocks xmlns:a="http://schemas.openxmlformats.org/drawingml/2006/main" noChangeAspect="1"/>
+            </wp:cNvGraphicFramePr>
+            <a:graphic xmlns:a="http://schemas.openxmlformats.org/drawingml/2006/main">
+              <a:graphicData uri="http://schemas.openxmlformats.org/drawingml/2006/picture">
+                <pic:pic xmlns:pic="http://schemas.openxmlformats.org/drawingml/2006/picture">
+                  <pic:nvPicPr>
+                    <pic:cNvPr id="0" name="Picture 23"/>
+                    <pic:cNvPicPr>
+                      <a:picLocks noChangeAspect="1" noChangeArrowheads="1"/>
+                    </pic:cNvPicPr>
+                  </pic:nvPicPr>
+                  <pic:blipFill>
+                    <a:blip r:embed="rId19">
+                      <a:extLst>
+                        <a:ext uri="{28A0092B-C50C-407E-A947-70E740481C1C}">
+                          <a14:useLocalDpi xmlns:a14="http://schemas.microsoft.com/office/drawing/2010/main" val="0"/>
+                        </a:ext>
+                      </a:extLst>
+                    </a:blip>
+                    <a:srcRect/>
+                    <a:stretch>
+                      <a:fillRect/>
+                    </a:stretch>
+                  </pic:blipFill>
+                  <pic:spPr bwMode="auto">
+                    <a:xfrm>
+                      <a:off x="0" y="0"/>
+                      <a:ext cx="3221355" cy="4298830"/>
+                    </a:xfrm>
+                    <a:prstGeom prst="rect">
+                      <a:avLst/>
+                    </a:prstGeom>
+                    <a:noFill/>
+                    <a:ln>
+                      <a:noFill/>
+                    </a:ln>
+                  </pic:spPr>
+                </pic:pic>
+              </a:graphicData>
+            </a:graphic>
+            <wp14:sizeRelH relativeFrom="margin">
+              <wp14:pctWidth>0</wp14:pctWidth>
+            </wp14:sizeRelH>
+            <wp14:sizeRelV relativeFrom="margin">
+              <wp14:pctHeight>0</wp14:pctHeight>
+            </wp14:sizeRelV>
+          </wp:anchor>
+        </w:drawing>
+      </w:r>
+      <w:r>
+        <w:t>Produce dashboards and reports.</w:t>
+      </w:r>
+    </w:p>
+    <w:p>
+      <w:pPr>
+        <w:pStyle w:val="ListParagraph"/>
+        <w:numPr>
+          <w:ilvl w:val="0"/>
+          <w:numId w:val="175"/>
+        </w:numPr>
+        <w:tabs>
+          <w:tab w:val="left" w:pos="3645"/>
+        </w:tabs>
+      </w:pPr>
+      <w:r>
+        <w:t>Display analytics results.</w:t>
+      </w:r>
+    </w:p>
+    <w:p>
+      <w:pPr>
+        <w:tabs>
+          <w:tab w:val="left" w:pos="3645"/>
+        </w:tabs>
+        <w:rPr>
+          <w:b/>
+          <w:bCs/>
+        </w:rPr>
+      </w:pPr>
+      <w:r>
+        <w:rPr>
+          <w:b/>
+          <w:bCs/>
+        </w:rPr>
+        <w:t>Decision Point</w:t>
+      </w:r>
+    </w:p>
+    <w:p>
+      <w:pPr>
+        <w:tabs>
+          <w:tab w:val="left" w:pos="3645"/>
+        </w:tabs>
+      </w:pPr>
+      <w:r>
+        <w:rPr>
+          <w:b/>
+          <w:bCs/>
+        </w:rPr>
+        <w:t>Data Available?</w:t>
+      </w:r>
+    </w:p>
+    <w:p>
+      <w:pPr>
+        <w:numPr>
+          <w:ilvl w:val="0"/>
+          <w:numId w:val="174"/>
+        </w:numPr>
+        <w:tabs>
+          <w:tab w:val="left" w:pos="3645"/>
+        </w:tabs>
+        <w:spacing w:after="0"/>
+      </w:pPr>
+      <w:r>
+        <w:rPr>
+          <w:b/>
+          <w:bCs/>
+        </w:rPr>
+        <w:t>Yes:</w:t>
+      </w:r>
+      <w:r>
+        <w:t xml:space="preserve"> Generate and display dashboards and reports.</w:t>
+      </w:r>
+    </w:p>
+    <w:p>
+      <w:pPr>
+        <w:numPr>
+          <w:ilvl w:val="0"/>
+          <w:numId w:val="174"/>
+        </w:numPr>
+        <w:tabs>
+          <w:tab w:val="left" w:pos="3645"/>
+        </w:tabs>
+      </w:pPr>
+      <w:r>
+        <w:rPr>
+          <w:b/>
+          <w:bCs/>
+        </w:rPr>
+        <w:t>No:</w:t>
+      </w:r>
+      <w:r>
+        <w:t xml:space="preserve"> Display a message indicating that no data is available.</w:t>
+      </w:r>
+    </w:p>
+    <w:p>
+      <w:pPr>
+        <w:tabs>
+          <w:tab w:val="left" w:pos="3645"/>
+        </w:tabs>
+        <w:rPr>
+          <w:b/>
+          <w:bCs/>
+        </w:rPr>
+      </w:pPr>
+      <w:r>
+        <w:rPr>
+          <w:b/>
+          <w:bCs/>
+        </w:rPr>
+        <w:t>Conclusion</w:t>
+      </w:r>
+    </w:p>
+    <w:p>
+      <w:pPr>
+        <w:tabs>
+          <w:tab w:val="left" w:pos="3645"/>
+        </w:tabs>
+        <w:rPr>
+          <w:b/>
+          <w:bCs/>
+        </w:rPr>
+      </w:pPr>
+      <w:r>
+        <w:t>Analytics Generation Workflow Activity Diagram depicts how the operational data collected from various modules is turned into useful business intelligence. Through creation of dashboards, performance indicators, and analytics reports, the workflow helps in efficient monitoring and decision-making.</w:t>
+      </w:r>
+      <w:r>
+        <w:rPr>
+          <w:b/>
+          <w:bCs/>
+        </w:rPr>
+        <w:t xml:space="preserve"> </w:t>
+      </w:r>
+    </w:p>
+    <w:p>
+      <w:pPr>
+        <w:spacing w:line="278" w:lineRule="auto"/>
+        <w:rPr>
+          <w:b/>
+          <w:bCs/>
+        </w:rPr>
+      </w:pPr>
+      <w:r>
+        <w:rPr>
+          <w:b/>
+          <w:bCs/>
+        </w:rPr>
+        <w:br w:type="page"/>
+      </w:r>
+    </w:p>
+    <w:p>
+      <w:pPr>
+        <w:tabs>
+          <w:tab w:val="left" w:pos="3645"/>
+        </w:tabs>
+        <w:rPr>
+          <w:b/>
+          <w:bCs/>
+        </w:rPr>
+      </w:pPr>
     </w:p>
     <w:p>
       <w:pPr>
@@ -7165,6 +7725,119 @@
     </w:lvl>
   </w:abstractNum>
   <w:abstractNum w:abstractNumId="3" w15:restartNumberingAfterBreak="0">
+    <w:nsid w:val="02024402"/>
+    <w:multiLevelType w:val="hybridMultilevel"/>
+    <w:tmpl w:val="AB10FD74"/>
+    <w:lvl w:ilvl="0" w:tplc="04090005">
+      <w:start w:val="1"/>
+      <w:numFmt w:val="bullet"/>
+      <w:lvlText w:val=""/>
+      <w:lvlJc w:val="left"/>
+      <w:pPr>
+        <w:ind w:left="1080" w:hanging="360"/>
+      </w:pPr>
+      <w:rPr>
+        <w:rFonts w:ascii="Wingdings" w:hAnsi="Wingdings" w:hint="default"/>
+      </w:rPr>
+    </w:lvl>
+    <w:lvl w:ilvl="1" w:tplc="04090003" w:tentative="1">
+      <w:start w:val="1"/>
+      <w:numFmt w:val="bullet"/>
+      <w:lvlText w:val="o"/>
+      <w:lvlJc w:val="left"/>
+      <w:pPr>
+        <w:ind w:left="1800" w:hanging="360"/>
+      </w:pPr>
+      <w:rPr>
+        <w:rFonts w:ascii="Courier New" w:hAnsi="Courier New" w:cs="Courier New" w:hint="default"/>
+      </w:rPr>
+    </w:lvl>
+    <w:lvl w:ilvl="2" w:tplc="04090005" w:tentative="1">
+      <w:start w:val="1"/>
+      <w:numFmt w:val="bullet"/>
+      <w:lvlText w:val=""/>
+      <w:lvlJc w:val="left"/>
+      <w:pPr>
+        <w:ind w:left="2520" w:hanging="360"/>
+      </w:pPr>
+      <w:rPr>
+        <w:rFonts w:ascii="Wingdings" w:hAnsi="Wingdings" w:hint="default"/>
+      </w:rPr>
+    </w:lvl>
+    <w:lvl w:ilvl="3" w:tplc="04090001" w:tentative="1">
+      <w:start w:val="1"/>
+      <w:numFmt w:val="bullet"/>
+      <w:lvlText w:val=""/>
+      <w:lvlJc w:val="left"/>
+      <w:pPr>
+        <w:ind w:left="3240" w:hanging="360"/>
+      </w:pPr>
+      <w:rPr>
+        <w:rFonts w:ascii="Symbol" w:hAnsi="Symbol" w:hint="default"/>
+      </w:rPr>
+    </w:lvl>
+    <w:lvl w:ilvl="4" w:tplc="04090003" w:tentative="1">
+      <w:start w:val="1"/>
+      <w:numFmt w:val="bullet"/>
+      <w:lvlText w:val="o"/>
+      <w:lvlJc w:val="left"/>
+      <w:pPr>
+        <w:ind w:left="3960" w:hanging="360"/>
+      </w:pPr>
+      <w:rPr>
+        <w:rFonts w:ascii="Courier New" w:hAnsi="Courier New" w:cs="Courier New" w:hint="default"/>
+      </w:rPr>
+    </w:lvl>
+    <w:lvl w:ilvl="5" w:tplc="04090005" w:tentative="1">
+      <w:start w:val="1"/>
+      <w:numFmt w:val="bullet"/>
+      <w:lvlText w:val=""/>
+      <w:lvlJc w:val="left"/>
+      <w:pPr>
+        <w:ind w:left="4680" w:hanging="360"/>
+      </w:pPr>
+      <w:rPr>
+        <w:rFonts w:ascii="Wingdings" w:hAnsi="Wingdings" w:hint="default"/>
+      </w:rPr>
+    </w:lvl>
+    <w:lvl w:ilvl="6" w:tplc="04090001" w:tentative="1">
+      <w:start w:val="1"/>
+      <w:numFmt w:val="bullet"/>
+      <w:lvlText w:val=""/>
+      <w:lvlJc w:val="left"/>
+      <w:pPr>
+        <w:ind w:left="5400" w:hanging="360"/>
+      </w:pPr>
+      <w:rPr>
+        <w:rFonts w:ascii="Symbol" w:hAnsi="Symbol" w:hint="default"/>
+      </w:rPr>
+    </w:lvl>
+    <w:lvl w:ilvl="7" w:tplc="04090003" w:tentative="1">
+      <w:start w:val="1"/>
+      <w:numFmt w:val="bullet"/>
+      <w:lvlText w:val="o"/>
+      <w:lvlJc w:val="left"/>
+      <w:pPr>
+        <w:ind w:left="6120" w:hanging="360"/>
+      </w:pPr>
+      <w:rPr>
+        <w:rFonts w:ascii="Courier New" w:hAnsi="Courier New" w:cs="Courier New" w:hint="default"/>
+      </w:rPr>
+    </w:lvl>
+    <w:lvl w:ilvl="8" w:tplc="04090005" w:tentative="1">
+      <w:start w:val="1"/>
+      <w:numFmt w:val="bullet"/>
+      <w:lvlText w:val=""/>
+      <w:lvlJc w:val="left"/>
+      <w:pPr>
+        <w:ind w:left="6840" w:hanging="360"/>
+      </w:pPr>
+      <w:rPr>
+        <w:rFonts w:ascii="Wingdings" w:hAnsi="Wingdings" w:hint="default"/>
+      </w:rPr>
+    </w:lvl>
+  </w:abstractNum>
+  <w:abstractNum w:abstractNumId="4" w15:restartNumberingAfterBreak="0">
     <w:nsid w:val="027A2D57"/>
     <w:multiLevelType w:val="hybridMultilevel"/>
     <w:tmpl w:val="3148FF7E"/>
@@ -7277,7 +7950,7 @@
       </w:rPr>
     </w:lvl>
   </w:abstractNum>
-  <w:abstractNum w:abstractNumId="4" w15:restartNumberingAfterBreak="0">
+  <w:abstractNum w:abstractNumId="5" w15:restartNumberingAfterBreak="0">
     <w:nsid w:val="02AD60EC"/>
     <w:multiLevelType w:val="multilevel"/>
     <w:tmpl w:val="FC6C73B0"/>
@@ -7426,7 +8099,7 @@
       </w:rPr>
     </w:lvl>
   </w:abstractNum>
-  <w:abstractNum w:abstractNumId="5" w15:restartNumberingAfterBreak="0">
+  <w:abstractNum w:abstractNumId="6" w15:restartNumberingAfterBreak="0">
     <w:nsid w:val="02D96F98"/>
     <w:multiLevelType w:val="hybridMultilevel"/>
     <w:tmpl w:val="C7E88CC4"/>
@@ -7539,7 +8212,7 @@
       </w:rPr>
     </w:lvl>
   </w:abstractNum>
-  <w:abstractNum w:abstractNumId="6" w15:restartNumberingAfterBreak="0">
+  <w:abstractNum w:abstractNumId="7" w15:restartNumberingAfterBreak="0">
     <w:nsid w:val="038C4B22"/>
     <w:multiLevelType w:val="hybridMultilevel"/>
     <w:tmpl w:val="390E2614"/>
@@ -7652,7 +8325,7 @@
       </w:rPr>
     </w:lvl>
   </w:abstractNum>
-  <w:abstractNum w:abstractNumId="7" w15:restartNumberingAfterBreak="0">
+  <w:abstractNum w:abstractNumId="8" w15:restartNumberingAfterBreak="0">
     <w:nsid w:val="03B57922"/>
     <w:multiLevelType w:val="hybridMultilevel"/>
     <w:tmpl w:val="C1E03AA8"/>
@@ -7765,7 +8438,7 @@
       </w:rPr>
     </w:lvl>
   </w:abstractNum>
-  <w:abstractNum w:abstractNumId="8" w15:restartNumberingAfterBreak="0">
+  <w:abstractNum w:abstractNumId="9" w15:restartNumberingAfterBreak="0">
     <w:nsid w:val="04351CD0"/>
     <w:multiLevelType w:val="hybridMultilevel"/>
     <w:tmpl w:val="4748F3C4"/>
@@ -7878,7 +8551,7 @@
       </w:rPr>
     </w:lvl>
   </w:abstractNum>
-  <w:abstractNum w:abstractNumId="9" w15:restartNumberingAfterBreak="0">
+  <w:abstractNum w:abstractNumId="10" w15:restartNumberingAfterBreak="0">
     <w:nsid w:val="0444578B"/>
     <w:multiLevelType w:val="multilevel"/>
     <w:tmpl w:val="6B840BA4"/>
@@ -8027,7 +8700,7 @@
       </w:rPr>
     </w:lvl>
   </w:abstractNum>
-  <w:abstractNum w:abstractNumId="10" w15:restartNumberingAfterBreak="0">
+  <w:abstractNum w:abstractNumId="11" w15:restartNumberingAfterBreak="0">
     <w:nsid w:val="052F1ED8"/>
     <w:multiLevelType w:val="multilevel"/>
     <w:tmpl w:val="01961300"/>
@@ -8176,7 +8849,7 @@
       </w:rPr>
     </w:lvl>
   </w:abstractNum>
-  <w:abstractNum w:abstractNumId="11" w15:restartNumberingAfterBreak="0">
+  <w:abstractNum w:abstractNumId="12" w15:restartNumberingAfterBreak="0">
     <w:nsid w:val="053B666F"/>
     <w:multiLevelType w:val="multilevel"/>
     <w:tmpl w:val="E1BC67F6"/>
@@ -8325,7 +8998,7 @@
       </w:rPr>
     </w:lvl>
   </w:abstractNum>
-  <w:abstractNum w:abstractNumId="12" w15:restartNumberingAfterBreak="0">
+  <w:abstractNum w:abstractNumId="13" w15:restartNumberingAfterBreak="0">
     <w:nsid w:val="06FA4547"/>
     <w:multiLevelType w:val="hybridMultilevel"/>
     <w:tmpl w:val="DA825754"/>
@@ -8438,7 +9111,7 @@
       </w:rPr>
     </w:lvl>
   </w:abstractNum>
-  <w:abstractNum w:abstractNumId="13" w15:restartNumberingAfterBreak="0">
+  <w:abstractNum w:abstractNumId="14" w15:restartNumberingAfterBreak="0">
     <w:nsid w:val="0717208B"/>
     <w:multiLevelType w:val="hybridMultilevel"/>
     <w:tmpl w:val="5866C9A8"/>
@@ -8551,7 +9224,7 @@
       </w:rPr>
     </w:lvl>
   </w:abstractNum>
-  <w:abstractNum w:abstractNumId="14" w15:restartNumberingAfterBreak="0">
+  <w:abstractNum w:abstractNumId="15" w15:restartNumberingAfterBreak="0">
     <w:nsid w:val="08BB19BF"/>
     <w:multiLevelType w:val="multilevel"/>
     <w:tmpl w:val="C5807BB2"/>
@@ -8700,7 +9373,7 @@
       </w:rPr>
     </w:lvl>
   </w:abstractNum>
-  <w:abstractNum w:abstractNumId="15" w15:restartNumberingAfterBreak="0">
+  <w:abstractNum w:abstractNumId="16" w15:restartNumberingAfterBreak="0">
     <w:nsid w:val="08D32D08"/>
     <w:multiLevelType w:val="multilevel"/>
     <w:tmpl w:val="A32449CA"/>
@@ -8849,7 +9522,7 @@
       </w:rPr>
     </w:lvl>
   </w:abstractNum>
-  <w:abstractNum w:abstractNumId="16" w15:restartNumberingAfterBreak="0">
+  <w:abstractNum w:abstractNumId="17" w15:restartNumberingAfterBreak="0">
     <w:nsid w:val="09E84C0F"/>
     <w:multiLevelType w:val="hybridMultilevel"/>
     <w:tmpl w:val="3754EFAC"/>
@@ -8962,7 +9635,7 @@
       </w:rPr>
     </w:lvl>
   </w:abstractNum>
-  <w:abstractNum w:abstractNumId="17" w15:restartNumberingAfterBreak="0">
+  <w:abstractNum w:abstractNumId="18" w15:restartNumberingAfterBreak="0">
     <w:nsid w:val="0AE82489"/>
     <w:multiLevelType w:val="multilevel"/>
     <w:tmpl w:val="B82C10D4"/>
@@ -9111,7 +9784,7 @@
       </w:rPr>
     </w:lvl>
   </w:abstractNum>
-  <w:abstractNum w:abstractNumId="18" w15:restartNumberingAfterBreak="0">
+  <w:abstractNum w:abstractNumId="19" w15:restartNumberingAfterBreak="0">
     <w:nsid w:val="0CC17936"/>
     <w:multiLevelType w:val="multilevel"/>
     <w:tmpl w:val="B5E0C4F8"/>
@@ -9260,7 +9933,7 @@
       </w:rPr>
     </w:lvl>
   </w:abstractNum>
-  <w:abstractNum w:abstractNumId="19" w15:restartNumberingAfterBreak="0">
+  <w:abstractNum w:abstractNumId="20" w15:restartNumberingAfterBreak="0">
     <w:nsid w:val="0D367329"/>
     <w:multiLevelType w:val="multilevel"/>
     <w:tmpl w:val="66064F64"/>
@@ -9409,7 +10082,7 @@
       </w:rPr>
     </w:lvl>
   </w:abstractNum>
-  <w:abstractNum w:abstractNumId="20" w15:restartNumberingAfterBreak="0">
+  <w:abstractNum w:abstractNumId="21" w15:restartNumberingAfterBreak="0">
     <w:nsid w:val="0E1040E2"/>
     <w:multiLevelType w:val="multilevel"/>
     <w:tmpl w:val="607CCC88"/>
@@ -9558,7 +10231,7 @@
       </w:rPr>
     </w:lvl>
   </w:abstractNum>
-  <w:abstractNum w:abstractNumId="21" w15:restartNumberingAfterBreak="0">
+  <w:abstractNum w:abstractNumId="22" w15:restartNumberingAfterBreak="0">
     <w:nsid w:val="0E2561E7"/>
     <w:multiLevelType w:val="hybridMultilevel"/>
     <w:tmpl w:val="2A6E4870"/>
@@ -9671,7 +10344,7 @@
       </w:rPr>
     </w:lvl>
   </w:abstractNum>
-  <w:abstractNum w:abstractNumId="22" w15:restartNumberingAfterBreak="0">
+  <w:abstractNum w:abstractNumId="23" w15:restartNumberingAfterBreak="0">
     <w:nsid w:val="0E841C27"/>
     <w:multiLevelType w:val="hybridMultilevel"/>
     <w:tmpl w:val="789C7F32"/>
@@ -9784,7 +10457,7 @@
       </w:rPr>
     </w:lvl>
   </w:abstractNum>
-  <w:abstractNum w:abstractNumId="23" w15:restartNumberingAfterBreak="0">
+  <w:abstractNum w:abstractNumId="24" w15:restartNumberingAfterBreak="0">
     <w:nsid w:val="0FAA2602"/>
     <w:multiLevelType w:val="hybridMultilevel"/>
     <w:tmpl w:val="C6C63128"/>
@@ -9897,7 +10570,7 @@
       </w:rPr>
     </w:lvl>
   </w:abstractNum>
-  <w:abstractNum w:abstractNumId="24" w15:restartNumberingAfterBreak="0">
+  <w:abstractNum w:abstractNumId="25" w15:restartNumberingAfterBreak="0">
     <w:nsid w:val="122550ED"/>
     <w:multiLevelType w:val="hybridMultilevel"/>
     <w:tmpl w:val="91ACE480"/>
@@ -10010,7 +10683,7 @@
       </w:rPr>
     </w:lvl>
   </w:abstractNum>
-  <w:abstractNum w:abstractNumId="25" w15:restartNumberingAfterBreak="0">
+  <w:abstractNum w:abstractNumId="26" w15:restartNumberingAfterBreak="0">
     <w:nsid w:val="124C1BAE"/>
     <w:multiLevelType w:val="hybridMultilevel"/>
     <w:tmpl w:val="04988FC0"/>
@@ -10123,7 +10796,7 @@
       </w:rPr>
     </w:lvl>
   </w:abstractNum>
-  <w:abstractNum w:abstractNumId="26" w15:restartNumberingAfterBreak="0">
+  <w:abstractNum w:abstractNumId="27" w15:restartNumberingAfterBreak="0">
     <w:nsid w:val="139F7557"/>
     <w:multiLevelType w:val="multilevel"/>
     <w:tmpl w:val="A984C1D4"/>
@@ -10272,7 +10945,7 @@
       </w:rPr>
     </w:lvl>
   </w:abstractNum>
-  <w:abstractNum w:abstractNumId="27" w15:restartNumberingAfterBreak="0">
+  <w:abstractNum w:abstractNumId="28" w15:restartNumberingAfterBreak="0">
     <w:nsid w:val="13A13D09"/>
     <w:multiLevelType w:val="multilevel"/>
     <w:tmpl w:val="92067DCC"/>
@@ -10421,7 +11094,7 @@
       </w:rPr>
     </w:lvl>
   </w:abstractNum>
-  <w:abstractNum w:abstractNumId="28" w15:restartNumberingAfterBreak="0">
+  <w:abstractNum w:abstractNumId="29" w15:restartNumberingAfterBreak="0">
     <w:nsid w:val="14DC6E23"/>
     <w:multiLevelType w:val="hybridMultilevel"/>
     <w:tmpl w:val="2ACC2CF2"/>
@@ -10534,7 +11207,7 @@
       </w:rPr>
     </w:lvl>
   </w:abstractNum>
-  <w:abstractNum w:abstractNumId="29" w15:restartNumberingAfterBreak="0">
+  <w:abstractNum w:abstractNumId="30" w15:restartNumberingAfterBreak="0">
     <w:nsid w:val="15313512"/>
     <w:multiLevelType w:val="multilevel"/>
     <w:tmpl w:val="3D18208A"/>
@@ -10683,7 +11356,7 @@
       </w:rPr>
     </w:lvl>
   </w:abstractNum>
-  <w:abstractNum w:abstractNumId="30" w15:restartNumberingAfterBreak="0">
+  <w:abstractNum w:abstractNumId="31" w15:restartNumberingAfterBreak="0">
     <w:nsid w:val="161C5709"/>
     <w:multiLevelType w:val="hybridMultilevel"/>
     <w:tmpl w:val="F06CE1E0"/>
@@ -10796,7 +11469,7 @@
       </w:rPr>
     </w:lvl>
   </w:abstractNum>
-  <w:abstractNum w:abstractNumId="31" w15:restartNumberingAfterBreak="0">
+  <w:abstractNum w:abstractNumId="32" w15:restartNumberingAfterBreak="0">
     <w:nsid w:val="16D400B4"/>
     <w:multiLevelType w:val="hybridMultilevel"/>
     <w:tmpl w:val="58E6DFBE"/>
@@ -10909,7 +11582,7 @@
       </w:rPr>
     </w:lvl>
   </w:abstractNum>
-  <w:abstractNum w:abstractNumId="32" w15:restartNumberingAfterBreak="0">
+  <w:abstractNum w:abstractNumId="33" w15:restartNumberingAfterBreak="0">
     <w:nsid w:val="17236012"/>
     <w:multiLevelType w:val="hybridMultilevel"/>
     <w:tmpl w:val="DAFA46C8"/>
@@ -11022,7 +11695,7 @@
       </w:rPr>
     </w:lvl>
   </w:abstractNum>
-  <w:abstractNum w:abstractNumId="33" w15:restartNumberingAfterBreak="0">
+  <w:abstractNum w:abstractNumId="34" w15:restartNumberingAfterBreak="0">
     <w:nsid w:val="172B04C0"/>
     <w:multiLevelType w:val="hybridMultilevel"/>
     <w:tmpl w:val="B6C41D5E"/>
@@ -11135,7 +11808,7 @@
       </w:rPr>
     </w:lvl>
   </w:abstractNum>
-  <w:abstractNum w:abstractNumId="34" w15:restartNumberingAfterBreak="0">
+  <w:abstractNum w:abstractNumId="35" w15:restartNumberingAfterBreak="0">
     <w:nsid w:val="17485CCB"/>
     <w:multiLevelType w:val="multilevel"/>
     <w:tmpl w:val="397E1AE0"/>
@@ -11284,7 +11957,7 @@
       </w:rPr>
     </w:lvl>
   </w:abstractNum>
-  <w:abstractNum w:abstractNumId="35" w15:restartNumberingAfterBreak="0">
+  <w:abstractNum w:abstractNumId="36" w15:restartNumberingAfterBreak="0">
     <w:nsid w:val="17763D31"/>
     <w:multiLevelType w:val="hybridMultilevel"/>
     <w:tmpl w:val="6CE63304"/>
@@ -11397,7 +12070,7 @@
       </w:rPr>
     </w:lvl>
   </w:abstractNum>
-  <w:abstractNum w:abstractNumId="36" w15:restartNumberingAfterBreak="0">
+  <w:abstractNum w:abstractNumId="37" w15:restartNumberingAfterBreak="0">
     <w:nsid w:val="17A835CF"/>
     <w:multiLevelType w:val="multilevel"/>
     <w:tmpl w:val="0C988B24"/>
@@ -11546,7 +12219,7 @@
       </w:rPr>
     </w:lvl>
   </w:abstractNum>
-  <w:abstractNum w:abstractNumId="37" w15:restartNumberingAfterBreak="0">
+  <w:abstractNum w:abstractNumId="38" w15:restartNumberingAfterBreak="0">
     <w:nsid w:val="17B06937"/>
     <w:multiLevelType w:val="hybridMultilevel"/>
     <w:tmpl w:val="71089CF2"/>
@@ -11659,7 +12332,7 @@
       </w:rPr>
     </w:lvl>
   </w:abstractNum>
-  <w:abstractNum w:abstractNumId="38" w15:restartNumberingAfterBreak="0">
+  <w:abstractNum w:abstractNumId="39" w15:restartNumberingAfterBreak="0">
     <w:nsid w:val="18FD59FB"/>
     <w:multiLevelType w:val="multilevel"/>
     <w:tmpl w:val="942CD1D2"/>
@@ -11808,7 +12481,7 @@
       </w:rPr>
     </w:lvl>
   </w:abstractNum>
-  <w:abstractNum w:abstractNumId="39" w15:restartNumberingAfterBreak="0">
+  <w:abstractNum w:abstractNumId="40" w15:restartNumberingAfterBreak="0">
     <w:nsid w:val="190F0390"/>
     <w:multiLevelType w:val="multilevel"/>
     <w:tmpl w:val="CBE4A4A4"/>
@@ -11957,7 +12630,7 @@
       </w:rPr>
     </w:lvl>
   </w:abstractNum>
-  <w:abstractNum w:abstractNumId="40" w15:restartNumberingAfterBreak="0">
+  <w:abstractNum w:abstractNumId="41" w15:restartNumberingAfterBreak="0">
     <w:nsid w:val="195875B0"/>
     <w:multiLevelType w:val="multilevel"/>
     <w:tmpl w:val="615444D4"/>
@@ -12070,7 +12743,7 @@
       </w:pPr>
     </w:lvl>
   </w:abstractNum>
-  <w:abstractNum w:abstractNumId="41" w15:restartNumberingAfterBreak="0">
+  <w:abstractNum w:abstractNumId="42" w15:restartNumberingAfterBreak="0">
     <w:nsid w:val="197C6FD7"/>
     <w:multiLevelType w:val="hybridMultilevel"/>
     <w:tmpl w:val="D97CEAA8"/>
@@ -12183,7 +12856,7 @@
       </w:rPr>
     </w:lvl>
   </w:abstractNum>
-  <w:abstractNum w:abstractNumId="42" w15:restartNumberingAfterBreak="0">
+  <w:abstractNum w:abstractNumId="43" w15:restartNumberingAfterBreak="0">
     <w:nsid w:val="1CC60A94"/>
     <w:multiLevelType w:val="multilevel"/>
     <w:tmpl w:val="EB74741C"/>
@@ -12332,7 +13005,7 @@
       </w:rPr>
     </w:lvl>
   </w:abstractNum>
-  <w:abstractNum w:abstractNumId="43" w15:restartNumberingAfterBreak="0">
+  <w:abstractNum w:abstractNumId="44" w15:restartNumberingAfterBreak="0">
     <w:nsid w:val="1E497DC6"/>
     <w:multiLevelType w:val="multilevel"/>
     <w:tmpl w:val="B7C826A4"/>
@@ -12481,7 +13154,7 @@
       </w:rPr>
     </w:lvl>
   </w:abstractNum>
-  <w:abstractNum w:abstractNumId="44" w15:restartNumberingAfterBreak="0">
+  <w:abstractNum w:abstractNumId="45" w15:restartNumberingAfterBreak="0">
     <w:nsid w:val="1E6658CF"/>
     <w:multiLevelType w:val="multilevel"/>
     <w:tmpl w:val="762ABC5E"/>
@@ -12630,7 +13303,7 @@
       </w:rPr>
     </w:lvl>
   </w:abstractNum>
-  <w:abstractNum w:abstractNumId="45" w15:restartNumberingAfterBreak="0">
+  <w:abstractNum w:abstractNumId="46" w15:restartNumberingAfterBreak="0">
     <w:nsid w:val="1FA532B0"/>
     <w:multiLevelType w:val="multilevel"/>
     <w:tmpl w:val="8718294C"/>
@@ -12779,7 +13452,7 @@
       </w:rPr>
     </w:lvl>
   </w:abstractNum>
-  <w:abstractNum w:abstractNumId="46" w15:restartNumberingAfterBreak="0">
+  <w:abstractNum w:abstractNumId="47" w15:restartNumberingAfterBreak="0">
     <w:nsid w:val="215C77FD"/>
     <w:multiLevelType w:val="hybridMultilevel"/>
     <w:tmpl w:val="58F41D10"/>
@@ -12868,7 +13541,7 @@
       </w:pPr>
     </w:lvl>
   </w:abstractNum>
-  <w:abstractNum w:abstractNumId="47" w15:restartNumberingAfterBreak="0">
+  <w:abstractNum w:abstractNumId="48" w15:restartNumberingAfterBreak="0">
     <w:nsid w:val="218D5909"/>
     <w:multiLevelType w:val="hybridMultilevel"/>
     <w:tmpl w:val="CC989EE4"/>
@@ -12981,7 +13654,7 @@
       </w:rPr>
     </w:lvl>
   </w:abstractNum>
-  <w:abstractNum w:abstractNumId="48" w15:restartNumberingAfterBreak="0">
+  <w:abstractNum w:abstractNumId="49" w15:restartNumberingAfterBreak="0">
     <w:nsid w:val="23E010BA"/>
     <w:multiLevelType w:val="multilevel"/>
     <w:tmpl w:val="4A16907E"/>
@@ -13130,7 +13803,7 @@
       </w:rPr>
     </w:lvl>
   </w:abstractNum>
-  <w:abstractNum w:abstractNumId="49" w15:restartNumberingAfterBreak="0">
+  <w:abstractNum w:abstractNumId="50" w15:restartNumberingAfterBreak="0">
     <w:nsid w:val="24116768"/>
     <w:multiLevelType w:val="multilevel"/>
     <w:tmpl w:val="9028B3D2"/>
@@ -13279,7 +13952,7 @@
       </w:rPr>
     </w:lvl>
   </w:abstractNum>
-  <w:abstractNum w:abstractNumId="50" w15:restartNumberingAfterBreak="0">
+  <w:abstractNum w:abstractNumId="51" w15:restartNumberingAfterBreak="0">
     <w:nsid w:val="2470127A"/>
     <w:multiLevelType w:val="multilevel"/>
     <w:tmpl w:val="309E9618"/>
@@ -13428,7 +14101,7 @@
       </w:rPr>
     </w:lvl>
   </w:abstractNum>
-  <w:abstractNum w:abstractNumId="51" w15:restartNumberingAfterBreak="0">
+  <w:abstractNum w:abstractNumId="52" w15:restartNumberingAfterBreak="0">
     <w:nsid w:val="24796798"/>
     <w:multiLevelType w:val="hybridMultilevel"/>
     <w:tmpl w:val="6622BEDC"/>
@@ -13517,7 +14190,7 @@
       </w:pPr>
     </w:lvl>
   </w:abstractNum>
-  <w:abstractNum w:abstractNumId="52" w15:restartNumberingAfterBreak="0">
+  <w:abstractNum w:abstractNumId="53" w15:restartNumberingAfterBreak="0">
     <w:nsid w:val="253B76EC"/>
     <w:multiLevelType w:val="multilevel"/>
     <w:tmpl w:val="2AA67CDA"/>
@@ -13666,7 +14339,7 @@
       </w:rPr>
     </w:lvl>
   </w:abstractNum>
-  <w:abstractNum w:abstractNumId="53" w15:restartNumberingAfterBreak="0">
+  <w:abstractNum w:abstractNumId="54" w15:restartNumberingAfterBreak="0">
     <w:nsid w:val="2D0F5EA7"/>
     <w:multiLevelType w:val="hybridMultilevel"/>
     <w:tmpl w:val="F68ABCD6"/>
@@ -13779,7 +14452,7 @@
       </w:rPr>
     </w:lvl>
   </w:abstractNum>
-  <w:abstractNum w:abstractNumId="54" w15:restartNumberingAfterBreak="0">
+  <w:abstractNum w:abstractNumId="55" w15:restartNumberingAfterBreak="0">
     <w:nsid w:val="2E4D738C"/>
     <w:multiLevelType w:val="multilevel"/>
     <w:tmpl w:val="1540BBA2"/>
@@ -13928,7 +14601,7 @@
       </w:rPr>
     </w:lvl>
   </w:abstractNum>
-  <w:abstractNum w:abstractNumId="55" w15:restartNumberingAfterBreak="0">
+  <w:abstractNum w:abstractNumId="56" w15:restartNumberingAfterBreak="0">
     <w:nsid w:val="2F0041C7"/>
     <w:multiLevelType w:val="multilevel"/>
     <w:tmpl w:val="656414FE"/>
@@ -14077,7 +14750,7 @@
       </w:rPr>
     </w:lvl>
   </w:abstractNum>
-  <w:abstractNum w:abstractNumId="56" w15:restartNumberingAfterBreak="0">
+  <w:abstractNum w:abstractNumId="57" w15:restartNumberingAfterBreak="0">
     <w:nsid w:val="2FAF0538"/>
     <w:multiLevelType w:val="hybridMultilevel"/>
     <w:tmpl w:val="EB1AC18C"/>
@@ -14190,7 +14863,7 @@
       </w:rPr>
     </w:lvl>
   </w:abstractNum>
-  <w:abstractNum w:abstractNumId="57" w15:restartNumberingAfterBreak="0">
+  <w:abstractNum w:abstractNumId="58" w15:restartNumberingAfterBreak="0">
     <w:nsid w:val="304F01FA"/>
     <w:multiLevelType w:val="multilevel"/>
     <w:tmpl w:val="151C4EC6"/>
@@ -14339,7 +15012,7 @@
       </w:rPr>
     </w:lvl>
   </w:abstractNum>
-  <w:abstractNum w:abstractNumId="58" w15:restartNumberingAfterBreak="0">
+  <w:abstractNum w:abstractNumId="59" w15:restartNumberingAfterBreak="0">
     <w:nsid w:val="30BD025D"/>
     <w:multiLevelType w:val="hybridMultilevel"/>
     <w:tmpl w:val="04381C82"/>
@@ -14428,7 +15101,7 @@
       </w:pPr>
     </w:lvl>
   </w:abstractNum>
-  <w:abstractNum w:abstractNumId="59" w15:restartNumberingAfterBreak="0">
+  <w:abstractNum w:abstractNumId="60" w15:restartNumberingAfterBreak="0">
     <w:nsid w:val="327C0BA6"/>
     <w:multiLevelType w:val="hybridMultilevel"/>
     <w:tmpl w:val="2A9047EE"/>
@@ -14541,7 +15214,7 @@
       </w:rPr>
     </w:lvl>
   </w:abstractNum>
-  <w:abstractNum w:abstractNumId="60" w15:restartNumberingAfterBreak="0">
+  <w:abstractNum w:abstractNumId="61" w15:restartNumberingAfterBreak="0">
     <w:nsid w:val="338D63E8"/>
     <w:multiLevelType w:val="hybridMultilevel"/>
     <w:tmpl w:val="28D0FB50"/>
@@ -14654,7 +15327,7 @@
       </w:rPr>
     </w:lvl>
   </w:abstractNum>
-  <w:abstractNum w:abstractNumId="61" w15:restartNumberingAfterBreak="0">
+  <w:abstractNum w:abstractNumId="62" w15:restartNumberingAfterBreak="0">
     <w:nsid w:val="34182771"/>
     <w:multiLevelType w:val="multilevel"/>
     <w:tmpl w:val="2AA67CDA"/>
@@ -14803,7 +15476,7 @@
       </w:rPr>
     </w:lvl>
   </w:abstractNum>
-  <w:abstractNum w:abstractNumId="62" w15:restartNumberingAfterBreak="0">
+  <w:abstractNum w:abstractNumId="63" w15:restartNumberingAfterBreak="0">
     <w:nsid w:val="35413E58"/>
     <w:multiLevelType w:val="hybridMultilevel"/>
     <w:tmpl w:val="03C64164"/>
@@ -14916,7 +15589,7 @@
       </w:rPr>
     </w:lvl>
   </w:abstractNum>
-  <w:abstractNum w:abstractNumId="63" w15:restartNumberingAfterBreak="0">
+  <w:abstractNum w:abstractNumId="64" w15:restartNumberingAfterBreak="0">
     <w:nsid w:val="358C715D"/>
     <w:multiLevelType w:val="hybridMultilevel"/>
     <w:tmpl w:val="84C85350"/>
@@ -15029,7 +15702,7 @@
       </w:rPr>
     </w:lvl>
   </w:abstractNum>
-  <w:abstractNum w:abstractNumId="64" w15:restartNumberingAfterBreak="0">
+  <w:abstractNum w:abstractNumId="65" w15:restartNumberingAfterBreak="0">
     <w:nsid w:val="35C86AF0"/>
     <w:multiLevelType w:val="multilevel"/>
     <w:tmpl w:val="8202FCD6"/>
@@ -15178,7 +15851,7 @@
       </w:rPr>
     </w:lvl>
   </w:abstractNum>
-  <w:abstractNum w:abstractNumId="65" w15:restartNumberingAfterBreak="0">
+  <w:abstractNum w:abstractNumId="66" w15:restartNumberingAfterBreak="0">
     <w:nsid w:val="3623194A"/>
     <w:multiLevelType w:val="multilevel"/>
     <w:tmpl w:val="63F4E6F0"/>
@@ -15327,7 +16000,7 @@
       </w:rPr>
     </w:lvl>
   </w:abstractNum>
-  <w:abstractNum w:abstractNumId="66" w15:restartNumberingAfterBreak="0">
+  <w:abstractNum w:abstractNumId="67" w15:restartNumberingAfterBreak="0">
     <w:nsid w:val="36E36979"/>
     <w:multiLevelType w:val="multilevel"/>
     <w:tmpl w:val="3D58C93A"/>
@@ -15476,7 +16149,7 @@
       </w:rPr>
     </w:lvl>
   </w:abstractNum>
-  <w:abstractNum w:abstractNumId="67" w15:restartNumberingAfterBreak="0">
+  <w:abstractNum w:abstractNumId="68" w15:restartNumberingAfterBreak="0">
     <w:nsid w:val="37B424C3"/>
     <w:multiLevelType w:val="hybridMultilevel"/>
     <w:tmpl w:val="18F030D4"/>
@@ -15589,7 +16262,7 @@
       </w:rPr>
     </w:lvl>
   </w:abstractNum>
-  <w:abstractNum w:abstractNumId="68" w15:restartNumberingAfterBreak="0">
+  <w:abstractNum w:abstractNumId="69" w15:restartNumberingAfterBreak="0">
     <w:nsid w:val="39FC34BD"/>
     <w:multiLevelType w:val="hybridMultilevel"/>
     <w:tmpl w:val="D0D4E132"/>
@@ -15702,7 +16375,7 @@
       </w:rPr>
     </w:lvl>
   </w:abstractNum>
-  <w:abstractNum w:abstractNumId="69" w15:restartNumberingAfterBreak="0">
+  <w:abstractNum w:abstractNumId="70" w15:restartNumberingAfterBreak="0">
     <w:nsid w:val="3AE06C70"/>
     <w:multiLevelType w:val="multilevel"/>
     <w:tmpl w:val="B0D67FDE"/>
@@ -15851,7 +16524,7 @@
       </w:rPr>
     </w:lvl>
   </w:abstractNum>
-  <w:abstractNum w:abstractNumId="70" w15:restartNumberingAfterBreak="0">
+  <w:abstractNum w:abstractNumId="71" w15:restartNumberingAfterBreak="0">
     <w:nsid w:val="3BC10D30"/>
     <w:multiLevelType w:val="multilevel"/>
     <w:tmpl w:val="502AD78C"/>
@@ -16000,7 +16673,7 @@
       </w:rPr>
     </w:lvl>
   </w:abstractNum>
-  <w:abstractNum w:abstractNumId="71" w15:restartNumberingAfterBreak="0">
+  <w:abstractNum w:abstractNumId="72" w15:restartNumberingAfterBreak="0">
     <w:nsid w:val="3C276BB8"/>
     <w:multiLevelType w:val="multilevel"/>
     <w:tmpl w:val="2AA67CDA"/>
@@ -16149,7 +16822,7 @@
       </w:rPr>
     </w:lvl>
   </w:abstractNum>
-  <w:abstractNum w:abstractNumId="72" w15:restartNumberingAfterBreak="0">
+  <w:abstractNum w:abstractNumId="73" w15:restartNumberingAfterBreak="0">
     <w:nsid w:val="3C596808"/>
     <w:multiLevelType w:val="multilevel"/>
     <w:tmpl w:val="2AA67CDA"/>
@@ -16298,7 +16971,7 @@
       </w:rPr>
     </w:lvl>
   </w:abstractNum>
-  <w:abstractNum w:abstractNumId="73" w15:restartNumberingAfterBreak="0">
+  <w:abstractNum w:abstractNumId="74" w15:restartNumberingAfterBreak="0">
     <w:nsid w:val="3CBF280A"/>
     <w:multiLevelType w:val="multilevel"/>
     <w:tmpl w:val="A13E4362"/>
@@ -16447,7 +17120,7 @@
       </w:rPr>
     </w:lvl>
   </w:abstractNum>
-  <w:abstractNum w:abstractNumId="74" w15:restartNumberingAfterBreak="0">
+  <w:abstractNum w:abstractNumId="75" w15:restartNumberingAfterBreak="0">
     <w:nsid w:val="3CC7541B"/>
     <w:multiLevelType w:val="multilevel"/>
     <w:tmpl w:val="2AA67CDA"/>
@@ -16596,7 +17269,7 @@
       </w:rPr>
     </w:lvl>
   </w:abstractNum>
-  <w:abstractNum w:abstractNumId="75" w15:restartNumberingAfterBreak="0">
+  <w:abstractNum w:abstractNumId="76" w15:restartNumberingAfterBreak="0">
     <w:nsid w:val="3F166EB0"/>
     <w:multiLevelType w:val="multilevel"/>
     <w:tmpl w:val="414C6912"/>
@@ -16745,7 +17418,7 @@
       </w:rPr>
     </w:lvl>
   </w:abstractNum>
-  <w:abstractNum w:abstractNumId="76" w15:restartNumberingAfterBreak="0">
+  <w:abstractNum w:abstractNumId="77" w15:restartNumberingAfterBreak="0">
     <w:nsid w:val="3F5E3BA1"/>
     <w:multiLevelType w:val="multilevel"/>
     <w:tmpl w:val="2AA67CDA"/>
@@ -16894,7 +17567,7 @@
       </w:rPr>
     </w:lvl>
   </w:abstractNum>
-  <w:abstractNum w:abstractNumId="77" w15:restartNumberingAfterBreak="0">
+  <w:abstractNum w:abstractNumId="78" w15:restartNumberingAfterBreak="0">
     <w:nsid w:val="40431B1C"/>
     <w:multiLevelType w:val="multilevel"/>
     <w:tmpl w:val="5D8E77D0"/>
@@ -17043,7 +17716,7 @@
       </w:rPr>
     </w:lvl>
   </w:abstractNum>
-  <w:abstractNum w:abstractNumId="78" w15:restartNumberingAfterBreak="0">
+  <w:abstractNum w:abstractNumId="79" w15:restartNumberingAfterBreak="0">
     <w:nsid w:val="419E0199"/>
     <w:multiLevelType w:val="multilevel"/>
     <w:tmpl w:val="D6CA9606"/>
@@ -17192,7 +17865,156 @@
       </w:rPr>
     </w:lvl>
   </w:abstractNum>
-  <w:abstractNum w:abstractNumId="79" w15:restartNumberingAfterBreak="0">
+  <w:abstractNum w:abstractNumId="80" w15:restartNumberingAfterBreak="0">
+    <w:nsid w:val="434F7B61"/>
+    <w:multiLevelType w:val="multilevel"/>
+    <w:tmpl w:val="1A0A45AA"/>
+    <w:lvl w:ilvl="0">
+      <w:start w:val="1"/>
+      <w:numFmt w:val="bullet"/>
+      <w:lvlText w:val=""/>
+      <w:lvlJc w:val="left"/>
+      <w:pPr>
+        <w:tabs>
+          <w:tab w:val="num" w:pos="720"/>
+        </w:tabs>
+        <w:ind w:left="720" w:hanging="360"/>
+      </w:pPr>
+      <w:rPr>
+        <w:rFonts w:ascii="Symbol" w:hAnsi="Symbol" w:hint="default"/>
+        <w:sz w:val="20"/>
+      </w:rPr>
+    </w:lvl>
+    <w:lvl w:ilvl="1" w:tentative="1">
+      <w:start w:val="1"/>
+      <w:numFmt w:val="bullet"/>
+      <w:lvlText w:val="o"/>
+      <w:lvlJc w:val="left"/>
+      <w:pPr>
+        <w:tabs>
+          <w:tab w:val="num" w:pos="1440"/>
+        </w:tabs>
+        <w:ind w:left="1440" w:hanging="360"/>
+      </w:pPr>
+      <w:rPr>
+        <w:rFonts w:ascii="Courier New" w:hAnsi="Courier New" w:hint="default"/>
+        <w:sz w:val="20"/>
+      </w:rPr>
+    </w:lvl>
+    <w:lvl w:ilvl="2" w:tentative="1">
+      <w:start w:val="1"/>
+      <w:numFmt w:val="bullet"/>
+      <w:lvlText w:val=""/>
+      <w:lvlJc w:val="left"/>
+      <w:pPr>
+        <w:tabs>
+          <w:tab w:val="num" w:pos="2160"/>
+        </w:tabs>
+        <w:ind w:left="2160" w:hanging="360"/>
+      </w:pPr>
+      <w:rPr>
+        <w:rFonts w:ascii="Wingdings" w:hAnsi="Wingdings" w:hint="default"/>
+        <w:sz w:val="20"/>
+      </w:rPr>
+    </w:lvl>
+    <w:lvl w:ilvl="3" w:tentative="1">
+      <w:start w:val="1"/>
+      <w:numFmt w:val="bullet"/>
+      <w:lvlText w:val=""/>
+      <w:lvlJc w:val="left"/>
+      <w:pPr>
+        <w:tabs>
+          <w:tab w:val="num" w:pos="2880"/>
+        </w:tabs>
+        <w:ind w:left="2880" w:hanging="360"/>
+      </w:pPr>
+      <w:rPr>
+        <w:rFonts w:ascii="Wingdings" w:hAnsi="Wingdings" w:hint="default"/>
+        <w:sz w:val="20"/>
+      </w:rPr>
+    </w:lvl>
+    <w:lvl w:ilvl="4" w:tentative="1">
+      <w:start w:val="1"/>
+      <w:numFmt w:val="bullet"/>
+      <w:lvlText w:val=""/>
+      <w:lvlJc w:val="left"/>
+      <w:pPr>
+        <w:tabs>
+          <w:tab w:val="num" w:pos="3600"/>
+        </w:tabs>
+        <w:ind w:left="3600" w:hanging="360"/>
+      </w:pPr>
+      <w:rPr>
+        <w:rFonts w:ascii="Wingdings" w:hAnsi="Wingdings" w:hint="default"/>
+        <w:sz w:val="20"/>
+      </w:rPr>
+    </w:lvl>
+    <w:lvl w:ilvl="5" w:tentative="1">
+      <w:start w:val="1"/>
+      <w:numFmt w:val="bullet"/>
+      <w:lvlText w:val=""/>
+      <w:lvlJc w:val="left"/>
+      <w:pPr>
+        <w:tabs>
+          <w:tab w:val="num" w:pos="4320"/>
+        </w:tabs>
+        <w:ind w:left="4320" w:hanging="360"/>
+      </w:pPr>
+      <w:rPr>
+        <w:rFonts w:ascii="Wingdings" w:hAnsi="Wingdings" w:hint="default"/>
+        <w:sz w:val="20"/>
+      </w:rPr>
+    </w:lvl>
+    <w:lvl w:ilvl="6" w:tentative="1">
+      <w:start w:val="1"/>
+      <w:numFmt w:val="bullet"/>
+      <w:lvlText w:val=""/>
+      <w:lvlJc w:val="left"/>
+      <w:pPr>
+        <w:tabs>
+          <w:tab w:val="num" w:pos="5040"/>
+        </w:tabs>
+        <w:ind w:left="5040" w:hanging="360"/>
+      </w:pPr>
+      <w:rPr>
+        <w:rFonts w:ascii="Wingdings" w:hAnsi="Wingdings" w:hint="default"/>
+        <w:sz w:val="20"/>
+      </w:rPr>
+    </w:lvl>
+    <w:lvl w:ilvl="7" w:tentative="1">
+      <w:start w:val="1"/>
+      <w:numFmt w:val="bullet"/>
+      <w:lvlText w:val=""/>
+      <w:lvlJc w:val="left"/>
+      <w:pPr>
+        <w:tabs>
+          <w:tab w:val="num" w:pos="5760"/>
+        </w:tabs>
+        <w:ind w:left="5760" w:hanging="360"/>
+      </w:pPr>
+      <w:rPr>
+        <w:rFonts w:ascii="Wingdings" w:hAnsi="Wingdings" w:hint="default"/>
+        <w:sz w:val="20"/>
+      </w:rPr>
+    </w:lvl>
+    <w:lvl w:ilvl="8" w:tentative="1">
+      <w:start w:val="1"/>
+      <w:numFmt w:val="bullet"/>
+      <w:lvlText w:val=""/>
+      <w:lvlJc w:val="left"/>
+      <w:pPr>
+        <w:tabs>
+          <w:tab w:val="num" w:pos="6480"/>
+        </w:tabs>
+        <w:ind w:left="6480" w:hanging="360"/>
+      </w:pPr>
+      <w:rPr>
+        <w:rFonts w:ascii="Wingdings" w:hAnsi="Wingdings" w:hint="default"/>
+        <w:sz w:val="20"/>
+      </w:rPr>
+    </w:lvl>
+  </w:abstractNum>
+  <w:abstractNum w:abstractNumId="81" w15:restartNumberingAfterBreak="0">
     <w:nsid w:val="452F60FB"/>
     <w:multiLevelType w:val="hybridMultilevel"/>
     <w:tmpl w:val="892A990A"/>
@@ -17305,7 +18127,7 @@
       </w:rPr>
     </w:lvl>
   </w:abstractNum>
-  <w:abstractNum w:abstractNumId="80" w15:restartNumberingAfterBreak="0">
+  <w:abstractNum w:abstractNumId="82" w15:restartNumberingAfterBreak="0">
     <w:nsid w:val="47B65409"/>
     <w:multiLevelType w:val="multilevel"/>
     <w:tmpl w:val="2AA67CDA"/>
@@ -17454,7 +18276,7 @@
       </w:rPr>
     </w:lvl>
   </w:abstractNum>
-  <w:abstractNum w:abstractNumId="81" w15:restartNumberingAfterBreak="0">
+  <w:abstractNum w:abstractNumId="83" w15:restartNumberingAfterBreak="0">
     <w:nsid w:val="47BF2170"/>
     <w:multiLevelType w:val="multilevel"/>
     <w:tmpl w:val="D9681266"/>
@@ -17603,7 +18425,7 @@
       </w:rPr>
     </w:lvl>
   </w:abstractNum>
-  <w:abstractNum w:abstractNumId="82" w15:restartNumberingAfterBreak="0">
+  <w:abstractNum w:abstractNumId="84" w15:restartNumberingAfterBreak="0">
     <w:nsid w:val="47E5592F"/>
     <w:multiLevelType w:val="hybridMultilevel"/>
     <w:tmpl w:val="719AB9FA"/>
@@ -17716,7 +18538,7 @@
       </w:rPr>
     </w:lvl>
   </w:abstractNum>
-  <w:abstractNum w:abstractNumId="83" w15:restartNumberingAfterBreak="0">
+  <w:abstractNum w:abstractNumId="85" w15:restartNumberingAfterBreak="0">
     <w:nsid w:val="48C041A9"/>
     <w:multiLevelType w:val="multilevel"/>
     <w:tmpl w:val="59A694BC"/>
@@ -17865,7 +18687,7 @@
       </w:rPr>
     </w:lvl>
   </w:abstractNum>
-  <w:abstractNum w:abstractNumId="84" w15:restartNumberingAfterBreak="0">
+  <w:abstractNum w:abstractNumId="86" w15:restartNumberingAfterBreak="0">
     <w:nsid w:val="49D6568A"/>
     <w:multiLevelType w:val="multilevel"/>
     <w:tmpl w:val="559E29EC"/>
@@ -18014,7 +18836,7 @@
       </w:rPr>
     </w:lvl>
   </w:abstractNum>
-  <w:abstractNum w:abstractNumId="85" w15:restartNumberingAfterBreak="0">
+  <w:abstractNum w:abstractNumId="87" w15:restartNumberingAfterBreak="0">
     <w:nsid w:val="4A7C2BC0"/>
     <w:multiLevelType w:val="hybridMultilevel"/>
     <w:tmpl w:val="4E4ADB18"/>
@@ -18127,7 +18949,7 @@
       </w:rPr>
     </w:lvl>
   </w:abstractNum>
-  <w:abstractNum w:abstractNumId="86" w15:restartNumberingAfterBreak="0">
+  <w:abstractNum w:abstractNumId="88" w15:restartNumberingAfterBreak="0">
     <w:nsid w:val="4AF73293"/>
     <w:multiLevelType w:val="hybridMultilevel"/>
     <w:tmpl w:val="F2962738"/>
@@ -18240,7 +19062,7 @@
       </w:rPr>
     </w:lvl>
   </w:abstractNum>
-  <w:abstractNum w:abstractNumId="87" w15:restartNumberingAfterBreak="0">
+  <w:abstractNum w:abstractNumId="89" w15:restartNumberingAfterBreak="0">
     <w:nsid w:val="4B375248"/>
     <w:multiLevelType w:val="multilevel"/>
     <w:tmpl w:val="B574C1C6"/>
@@ -18389,7 +19211,7 @@
       </w:rPr>
     </w:lvl>
   </w:abstractNum>
-  <w:abstractNum w:abstractNumId="88" w15:restartNumberingAfterBreak="0">
+  <w:abstractNum w:abstractNumId="90" w15:restartNumberingAfterBreak="0">
     <w:nsid w:val="4BA13766"/>
     <w:multiLevelType w:val="multilevel"/>
     <w:tmpl w:val="63F4E6F0"/>
@@ -18538,7 +19360,7 @@
       </w:rPr>
     </w:lvl>
   </w:abstractNum>
-  <w:abstractNum w:abstractNumId="89" w15:restartNumberingAfterBreak="0">
+  <w:abstractNum w:abstractNumId="91" w15:restartNumberingAfterBreak="0">
     <w:nsid w:val="4BA25441"/>
     <w:multiLevelType w:val="hybridMultilevel"/>
     <w:tmpl w:val="217E2E96"/>
@@ -18651,7 +19473,7 @@
       </w:rPr>
     </w:lvl>
   </w:abstractNum>
-  <w:abstractNum w:abstractNumId="90" w15:restartNumberingAfterBreak="0">
+  <w:abstractNum w:abstractNumId="92" w15:restartNumberingAfterBreak="0">
     <w:nsid w:val="4BDF79AF"/>
     <w:multiLevelType w:val="hybridMultilevel"/>
     <w:tmpl w:val="09F0B06C"/>
@@ -18764,7 +19586,7 @@
       </w:rPr>
     </w:lvl>
   </w:abstractNum>
-  <w:abstractNum w:abstractNumId="91" w15:restartNumberingAfterBreak="0">
+  <w:abstractNum w:abstractNumId="93" w15:restartNumberingAfterBreak="0">
     <w:nsid w:val="4E276DCB"/>
     <w:multiLevelType w:val="hybridMultilevel"/>
     <w:tmpl w:val="B7C469B4"/>
@@ -18877,7 +19699,7 @@
       </w:rPr>
     </w:lvl>
   </w:abstractNum>
-  <w:abstractNum w:abstractNumId="92" w15:restartNumberingAfterBreak="0">
+  <w:abstractNum w:abstractNumId="94" w15:restartNumberingAfterBreak="0">
     <w:nsid w:val="4F053929"/>
     <w:multiLevelType w:val="hybridMultilevel"/>
     <w:tmpl w:val="2A78C678"/>
@@ -18990,7 +19812,7 @@
       </w:rPr>
     </w:lvl>
   </w:abstractNum>
-  <w:abstractNum w:abstractNumId="93" w15:restartNumberingAfterBreak="0">
+  <w:abstractNum w:abstractNumId="95" w15:restartNumberingAfterBreak="0">
     <w:nsid w:val="4F750073"/>
     <w:multiLevelType w:val="hybridMultilevel"/>
     <w:tmpl w:val="EC7AB8FC"/>
@@ -19103,7 +19925,7 @@
       </w:rPr>
     </w:lvl>
   </w:abstractNum>
-  <w:abstractNum w:abstractNumId="94" w15:restartNumberingAfterBreak="0">
+  <w:abstractNum w:abstractNumId="96" w15:restartNumberingAfterBreak="0">
     <w:nsid w:val="4FFB237E"/>
     <w:multiLevelType w:val="multilevel"/>
     <w:tmpl w:val="2AA67CDA"/>
@@ -19252,7 +20074,7 @@
       </w:rPr>
     </w:lvl>
   </w:abstractNum>
-  <w:abstractNum w:abstractNumId="95" w15:restartNumberingAfterBreak="0">
+  <w:abstractNum w:abstractNumId="97" w15:restartNumberingAfterBreak="0">
     <w:nsid w:val="51737FE0"/>
     <w:multiLevelType w:val="hybridMultilevel"/>
     <w:tmpl w:val="2B0604E6"/>
@@ -19365,7 +20187,7 @@
       </w:rPr>
     </w:lvl>
   </w:abstractNum>
-  <w:abstractNum w:abstractNumId="96" w15:restartNumberingAfterBreak="0">
+  <w:abstractNum w:abstractNumId="98" w15:restartNumberingAfterBreak="0">
     <w:nsid w:val="518B1885"/>
     <w:multiLevelType w:val="multilevel"/>
     <w:tmpl w:val="AE1AAC28"/>
@@ -19514,7 +20336,7 @@
       </w:rPr>
     </w:lvl>
   </w:abstractNum>
-  <w:abstractNum w:abstractNumId="97" w15:restartNumberingAfterBreak="0">
+  <w:abstractNum w:abstractNumId="99" w15:restartNumberingAfterBreak="0">
     <w:nsid w:val="51A86EF8"/>
     <w:multiLevelType w:val="multilevel"/>
     <w:tmpl w:val="FF2841D4"/>
@@ -19663,7 +20485,7 @@
       </w:rPr>
     </w:lvl>
   </w:abstractNum>
-  <w:abstractNum w:abstractNumId="98" w15:restartNumberingAfterBreak="0">
+  <w:abstractNum w:abstractNumId="100" w15:restartNumberingAfterBreak="0">
     <w:nsid w:val="51AB55CC"/>
     <w:multiLevelType w:val="multilevel"/>
     <w:tmpl w:val="5986D838"/>
@@ -19812,7 +20634,7 @@
       </w:rPr>
     </w:lvl>
   </w:abstractNum>
-  <w:abstractNum w:abstractNumId="99" w15:restartNumberingAfterBreak="0">
+  <w:abstractNum w:abstractNumId="101" w15:restartNumberingAfterBreak="0">
     <w:nsid w:val="521378FF"/>
     <w:multiLevelType w:val="multilevel"/>
     <w:tmpl w:val="7B002268"/>
@@ -19961,7 +20783,7 @@
       </w:rPr>
     </w:lvl>
   </w:abstractNum>
-  <w:abstractNum w:abstractNumId="100" w15:restartNumberingAfterBreak="0">
+  <w:abstractNum w:abstractNumId="102" w15:restartNumberingAfterBreak="0">
     <w:nsid w:val="521F2792"/>
     <w:multiLevelType w:val="multilevel"/>
     <w:tmpl w:val="9FB45386"/>
@@ -20110,7 +20932,156 @@
       </w:rPr>
     </w:lvl>
   </w:abstractNum>
-  <w:abstractNum w:abstractNumId="101" w15:restartNumberingAfterBreak="0">
+  <w:abstractNum w:abstractNumId="103" w15:restartNumberingAfterBreak="0">
+    <w:nsid w:val="5305347C"/>
+    <w:multiLevelType w:val="multilevel"/>
+    <w:tmpl w:val="76309E9A"/>
+    <w:lvl w:ilvl="0">
+      <w:start w:val="1"/>
+      <w:numFmt w:val="bullet"/>
+      <w:lvlText w:val=""/>
+      <w:lvlJc w:val="left"/>
+      <w:pPr>
+        <w:tabs>
+          <w:tab w:val="num" w:pos="720"/>
+        </w:tabs>
+        <w:ind w:left="720" w:hanging="360"/>
+      </w:pPr>
+      <w:rPr>
+        <w:rFonts w:ascii="Symbol" w:hAnsi="Symbol" w:hint="default"/>
+        <w:sz w:val="20"/>
+      </w:rPr>
+    </w:lvl>
+    <w:lvl w:ilvl="1" w:tentative="1">
+      <w:start w:val="1"/>
+      <w:numFmt w:val="bullet"/>
+      <w:lvlText w:val="o"/>
+      <w:lvlJc w:val="left"/>
+      <w:pPr>
+        <w:tabs>
+          <w:tab w:val="num" w:pos="1440"/>
+        </w:tabs>
+        <w:ind w:left="1440" w:hanging="360"/>
+      </w:pPr>
+      <w:rPr>
+        <w:rFonts w:ascii="Courier New" w:hAnsi="Courier New" w:hint="default"/>
+        <w:sz w:val="20"/>
+      </w:rPr>
+    </w:lvl>
+    <w:lvl w:ilvl="2" w:tentative="1">
+      <w:start w:val="1"/>
+      <w:numFmt w:val="bullet"/>
+      <w:lvlText w:val=""/>
+      <w:lvlJc w:val="left"/>
+      <w:pPr>
+        <w:tabs>
+          <w:tab w:val="num" w:pos="2160"/>
+        </w:tabs>
+        <w:ind w:left="2160" w:hanging="360"/>
+      </w:pPr>
+      <w:rPr>
+        <w:rFonts w:ascii="Wingdings" w:hAnsi="Wingdings" w:hint="default"/>
+        <w:sz w:val="20"/>
+      </w:rPr>
+    </w:lvl>
+    <w:lvl w:ilvl="3" w:tentative="1">
+      <w:start w:val="1"/>
+      <w:numFmt w:val="bullet"/>
+      <w:lvlText w:val=""/>
+      <w:lvlJc w:val="left"/>
+      <w:pPr>
+        <w:tabs>
+          <w:tab w:val="num" w:pos="2880"/>
+        </w:tabs>
+        <w:ind w:left="2880" w:hanging="360"/>
+      </w:pPr>
+      <w:rPr>
+        <w:rFonts w:ascii="Wingdings" w:hAnsi="Wingdings" w:hint="default"/>
+        <w:sz w:val="20"/>
+      </w:rPr>
+    </w:lvl>
+    <w:lvl w:ilvl="4" w:tentative="1">
+      <w:start w:val="1"/>
+      <w:numFmt w:val="bullet"/>
+      <w:lvlText w:val=""/>
+      <w:lvlJc w:val="left"/>
+      <w:pPr>
+        <w:tabs>
+          <w:tab w:val="num" w:pos="3600"/>
+        </w:tabs>
+        <w:ind w:left="3600" w:hanging="360"/>
+      </w:pPr>
+      <w:rPr>
+        <w:rFonts w:ascii="Wingdings" w:hAnsi="Wingdings" w:hint="default"/>
+        <w:sz w:val="20"/>
+      </w:rPr>
+    </w:lvl>
+    <w:lvl w:ilvl="5" w:tentative="1">
+      <w:start w:val="1"/>
+      <w:numFmt w:val="bullet"/>
+      <w:lvlText w:val=""/>
+      <w:lvlJc w:val="left"/>
+      <w:pPr>
+        <w:tabs>
+          <w:tab w:val="num" w:pos="4320"/>
+        </w:tabs>
+        <w:ind w:left="4320" w:hanging="360"/>
+      </w:pPr>
+      <w:rPr>
+        <w:rFonts w:ascii="Wingdings" w:hAnsi="Wingdings" w:hint="default"/>
+        <w:sz w:val="20"/>
+      </w:rPr>
+    </w:lvl>
+    <w:lvl w:ilvl="6" w:tentative="1">
+      <w:start w:val="1"/>
+      <w:numFmt w:val="bullet"/>
+      <w:lvlText w:val=""/>
+      <w:lvlJc w:val="left"/>
+      <w:pPr>
+        <w:tabs>
+          <w:tab w:val="num" w:pos="5040"/>
+        </w:tabs>
+        <w:ind w:left="5040" w:hanging="360"/>
+      </w:pPr>
+      <w:rPr>
+        <w:rFonts w:ascii="Wingdings" w:hAnsi="Wingdings" w:hint="default"/>
+        <w:sz w:val="20"/>
+      </w:rPr>
+    </w:lvl>
+    <w:lvl w:ilvl="7" w:tentative="1">
+      <w:start w:val="1"/>
+      <w:numFmt w:val="bullet"/>
+      <w:lvlText w:val=""/>
+      <w:lvlJc w:val="left"/>
+      <w:pPr>
+        <w:tabs>
+          <w:tab w:val="num" w:pos="5760"/>
+        </w:tabs>
+        <w:ind w:left="5760" w:hanging="360"/>
+      </w:pPr>
+      <w:rPr>
+        <w:rFonts w:ascii="Wingdings" w:hAnsi="Wingdings" w:hint="default"/>
+        <w:sz w:val="20"/>
+      </w:rPr>
+    </w:lvl>
+    <w:lvl w:ilvl="8" w:tentative="1">
+      <w:start w:val="1"/>
+      <w:numFmt w:val="bullet"/>
+      <w:lvlText w:val=""/>
+      <w:lvlJc w:val="left"/>
+      <w:pPr>
+        <w:tabs>
+          <w:tab w:val="num" w:pos="6480"/>
+        </w:tabs>
+        <w:ind w:left="6480" w:hanging="360"/>
+      </w:pPr>
+      <w:rPr>
+        <w:rFonts w:ascii="Wingdings" w:hAnsi="Wingdings" w:hint="default"/>
+        <w:sz w:val="20"/>
+      </w:rPr>
+    </w:lvl>
+  </w:abstractNum>
+  <w:abstractNum w:abstractNumId="104" w15:restartNumberingAfterBreak="0">
     <w:nsid w:val="53390911"/>
     <w:multiLevelType w:val="multilevel"/>
     <w:tmpl w:val="1C380F12"/>
@@ -20259,7 +21230,7 @@
       </w:rPr>
     </w:lvl>
   </w:abstractNum>
-  <w:abstractNum w:abstractNumId="102" w15:restartNumberingAfterBreak="0">
+  <w:abstractNum w:abstractNumId="105" w15:restartNumberingAfterBreak="0">
     <w:nsid w:val="53CD23AC"/>
     <w:multiLevelType w:val="multilevel"/>
     <w:tmpl w:val="57BAE8F0"/>
@@ -20408,7 +21379,7 @@
       </w:rPr>
     </w:lvl>
   </w:abstractNum>
-  <w:abstractNum w:abstractNumId="103" w15:restartNumberingAfterBreak="0">
+  <w:abstractNum w:abstractNumId="106" w15:restartNumberingAfterBreak="0">
     <w:nsid w:val="5462791F"/>
     <w:multiLevelType w:val="hybridMultilevel"/>
     <w:tmpl w:val="FDE24C26"/>
@@ -20521,7 +21492,7 @@
       </w:rPr>
     </w:lvl>
   </w:abstractNum>
-  <w:abstractNum w:abstractNumId="104" w15:restartNumberingAfterBreak="0">
+  <w:abstractNum w:abstractNumId="107" w15:restartNumberingAfterBreak="0">
     <w:nsid w:val="547005EB"/>
     <w:multiLevelType w:val="multilevel"/>
     <w:tmpl w:val="F260CC5C"/>
@@ -20670,7 +21641,7 @@
       </w:rPr>
     </w:lvl>
   </w:abstractNum>
-  <w:abstractNum w:abstractNumId="105" w15:restartNumberingAfterBreak="0">
+  <w:abstractNum w:abstractNumId="108" w15:restartNumberingAfterBreak="0">
     <w:nsid w:val="55961DEA"/>
     <w:multiLevelType w:val="multilevel"/>
     <w:tmpl w:val="AED821A4"/>
@@ -20819,7 +21790,7 @@
       </w:rPr>
     </w:lvl>
   </w:abstractNum>
-  <w:abstractNum w:abstractNumId="106" w15:restartNumberingAfterBreak="0">
+  <w:abstractNum w:abstractNumId="109" w15:restartNumberingAfterBreak="0">
     <w:nsid w:val="55EC0440"/>
     <w:multiLevelType w:val="hybridMultilevel"/>
     <w:tmpl w:val="67C69668"/>
@@ -20932,7 +21903,7 @@
       </w:rPr>
     </w:lvl>
   </w:abstractNum>
-  <w:abstractNum w:abstractNumId="107" w15:restartNumberingAfterBreak="0">
+  <w:abstractNum w:abstractNumId="110" w15:restartNumberingAfterBreak="0">
     <w:nsid w:val="58034221"/>
     <w:multiLevelType w:val="hybridMultilevel"/>
     <w:tmpl w:val="65D0619C"/>
@@ -21045,7 +22016,7 @@
       </w:rPr>
     </w:lvl>
   </w:abstractNum>
-  <w:abstractNum w:abstractNumId="108" w15:restartNumberingAfterBreak="0">
+  <w:abstractNum w:abstractNumId="111" w15:restartNumberingAfterBreak="0">
     <w:nsid w:val="583419A0"/>
     <w:multiLevelType w:val="multilevel"/>
     <w:tmpl w:val="6EE47FD8"/>
@@ -21194,7 +22165,7 @@
       </w:rPr>
     </w:lvl>
   </w:abstractNum>
-  <w:abstractNum w:abstractNumId="109" w15:restartNumberingAfterBreak="0">
+  <w:abstractNum w:abstractNumId="112" w15:restartNumberingAfterBreak="0">
     <w:nsid w:val="583F3D9C"/>
     <w:multiLevelType w:val="multilevel"/>
     <w:tmpl w:val="8E4C5D4A"/>
@@ -21343,7 +22314,7 @@
       </w:rPr>
     </w:lvl>
   </w:abstractNum>
-  <w:abstractNum w:abstractNumId="110" w15:restartNumberingAfterBreak="0">
+  <w:abstractNum w:abstractNumId="113" w15:restartNumberingAfterBreak="0">
     <w:nsid w:val="59515319"/>
     <w:multiLevelType w:val="multilevel"/>
     <w:tmpl w:val="5AD8ACF0"/>
@@ -21492,7 +22463,7 @@
       </w:rPr>
     </w:lvl>
   </w:abstractNum>
-  <w:abstractNum w:abstractNumId="111" w15:restartNumberingAfterBreak="0">
+  <w:abstractNum w:abstractNumId="114" w15:restartNumberingAfterBreak="0">
     <w:nsid w:val="5A460390"/>
     <w:multiLevelType w:val="hybridMultilevel"/>
     <w:tmpl w:val="BD8E939C"/>
@@ -21605,7 +22576,7 @@
       </w:rPr>
     </w:lvl>
   </w:abstractNum>
-  <w:abstractNum w:abstractNumId="112" w15:restartNumberingAfterBreak="0">
+  <w:abstractNum w:abstractNumId="115" w15:restartNumberingAfterBreak="0">
     <w:nsid w:val="5C25321F"/>
     <w:multiLevelType w:val="multilevel"/>
     <w:tmpl w:val="16D68826"/>
@@ -21754,7 +22725,7 @@
       </w:rPr>
     </w:lvl>
   </w:abstractNum>
-  <w:abstractNum w:abstractNumId="113" w15:restartNumberingAfterBreak="0">
+  <w:abstractNum w:abstractNumId="116" w15:restartNumberingAfterBreak="0">
     <w:nsid w:val="5CEE630B"/>
     <w:multiLevelType w:val="hybridMultilevel"/>
     <w:tmpl w:val="DE8E8DBA"/>
@@ -21867,7 +22838,7 @@
       </w:rPr>
     </w:lvl>
   </w:abstractNum>
-  <w:abstractNum w:abstractNumId="114" w15:restartNumberingAfterBreak="0">
+  <w:abstractNum w:abstractNumId="117" w15:restartNumberingAfterBreak="0">
     <w:nsid w:val="5D5A183C"/>
     <w:multiLevelType w:val="multilevel"/>
     <w:tmpl w:val="C804C34A"/>
@@ -22016,7 +22987,7 @@
       </w:rPr>
     </w:lvl>
   </w:abstractNum>
-  <w:abstractNum w:abstractNumId="115" w15:restartNumberingAfterBreak="0">
+  <w:abstractNum w:abstractNumId="118" w15:restartNumberingAfterBreak="0">
     <w:nsid w:val="5DF95194"/>
     <w:multiLevelType w:val="multilevel"/>
     <w:tmpl w:val="CC127E54"/>
@@ -22165,7 +23136,7 @@
       </w:rPr>
     </w:lvl>
   </w:abstractNum>
-  <w:abstractNum w:abstractNumId="116" w15:restartNumberingAfterBreak="0">
+  <w:abstractNum w:abstractNumId="119" w15:restartNumberingAfterBreak="0">
     <w:nsid w:val="5E6333E0"/>
     <w:multiLevelType w:val="hybridMultilevel"/>
     <w:tmpl w:val="A15497C8"/>
@@ -22278,7 +23249,7 @@
       </w:rPr>
     </w:lvl>
   </w:abstractNum>
-  <w:abstractNum w:abstractNumId="117" w15:restartNumberingAfterBreak="0">
+  <w:abstractNum w:abstractNumId="120" w15:restartNumberingAfterBreak="0">
     <w:nsid w:val="5E9C452C"/>
     <w:multiLevelType w:val="multilevel"/>
     <w:tmpl w:val="B8727936"/>
@@ -22427,7 +23398,7 @@
       </w:rPr>
     </w:lvl>
   </w:abstractNum>
-  <w:abstractNum w:abstractNumId="118" w15:restartNumberingAfterBreak="0">
+  <w:abstractNum w:abstractNumId="121" w15:restartNumberingAfterBreak="0">
     <w:nsid w:val="5EC339A8"/>
     <w:multiLevelType w:val="multilevel"/>
     <w:tmpl w:val="36DAAD54"/>
@@ -22576,7 +23547,7 @@
       </w:rPr>
     </w:lvl>
   </w:abstractNum>
-  <w:abstractNum w:abstractNumId="119" w15:restartNumberingAfterBreak="0">
+  <w:abstractNum w:abstractNumId="122" w15:restartNumberingAfterBreak="0">
     <w:nsid w:val="605D2403"/>
     <w:multiLevelType w:val="multilevel"/>
     <w:tmpl w:val="5AF24F44"/>
@@ -22725,7 +23696,7 @@
       </w:rPr>
     </w:lvl>
   </w:abstractNum>
-  <w:abstractNum w:abstractNumId="120" w15:restartNumberingAfterBreak="0">
+  <w:abstractNum w:abstractNumId="123" w15:restartNumberingAfterBreak="0">
     <w:nsid w:val="62385AA6"/>
     <w:multiLevelType w:val="multilevel"/>
     <w:tmpl w:val="B9EAECD4"/>
@@ -22874,7 +23845,7 @@
       </w:rPr>
     </w:lvl>
   </w:abstractNum>
-  <w:abstractNum w:abstractNumId="121" w15:restartNumberingAfterBreak="0">
+  <w:abstractNum w:abstractNumId="124" w15:restartNumberingAfterBreak="0">
     <w:nsid w:val="625D686D"/>
     <w:multiLevelType w:val="multilevel"/>
     <w:tmpl w:val="BC1C2048"/>
@@ -23023,7 +23994,7 @@
       </w:rPr>
     </w:lvl>
   </w:abstractNum>
-  <w:abstractNum w:abstractNumId="122" w15:restartNumberingAfterBreak="0">
+  <w:abstractNum w:abstractNumId="125" w15:restartNumberingAfterBreak="0">
     <w:nsid w:val="62B46951"/>
     <w:multiLevelType w:val="hybridMultilevel"/>
     <w:tmpl w:val="0FEAFEC6"/>
@@ -23136,7 +24107,7 @@
       </w:rPr>
     </w:lvl>
   </w:abstractNum>
-  <w:abstractNum w:abstractNumId="123" w15:restartNumberingAfterBreak="0">
+  <w:abstractNum w:abstractNumId="126" w15:restartNumberingAfterBreak="0">
     <w:nsid w:val="64014C6E"/>
     <w:multiLevelType w:val="multilevel"/>
     <w:tmpl w:val="96E42962"/>
@@ -23285,7 +24256,7 @@
       </w:rPr>
     </w:lvl>
   </w:abstractNum>
-  <w:abstractNum w:abstractNumId="124" w15:restartNumberingAfterBreak="0">
+  <w:abstractNum w:abstractNumId="127" w15:restartNumberingAfterBreak="0">
     <w:nsid w:val="647819E3"/>
     <w:multiLevelType w:val="multilevel"/>
     <w:tmpl w:val="ABB278BC"/>
@@ -23434,7 +24405,7 @@
       </w:rPr>
     </w:lvl>
   </w:abstractNum>
-  <w:abstractNum w:abstractNumId="125" w15:restartNumberingAfterBreak="0">
+  <w:abstractNum w:abstractNumId="128" w15:restartNumberingAfterBreak="0">
     <w:nsid w:val="64F30198"/>
     <w:multiLevelType w:val="multilevel"/>
     <w:tmpl w:val="63F4E6F0"/>
@@ -23583,7 +24554,7 @@
       </w:rPr>
     </w:lvl>
   </w:abstractNum>
-  <w:abstractNum w:abstractNumId="126" w15:restartNumberingAfterBreak="0">
+  <w:abstractNum w:abstractNumId="129" w15:restartNumberingAfterBreak="0">
     <w:nsid w:val="65314293"/>
     <w:multiLevelType w:val="hybridMultilevel"/>
     <w:tmpl w:val="6688DFAC"/>
@@ -23696,7 +24667,7 @@
       </w:rPr>
     </w:lvl>
   </w:abstractNum>
-  <w:abstractNum w:abstractNumId="127" w15:restartNumberingAfterBreak="0">
+  <w:abstractNum w:abstractNumId="130" w15:restartNumberingAfterBreak="0">
     <w:nsid w:val="657A47E4"/>
     <w:multiLevelType w:val="hybridMultilevel"/>
     <w:tmpl w:val="98CAEF8A"/>
@@ -23809,7 +24780,7 @@
       </w:rPr>
     </w:lvl>
   </w:abstractNum>
-  <w:abstractNum w:abstractNumId="128" w15:restartNumberingAfterBreak="0">
+  <w:abstractNum w:abstractNumId="131" w15:restartNumberingAfterBreak="0">
     <w:nsid w:val="65CE4D0F"/>
     <w:multiLevelType w:val="hybridMultilevel"/>
     <w:tmpl w:val="DB668538"/>
@@ -23922,7 +24893,7 @@
       </w:rPr>
     </w:lvl>
   </w:abstractNum>
-  <w:abstractNum w:abstractNumId="129" w15:restartNumberingAfterBreak="0">
+  <w:abstractNum w:abstractNumId="132" w15:restartNumberingAfterBreak="0">
     <w:nsid w:val="661C7D73"/>
     <w:multiLevelType w:val="multilevel"/>
     <w:tmpl w:val="D9681266"/>
@@ -24071,7 +25042,7 @@
       </w:rPr>
     </w:lvl>
   </w:abstractNum>
-  <w:abstractNum w:abstractNumId="130" w15:restartNumberingAfterBreak="0">
+  <w:abstractNum w:abstractNumId="133" w15:restartNumberingAfterBreak="0">
     <w:nsid w:val="661F6F82"/>
     <w:multiLevelType w:val="multilevel"/>
     <w:tmpl w:val="53F8A934"/>
@@ -24220,7 +25191,7 @@
       </w:rPr>
     </w:lvl>
   </w:abstractNum>
-  <w:abstractNum w:abstractNumId="131" w15:restartNumberingAfterBreak="0">
+  <w:abstractNum w:abstractNumId="134" w15:restartNumberingAfterBreak="0">
     <w:nsid w:val="66E36FE0"/>
     <w:multiLevelType w:val="multilevel"/>
     <w:tmpl w:val="2AA67CDA"/>
@@ -24369,7 +25340,7 @@
       </w:rPr>
     </w:lvl>
   </w:abstractNum>
-  <w:abstractNum w:abstractNumId="132" w15:restartNumberingAfterBreak="0">
+  <w:abstractNum w:abstractNumId="135" w15:restartNumberingAfterBreak="0">
     <w:nsid w:val="68205EC5"/>
     <w:multiLevelType w:val="multilevel"/>
     <w:tmpl w:val="EB4C8238"/>
@@ -24518,7 +25489,7 @@
       </w:rPr>
     </w:lvl>
   </w:abstractNum>
-  <w:abstractNum w:abstractNumId="133" w15:restartNumberingAfterBreak="0">
+  <w:abstractNum w:abstractNumId="136" w15:restartNumberingAfterBreak="0">
     <w:nsid w:val="68B94344"/>
     <w:multiLevelType w:val="multilevel"/>
     <w:tmpl w:val="9BA812D8"/>
@@ -24667,7 +25638,7 @@
       </w:rPr>
     </w:lvl>
   </w:abstractNum>
-  <w:abstractNum w:abstractNumId="134" w15:restartNumberingAfterBreak="0">
+  <w:abstractNum w:abstractNumId="137" w15:restartNumberingAfterBreak="0">
     <w:nsid w:val="69DE2C87"/>
     <w:multiLevelType w:val="hybridMultilevel"/>
     <w:tmpl w:val="F530F20A"/>
@@ -24780,7 +25751,7 @@
       </w:rPr>
     </w:lvl>
   </w:abstractNum>
-  <w:abstractNum w:abstractNumId="135" w15:restartNumberingAfterBreak="0">
+  <w:abstractNum w:abstractNumId="138" w15:restartNumberingAfterBreak="0">
     <w:nsid w:val="69ED672D"/>
     <w:multiLevelType w:val="multilevel"/>
     <w:tmpl w:val="CC08E300"/>
@@ -24929,7 +25900,7 @@
       </w:rPr>
     </w:lvl>
   </w:abstractNum>
-  <w:abstractNum w:abstractNumId="136" w15:restartNumberingAfterBreak="0">
+  <w:abstractNum w:abstractNumId="139" w15:restartNumberingAfterBreak="0">
     <w:nsid w:val="6A063EFD"/>
     <w:multiLevelType w:val="hybridMultilevel"/>
     <w:tmpl w:val="48703FBA"/>
@@ -25042,7 +26013,7 @@
       </w:rPr>
     </w:lvl>
   </w:abstractNum>
-  <w:abstractNum w:abstractNumId="137" w15:restartNumberingAfterBreak="0">
+  <w:abstractNum w:abstractNumId="140" w15:restartNumberingAfterBreak="0">
     <w:nsid w:val="6A825ABE"/>
     <w:multiLevelType w:val="multilevel"/>
     <w:tmpl w:val="0CD6F30E"/>
@@ -25191,7 +26162,7 @@
       </w:rPr>
     </w:lvl>
   </w:abstractNum>
-  <w:abstractNum w:abstractNumId="138" w15:restartNumberingAfterBreak="0">
+  <w:abstractNum w:abstractNumId="141" w15:restartNumberingAfterBreak="0">
     <w:nsid w:val="6B1D7832"/>
     <w:multiLevelType w:val="multilevel"/>
     <w:tmpl w:val="DD4646B2"/>
@@ -25340,7 +26311,7 @@
       </w:rPr>
     </w:lvl>
   </w:abstractNum>
-  <w:abstractNum w:abstractNumId="139" w15:restartNumberingAfterBreak="0">
+  <w:abstractNum w:abstractNumId="142" w15:restartNumberingAfterBreak="0">
     <w:nsid w:val="6C6D6667"/>
     <w:multiLevelType w:val="hybridMultilevel"/>
     <w:tmpl w:val="A744709C"/>
@@ -25453,7 +26424,7 @@
       </w:rPr>
     </w:lvl>
   </w:abstractNum>
-  <w:abstractNum w:abstractNumId="140" w15:restartNumberingAfterBreak="0">
+  <w:abstractNum w:abstractNumId="143" w15:restartNumberingAfterBreak="0">
     <w:nsid w:val="6CAD7EA5"/>
     <w:multiLevelType w:val="multilevel"/>
     <w:tmpl w:val="C472C5B0"/>
@@ -25602,7 +26573,7 @@
       </w:rPr>
     </w:lvl>
   </w:abstractNum>
-  <w:abstractNum w:abstractNumId="141" w15:restartNumberingAfterBreak="0">
+  <w:abstractNum w:abstractNumId="144" w15:restartNumberingAfterBreak="0">
     <w:nsid w:val="6E43557B"/>
     <w:multiLevelType w:val="multilevel"/>
     <w:tmpl w:val="323C7112"/>
@@ -25751,7 +26722,7 @@
       </w:rPr>
     </w:lvl>
   </w:abstractNum>
-  <w:abstractNum w:abstractNumId="142" w15:restartNumberingAfterBreak="0">
+  <w:abstractNum w:abstractNumId="145" w15:restartNumberingAfterBreak="0">
     <w:nsid w:val="6E4C2FCD"/>
     <w:multiLevelType w:val="hybridMultilevel"/>
     <w:tmpl w:val="1FE6FE7A"/>
@@ -25864,7 +26835,7 @@
       </w:rPr>
     </w:lvl>
   </w:abstractNum>
-  <w:abstractNum w:abstractNumId="143" w15:restartNumberingAfterBreak="0">
+  <w:abstractNum w:abstractNumId="146" w15:restartNumberingAfterBreak="0">
     <w:nsid w:val="6EA27D0A"/>
     <w:multiLevelType w:val="multilevel"/>
     <w:tmpl w:val="7BF0256C"/>
@@ -26013,7 +26984,7 @@
       </w:rPr>
     </w:lvl>
   </w:abstractNum>
-  <w:abstractNum w:abstractNumId="144" w15:restartNumberingAfterBreak="0">
+  <w:abstractNum w:abstractNumId="147" w15:restartNumberingAfterBreak="0">
     <w:nsid w:val="6EF86273"/>
     <w:multiLevelType w:val="multilevel"/>
     <w:tmpl w:val="2AA67CDA"/>
@@ -26162,7 +27133,7 @@
       </w:rPr>
     </w:lvl>
   </w:abstractNum>
-  <w:abstractNum w:abstractNumId="145" w15:restartNumberingAfterBreak="0">
+  <w:abstractNum w:abstractNumId="148" w15:restartNumberingAfterBreak="0">
     <w:nsid w:val="6F1425D4"/>
     <w:multiLevelType w:val="multilevel"/>
     <w:tmpl w:val="F71C8B08"/>
@@ -26311,7 +27282,7 @@
       </w:rPr>
     </w:lvl>
   </w:abstractNum>
-  <w:abstractNum w:abstractNumId="146" w15:restartNumberingAfterBreak="0">
+  <w:abstractNum w:abstractNumId="149" w15:restartNumberingAfterBreak="0">
     <w:nsid w:val="6F304959"/>
     <w:multiLevelType w:val="multilevel"/>
     <w:tmpl w:val="57AA766C"/>
@@ -26460,7 +27431,7 @@
       </w:rPr>
     </w:lvl>
   </w:abstractNum>
-  <w:abstractNum w:abstractNumId="147" w15:restartNumberingAfterBreak="0">
+  <w:abstractNum w:abstractNumId="150" w15:restartNumberingAfterBreak="0">
     <w:nsid w:val="70874300"/>
     <w:multiLevelType w:val="hybridMultilevel"/>
     <w:tmpl w:val="1B3A0518"/>
@@ -26573,7 +27544,7 @@
       </w:rPr>
     </w:lvl>
   </w:abstractNum>
-  <w:abstractNum w:abstractNumId="148" w15:restartNumberingAfterBreak="0">
+  <w:abstractNum w:abstractNumId="151" w15:restartNumberingAfterBreak="0">
     <w:nsid w:val="7090251B"/>
     <w:multiLevelType w:val="hybridMultilevel"/>
     <w:tmpl w:val="67687EFE"/>
@@ -26686,7 +27657,7 @@
       </w:rPr>
     </w:lvl>
   </w:abstractNum>
-  <w:abstractNum w:abstractNumId="149" w15:restartNumberingAfterBreak="0">
+  <w:abstractNum w:abstractNumId="152" w15:restartNumberingAfterBreak="0">
     <w:nsid w:val="72031F81"/>
     <w:multiLevelType w:val="multilevel"/>
     <w:tmpl w:val="84400090"/>
@@ -26835,7 +27806,7 @@
       </w:rPr>
     </w:lvl>
   </w:abstractNum>
-  <w:abstractNum w:abstractNumId="150" w15:restartNumberingAfterBreak="0">
+  <w:abstractNum w:abstractNumId="153" w15:restartNumberingAfterBreak="0">
     <w:nsid w:val="722301E0"/>
     <w:multiLevelType w:val="multilevel"/>
     <w:tmpl w:val="1EE82E5A"/>
@@ -26984,7 +27955,7 @@
       </w:rPr>
     </w:lvl>
   </w:abstractNum>
-  <w:abstractNum w:abstractNumId="151" w15:restartNumberingAfterBreak="0">
+  <w:abstractNum w:abstractNumId="154" w15:restartNumberingAfterBreak="0">
     <w:nsid w:val="75144C65"/>
     <w:multiLevelType w:val="hybridMultilevel"/>
     <w:tmpl w:val="12127FAA"/>
@@ -27097,7 +28068,7 @@
       </w:rPr>
     </w:lvl>
   </w:abstractNum>
-  <w:abstractNum w:abstractNumId="152" w15:restartNumberingAfterBreak="0">
+  <w:abstractNum w:abstractNumId="155" w15:restartNumberingAfterBreak="0">
     <w:nsid w:val="75237F84"/>
     <w:multiLevelType w:val="hybridMultilevel"/>
     <w:tmpl w:val="5F0A6EF2"/>
@@ -27210,7 +28181,7 @@
       </w:rPr>
     </w:lvl>
   </w:abstractNum>
-  <w:abstractNum w:abstractNumId="153" w15:restartNumberingAfterBreak="0">
+  <w:abstractNum w:abstractNumId="156" w15:restartNumberingAfterBreak="0">
     <w:nsid w:val="758968F2"/>
     <w:multiLevelType w:val="multilevel"/>
     <w:tmpl w:val="D4241C4A"/>
@@ -27359,7 +28330,7 @@
       </w:rPr>
     </w:lvl>
   </w:abstractNum>
-  <w:abstractNum w:abstractNumId="154" w15:restartNumberingAfterBreak="0">
+  <w:abstractNum w:abstractNumId="157" w15:restartNumberingAfterBreak="0">
     <w:nsid w:val="75C90201"/>
     <w:multiLevelType w:val="hybridMultilevel"/>
     <w:tmpl w:val="02D63AEC"/>
@@ -27472,7 +28443,7 @@
       </w:rPr>
     </w:lvl>
   </w:abstractNum>
-  <w:abstractNum w:abstractNumId="155" w15:restartNumberingAfterBreak="0">
+  <w:abstractNum w:abstractNumId="158" w15:restartNumberingAfterBreak="0">
     <w:nsid w:val="75F3357C"/>
     <w:multiLevelType w:val="hybridMultilevel"/>
     <w:tmpl w:val="26723550"/>
@@ -27585,7 +28556,7 @@
       </w:rPr>
     </w:lvl>
   </w:abstractNum>
-  <w:abstractNum w:abstractNumId="156" w15:restartNumberingAfterBreak="0">
+  <w:abstractNum w:abstractNumId="159" w15:restartNumberingAfterBreak="0">
     <w:nsid w:val="75FF09B0"/>
     <w:multiLevelType w:val="multilevel"/>
     <w:tmpl w:val="C34A7734"/>
@@ -27734,7 +28705,7 @@
       </w:rPr>
     </w:lvl>
   </w:abstractNum>
-  <w:abstractNum w:abstractNumId="157" w15:restartNumberingAfterBreak="0">
+  <w:abstractNum w:abstractNumId="160" w15:restartNumberingAfterBreak="0">
     <w:nsid w:val="76864E3D"/>
     <w:multiLevelType w:val="hybridMultilevel"/>
     <w:tmpl w:val="9000C896"/>
@@ -27847,7 +28818,7 @@
       </w:rPr>
     </w:lvl>
   </w:abstractNum>
-  <w:abstractNum w:abstractNumId="158" w15:restartNumberingAfterBreak="0">
+  <w:abstractNum w:abstractNumId="161" w15:restartNumberingAfterBreak="0">
     <w:nsid w:val="774028FF"/>
     <w:multiLevelType w:val="hybridMultilevel"/>
     <w:tmpl w:val="EED036DC"/>
@@ -27960,7 +28931,7 @@
       </w:rPr>
     </w:lvl>
   </w:abstractNum>
-  <w:abstractNum w:abstractNumId="159" w15:restartNumberingAfterBreak="0">
+  <w:abstractNum w:abstractNumId="162" w15:restartNumberingAfterBreak="0">
     <w:nsid w:val="777E68D9"/>
     <w:multiLevelType w:val="multilevel"/>
     <w:tmpl w:val="3F503B98"/>
@@ -28109,7 +29080,7 @@
       </w:rPr>
     </w:lvl>
   </w:abstractNum>
-  <w:abstractNum w:abstractNumId="160" w15:restartNumberingAfterBreak="0">
+  <w:abstractNum w:abstractNumId="163" w15:restartNumberingAfterBreak="0">
     <w:nsid w:val="77960362"/>
     <w:multiLevelType w:val="multilevel"/>
     <w:tmpl w:val="FEA0022E"/>
@@ -28258,7 +29229,7 @@
       </w:rPr>
     </w:lvl>
   </w:abstractNum>
-  <w:abstractNum w:abstractNumId="161" w15:restartNumberingAfterBreak="0">
+  <w:abstractNum w:abstractNumId="164" w15:restartNumberingAfterBreak="0">
     <w:nsid w:val="78547E35"/>
     <w:multiLevelType w:val="multilevel"/>
     <w:tmpl w:val="FC1421DE"/>
@@ -28407,7 +29378,7 @@
       </w:rPr>
     </w:lvl>
   </w:abstractNum>
-  <w:abstractNum w:abstractNumId="162" w15:restartNumberingAfterBreak="0">
+  <w:abstractNum w:abstractNumId="165" w15:restartNumberingAfterBreak="0">
     <w:nsid w:val="78553766"/>
     <w:multiLevelType w:val="hybridMultilevel"/>
     <w:tmpl w:val="246CBCB4"/>
@@ -28520,7 +29491,7 @@
       </w:rPr>
     </w:lvl>
   </w:abstractNum>
-  <w:abstractNum w:abstractNumId="163" w15:restartNumberingAfterBreak="0">
+  <w:abstractNum w:abstractNumId="166" w15:restartNumberingAfterBreak="0">
     <w:nsid w:val="785A644F"/>
     <w:multiLevelType w:val="multilevel"/>
     <w:tmpl w:val="D1DC60FE"/>
@@ -28669,7 +29640,7 @@
       </w:rPr>
     </w:lvl>
   </w:abstractNum>
-  <w:abstractNum w:abstractNumId="164" w15:restartNumberingAfterBreak="0">
+  <w:abstractNum w:abstractNumId="167" w15:restartNumberingAfterBreak="0">
     <w:nsid w:val="78B62297"/>
     <w:multiLevelType w:val="multilevel"/>
     <w:tmpl w:val="2AA67CDA"/>
@@ -28818,7 +29789,7 @@
       </w:rPr>
     </w:lvl>
   </w:abstractNum>
-  <w:abstractNum w:abstractNumId="165" w15:restartNumberingAfterBreak="0">
+  <w:abstractNum w:abstractNumId="168" w15:restartNumberingAfterBreak="0">
     <w:nsid w:val="79E63650"/>
     <w:multiLevelType w:val="multilevel"/>
     <w:tmpl w:val="98AA5BE8"/>
@@ -28967,7 +29938,7 @@
       </w:rPr>
     </w:lvl>
   </w:abstractNum>
-  <w:abstractNum w:abstractNumId="166" w15:restartNumberingAfterBreak="0">
+  <w:abstractNum w:abstractNumId="169" w15:restartNumberingAfterBreak="0">
     <w:nsid w:val="7BFA03DF"/>
     <w:multiLevelType w:val="hybridMultilevel"/>
     <w:tmpl w:val="536A979E"/>
@@ -29080,7 +30051,7 @@
       </w:rPr>
     </w:lvl>
   </w:abstractNum>
-  <w:abstractNum w:abstractNumId="167" w15:restartNumberingAfterBreak="0">
+  <w:abstractNum w:abstractNumId="170" w15:restartNumberingAfterBreak="0">
     <w:nsid w:val="7CA524B4"/>
     <w:multiLevelType w:val="hybridMultilevel"/>
     <w:tmpl w:val="957C4F4A"/>
@@ -29193,7 +30164,7 @@
       </w:rPr>
     </w:lvl>
   </w:abstractNum>
-  <w:abstractNum w:abstractNumId="168" w15:restartNumberingAfterBreak="0">
+  <w:abstractNum w:abstractNumId="171" w15:restartNumberingAfterBreak="0">
     <w:nsid w:val="7E1C597E"/>
     <w:multiLevelType w:val="multilevel"/>
     <w:tmpl w:val="2AA67CDA"/>
@@ -29342,7 +30313,7 @@
       </w:rPr>
     </w:lvl>
   </w:abstractNum>
-  <w:abstractNum w:abstractNumId="169" w15:restartNumberingAfterBreak="0">
+  <w:abstractNum w:abstractNumId="172" w15:restartNumberingAfterBreak="0">
     <w:nsid w:val="7EBD7710"/>
     <w:multiLevelType w:val="hybridMultilevel"/>
     <w:tmpl w:val="C8C6F7A0"/>
@@ -29455,7 +30426,7 @@
       </w:rPr>
     </w:lvl>
   </w:abstractNum>
-  <w:abstractNum w:abstractNumId="170" w15:restartNumberingAfterBreak="0">
+  <w:abstractNum w:abstractNumId="173" w15:restartNumberingAfterBreak="0">
     <w:nsid w:val="7F233031"/>
     <w:multiLevelType w:val="hybridMultilevel"/>
     <w:tmpl w:val="0D22564E"/>
@@ -29568,7 +30539,7 @@
       </w:rPr>
     </w:lvl>
   </w:abstractNum>
-  <w:abstractNum w:abstractNumId="171" w15:restartNumberingAfterBreak="0">
+  <w:abstractNum w:abstractNumId="174" w15:restartNumberingAfterBreak="0">
     <w:nsid w:val="7F426DF2"/>
     <w:multiLevelType w:val="multilevel"/>
     <w:tmpl w:val="430EFE5E"/>
@@ -29718,520 +30689,529 @@
     </w:lvl>
   </w:abstractNum>
   <w:num w:numId="1" w16cid:durableId="425157302">
-    <w:abstractNumId w:val="65"/>
+    <w:abstractNumId w:val="66"/>
   </w:num>
   <w:num w:numId="2" w16cid:durableId="967664612">
+    <w:abstractNumId w:val="128"/>
+  </w:num>
+  <w:num w:numId="3" w16cid:durableId="361631616">
+    <w:abstractNumId w:val="90"/>
+  </w:num>
+  <w:num w:numId="4" w16cid:durableId="1409575397">
+    <w:abstractNumId w:val="106"/>
+  </w:num>
+  <w:num w:numId="5" w16cid:durableId="1647204897">
+    <w:abstractNumId w:val="170"/>
+  </w:num>
+  <w:num w:numId="6" w16cid:durableId="682589869">
+    <w:abstractNumId w:val="33"/>
+  </w:num>
+  <w:num w:numId="7" w16cid:durableId="679703478">
+    <w:abstractNumId w:val="137"/>
+  </w:num>
+  <w:num w:numId="8" w16cid:durableId="496455128">
+    <w:abstractNumId w:val="59"/>
+  </w:num>
+  <w:num w:numId="9" w16cid:durableId="1184633094">
+    <w:abstractNumId w:val="81"/>
+  </w:num>
+  <w:num w:numId="10" w16cid:durableId="71507387">
+    <w:abstractNumId w:val="88"/>
+  </w:num>
+  <w:num w:numId="11" w16cid:durableId="1412503779">
+    <w:abstractNumId w:val="139"/>
+  </w:num>
+  <w:num w:numId="12" w16cid:durableId="1107113995">
+    <w:abstractNumId w:val="60"/>
+  </w:num>
+  <w:num w:numId="13" w16cid:durableId="2011055922">
+    <w:abstractNumId w:val="34"/>
+  </w:num>
+  <w:num w:numId="14" w16cid:durableId="1529222885">
+    <w:abstractNumId w:val="169"/>
+  </w:num>
+  <w:num w:numId="15" w16cid:durableId="836580755">
+    <w:abstractNumId w:val="24"/>
+  </w:num>
+  <w:num w:numId="16" w16cid:durableId="1344674502">
+    <w:abstractNumId w:val="114"/>
+  </w:num>
+  <w:num w:numId="17" w16cid:durableId="1320882603">
+    <w:abstractNumId w:val="150"/>
+  </w:num>
+  <w:num w:numId="18" w16cid:durableId="1139028372">
+    <w:abstractNumId w:val="61"/>
+  </w:num>
+  <w:num w:numId="19" w16cid:durableId="1525635473">
     <w:abstractNumId w:val="125"/>
   </w:num>
-  <w:num w:numId="3" w16cid:durableId="361631616">
-    <w:abstractNumId w:val="88"/>
+  <w:num w:numId="20" w16cid:durableId="609623515">
+    <w:abstractNumId w:val="172"/>
   </w:num>
-  <w:num w:numId="4" w16cid:durableId="1409575397">
-    <w:abstractNumId w:val="103"/>
+  <w:num w:numId="21" w16cid:durableId="165170997">
+    <w:abstractNumId w:val="142"/>
   </w:num>
-  <w:num w:numId="5" w16cid:durableId="1647204897">
-    <w:abstractNumId w:val="167"/>
+  <w:num w:numId="22" w16cid:durableId="1620525290">
+    <w:abstractNumId w:val="42"/>
   </w:num>
-  <w:num w:numId="6" w16cid:durableId="682589869">
+  <w:num w:numId="23" w16cid:durableId="400753109">
+    <w:abstractNumId w:val="154"/>
+  </w:num>
+  <w:num w:numId="24" w16cid:durableId="193882219">
+    <w:abstractNumId w:val="9"/>
+  </w:num>
+  <w:num w:numId="25" w16cid:durableId="311981628">
+    <w:abstractNumId w:val="68"/>
+  </w:num>
+  <w:num w:numId="26" w16cid:durableId="2009166045">
+    <w:abstractNumId w:val="23"/>
+  </w:num>
+  <w:num w:numId="27" w16cid:durableId="2135174697">
     <w:abstractNumId w:val="32"/>
   </w:num>
-  <w:num w:numId="7" w16cid:durableId="679703478">
-    <w:abstractNumId w:val="134"/>
-  </w:num>
-  <w:num w:numId="8" w16cid:durableId="496455128">
-    <w:abstractNumId w:val="58"/>
-  </w:num>
-  <w:num w:numId="9" w16cid:durableId="1184633094">
-    <w:abstractNumId w:val="79"/>
-  </w:num>
-  <w:num w:numId="10" w16cid:durableId="71507387">
-    <w:abstractNumId w:val="86"/>
-  </w:num>
-  <w:num w:numId="11" w16cid:durableId="1412503779">
-    <w:abstractNumId w:val="136"/>
-  </w:num>
-  <w:num w:numId="12" w16cid:durableId="1107113995">
-    <w:abstractNumId w:val="59"/>
-  </w:num>
-  <w:num w:numId="13" w16cid:durableId="2011055922">
-    <w:abstractNumId w:val="33"/>
-  </w:num>
-  <w:num w:numId="14" w16cid:durableId="1529222885">
-    <w:abstractNumId w:val="166"/>
-  </w:num>
-  <w:num w:numId="15" w16cid:durableId="836580755">
-    <w:abstractNumId w:val="23"/>
-  </w:num>
-  <w:num w:numId="16" w16cid:durableId="1344674502">
-    <w:abstractNumId w:val="111"/>
-  </w:num>
-  <w:num w:numId="17" w16cid:durableId="1320882603">
-    <w:abstractNumId w:val="147"/>
-  </w:num>
-  <w:num w:numId="18" w16cid:durableId="1139028372">
-    <w:abstractNumId w:val="60"/>
-  </w:num>
-  <w:num w:numId="19" w16cid:durableId="1525635473">
-    <w:abstractNumId w:val="122"/>
-  </w:num>
-  <w:num w:numId="20" w16cid:durableId="609623515">
-    <w:abstractNumId w:val="169"/>
-  </w:num>
-  <w:num w:numId="21" w16cid:durableId="165170997">
-    <w:abstractNumId w:val="139"/>
-  </w:num>
-  <w:num w:numId="22" w16cid:durableId="1620525290">
-    <w:abstractNumId w:val="41"/>
-  </w:num>
-  <w:num w:numId="23" w16cid:durableId="400753109">
-    <w:abstractNumId w:val="151"/>
-  </w:num>
-  <w:num w:numId="24" w16cid:durableId="193882219">
-    <w:abstractNumId w:val="8"/>
-  </w:num>
-  <w:num w:numId="25" w16cid:durableId="311981628">
-    <w:abstractNumId w:val="67"/>
-  </w:num>
-  <w:num w:numId="26" w16cid:durableId="2009166045">
-    <w:abstractNumId w:val="22"/>
-  </w:num>
-  <w:num w:numId="27" w16cid:durableId="2135174697">
-    <w:abstractNumId w:val="31"/>
-  </w:num>
   <w:num w:numId="28" w16cid:durableId="353504740">
-    <w:abstractNumId w:val="24"/>
+    <w:abstractNumId w:val="25"/>
   </w:num>
   <w:num w:numId="29" w16cid:durableId="2124693280">
-    <w:abstractNumId w:val="128"/>
+    <w:abstractNumId w:val="131"/>
   </w:num>
   <w:num w:numId="30" w16cid:durableId="1367099744">
-    <w:abstractNumId w:val="47"/>
+    <w:abstractNumId w:val="48"/>
   </w:num>
   <w:num w:numId="31" w16cid:durableId="2011105642">
-    <w:abstractNumId w:val="113"/>
+    <w:abstractNumId w:val="116"/>
   </w:num>
   <w:num w:numId="32" w16cid:durableId="831995364">
-    <w:abstractNumId w:val="37"/>
+    <w:abstractNumId w:val="38"/>
   </w:num>
   <w:num w:numId="33" w16cid:durableId="851073403">
-    <w:abstractNumId w:val="6"/>
+    <w:abstractNumId w:val="7"/>
   </w:num>
   <w:num w:numId="34" w16cid:durableId="1183666391">
-    <w:abstractNumId w:val="35"/>
+    <w:abstractNumId w:val="36"/>
   </w:num>
   <w:num w:numId="35" w16cid:durableId="697268929">
     <w:abstractNumId w:val="2"/>
   </w:num>
   <w:num w:numId="36" w16cid:durableId="1971284395">
-    <w:abstractNumId w:val="3"/>
+    <w:abstractNumId w:val="4"/>
   </w:num>
   <w:num w:numId="37" w16cid:durableId="1849755457">
-    <w:abstractNumId w:val="152"/>
+    <w:abstractNumId w:val="155"/>
   </w:num>
   <w:num w:numId="38" w16cid:durableId="516505904">
-    <w:abstractNumId w:val="21"/>
+    <w:abstractNumId w:val="22"/>
   </w:num>
   <w:num w:numId="39" w16cid:durableId="906300072">
-    <w:abstractNumId w:val="25"/>
+    <w:abstractNumId w:val="26"/>
   </w:num>
   <w:num w:numId="40" w16cid:durableId="905338697">
+    <w:abstractNumId w:val="93"/>
+  </w:num>
+  <w:num w:numId="41" w16cid:durableId="501896635">
+    <w:abstractNumId w:val="63"/>
+  </w:num>
+  <w:num w:numId="42" w16cid:durableId="1953435156">
+    <w:abstractNumId w:val="94"/>
+  </w:num>
+  <w:num w:numId="43" w16cid:durableId="1060447452">
+    <w:abstractNumId w:val="110"/>
+  </w:num>
+  <w:num w:numId="44" w16cid:durableId="1772503672">
+    <w:abstractNumId w:val="84"/>
+  </w:num>
+  <w:num w:numId="45" w16cid:durableId="1650330222">
     <w:abstractNumId w:val="91"/>
   </w:num>
-  <w:num w:numId="41" w16cid:durableId="501896635">
-    <w:abstractNumId w:val="62"/>
+  <w:num w:numId="46" w16cid:durableId="2102337934">
+    <w:abstractNumId w:val="41"/>
   </w:num>
-  <w:num w:numId="42" w16cid:durableId="1953435156">
-    <w:abstractNumId w:val="92"/>
+  <w:num w:numId="47" w16cid:durableId="68767822">
+    <w:abstractNumId w:val="140"/>
   </w:num>
-  <w:num w:numId="43" w16cid:durableId="1060447452">
+  <w:num w:numId="48" w16cid:durableId="1992058265">
+    <w:abstractNumId w:val="10"/>
+  </w:num>
+  <w:num w:numId="49" w16cid:durableId="788475134">
+    <w:abstractNumId w:val="166"/>
+  </w:num>
+  <w:num w:numId="50" w16cid:durableId="224419455">
+    <w:abstractNumId w:val="146"/>
+  </w:num>
+  <w:num w:numId="51" w16cid:durableId="1699575947">
+    <w:abstractNumId w:val="124"/>
+  </w:num>
+  <w:num w:numId="52" w16cid:durableId="1048916239">
+    <w:abstractNumId w:val="74"/>
+  </w:num>
+  <w:num w:numId="53" w16cid:durableId="1188711211">
+    <w:abstractNumId w:val="159"/>
+  </w:num>
+  <w:num w:numId="54" w16cid:durableId="447555614">
+    <w:abstractNumId w:val="127"/>
+  </w:num>
+  <w:num w:numId="55" w16cid:durableId="1679307268">
+    <w:abstractNumId w:val="71"/>
+  </w:num>
+  <w:num w:numId="56" w16cid:durableId="693773591">
+    <w:abstractNumId w:val="144"/>
+  </w:num>
+  <w:num w:numId="57" w16cid:durableId="1110473324">
+    <w:abstractNumId w:val="51"/>
+  </w:num>
+  <w:num w:numId="58" w16cid:durableId="842937968">
+    <w:abstractNumId w:val="89"/>
+  </w:num>
+  <w:num w:numId="59" w16cid:durableId="821121315">
+    <w:abstractNumId w:val="58"/>
+  </w:num>
+  <w:num w:numId="60" w16cid:durableId="2095394549">
+    <w:abstractNumId w:val="163"/>
+  </w:num>
+  <w:num w:numId="61" w16cid:durableId="1299921011">
+    <w:abstractNumId w:val="56"/>
+  </w:num>
+  <w:num w:numId="62" w16cid:durableId="1927420240">
+    <w:abstractNumId w:val="99"/>
+  </w:num>
+  <w:num w:numId="63" w16cid:durableId="41290043">
+    <w:abstractNumId w:val="105"/>
+  </w:num>
+  <w:num w:numId="64" w16cid:durableId="999846909">
+    <w:abstractNumId w:val="85"/>
+  </w:num>
+  <w:num w:numId="65" w16cid:durableId="1250969563">
+    <w:abstractNumId w:val="97"/>
+  </w:num>
+  <w:num w:numId="66" w16cid:durableId="484011382">
+    <w:abstractNumId w:val="138"/>
+  </w:num>
+  <w:num w:numId="67" w16cid:durableId="2008289242">
+    <w:abstractNumId w:val="19"/>
+  </w:num>
+  <w:num w:numId="68" w16cid:durableId="1041637222">
+    <w:abstractNumId w:val="27"/>
+  </w:num>
+  <w:num w:numId="69" w16cid:durableId="1296839887">
+    <w:abstractNumId w:val="104"/>
+  </w:num>
+  <w:num w:numId="70" w16cid:durableId="336662050">
+    <w:abstractNumId w:val="123"/>
+  </w:num>
+  <w:num w:numId="71" w16cid:durableId="1460032333">
+    <w:abstractNumId w:val="143"/>
+  </w:num>
+  <w:num w:numId="72" w16cid:durableId="592400615">
+    <w:abstractNumId w:val="16"/>
+  </w:num>
+  <w:num w:numId="73" w16cid:durableId="1879049234">
+    <w:abstractNumId w:val="47"/>
+  </w:num>
+  <w:num w:numId="74" w16cid:durableId="1747679558">
+    <w:abstractNumId w:val="52"/>
+  </w:num>
+  <w:num w:numId="75" w16cid:durableId="55278029">
+    <w:abstractNumId w:val="43"/>
+  </w:num>
+  <w:num w:numId="76" w16cid:durableId="1032193382">
+    <w:abstractNumId w:val="45"/>
+  </w:num>
+  <w:num w:numId="77" w16cid:durableId="763109604">
     <w:abstractNumId w:val="107"/>
   </w:num>
-  <w:num w:numId="44" w16cid:durableId="1772503672">
-    <w:abstractNumId w:val="82"/>
-  </w:num>
-  <w:num w:numId="45" w16cid:durableId="1650330222">
-    <w:abstractNumId w:val="89"/>
-  </w:num>
-  <w:num w:numId="46" w16cid:durableId="2102337934">
-    <w:abstractNumId w:val="40"/>
-  </w:num>
-  <w:num w:numId="47" w16cid:durableId="68767822">
-    <w:abstractNumId w:val="137"/>
-  </w:num>
-  <w:num w:numId="48" w16cid:durableId="1992058265">
-    <w:abstractNumId w:val="9"/>
-  </w:num>
-  <w:num w:numId="49" w16cid:durableId="788475134">
-    <w:abstractNumId w:val="163"/>
-  </w:num>
-  <w:num w:numId="50" w16cid:durableId="224419455">
-    <w:abstractNumId w:val="143"/>
-  </w:num>
-  <w:num w:numId="51" w16cid:durableId="1699575947">
-    <w:abstractNumId w:val="121"/>
-  </w:num>
-  <w:num w:numId="52" w16cid:durableId="1048916239">
-    <w:abstractNumId w:val="73"/>
-  </w:num>
-  <w:num w:numId="53" w16cid:durableId="1188711211">
-    <w:abstractNumId w:val="156"/>
-  </w:num>
-  <w:num w:numId="54" w16cid:durableId="447555614">
-    <w:abstractNumId w:val="124"/>
-  </w:num>
-  <w:num w:numId="55" w16cid:durableId="1679307268">
-    <w:abstractNumId w:val="70"/>
-  </w:num>
-  <w:num w:numId="56" w16cid:durableId="693773591">
-    <w:abstractNumId w:val="141"/>
-  </w:num>
-  <w:num w:numId="57" w16cid:durableId="1110473324">
-    <w:abstractNumId w:val="50"/>
-  </w:num>
-  <w:num w:numId="58" w16cid:durableId="842937968">
-    <w:abstractNumId w:val="87"/>
-  </w:num>
-  <w:num w:numId="59" w16cid:durableId="821121315">
-    <w:abstractNumId w:val="57"/>
-  </w:num>
-  <w:num w:numId="60" w16cid:durableId="2095394549">
-    <w:abstractNumId w:val="160"/>
-  </w:num>
-  <w:num w:numId="61" w16cid:durableId="1299921011">
-    <w:abstractNumId w:val="55"/>
-  </w:num>
-  <w:num w:numId="62" w16cid:durableId="1927420240">
-    <w:abstractNumId w:val="97"/>
-  </w:num>
-  <w:num w:numId="63" w16cid:durableId="41290043">
-    <w:abstractNumId w:val="102"/>
-  </w:num>
-  <w:num w:numId="64" w16cid:durableId="999846909">
-    <w:abstractNumId w:val="83"/>
-  </w:num>
-  <w:num w:numId="65" w16cid:durableId="1250969563">
-    <w:abstractNumId w:val="95"/>
-  </w:num>
-  <w:num w:numId="66" w16cid:durableId="484011382">
-    <w:abstractNumId w:val="135"/>
-  </w:num>
-  <w:num w:numId="67" w16cid:durableId="2008289242">
-    <w:abstractNumId w:val="18"/>
-  </w:num>
-  <w:num w:numId="68" w16cid:durableId="1041637222">
-    <w:abstractNumId w:val="26"/>
-  </w:num>
-  <w:num w:numId="69" w16cid:durableId="1296839887">
-    <w:abstractNumId w:val="101"/>
-  </w:num>
-  <w:num w:numId="70" w16cid:durableId="336662050">
-    <w:abstractNumId w:val="120"/>
-  </w:num>
-  <w:num w:numId="71" w16cid:durableId="1460032333">
-    <w:abstractNumId w:val="140"/>
-  </w:num>
-  <w:num w:numId="72" w16cid:durableId="592400615">
-    <w:abstractNumId w:val="15"/>
-  </w:num>
-  <w:num w:numId="73" w16cid:durableId="1879049234">
-    <w:abstractNumId w:val="46"/>
-  </w:num>
-  <w:num w:numId="74" w16cid:durableId="1747679558">
-    <w:abstractNumId w:val="51"/>
-  </w:num>
-  <w:num w:numId="75" w16cid:durableId="55278029">
-    <w:abstractNumId w:val="42"/>
-  </w:num>
-  <w:num w:numId="76" w16cid:durableId="1032193382">
-    <w:abstractNumId w:val="44"/>
-  </w:num>
-  <w:num w:numId="77" w16cid:durableId="763109604">
-    <w:abstractNumId w:val="104"/>
-  </w:num>
   <w:num w:numId="78" w16cid:durableId="2138137265">
-    <w:abstractNumId w:val="126"/>
+    <w:abstractNumId w:val="129"/>
   </w:num>
   <w:num w:numId="79" w16cid:durableId="343675924">
-    <w:abstractNumId w:val="148"/>
+    <w:abstractNumId w:val="151"/>
   </w:num>
   <w:num w:numId="80" w16cid:durableId="1823277442">
-    <w:abstractNumId w:val="54"/>
+    <w:abstractNumId w:val="55"/>
   </w:num>
   <w:num w:numId="81" w16cid:durableId="1686900155">
     <w:abstractNumId w:val="0"/>
   </w:num>
   <w:num w:numId="82" w16cid:durableId="1113326280">
+    <w:abstractNumId w:val="102"/>
+  </w:num>
+  <w:num w:numId="83" w16cid:durableId="1253051103">
+    <w:abstractNumId w:val="141"/>
+  </w:num>
+  <w:num w:numId="84" w16cid:durableId="444888444">
+    <w:abstractNumId w:val="65"/>
+  </w:num>
+  <w:num w:numId="85" w16cid:durableId="64299649">
+    <w:abstractNumId w:val="132"/>
+  </w:num>
+  <w:num w:numId="86" w16cid:durableId="868182992">
+    <w:abstractNumId w:val="83"/>
+  </w:num>
+  <w:num w:numId="87" w16cid:durableId="896863331">
+    <w:abstractNumId w:val="35"/>
+  </w:num>
+  <w:num w:numId="88" w16cid:durableId="505442826">
+    <w:abstractNumId w:val="136"/>
+  </w:num>
+  <w:num w:numId="89" w16cid:durableId="1858763908">
+    <w:abstractNumId w:val="49"/>
+  </w:num>
+  <w:num w:numId="90" w16cid:durableId="1896088176">
+    <w:abstractNumId w:val="21"/>
+  </w:num>
+  <w:num w:numId="91" w16cid:durableId="1284576603">
+    <w:abstractNumId w:val="117"/>
+  </w:num>
+  <w:num w:numId="92" w16cid:durableId="1963075542">
+    <w:abstractNumId w:val="15"/>
+  </w:num>
+  <w:num w:numId="93" w16cid:durableId="787627596">
+    <w:abstractNumId w:val="101"/>
+  </w:num>
+  <w:num w:numId="94" w16cid:durableId="2003925799">
+    <w:abstractNumId w:val="18"/>
+  </w:num>
+  <w:num w:numId="95" w16cid:durableId="1169102579">
+    <w:abstractNumId w:val="120"/>
+  </w:num>
+  <w:num w:numId="96" w16cid:durableId="1216501564">
+    <w:abstractNumId w:val="46"/>
+  </w:num>
+  <w:num w:numId="97" w16cid:durableId="261768216">
+    <w:abstractNumId w:val="147"/>
+  </w:num>
+  <w:num w:numId="98" w16cid:durableId="2141918721">
+    <w:abstractNumId w:val="96"/>
+  </w:num>
+  <w:num w:numId="99" w16cid:durableId="905841544">
+    <w:abstractNumId w:val="53"/>
+  </w:num>
+  <w:num w:numId="100" w16cid:durableId="1753887223">
+    <w:abstractNumId w:val="118"/>
+  </w:num>
+  <w:num w:numId="101" w16cid:durableId="1320184766">
+    <w:abstractNumId w:val="40"/>
+  </w:num>
+  <w:num w:numId="102" w16cid:durableId="465127606">
+    <w:abstractNumId w:val="75"/>
+  </w:num>
+  <w:num w:numId="103" w16cid:durableId="1640451435">
+    <w:abstractNumId w:val="73"/>
+  </w:num>
+  <w:num w:numId="104" w16cid:durableId="942029608">
+    <w:abstractNumId w:val="67"/>
+  </w:num>
+  <w:num w:numId="105" w16cid:durableId="70857193">
+    <w:abstractNumId w:val="78"/>
+  </w:num>
+  <w:num w:numId="106" w16cid:durableId="1617908629">
+    <w:abstractNumId w:val="153"/>
+  </w:num>
+  <w:num w:numId="107" w16cid:durableId="970137111">
+    <w:abstractNumId w:val="171"/>
+  </w:num>
+  <w:num w:numId="108" w16cid:durableId="383797013">
+    <w:abstractNumId w:val="62"/>
+  </w:num>
+  <w:num w:numId="109" w16cid:durableId="1459567304">
+    <w:abstractNumId w:val="77"/>
+  </w:num>
+  <w:num w:numId="110" w16cid:durableId="862745862">
+    <w:abstractNumId w:val="28"/>
+  </w:num>
+  <w:num w:numId="111" w16cid:durableId="1859536331">
+    <w:abstractNumId w:val="82"/>
+  </w:num>
+  <w:num w:numId="112" w16cid:durableId="2092697678">
+    <w:abstractNumId w:val="98"/>
+  </w:num>
+  <w:num w:numId="113" w16cid:durableId="1418403813">
+    <w:abstractNumId w:val="86"/>
+  </w:num>
+  <w:num w:numId="114" w16cid:durableId="1965042317">
+    <w:abstractNumId w:val="152"/>
+  </w:num>
+  <w:num w:numId="115" w16cid:durableId="670569040">
+    <w:abstractNumId w:val="72"/>
+  </w:num>
+  <w:num w:numId="116" w16cid:durableId="413823113">
+    <w:abstractNumId w:val="167"/>
+  </w:num>
+  <w:num w:numId="117" w16cid:durableId="1293747982">
+    <w:abstractNumId w:val="134"/>
+  </w:num>
+  <w:num w:numId="118" w16cid:durableId="2058698591">
+    <w:abstractNumId w:val="79"/>
+  </w:num>
+  <w:num w:numId="119" w16cid:durableId="892157361">
     <w:abstractNumId w:val="100"/>
   </w:num>
-  <w:num w:numId="83" w16cid:durableId="1253051103">
-    <w:abstractNumId w:val="138"/>
+  <w:num w:numId="120" w16cid:durableId="1449229938">
+    <w:abstractNumId w:val="156"/>
   </w:num>
-  <w:num w:numId="84" w16cid:durableId="444888444">
-    <w:abstractNumId w:val="64"/>
+  <w:num w:numId="121" w16cid:durableId="177283374">
+    <w:abstractNumId w:val="13"/>
   </w:num>
-  <w:num w:numId="85" w16cid:durableId="64299649">
-    <w:abstractNumId w:val="129"/>
-  </w:num>
-  <w:num w:numId="86" w16cid:durableId="868182992">
-    <w:abstractNumId w:val="81"/>
-  </w:num>
-  <w:num w:numId="87" w16cid:durableId="896863331">
-    <w:abstractNumId w:val="34"/>
-  </w:num>
-  <w:num w:numId="88" w16cid:durableId="505442826">
-    <w:abstractNumId w:val="133"/>
-  </w:num>
-  <w:num w:numId="89" w16cid:durableId="1858763908">
-    <w:abstractNumId w:val="48"/>
-  </w:num>
-  <w:num w:numId="90" w16cid:durableId="1896088176">
-    <w:abstractNumId w:val="20"/>
-  </w:num>
-  <w:num w:numId="91" w16cid:durableId="1284576603">
-    <w:abstractNumId w:val="114"/>
-  </w:num>
-  <w:num w:numId="92" w16cid:durableId="1963075542">
-    <w:abstractNumId w:val="14"/>
-  </w:num>
-  <w:num w:numId="93" w16cid:durableId="787627596">
-    <w:abstractNumId w:val="99"/>
-  </w:num>
-  <w:num w:numId="94" w16cid:durableId="2003925799">
+  <w:num w:numId="122" w16cid:durableId="576598579">
     <w:abstractNumId w:val="17"/>
   </w:num>
-  <w:num w:numId="95" w16cid:durableId="1169102579">
-    <w:abstractNumId w:val="117"/>
-  </w:num>
-  <w:num w:numId="96" w16cid:durableId="1216501564">
-    <w:abstractNumId w:val="45"/>
-  </w:num>
-  <w:num w:numId="97" w16cid:durableId="261768216">
-    <w:abstractNumId w:val="144"/>
-  </w:num>
-  <w:num w:numId="98" w16cid:durableId="2141918721">
-    <w:abstractNumId w:val="94"/>
-  </w:num>
-  <w:num w:numId="99" w16cid:durableId="905841544">
-    <w:abstractNumId w:val="52"/>
-  </w:num>
-  <w:num w:numId="100" w16cid:durableId="1753887223">
-    <w:abstractNumId w:val="115"/>
-  </w:num>
-  <w:num w:numId="101" w16cid:durableId="1320184766">
-    <w:abstractNumId w:val="39"/>
-  </w:num>
-  <w:num w:numId="102" w16cid:durableId="465127606">
-    <w:abstractNumId w:val="74"/>
-  </w:num>
-  <w:num w:numId="103" w16cid:durableId="1640451435">
-    <w:abstractNumId w:val="72"/>
-  </w:num>
-  <w:num w:numId="104" w16cid:durableId="942029608">
-    <w:abstractNumId w:val="66"/>
-  </w:num>
-  <w:num w:numId="105" w16cid:durableId="70857193">
-    <w:abstractNumId w:val="77"/>
-  </w:num>
-  <w:num w:numId="106" w16cid:durableId="1617908629">
-    <w:abstractNumId w:val="150"/>
-  </w:num>
-  <w:num w:numId="107" w16cid:durableId="970137111">
-    <w:abstractNumId w:val="168"/>
-  </w:num>
-  <w:num w:numId="108" w16cid:durableId="383797013">
-    <w:abstractNumId w:val="61"/>
-  </w:num>
-  <w:num w:numId="109" w16cid:durableId="1459567304">
-    <w:abstractNumId w:val="76"/>
-  </w:num>
-  <w:num w:numId="110" w16cid:durableId="862745862">
-    <w:abstractNumId w:val="27"/>
-  </w:num>
-  <w:num w:numId="111" w16cid:durableId="1859536331">
-    <w:abstractNumId w:val="80"/>
-  </w:num>
-  <w:num w:numId="112" w16cid:durableId="2092697678">
-    <w:abstractNumId w:val="96"/>
-  </w:num>
-  <w:num w:numId="113" w16cid:durableId="1418403813">
-    <w:abstractNumId w:val="84"/>
-  </w:num>
-  <w:num w:numId="114" w16cid:durableId="1965042317">
-    <w:abstractNumId w:val="149"/>
-  </w:num>
-  <w:num w:numId="115" w16cid:durableId="670569040">
-    <w:abstractNumId w:val="71"/>
-  </w:num>
-  <w:num w:numId="116" w16cid:durableId="413823113">
-    <w:abstractNumId w:val="164"/>
-  </w:num>
-  <w:num w:numId="117" w16cid:durableId="1293747982">
-    <w:abstractNumId w:val="131"/>
-  </w:num>
-  <w:num w:numId="118" w16cid:durableId="2058698591">
-    <w:abstractNumId w:val="78"/>
-  </w:num>
-  <w:num w:numId="119" w16cid:durableId="892157361">
-    <w:abstractNumId w:val="98"/>
-  </w:num>
-  <w:num w:numId="120" w16cid:durableId="1449229938">
-    <w:abstractNumId w:val="153"/>
-  </w:num>
-  <w:num w:numId="121" w16cid:durableId="177283374">
-    <w:abstractNumId w:val="12"/>
-  </w:num>
-  <w:num w:numId="122" w16cid:durableId="576598579">
-    <w:abstractNumId w:val="16"/>
-  </w:num>
   <w:num w:numId="123" w16cid:durableId="1495337109">
-    <w:abstractNumId w:val="157"/>
+    <w:abstractNumId w:val="160"/>
   </w:num>
   <w:num w:numId="124" w16cid:durableId="302319311">
-    <w:abstractNumId w:val="110"/>
+    <w:abstractNumId w:val="113"/>
   </w:num>
   <w:num w:numId="125" w16cid:durableId="1891844186">
-    <w:abstractNumId w:val="130"/>
+    <w:abstractNumId w:val="133"/>
   </w:num>
   <w:num w:numId="126" w16cid:durableId="256911009">
     <w:abstractNumId w:val="1"/>
   </w:num>
   <w:num w:numId="127" w16cid:durableId="1001927776">
-    <w:abstractNumId w:val="170"/>
+    <w:abstractNumId w:val="173"/>
   </w:num>
   <w:num w:numId="128" w16cid:durableId="1365057616">
-    <w:abstractNumId w:val="116"/>
+    <w:abstractNumId w:val="119"/>
   </w:num>
   <w:num w:numId="129" w16cid:durableId="2142647602">
-    <w:abstractNumId w:val="118"/>
+    <w:abstractNumId w:val="121"/>
   </w:num>
   <w:num w:numId="130" w16cid:durableId="1895652277">
-    <w:abstractNumId w:val="171"/>
+    <w:abstractNumId w:val="174"/>
   </w:num>
   <w:num w:numId="131" w16cid:durableId="1132407586">
+    <w:abstractNumId w:val="164"/>
+  </w:num>
+  <w:num w:numId="132" w16cid:durableId="1209996408">
+    <w:abstractNumId w:val="14"/>
+  </w:num>
+  <w:num w:numId="133" w16cid:durableId="1840802852">
+    <w:abstractNumId w:val="6"/>
+  </w:num>
+  <w:num w:numId="134" w16cid:durableId="220867256">
+    <w:abstractNumId w:val="135"/>
+  </w:num>
+  <w:num w:numId="135" w16cid:durableId="2026857351">
+    <w:abstractNumId w:val="39"/>
+  </w:num>
+  <w:num w:numId="136" w16cid:durableId="1236696510">
+    <w:abstractNumId w:val="162"/>
+  </w:num>
+  <w:num w:numId="137" w16cid:durableId="1156385716">
+    <w:abstractNumId w:val="54"/>
+  </w:num>
+  <w:num w:numId="138" w16cid:durableId="1088235058">
+    <w:abstractNumId w:val="29"/>
+  </w:num>
+  <w:num w:numId="139" w16cid:durableId="106968457">
+    <w:abstractNumId w:val="20"/>
+  </w:num>
+  <w:num w:numId="140" w16cid:durableId="1705979747">
+    <w:abstractNumId w:val="12"/>
+  </w:num>
+  <w:num w:numId="141" w16cid:durableId="1122117806">
+    <w:abstractNumId w:val="37"/>
+  </w:num>
+  <w:num w:numId="142" w16cid:durableId="2126385657">
+    <w:abstractNumId w:val="69"/>
+  </w:num>
+  <w:num w:numId="143" w16cid:durableId="1058674300">
+    <w:abstractNumId w:val="87"/>
+  </w:num>
+  <w:num w:numId="144" w16cid:durableId="756362112">
+    <w:abstractNumId w:val="8"/>
+  </w:num>
+  <w:num w:numId="145" w16cid:durableId="1612125897">
+    <w:abstractNumId w:val="95"/>
+  </w:num>
+  <w:num w:numId="146" w16cid:durableId="797142166">
+    <w:abstractNumId w:val="31"/>
+  </w:num>
+  <w:num w:numId="147" w16cid:durableId="542138466">
+    <w:abstractNumId w:val="11"/>
+  </w:num>
+  <w:num w:numId="148" w16cid:durableId="1917398031">
+    <w:abstractNumId w:val="126"/>
+  </w:num>
+  <w:num w:numId="149" w16cid:durableId="524444307">
+    <w:abstractNumId w:val="148"/>
+  </w:num>
+  <w:num w:numId="150" w16cid:durableId="859783391">
+    <w:abstractNumId w:val="158"/>
+  </w:num>
+  <w:num w:numId="151" w16cid:durableId="2097357959">
     <w:abstractNumId w:val="161"/>
   </w:num>
-  <w:num w:numId="132" w16cid:durableId="1209996408">
-    <w:abstractNumId w:val="13"/>
+  <w:num w:numId="152" w16cid:durableId="748579603">
+    <w:abstractNumId w:val="168"/>
   </w:num>
-  <w:num w:numId="133" w16cid:durableId="1840802852">
+  <w:num w:numId="153" w16cid:durableId="1193568221">
+    <w:abstractNumId w:val="30"/>
+  </w:num>
+  <w:num w:numId="154" w16cid:durableId="913079688">
+    <w:abstractNumId w:val="122"/>
+  </w:num>
+  <w:num w:numId="155" w16cid:durableId="1216234668">
+    <w:abstractNumId w:val="57"/>
+  </w:num>
+  <w:num w:numId="156" w16cid:durableId="240020660">
+    <w:abstractNumId w:val="157"/>
+  </w:num>
+  <w:num w:numId="157" w16cid:durableId="1604263775">
+    <w:abstractNumId w:val="44"/>
+  </w:num>
+  <w:num w:numId="158" w16cid:durableId="2053966958">
+    <w:abstractNumId w:val="50"/>
+  </w:num>
+  <w:num w:numId="159" w16cid:durableId="1269044918">
     <w:abstractNumId w:val="5"/>
   </w:num>
-  <w:num w:numId="134" w16cid:durableId="220867256">
-    <w:abstractNumId w:val="132"/>
+  <w:num w:numId="160" w16cid:durableId="640892086">
+    <w:abstractNumId w:val="92"/>
   </w:num>
-  <w:num w:numId="135" w16cid:durableId="2026857351">
-    <w:abstractNumId w:val="38"/>
-  </w:num>
-  <w:num w:numId="136" w16cid:durableId="1236696510">
-    <w:abstractNumId w:val="159"/>
-  </w:num>
-  <w:num w:numId="137" w16cid:durableId="1156385716">
-    <w:abstractNumId w:val="53"/>
-  </w:num>
-  <w:num w:numId="138" w16cid:durableId="1088235058">
-    <w:abstractNumId w:val="28"/>
-  </w:num>
-  <w:num w:numId="139" w16cid:durableId="106968457">
-    <w:abstractNumId w:val="19"/>
-  </w:num>
-  <w:num w:numId="140" w16cid:durableId="1705979747">
-    <w:abstractNumId w:val="11"/>
-  </w:num>
-  <w:num w:numId="141" w16cid:durableId="1122117806">
-    <w:abstractNumId w:val="36"/>
-  </w:num>
-  <w:num w:numId="142" w16cid:durableId="2126385657">
-    <w:abstractNumId w:val="68"/>
-  </w:num>
-  <w:num w:numId="143" w16cid:durableId="1058674300">
-    <w:abstractNumId w:val="85"/>
-  </w:num>
-  <w:num w:numId="144" w16cid:durableId="756362112">
-    <w:abstractNumId w:val="7"/>
-  </w:num>
-  <w:num w:numId="145" w16cid:durableId="1612125897">
-    <w:abstractNumId w:val="93"/>
-  </w:num>
-  <w:num w:numId="146" w16cid:durableId="797142166">
-    <w:abstractNumId w:val="30"/>
-  </w:num>
-  <w:num w:numId="147" w16cid:durableId="542138466">
-    <w:abstractNumId w:val="10"/>
-  </w:num>
-  <w:num w:numId="148" w16cid:durableId="1917398031">
-    <w:abstractNumId w:val="123"/>
-  </w:num>
-  <w:num w:numId="149" w16cid:durableId="524444307">
+  <w:num w:numId="161" w16cid:durableId="610010161">
     <w:abstractNumId w:val="145"/>
   </w:num>
-  <w:num w:numId="150" w16cid:durableId="859783391">
-    <w:abstractNumId w:val="155"/>
+  <w:num w:numId="162" w16cid:durableId="1104762223">
+    <w:abstractNumId w:val="149"/>
   </w:num>
-  <w:num w:numId="151" w16cid:durableId="2097357959">
-    <w:abstractNumId w:val="158"/>
+  <w:num w:numId="163" w16cid:durableId="596792981">
+    <w:abstractNumId w:val="112"/>
   </w:num>
-  <w:num w:numId="152" w16cid:durableId="748579603">
+  <w:num w:numId="164" w16cid:durableId="2035573063">
+    <w:abstractNumId w:val="108"/>
+  </w:num>
+  <w:num w:numId="165" w16cid:durableId="1444885796">
+    <w:abstractNumId w:val="109"/>
+  </w:num>
+  <w:num w:numId="166" w16cid:durableId="1898589376">
     <w:abstractNumId w:val="165"/>
   </w:num>
-  <w:num w:numId="153" w16cid:durableId="1193568221">
-    <w:abstractNumId w:val="29"/>
-  </w:num>
-  <w:num w:numId="154" w16cid:durableId="913079688">
-    <w:abstractNumId w:val="119"/>
-  </w:num>
-  <w:num w:numId="155" w16cid:durableId="1216234668">
-    <w:abstractNumId w:val="56"/>
-  </w:num>
-  <w:num w:numId="156" w16cid:durableId="240020660">
-    <w:abstractNumId w:val="154"/>
-  </w:num>
-  <w:num w:numId="157" w16cid:durableId="1604263775">
-    <w:abstractNumId w:val="43"/>
-  </w:num>
-  <w:num w:numId="158" w16cid:durableId="2053966958">
-    <w:abstractNumId w:val="49"/>
-  </w:num>
-  <w:num w:numId="159" w16cid:durableId="1269044918">
-    <w:abstractNumId w:val="4"/>
-  </w:num>
-  <w:num w:numId="160" w16cid:durableId="640892086">
-    <w:abstractNumId w:val="90"/>
-  </w:num>
-  <w:num w:numId="161" w16cid:durableId="610010161">
-    <w:abstractNumId w:val="142"/>
-  </w:num>
-  <w:num w:numId="162" w16cid:durableId="1104762223">
-    <w:abstractNumId w:val="146"/>
-  </w:num>
-  <w:num w:numId="163" w16cid:durableId="596792981">
-    <w:abstractNumId w:val="109"/>
-  </w:num>
-  <w:num w:numId="164" w16cid:durableId="2035573063">
-    <w:abstractNumId w:val="105"/>
-  </w:num>
-  <w:num w:numId="165" w16cid:durableId="1444885796">
-    <w:abstractNumId w:val="106"/>
-  </w:num>
-  <w:num w:numId="166" w16cid:durableId="1898589376">
-    <w:abstractNumId w:val="162"/>
-  </w:num>
   <w:num w:numId="167" w16cid:durableId="1031300584">
-    <w:abstractNumId w:val="112"/>
+    <w:abstractNumId w:val="115"/>
   </w:num>
   <w:num w:numId="168" w16cid:durableId="12998393">
-    <w:abstractNumId w:val="69"/>
+    <w:abstractNumId w:val="70"/>
   </w:num>
   <w:num w:numId="169" w16cid:durableId="1888099200">
-    <w:abstractNumId w:val="63"/>
+    <w:abstractNumId w:val="64"/>
   </w:num>
   <w:num w:numId="170" w16cid:durableId="749038013">
-    <w:abstractNumId w:val="75"/>
+    <w:abstractNumId w:val="76"/>
   </w:num>
   <w:num w:numId="171" w16cid:durableId="107625264">
-    <w:abstractNumId w:val="108"/>
+    <w:abstractNumId w:val="111"/>
   </w:num>
   <w:num w:numId="172" w16cid:durableId="644552680">
-    <w:abstractNumId w:val="127"/>
+    <w:abstractNumId w:val="130"/>
+  </w:num>
+  <w:num w:numId="173" w16cid:durableId="212929681">
+    <w:abstractNumId w:val="103"/>
+  </w:num>
+  <w:num w:numId="174" w16cid:durableId="165562762">
+    <w:abstractNumId w:val="80"/>
+  </w:num>
+  <w:num w:numId="175" w16cid:durableId="213129860">
+    <w:abstractNumId w:val="3"/>
   </w:num>
   <w:numIdMacAtCleanup w:val="45"/>
 </w:numbering>

</xml_diff>

<commit_message>
Activity Diagram Review & Validation (#280) Process Review (#281) Stakeholder Review & Sign-Off (#282)
</commit_message>
<xml_diff>
--- a/Activity Specification Document.docx
+++ b/Activity Specification Document.docx
@@ -27,6 +27,54 @@
           <w:rFonts w:eastAsiaTheme="minorHAnsi"/>
         </w:rPr>
         <w:t xml:space="preserve"> </w:t>
+      </w:r>
+      <w:r>
+        <w:rPr>
+          <w:color w:val="D0CECE" w:themeColor="background2" w:themeShade="E6"/>
+          <w:sz w:val="24"/>
+          <w:szCs w:val="28"/>
+        </w:rPr>
+        <w:t>(Reviewed on JUL 09, 2026)</w:t>
+      </w:r>
+    </w:p>
+    <w:p>
+      <w:pPr>
+        <w:spacing w:line="278" w:lineRule="auto"/>
+      </w:pPr>
+      <w:r>
+        <w:t>This chapter will present the specifications of the activity diagrams for the KriGo vehicle rental system. The activity diagrams are one of the behavioral diagrams that are part of the Unified Modeling Language (UML). They help in representing the workflow of the business processes and system operations. It represents the order of activities, control flows, decisions, parallel processes and interactions necessary for accomplishing the tasks within the system.</w:t>
+      </w:r>
+    </w:p>
+    <w:p>
+      <w:pPr>
+        <w:spacing w:line="278" w:lineRule="auto"/>
+      </w:pPr>
+      <w:r>
+        <w:t>Whereas use case diagrams provide an identification of the functional requirements and sequence diagrams depict the interactions among the system objects through time, the activity diagrams represent the procedure of operations execution starting from their beginning till the completion of the process. Activity diagrams allow visualizing collaboration of users and system components when executing the business processes. Therefore, they are helpful in understanding the system behavior, verification of the business logic and identifying the alternative execution paths.</w:t>
+      </w:r>
+    </w:p>
+    <w:p>
+      <w:pPr>
+        <w:spacing w:line="278" w:lineRule="auto"/>
+      </w:pPr>
+      <w:r>
+        <w:t>The activity diagrams presented in this chapter will cover the main workflow of the KriGo platform, including registration of customers, searching and selection of the vehicles, management of reservations, payment and review submissions, management of the fleet, management of branches and employees, verification of agencies, content moderation, dispute resolution, generation of AI recommendations, communication with the AI assistant, generation of analytics, and mobile application functionality, including quick booking and offline functionality. Moreover, an overview activity diagram will be presented illustrating the customer reservation process from the start till its completion with activity partitions (swimlanes) that involve various system participants.</w:t>
+      </w:r>
+    </w:p>
+    <w:p>
+      <w:pPr>
+        <w:spacing w:line="278" w:lineRule="auto"/>
+      </w:pPr>
+      <w:r>
+        <w:t>The activity diagrams described the sequence of activities of a certain business process and highlight the decision points, alternative flows, validation techniques and synchronization points that determine the system behavior. When needed, the activity partitions will be used in order to separate the roles of various actors and system components involved in the process.</w:t>
+      </w:r>
+    </w:p>
+    <w:p>
+      <w:pPr>
+        <w:spacing w:line="278" w:lineRule="auto"/>
+      </w:pPr>
+      <w:r>
+        <w:t>Activity diagrams serve as a crucial tool for the transition from the system requirements to the realization of the business processes. They help in visualization of operational workflows, verification of the business rules, process dependencies identification, and development, testing and maintenance of the KriGo system. With the help of activity diagrams, together with use case and sequence diagrams presented in previous chapters, we will build the full behavioral model of the system.</w:t>
       </w:r>
     </w:p>
     <w:p>
@@ -1475,6 +1523,7 @@
       <w:r>
         <w:t xml:space="preserve">If </w:t>
       </w:r>
+      <w:proofErr w:type="gramStart"/>
       <w:r>
         <w:rPr>
           <w:b/>
@@ -1482,6 +1531,7 @@
         </w:rPr>
         <w:t>Yes</w:t>
       </w:r>
+      <w:proofErr w:type="gramEnd"/>
       <w:r>
         <w:t>, the reservation process continues with rental cost calculation and reservation review.</w:t>
       </w:r>
@@ -1497,6 +1547,7 @@
       <w:r>
         <w:t xml:space="preserve">If </w:t>
       </w:r>
+      <w:proofErr w:type="gramStart"/>
       <w:r>
         <w:rPr>
           <w:b/>
@@ -1504,6 +1555,7 @@
         </w:rPr>
         <w:t>No</w:t>
       </w:r>
+      <w:proofErr w:type="gramEnd"/>
       <w:r>
         <w:t>, the customer is informed that the vehicle is unavailable and returns to the vehicle search process.</w:t>
       </w:r>
@@ -1534,6 +1586,7 @@
       <w:r>
         <w:t xml:space="preserve">If </w:t>
       </w:r>
+      <w:proofErr w:type="gramStart"/>
       <w:r>
         <w:rPr>
           <w:b/>
@@ -1541,6 +1594,7 @@
         </w:rPr>
         <w:t>Yes</w:t>
       </w:r>
+      <w:proofErr w:type="gramEnd"/>
       <w:r>
         <w:t>, the reservation is created and stored successfully.</w:t>
       </w:r>
@@ -1555,6 +1609,7 @@
       <w:r>
         <w:t xml:space="preserve">If </w:t>
       </w:r>
+      <w:proofErr w:type="gramStart"/>
       <w:r>
         <w:rPr>
           <w:b/>
@@ -1562,6 +1617,7 @@
         </w:rPr>
         <w:t>No</w:t>
       </w:r>
+      <w:proofErr w:type="gramEnd"/>
       <w:r>
         <w:t>, the reservation process is canceled without saving any data.</w:t>
       </w:r>
@@ -2063,6 +2119,7 @@
       <w:r>
         <w:t xml:space="preserve">If </w:t>
       </w:r>
+      <w:proofErr w:type="gramStart"/>
       <w:r>
         <w:rPr>
           <w:b/>
@@ -2070,6 +2127,7 @@
         </w:rPr>
         <w:t>Yes</w:t>
       </w:r>
+      <w:proofErr w:type="gramEnd"/>
       <w:r>
         <w:t>, the reservation status is updated and the payment is confirmed.</w:t>
       </w:r>
@@ -2084,6 +2142,7 @@
       <w:r>
         <w:t xml:space="preserve">If </w:t>
       </w:r>
+      <w:proofErr w:type="gramStart"/>
       <w:r>
         <w:rPr>
           <w:b/>
@@ -2091,6 +2150,7 @@
         </w:rPr>
         <w:t>No</w:t>
       </w:r>
+      <w:proofErr w:type="gramEnd"/>
       <w:r>
         <w:t>, the customer may retry the payment or cancel the transaction.</w:t>
       </w:r>
@@ -2121,6 +2181,7 @@
       <w:r>
         <w:t xml:space="preserve">If </w:t>
       </w:r>
+      <w:proofErr w:type="gramStart"/>
       <w:r>
         <w:rPr>
           <w:b/>
@@ -2128,6 +2189,7 @@
         </w:rPr>
         <w:t>Yes</w:t>
       </w:r>
+      <w:proofErr w:type="gramEnd"/>
       <w:r>
         <w:t>, the customer re-enters the payment information.</w:t>
       </w:r>
@@ -2142,6 +2204,7 @@
       <w:r>
         <w:t xml:space="preserve">If </w:t>
       </w:r>
+      <w:proofErr w:type="gramStart"/>
       <w:r>
         <w:rPr>
           <w:b/>
@@ -2149,6 +2212,7 @@
         </w:rPr>
         <w:t>No</w:t>
       </w:r>
+      <w:proofErr w:type="gramEnd"/>
       <w:r>
         <w:t>, the payment process is canceled.</w:t>
       </w:r>
@@ -2179,6 +2243,7 @@
       <w:r>
         <w:t xml:space="preserve">If </w:t>
       </w:r>
+      <w:proofErr w:type="gramStart"/>
       <w:r>
         <w:rPr>
           <w:b/>
@@ -2186,6 +2251,7 @@
         </w:rPr>
         <w:t>Yes</w:t>
       </w:r>
+      <w:proofErr w:type="gramEnd"/>
       <w:r>
         <w:t>, the customer submits a rating and written review.</w:t>
       </w:r>
@@ -2200,6 +2266,7 @@
       <w:r>
         <w:t xml:space="preserve">If </w:t>
       </w:r>
+      <w:proofErr w:type="gramStart"/>
       <w:r>
         <w:rPr>
           <w:b/>
@@ -2207,6 +2274,7 @@
         </w:rPr>
         <w:t>No</w:t>
       </w:r>
+      <w:proofErr w:type="gramEnd"/>
       <w:r>
         <w:t>, the workflow ends after the payment process.</w:t>
       </w:r>
@@ -2728,6 +2796,7 @@
       <w:r>
         <w:t xml:space="preserve">If </w:t>
       </w:r>
+      <w:proofErr w:type="gramStart"/>
       <w:r>
         <w:rPr>
           <w:b/>
@@ -2735,6 +2804,7 @@
         </w:rPr>
         <w:t>Yes</w:t>
       </w:r>
+      <w:proofErr w:type="gramEnd"/>
       <w:r>
         <w:t>, the system updates the fleet records and saves the changes.</w:t>
       </w:r>
@@ -2749,6 +2819,7 @@
       <w:r>
         <w:t xml:space="preserve">If </w:t>
       </w:r>
+      <w:proofErr w:type="gramStart"/>
       <w:r>
         <w:rPr>
           <w:b/>
@@ -2756,6 +2827,7 @@
         </w:rPr>
         <w:t>No</w:t>
       </w:r>
+      <w:proofErr w:type="gramEnd"/>
       <w:r>
         <w:t>, validation errors are displayed and the user returns to correct the submitted information.</w:t>
       </w:r>
@@ -8857,10 +8929,108 @@
     </w:p>
     <w:p>
       <w:pPr>
-        <w:tabs>
-          <w:tab w:val="left" w:pos="3645"/>
-        </w:tabs>
-      </w:pPr>
+        <w:keepNext/>
+      </w:pPr>
+      <w:r>
+        <w:rPr>
+          <w:rStyle w:val="Heading3Char"/>
+        </w:rPr>
+        <w:lastRenderedPageBreak/>
+        <w:drawing>
+          <wp:anchor distT="0" distB="0" distL="114300" distR="114300" simplePos="0" relativeHeight="251679744" behindDoc="0" locked="0" layoutInCell="1" allowOverlap="1" wp14:anchorId="36B4BCE6" wp14:editId="7D76A9D1">
+            <wp:simplePos x="0" y="0"/>
+            <wp:positionH relativeFrom="column">
+              <wp:posOffset>-50165</wp:posOffset>
+            </wp:positionH>
+            <wp:positionV relativeFrom="paragraph">
+              <wp:posOffset>257175</wp:posOffset>
+            </wp:positionV>
+            <wp:extent cx="5941695" cy="8153400"/>
+            <wp:effectExtent l="0" t="0" r="1905" b="0"/>
+            <wp:wrapSquare wrapText="bothSides"/>
+            <wp:docPr id="1346457245" name="Picture 23"/>
+            <wp:cNvGraphicFramePr>
+              <a:graphicFrameLocks xmlns:a="http://schemas.openxmlformats.org/drawingml/2006/main" noChangeAspect="1"/>
+            </wp:cNvGraphicFramePr>
+            <a:graphic xmlns:a="http://schemas.openxmlformats.org/drawingml/2006/main">
+              <a:graphicData uri="http://schemas.openxmlformats.org/drawingml/2006/picture">
+                <pic:pic xmlns:pic="http://schemas.openxmlformats.org/drawingml/2006/picture">
+                  <pic:nvPicPr>
+                    <pic:cNvPr id="0" name="Picture 31"/>
+                    <pic:cNvPicPr>
+                      <a:picLocks noChangeAspect="1" noChangeArrowheads="1"/>
+                    </pic:cNvPicPr>
+                  </pic:nvPicPr>
+                  <pic:blipFill>
+                    <a:blip r:embed="rId23" cstate="print">
+                      <a:extLst>
+                        <a:ext uri="{28A0092B-C50C-407E-A947-70E740481C1C}">
+                          <a14:useLocalDpi xmlns:a14="http://schemas.microsoft.com/office/drawing/2010/main" val="0"/>
+                        </a:ext>
+                      </a:extLst>
+                    </a:blip>
+                    <a:srcRect/>
+                    <a:stretch>
+                      <a:fillRect/>
+                    </a:stretch>
+                  </pic:blipFill>
+                  <pic:spPr bwMode="auto">
+                    <a:xfrm>
+                      <a:off x="0" y="0"/>
+                      <a:ext cx="5941695" cy="8153400"/>
+                    </a:xfrm>
+                    <a:prstGeom prst="rect">
+                      <a:avLst/>
+                    </a:prstGeom>
+                    <a:noFill/>
+                    <a:ln>
+                      <a:noFill/>
+                    </a:ln>
+                  </pic:spPr>
+                </pic:pic>
+              </a:graphicData>
+            </a:graphic>
+          </wp:anchor>
+        </w:drawing>
+      </w:r>
+      <w:r>
+        <w:rPr>
+          <w:rStyle w:val="Heading3Char"/>
+        </w:rPr>
+        <w:t>System Overview Activity Diagram (Customer Jurney)</w:t>
+      </w:r>
+    </w:p>
+    <w:p>
+      <w:pPr>
+        <w:pStyle w:val="Caption"/>
+      </w:pPr>
+      <w:r>
+        <w:t xml:space="preserve">Figure </w:t>
+      </w:r>
+      <w:r>
+        <w:fldChar w:fldCharType="begin"/>
+      </w:r>
+      <w:r>
+        <w:instrText xml:space="preserve"> SEQ Figure \* ARABIC </w:instrText>
+      </w:r>
+      <w:r>
+        <w:fldChar w:fldCharType="separate"/>
+      </w:r>
+      <w:r>
+        <w:rPr>
+          <w:noProof/>
+        </w:rPr>
+        <w:t>16</w:t>
+      </w:r>
+      <w:r>
+        <w:fldChar w:fldCharType="end"/>
+      </w:r>
+      <w:r>
+        <w:t xml:space="preserve"> - </w:t>
+      </w:r>
+      <w:r>
+        <w:t>System Overview Activity Diagram</w:t>
+      </w:r>
     </w:p>
     <w:sectPr>
       <w:pgSz w:w="11906" w:h="16838" w:code="9"/>

</xml_diff>